<commit_message>
CostsDescriptions: Add the description for a cost below the table when it is too long
</commit_message>
<xml_diff>
--- a/src/main/resources/org/damap/base/template/FWFTemplate.docx
+++ b/src/main/resources/org/damap/base/template/FWFTemplate.docx
@@ -4057,16 +4057,16 @@
               <w:tblLook w:val="04A0" w:firstRow="1" w:lastRow="0" w:firstColumn="1" w:lastColumn="0" w:noHBand="0" w:noVBand="1"/>
             </w:tblPr>
             <w:tblGrid>
-              <w:gridCol w:w="3326"/>
-              <w:gridCol w:w="2320"/>
-              <w:gridCol w:w="3766"/>
-              <w:gridCol w:w="1606"/>
-              <w:gridCol w:w="1408"/>
+              <w:gridCol w:w="2212"/>
+              <w:gridCol w:w="1708"/>
+              <w:gridCol w:w="5747"/>
+              <w:gridCol w:w="1467"/>
+              <w:gridCol w:w="1292"/>
             </w:tblGrid>
             <w:tr>
               <w:tc>
                 <w:tcPr>
-                  <w:tcW w:w="3326" w:type="dxa"/>
+                  <w:tcW w:w="2424" w:type="dxa"/>
                   <w:tcBorders>
                     <w:bottom w:val="single" w:sz="12" w:space="0" w:color="006AAB"/>
                   </w:tcBorders>
@@ -4106,7 +4106,7 @@
               </w:tc>
               <w:tc>
                 <w:tcPr>
-                  <w:tcW w:w="2320" w:type="dxa"/>
+                  <w:tcW w:w="1824" w:type="dxa"/>
                   <w:tcBorders>
                     <w:bottom w:val="single" w:sz="12" w:space="0" w:color="006AAB"/>
                   </w:tcBorders>
@@ -4144,7 +4144,7 @@
               </w:tc>
               <w:tc>
                 <w:tcPr>
-                  <w:tcW w:w="3766" w:type="dxa"/>
+                  <w:tcW w:w="6626" w:type="dxa"/>
                   <w:tcBorders>
                     <w:bottom w:val="single" w:sz="12" w:space="0" w:color="006AAB"/>
                   </w:tcBorders>
@@ -4181,7 +4181,7 @@
               </w:tc>
               <w:tc>
                 <w:tcPr>
-                  <w:tcW w:w="1606" w:type="dxa"/>
+                  <w:tcW w:w="238" w:type="dxa"/>
                   <w:tcBorders>
                     <w:bottom w:val="single" w:sz="12" w:space="0" w:color="006AAB"/>
                   </w:tcBorders>
@@ -4221,7 +4221,7 @@
               </w:tc>
               <w:tc>
                 <w:tcPr>
-                  <w:tcW w:w="1408" w:type="dxa"/>
+                  <w:tcW w:w="1314" w:type="dxa"/>
                   <w:tcBorders>
                     <w:bottom w:val="single" w:sz="12" w:space="0" w:color="006AAB"/>
                   </w:tcBorders>
@@ -4264,7 +4264,7 @@
             <w:tr>
               <w:tc>
                 <w:tcPr>
-                  <w:tcW w:w="3326" w:type="dxa"/>
+                  <w:tcW w:w="2424" w:type="dxa"/>
                   <w:tcBorders>
                     <w:top w:val="single" w:sz="12" w:space="0" w:color="006AAB"/>
                   </w:tcBorders>
@@ -4310,7 +4310,7 @@
               </w:tc>
               <w:tc>
                 <w:tcPr>
-                  <w:tcW w:w="2320" w:type="dxa"/>
+                  <w:tcW w:w="1824" w:type="dxa"/>
                   <w:tcBorders>
                     <w:top w:val="single" w:sz="12" w:space="0" w:color="006AAB"/>
                   </w:tcBorders>
@@ -4355,7 +4355,7 @@
               </w:tc>
               <w:tc>
                 <w:tcPr>
-                  <w:tcW w:w="3766" w:type="dxa"/>
+                  <w:tcW w:w="6626" w:type="dxa"/>
                   <w:tcBorders>
                     <w:top w:val="single" w:sz="12" w:space="0" w:color="006AAB"/>
                   </w:tcBorders>
@@ -4374,7 +4374,7 @@
               </w:tc>
               <w:tc>
                 <w:tcPr>
-                  <w:tcW w:w="1606" w:type="dxa"/>
+                  <w:tcW w:w="238" w:type="dxa"/>
                   <w:tcBorders>
                     <w:top w:val="single" w:sz="12" w:space="0" w:color="006AAB"/>
                   </w:tcBorders>
@@ -4393,7 +4393,7 @@
               </w:tc>
               <w:tc>
                 <w:tcPr>
-                  <w:tcW w:w="1408" w:type="dxa"/>
+                  <w:tcW w:w="1314" w:type="dxa"/>
                   <w:tcBorders>
                     <w:top w:val="single" w:sz="12" w:space="0" w:color="006AAB"/>
                   </w:tcBorders>
@@ -4414,7 +4414,7 @@
             <w:tr>
               <w:tc>
                 <w:tcPr>
-                  <w:tcW w:w="3326" w:type="dxa"/>
+                  <w:tcW w:w="2424" w:type="dxa"/>
                 </w:tcPr>
                 <w:p>
                   <w:pPr>
@@ -4439,7 +4439,7 @@
               </w:tc>
               <w:tc>
                 <w:tcPr>
-                  <w:tcW w:w="2320" w:type="dxa"/>
+                  <w:tcW w:w="1824" w:type="dxa"/>
                 </w:tcPr>
                 <w:p>
                   <w:pPr>
@@ -4462,7 +4462,7 @@
               </w:tc>
               <w:tc>
                 <w:tcPr>
-                  <w:tcW w:w="3766" w:type="dxa"/>
+                  <w:tcW w:w="6626" w:type="dxa"/>
                 </w:tcPr>
                 <w:p>
                   <w:pPr>
@@ -4485,7 +4485,7 @@
               </w:tc>
               <w:tc>
                 <w:tcPr>
-                  <w:tcW w:w="1606" w:type="dxa"/>
+                  <w:tcW w:w="238" w:type="dxa"/>
                 </w:tcPr>
                 <w:p>
                   <w:pPr>
@@ -4508,7 +4508,7 @@
               </w:tc>
               <w:tc>
                 <w:tcPr>
-                  <w:tcW w:w="1408" w:type="dxa"/>
+                  <w:tcW w:w="1314" w:type="dxa"/>
                 </w:tcPr>
                 <w:p>
                   <w:pPr>
@@ -4533,7 +4533,7 @@
             <w:tr>
               <w:tc>
                 <w:tcPr>
-                  <w:tcW w:w="3326" w:type="dxa"/>
+                  <w:tcW w:w="2424" w:type="dxa"/>
                   <w:tcBorders>
                     <w:top w:val="single" w:sz="12" w:space="0" w:color="006AAB"/>
                     <w:right w:val="none" w:sz="4" w:space="0" w:color="000000" w:themeColor="text1"/>
@@ -4562,7 +4562,7 @@
               </w:tc>
               <w:tc>
                 <w:tcPr>
-                  <w:tcW w:w="2320" w:type="dxa"/>
+                  <w:tcW w:w="1824" w:type="dxa"/>
                   <w:tcBorders>
                     <w:top w:val="single" w:sz="12" w:space="0" w:color="006AAB"/>
                     <w:left w:val="none" w:sz="4" w:space="0" w:color="000000" w:themeColor="text1"/>
@@ -4584,7 +4584,7 @@
               </w:tc>
               <w:tc>
                 <w:tcPr>
-                  <w:tcW w:w="3766" w:type="dxa"/>
+                  <w:tcW w:w="6626" w:type="dxa"/>
                   <w:tcBorders>
                     <w:top w:val="single" w:sz="12" w:space="0" w:color="006AAB"/>
                     <w:left w:val="none" w:sz="4" w:space="0" w:color="000000" w:themeColor="text1"/>
@@ -4605,7 +4605,7 @@
               </w:tc>
               <w:tc>
                 <w:tcPr>
-                  <w:tcW w:w="1606" w:type="dxa"/>
+                  <w:tcW w:w="238" w:type="dxa"/>
                   <w:tcBorders>
                     <w:top w:val="single" w:sz="12" w:space="0" w:color="006AAB"/>
                   </w:tcBorders>
@@ -4652,7 +4652,7 @@
               </w:tc>
               <w:tc>
                 <w:tcPr>
-                  <w:tcW w:w="1408" w:type="dxa"/>
+                  <w:tcW w:w="1314" w:type="dxa"/>
                   <w:tcBorders>
                     <w:top w:val="single" w:sz="12" w:space="0" w:color="006AAB"/>
                   </w:tcBorders>
@@ -4699,6 +4699,64 @@
               </w:tc>
             </w:tr>
           </w:tbl>
+          <w:p>
+            <w:pPr>
+              <w:spacing w:before="120" w:after="120"/>
+              <w:rPr>
+                <w:rFonts w:ascii="Arial" w:hAnsi="Arial" w:cs="Arial"/>
+                <w:sz w:val="18"/>
+                <w:szCs w:val="18"/>
+                <w:lang w:val="en-GB"/>
+              </w:rPr>
+            </w:pPr>
+            <w:r>
+              <w:rPr>
+                <w:rFonts w:ascii="Arial" w:hAnsi="Arial" w:cs="Arial"/>
+                <w:sz w:val="18"/>
+                <w:szCs w:val="18"/>
+                <w:lang w:val="en-GB"/>
+              </w:rPr>
+              <w:t>[</w:t>
+            </w:r>
+            <w:proofErr w:type="spellStart"/>
+            <w:r>
+              <w:rPr>
+                <w:rFonts w:ascii="Arial" w:hAnsi="Arial" w:cs="Arial"/>
+                <w:sz w:val="18"/>
+                <w:szCs w:val="18"/>
+                <w:lang w:val="en-GB"/>
+              </w:rPr>
+              <w:t>costsDescription</w:t>
+            </w:r>
+            <w:r>
+              <w:rPr>
+                <w:rFonts w:ascii="Arial" w:hAnsi="Arial" w:cs="Arial"/>
+                <w:sz w:val="18"/>
+                <w:szCs w:val="18"/>
+                <w:lang w:val="en-GB"/>
+              </w:rPr>
+              <w:t>s</w:t>
+            </w:r>
+            <w:proofErr w:type="spellEnd"/>
+            <w:r>
+              <w:rPr>
+                <w:rFonts w:ascii="Arial" w:hAnsi="Arial" w:cs="Arial"/>
+                <w:sz w:val="18"/>
+                <w:szCs w:val="18"/>
+                <w:lang w:val="en-GB"/>
+              </w:rPr>
+              <w:t>]</w:t>
+            </w:r>
+            <w:r>
+              <w:rPr>
+                <w:rFonts w:ascii="Arial" w:hAnsi="Arial" w:cs="Arial"/>
+                <w:sz w:val="18"/>
+                <w:szCs w:val="18"/>
+                <w:lang w:val="en-GB"/>
+              </w:rPr>
+              <w:t xml:space="preserve"> </w:t>
+            </w:r>
+          </w:p>
           <w:p>
             <w:pPr>
               <w:spacing w:before="120" w:after="120"/>

</xml_diff>

<commit_message>
Cost: Remove cost coverage when no costs are provided in the templates
</commit_message>
<xml_diff>
--- a/src/main/resources/org/damap/base/template/FWFTemplate.docx
+++ b/src/main/resources/org/damap/base/template/FWFTemplate.docx
@@ -51,31 +51,7 @@
           <w:szCs w:val="64"/>
           <w:lang w:val="en-GB"/>
         </w:rPr>
-        <w:t>[</w:t>
-      </w:r>
-      <w:proofErr w:type="spellStart"/>
-      <w:r>
-        <w:rPr>
-          <w:b/>
-          <w:bCs/>
-          <w:color w:val="006699"/>
-          <w:sz w:val="64"/>
-          <w:szCs w:val="64"/>
-          <w:lang w:val="en-GB"/>
-        </w:rPr>
-        <w:t>projectname</w:t>
-      </w:r>
-      <w:proofErr w:type="spellEnd"/>
-      <w:r>
-        <w:rPr>
-          <w:b/>
-          <w:bCs/>
-          <w:color w:val="006699"/>
-          <w:sz w:val="64"/>
-          <w:szCs w:val="64"/>
-          <w:lang w:val="en-GB"/>
-        </w:rPr>
-        <w:t>]</w:t>
+        <w:t>[projectname]</w:t>
       </w:r>
     </w:p>
     <w:p>
@@ -257,34 +233,14 @@
                 <w:szCs w:val="20"/>
               </w:rPr>
             </w:pPr>
-            <w:proofErr w:type="spellStart"/>
             <w:r>
               <w:rPr>
                 <w:color w:val="92D050"/>
                 <w:sz w:val="20"/>
                 <w:szCs w:val="20"/>
               </w:rPr>
-              <w:t>dd</w:t>
+              <w:t>dd/mm/yyyy</w:t>
             </w:r>
-            <w:proofErr w:type="spellEnd"/>
-            <w:r>
-              <w:rPr>
-                <w:color w:val="92D050"/>
-                <w:sz w:val="20"/>
-                <w:szCs w:val="20"/>
-              </w:rPr>
-              <w:t>/mm/</w:t>
-            </w:r>
-            <w:proofErr w:type="spellStart"/>
-            <w:r>
-              <w:rPr>
-                <w:color w:val="92D050"/>
-                <w:sz w:val="20"/>
-                <w:szCs w:val="20"/>
-              </w:rPr>
-              <w:t>yyyy</w:t>
-            </w:r>
-            <w:proofErr w:type="spellEnd"/>
           </w:p>
         </w:tc>
         <w:tc>
@@ -1550,43 +1506,7 @@
                 <w:sz w:val="18"/>
                 <w:szCs w:val="18"/>
               </w:rPr>
-              <w:t xml:space="preserve">Give details on the data format: the way in which the data is encoded for storage, often reflected by the filename extension (for example, pdf, </w:t>
-            </w:r>
-            <w:proofErr w:type="spellStart"/>
-            <w:r>
-              <w:rPr>
-                <w:rFonts w:ascii="Arial" w:hAnsi="Arial" w:cs="Arial"/>
-                <w:sz w:val="18"/>
-                <w:szCs w:val="18"/>
-              </w:rPr>
-              <w:t>xls</w:t>
-            </w:r>
-            <w:proofErr w:type="spellEnd"/>
-            <w:r>
-              <w:rPr>
-                <w:rFonts w:ascii="Arial" w:hAnsi="Arial" w:cs="Arial"/>
-                <w:sz w:val="18"/>
-                <w:szCs w:val="18"/>
-              </w:rPr>
-              <w:t xml:space="preserve">, doc, txt, or </w:t>
-            </w:r>
-            <w:proofErr w:type="spellStart"/>
-            <w:r>
-              <w:rPr>
-                <w:rFonts w:ascii="Arial" w:hAnsi="Arial" w:cs="Arial"/>
-                <w:sz w:val="18"/>
-                <w:szCs w:val="18"/>
-              </w:rPr>
-              <w:t>rdf</w:t>
-            </w:r>
-            <w:proofErr w:type="spellEnd"/>
-            <w:r>
-              <w:rPr>
-                <w:rFonts w:ascii="Arial" w:hAnsi="Arial" w:cs="Arial"/>
-                <w:sz w:val="18"/>
-                <w:szCs w:val="18"/>
-              </w:rPr>
-              <w:t>).</w:t>
+              <w:t>Give details on the data format: the way in which the data is encoded for storage, often reflected by the filename extension (for example, pdf, xls, doc, txt, or rdf).</w:t>
             </w:r>
           </w:p>
           <w:p>
@@ -1829,19 +1749,8 @@
                   <w:sz w:val="18"/>
                   <w:szCs w:val="18"/>
                 </w:rPr>
-                <w:t xml:space="preserve">Digital Curation </w:t>
+                <w:t>Digital Curation Center</w:t>
               </w:r>
-              <w:proofErr w:type="spellStart"/>
-              <w:r>
-                <w:rPr>
-                  <w:rStyle w:val="Hyperlink"/>
-                  <w:rFonts w:ascii="Arial" w:hAnsi="Arial" w:cs="Arial"/>
-                  <w:sz w:val="18"/>
-                  <w:szCs w:val="18"/>
-                </w:rPr>
-                <w:t>Center</w:t>
-              </w:r>
-              <w:proofErr w:type="spellEnd"/>
             </w:hyperlink>
             <w:r>
               <w:rPr>
@@ -3152,27 +3061,7 @@
                 <w:szCs w:val="18"/>
                 <w:lang w:val="en-US"/>
               </w:rPr>
-              <w:t xml:space="preserve">What ethical issues and codes of conduct are there, and how will they be </w:t>
-            </w:r>
-            <w:proofErr w:type="gramStart"/>
-            <w:r>
-              <w:rPr>
-                <w:rFonts w:ascii="Arial" w:hAnsi="Arial" w:cs="Arial"/>
-                <w:sz w:val="18"/>
-                <w:szCs w:val="18"/>
-                <w:lang w:val="en-US"/>
-              </w:rPr>
-              <w:t>taken into account</w:t>
-            </w:r>
-            <w:proofErr w:type="gramEnd"/>
-            <w:r>
-              <w:rPr>
-                <w:rFonts w:ascii="Arial" w:hAnsi="Arial" w:cs="Arial"/>
-                <w:sz w:val="18"/>
-                <w:szCs w:val="18"/>
-                <w:lang w:val="en-US"/>
-              </w:rPr>
-              <w:t>?</w:t>
+              <w:t>What ethical issues and codes of conduct are there, and how will they be taken into account?</w:t>
             </w:r>
           </w:p>
         </w:tc>
@@ -3233,27 +3122,7 @@
                 <w:lang w:val="en-US"/>
               </w:rPr>
               <w:lastRenderedPageBreak/>
-              <w:t xml:space="preserve">Follow the national and international codes of </w:t>
-            </w:r>
-            <w:proofErr w:type="gramStart"/>
-            <w:r>
-              <w:rPr>
-                <w:rFonts w:ascii="Arial" w:hAnsi="Arial" w:cs="Arial"/>
-                <w:sz w:val="18"/>
-                <w:szCs w:val="18"/>
-                <w:lang w:val="en-US"/>
-              </w:rPr>
-              <w:t>conducts</w:t>
-            </w:r>
-            <w:proofErr w:type="gramEnd"/>
-            <w:r>
-              <w:rPr>
-                <w:rFonts w:ascii="Arial" w:hAnsi="Arial" w:cs="Arial"/>
-                <w:sz w:val="18"/>
-                <w:szCs w:val="18"/>
-                <w:lang w:val="en-US"/>
-              </w:rPr>
-              <w:t xml:space="preserve"> and institutional ethical guidelines, and check if ethical review (for example, by an ethics committee) is required for data collection in the research project.</w:t>
+              <w:t>Follow the national and international codes of conducts and institutional ethical guidelines, and check if ethical review (for example, by an ethics committee) is required for data collection in the research project.</w:t>
             </w:r>
             <w:r>
               <w:rPr>
@@ -3609,7 +3478,6 @@
               </w:rPr>
               <w:t>[</w:t>
             </w:r>
-            <w:proofErr w:type="spellStart"/>
             <w:r>
               <w:rPr>
                 <w:rFonts w:ascii="Arial" w:hAnsi="Arial" w:cs="Arial"/>
@@ -3620,7 +3488,6 @@
               </w:rPr>
               <w:t>grantid</w:t>
             </w:r>
-            <w:proofErr w:type="spellEnd"/>
             <w:r>
               <w:rPr>
                 <w:rFonts w:ascii="Arial" w:hAnsi="Arial" w:cs="Arial"/>
@@ -3655,33 +3522,7 @@
                 <w:szCs w:val="18"/>
                 <w:lang w:val="de-AT"/>
               </w:rPr>
-              <w:t xml:space="preserve">DMP </w:t>
-            </w:r>
-            <w:proofErr w:type="spellStart"/>
-            <w:r>
-              <w:rPr>
-                <w:rFonts w:ascii="Arial" w:hAnsi="Arial" w:cs="Arial"/>
-                <w:b/>
-                <w:bCs/>
-                <w:iCs/>
-                <w:sz w:val="18"/>
-                <w:szCs w:val="18"/>
-                <w:lang w:val="de-AT"/>
-              </w:rPr>
-              <w:t>version</w:t>
-            </w:r>
-            <w:proofErr w:type="spellEnd"/>
-            <w:r>
-              <w:rPr>
-                <w:rFonts w:ascii="Arial" w:hAnsi="Arial" w:cs="Arial"/>
-                <w:b/>
-                <w:bCs/>
-                <w:iCs/>
-                <w:sz w:val="18"/>
-                <w:szCs w:val="18"/>
-                <w:lang w:val="de-AT"/>
-              </w:rPr>
-              <w:t>:</w:t>
+              <w:t>DMP version:</w:t>
             </w:r>
             <w:r>
               <w:rPr>
@@ -3702,33 +3543,7 @@
                 <w:szCs w:val="18"/>
                 <w:lang w:val="de-AT"/>
               </w:rPr>
-              <w:t>[Nr.], [</w:t>
-            </w:r>
-            <w:proofErr w:type="spellStart"/>
-            <w:proofErr w:type="gramStart"/>
-            <w:r>
-              <w:rPr>
-                <w:rFonts w:ascii="Arial" w:hAnsi="Arial" w:cs="Arial"/>
-                <w:iCs/>
-                <w:color w:val="92D050"/>
-                <w:sz w:val="18"/>
-                <w:szCs w:val="18"/>
-                <w:lang w:val="de-AT"/>
-              </w:rPr>
-              <w:t>dd.mm.yyyy</w:t>
-            </w:r>
-            <w:proofErr w:type="spellEnd"/>
-            <w:proofErr w:type="gramEnd"/>
-            <w:r>
-              <w:rPr>
-                <w:rFonts w:ascii="Arial" w:hAnsi="Arial" w:cs="Arial"/>
-                <w:iCs/>
-                <w:color w:val="92D050"/>
-                <w:sz w:val="18"/>
-                <w:szCs w:val="18"/>
-                <w:lang w:val="de-AT"/>
-              </w:rPr>
-              <w:t>]</w:t>
+              <w:t>[Nr.], [dd.mm.yyyy]</w:t>
             </w:r>
           </w:p>
           <w:p>
@@ -3745,7 +3560,6 @@
                 <w:lang w:val="de-AT"/>
               </w:rPr>
             </w:pPr>
-            <w:proofErr w:type="spellStart"/>
             <w:r>
               <w:rPr>
                 <w:rFonts w:ascii="Arial" w:hAnsi="Arial" w:cs="Arial"/>
@@ -3768,20 +3582,7 @@
                 <w:szCs w:val="18"/>
                 <w:lang w:val="de-AT"/>
               </w:rPr>
-              <w:t>ontributors</w:t>
-            </w:r>
-            <w:proofErr w:type="spellEnd"/>
-            <w:r>
-              <w:rPr>
-                <w:rFonts w:ascii="Arial" w:hAnsi="Arial" w:cs="Arial"/>
-                <w:b/>
-                <w:bCs/>
-                <w:iCs/>
-                <w:sz w:val="18"/>
-                <w:szCs w:val="18"/>
-                <w:lang w:val="de-AT"/>
-              </w:rPr>
-              <w:t>:</w:t>
+              <w:t>ontributors:</w:t>
             </w:r>
           </w:p>
           <w:p>
@@ -3804,29 +3605,7 @@
                 <w:szCs w:val="18"/>
                 <w:lang w:val="de-AT"/>
               </w:rPr>
-              <w:t>[</w:t>
-            </w:r>
-            <w:proofErr w:type="spellStart"/>
-            <w:r>
-              <w:rPr>
-                <w:rFonts w:ascii="Arial" w:hAnsi="Arial" w:cs="Arial"/>
-                <w:iCs/>
-                <w:sz w:val="18"/>
-                <w:szCs w:val="18"/>
-                <w:lang w:val="de-AT"/>
-              </w:rPr>
-              <w:t>contributors</w:t>
-            </w:r>
-            <w:proofErr w:type="spellEnd"/>
-            <w:r>
-              <w:rPr>
-                <w:rFonts w:ascii="Arial" w:hAnsi="Arial" w:cs="Arial"/>
-                <w:iCs/>
-                <w:sz w:val="18"/>
-                <w:szCs w:val="18"/>
-                <w:lang w:val="de-AT"/>
-              </w:rPr>
-              <w:t>]</w:t>
+              <w:t>[contributors]</w:t>
             </w:r>
           </w:p>
         </w:tc>
@@ -4286,25 +4065,7 @@
                       <w:sz w:val="18"/>
                       <w:szCs w:val="18"/>
                     </w:rPr>
-                    <w:t>[</w:t>
-                  </w:r>
-                  <w:proofErr w:type="spellStart"/>
-                  <w:r>
-                    <w:rPr>
-                      <w:bCs/>
-                      <w:sz w:val="18"/>
-                      <w:szCs w:val="18"/>
-                    </w:rPr>
-                    <w:t>costTable</w:t>
-                  </w:r>
-                  <w:proofErr w:type="spellEnd"/>
-                  <w:r>
-                    <w:rPr>
-                      <w:bCs/>
-                      <w:sz w:val="18"/>
-                      <w:szCs w:val="18"/>
-                    </w:rPr>
-                    <w:t>]</w:t>
+                    <w:t>[costTable]</w:t>
                   </w:r>
                 </w:p>
               </w:tc>
@@ -4331,25 +4092,7 @@
                       <w:sz w:val="18"/>
                       <w:szCs w:val="18"/>
                     </w:rPr>
-                    <w:t>[</w:t>
-                  </w:r>
-                  <w:proofErr w:type="spellStart"/>
-                  <w:r>
-                    <w:rPr>
-                      <w:bCs/>
-                      <w:sz w:val="18"/>
-                      <w:szCs w:val="18"/>
-                    </w:rPr>
-                    <w:t>costTable</w:t>
-                  </w:r>
-                  <w:proofErr w:type="spellEnd"/>
-                  <w:r>
-                    <w:rPr>
-                      <w:bCs/>
-                      <w:sz w:val="18"/>
-                      <w:szCs w:val="18"/>
-                    </w:rPr>
-                    <w:t>]</w:t>
+                    <w:t>[costTable]</w:t>
                   </w:r>
                 </w:p>
               </w:tc>
@@ -4628,25 +4371,7 @@
                       <w:sz w:val="18"/>
                       <w:szCs w:val="18"/>
                     </w:rPr>
-                    <w:t>[</w:t>
-                  </w:r>
-                  <w:proofErr w:type="spellStart"/>
-                  <w:r>
-                    <w:rPr>
-                      <w:b/>
-                      <w:sz w:val="18"/>
-                      <w:szCs w:val="18"/>
-                    </w:rPr>
-                    <w:t>costcurrency</w:t>
-                  </w:r>
-                  <w:proofErr w:type="spellEnd"/>
-                  <w:r>
-                    <w:rPr>
-                      <w:b/>
-                      <w:sz w:val="18"/>
-                      <w:szCs w:val="18"/>
-                    </w:rPr>
-                    <w:t>]</w:t>
+                    <w:t>[costcurrency]</w:t>
                   </w:r>
                 </w:p>
               </w:tc>
@@ -4675,25 +4400,7 @@
                       <w:sz w:val="18"/>
                       <w:szCs w:val="18"/>
                     </w:rPr>
-                    <w:t>[</w:t>
-                  </w:r>
-                  <w:proofErr w:type="spellStart"/>
-                  <w:r>
-                    <w:rPr>
-                      <w:b/>
-                      <w:sz w:val="18"/>
-                      <w:szCs w:val="18"/>
-                    </w:rPr>
-                    <w:t>costtotal</w:t>
-                  </w:r>
-                  <w:proofErr w:type="spellEnd"/>
-                  <w:r>
-                    <w:rPr>
-                      <w:b/>
-                      <w:sz w:val="18"/>
-                      <w:szCs w:val="18"/>
-                    </w:rPr>
-                    <w:t>]</w:t>
+                    <w:t>[costtotal]</w:t>
                   </w:r>
                 </w:p>
               </w:tc>
@@ -4716,17 +4423,7 @@
                 <w:szCs w:val="18"/>
                 <w:lang w:val="en-GB"/>
               </w:rPr>
-              <w:t>[</w:t>
-            </w:r>
-            <w:proofErr w:type="spellStart"/>
-            <w:r>
-              <w:rPr>
-                <w:rFonts w:ascii="Arial" w:hAnsi="Arial" w:cs="Arial"/>
-                <w:sz w:val="18"/>
-                <w:szCs w:val="18"/>
-                <w:lang w:val="en-GB"/>
-              </w:rPr>
-              <w:t>costsDescription</w:t>
+              <w:t>[costsDescription</w:t>
             </w:r>
             <w:r>
               <w:rPr>
@@ -4737,7 +4434,6 @@
               </w:rPr>
               <w:t>s</w:t>
             </w:r>
-            <w:proofErr w:type="spellEnd"/>
             <w:r>
               <w:rPr>
                 <w:rFonts w:ascii="Arial" w:hAnsi="Arial" w:cs="Arial"/>
@@ -4750,54 +4446,12 @@
             <w:r>
               <w:rPr>
                 <w:rFonts w:ascii="Arial" w:hAnsi="Arial" w:cs="Arial"/>
+                <w:color w:val="92D050"/>
                 <w:sz w:val="18"/>
                 <w:szCs w:val="18"/>
                 <w:lang w:val="en-GB"/>
               </w:rPr>
-              <w:t xml:space="preserve"> </w:t>
-            </w:r>
-          </w:p>
-          <w:p>
-            <w:pPr>
-              <w:spacing w:before="120" w:after="120"/>
-              <w:rPr>
-                <w:rFonts w:ascii="Arial" w:hAnsi="Arial" w:cs="Arial"/>
-                <w:color w:val="000000" w:themeColor="text1"/>
-                <w:sz w:val="18"/>
-                <w:szCs w:val="18"/>
-                <w:lang w:val="en-GB"/>
-              </w:rPr>
-            </w:pPr>
-            <w:r>
-              <w:rPr>
-                <w:rFonts w:ascii="Arial" w:hAnsi="Arial" w:cs="Arial"/>
-                <w:color w:val="92D050"/>
-                <w:sz w:val="18"/>
-                <w:szCs w:val="18"/>
-                <w:lang w:val="en-GB"/>
-              </w:rPr>
-              <w:t>Coverage of costs:</w:t>
-            </w:r>
-          </w:p>
-          <w:p>
-            <w:pPr>
-              <w:spacing w:before="120" w:after="120"/>
-              <w:rPr>
-                <w:rFonts w:ascii="Arial" w:hAnsi="Arial" w:cs="Arial"/>
-                <w:sz w:val="18"/>
-                <w:szCs w:val="18"/>
-                <w:lang w:val="en-GB"/>
-              </w:rPr>
-            </w:pPr>
-            <w:r>
-              <w:rPr>
-                <w:rFonts w:ascii="Arial" w:hAnsi="Arial" w:cs="Arial"/>
-                <w:color w:val="92D050"/>
-                <w:sz w:val="18"/>
-                <w:szCs w:val="18"/>
-                <w:lang w:val="en-GB"/>
-              </w:rPr>
-              <w:t>…</w:t>
+              <w:t>[costCoverage]</w:t>
             </w:r>
           </w:p>
         </w:tc>
@@ -5209,23 +4863,7 @@
                       <w:sz w:val="18"/>
                       <w:szCs w:val="18"/>
                     </w:rPr>
-                    <w:t>[</w:t>
-                  </w:r>
-                  <w:proofErr w:type="spellStart"/>
-                  <w:r>
-                    <w:rPr>
-                      <w:sz w:val="18"/>
-                      <w:szCs w:val="18"/>
-                    </w:rPr>
-                    <w:t>datasetTable</w:t>
-                  </w:r>
-                  <w:proofErr w:type="spellEnd"/>
-                  <w:r>
-                    <w:rPr>
-                      <w:sz w:val="18"/>
-                      <w:szCs w:val="18"/>
-                    </w:rPr>
-                    <w:t>]</w:t>
+                    <w:t>[datasetTable]</w:t>
                   </w:r>
                 </w:p>
               </w:tc>
@@ -5379,7 +5017,6 @@
                       <w:sz w:val="18"/>
                       <w:szCs w:val="18"/>
                     </w:rPr>
-                    <w:lastRenderedPageBreak/>
                     <w:t>ID</w:t>
                   </w:r>
                 </w:p>
@@ -5556,6 +5193,7 @@
                 <w:szCs w:val="18"/>
                 <w:lang w:val="en-GB"/>
               </w:rPr>
+              <w:lastRenderedPageBreak/>
               <w:t>Reused datasets:</w:t>
             </w:r>
           </w:p>
@@ -5819,23 +5457,7 @@
                       <w:sz w:val="18"/>
                       <w:szCs w:val="18"/>
                     </w:rPr>
-                    <w:t>[</w:t>
-                  </w:r>
-                  <w:proofErr w:type="spellStart"/>
-                  <w:r>
-                    <w:rPr>
-                      <w:sz w:val="18"/>
-                      <w:szCs w:val="18"/>
-                    </w:rPr>
-                    <w:t>reusedDatasetTable</w:t>
-                  </w:r>
-                  <w:proofErr w:type="spellEnd"/>
-                  <w:r>
-                    <w:rPr>
-                      <w:sz w:val="18"/>
-                      <w:szCs w:val="18"/>
-                    </w:rPr>
-                    <w:t>]</w:t>
+                    <w:t>[reusedDatasetTable]</w:t>
                   </w:r>
                 </w:p>
               </w:tc>
@@ -5994,23 +5616,7 @@
                       <w:sz w:val="18"/>
                       <w:szCs w:val="18"/>
                     </w:rPr>
-                    <w:t>[</w:t>
-                  </w:r>
-                  <w:proofErr w:type="spellStart"/>
-                  <w:r>
-                    <w:rPr>
-                      <w:sz w:val="18"/>
-                      <w:szCs w:val="18"/>
-                    </w:rPr>
-                    <w:t>reusedDatasetTable</w:t>
-                  </w:r>
-                  <w:proofErr w:type="spellEnd"/>
-                  <w:r>
-                    <w:rPr>
-                      <w:sz w:val="18"/>
-                      <w:szCs w:val="18"/>
-                    </w:rPr>
-                    <w:t>]</w:t>
+                    <w:t>[reusedDatasetTable]</w:t>
                   </w:r>
                 </w:p>
               </w:tc>
@@ -6160,27 +5766,7 @@
                 <w:szCs w:val="18"/>
                 <w:lang w:val="en-GB"/>
               </w:rPr>
-              <w:t>[</w:t>
-            </w:r>
-            <w:proofErr w:type="spellStart"/>
-            <w:r>
-              <w:rPr>
-                <w:rFonts w:ascii="Arial" w:hAnsi="Arial" w:cs="Arial"/>
-                <w:sz w:val="18"/>
-                <w:szCs w:val="18"/>
-                <w:lang w:val="en-GB"/>
-              </w:rPr>
-              <w:t>datageneration</w:t>
-            </w:r>
-            <w:proofErr w:type="spellEnd"/>
-            <w:r>
-              <w:rPr>
-                <w:rFonts w:ascii="Arial" w:hAnsi="Arial" w:cs="Arial"/>
-                <w:sz w:val="18"/>
-                <w:szCs w:val="18"/>
-                <w:lang w:val="en-GB"/>
-              </w:rPr>
-              <w:t>]</w:t>
+              <w:t>[datageneration]</w:t>
             </w:r>
           </w:p>
         </w:tc>
@@ -6318,27 +5904,7 @@
                 <w:szCs w:val="18"/>
                 <w:lang w:val="en-US"/>
               </w:rPr>
-              <w:t>[</w:t>
-            </w:r>
-            <w:proofErr w:type="spellStart"/>
-            <w:r>
-              <w:rPr>
-                <w:rFonts w:ascii="Arial" w:hAnsi="Arial" w:cs="Arial"/>
-                <w:sz w:val="18"/>
-                <w:szCs w:val="18"/>
-                <w:lang w:val="en-US"/>
-              </w:rPr>
-              <w:t>dataorganisation</w:t>
-            </w:r>
-            <w:proofErr w:type="spellEnd"/>
-            <w:r>
-              <w:rPr>
-                <w:rFonts w:ascii="Arial" w:hAnsi="Arial" w:cs="Arial"/>
-                <w:sz w:val="18"/>
-                <w:szCs w:val="18"/>
-                <w:lang w:val="en-US"/>
-              </w:rPr>
-              <w:t>]</w:t>
+              <w:t>[dataorganisation]</w:t>
             </w:r>
           </w:p>
           <w:p>
@@ -6540,27 +6106,7 @@
                 <w:szCs w:val="18"/>
                 <w:lang w:val="en-US"/>
               </w:rPr>
-              <w:t>[</w:t>
-            </w:r>
-            <w:proofErr w:type="spellStart"/>
-            <w:r>
-              <w:rPr>
-                <w:rFonts w:ascii="Arial" w:eastAsia="Arial" w:hAnsi="Arial" w:cs="Arial"/>
-                <w:sz w:val="18"/>
-                <w:szCs w:val="18"/>
-                <w:lang w:val="en-US"/>
-              </w:rPr>
-              <w:t>dataqualitycontrol</w:t>
-            </w:r>
-            <w:proofErr w:type="spellEnd"/>
-            <w:r>
-              <w:rPr>
-                <w:rFonts w:ascii="Arial" w:eastAsia="Arial" w:hAnsi="Arial" w:cs="Arial"/>
-                <w:sz w:val="18"/>
-                <w:szCs w:val="18"/>
-                <w:lang w:val="en-US"/>
-              </w:rPr>
-              <w:t>]</w:t>
+              <w:t>[dataqualitycontrol]</w:t>
             </w:r>
           </w:p>
         </w:tc>
@@ -6693,27 +6239,7 @@
                 <w:szCs w:val="18"/>
                 <w:lang w:val="en-GB"/>
               </w:rPr>
-              <w:t>[</w:t>
-            </w:r>
-            <w:proofErr w:type="spellStart"/>
-            <w:r>
-              <w:rPr>
-                <w:rFonts w:ascii="Arial" w:hAnsi="Arial" w:cs="Arial"/>
-                <w:sz w:val="18"/>
-                <w:szCs w:val="18"/>
-                <w:lang w:val="en-GB"/>
-              </w:rPr>
-              <w:t>storageintro</w:t>
-            </w:r>
-            <w:proofErr w:type="spellEnd"/>
-            <w:r>
-              <w:rPr>
-                <w:rFonts w:ascii="Arial" w:hAnsi="Arial" w:cs="Arial"/>
-                <w:sz w:val="18"/>
-                <w:szCs w:val="18"/>
-                <w:lang w:val="en-GB"/>
-              </w:rPr>
-              <w:t>]</w:t>
+              <w:t>[storageintro]</w:t>
             </w:r>
             <w:r>
               <w:rPr>
@@ -6784,7 +6310,6 @@
                 <w:szCs w:val="18"/>
                 <w:lang w:val="en-GB"/>
               </w:rPr>
-              <w:lastRenderedPageBreak/>
               <w:t xml:space="preserve">We pay strict attention to compliance with the relevant institutional and national data protection policies. </w:t>
             </w:r>
             <w:r>
@@ -6794,17 +6319,7 @@
                 <w:szCs w:val="18"/>
                 <w:lang w:val="en-GB"/>
               </w:rPr>
-              <w:t>[</w:t>
-            </w:r>
-            <w:proofErr w:type="spellStart"/>
-            <w:r>
-              <w:rPr>
-                <w:rFonts w:ascii="Arial" w:hAnsi="Arial" w:cs="Arial"/>
-                <w:sz w:val="18"/>
-                <w:szCs w:val="18"/>
-                <w:lang w:val="en-GB"/>
-              </w:rPr>
-              <w:t>sensitive</w:t>
+              <w:t>[sensitive</w:t>
             </w:r>
             <w:r>
               <w:rPr>
@@ -6815,7 +6330,6 @@
               </w:rPr>
               <w:t>data</w:t>
             </w:r>
-            <w:proofErr w:type="spellEnd"/>
             <w:r>
               <w:rPr>
                 <w:rFonts w:ascii="Arial" w:hAnsi="Arial" w:cs="Arial"/>
@@ -6844,6 +6358,7 @@
                 <w:szCs w:val="18"/>
                 <w:lang w:val="en-GB"/>
               </w:rPr>
+              <w:lastRenderedPageBreak/>
               <w:t>Access to data during research:</w:t>
             </w:r>
           </w:p>
@@ -7047,23 +6562,7 @@
                       <w:sz w:val="18"/>
                       <w:szCs w:val="18"/>
                     </w:rPr>
-                    <w:t>[</w:t>
-                  </w:r>
-                  <w:proofErr w:type="spellStart"/>
-                  <w:r>
-                    <w:rPr>
-                      <w:sz w:val="18"/>
-                      <w:szCs w:val="18"/>
-                    </w:rPr>
-                    <w:t>datasetAccessTable</w:t>
-                  </w:r>
-                  <w:proofErr w:type="spellEnd"/>
-                  <w:r>
-                    <w:rPr>
-                      <w:sz w:val="18"/>
-                      <w:szCs w:val="18"/>
-                    </w:rPr>
-                    <w:t>]</w:t>
+                    <w:t>[datasetAccessTable]</w:t>
                   </w:r>
                 </w:p>
               </w:tc>
@@ -7598,23 +7097,7 @@
                       <w:sz w:val="18"/>
                       <w:szCs w:val="18"/>
                     </w:rPr>
-                    <w:t>[</w:t>
-                  </w:r>
-                  <w:proofErr w:type="spellStart"/>
-                  <w:r>
-                    <w:rPr>
-                      <w:sz w:val="18"/>
-                      <w:szCs w:val="18"/>
-                    </w:rPr>
-                    <w:t>datasetPublicationTable</w:t>
-                  </w:r>
-                  <w:proofErr w:type="spellEnd"/>
-                  <w:r>
-                    <w:rPr>
-                      <w:sz w:val="18"/>
-                      <w:szCs w:val="18"/>
-                    </w:rPr>
-                    <w:t>]</w:t>
+                    <w:t>[datasetPublicationTable]</w:t>
                   </w:r>
                 </w:p>
               </w:tc>
@@ -7853,17 +7336,7 @@
                 <w:szCs w:val="18"/>
                 <w:lang w:val="en-GB"/>
               </w:rPr>
-              <w:t>[</w:t>
-            </w:r>
-            <w:proofErr w:type="spellStart"/>
-            <w:r>
-              <w:rPr>
-                <w:rFonts w:ascii="Arial" w:hAnsi="Arial" w:cs="Arial"/>
-                <w:sz w:val="18"/>
-                <w:szCs w:val="18"/>
-                <w:lang w:val="en-GB"/>
-              </w:rPr>
-              <w:t>closed</w:t>
+              <w:t>[closed</w:t>
             </w:r>
             <w:r>
               <w:rPr>
@@ -7881,17 +7354,7 @@
                 <w:szCs w:val="18"/>
                 <w:lang w:val="en-GB"/>
               </w:rPr>
-              <w:t>datasetreasons</w:t>
-            </w:r>
-            <w:proofErr w:type="spellEnd"/>
-            <w:r>
-              <w:rPr>
-                <w:rFonts w:ascii="Arial" w:hAnsi="Arial" w:cs="Arial"/>
-                <w:sz w:val="18"/>
-                <w:szCs w:val="18"/>
-                <w:lang w:val="en-GB"/>
-              </w:rPr>
-              <w:t>]</w:t>
+              <w:t>datasetreasons]</w:t>
             </w:r>
           </w:p>
           <w:p>
@@ -7911,27 +7374,7 @@
                 <w:szCs w:val="18"/>
                 <w:lang w:val="en-GB"/>
               </w:rPr>
-              <w:t>[</w:t>
-            </w:r>
-            <w:proofErr w:type="spellStart"/>
-            <w:r>
-              <w:rPr>
-                <w:rFonts w:ascii="Arial" w:hAnsi="Arial" w:cs="Arial"/>
-                <w:sz w:val="18"/>
-                <w:szCs w:val="18"/>
-                <w:lang w:val="en-GB"/>
-              </w:rPr>
-              <w:t>repoinformation</w:t>
-            </w:r>
-            <w:proofErr w:type="spellEnd"/>
-            <w:r>
-              <w:rPr>
-                <w:rFonts w:ascii="Arial" w:hAnsi="Arial" w:cs="Arial"/>
-                <w:sz w:val="18"/>
-                <w:szCs w:val="18"/>
-                <w:lang w:val="en-GB"/>
-              </w:rPr>
-              <w:t>]</w:t>
+              <w:t>[repoinformation]</w:t>
             </w:r>
           </w:p>
           <w:p>
@@ -7971,27 +7414,7 @@
                 <w:szCs w:val="18"/>
                 <w:lang w:val="en-US"/>
               </w:rPr>
-              <w:t>[</w:t>
-            </w:r>
-            <w:proofErr w:type="spellStart"/>
-            <w:r>
-              <w:rPr>
-                <w:rFonts w:ascii="Arial" w:hAnsi="Arial" w:cs="Arial"/>
-                <w:sz w:val="18"/>
-                <w:szCs w:val="18"/>
-                <w:lang w:val="en-US"/>
-              </w:rPr>
-              <w:t>restrictedAccessInfo</w:t>
-            </w:r>
-            <w:proofErr w:type="spellEnd"/>
-            <w:r>
-              <w:rPr>
-                <w:rFonts w:ascii="Arial" w:hAnsi="Arial" w:cs="Arial"/>
-                <w:sz w:val="18"/>
-                <w:szCs w:val="18"/>
-                <w:lang w:val="en-US"/>
-              </w:rPr>
-              <w:t>]</w:t>
+              <w:t>[restrictedAccessInfo]</w:t>
             </w:r>
             <w:bookmarkStart w:id="5" w:name="_Toc66691678"/>
           </w:p>
@@ -8233,23 +7656,7 @@
                       <w:sz w:val="18"/>
                       <w:szCs w:val="18"/>
                     </w:rPr>
-                    <w:t>[</w:t>
-                  </w:r>
-                  <w:proofErr w:type="spellStart"/>
-                  <w:r>
-                    <w:rPr>
-                      <w:sz w:val="18"/>
-                      <w:szCs w:val="18"/>
-                    </w:rPr>
-                    <w:t>datasetRepositoryTable</w:t>
-                  </w:r>
-                  <w:proofErr w:type="spellEnd"/>
-                  <w:r>
-                    <w:rPr>
-                      <w:sz w:val="18"/>
-                      <w:szCs w:val="18"/>
-                    </w:rPr>
-                    <w:t>]</w:t>
+                    <w:t>[datasetRepositoryTable]</w:t>
                   </w:r>
                 </w:p>
               </w:tc>
@@ -8313,7 +7720,6 @@
                       <w:sz w:val="18"/>
                       <w:szCs w:val="18"/>
                     </w:rPr>
-                    <w:lastRenderedPageBreak/>
                     <w:t>ID</w:t>
                   </w:r>
                 </w:p>
@@ -8387,23 +7793,7 @@
                       <w:sz w:val="18"/>
                       <w:szCs w:val="18"/>
                     </w:rPr>
-                    <w:t>[</w:t>
-                  </w:r>
-                  <w:proofErr w:type="spellStart"/>
-                  <w:r>
-                    <w:rPr>
-                      <w:sz w:val="18"/>
-                      <w:szCs w:val="18"/>
-                    </w:rPr>
-                    <w:t>targetaudience</w:t>
-                  </w:r>
-                  <w:proofErr w:type="spellEnd"/>
-                  <w:r>
-                    <w:rPr>
-                      <w:sz w:val="18"/>
-                      <w:szCs w:val="18"/>
-                    </w:rPr>
-                    <w:t>]</w:t>
+                    <w:t>[targetaudience]</w:t>
                   </w:r>
                 </w:p>
               </w:tc>
@@ -8426,6 +7816,7 @@
                 <w:szCs w:val="18"/>
                 <w:lang w:val="en-GB"/>
               </w:rPr>
+              <w:lastRenderedPageBreak/>
               <w:t xml:space="preserve">Overview of (unpublished) data that will be deleted: </w:t>
             </w:r>
           </w:p>
@@ -8650,23 +8041,7 @@
                       <w:sz w:val="18"/>
                       <w:szCs w:val="18"/>
                     </w:rPr>
-                    <w:t>[</w:t>
-                  </w:r>
-                  <w:proofErr w:type="spellStart"/>
-                  <w:r>
-                    <w:rPr>
-                      <w:sz w:val="18"/>
-                      <w:szCs w:val="18"/>
-                    </w:rPr>
-                    <w:t>datasetDeleteTable</w:t>
-                  </w:r>
-                  <w:proofErr w:type="spellEnd"/>
-                  <w:r>
-                    <w:rPr>
-                      <w:sz w:val="18"/>
-                      <w:szCs w:val="18"/>
-                    </w:rPr>
-                    <w:t>]</w:t>
+                    <w:t>[datasetDeleteTable]</w:t>
                   </w:r>
                 </w:p>
               </w:tc>
@@ -8692,23 +8067,7 @@
                       <w:sz w:val="18"/>
                       <w:szCs w:val="18"/>
                     </w:rPr>
-                    <w:t>[</w:t>
-                  </w:r>
-                  <w:proofErr w:type="spellStart"/>
-                  <w:r>
-                    <w:rPr>
-                      <w:sz w:val="18"/>
-                      <w:szCs w:val="18"/>
-                    </w:rPr>
-                    <w:t>datasetDeleteTable</w:t>
-                  </w:r>
-                  <w:proofErr w:type="spellEnd"/>
-                  <w:r>
-                    <w:rPr>
-                      <w:sz w:val="18"/>
-                      <w:szCs w:val="18"/>
-                    </w:rPr>
-                    <w:t>]</w:t>
+                    <w:t>[datasetDeleteTable]</w:t>
                   </w:r>
                 </w:p>
               </w:tc>
@@ -9030,7 +8389,6 @@
               </w:rPr>
               <w:t>[</w:t>
             </w:r>
-            <w:proofErr w:type="spellStart"/>
             <w:r>
               <w:rPr>
                 <w:rFonts w:ascii="Arial" w:hAnsi="Arial" w:cs="Arial"/>
@@ -9040,7 +8398,6 @@
               </w:rPr>
               <w:t>personaldata</w:t>
             </w:r>
-            <w:proofErr w:type="spellEnd"/>
             <w:r>
               <w:rPr>
                 <w:rFonts w:ascii="Arial" w:hAnsi="Arial" w:cs="Arial"/>
@@ -9104,7 +8461,6 @@
               </w:rPr>
               <w:t>[</w:t>
             </w:r>
-            <w:proofErr w:type="spellStart"/>
             <w:r>
               <w:rPr>
                 <w:rFonts w:ascii="Arial" w:hAnsi="Arial" w:cs="Arial"/>
@@ -9112,17 +8468,7 @@
                 <w:szCs w:val="18"/>
                 <w:lang w:val="en-GB"/>
               </w:rPr>
-              <w:t>legalrestriction</w:t>
-            </w:r>
-            <w:proofErr w:type="spellEnd"/>
-            <w:r>
-              <w:rPr>
-                <w:rFonts w:ascii="Arial" w:hAnsi="Arial" w:cs="Arial"/>
-                <w:sz w:val="18"/>
-                <w:szCs w:val="18"/>
-                <w:lang w:val="en-GB"/>
-              </w:rPr>
-              <w:t>]</w:t>
+              <w:t>legalrestriction]</w:t>
             </w:r>
           </w:p>
         </w:tc>
@@ -9222,27 +8568,7 @@
                 <w:szCs w:val="18"/>
                 <w:lang w:val="en-GB"/>
               </w:rPr>
-              <w:t>[</w:t>
-            </w:r>
-            <w:proofErr w:type="spellStart"/>
-            <w:r>
-              <w:rPr>
-                <w:rFonts w:ascii="Arial" w:hAnsi="Arial" w:cs="Arial"/>
-                <w:sz w:val="18"/>
-                <w:szCs w:val="18"/>
-                <w:lang w:val="en-GB"/>
-              </w:rPr>
-              <w:t>ethicalissues</w:t>
-            </w:r>
-            <w:proofErr w:type="spellEnd"/>
-            <w:r>
-              <w:rPr>
-                <w:rFonts w:ascii="Arial" w:hAnsi="Arial" w:cs="Arial"/>
-                <w:sz w:val="18"/>
-                <w:szCs w:val="18"/>
-                <w:lang w:val="en-GB"/>
-              </w:rPr>
-              <w:t>]</w:t>
+              <w:t>[ethicalissues]</w:t>
             </w:r>
           </w:p>
         </w:tc>
@@ -9407,27 +8733,7 @@
             <w:szCs w:val="16"/>
             <w:lang w:val="de-AT"/>
           </w:rPr>
-          <w:t xml:space="preserve"> DMP </w:t>
-        </w:r>
-        <w:proofErr w:type="spellStart"/>
-        <w:r>
-          <w:rPr>
-            <w:rFonts w:ascii="Arial" w:hAnsi="Arial" w:cs="Arial"/>
-            <w:sz w:val="16"/>
-            <w:szCs w:val="16"/>
-            <w:lang w:val="de-AT"/>
-          </w:rPr>
-          <w:t>Guidance</w:t>
-        </w:r>
-        <w:proofErr w:type="spellEnd"/>
-        <w:r>
-          <w:rPr>
-            <w:rFonts w:ascii="Arial" w:hAnsi="Arial" w:cs="Arial"/>
-            <w:sz w:val="16"/>
-            <w:szCs w:val="16"/>
-            <w:lang w:val="de-AT"/>
-          </w:rPr>
-          <w:t xml:space="preserve"> and Template (01/2022)</w:t>
+          <w:t xml:space="preserve"> DMP Guidance and Template (01/2022)</w:t>
         </w:r>
         <w:r>
           <w:rPr>
@@ -9590,7 +8896,6 @@
           </w:rPr>
           <w:t xml:space="preserve"> </w:t>
         </w:r>
-        <w:proofErr w:type="gramStart"/>
         <w:r>
           <w:rPr>
             <w:rFonts w:ascii="Arial" w:hAnsi="Arial" w:cs="Arial"/>
@@ -9598,17 +8903,7 @@
             <w:szCs w:val="16"/>
             <w:lang w:val="de-AT"/>
           </w:rPr>
-          <w:t>DMP Template</w:t>
-        </w:r>
-        <w:proofErr w:type="gramEnd"/>
-        <w:r>
-          <w:rPr>
-            <w:rFonts w:ascii="Arial" w:hAnsi="Arial" w:cs="Arial"/>
-            <w:sz w:val="16"/>
-            <w:szCs w:val="16"/>
-            <w:lang w:val="de-AT"/>
-          </w:rPr>
-          <w:t xml:space="preserve"> (01/2022)</w:t>
+          <w:t>DMP Template (01/2022)</w:t>
         </w:r>
         <w:r>
           <w:tab/>

</xml_diff>

<commit_message>
FWF: Update FWF template, remove detailed guidance table
</commit_message>
<xml_diff>
--- a/src/main/resources/org/damap/base/template/FWFTemplate.docx
+++ b/src/main/resources/org/damap/base/template/FWFTemplate.docx
@@ -1,6 +1,6 @@
 
 <file path=word/document.xml><?xml version="1.0" encoding="utf-8"?>
-<w:document xmlns:wpc="http://schemas.microsoft.com/office/word/2010/wordprocessingCanvas" xmlns:cx="http://schemas.microsoft.com/office/drawing/2014/chartex" xmlns:cx1="http://schemas.microsoft.com/office/drawing/2015/9/8/chartex" xmlns:cx2="http://schemas.microsoft.com/office/drawing/2015/10/21/chartex" xmlns:cx3="http://schemas.microsoft.com/office/drawing/2016/5/9/chartex" xmlns:cx4="http://schemas.microsoft.com/office/drawing/2016/5/10/chartex" xmlns:cx5="http://schemas.microsoft.com/office/drawing/2016/5/11/chartex" xmlns:cx6="http://schemas.microsoft.com/office/drawing/2016/5/12/chartex" xmlns:cx7="http://schemas.microsoft.com/office/drawing/2016/5/13/chartex" xmlns:cx8="http://schemas.microsoft.com/office/drawing/2016/5/14/chartex" xmlns:mc="http://schemas.openxmlformats.org/markup-compatibility/2006" xmlns:aink="http://schemas.microsoft.com/office/drawing/2016/ink" xmlns:am3d="http://schemas.microsoft.com/office/drawing/2017/model3d" xmlns:o="urn:schemas-microsoft-com:office:office" xmlns:oel="http://schemas.microsoft.com/office/2019/extlst" xmlns:r="http://schemas.openxmlformats.org/officeDocument/2006/relationships" xmlns:m="http://schemas.openxmlformats.org/officeDocument/2006/math" xmlns:v="urn:schemas-microsoft-com:vml" xmlns:wp14="http://schemas.microsoft.com/office/word/2010/wordprocessingDrawing" xmlns:wp="http://schemas.openxmlformats.org/drawingml/2006/wordprocessingDrawing" xmlns:w10="urn:schemas-microsoft-com:office:word" xmlns:w="http://schemas.openxmlformats.org/wordprocessingml/2006/main" xmlns:w14="http://schemas.microsoft.com/office/word/2010/wordml" xmlns:w15="http://schemas.microsoft.com/office/word/2012/wordml" xmlns:w16cex="http://schemas.microsoft.com/office/word/2018/wordml/cex" xmlns:w16cid="http://schemas.microsoft.com/office/word/2016/wordml/cid" xmlns:w16="http://schemas.microsoft.com/office/word/2018/wordml" xmlns:w16du="http://schemas.microsoft.com/office/word/2023/wordml/word16du" xmlns:w16sdtdh="http://schemas.microsoft.com/office/word/2020/wordml/sdtdatahash" xmlns:w16se="http://schemas.microsoft.com/office/word/2015/wordml/symex" xmlns:wpg="http://schemas.microsoft.com/office/word/2010/wordprocessingGroup" xmlns:wpi="http://schemas.microsoft.com/office/word/2010/wordprocessingInk" xmlns:wne="http://schemas.microsoft.com/office/word/2006/wordml" xmlns:wps="http://schemas.microsoft.com/office/word/2010/wordprocessingShape" mc:Ignorable="w14 w15 w16se w16cid w16 w16cex w16sdtdh w16du wp14">
+<w:document xmlns:wpc="http://schemas.microsoft.com/office/word/2010/wordprocessingCanvas" xmlns:cx="http://schemas.microsoft.com/office/drawing/2014/chartex" xmlns:cx1="http://schemas.microsoft.com/office/drawing/2015/9/8/chartex" xmlns:cx2="http://schemas.microsoft.com/office/drawing/2015/10/21/chartex" xmlns:cx3="http://schemas.microsoft.com/office/drawing/2016/5/9/chartex" xmlns:cx4="http://schemas.microsoft.com/office/drawing/2016/5/10/chartex" xmlns:cx5="http://schemas.microsoft.com/office/drawing/2016/5/11/chartex" xmlns:cx6="http://schemas.microsoft.com/office/drawing/2016/5/12/chartex" xmlns:cx7="http://schemas.microsoft.com/office/drawing/2016/5/13/chartex" xmlns:cx8="http://schemas.microsoft.com/office/drawing/2016/5/14/chartex" xmlns:mc="http://schemas.openxmlformats.org/markup-compatibility/2006" xmlns:aink="http://schemas.microsoft.com/office/drawing/2016/ink" xmlns:am3d="http://schemas.microsoft.com/office/drawing/2017/model3d" xmlns:o="urn:schemas-microsoft-com:office:office" xmlns:oel="http://schemas.microsoft.com/office/2019/extlst" xmlns:r="http://schemas.openxmlformats.org/officeDocument/2006/relationships" xmlns:m="http://schemas.openxmlformats.org/officeDocument/2006/math" xmlns:v="urn:schemas-microsoft-com:vml" xmlns:wp14="http://schemas.microsoft.com/office/word/2010/wordprocessingDrawing" xmlns:wp="http://schemas.openxmlformats.org/drawingml/2006/wordprocessingDrawing" xmlns:w10="urn:schemas-microsoft-com:office:word" xmlns:w="http://schemas.openxmlformats.org/wordprocessingml/2006/main" xmlns:w14="http://schemas.microsoft.com/office/word/2010/wordml" xmlns:w15="http://schemas.microsoft.com/office/word/2012/wordml" xmlns:w16cex="http://schemas.microsoft.com/office/word/2018/wordml/cex" xmlns:w16cid="http://schemas.microsoft.com/office/word/2016/wordml/cid" xmlns:w16="http://schemas.microsoft.com/office/word/2018/wordml" xmlns:w16du="http://schemas.microsoft.com/office/word/2023/wordml/word16du" xmlns:w16sdtdh="http://schemas.microsoft.com/office/word/2020/wordml/sdtdatahash" xmlns:w16sdtfl="http://schemas.microsoft.com/office/word/2024/wordml/sdtformatlock" xmlns:w16se="http://schemas.microsoft.com/office/word/2015/wordml/symex" xmlns:wpg="http://schemas.microsoft.com/office/word/2010/wordprocessingGroup" xmlns:wpi="http://schemas.microsoft.com/office/word/2010/wordprocessingInk" xmlns:wne="http://schemas.microsoft.com/office/word/2006/wordml" xmlns:wps="http://schemas.microsoft.com/office/word/2010/wordprocessingShape" mc:Ignorable="w14 w15 w16se w16cid w16 w16cex w16sdtdh w16sdtfl w16du wp14">
   <w:body>
     <w:p>
       <w:pPr>
@@ -726,19 +726,6 @@
           <w:szCs w:val="28"/>
           <w:lang w:val="en-GB"/>
         </w:rPr>
-      </w:pPr>
-    </w:p>
-    <w:p>
-      <w:pPr>
-        <w:ind w:left="-284"/>
-        <w:jc w:val="center"/>
-        <w:rPr>
-          <w:rFonts w:ascii="Arial" w:hAnsi="Arial" w:cs="Arial"/>
-          <w:b/>
-          <w:sz w:val="28"/>
-          <w:szCs w:val="28"/>
-          <w:lang w:val="en-GB"/>
-        </w:rPr>
         <w:sectPr>
           <w:footerReference w:type="default" r:id="rId19"/>
           <w:pgSz w:w="16838" w:h="11906" w:orient="landscape"/>
@@ -751,7 +738,7 @@
     </w:p>
     <w:p>
       <w:pPr>
-        <w:ind w:left="-284"/>
+        <w:spacing w:before="120" w:after="120"/>
         <w:jc w:val="center"/>
         <w:rPr>
           <w:rFonts w:ascii="Arial" w:hAnsi="Arial" w:cs="Arial"/>
@@ -772,2457 +759,38 @@
         <w:lastRenderedPageBreak/>
         <w:t>FWF Data Management Plan (DMP)</w:t>
       </w:r>
+    </w:p>
+    <w:p>
+      <w:pPr>
+        <w:spacing w:before="120" w:after="120"/>
+        <w:rPr>
+          <w:rFonts w:ascii="Arial" w:hAnsi="Arial" w:cs="Arial"/>
+          <w:bCs/>
+          <w:color w:val="92D050"/>
+          <w:lang w:val="en-GB"/>
+        </w:rPr>
+      </w:pPr>
       <w:r>
         <w:rPr>
           <w:rFonts w:ascii="Arial" w:hAnsi="Arial" w:cs="Arial"/>
-          <w:b/>
-          <w:sz w:val="28"/>
-          <w:szCs w:val="28"/>
-          <w:lang w:val="en-GB"/>
+          <w:bCs/>
+          <w:color w:val="92D050"/>
+          <w:lang w:val="en-US"/>
         </w:rPr>
-        <w:br/>
-        <w:t>Guidance and Template</w:t>
+        <w:t>This DMP follows the official FWF template. When revising this DMP, please check the guidance from FWF for more details: </w:t>
       </w:r>
-    </w:p>
-    <w:p>
-      <w:pPr>
-        <w:ind w:left="-284"/>
-        <w:rPr>
-          <w:rFonts w:ascii="Arial" w:hAnsi="Arial" w:cs="Arial"/>
-          <w:lang w:val="en-GB"/>
-        </w:rPr>
-      </w:pPr>
-      <w:bookmarkStart w:id="0" w:name="_Hlk90560798"/>
-      <w:r>
-        <w:rPr>
-          <w:rFonts w:ascii="Arial" w:hAnsi="Arial" w:cs="Arial"/>
-          <w:lang w:val="en-GB"/>
-        </w:rPr>
-        <w:t xml:space="preserve">These guidelines are intended to be used as a guidance in the creation of a data management plan for an approved FWF project. This document is based, with minor changes, on the </w:t>
-      </w:r>
-      <w:hyperlink r:id="rId20" w:tooltip="https://www.scienceeurope.org/our-priorities/research-data/research-data-management/" w:history="1">
+      <w:hyperlink r:id="rId20" w:history="1">
         <w:r>
           <w:rPr>
             <w:rStyle w:val="Hyperlink"/>
             <w:rFonts w:ascii="Arial" w:hAnsi="Arial" w:cs="Arial"/>
-            <w:lang w:val="en-GB"/>
+            <w:bCs/>
+            <w:color w:val="92D050"/>
+            <w:lang w:val="en-US"/>
           </w:rPr>
-          <w:t>RDM Guidance for Researchers</w:t>
+          <w:t>FWF DMP - Guidance and Template</w:t>
         </w:r>
       </w:hyperlink>
-      <w:r>
-        <w:rPr>
-          <w:rFonts w:ascii="Arial" w:hAnsi="Arial" w:cs="Arial"/>
-          <w:lang w:val="en-GB"/>
-        </w:rPr>
-        <w:t xml:space="preserve"> of Science Europe. </w:t>
-      </w:r>
-    </w:p>
-    <w:p>
-      <w:pPr>
-        <w:ind w:left="-284"/>
-        <w:rPr>
-          <w:rFonts w:ascii="Arial" w:hAnsi="Arial" w:cs="Arial"/>
-          <w:lang w:val="en-GB"/>
-        </w:rPr>
-      </w:pPr>
-      <w:r>
-        <w:rPr>
-          <w:rFonts w:ascii="Arial" w:hAnsi="Arial" w:cs="Arial"/>
-          <w:lang w:val="en-GB"/>
-        </w:rPr>
-        <w:t xml:space="preserve">Please answer all the questions in the second column and address the items in the third column. The DMP template can be found at the end of these guidelines, and further information is available in the </w:t>
-      </w:r>
-      <w:hyperlink r:id="rId21" w:tooltip="https://www.fwf.ac.at/fileadmin/files/Dokumente/Open_Access/FWF_DMPMatrix_e.pdf" w:history="1">
-        <w:r>
-          <w:rPr>
-            <w:rStyle w:val="Hyperlink"/>
-            <w:rFonts w:ascii="Arial" w:hAnsi="Arial" w:cs="Arial"/>
-            <w:lang w:val="en-GB"/>
-          </w:rPr>
-          <w:t>DMP Evaluation Rubric</w:t>
-        </w:r>
-      </w:hyperlink>
-      <w:r>
-        <w:rPr>
-          <w:rFonts w:ascii="Arial" w:hAnsi="Arial" w:cs="Arial"/>
-          <w:lang w:val="en-GB"/>
-        </w:rPr>
-        <w:t>.</w:t>
-      </w:r>
-    </w:p>
-    <w:p>
-      <w:pPr>
-        <w:ind w:left="-284"/>
-        <w:rPr>
-          <w:rFonts w:ascii="Arial" w:hAnsi="Arial" w:cs="Arial"/>
-          <w:lang w:val="en-GB"/>
-        </w:rPr>
-      </w:pPr>
-      <w:r>
-        <w:rPr>
-          <w:rFonts w:ascii="Arial" w:hAnsi="Arial" w:cs="Arial"/>
-          <w:b/>
-          <w:lang w:val="en-GB"/>
-        </w:rPr>
-        <w:br/>
-        <w:t>Guidance</w:t>
-      </w:r>
-      <w:bookmarkEnd w:id="0"/>
-    </w:p>
-    <w:tbl>
-      <w:tblPr>
-        <w:tblW w:w="15168" w:type="dxa"/>
-        <w:tblInd w:w="-289" w:type="dxa"/>
-        <w:tblBorders>
-          <w:top w:val="single" w:sz="4" w:space="0" w:color="auto"/>
-          <w:left w:val="single" w:sz="4" w:space="0" w:color="auto"/>
-          <w:bottom w:val="single" w:sz="4" w:space="0" w:color="auto"/>
-          <w:right w:val="single" w:sz="4" w:space="0" w:color="auto"/>
-          <w:insideH w:val="single" w:sz="4" w:space="0" w:color="auto"/>
-          <w:insideV w:val="single" w:sz="4" w:space="0" w:color="auto"/>
-        </w:tblBorders>
-        <w:tblLook w:val="04A0" w:firstRow="1" w:lastRow="0" w:firstColumn="1" w:lastColumn="0" w:noHBand="0" w:noVBand="1"/>
-      </w:tblPr>
-      <w:tblGrid>
-        <w:gridCol w:w="2344"/>
-        <w:gridCol w:w="3969"/>
-        <w:gridCol w:w="8855"/>
-      </w:tblGrid>
-      <w:tr>
-        <w:trPr>
-          <w:trHeight w:val="454"/>
-        </w:trPr>
-        <w:tc>
-          <w:tcPr>
-            <w:tcW w:w="15168" w:type="dxa"/>
-            <w:gridSpan w:val="3"/>
-            <w:tcBorders>
-              <w:top w:val="single" w:sz="4" w:space="0" w:color="auto"/>
-              <w:left w:val="single" w:sz="4" w:space="0" w:color="auto"/>
-              <w:bottom w:val="single" w:sz="4" w:space="0" w:color="auto"/>
-              <w:right w:val="single" w:sz="4" w:space="0" w:color="auto"/>
-            </w:tcBorders>
-            <w:shd w:val="clear" w:color="auto" w:fill="4F81BD"/>
-            <w:vAlign w:val="center"/>
-          </w:tcPr>
-          <w:p>
-            <w:pPr>
-              <w:pStyle w:val="NoSpacing"/>
-              <w:spacing w:before="120" w:after="120"/>
-              <w:ind w:left="-27"/>
-              <w:rPr>
-                <w:rFonts w:ascii="Arial" w:hAnsi="Arial" w:cs="Arial"/>
-                <w:b/>
-                <w:color w:val="FFFFFF"/>
-                <w:sz w:val="18"/>
-                <w:szCs w:val="18"/>
-                <w:lang w:val="en-GB"/>
-              </w:rPr>
-            </w:pPr>
-            <w:r>
-              <w:rPr>
-                <w:rFonts w:ascii="Arial" w:hAnsi="Arial" w:cs="Arial"/>
-                <w:b/>
-                <w:color w:val="FFFFFF" w:themeColor="background1"/>
-                <w:sz w:val="18"/>
-                <w:szCs w:val="18"/>
-                <w:lang w:val="en-GB"/>
-              </w:rPr>
-              <w:t>I General Information</w:t>
-            </w:r>
-          </w:p>
-        </w:tc>
-      </w:tr>
-      <w:tr>
-        <w:trPr>
-          <w:trHeight w:val="454"/>
-        </w:trPr>
-        <w:tc>
-          <w:tcPr>
-            <w:tcW w:w="2344" w:type="dxa"/>
-            <w:tcBorders>
-              <w:top w:val="single" w:sz="4" w:space="0" w:color="auto"/>
-              <w:left w:val="single" w:sz="4" w:space="0" w:color="auto"/>
-              <w:bottom w:val="single" w:sz="4" w:space="0" w:color="auto"/>
-              <w:right w:val="single" w:sz="4" w:space="0" w:color="auto"/>
-            </w:tcBorders>
-            <w:shd w:val="clear" w:color="auto" w:fill="auto"/>
-            <w:vAlign w:val="center"/>
-          </w:tcPr>
-          <w:p>
-            <w:pPr>
-              <w:pStyle w:val="NoSpacing"/>
-              <w:spacing w:before="120" w:after="120"/>
-              <w:rPr>
-                <w:rFonts w:ascii="Arial" w:hAnsi="Arial" w:cs="Arial"/>
-                <w:b/>
-                <w:sz w:val="18"/>
-                <w:szCs w:val="18"/>
-                <w:lang w:val="en-GB"/>
-              </w:rPr>
-            </w:pPr>
-            <w:r>
-              <w:rPr>
-                <w:rFonts w:ascii="Arial" w:hAnsi="Arial" w:cs="Arial"/>
-                <w:b/>
-                <w:sz w:val="18"/>
-                <w:szCs w:val="18"/>
-                <w:lang w:val="en-GB"/>
-              </w:rPr>
-              <w:t xml:space="preserve">I.1 Administrative information  </w:t>
-            </w:r>
-          </w:p>
-        </w:tc>
-        <w:tc>
-          <w:tcPr>
-            <w:tcW w:w="3969" w:type="dxa"/>
-            <w:tcBorders>
-              <w:top w:val="single" w:sz="4" w:space="0" w:color="auto"/>
-              <w:left w:val="single" w:sz="4" w:space="0" w:color="auto"/>
-              <w:bottom w:val="single" w:sz="4" w:space="0" w:color="auto"/>
-              <w:right w:val="single" w:sz="4" w:space="0" w:color="auto"/>
-            </w:tcBorders>
-            <w:shd w:val="clear" w:color="auto" w:fill="auto"/>
-            <w:vAlign w:val="center"/>
-          </w:tcPr>
-          <w:p>
-            <w:pPr>
-              <w:pStyle w:val="NoSpacing"/>
-              <w:spacing w:before="120" w:after="120"/>
-              <w:rPr>
-                <w:rFonts w:ascii="Arial" w:hAnsi="Arial" w:cs="Arial"/>
-                <w:i/>
-                <w:sz w:val="18"/>
-                <w:szCs w:val="18"/>
-                <w:lang w:val="en-GB"/>
-              </w:rPr>
-            </w:pPr>
-            <w:r>
-              <w:rPr>
-                <w:rFonts w:ascii="Arial" w:hAnsi="Arial" w:cs="Arial"/>
-                <w:sz w:val="18"/>
-                <w:szCs w:val="18"/>
-                <w:lang w:val="en-GB"/>
-              </w:rPr>
-              <w:t>Provide information such as name of principal investigator, FWF project number, and version of DMP</w:t>
-            </w:r>
-          </w:p>
-        </w:tc>
-        <w:tc>
-          <w:tcPr>
-            <w:tcW w:w="8855" w:type="dxa"/>
-            <w:tcBorders>
-              <w:top w:val="single" w:sz="4" w:space="0" w:color="auto"/>
-              <w:left w:val="single" w:sz="4" w:space="0" w:color="auto"/>
-              <w:bottom w:val="single" w:sz="4" w:space="0" w:color="auto"/>
-              <w:right w:val="single" w:sz="4" w:space="0" w:color="auto"/>
-            </w:tcBorders>
-            <w:shd w:val="clear" w:color="auto" w:fill="auto"/>
-            <w:vAlign w:val="center"/>
-          </w:tcPr>
-          <w:p>
-            <w:pPr>
-              <w:pStyle w:val="NoSpacing"/>
-              <w:numPr>
-                <w:ilvl w:val="0"/>
-                <w:numId w:val="18"/>
-              </w:numPr>
-              <w:spacing w:before="120" w:after="120"/>
-              <w:ind w:left="243" w:hanging="243"/>
-              <w:rPr>
-                <w:rFonts w:ascii="Arial" w:hAnsi="Arial" w:cs="Arial"/>
-                <w:i/>
-                <w:sz w:val="18"/>
-                <w:szCs w:val="18"/>
-                <w:lang w:val="en-GB"/>
-              </w:rPr>
-            </w:pPr>
-            <w:r>
-              <w:rPr>
-                <w:rFonts w:ascii="Arial" w:hAnsi="Arial" w:cs="Arial"/>
-                <w:sz w:val="18"/>
-                <w:szCs w:val="18"/>
-                <w:lang w:val="en-GB"/>
-              </w:rPr>
-              <w:t>Provide the relevant grant information.</w:t>
-            </w:r>
-          </w:p>
-          <w:p>
-            <w:pPr>
-              <w:pStyle w:val="NoSpacing"/>
-              <w:numPr>
-                <w:ilvl w:val="0"/>
-                <w:numId w:val="18"/>
-              </w:numPr>
-              <w:spacing w:before="120" w:after="120"/>
-              <w:ind w:left="243" w:hanging="243"/>
-              <w:rPr>
-                <w:rFonts w:ascii="Arial" w:hAnsi="Arial" w:cs="Arial"/>
-                <w:i/>
-                <w:sz w:val="18"/>
-                <w:szCs w:val="18"/>
-                <w:lang w:val="en-GB"/>
-              </w:rPr>
-            </w:pPr>
-            <w:r>
-              <w:rPr>
-                <w:rFonts w:ascii="Arial" w:hAnsi="Arial" w:cs="Arial"/>
-                <w:sz w:val="18"/>
-                <w:szCs w:val="18"/>
-                <w:lang w:val="en-GB"/>
-              </w:rPr>
-              <w:t>Consider regular updates of the DMP.</w:t>
-            </w:r>
-          </w:p>
-        </w:tc>
-      </w:tr>
-      <w:tr>
-        <w:trPr>
-          <w:trHeight w:val="454"/>
-        </w:trPr>
-        <w:tc>
-          <w:tcPr>
-            <w:tcW w:w="2344" w:type="dxa"/>
-            <w:tcBorders>
-              <w:top w:val="single" w:sz="4" w:space="0" w:color="auto"/>
-              <w:left w:val="single" w:sz="4" w:space="0" w:color="auto"/>
-              <w:bottom w:val="single" w:sz="4" w:space="0" w:color="auto"/>
-              <w:right w:val="single" w:sz="4" w:space="0" w:color="auto"/>
-            </w:tcBorders>
-            <w:shd w:val="clear" w:color="auto" w:fill="auto"/>
-            <w:vAlign w:val="center"/>
-          </w:tcPr>
-          <w:p>
-            <w:pPr>
-              <w:pStyle w:val="NoSpacing"/>
-              <w:spacing w:before="120" w:after="120"/>
-              <w:rPr>
-                <w:rFonts w:ascii="Arial" w:hAnsi="Arial" w:cs="Arial"/>
-                <w:b/>
-                <w:sz w:val="18"/>
-                <w:szCs w:val="18"/>
-                <w:lang w:val="en-GB"/>
-              </w:rPr>
-            </w:pPr>
-            <w:bookmarkStart w:id="1" w:name="_Hlk102035349"/>
-            <w:r>
-              <w:rPr>
-                <w:rFonts w:ascii="Arial" w:hAnsi="Arial" w:cs="Arial"/>
-                <w:b/>
-                <w:sz w:val="18"/>
-                <w:szCs w:val="18"/>
-                <w:lang w:val="en-GB"/>
-              </w:rPr>
-              <w:t xml:space="preserve">I.2 Data management responsibilities and resources </w:t>
-            </w:r>
-          </w:p>
-        </w:tc>
-        <w:tc>
-          <w:tcPr>
-            <w:tcW w:w="3969" w:type="dxa"/>
-            <w:tcBorders>
-              <w:top w:val="single" w:sz="4" w:space="0" w:color="auto"/>
-              <w:left w:val="single" w:sz="4" w:space="0" w:color="auto"/>
-              <w:bottom w:val="single" w:sz="4" w:space="0" w:color="auto"/>
-              <w:right w:val="single" w:sz="4" w:space="0" w:color="auto"/>
-            </w:tcBorders>
-            <w:shd w:val="clear" w:color="auto" w:fill="auto"/>
-            <w:vAlign w:val="center"/>
-          </w:tcPr>
-          <w:p>
-            <w:pPr>
-              <w:pStyle w:val="NoSpacing"/>
-              <w:spacing w:before="120" w:after="120"/>
-              <w:rPr>
-                <w:rFonts w:ascii="Arial" w:hAnsi="Arial" w:cs="Arial"/>
-                <w:sz w:val="18"/>
-                <w:szCs w:val="18"/>
-                <w:lang w:val="en-GB"/>
-              </w:rPr>
-            </w:pPr>
-            <w:r>
-              <w:rPr>
-                <w:rFonts w:ascii="Arial" w:hAnsi="Arial" w:cs="Arial"/>
-                <w:sz w:val="18"/>
-                <w:szCs w:val="18"/>
-                <w:lang w:val="en-GB"/>
-              </w:rPr>
-              <w:t>Who (for example, role, position, and institution) will be responsible for data management?</w:t>
-            </w:r>
-          </w:p>
-          <w:p>
-            <w:pPr>
-              <w:pStyle w:val="NoSpacing"/>
-              <w:spacing w:before="120" w:after="120"/>
-              <w:rPr>
-                <w:rFonts w:ascii="Arial" w:hAnsi="Arial" w:cs="Arial"/>
-                <w:sz w:val="18"/>
-                <w:szCs w:val="18"/>
-                <w:lang w:val="en-GB"/>
-              </w:rPr>
-            </w:pPr>
-            <w:r>
-              <w:rPr>
-                <w:rFonts w:ascii="Arial" w:hAnsi="Arial" w:cs="Arial"/>
-                <w:sz w:val="18"/>
-                <w:szCs w:val="18"/>
-                <w:lang w:val="en-GB"/>
-              </w:rPr>
-              <w:t xml:space="preserve">What resources will be dedicated to data management and ensuring that data will be FAIR (Findable, Accessible, Interoperable, Re-usable)? </w:t>
-            </w:r>
-          </w:p>
-        </w:tc>
-        <w:tc>
-          <w:tcPr>
-            <w:tcW w:w="8855" w:type="dxa"/>
-            <w:tcBorders>
-              <w:top w:val="single" w:sz="4" w:space="0" w:color="auto"/>
-              <w:left w:val="single" w:sz="4" w:space="0" w:color="auto"/>
-              <w:bottom w:val="single" w:sz="4" w:space="0" w:color="auto"/>
-              <w:right w:val="single" w:sz="4" w:space="0" w:color="auto"/>
-            </w:tcBorders>
-          </w:tcPr>
-          <w:p>
-            <w:pPr>
-              <w:pStyle w:val="NoSpacing"/>
-              <w:numPr>
-                <w:ilvl w:val="0"/>
-                <w:numId w:val="18"/>
-              </w:numPr>
-              <w:spacing w:before="120" w:after="120"/>
-              <w:ind w:left="243" w:hanging="243"/>
-              <w:rPr>
-                <w:rFonts w:ascii="Arial" w:hAnsi="Arial" w:cs="Arial"/>
-                <w:sz w:val="18"/>
-                <w:szCs w:val="18"/>
-                <w:lang w:val="en-GB"/>
-              </w:rPr>
-            </w:pPr>
-            <w:r>
-              <w:rPr>
-                <w:rFonts w:ascii="Arial" w:hAnsi="Arial" w:cs="Arial"/>
-                <w:sz w:val="18"/>
-                <w:szCs w:val="18"/>
-                <w:lang w:val="en-GB"/>
-              </w:rPr>
-              <w:t xml:space="preserve">Indicate who is responsible for implementing the DMP, and for ensuring it is reviewed and, if necessary, revised. </w:t>
-            </w:r>
-          </w:p>
-          <w:p>
-            <w:pPr>
-              <w:pStyle w:val="NoSpacing"/>
-              <w:numPr>
-                <w:ilvl w:val="0"/>
-                <w:numId w:val="18"/>
-              </w:numPr>
-              <w:spacing w:before="120" w:after="120"/>
-              <w:ind w:left="243" w:hanging="243"/>
-              <w:rPr>
-                <w:rFonts w:ascii="Arial" w:hAnsi="Arial" w:cs="Arial"/>
-                <w:sz w:val="18"/>
-                <w:szCs w:val="18"/>
-                <w:lang w:val="en-GB"/>
-              </w:rPr>
-            </w:pPr>
-            <w:r>
-              <w:rPr>
-                <w:rFonts w:ascii="Arial" w:hAnsi="Arial" w:cs="Arial"/>
-                <w:sz w:val="18"/>
-                <w:szCs w:val="18"/>
-                <w:lang w:val="en-GB"/>
-              </w:rPr>
-              <w:t>For collaborative projects, explain the co-ordination of data management responsibilities across partners.</w:t>
-            </w:r>
-          </w:p>
-          <w:p>
-            <w:pPr>
-              <w:pStyle w:val="NoSpacing"/>
-              <w:numPr>
-                <w:ilvl w:val="0"/>
-                <w:numId w:val="18"/>
-              </w:numPr>
-              <w:spacing w:before="120" w:after="120"/>
-              <w:ind w:left="243" w:hanging="243"/>
-              <w:rPr>
-                <w:rFonts w:ascii="Arial" w:hAnsi="Arial" w:cs="Arial"/>
-                <w:sz w:val="18"/>
-                <w:szCs w:val="18"/>
-                <w:lang w:val="en-GB"/>
-              </w:rPr>
-            </w:pPr>
-            <w:r>
-              <w:rPr>
-                <w:rFonts w:ascii="Arial" w:hAnsi="Arial" w:cs="Arial"/>
-                <w:sz w:val="18"/>
-                <w:szCs w:val="18"/>
-                <w:lang w:val="en-GB"/>
-              </w:rPr>
-              <w:t>Explain how the necessary resources (for example, time) to prepare the data for sharing/preservation have been costed in. Carefully consider and justify any resources needed to deliver the data. These may include storage costs, hardware, staff time, and repository charges.</w:t>
-            </w:r>
-            <w:bookmarkEnd w:id="1"/>
-          </w:p>
-        </w:tc>
-      </w:tr>
-      <w:tr>
-        <w:trPr>
-          <w:trHeight w:val="454"/>
-        </w:trPr>
-        <w:tc>
-          <w:tcPr>
-            <w:tcW w:w="15168" w:type="dxa"/>
-            <w:gridSpan w:val="3"/>
-            <w:shd w:val="clear" w:color="auto" w:fill="4F81BD"/>
-            <w:vAlign w:val="center"/>
-          </w:tcPr>
-          <w:p>
-            <w:pPr>
-              <w:pStyle w:val="NoSpacing"/>
-              <w:spacing w:before="120" w:after="120"/>
-              <w:rPr>
-                <w:rFonts w:ascii="Arial" w:hAnsi="Arial" w:cs="Arial"/>
-                <w:b/>
-                <w:color w:val="FFFFFF"/>
-                <w:sz w:val="18"/>
-                <w:szCs w:val="18"/>
-                <w:lang w:val="en-GB"/>
-              </w:rPr>
-            </w:pPr>
-            <w:r>
-              <w:rPr>
-                <w:rFonts w:ascii="Arial" w:hAnsi="Arial" w:cs="Arial"/>
-                <w:b/>
-                <w:color w:val="FFFFFF" w:themeColor="background1"/>
-                <w:sz w:val="18"/>
-                <w:szCs w:val="18"/>
-                <w:lang w:val="en-GB"/>
-              </w:rPr>
-              <w:t>II Data Characteristics</w:t>
-            </w:r>
-          </w:p>
-        </w:tc>
-      </w:tr>
-      <w:tr>
-        <w:trPr>
-          <w:trHeight w:val="454"/>
-        </w:trPr>
-        <w:tc>
-          <w:tcPr>
-            <w:tcW w:w="2344" w:type="dxa"/>
-            <w:shd w:val="clear" w:color="auto" w:fill="auto"/>
-            <w:vAlign w:val="center"/>
-          </w:tcPr>
-          <w:p>
-            <w:pPr>
-              <w:pStyle w:val="NoSpacing"/>
-              <w:spacing w:before="120" w:after="120"/>
-              <w:rPr>
-                <w:rFonts w:ascii="Arial" w:hAnsi="Arial" w:cs="Arial"/>
-                <w:b/>
-                <w:sz w:val="18"/>
-                <w:szCs w:val="18"/>
-                <w:lang w:val="en-GB"/>
-              </w:rPr>
-            </w:pPr>
-            <w:r>
-              <w:rPr>
-                <w:rFonts w:ascii="Arial" w:hAnsi="Arial" w:cs="Arial"/>
-                <w:b/>
-                <w:sz w:val="18"/>
-                <w:szCs w:val="18"/>
-                <w:lang w:val="en-GB"/>
-              </w:rPr>
-              <w:t>II.1 Data description and collection or re-use of existing data</w:t>
-            </w:r>
-          </w:p>
-        </w:tc>
-        <w:tc>
-          <w:tcPr>
-            <w:tcW w:w="3969" w:type="dxa"/>
-            <w:shd w:val="clear" w:color="auto" w:fill="auto"/>
-            <w:vAlign w:val="center"/>
-          </w:tcPr>
-          <w:p>
-            <w:pPr>
-              <w:pStyle w:val="NoSpacing"/>
-              <w:spacing w:before="120" w:after="120"/>
-              <w:rPr>
-                <w:rFonts w:ascii="Arial" w:hAnsi="Arial" w:cs="Arial"/>
-                <w:sz w:val="18"/>
-                <w:szCs w:val="18"/>
-                <w:lang w:val="en-GB"/>
-              </w:rPr>
-            </w:pPr>
-            <w:r>
-              <w:rPr>
-                <w:rFonts w:ascii="Arial" w:hAnsi="Arial" w:cs="Arial"/>
-                <w:sz w:val="18"/>
-                <w:szCs w:val="18"/>
-                <w:lang w:val="en-GB"/>
-              </w:rPr>
-              <w:t>How will new data be collected or produced and/or how will existing data be re-used?</w:t>
-            </w:r>
-          </w:p>
-          <w:p>
-            <w:pPr>
-              <w:pStyle w:val="NoSpacing"/>
-              <w:spacing w:before="120" w:after="120"/>
-              <w:rPr>
-                <w:rFonts w:ascii="Arial" w:hAnsi="Arial" w:cs="Arial"/>
-                <w:sz w:val="18"/>
-                <w:szCs w:val="18"/>
-                <w:lang w:val="en-GB"/>
-              </w:rPr>
-            </w:pPr>
-            <w:r>
-              <w:rPr>
-                <w:rFonts w:ascii="Arial" w:hAnsi="Arial" w:cs="Arial"/>
-                <w:sz w:val="18"/>
-                <w:szCs w:val="18"/>
-                <w:lang w:val="en-GB"/>
-              </w:rPr>
-              <w:t>What data (types, formats, and volumes) will be collected or produced?</w:t>
-            </w:r>
-          </w:p>
-        </w:tc>
-        <w:tc>
-          <w:tcPr>
-            <w:tcW w:w="8855" w:type="dxa"/>
-          </w:tcPr>
-          <w:p>
-            <w:pPr>
-              <w:pStyle w:val="ListItem-Bullet"/>
-              <w:numPr>
-                <w:ilvl w:val="0"/>
-                <w:numId w:val="18"/>
-              </w:numPr>
-              <w:spacing w:before="120" w:after="120"/>
-              <w:ind w:left="243" w:hanging="283"/>
-              <w:rPr>
-                <w:rFonts w:ascii="Arial" w:hAnsi="Arial" w:cs="Arial"/>
-                <w:sz w:val="18"/>
-                <w:szCs w:val="18"/>
-              </w:rPr>
-            </w:pPr>
-            <w:r>
-              <w:rPr>
-                <w:rFonts w:ascii="Arial" w:hAnsi="Arial" w:cs="Arial"/>
-                <w:sz w:val="18"/>
-                <w:szCs w:val="18"/>
-              </w:rPr>
-              <w:t xml:space="preserve">Explain which methodologies or software will be used if new data are collected or produced. </w:t>
-            </w:r>
-          </w:p>
-          <w:p>
-            <w:pPr>
-              <w:pStyle w:val="ListItem-Bullet"/>
-              <w:numPr>
-                <w:ilvl w:val="0"/>
-                <w:numId w:val="18"/>
-              </w:numPr>
-              <w:spacing w:before="120" w:after="120"/>
-              <w:ind w:left="243" w:hanging="283"/>
-              <w:rPr>
-                <w:rFonts w:ascii="Arial" w:hAnsi="Arial" w:cs="Arial"/>
-                <w:sz w:val="18"/>
-                <w:szCs w:val="18"/>
-              </w:rPr>
-            </w:pPr>
-            <w:r>
-              <w:rPr>
-                <w:rFonts w:ascii="Arial" w:hAnsi="Arial" w:cs="Arial"/>
-                <w:sz w:val="18"/>
-                <w:szCs w:val="18"/>
-              </w:rPr>
-              <w:t xml:space="preserve">State any constraints on re-use of existing data if there are any. </w:t>
-            </w:r>
-          </w:p>
-          <w:p>
-            <w:pPr>
-              <w:pStyle w:val="ListItem-Bullet"/>
-              <w:numPr>
-                <w:ilvl w:val="0"/>
-                <w:numId w:val="18"/>
-              </w:numPr>
-              <w:spacing w:before="120" w:after="120"/>
-              <w:ind w:left="243" w:hanging="283"/>
-              <w:rPr>
-                <w:rFonts w:ascii="Arial" w:hAnsi="Arial" w:cs="Arial"/>
-                <w:sz w:val="18"/>
-                <w:szCs w:val="18"/>
-              </w:rPr>
-            </w:pPr>
-            <w:r>
-              <w:rPr>
-                <w:rFonts w:ascii="Arial" w:hAnsi="Arial" w:cs="Arial"/>
-                <w:sz w:val="18"/>
-                <w:szCs w:val="18"/>
-              </w:rPr>
-              <w:t>Explain how data provenance will be documented.</w:t>
-            </w:r>
-          </w:p>
-          <w:p>
-            <w:pPr>
-              <w:pStyle w:val="ListItem-Bullet"/>
-              <w:numPr>
-                <w:ilvl w:val="0"/>
-                <w:numId w:val="18"/>
-              </w:numPr>
-              <w:spacing w:before="120" w:after="120"/>
-              <w:ind w:left="243" w:hanging="283"/>
-              <w:rPr>
-                <w:rFonts w:ascii="Arial" w:hAnsi="Arial" w:cs="Arial"/>
-                <w:sz w:val="18"/>
-                <w:szCs w:val="18"/>
-              </w:rPr>
-            </w:pPr>
-            <w:r>
-              <w:rPr>
-                <w:rFonts w:ascii="Arial" w:hAnsi="Arial" w:cs="Arial"/>
-                <w:sz w:val="18"/>
-                <w:szCs w:val="18"/>
-              </w:rPr>
-              <w:t>Give details on the kind of data: for example, numeric (databases), textual (documents), image, audio, or video.</w:t>
-            </w:r>
-          </w:p>
-          <w:p>
-            <w:pPr>
-              <w:pStyle w:val="ListItem-Bullet"/>
-              <w:numPr>
-                <w:ilvl w:val="0"/>
-                <w:numId w:val="18"/>
-              </w:numPr>
-              <w:spacing w:before="120" w:after="120"/>
-              <w:ind w:left="243" w:hanging="283"/>
-              <w:rPr>
-                <w:rFonts w:ascii="Arial" w:hAnsi="Arial" w:cs="Arial"/>
-                <w:sz w:val="18"/>
-                <w:szCs w:val="18"/>
-              </w:rPr>
-            </w:pPr>
-            <w:r>
-              <w:rPr>
-                <w:rFonts w:ascii="Arial" w:hAnsi="Arial" w:cs="Arial"/>
-                <w:sz w:val="18"/>
-                <w:szCs w:val="18"/>
-              </w:rPr>
-              <w:t>Give details on the data format: the way in which the data is encoded for storage, often reflected by the filename extension (for example, pdf, xls, doc, txt, or rdf).</w:t>
-            </w:r>
-          </w:p>
-          <w:p>
-            <w:pPr>
-              <w:pStyle w:val="ListItem-Bullet"/>
-              <w:numPr>
-                <w:ilvl w:val="0"/>
-                <w:numId w:val="18"/>
-              </w:numPr>
-              <w:spacing w:before="120" w:after="120"/>
-              <w:ind w:left="243" w:hanging="283"/>
-              <w:rPr>
-                <w:rFonts w:ascii="Arial" w:hAnsi="Arial" w:cs="Arial"/>
-                <w:sz w:val="18"/>
-                <w:szCs w:val="18"/>
-              </w:rPr>
-            </w:pPr>
-            <w:r>
-              <w:rPr>
-                <w:rFonts w:ascii="Arial" w:hAnsi="Arial" w:cs="Arial"/>
-                <w:sz w:val="18"/>
-                <w:szCs w:val="18"/>
-              </w:rPr>
-              <w:lastRenderedPageBreak/>
-              <w:t>Justify the use of certain formats. For example, decisions may be based on a preference for open formats, standards accepted by data repositories, widespread usage within the research community, or on the software or equipment that will be used.</w:t>
-            </w:r>
-          </w:p>
-          <w:p>
-            <w:pPr>
-              <w:pStyle w:val="ListItem-Bullet"/>
-              <w:numPr>
-                <w:ilvl w:val="0"/>
-                <w:numId w:val="18"/>
-              </w:numPr>
-              <w:spacing w:before="120" w:after="120"/>
-              <w:ind w:left="243" w:hanging="283"/>
-              <w:rPr>
-                <w:rFonts w:ascii="Arial" w:hAnsi="Arial" w:cs="Arial"/>
-                <w:i/>
-                <w:sz w:val="18"/>
-                <w:szCs w:val="18"/>
-                <w:lang w:val="en-US"/>
-              </w:rPr>
-            </w:pPr>
-            <w:r>
-              <w:rPr>
-                <w:rFonts w:ascii="Arial" w:hAnsi="Arial" w:cs="Arial"/>
-                <w:sz w:val="18"/>
-                <w:szCs w:val="18"/>
-              </w:rPr>
-              <w:t>Give preference to open and standard formats as they facilitate sharing and long-term re-use of data (several repositories provide lists of such ‘preferred formats’).</w:t>
-            </w:r>
-          </w:p>
-          <w:p>
-            <w:pPr>
-              <w:pStyle w:val="ListItem-Bullet"/>
-              <w:numPr>
-                <w:ilvl w:val="0"/>
-                <w:numId w:val="18"/>
-              </w:numPr>
-              <w:spacing w:before="120" w:after="120"/>
-              <w:ind w:left="243" w:hanging="283"/>
-              <w:rPr>
-                <w:rFonts w:ascii="Arial" w:hAnsi="Arial" w:cs="Arial"/>
-                <w:i/>
-                <w:sz w:val="18"/>
-                <w:szCs w:val="18"/>
-                <w:lang w:val="en-US"/>
-              </w:rPr>
-            </w:pPr>
-            <w:r>
-              <w:rPr>
-                <w:rFonts w:ascii="Arial" w:hAnsi="Arial" w:cs="Arial"/>
-                <w:sz w:val="18"/>
-                <w:szCs w:val="18"/>
-                <w:lang w:val="en-US"/>
-              </w:rPr>
-              <w:t>Give details on the volumes (they can be expressed in storage space required (bytes), and/or in numbers of objects/files).</w:t>
-            </w:r>
-          </w:p>
-        </w:tc>
-      </w:tr>
-      <w:tr>
-        <w:trPr>
-          <w:trHeight w:val="454"/>
-        </w:trPr>
-        <w:tc>
-          <w:tcPr>
-            <w:tcW w:w="15168" w:type="dxa"/>
-            <w:gridSpan w:val="3"/>
-            <w:shd w:val="clear" w:color="auto" w:fill="4F81BD"/>
-            <w:vAlign w:val="center"/>
-          </w:tcPr>
-          <w:p>
-            <w:pPr>
-              <w:pStyle w:val="NoSpacing"/>
-              <w:spacing w:before="120" w:after="120"/>
-              <w:rPr>
-                <w:rFonts w:ascii="Arial" w:hAnsi="Arial" w:cs="Arial"/>
-                <w:b/>
-                <w:color w:val="FFFFFF"/>
-                <w:sz w:val="18"/>
-                <w:szCs w:val="18"/>
-                <w:lang w:val="en-GB"/>
-              </w:rPr>
-            </w:pPr>
-            <w:r>
-              <w:rPr>
-                <w:rFonts w:ascii="Arial" w:hAnsi="Arial" w:cs="Arial"/>
-                <w:b/>
-                <w:color w:val="FFFFFF" w:themeColor="background1"/>
-                <w:sz w:val="18"/>
-                <w:szCs w:val="18"/>
-                <w:lang w:val="en-GB"/>
-              </w:rPr>
-              <w:lastRenderedPageBreak/>
-              <w:t xml:space="preserve">III Documentation and Data Quality </w:t>
-            </w:r>
-          </w:p>
-        </w:tc>
-      </w:tr>
-      <w:tr>
-        <w:trPr>
-          <w:trHeight w:val="454"/>
-        </w:trPr>
-        <w:tc>
-          <w:tcPr>
-            <w:tcW w:w="2344" w:type="dxa"/>
-            <w:shd w:val="clear" w:color="auto" w:fill="auto"/>
-            <w:vAlign w:val="center"/>
-          </w:tcPr>
-          <w:p>
-            <w:pPr>
-              <w:pStyle w:val="NoSpacing"/>
-              <w:spacing w:before="120" w:after="120"/>
-              <w:rPr>
-                <w:rFonts w:ascii="Arial" w:hAnsi="Arial" w:cs="Arial"/>
-                <w:b/>
-                <w:sz w:val="18"/>
-                <w:szCs w:val="18"/>
-                <w:lang w:val="en-GB"/>
-              </w:rPr>
-            </w:pPr>
-            <w:r>
-              <w:rPr>
-                <w:rFonts w:ascii="Arial" w:hAnsi="Arial" w:cs="Arial"/>
-                <w:b/>
-                <w:sz w:val="18"/>
-                <w:szCs w:val="18"/>
-                <w:lang w:val="en-GB"/>
-              </w:rPr>
-              <w:t xml:space="preserve">III.1 Metadata and documentation </w:t>
-            </w:r>
-          </w:p>
-        </w:tc>
-        <w:tc>
-          <w:tcPr>
-            <w:tcW w:w="3969" w:type="dxa"/>
-            <w:shd w:val="clear" w:color="auto" w:fill="auto"/>
-            <w:vAlign w:val="center"/>
-          </w:tcPr>
-          <w:p>
-            <w:pPr>
-              <w:pStyle w:val="NoSpacing"/>
-              <w:spacing w:before="120" w:after="120"/>
-              <w:rPr>
-                <w:rFonts w:ascii="Arial" w:hAnsi="Arial" w:cs="Arial"/>
-                <w:sz w:val="18"/>
-                <w:szCs w:val="18"/>
-                <w:lang w:val="en-GB"/>
-              </w:rPr>
-            </w:pPr>
-            <w:r>
-              <w:rPr>
-                <w:rFonts w:ascii="Arial" w:hAnsi="Arial" w:cs="Arial"/>
-                <w:sz w:val="18"/>
-                <w:szCs w:val="18"/>
-                <w:lang w:val="en-GB"/>
-              </w:rPr>
-              <w:t xml:space="preserve">What metadata and documentation (for example, the methodology of data collection and way of organising the data) will accompany the data? </w:t>
-            </w:r>
-          </w:p>
-        </w:tc>
-        <w:tc>
-          <w:tcPr>
-            <w:tcW w:w="8855" w:type="dxa"/>
-          </w:tcPr>
-          <w:p>
-            <w:pPr>
-              <w:pStyle w:val="ListItem-Bullet"/>
-              <w:numPr>
-                <w:ilvl w:val="0"/>
-                <w:numId w:val="18"/>
-              </w:numPr>
-              <w:spacing w:before="120" w:after="120"/>
-              <w:ind w:left="243" w:hanging="283"/>
-              <w:rPr>
-                <w:rFonts w:ascii="Arial" w:hAnsi="Arial" w:cs="Arial"/>
-                <w:sz w:val="18"/>
-                <w:szCs w:val="18"/>
-              </w:rPr>
-            </w:pPr>
-            <w:r>
-              <w:rPr>
-                <w:rFonts w:ascii="Arial" w:hAnsi="Arial" w:cs="Arial"/>
-                <w:sz w:val="18"/>
-                <w:szCs w:val="18"/>
-              </w:rPr>
-              <w:t xml:space="preserve">Indicate which metadata will be provided to help others identify and discover the data. </w:t>
-            </w:r>
-          </w:p>
-          <w:p>
-            <w:pPr>
-              <w:pStyle w:val="ListItem-Bullet"/>
-              <w:numPr>
-                <w:ilvl w:val="0"/>
-                <w:numId w:val="18"/>
-              </w:numPr>
-              <w:spacing w:before="120" w:after="120"/>
-              <w:ind w:left="243" w:hanging="283"/>
-              <w:rPr>
-                <w:rFonts w:ascii="Arial" w:hAnsi="Arial" w:cs="Arial"/>
-                <w:sz w:val="18"/>
-                <w:szCs w:val="18"/>
-              </w:rPr>
-            </w:pPr>
-            <w:r>
-              <w:rPr>
-                <w:rFonts w:ascii="Arial" w:hAnsi="Arial" w:cs="Arial"/>
-                <w:sz w:val="18"/>
-                <w:szCs w:val="18"/>
-              </w:rPr>
-              <w:t xml:space="preserve">Use community metadata standards where these are in place (see </w:t>
-            </w:r>
-            <w:hyperlink r:id="rId22" w:tooltip="http://www.dcc.ac.uk/resources/metadata-standards/list" w:history="1">
-              <w:r>
-                <w:rPr>
-                  <w:rStyle w:val="Hyperlink"/>
-                  <w:rFonts w:ascii="Arial" w:hAnsi="Arial" w:cs="Arial"/>
-                  <w:sz w:val="18"/>
-                  <w:szCs w:val="18"/>
-                </w:rPr>
-                <w:t>Digital Curation Center</w:t>
-              </w:r>
-            </w:hyperlink>
-            <w:r>
-              <w:rPr>
-                <w:rFonts w:ascii="Arial" w:hAnsi="Arial" w:cs="Arial"/>
-                <w:sz w:val="18"/>
-                <w:szCs w:val="18"/>
-              </w:rPr>
-              <w:t xml:space="preserve"> or </w:t>
-            </w:r>
-            <w:hyperlink r:id="rId23" w:tooltip="http://rd-alliance.github.io/metadata-directory/standards/" w:history="1">
-              <w:r>
-                <w:rPr>
-                  <w:rStyle w:val="Hyperlink"/>
-                  <w:rFonts w:ascii="Arial" w:hAnsi="Arial" w:cs="Arial"/>
-                  <w:sz w:val="18"/>
-                  <w:szCs w:val="18"/>
-                </w:rPr>
-                <w:t>RDA Metadata Directory</w:t>
-              </w:r>
-            </w:hyperlink>
-            <w:r>
-              <w:rPr>
-                <w:rFonts w:ascii="Arial" w:hAnsi="Arial" w:cs="Arial"/>
-                <w:sz w:val="18"/>
-                <w:szCs w:val="18"/>
-              </w:rPr>
-              <w:t>).</w:t>
-            </w:r>
-          </w:p>
-          <w:p>
-            <w:pPr>
-              <w:pStyle w:val="ListItem-Bullet"/>
-              <w:numPr>
-                <w:ilvl w:val="0"/>
-                <w:numId w:val="18"/>
-              </w:numPr>
-              <w:spacing w:before="120" w:after="120"/>
-              <w:ind w:left="243" w:hanging="283"/>
-              <w:rPr>
-                <w:rFonts w:ascii="Arial" w:hAnsi="Arial" w:cs="Arial"/>
-                <w:sz w:val="18"/>
-                <w:szCs w:val="18"/>
-              </w:rPr>
-            </w:pPr>
-            <w:r>
-              <w:rPr>
-                <w:rFonts w:ascii="Arial" w:hAnsi="Arial" w:cs="Arial"/>
-                <w:sz w:val="18"/>
-                <w:szCs w:val="18"/>
-              </w:rPr>
-              <w:t xml:space="preserve">Consistent, well-ordered research data will be easier to find, understand, and re-use. Indicate how the data will be organised during the project, mentioning for example conventions, version control, and folder structures. </w:t>
-            </w:r>
-          </w:p>
-          <w:p>
-            <w:pPr>
-              <w:pStyle w:val="ListItem-Bullet"/>
-              <w:numPr>
-                <w:ilvl w:val="0"/>
-                <w:numId w:val="18"/>
-              </w:numPr>
-              <w:spacing w:before="120" w:after="120"/>
-              <w:ind w:left="243" w:hanging="283"/>
-              <w:rPr>
-                <w:rFonts w:ascii="Arial" w:hAnsi="Arial" w:cs="Arial"/>
-                <w:sz w:val="18"/>
-                <w:szCs w:val="18"/>
-              </w:rPr>
-            </w:pPr>
-            <w:r>
-              <w:rPr>
-                <w:rFonts w:ascii="Arial" w:hAnsi="Arial" w:cs="Arial"/>
-                <w:sz w:val="18"/>
-                <w:szCs w:val="18"/>
-              </w:rPr>
-              <w:t>Consider what other documentation is needed to enable re-use. This may include information on the methodology used to collect the data, analytical and procedural information, definitions of variables, units of measurement, and so on.</w:t>
-            </w:r>
-          </w:p>
-          <w:p>
-            <w:pPr>
-              <w:pStyle w:val="ListItem-Bullet"/>
-              <w:numPr>
-                <w:ilvl w:val="0"/>
-                <w:numId w:val="18"/>
-              </w:numPr>
-              <w:spacing w:before="120" w:after="120"/>
-              <w:ind w:left="243" w:hanging="283"/>
-              <w:rPr>
-                <w:rFonts w:ascii="Arial" w:hAnsi="Arial" w:cs="Arial"/>
-                <w:sz w:val="18"/>
-                <w:szCs w:val="18"/>
-              </w:rPr>
-            </w:pPr>
-            <w:r>
-              <w:rPr>
-                <w:rFonts w:ascii="Arial" w:hAnsi="Arial" w:cs="Arial"/>
-                <w:sz w:val="18"/>
-                <w:szCs w:val="18"/>
-              </w:rPr>
-              <w:t>Consider how this information will be captured and where it will be recorded for example in a database with links to each item, a ‘readme’ text file, or lab notebooks.</w:t>
-            </w:r>
-          </w:p>
-        </w:tc>
-      </w:tr>
-      <w:tr>
-        <w:trPr>
-          <w:trHeight w:val="454"/>
-        </w:trPr>
-        <w:tc>
-          <w:tcPr>
-            <w:tcW w:w="2344" w:type="dxa"/>
-            <w:shd w:val="clear" w:color="auto" w:fill="auto"/>
-            <w:vAlign w:val="center"/>
-          </w:tcPr>
-          <w:p>
-            <w:pPr>
-              <w:pStyle w:val="NoSpacing"/>
-              <w:spacing w:before="120" w:after="120"/>
-              <w:rPr>
-                <w:rFonts w:ascii="Arial" w:hAnsi="Arial" w:cs="Arial"/>
-                <w:b/>
-                <w:sz w:val="18"/>
-                <w:szCs w:val="18"/>
-                <w:lang w:val="en-GB"/>
-              </w:rPr>
-            </w:pPr>
-            <w:r>
-              <w:rPr>
-                <w:rFonts w:ascii="Arial" w:hAnsi="Arial" w:cs="Arial"/>
-                <w:b/>
-                <w:sz w:val="18"/>
-                <w:szCs w:val="18"/>
-                <w:lang w:val="en-GB"/>
-              </w:rPr>
-              <w:t>III.2 Data quality control</w:t>
-            </w:r>
-          </w:p>
-        </w:tc>
-        <w:tc>
-          <w:tcPr>
-            <w:tcW w:w="3969" w:type="dxa"/>
-            <w:shd w:val="clear" w:color="auto" w:fill="auto"/>
-            <w:vAlign w:val="center"/>
-          </w:tcPr>
-          <w:p>
-            <w:pPr>
-              <w:pStyle w:val="NoSpacing"/>
-              <w:spacing w:before="120" w:after="120"/>
-              <w:rPr>
-                <w:rFonts w:ascii="Arial" w:hAnsi="Arial" w:cs="Arial"/>
-                <w:sz w:val="18"/>
-                <w:szCs w:val="18"/>
-                <w:lang w:val="en-GB"/>
-              </w:rPr>
-            </w:pPr>
-            <w:r>
-              <w:rPr>
-                <w:rFonts w:ascii="Arial" w:hAnsi="Arial" w:cs="Arial"/>
-                <w:sz w:val="18"/>
-                <w:szCs w:val="18"/>
-                <w:lang w:val="en-GB"/>
-              </w:rPr>
-              <w:t>What data quality control measures will be used?</w:t>
-            </w:r>
-          </w:p>
-        </w:tc>
-        <w:tc>
-          <w:tcPr>
-            <w:tcW w:w="8855" w:type="dxa"/>
-          </w:tcPr>
-          <w:p>
-            <w:pPr>
-              <w:pStyle w:val="ListItem-Bullet"/>
-              <w:numPr>
-                <w:ilvl w:val="0"/>
-                <w:numId w:val="18"/>
-              </w:numPr>
-              <w:spacing w:before="120" w:after="120"/>
-              <w:ind w:left="243" w:hanging="283"/>
-              <w:rPr>
-                <w:rFonts w:ascii="Arial" w:hAnsi="Arial" w:cs="Arial"/>
-                <w:i/>
-                <w:sz w:val="18"/>
-                <w:szCs w:val="18"/>
-                <w:lang w:val="en-US"/>
-              </w:rPr>
-            </w:pPr>
-            <w:r>
-              <w:rPr>
-                <w:rFonts w:ascii="Arial" w:hAnsi="Arial" w:cs="Arial"/>
-                <w:sz w:val="18"/>
-                <w:szCs w:val="18"/>
-              </w:rPr>
-              <w:t>Explain how the consistency and quality of data collection will be controlled and documented. This may include processes such as calibration, repeated samples or measurements, standardised data capture, data entry validation, peer review of data, or representation with controlled vocabularies.</w:t>
-            </w:r>
-          </w:p>
-        </w:tc>
-      </w:tr>
-      <w:tr>
-        <w:trPr>
-          <w:trHeight w:val="454"/>
-        </w:trPr>
-        <w:tc>
-          <w:tcPr>
-            <w:tcW w:w="15168" w:type="dxa"/>
-            <w:gridSpan w:val="3"/>
-            <w:shd w:val="clear" w:color="auto" w:fill="4F81BD"/>
-            <w:vAlign w:val="center"/>
-          </w:tcPr>
-          <w:p>
-            <w:pPr>
-              <w:pStyle w:val="NoSpacing"/>
-              <w:spacing w:before="120" w:after="120"/>
-              <w:rPr>
-                <w:rFonts w:ascii="Arial" w:hAnsi="Arial" w:cs="Arial"/>
-                <w:b/>
-                <w:color w:val="FFFFFF"/>
-                <w:sz w:val="18"/>
-                <w:szCs w:val="18"/>
-                <w:lang w:val="en-GB"/>
-              </w:rPr>
-            </w:pPr>
-            <w:r>
-              <w:rPr>
-                <w:rFonts w:ascii="Arial" w:hAnsi="Arial" w:cs="Arial"/>
-                <w:b/>
-                <w:color w:val="FFFFFF" w:themeColor="background1"/>
-                <w:sz w:val="18"/>
-                <w:szCs w:val="18"/>
-                <w:lang w:val="en-GB"/>
-              </w:rPr>
-              <w:t>IV Data Storage, Sharing, and Long-Term Preservation</w:t>
-            </w:r>
-          </w:p>
-        </w:tc>
-      </w:tr>
-      <w:tr>
-        <w:trPr>
-          <w:trHeight w:val="454"/>
-        </w:trPr>
-        <w:tc>
-          <w:tcPr>
-            <w:tcW w:w="2344" w:type="dxa"/>
-            <w:tcBorders>
-              <w:top w:val="single" w:sz="4" w:space="0" w:color="auto"/>
-              <w:left w:val="single" w:sz="4" w:space="0" w:color="auto"/>
-              <w:bottom w:val="single" w:sz="4" w:space="0" w:color="auto"/>
-              <w:right w:val="single" w:sz="4" w:space="0" w:color="auto"/>
-            </w:tcBorders>
-            <w:shd w:val="clear" w:color="auto" w:fill="auto"/>
-            <w:vAlign w:val="center"/>
-          </w:tcPr>
-          <w:p>
-            <w:pPr>
-              <w:pStyle w:val="NoSpacing"/>
-              <w:spacing w:before="120" w:after="120"/>
-              <w:rPr>
-                <w:rFonts w:ascii="Arial" w:hAnsi="Arial" w:cs="Arial"/>
-                <w:b/>
-                <w:sz w:val="18"/>
-                <w:szCs w:val="18"/>
-                <w:lang w:val="en-GB"/>
-              </w:rPr>
-            </w:pPr>
-            <w:r>
-              <w:rPr>
-                <w:rFonts w:ascii="Arial" w:hAnsi="Arial" w:cs="Arial"/>
-                <w:b/>
-                <w:sz w:val="18"/>
-                <w:szCs w:val="18"/>
-                <w:lang w:val="en-GB"/>
-              </w:rPr>
-              <w:t>IV.1 Data storage and backup during the research process</w:t>
-            </w:r>
-          </w:p>
-        </w:tc>
-        <w:tc>
-          <w:tcPr>
-            <w:tcW w:w="3969" w:type="dxa"/>
-            <w:tcBorders>
-              <w:top w:val="single" w:sz="4" w:space="0" w:color="auto"/>
-              <w:left w:val="single" w:sz="4" w:space="0" w:color="auto"/>
-              <w:bottom w:val="single" w:sz="4" w:space="0" w:color="auto"/>
-              <w:right w:val="single" w:sz="4" w:space="0" w:color="auto"/>
-            </w:tcBorders>
-            <w:shd w:val="clear" w:color="auto" w:fill="auto"/>
-            <w:vAlign w:val="center"/>
-          </w:tcPr>
-          <w:p>
-            <w:pPr>
-              <w:pStyle w:val="NoSpacing"/>
-              <w:spacing w:before="120" w:after="120"/>
-              <w:rPr>
-                <w:rFonts w:ascii="Arial" w:hAnsi="Arial" w:cs="Arial"/>
-                <w:sz w:val="18"/>
-                <w:szCs w:val="18"/>
-                <w:lang w:val="en-GB"/>
-              </w:rPr>
-            </w:pPr>
-            <w:r>
-              <w:rPr>
-                <w:rFonts w:ascii="Arial" w:hAnsi="Arial" w:cs="Arial"/>
-                <w:sz w:val="18"/>
-                <w:szCs w:val="18"/>
-                <w:lang w:val="en-GB"/>
-              </w:rPr>
-              <w:t>How will the data and metadata be stored and backed up during the research process?</w:t>
-            </w:r>
-          </w:p>
-          <w:p>
-            <w:pPr>
-              <w:pStyle w:val="NoSpacing"/>
-              <w:spacing w:before="120" w:after="120"/>
-              <w:rPr>
-                <w:rFonts w:ascii="Arial" w:hAnsi="Arial" w:cs="Arial"/>
-                <w:sz w:val="18"/>
-                <w:szCs w:val="18"/>
-                <w:lang w:val="en-GB"/>
-              </w:rPr>
-            </w:pPr>
-            <w:r>
-              <w:rPr>
-                <w:rFonts w:ascii="Arial" w:hAnsi="Arial" w:cs="Arial"/>
-                <w:sz w:val="18"/>
-                <w:szCs w:val="18"/>
-                <w:lang w:val="en-GB"/>
-              </w:rPr>
-              <w:t>How will data security and protection of sensitive data be taken care of during the research?</w:t>
-            </w:r>
-          </w:p>
-        </w:tc>
-        <w:tc>
-          <w:tcPr>
-            <w:tcW w:w="8855" w:type="dxa"/>
-            <w:tcBorders>
-              <w:top w:val="single" w:sz="4" w:space="0" w:color="auto"/>
-              <w:left w:val="single" w:sz="4" w:space="0" w:color="auto"/>
-              <w:bottom w:val="single" w:sz="4" w:space="0" w:color="auto"/>
-              <w:right w:val="single" w:sz="4" w:space="0" w:color="auto"/>
-            </w:tcBorders>
-          </w:tcPr>
-          <w:p>
-            <w:pPr>
-              <w:pStyle w:val="ListItem-Bullet"/>
-              <w:numPr>
-                <w:ilvl w:val="0"/>
-                <w:numId w:val="18"/>
-              </w:numPr>
-              <w:spacing w:before="120" w:after="120"/>
-              <w:ind w:left="243" w:hanging="283"/>
-              <w:rPr>
-                <w:rFonts w:ascii="Arial" w:hAnsi="Arial" w:cs="Arial"/>
-                <w:sz w:val="18"/>
-                <w:szCs w:val="18"/>
-              </w:rPr>
-            </w:pPr>
-            <w:r>
-              <w:rPr>
-                <w:rFonts w:ascii="Arial" w:hAnsi="Arial" w:cs="Arial"/>
-                <w:sz w:val="18"/>
-                <w:szCs w:val="18"/>
-              </w:rPr>
-              <w:t xml:space="preserve">Describe where the data and metadata will be stored and backed up during research activities and how often the backup will be performed. It is recommended to store data in least at two separate locations. </w:t>
-            </w:r>
-          </w:p>
-          <w:p>
-            <w:pPr>
-              <w:pStyle w:val="ListItem-Bullet"/>
-              <w:numPr>
-                <w:ilvl w:val="0"/>
-                <w:numId w:val="18"/>
-              </w:numPr>
-              <w:spacing w:before="120" w:after="120"/>
-              <w:ind w:left="243" w:hanging="283"/>
-              <w:rPr>
-                <w:rFonts w:ascii="Arial" w:hAnsi="Arial" w:cs="Arial"/>
-                <w:sz w:val="18"/>
-                <w:szCs w:val="18"/>
-              </w:rPr>
-            </w:pPr>
-            <w:r>
-              <w:rPr>
-                <w:rFonts w:ascii="Arial" w:hAnsi="Arial" w:cs="Arial"/>
-                <w:sz w:val="18"/>
-                <w:szCs w:val="18"/>
-              </w:rPr>
-              <w:t>Give preference to the use of robust, managed storage with automatic backup, such as provided by IT support services of your home institution. Storing data on laptops, stand-alone hard drives, or external storage devices such as USB sticks is not recommended.</w:t>
-            </w:r>
-          </w:p>
-          <w:p>
-            <w:pPr>
-              <w:pStyle w:val="ListItem-Bullet"/>
-              <w:numPr>
-                <w:ilvl w:val="0"/>
-                <w:numId w:val="18"/>
-              </w:numPr>
-              <w:spacing w:before="120" w:after="120"/>
-              <w:ind w:left="243" w:hanging="283"/>
-              <w:rPr>
-                <w:rFonts w:ascii="Arial" w:hAnsi="Arial" w:cs="Arial"/>
-                <w:sz w:val="18"/>
-                <w:szCs w:val="18"/>
-              </w:rPr>
-            </w:pPr>
-            <w:r>
-              <w:rPr>
-                <w:rFonts w:ascii="Arial" w:hAnsi="Arial" w:cs="Arial"/>
-                <w:sz w:val="18"/>
-                <w:szCs w:val="18"/>
-              </w:rPr>
-              <w:t>Explain how the data will be recovered in the event of a technical incident.</w:t>
-            </w:r>
-          </w:p>
-          <w:p>
-            <w:pPr>
-              <w:pStyle w:val="ListItem-Bullet"/>
-              <w:numPr>
-                <w:ilvl w:val="0"/>
-                <w:numId w:val="18"/>
-              </w:numPr>
-              <w:spacing w:before="120" w:after="120"/>
-              <w:ind w:left="243" w:hanging="283"/>
-              <w:rPr>
-                <w:rFonts w:ascii="Arial" w:hAnsi="Arial" w:cs="Arial"/>
-                <w:sz w:val="18"/>
-                <w:szCs w:val="18"/>
-              </w:rPr>
-            </w:pPr>
-            <w:r>
-              <w:rPr>
-                <w:rFonts w:ascii="Arial" w:hAnsi="Arial" w:cs="Arial"/>
-                <w:sz w:val="18"/>
-                <w:szCs w:val="18"/>
-              </w:rPr>
-              <w:t>Explain who will have access to the data during the research and how access to data is controlled, especially in collaborative projects.</w:t>
-            </w:r>
-          </w:p>
-          <w:p>
-            <w:pPr>
-              <w:pStyle w:val="ListItem-Bullet"/>
-              <w:numPr>
-                <w:ilvl w:val="0"/>
-                <w:numId w:val="18"/>
-              </w:numPr>
-              <w:spacing w:before="120" w:after="120"/>
-              <w:ind w:left="243" w:hanging="283"/>
-              <w:rPr>
-                <w:rFonts w:ascii="Arial" w:hAnsi="Arial" w:cs="Arial"/>
-                <w:sz w:val="18"/>
-                <w:szCs w:val="18"/>
-              </w:rPr>
-            </w:pPr>
-            <w:r>
-              <w:rPr>
-                <w:rFonts w:ascii="Arial" w:hAnsi="Arial" w:cs="Arial"/>
-                <w:sz w:val="18"/>
-                <w:szCs w:val="18"/>
-              </w:rPr>
-              <w:t>Explain which institutional data protection policies are in place.</w:t>
-            </w:r>
-          </w:p>
-          <w:p>
-            <w:pPr>
-              <w:pStyle w:val="ListItem-Bullet"/>
-              <w:numPr>
-                <w:ilvl w:val="0"/>
-                <w:numId w:val="18"/>
-              </w:numPr>
-              <w:spacing w:before="120" w:after="120"/>
-              <w:ind w:left="243" w:hanging="283"/>
-              <w:rPr>
-                <w:rFonts w:ascii="Arial" w:hAnsi="Arial" w:cs="Arial"/>
-                <w:sz w:val="18"/>
-                <w:szCs w:val="18"/>
-              </w:rPr>
-            </w:pPr>
-            <w:r>
-              <w:rPr>
-                <w:rFonts w:ascii="Arial" w:hAnsi="Arial" w:cs="Arial"/>
-                <w:sz w:val="18"/>
-                <w:szCs w:val="18"/>
-              </w:rPr>
-              <w:lastRenderedPageBreak/>
-              <w:t>Consider data protection (e.g., default technical security measures of the home institution), particularly if your data is sensitive (for example, containing personal data or politically sensitive information). Describe the main risks and how these will be managed during the project.</w:t>
-            </w:r>
-          </w:p>
-        </w:tc>
-      </w:tr>
-      <w:tr>
-        <w:trPr>
-          <w:trHeight w:val="454"/>
-        </w:trPr>
-        <w:tc>
-          <w:tcPr>
-            <w:tcW w:w="2344" w:type="dxa"/>
-            <w:tcBorders>
-              <w:top w:val="single" w:sz="4" w:space="0" w:color="auto"/>
-              <w:left w:val="single" w:sz="4" w:space="0" w:color="auto"/>
-              <w:bottom w:val="single" w:sz="4" w:space="0" w:color="auto"/>
-              <w:right w:val="single" w:sz="4" w:space="0" w:color="auto"/>
-            </w:tcBorders>
-            <w:shd w:val="clear" w:color="auto" w:fill="auto"/>
-            <w:vAlign w:val="center"/>
-          </w:tcPr>
-          <w:p>
-            <w:pPr>
-              <w:pStyle w:val="NoSpacing"/>
-              <w:spacing w:before="120" w:after="120"/>
-              <w:rPr>
-                <w:rFonts w:ascii="Arial" w:hAnsi="Arial" w:cs="Arial"/>
-                <w:b/>
-                <w:sz w:val="18"/>
-                <w:szCs w:val="18"/>
-                <w:lang w:val="en-GB"/>
-              </w:rPr>
-            </w:pPr>
-          </w:p>
-          <w:p>
-            <w:pPr>
-              <w:pStyle w:val="NoSpacing"/>
-              <w:spacing w:before="120" w:after="120"/>
-              <w:rPr>
-                <w:rFonts w:ascii="Arial" w:hAnsi="Arial" w:cs="Arial"/>
-                <w:b/>
-                <w:color w:val="FFFFFF"/>
-                <w:sz w:val="18"/>
-                <w:szCs w:val="18"/>
-                <w:lang w:val="en-GB"/>
-              </w:rPr>
-            </w:pPr>
-            <w:r>
-              <w:rPr>
-                <w:rFonts w:ascii="Arial" w:hAnsi="Arial" w:cs="Arial"/>
-                <w:b/>
-                <w:sz w:val="18"/>
-                <w:szCs w:val="18"/>
-                <w:lang w:val="en-GB"/>
-              </w:rPr>
-              <w:t xml:space="preserve">IV.2 Data sharing and long-term preservation  </w:t>
-            </w:r>
-          </w:p>
-        </w:tc>
-        <w:tc>
-          <w:tcPr>
-            <w:tcW w:w="3969" w:type="dxa"/>
-            <w:tcBorders>
-              <w:top w:val="single" w:sz="4" w:space="0" w:color="auto"/>
-              <w:left w:val="single" w:sz="4" w:space="0" w:color="auto"/>
-              <w:bottom w:val="single" w:sz="4" w:space="0" w:color="auto"/>
-              <w:right w:val="single" w:sz="4" w:space="0" w:color="auto"/>
-            </w:tcBorders>
-            <w:shd w:val="clear" w:color="auto" w:fill="auto"/>
-            <w:vAlign w:val="center"/>
-          </w:tcPr>
-          <w:p>
-            <w:pPr>
-              <w:pStyle w:val="NoSpacing"/>
-              <w:spacing w:before="120" w:after="120"/>
-              <w:rPr>
-                <w:rFonts w:ascii="Arial" w:hAnsi="Arial" w:cs="Arial"/>
-                <w:sz w:val="18"/>
-                <w:szCs w:val="18"/>
-                <w:lang w:val="en-US"/>
-              </w:rPr>
-            </w:pPr>
-            <w:r>
-              <w:rPr>
-                <w:rFonts w:ascii="Arial" w:hAnsi="Arial" w:cs="Arial"/>
-                <w:sz w:val="18"/>
-                <w:szCs w:val="18"/>
-                <w:lang w:val="en-GB"/>
-              </w:rPr>
-              <w:t>How and when will the data be shared?</w:t>
-            </w:r>
-            <w:r>
-              <w:rPr>
-                <w:rFonts w:ascii="Arial" w:hAnsi="Arial" w:cs="Arial"/>
-                <w:sz w:val="18"/>
-                <w:szCs w:val="18"/>
-                <w:lang w:val="en-US"/>
-              </w:rPr>
-              <w:t xml:space="preserve"> </w:t>
-            </w:r>
-            <w:r>
-              <w:rPr>
-                <w:rFonts w:ascii="Arial" w:hAnsi="Arial" w:cs="Arial"/>
-                <w:sz w:val="18"/>
-                <w:szCs w:val="18"/>
-                <w:lang w:val="en-GB"/>
-              </w:rPr>
-              <w:t>Are there restrictions to data sharing or embargo reasons?</w:t>
-            </w:r>
-          </w:p>
-          <w:p>
-            <w:pPr>
-              <w:pStyle w:val="NoSpacing"/>
-              <w:spacing w:before="120" w:after="120"/>
-              <w:rPr>
-                <w:rFonts w:ascii="Arial" w:hAnsi="Arial" w:cs="Arial"/>
-                <w:sz w:val="18"/>
-                <w:szCs w:val="18"/>
-                <w:lang w:val="en-US"/>
-              </w:rPr>
-            </w:pPr>
-            <w:r>
-              <w:rPr>
-                <w:rFonts w:ascii="Arial" w:hAnsi="Arial" w:cs="Arial"/>
-                <w:sz w:val="18"/>
-                <w:szCs w:val="18"/>
-                <w:lang w:val="en-GB"/>
-              </w:rPr>
-              <w:t>In which repository will the data be archived and made available for re-use? What persistent identifier (e.g., DOI) and which usage licence (e.g., CC BY) will be used?</w:t>
-            </w:r>
-          </w:p>
-          <w:p>
-            <w:pPr>
-              <w:pStyle w:val="NoSpacing"/>
-              <w:spacing w:before="120" w:after="120"/>
-              <w:rPr>
-                <w:rFonts w:ascii="Arial" w:hAnsi="Arial" w:cs="Arial"/>
-                <w:sz w:val="18"/>
-                <w:szCs w:val="18"/>
-                <w:lang w:val="en-US"/>
-              </w:rPr>
-            </w:pPr>
-            <w:r>
-              <w:rPr>
-                <w:rFonts w:ascii="Arial" w:hAnsi="Arial" w:cs="Arial"/>
-                <w:sz w:val="18"/>
-                <w:szCs w:val="18"/>
-                <w:lang w:val="en-US"/>
-              </w:rPr>
-              <w:t>What methods and software tools are needed to access and use the data?</w:t>
-            </w:r>
-          </w:p>
-          <w:p>
-            <w:pPr>
-              <w:pStyle w:val="NoSpacing"/>
-              <w:spacing w:before="120" w:after="120"/>
-              <w:rPr>
-                <w:rFonts w:ascii="Arial" w:hAnsi="Arial" w:cs="Arial"/>
-                <w:sz w:val="18"/>
-                <w:szCs w:val="18"/>
-                <w:lang w:val="en-GB"/>
-              </w:rPr>
-            </w:pPr>
-            <w:r>
-              <w:rPr>
-                <w:rFonts w:ascii="Arial" w:hAnsi="Arial" w:cs="Arial"/>
-                <w:sz w:val="18"/>
-                <w:szCs w:val="18"/>
-                <w:lang w:val="en-US"/>
-              </w:rPr>
-              <w:t>How will data for preservation be selected, and where will the data be preserved long-term?</w:t>
-            </w:r>
-          </w:p>
-        </w:tc>
-        <w:tc>
-          <w:tcPr>
-            <w:tcW w:w="8855" w:type="dxa"/>
-            <w:tcBorders>
-              <w:top w:val="single" w:sz="4" w:space="0" w:color="auto"/>
-              <w:left w:val="single" w:sz="4" w:space="0" w:color="auto"/>
-              <w:bottom w:val="single" w:sz="4" w:space="0" w:color="auto"/>
-              <w:right w:val="single" w:sz="4" w:space="0" w:color="auto"/>
-            </w:tcBorders>
-          </w:tcPr>
-          <w:p>
-            <w:pPr>
-              <w:pStyle w:val="ListItem-Bullet"/>
-              <w:numPr>
-                <w:ilvl w:val="0"/>
-                <w:numId w:val="18"/>
-              </w:numPr>
-              <w:spacing w:before="120" w:after="120"/>
-              <w:ind w:left="243" w:hanging="283"/>
-              <w:rPr>
-                <w:rFonts w:ascii="Arial" w:hAnsi="Arial" w:cs="Arial"/>
-                <w:sz w:val="18"/>
-                <w:szCs w:val="18"/>
-              </w:rPr>
-            </w:pPr>
-            <w:r>
-              <w:rPr>
-                <w:rFonts w:ascii="Arial" w:hAnsi="Arial" w:cs="Arial"/>
-                <w:sz w:val="18"/>
-                <w:szCs w:val="18"/>
-              </w:rPr>
-              <w:t xml:space="preserve">Explain how and when the data will be shared. Consider the </w:t>
-            </w:r>
-            <w:hyperlink r:id="rId24" w:tooltip="https://www.fwf.ac.at/en/research-funding/open-access-policy/open-access-to-research-data" w:history="1">
-              <w:r>
-                <w:rPr>
-                  <w:rStyle w:val="Hyperlink"/>
-                  <w:rFonts w:ascii="Arial" w:hAnsi="Arial" w:cs="Arial"/>
-                  <w:sz w:val="18"/>
-                  <w:szCs w:val="18"/>
-                </w:rPr>
-                <w:t>FWF’</w:t>
-              </w:r>
-              <w:r>
-                <w:rPr>
-                  <w:rStyle w:val="Hyperlink"/>
-                  <w:rFonts w:ascii="Arial" w:hAnsi="Arial" w:cs="Arial"/>
-                </w:rPr>
-                <w:t>s</w:t>
-              </w:r>
-              <w:r>
-                <w:rPr>
-                  <w:rStyle w:val="Hyperlink"/>
-                  <w:rFonts w:ascii="Arial" w:hAnsi="Arial" w:cs="Arial"/>
-                  <w:sz w:val="18"/>
-                  <w:szCs w:val="18"/>
-                </w:rPr>
-                <w:t xml:space="preserve"> Open Access policy on research data</w:t>
-              </w:r>
-            </w:hyperlink>
-            <w:r>
-              <w:rPr>
-                <w:rFonts w:ascii="Arial" w:hAnsi="Arial" w:cs="Arial"/>
-                <w:sz w:val="18"/>
-                <w:szCs w:val="18"/>
-              </w:rPr>
-              <w:t>. Immediate open access to research data is mandatory for data underpinning research papers, unless there are legal, ethical, or other reasons not to do so.</w:t>
-            </w:r>
-            <w:r>
-              <w:rPr>
-                <w:rFonts w:ascii="Arial" w:hAnsi="Arial" w:cs="Arial"/>
-                <w:color w:val="FF0000"/>
-                <w:sz w:val="18"/>
-                <w:szCs w:val="18"/>
-              </w:rPr>
-              <w:t xml:space="preserve"> </w:t>
-            </w:r>
-            <w:r>
-              <w:rPr>
-                <w:rFonts w:ascii="Arial" w:hAnsi="Arial" w:cs="Arial"/>
-                <w:sz w:val="18"/>
-                <w:szCs w:val="18"/>
-              </w:rPr>
-              <w:t xml:space="preserve">Explain such reasons where applicable. </w:t>
-            </w:r>
-          </w:p>
-          <w:p>
-            <w:pPr>
-              <w:pStyle w:val="ListItem-Bullet"/>
-              <w:numPr>
-                <w:ilvl w:val="0"/>
-                <w:numId w:val="18"/>
-              </w:numPr>
-              <w:spacing w:before="120" w:after="120"/>
-              <w:ind w:left="243" w:hanging="283"/>
-              <w:rPr>
-                <w:rFonts w:ascii="Arial" w:hAnsi="Arial" w:cs="Arial"/>
-                <w:sz w:val="18"/>
-                <w:szCs w:val="18"/>
-              </w:rPr>
-            </w:pPr>
-            <w:r>
-              <w:rPr>
-                <w:rFonts w:ascii="Arial" w:hAnsi="Arial" w:cs="Arial"/>
-                <w:sz w:val="18"/>
-                <w:szCs w:val="18"/>
-              </w:rPr>
-              <w:t>Explain how the data will be discoverable and made available for re-use, addressing the choice of repository, the persistent identifier (e.g., DOI), and the licence to use (see "</w:t>
-            </w:r>
-            <w:hyperlink r:id="rId25" w:tooltip="https://www.dcc.ac.uk/sites/default/files/documents/publications/reports/guides/How_To_License_Research_Data.pdf" w:history="1">
-              <w:r>
-                <w:rPr>
-                  <w:rStyle w:val="Hyperlink"/>
-                  <w:rFonts w:ascii="Arial" w:hAnsi="Arial" w:cs="Arial"/>
-                  <w:sz w:val="18"/>
-                  <w:szCs w:val="18"/>
-                </w:rPr>
-                <w:t>How to License Research Data</w:t>
-              </w:r>
-            </w:hyperlink>
-            <w:r>
-              <w:rPr>
-                <w:rFonts w:ascii="Arial" w:hAnsi="Arial" w:cs="Arial"/>
-                <w:sz w:val="18"/>
-                <w:szCs w:val="18"/>
-              </w:rPr>
-              <w:t xml:space="preserve">"). When choosing a repository, follow the </w:t>
-            </w:r>
-            <w:hyperlink r:id="rId26" w:tooltip="https://portal.fwf.ac.at/workspaces/Strateg-Dok/Dokumente/OpenAccess/05_Open_Data/Data_Policy/Update-DMP-2021/Science%20Europe%20Criteria%20for%20the%20selection%20of%20trustworthy%20repositories" w:history="1">
-              <w:r>
-                <w:rPr>
-                  <w:rStyle w:val="Hyperlink"/>
-                  <w:rFonts w:ascii="Arial" w:hAnsi="Arial" w:cs="Arial"/>
-                  <w:sz w:val="18"/>
-                  <w:szCs w:val="18"/>
-                </w:rPr>
-                <w:t>Science Europe Criteria for the selection of trustworthy repositories</w:t>
-              </w:r>
-            </w:hyperlink>
-            <w:r>
-              <w:rPr>
-                <w:rFonts w:ascii="Arial" w:hAnsi="Arial" w:cs="Arial"/>
-                <w:sz w:val="18"/>
-                <w:szCs w:val="18"/>
-              </w:rPr>
-              <w:t xml:space="preserve"> and use </w:t>
-            </w:r>
-            <w:hyperlink r:id="rId27" w:tooltip="http://www.re3data.org/" w:history="1">
-              <w:r>
-                <w:rPr>
-                  <w:rStyle w:val="Hyperlink"/>
-                  <w:rFonts w:ascii="Arial" w:hAnsi="Arial" w:cs="Arial"/>
-                  <w:sz w:val="18"/>
-                  <w:szCs w:val="18"/>
-                </w:rPr>
-                <w:t>http://www.re3data.org/</w:t>
-              </w:r>
-            </w:hyperlink>
-            <w:r>
-              <w:rPr>
-                <w:rFonts w:ascii="Arial" w:hAnsi="Arial" w:cs="Arial"/>
-                <w:sz w:val="18"/>
-                <w:szCs w:val="18"/>
-              </w:rPr>
-              <w:t xml:space="preserve"> to search for repositories.</w:t>
-            </w:r>
-          </w:p>
-          <w:p>
-            <w:pPr>
-              <w:pStyle w:val="ListItem-Bullet"/>
-              <w:numPr>
-                <w:ilvl w:val="0"/>
-                <w:numId w:val="18"/>
-              </w:numPr>
-              <w:spacing w:before="120" w:after="120"/>
-              <w:ind w:left="243" w:hanging="283"/>
-              <w:rPr>
-                <w:rFonts w:ascii="Arial" w:hAnsi="Arial" w:cs="Arial"/>
-                <w:sz w:val="18"/>
-                <w:szCs w:val="18"/>
-              </w:rPr>
-            </w:pPr>
-            <w:r>
-              <w:rPr>
-                <w:rFonts w:ascii="Arial" w:hAnsi="Arial" w:cs="Arial"/>
-                <w:sz w:val="18"/>
-                <w:szCs w:val="18"/>
-              </w:rPr>
-              <w:t>Indicate who will be able to use the data. If it is necessary to restrict access or to apply a data sharing agreement, explain how and why. Explain what actions will be taken to overcome or to minimise restrictions.</w:t>
-            </w:r>
-          </w:p>
-          <w:p>
-            <w:pPr>
-              <w:pStyle w:val="ListItem-Bullet"/>
-              <w:numPr>
-                <w:ilvl w:val="0"/>
-                <w:numId w:val="18"/>
-              </w:numPr>
-              <w:spacing w:before="120" w:after="120"/>
-              <w:ind w:left="243" w:hanging="283"/>
-              <w:rPr>
-                <w:rFonts w:ascii="Arial" w:hAnsi="Arial" w:cs="Arial"/>
-                <w:sz w:val="18"/>
-                <w:szCs w:val="18"/>
-              </w:rPr>
-            </w:pPr>
-            <w:r>
-              <w:rPr>
-                <w:rFonts w:ascii="Arial" w:hAnsi="Arial" w:cs="Arial"/>
-                <w:sz w:val="18"/>
-                <w:szCs w:val="18"/>
-              </w:rPr>
-              <w:t xml:space="preserve">Describe whether potential users need specific tools to access, interpret, and (re)-use the data (e.g., codes, algorithms). Consider the sustainability of software needed for accessing the data. </w:t>
-            </w:r>
-          </w:p>
-          <w:p>
-            <w:pPr>
-              <w:pStyle w:val="ListItem-Bullet"/>
-              <w:numPr>
-                <w:ilvl w:val="0"/>
-                <w:numId w:val="18"/>
-              </w:numPr>
-              <w:spacing w:before="120" w:after="120"/>
-              <w:ind w:left="243" w:hanging="283"/>
-              <w:rPr>
-                <w:rFonts w:ascii="Arial" w:hAnsi="Arial" w:cs="Arial"/>
-                <w:sz w:val="18"/>
-                <w:szCs w:val="18"/>
-              </w:rPr>
-            </w:pPr>
-            <w:r>
-              <w:rPr>
-                <w:rFonts w:ascii="Arial" w:hAnsi="Arial" w:cs="Arial"/>
-                <w:sz w:val="18"/>
-                <w:szCs w:val="18"/>
-              </w:rPr>
-              <w:t>Indicate what data must be retained or destroyed for contractual, legal, or regulatory purposes.</w:t>
-            </w:r>
-          </w:p>
-          <w:p>
-            <w:pPr>
-              <w:pStyle w:val="ListItem-Bullet"/>
-              <w:numPr>
-                <w:ilvl w:val="0"/>
-                <w:numId w:val="18"/>
-              </w:numPr>
-              <w:spacing w:before="120" w:after="120"/>
-              <w:ind w:left="243" w:hanging="283"/>
-              <w:rPr>
-                <w:rFonts w:ascii="Arial" w:hAnsi="Arial" w:cs="Arial"/>
-                <w:sz w:val="18"/>
-                <w:szCs w:val="18"/>
-              </w:rPr>
-            </w:pPr>
-            <w:r>
-              <w:rPr>
-                <w:rFonts w:ascii="Arial" w:hAnsi="Arial" w:cs="Arial"/>
-                <w:sz w:val="18"/>
-                <w:szCs w:val="18"/>
-              </w:rPr>
-              <w:t xml:space="preserve">Outline how it will be decided what data to keep and what data not to keep. Describe the data to be preserved long-term and give information on how long and where the data will be retained. </w:t>
-            </w:r>
-          </w:p>
-        </w:tc>
-      </w:tr>
-      <w:tr>
-        <w:trPr>
-          <w:trHeight w:val="454"/>
-        </w:trPr>
-        <w:tc>
-          <w:tcPr>
-            <w:tcW w:w="15168" w:type="dxa"/>
-            <w:gridSpan w:val="3"/>
-            <w:shd w:val="clear" w:color="auto" w:fill="4F81BD"/>
-            <w:vAlign w:val="center"/>
-          </w:tcPr>
-          <w:p>
-            <w:pPr>
-              <w:pStyle w:val="NoSpacing"/>
-              <w:spacing w:before="120" w:after="120"/>
-              <w:rPr>
-                <w:rFonts w:ascii="Arial" w:hAnsi="Arial" w:cs="Arial"/>
-                <w:b/>
-                <w:color w:val="FFFFFF"/>
-                <w:sz w:val="18"/>
-                <w:szCs w:val="18"/>
-                <w:lang w:val="en-GB"/>
-              </w:rPr>
-            </w:pPr>
-            <w:r>
-              <w:rPr>
-                <w:rFonts w:ascii="Arial" w:hAnsi="Arial" w:cs="Arial"/>
-                <w:b/>
-                <w:color w:val="FFFFFF" w:themeColor="background1"/>
-                <w:sz w:val="18"/>
-                <w:szCs w:val="18"/>
-                <w:lang w:val="en-GB"/>
-              </w:rPr>
-              <w:t>V Legal and Ethical Aspects</w:t>
-            </w:r>
-          </w:p>
-        </w:tc>
-      </w:tr>
-      <w:tr>
-        <w:trPr>
-          <w:trHeight w:val="454"/>
-        </w:trPr>
-        <w:tc>
-          <w:tcPr>
-            <w:tcW w:w="2344" w:type="dxa"/>
-            <w:shd w:val="clear" w:color="auto" w:fill="auto"/>
-            <w:vAlign w:val="center"/>
-          </w:tcPr>
-          <w:p>
-            <w:pPr>
-              <w:pStyle w:val="NoSpacing"/>
-              <w:spacing w:before="120" w:after="120"/>
-              <w:rPr>
-                <w:rFonts w:ascii="Arial" w:hAnsi="Arial" w:cs="Arial"/>
-                <w:b/>
-                <w:sz w:val="18"/>
-                <w:szCs w:val="18"/>
-                <w:lang w:val="en-GB"/>
-              </w:rPr>
-            </w:pPr>
-            <w:r>
-              <w:rPr>
-                <w:rFonts w:ascii="Arial" w:hAnsi="Arial" w:cs="Arial"/>
-                <w:b/>
-                <w:sz w:val="18"/>
-                <w:szCs w:val="18"/>
-                <w:lang w:val="en-GB"/>
-              </w:rPr>
-              <w:t>V.1 Legal aspects</w:t>
-            </w:r>
-          </w:p>
-        </w:tc>
-        <w:tc>
-          <w:tcPr>
-            <w:tcW w:w="3969" w:type="dxa"/>
-            <w:shd w:val="clear" w:color="auto" w:fill="auto"/>
-            <w:vAlign w:val="center"/>
-          </w:tcPr>
-          <w:p>
-            <w:pPr>
-              <w:pStyle w:val="NoSpacing"/>
-              <w:spacing w:before="120" w:after="120"/>
-              <w:rPr>
-                <w:rFonts w:ascii="Arial" w:hAnsi="Arial" w:cs="Arial"/>
-                <w:sz w:val="18"/>
-                <w:szCs w:val="18"/>
-                <w:lang w:val="en-GB"/>
-              </w:rPr>
-            </w:pPr>
-            <w:r>
-              <w:rPr>
-                <w:rFonts w:ascii="Arial" w:hAnsi="Arial" w:cs="Arial"/>
-                <w:sz w:val="18"/>
-                <w:szCs w:val="18"/>
-                <w:lang w:val="en-GB"/>
-              </w:rPr>
-              <w:t>How will legal issues, such as intellectual property rights and ownership, be managed? What legislation is applicable?</w:t>
-            </w:r>
-          </w:p>
-          <w:p>
-            <w:pPr>
-              <w:pStyle w:val="NoSpacing"/>
-              <w:spacing w:before="120" w:after="120"/>
-              <w:rPr>
-                <w:rFonts w:ascii="Arial" w:hAnsi="Arial" w:cs="Arial"/>
-                <w:sz w:val="18"/>
-                <w:szCs w:val="18"/>
-                <w:lang w:val="en-GB"/>
-              </w:rPr>
-            </w:pPr>
-            <w:r>
-              <w:rPr>
-                <w:rFonts w:ascii="Arial" w:hAnsi="Arial" w:cs="Arial"/>
-                <w:sz w:val="18"/>
-                <w:szCs w:val="18"/>
-                <w:lang w:val="en-GB"/>
-              </w:rPr>
-              <w:t xml:space="preserve">If personal data are processed, how will compliance with legislation on personal data and on security be ensured? </w:t>
-            </w:r>
-          </w:p>
-        </w:tc>
-        <w:tc>
-          <w:tcPr>
-            <w:tcW w:w="8855" w:type="dxa"/>
-          </w:tcPr>
-          <w:p>
-            <w:pPr>
-              <w:pStyle w:val="ListItem-Bullet"/>
-              <w:numPr>
-                <w:ilvl w:val="0"/>
-                <w:numId w:val="18"/>
-              </w:numPr>
-              <w:spacing w:before="120" w:after="120"/>
-              <w:ind w:left="243" w:hanging="283"/>
-              <w:rPr>
-                <w:rFonts w:ascii="Arial" w:hAnsi="Arial" w:cs="Arial"/>
-                <w:sz w:val="18"/>
-                <w:szCs w:val="18"/>
-              </w:rPr>
-            </w:pPr>
-            <w:r>
-              <w:rPr>
-                <w:rFonts w:ascii="Arial" w:hAnsi="Arial" w:cs="Arial"/>
-                <w:sz w:val="18"/>
-                <w:szCs w:val="18"/>
-              </w:rPr>
-              <w:t>Explain who will be the owner of the data, meaning who will have the rights to control access.</w:t>
-            </w:r>
-          </w:p>
-          <w:p>
-            <w:pPr>
-              <w:pStyle w:val="ListItem-Bullet"/>
-              <w:numPr>
-                <w:ilvl w:val="0"/>
-                <w:numId w:val="18"/>
-              </w:numPr>
-              <w:spacing w:before="120" w:after="120"/>
-              <w:ind w:left="243" w:hanging="283"/>
-              <w:rPr>
-                <w:rFonts w:ascii="Arial" w:hAnsi="Arial" w:cs="Arial"/>
-                <w:sz w:val="18"/>
-                <w:szCs w:val="18"/>
-              </w:rPr>
-            </w:pPr>
-            <w:r>
-              <w:rPr>
-                <w:rFonts w:ascii="Arial" w:hAnsi="Arial" w:cs="Arial"/>
-                <w:sz w:val="18"/>
-                <w:szCs w:val="18"/>
-              </w:rPr>
-              <w:t xml:space="preserve">Make sure to cover the matters of rights to control access to data for multi-partner projects and multiple data owners, in the consortium agreement. </w:t>
-            </w:r>
-          </w:p>
-          <w:p>
-            <w:pPr>
-              <w:pStyle w:val="ListItem-Bullet"/>
-              <w:numPr>
-                <w:ilvl w:val="0"/>
-                <w:numId w:val="18"/>
-              </w:numPr>
-              <w:spacing w:before="120" w:after="120"/>
-              <w:ind w:left="243" w:hanging="283"/>
-              <w:rPr>
-                <w:rFonts w:ascii="Arial" w:hAnsi="Arial" w:cs="Arial"/>
-                <w:sz w:val="18"/>
-                <w:szCs w:val="18"/>
-              </w:rPr>
-            </w:pPr>
-            <w:r>
-              <w:rPr>
-                <w:rFonts w:ascii="Arial" w:hAnsi="Arial" w:cs="Arial"/>
-                <w:sz w:val="18"/>
-                <w:szCs w:val="18"/>
-              </w:rPr>
-              <w:t>Indicate whether intellectual property rights (for example, Database Directive) are affected. If so, explain which and how will they be dealt with.</w:t>
-            </w:r>
-          </w:p>
-          <w:p>
-            <w:pPr>
-              <w:pStyle w:val="ListItem-Bullet"/>
-              <w:numPr>
-                <w:ilvl w:val="0"/>
-                <w:numId w:val="18"/>
-              </w:numPr>
-              <w:spacing w:before="120" w:after="120"/>
-              <w:ind w:left="243" w:hanging="283"/>
-              <w:rPr>
-                <w:rFonts w:ascii="Arial" w:hAnsi="Arial" w:cs="Arial"/>
-                <w:sz w:val="18"/>
-                <w:szCs w:val="18"/>
-              </w:rPr>
-            </w:pPr>
-            <w:r>
-              <w:rPr>
-                <w:rFonts w:ascii="Arial" w:hAnsi="Arial" w:cs="Arial"/>
-                <w:sz w:val="18"/>
-                <w:szCs w:val="18"/>
-              </w:rPr>
-              <w:t xml:space="preserve">Indicate whether there are any restrictions on the re-use of third-party data. </w:t>
-            </w:r>
-          </w:p>
-          <w:p>
-            <w:pPr>
-              <w:pStyle w:val="ListItem-Bullet"/>
-              <w:numPr>
-                <w:ilvl w:val="0"/>
-                <w:numId w:val="18"/>
-              </w:numPr>
-              <w:spacing w:before="120" w:after="120"/>
-              <w:ind w:left="243" w:hanging="283"/>
-              <w:rPr>
-                <w:rFonts w:ascii="Arial" w:hAnsi="Arial" w:cs="Arial"/>
-                <w:sz w:val="18"/>
-                <w:szCs w:val="18"/>
-              </w:rPr>
-            </w:pPr>
-            <w:r>
-              <w:rPr>
-                <w:rFonts w:ascii="Arial" w:hAnsi="Arial" w:cs="Arial"/>
-                <w:sz w:val="18"/>
-                <w:szCs w:val="18"/>
-              </w:rPr>
-              <w:t>Ensure that when dealing with personal data, data protection laws (for example, GDPR) are complied with:</w:t>
-            </w:r>
-          </w:p>
-          <w:p>
-            <w:pPr>
-              <w:pStyle w:val="ListItem-Bullet"/>
-              <w:numPr>
-                <w:ilvl w:val="0"/>
-                <w:numId w:val="21"/>
-              </w:numPr>
-              <w:spacing w:before="120" w:after="120"/>
-              <w:ind w:left="527" w:hanging="284"/>
-              <w:rPr>
-                <w:rFonts w:ascii="Arial" w:hAnsi="Arial" w:cs="Arial"/>
-                <w:sz w:val="18"/>
-                <w:szCs w:val="18"/>
-              </w:rPr>
-            </w:pPr>
-            <w:r>
-              <w:rPr>
-                <w:rFonts w:ascii="Arial" w:hAnsi="Arial" w:cs="Arial"/>
-                <w:sz w:val="18"/>
-                <w:szCs w:val="18"/>
-              </w:rPr>
-              <w:t>Gain informed consent for preservation and/or sharing of personal data.</w:t>
-            </w:r>
-          </w:p>
-          <w:p>
-            <w:pPr>
-              <w:pStyle w:val="ListItem-Bullet"/>
-              <w:numPr>
-                <w:ilvl w:val="0"/>
-                <w:numId w:val="21"/>
-              </w:numPr>
-              <w:spacing w:before="120" w:after="120"/>
-              <w:ind w:left="527" w:hanging="284"/>
-              <w:rPr>
-                <w:rFonts w:ascii="Arial" w:hAnsi="Arial" w:cs="Arial"/>
-                <w:sz w:val="18"/>
-                <w:szCs w:val="18"/>
-              </w:rPr>
-            </w:pPr>
-            <w:r>
-              <w:rPr>
-                <w:rFonts w:ascii="Arial" w:hAnsi="Arial" w:cs="Arial"/>
-                <w:sz w:val="18"/>
-                <w:szCs w:val="18"/>
-              </w:rPr>
-              <w:t>Consider anonymisation, pseudonymisation, or encryption of personal data for preservation and/or sharing (truly anonymous data are no longer considered personal data).</w:t>
-            </w:r>
-          </w:p>
-          <w:p>
-            <w:pPr>
-              <w:pStyle w:val="ListItem-Bullet"/>
-              <w:numPr>
-                <w:ilvl w:val="0"/>
-                <w:numId w:val="21"/>
-              </w:numPr>
-              <w:spacing w:before="120" w:after="120"/>
-              <w:ind w:left="527" w:hanging="284"/>
-              <w:rPr>
-                <w:rFonts w:ascii="Arial" w:hAnsi="Arial" w:cs="Arial"/>
-                <w:sz w:val="18"/>
-                <w:szCs w:val="18"/>
-              </w:rPr>
-            </w:pPr>
-            <w:r>
-              <w:rPr>
-                <w:rFonts w:ascii="Arial" w:hAnsi="Arial" w:cs="Arial"/>
-                <w:sz w:val="18"/>
-                <w:szCs w:val="18"/>
-              </w:rPr>
-              <w:t>Explain whether there is a managed access procedure in place for authorised users of personal data.</w:t>
-            </w:r>
-          </w:p>
-        </w:tc>
-      </w:tr>
-      <w:tr>
-        <w:trPr>
-          <w:trHeight w:val="454"/>
-        </w:trPr>
-        <w:tc>
-          <w:tcPr>
-            <w:tcW w:w="2344" w:type="dxa"/>
-            <w:tcBorders>
-              <w:top w:val="single" w:sz="4" w:space="0" w:color="auto"/>
-              <w:left w:val="single" w:sz="4" w:space="0" w:color="auto"/>
-              <w:bottom w:val="single" w:sz="4" w:space="0" w:color="auto"/>
-              <w:right w:val="single" w:sz="4" w:space="0" w:color="auto"/>
-            </w:tcBorders>
-            <w:shd w:val="clear" w:color="auto" w:fill="auto"/>
-            <w:vAlign w:val="center"/>
-          </w:tcPr>
-          <w:p>
-            <w:pPr>
-              <w:pStyle w:val="NoSpacing"/>
-              <w:spacing w:before="120" w:after="120"/>
-              <w:rPr>
-                <w:rFonts w:ascii="Arial" w:hAnsi="Arial" w:cs="Arial"/>
-                <w:b/>
-                <w:sz w:val="18"/>
-                <w:szCs w:val="18"/>
-                <w:lang w:val="en-GB"/>
-              </w:rPr>
-            </w:pPr>
-            <w:r>
-              <w:rPr>
-                <w:rFonts w:ascii="Arial" w:hAnsi="Arial" w:cs="Arial"/>
-                <w:b/>
-                <w:sz w:val="18"/>
-                <w:szCs w:val="18"/>
-                <w:lang w:val="en-GB"/>
-              </w:rPr>
-              <w:t>V.2 Ethical aspects</w:t>
-            </w:r>
-          </w:p>
-        </w:tc>
-        <w:tc>
-          <w:tcPr>
-            <w:tcW w:w="3969" w:type="dxa"/>
-            <w:tcBorders>
-              <w:top w:val="single" w:sz="4" w:space="0" w:color="auto"/>
-              <w:left w:val="single" w:sz="4" w:space="0" w:color="auto"/>
-              <w:bottom w:val="single" w:sz="4" w:space="0" w:color="auto"/>
-              <w:right w:val="single" w:sz="4" w:space="0" w:color="auto"/>
-            </w:tcBorders>
-            <w:shd w:val="clear" w:color="auto" w:fill="auto"/>
-            <w:vAlign w:val="center"/>
-          </w:tcPr>
-          <w:p>
-            <w:pPr>
-              <w:pStyle w:val="NoSpacing"/>
-              <w:spacing w:before="120" w:after="120"/>
-              <w:rPr>
-                <w:rFonts w:ascii="Arial" w:hAnsi="Arial" w:cs="Arial"/>
-                <w:sz w:val="18"/>
-                <w:szCs w:val="18"/>
-                <w:lang w:val="en-US"/>
-              </w:rPr>
-            </w:pPr>
-            <w:r>
-              <w:rPr>
-                <w:rFonts w:ascii="Arial" w:hAnsi="Arial" w:cs="Arial"/>
-                <w:sz w:val="18"/>
-                <w:szCs w:val="18"/>
-                <w:lang w:val="en-US"/>
-              </w:rPr>
-              <w:t>What ethical issues and codes of conduct are there, and how will they be taken into account?</w:t>
-            </w:r>
-          </w:p>
-        </w:tc>
-        <w:tc>
-          <w:tcPr>
-            <w:tcW w:w="8855" w:type="dxa"/>
-            <w:tcBorders>
-              <w:top w:val="single" w:sz="4" w:space="0" w:color="auto"/>
-              <w:left w:val="single" w:sz="4" w:space="0" w:color="auto"/>
-              <w:bottom w:val="single" w:sz="4" w:space="0" w:color="auto"/>
-              <w:right w:val="single" w:sz="4" w:space="0" w:color="auto"/>
-            </w:tcBorders>
-          </w:tcPr>
-          <w:p>
-            <w:pPr>
-              <w:pStyle w:val="ListItem-Bullet"/>
-              <w:numPr>
-                <w:ilvl w:val="0"/>
-                <w:numId w:val="19"/>
-              </w:numPr>
-              <w:spacing w:before="120" w:after="120"/>
-              <w:ind w:left="243" w:hanging="283"/>
-              <w:rPr>
-                <w:rFonts w:ascii="Arial" w:hAnsi="Arial" w:cs="Arial"/>
-                <w:sz w:val="18"/>
-                <w:szCs w:val="18"/>
-              </w:rPr>
-            </w:pPr>
-            <w:r>
-              <w:rPr>
-                <w:rFonts w:ascii="Arial" w:hAnsi="Arial" w:cs="Arial"/>
-                <w:sz w:val="18"/>
-                <w:szCs w:val="18"/>
-              </w:rPr>
-              <w:t>Consider whether ethical issues can affect how data are stored and shared, who can see or use them, and how long they are kept. Demonstrate awareness of these aspects and respective planning.</w:t>
-            </w:r>
-          </w:p>
-          <w:p>
-            <w:pPr>
-              <w:pStyle w:val="ListItem-Bullet"/>
-              <w:numPr>
-                <w:ilvl w:val="0"/>
-                <w:numId w:val="19"/>
-              </w:numPr>
-              <w:spacing w:before="120" w:after="120"/>
-              <w:ind w:left="243" w:hanging="283"/>
-              <w:rPr>
-                <w:rFonts w:ascii="Arial" w:hAnsi="Arial" w:cs="Arial"/>
-                <w:sz w:val="18"/>
-                <w:szCs w:val="18"/>
-              </w:rPr>
-            </w:pPr>
-            <w:r>
-              <w:rPr>
-                <w:rFonts w:ascii="Arial" w:hAnsi="Arial" w:cs="Arial"/>
-                <w:sz w:val="18"/>
-                <w:szCs w:val="18"/>
-                <w:lang w:val="en-US"/>
-              </w:rPr>
-              <w:lastRenderedPageBreak/>
-              <w:t>Follow the national and international codes of conducts and institutional ethical guidelines, and check if ethical review (for example, by an ethics committee) is required for data collection in the research project.</w:t>
-            </w:r>
-            <w:r>
-              <w:rPr>
-                <w:rFonts w:ascii="Arial" w:hAnsi="Arial" w:cs="Arial"/>
-                <w:sz w:val="18"/>
-                <w:szCs w:val="18"/>
-              </w:rPr>
-              <w:t xml:space="preserve"> </w:t>
-            </w:r>
-          </w:p>
-          <w:p>
-            <w:pPr>
-              <w:pStyle w:val="ListItem-Bullet"/>
-              <w:numPr>
-                <w:ilvl w:val="0"/>
-                <w:numId w:val="19"/>
-              </w:numPr>
-              <w:spacing w:before="120" w:after="120"/>
-              <w:ind w:left="243" w:hanging="283"/>
-              <w:rPr>
-                <w:rFonts w:ascii="Arial" w:hAnsi="Arial" w:cs="Arial"/>
-                <w:sz w:val="18"/>
-                <w:szCs w:val="18"/>
-              </w:rPr>
-            </w:pPr>
-            <w:r>
-              <w:rPr>
-                <w:rFonts w:ascii="Arial" w:hAnsi="Arial" w:cs="Arial"/>
-                <w:sz w:val="18"/>
-                <w:szCs w:val="18"/>
-              </w:rPr>
-              <w:t>Consider “</w:t>
-            </w:r>
-            <w:hyperlink r:id="rId28" w:tooltip="http://ec.europa.eu/research/participants/data/ref/fp7/89888/ethics-for-researchers_en.pdf" w:history="1">
-              <w:r>
-                <w:rPr>
-                  <w:rStyle w:val="Hyperlink"/>
-                  <w:rFonts w:ascii="Arial" w:hAnsi="Arial" w:cs="Arial"/>
-                  <w:sz w:val="18"/>
-                  <w:szCs w:val="18"/>
-                </w:rPr>
-                <w:t>Ethics for researchers</w:t>
-              </w:r>
-            </w:hyperlink>
-            <w:r>
-              <w:rPr>
-                <w:rFonts w:ascii="Arial" w:hAnsi="Arial" w:cs="Arial"/>
-                <w:sz w:val="18"/>
-                <w:szCs w:val="18"/>
-              </w:rPr>
-              <w:t>” published by the European Commission or “</w:t>
-            </w:r>
-            <w:hyperlink r:id="rId29" w:tooltip="https://ec.europa.eu/info/funding-tenders/opportunities/docs/2021-2027/horizon/guidance/european-code-of-conduct-for-research-integrity_horizon_en.pdf" w:history="1">
-              <w:r>
-                <w:rPr>
-                  <w:rStyle w:val="Hyperlink"/>
-                  <w:rFonts w:ascii="Arial" w:hAnsi="Arial" w:cs="Arial"/>
-                  <w:sz w:val="18"/>
-                  <w:szCs w:val="18"/>
-                </w:rPr>
-                <w:t>The European Code of Conduct for Research Integrity</w:t>
-              </w:r>
-            </w:hyperlink>
-            <w:r>
-              <w:rPr>
-                <w:rFonts w:ascii="Arial" w:hAnsi="Arial" w:cs="Arial"/>
-                <w:sz w:val="18"/>
-                <w:szCs w:val="18"/>
-              </w:rPr>
-              <w:t>”.</w:t>
-            </w:r>
-          </w:p>
-        </w:tc>
-      </w:tr>
-    </w:tbl>
-    <w:p>
-      <w:pPr>
-        <w:rPr>
-          <w:rFonts w:ascii="Arial" w:hAnsi="Arial" w:cs="Arial"/>
-          <w:b/>
-          <w:sz w:val="18"/>
-          <w:szCs w:val="18"/>
-          <w:lang w:val="en-US"/>
-        </w:rPr>
-      </w:pPr>
-    </w:p>
-    <w:p>
-      <w:pPr>
-        <w:rPr>
-          <w:rFonts w:ascii="Arial" w:hAnsi="Arial" w:cs="Arial"/>
-          <w:lang w:val="en-GB"/>
-        </w:rPr>
-        <w:sectPr>
-          <w:pgSz w:w="16838" w:h="11906" w:orient="landscape"/>
-          <w:pgMar w:top="851" w:right="820" w:bottom="1417" w:left="1134" w:header="708" w:footer="708" w:gutter="0"/>
-          <w:pgNumType w:start="1"/>
-          <w:cols w:space="708"/>
-          <w:docGrid w:linePitch="360"/>
-        </w:sectPr>
-      </w:pPr>
     </w:p>
     <w:p>
       <w:pPr>
@@ -3233,15 +801,6 @@
           <w:lang w:val="en-GB"/>
         </w:rPr>
       </w:pPr>
-      <w:r>
-        <w:rPr>
-          <w:rFonts w:ascii="Arial" w:hAnsi="Arial" w:cs="Arial"/>
-          <w:b/>
-          <w:lang w:val="en-GB"/>
-        </w:rPr>
-        <w:lastRenderedPageBreak/>
-        <w:t>Template</w:t>
-      </w:r>
     </w:p>
     <w:tbl>
       <w:tblPr>
@@ -4544,7 +2103,7 @@
                 <w:lang w:val="en-GB"/>
               </w:rPr>
             </w:pPr>
-            <w:bookmarkStart w:id="2" w:name="_Hlk65667802"/>
+            <w:bookmarkStart w:id="0" w:name="_Hlk65667802"/>
             <w:r>
               <w:rPr>
                 <w:rFonts w:ascii="Arial" w:hAnsi="Arial" w:cs="Arial"/>
@@ -4605,7 +2164,7 @@
                 </w:tcPr>
                 <w:p>
                   <w:pPr>
-                    <w:jc w:val="center"/>
+                    <w:jc w:val="left"/>
                     <w:rPr>
                       <w:rFonts w:cs="Arial"/>
                       <w:b/>
@@ -4615,8 +2174,8 @@
                       <w:szCs w:val="18"/>
                     </w:rPr>
                   </w:pPr>
-                  <w:bookmarkStart w:id="3" w:name="_Hlk66278334"/>
-                  <w:bookmarkEnd w:id="2"/>
+                  <w:bookmarkStart w:id="1" w:name="_Hlk66278334"/>
+                  <w:bookmarkEnd w:id="0"/>
                   <w:r>
                     <w:rPr>
                       <w:rFonts w:cs="Arial"/>
@@ -4624,7 +2183,8 @@
                       <w:sz w:val="18"/>
                       <w:szCs w:val="18"/>
                     </w:rPr>
-                    <w:t>dataset ID</w:t>
+                    <w:lastRenderedPageBreak/>
+                    <w:t>D</w:t>
                   </w:r>
                 </w:p>
               </w:tc>
@@ -5134,7 +2694,7 @@
                     </w:rPr>
                     <w:t>[dataset1sensitive]</w:t>
                   </w:r>
-                  <w:bookmarkEnd w:id="3"/>
+                  <w:bookmarkEnd w:id="1"/>
                 </w:p>
               </w:tc>
               <w:tc>
@@ -5193,7 +2753,6 @@
                 <w:szCs w:val="18"/>
                 <w:lang w:val="en-GB"/>
               </w:rPr>
-              <w:lastRenderedPageBreak/>
               <w:t>Reused datasets:</w:t>
             </w:r>
           </w:p>
@@ -5804,7 +3363,6 @@
                 <w:szCs w:val="18"/>
                 <w:lang w:val="en-GB"/>
               </w:rPr>
-              <w:lastRenderedPageBreak/>
               <w:t xml:space="preserve">III Documentation and Data Quality </w:t>
             </w:r>
           </w:p>
@@ -6185,6 +3743,7 @@
                 <w:szCs w:val="18"/>
                 <w:lang w:val="en-GB"/>
               </w:rPr>
+              <w:lastRenderedPageBreak/>
               <w:t>IV.1 Data storage and backup during the research process</w:t>
             </w:r>
           </w:p>
@@ -6350,7 +3909,7 @@
                 <w:lang w:val="en-GB"/>
               </w:rPr>
             </w:pPr>
-            <w:bookmarkStart w:id="4" w:name="_Hlk81476248"/>
+            <w:bookmarkStart w:id="2" w:name="_Hlk81476248"/>
             <w:r>
               <w:rPr>
                 <w:rFonts w:ascii="Arial" w:hAnsi="Arial" w:cs="Arial"/>
@@ -6358,7 +3917,6 @@
                 <w:szCs w:val="18"/>
                 <w:lang w:val="en-GB"/>
               </w:rPr>
-              <w:lastRenderedPageBreak/>
               <w:t>Access to data during research:</w:t>
             </w:r>
           </w:p>
@@ -6512,7 +4070,7 @@
                 </w:p>
               </w:tc>
             </w:tr>
-            <w:bookmarkEnd w:id="4"/>
+            <w:bookmarkEnd w:id="2"/>
             <w:tr>
               <w:tc>
                 <w:tcPr>
@@ -6770,7 +4328,6 @@
                 <w:szCs w:val="18"/>
                 <w:lang w:val="en-GB"/>
               </w:rPr>
-              <w:lastRenderedPageBreak/>
               <w:t>IV.2 Data sharing and long-term preservation</w:t>
             </w:r>
           </w:p>
@@ -7416,7 +4973,7 @@
               </w:rPr>
               <w:t>[restrictedAccessInfo]</w:t>
             </w:r>
-            <w:bookmarkStart w:id="5" w:name="_Toc66691678"/>
+            <w:bookmarkStart w:id="3" w:name="_Toc66691678"/>
           </w:p>
           <w:p>
             <w:pPr>
@@ -7438,9 +4995,10 @@
                 <w:sz w:val="18"/>
                 <w:szCs w:val="18"/>
               </w:rPr>
+              <w:lastRenderedPageBreak/>
               <w:t xml:space="preserve">Long-term preservation and </w:t>
             </w:r>
-            <w:bookmarkEnd w:id="5"/>
+            <w:bookmarkEnd w:id="3"/>
             <w:r>
               <w:rPr>
                 <w:b/>
@@ -7816,7 +5374,6 @@
                 <w:szCs w:val="18"/>
                 <w:lang w:val="en-GB"/>
               </w:rPr>
-              <w:lastRenderedPageBreak/>
               <w:t xml:space="preserve">Overview of (unpublished) data that will be deleted: </w:t>
             </w:r>
           </w:p>
@@ -8287,7 +5844,6 @@
                 <w:szCs w:val="18"/>
                 <w:lang w:val="en-GB"/>
               </w:rPr>
-              <w:lastRenderedPageBreak/>
               <w:t>V Legal and Ethical Aspects</w:t>
             </w:r>
           </w:p>
@@ -8345,8 +5901,8 @@
                 <w:szCs w:val="18"/>
               </w:rPr>
             </w:pPr>
-            <w:bookmarkStart w:id="6" w:name="_Toc66691673"/>
-            <w:bookmarkStart w:id="7" w:name="_Hlk40269153"/>
+            <w:bookmarkStart w:id="4" w:name="_Toc66691673"/>
+            <w:bookmarkStart w:id="5" w:name="_Hlk40269153"/>
             <w:r>
               <w:rPr>
                 <w:b/>
@@ -8357,7 +5913,7 @@
               </w:rPr>
               <w:t>Personal data</w:t>
             </w:r>
-            <w:bookmarkEnd w:id="6"/>
+            <w:bookmarkEnd w:id="4"/>
             <w:r>
               <w:rPr>
                 <w:b/>
@@ -8369,7 +5925,7 @@
               <w:t>:</w:t>
             </w:r>
           </w:p>
-          <w:bookmarkEnd w:id="7"/>
+          <w:bookmarkEnd w:id="5"/>
           <w:p>
             <w:pPr>
               <w:spacing w:before="120" w:after="120"/>
@@ -8583,7 +6139,7 @@
       </w:pPr>
     </w:p>
     <w:sectPr>
-      <w:footerReference w:type="default" r:id="rId30"/>
+      <w:footerReference w:type="default" r:id="rId21"/>
       <w:pgSz w:w="16838" w:h="11906" w:orient="landscape"/>
       <w:pgMar w:top="1134" w:right="1417" w:bottom="1417" w:left="1134" w:header="708" w:footer="708" w:gutter="0"/>
       <w:cols w:space="708"/>
@@ -8594,7 +6150,7 @@
 </file>
 
 <file path=word/endnotes.xml><?xml version="1.0" encoding="utf-8"?>
-<w:endnotes xmlns:wpc="http://schemas.microsoft.com/office/word/2010/wordprocessingCanvas" xmlns:cx="http://schemas.microsoft.com/office/drawing/2014/chartex" xmlns:cx1="http://schemas.microsoft.com/office/drawing/2015/9/8/chartex" xmlns:cx2="http://schemas.microsoft.com/office/drawing/2015/10/21/chartex" xmlns:cx3="http://schemas.microsoft.com/office/drawing/2016/5/9/chartex" xmlns:cx4="http://schemas.microsoft.com/office/drawing/2016/5/10/chartex" xmlns:cx5="http://schemas.microsoft.com/office/drawing/2016/5/11/chartex" xmlns:cx6="http://schemas.microsoft.com/office/drawing/2016/5/12/chartex" xmlns:cx7="http://schemas.microsoft.com/office/drawing/2016/5/13/chartex" xmlns:cx8="http://schemas.microsoft.com/office/drawing/2016/5/14/chartex" xmlns:mc="http://schemas.openxmlformats.org/markup-compatibility/2006" xmlns:aink="http://schemas.microsoft.com/office/drawing/2016/ink" xmlns:am3d="http://schemas.microsoft.com/office/drawing/2017/model3d" xmlns:o="urn:schemas-microsoft-com:office:office" xmlns:oel="http://schemas.microsoft.com/office/2019/extlst" xmlns:r="http://schemas.openxmlformats.org/officeDocument/2006/relationships" xmlns:m="http://schemas.openxmlformats.org/officeDocument/2006/math" xmlns:v="urn:schemas-microsoft-com:vml" xmlns:wp14="http://schemas.microsoft.com/office/word/2010/wordprocessingDrawing" xmlns:wp="http://schemas.openxmlformats.org/drawingml/2006/wordprocessingDrawing" xmlns:w10="urn:schemas-microsoft-com:office:word" xmlns:w="http://schemas.openxmlformats.org/wordprocessingml/2006/main" xmlns:w14="http://schemas.microsoft.com/office/word/2010/wordml" xmlns:w15="http://schemas.microsoft.com/office/word/2012/wordml" xmlns:w16cex="http://schemas.microsoft.com/office/word/2018/wordml/cex" xmlns:w16cid="http://schemas.microsoft.com/office/word/2016/wordml/cid" xmlns:w16="http://schemas.microsoft.com/office/word/2018/wordml" xmlns:w16du="http://schemas.microsoft.com/office/word/2023/wordml/word16du" xmlns:w16sdtdh="http://schemas.microsoft.com/office/word/2020/wordml/sdtdatahash" xmlns:w16se="http://schemas.microsoft.com/office/word/2015/wordml/symex" xmlns:wpg="http://schemas.microsoft.com/office/word/2010/wordprocessingGroup" xmlns:wpi="http://schemas.microsoft.com/office/word/2010/wordprocessingInk" xmlns:wne="http://schemas.microsoft.com/office/word/2006/wordml" xmlns:wps="http://schemas.microsoft.com/office/word/2010/wordprocessingShape" mc:Ignorable="w14 w15 w16se w16cid w16 w16cex w16sdtdh w16du wp14">
+<w:endnotes xmlns:wpc="http://schemas.microsoft.com/office/word/2010/wordprocessingCanvas" xmlns:cx="http://schemas.microsoft.com/office/drawing/2014/chartex" xmlns:cx1="http://schemas.microsoft.com/office/drawing/2015/9/8/chartex" xmlns:cx2="http://schemas.microsoft.com/office/drawing/2015/10/21/chartex" xmlns:cx3="http://schemas.microsoft.com/office/drawing/2016/5/9/chartex" xmlns:cx4="http://schemas.microsoft.com/office/drawing/2016/5/10/chartex" xmlns:cx5="http://schemas.microsoft.com/office/drawing/2016/5/11/chartex" xmlns:cx6="http://schemas.microsoft.com/office/drawing/2016/5/12/chartex" xmlns:cx7="http://schemas.microsoft.com/office/drawing/2016/5/13/chartex" xmlns:cx8="http://schemas.microsoft.com/office/drawing/2016/5/14/chartex" xmlns:mc="http://schemas.openxmlformats.org/markup-compatibility/2006" xmlns:aink="http://schemas.microsoft.com/office/drawing/2016/ink" xmlns:am3d="http://schemas.microsoft.com/office/drawing/2017/model3d" xmlns:o="urn:schemas-microsoft-com:office:office" xmlns:oel="http://schemas.microsoft.com/office/2019/extlst" xmlns:r="http://schemas.openxmlformats.org/officeDocument/2006/relationships" xmlns:m="http://schemas.openxmlformats.org/officeDocument/2006/math" xmlns:v="urn:schemas-microsoft-com:vml" xmlns:wp14="http://schemas.microsoft.com/office/word/2010/wordprocessingDrawing" xmlns:wp="http://schemas.openxmlformats.org/drawingml/2006/wordprocessingDrawing" xmlns:w10="urn:schemas-microsoft-com:office:word" xmlns:w="http://schemas.openxmlformats.org/wordprocessingml/2006/main" xmlns:w14="http://schemas.microsoft.com/office/word/2010/wordml" xmlns:w15="http://schemas.microsoft.com/office/word/2012/wordml" xmlns:w16cex="http://schemas.microsoft.com/office/word/2018/wordml/cex" xmlns:w16cid="http://schemas.microsoft.com/office/word/2016/wordml/cid" xmlns:w16="http://schemas.microsoft.com/office/word/2018/wordml" xmlns:w16du="http://schemas.microsoft.com/office/word/2023/wordml/word16du" xmlns:w16sdtdh="http://schemas.microsoft.com/office/word/2020/wordml/sdtdatahash" xmlns:w16sdtfl="http://schemas.microsoft.com/office/word/2024/wordml/sdtformatlock" xmlns:w16se="http://schemas.microsoft.com/office/word/2015/wordml/symex" xmlns:wpg="http://schemas.microsoft.com/office/word/2010/wordprocessingGroup" xmlns:wpi="http://schemas.microsoft.com/office/word/2010/wordprocessingInk" xmlns:wne="http://schemas.microsoft.com/office/word/2006/wordml" xmlns:wps="http://schemas.microsoft.com/office/word/2010/wordprocessingShape" mc:Ignorable="w14 w15 w16se w16cid w16 w16cex w16sdtdh w16sdtfl w16du wp14">
   <w:endnote w:type="separator" w:id="-1">
     <w:p>
       <w:pPr>
@@ -8619,7 +6175,7 @@
 </file>
 
 <file path=word/footer1.xml><?xml version="1.0" encoding="utf-8"?>
-<w:ftr xmlns:wpc="http://schemas.microsoft.com/office/word/2010/wordprocessingCanvas" xmlns:cx="http://schemas.microsoft.com/office/drawing/2014/chartex" xmlns:cx1="http://schemas.microsoft.com/office/drawing/2015/9/8/chartex" xmlns:cx2="http://schemas.microsoft.com/office/drawing/2015/10/21/chartex" xmlns:cx3="http://schemas.microsoft.com/office/drawing/2016/5/9/chartex" xmlns:cx4="http://schemas.microsoft.com/office/drawing/2016/5/10/chartex" xmlns:cx5="http://schemas.microsoft.com/office/drawing/2016/5/11/chartex" xmlns:cx6="http://schemas.microsoft.com/office/drawing/2016/5/12/chartex" xmlns:cx7="http://schemas.microsoft.com/office/drawing/2016/5/13/chartex" xmlns:cx8="http://schemas.microsoft.com/office/drawing/2016/5/14/chartex" xmlns:mc="http://schemas.openxmlformats.org/markup-compatibility/2006" xmlns:aink="http://schemas.microsoft.com/office/drawing/2016/ink" xmlns:am3d="http://schemas.microsoft.com/office/drawing/2017/model3d" xmlns:o="urn:schemas-microsoft-com:office:office" xmlns:oel="http://schemas.microsoft.com/office/2019/extlst" xmlns:r="http://schemas.openxmlformats.org/officeDocument/2006/relationships" xmlns:m="http://schemas.openxmlformats.org/officeDocument/2006/math" xmlns:v="urn:schemas-microsoft-com:vml" xmlns:wp14="http://schemas.microsoft.com/office/word/2010/wordprocessingDrawing" xmlns:wp="http://schemas.openxmlformats.org/drawingml/2006/wordprocessingDrawing" xmlns:w10="urn:schemas-microsoft-com:office:word" xmlns:w="http://schemas.openxmlformats.org/wordprocessingml/2006/main" xmlns:w14="http://schemas.microsoft.com/office/word/2010/wordml" xmlns:w15="http://schemas.microsoft.com/office/word/2012/wordml" xmlns:w16cex="http://schemas.microsoft.com/office/word/2018/wordml/cex" xmlns:w16cid="http://schemas.microsoft.com/office/word/2016/wordml/cid" xmlns:w16="http://schemas.microsoft.com/office/word/2018/wordml" xmlns:w16du="http://schemas.microsoft.com/office/word/2023/wordml/word16du" xmlns:w16sdtdh="http://schemas.microsoft.com/office/word/2020/wordml/sdtdatahash" xmlns:w16se="http://schemas.microsoft.com/office/word/2015/wordml/symex" xmlns:wpg="http://schemas.microsoft.com/office/word/2010/wordprocessingGroup" xmlns:wpi="http://schemas.microsoft.com/office/word/2010/wordprocessingInk" xmlns:wne="http://schemas.microsoft.com/office/word/2006/wordml" xmlns:wps="http://schemas.microsoft.com/office/word/2010/wordprocessingShape" mc:Ignorable="w14 w15 w16se w16cid w16 w16cex w16sdtdh w16du wp14">
+<w:ftr xmlns:wpc="http://schemas.microsoft.com/office/word/2010/wordprocessingCanvas" xmlns:cx="http://schemas.microsoft.com/office/drawing/2014/chartex" xmlns:cx1="http://schemas.microsoft.com/office/drawing/2015/9/8/chartex" xmlns:cx2="http://schemas.microsoft.com/office/drawing/2015/10/21/chartex" xmlns:cx3="http://schemas.microsoft.com/office/drawing/2016/5/9/chartex" xmlns:cx4="http://schemas.microsoft.com/office/drawing/2016/5/10/chartex" xmlns:cx5="http://schemas.microsoft.com/office/drawing/2016/5/11/chartex" xmlns:cx6="http://schemas.microsoft.com/office/drawing/2016/5/12/chartex" xmlns:cx7="http://schemas.microsoft.com/office/drawing/2016/5/13/chartex" xmlns:cx8="http://schemas.microsoft.com/office/drawing/2016/5/14/chartex" xmlns:mc="http://schemas.openxmlformats.org/markup-compatibility/2006" xmlns:aink="http://schemas.microsoft.com/office/drawing/2016/ink" xmlns:am3d="http://schemas.microsoft.com/office/drawing/2017/model3d" xmlns:o="urn:schemas-microsoft-com:office:office" xmlns:oel="http://schemas.microsoft.com/office/2019/extlst" xmlns:r="http://schemas.openxmlformats.org/officeDocument/2006/relationships" xmlns:m="http://schemas.openxmlformats.org/officeDocument/2006/math" xmlns:v="urn:schemas-microsoft-com:vml" xmlns:wp14="http://schemas.microsoft.com/office/word/2010/wordprocessingDrawing" xmlns:wp="http://schemas.openxmlformats.org/drawingml/2006/wordprocessingDrawing" xmlns:w10="urn:schemas-microsoft-com:office:word" xmlns:w="http://schemas.openxmlformats.org/wordprocessingml/2006/main" xmlns:w14="http://schemas.microsoft.com/office/word/2010/wordml" xmlns:w15="http://schemas.microsoft.com/office/word/2012/wordml" xmlns:w16cex="http://schemas.microsoft.com/office/word/2018/wordml/cex" xmlns:w16cid="http://schemas.microsoft.com/office/word/2016/wordml/cid" xmlns:w16="http://schemas.microsoft.com/office/word/2018/wordml" xmlns:w16du="http://schemas.microsoft.com/office/word/2023/wordml/word16du" xmlns:w16sdtdh="http://schemas.microsoft.com/office/word/2020/wordml/sdtdatahash" xmlns:w16sdtfl="http://schemas.microsoft.com/office/word/2024/wordml/sdtformatlock" xmlns:w16se="http://schemas.microsoft.com/office/word/2015/wordml/symex" xmlns:wpg="http://schemas.microsoft.com/office/word/2010/wordprocessingGroup" xmlns:wpi="http://schemas.microsoft.com/office/word/2010/wordprocessingInk" xmlns:wne="http://schemas.microsoft.com/office/word/2006/wordml" xmlns:wps="http://schemas.microsoft.com/office/word/2010/wordprocessingShape" mc:Ignorable="w14 w15 w16se w16cid w16 w16cex w16sdtdh w16sdtfl w16du wp14">
   <w:p>
     <w:pPr>
       <w:pStyle w:val="Footer"/>
@@ -8629,169 +6185,19 @@
         <w:tab w:val="center" w:pos="9214"/>
         <w:tab w:val="right" w:pos="14175"/>
       </w:tabs>
-      <w:jc w:val="right"/>
       <w:rPr>
         <w:rFonts w:ascii="Arial" w:hAnsi="Arial" w:cs="Arial"/>
         <w:sz w:val="16"/>
         <w:szCs w:val="16"/>
+        <w:lang w:val="de-AT"/>
       </w:rPr>
     </w:pPr>
-    <w:sdt>
-      <w:sdtPr>
-        <w:rPr>
-          <w:rFonts w:ascii="Arial" w:hAnsi="Arial" w:cs="Arial"/>
-          <w:sz w:val="16"/>
-          <w:szCs w:val="16"/>
-        </w:rPr>
-        <w:id w:val="-930815446"/>
-        <w:docPartObj>
-          <w:docPartGallery w:val="Page Numbers (Bottom of Page)"/>
-          <w:docPartUnique/>
-        </w:docPartObj>
-      </w:sdtPr>
-      <w:sdtContent>
-        <w:r>
-          <w:rPr>
-            <w:rFonts w:ascii="Arial" w:hAnsi="Arial" w:cs="Arial"/>
-            <w:noProof/>
-            <w:sz w:val="16"/>
-            <w:szCs w:val="16"/>
-            <w:lang w:val="de-AT" w:eastAsia="de-AT"/>
-          </w:rPr>
-          <mc:AlternateContent>
-            <mc:Choice Requires="wpg">
-              <w:drawing>
-                <wp:inline distT="0" distB="0" distL="0" distR="0" wp14:anchorId="77F6C6B4" wp14:editId="07777777">
-                  <wp:extent cx="219710" cy="66040"/>
-                  <wp:effectExtent l="0" t="0" r="8890" b="0"/>
-                  <wp:docPr id="1" name="Grafik 2"/>
-                  <wp:cNvGraphicFramePr>
-                    <a:graphicFrameLocks xmlns:a="http://schemas.openxmlformats.org/drawingml/2006/main" noChangeAspect="1"/>
-                  </wp:cNvGraphicFramePr>
-                  <a:graphic xmlns:a="http://schemas.openxmlformats.org/drawingml/2006/main">
-                    <a:graphicData uri="http://schemas.openxmlformats.org/drawingml/2006/picture">
-                      <pic:pic xmlns:pic="http://schemas.openxmlformats.org/drawingml/2006/picture">
-                        <pic:nvPicPr>
-                          <pic:cNvPr id="0" name="Picture 1"/>
-                          <pic:cNvPicPr>
-                            <a:picLocks noChangeAspect="1"/>
-                          </pic:cNvPicPr>
-                        </pic:nvPicPr>
-                        <pic:blipFill>
-                          <a:blip r:embed="rId1"/>
-                          <a:stretch/>
-                        </pic:blipFill>
-                        <pic:spPr bwMode="auto">
-                          <a:xfrm>
-                            <a:off x="0" y="0"/>
-                            <a:ext cx="219710" cy="66040"/>
-                          </a:xfrm>
-                          <a:prstGeom prst="rect">
-                            <a:avLst/>
-                          </a:prstGeom>
-                          <a:noFill/>
-                          <a:ln>
-                            <a:noFill/>
-                          </a:ln>
-                        </pic:spPr>
-                      </pic:pic>
-                    </a:graphicData>
-                  </a:graphic>
-                </wp:inline>
-              </w:drawing>
-            </mc:Choice>
-            <mc:Fallback xmlns:a="http://schemas.openxmlformats.org/drawingml/2006/main" xmlns:wp14="http://schemas.microsoft.com/office/word/2010/wordml" xmlns:pic="http://schemas.openxmlformats.org/drawingml/2006/picture">
-              <w:pict w14:anchorId="5B1651CD">
-                <v:shapetype coordsize="21600,21600" o:spt="75" o:preferrelative="t" path="m@4@5l@4@11@9@11@9@5xe" type="#_x0000_t75">
-                  <v:formulas>
-                    <v:f eqn="if lineDrawn pixelLineWidth 0"/>
-                    <v:f eqn="sum @0 1 0"/>
-                    <v:f eqn="sum 0 0 @1"/>
-                    <v:f eqn="prod @2 1 2"/>
-                    <v:f eqn="prod @3 21600 pixelWidth"/>
-                    <v:f eqn="prod @3 21600 pixelHeight"/>
-                    <v:f eqn="sum @0 0 1"/>
-                    <v:f eqn="prod @6 1 2"/>
-                    <v:f eqn="prod @7 21600 pixelWidth"/>
-                    <v:f eqn="sum @8 21600 0"/>
-                    <v:f eqn="prod @7 21600 pixelHeight"/>
-                    <v:f eqn="sum @10 21600 0"/>
-                  </v:formulas>
-                </v:shapetype>
-                <v:shape id="_x0000_i0" style="mso-wrap-distance-left:0.0pt;mso-wrap-distance-top:0.0pt;mso-wrap-distance-right:0.0pt;mso-wrap-distance-bottom:0.0pt;width:17.3pt;height:5.2pt;" o:spid="_x0000_s0" stroked="f" type="#_x0000_t75">
-                  <v:path textboxrect="0,0,0,0"/>
-                  <v:imagedata o:title="" r:id="rId2"/>
-                </v:shape>
-              </w:pict>
-            </mc:Fallback>
-          </mc:AlternateContent>
-        </w:r>
-        <w:r>
-          <w:rPr>
-            <w:rFonts w:ascii="Arial" w:hAnsi="Arial" w:cs="Arial"/>
-            <w:sz w:val="16"/>
-            <w:szCs w:val="16"/>
-            <w:lang w:val="de-AT"/>
-          </w:rPr>
-          <w:t xml:space="preserve"> DMP Guidance and Template (01/2022)</w:t>
-        </w:r>
-        <w:r>
-          <w:rPr>
-            <w:rFonts w:ascii="Arial" w:hAnsi="Arial" w:cs="Arial"/>
-            <w:sz w:val="16"/>
-            <w:szCs w:val="16"/>
-          </w:rPr>
-          <w:tab/>
-        </w:r>
-      </w:sdtContent>
-    </w:sdt>
-    <w:r>
-      <w:rPr>
-        <w:rFonts w:ascii="Arial" w:hAnsi="Arial" w:cs="Arial"/>
-        <w:sz w:val="16"/>
-        <w:szCs w:val="16"/>
-      </w:rPr>
-      <w:fldChar w:fldCharType="begin"/>
-    </w:r>
-    <w:r>
-      <w:rPr>
-        <w:rFonts w:ascii="Arial" w:hAnsi="Arial" w:cs="Arial"/>
-        <w:sz w:val="16"/>
-        <w:szCs w:val="16"/>
-      </w:rPr>
-      <w:instrText>PAGE   \* MERGEFORMAT</w:instrText>
-    </w:r>
-    <w:r>
-      <w:rPr>
-        <w:rFonts w:ascii="Arial" w:hAnsi="Arial" w:cs="Arial"/>
-        <w:sz w:val="16"/>
-        <w:szCs w:val="16"/>
-      </w:rPr>
-      <w:fldChar w:fldCharType="separate"/>
-    </w:r>
-    <w:r>
-      <w:rPr>
-        <w:rFonts w:ascii="Arial" w:hAnsi="Arial" w:cs="Arial"/>
-        <w:noProof/>
-        <w:sz w:val="16"/>
-        <w:szCs w:val="16"/>
-      </w:rPr>
-      <w:t>4</w:t>
-    </w:r>
-    <w:r>
-      <w:rPr>
-        <w:rFonts w:ascii="Arial" w:hAnsi="Arial" w:cs="Arial"/>
-        <w:sz w:val="16"/>
-        <w:szCs w:val="16"/>
-      </w:rPr>
-      <w:fldChar w:fldCharType="end"/>
-    </w:r>
   </w:p>
 </w:ftr>
 </file>
 
 <file path=word/footer2.xml><?xml version="1.0" encoding="utf-8"?>
-<w:ftr xmlns:wpc="http://schemas.microsoft.com/office/word/2010/wordprocessingCanvas" xmlns:cx="http://schemas.microsoft.com/office/drawing/2014/chartex" xmlns:cx1="http://schemas.microsoft.com/office/drawing/2015/9/8/chartex" xmlns:cx2="http://schemas.microsoft.com/office/drawing/2015/10/21/chartex" xmlns:cx3="http://schemas.microsoft.com/office/drawing/2016/5/9/chartex" xmlns:cx4="http://schemas.microsoft.com/office/drawing/2016/5/10/chartex" xmlns:cx5="http://schemas.microsoft.com/office/drawing/2016/5/11/chartex" xmlns:cx6="http://schemas.microsoft.com/office/drawing/2016/5/12/chartex" xmlns:cx7="http://schemas.microsoft.com/office/drawing/2016/5/13/chartex" xmlns:cx8="http://schemas.microsoft.com/office/drawing/2016/5/14/chartex" xmlns:mc="http://schemas.openxmlformats.org/markup-compatibility/2006" xmlns:aink="http://schemas.microsoft.com/office/drawing/2016/ink" xmlns:am3d="http://schemas.microsoft.com/office/drawing/2017/model3d" xmlns:o="urn:schemas-microsoft-com:office:office" xmlns:oel="http://schemas.microsoft.com/office/2019/extlst" xmlns:r="http://schemas.openxmlformats.org/officeDocument/2006/relationships" xmlns:m="http://schemas.openxmlformats.org/officeDocument/2006/math" xmlns:v="urn:schemas-microsoft-com:vml" xmlns:wp14="http://schemas.microsoft.com/office/word/2010/wordprocessingDrawing" xmlns:wp="http://schemas.openxmlformats.org/drawingml/2006/wordprocessingDrawing" xmlns:w10="urn:schemas-microsoft-com:office:word" xmlns:w="http://schemas.openxmlformats.org/wordprocessingml/2006/main" xmlns:w14="http://schemas.microsoft.com/office/word/2010/wordml" xmlns:w15="http://schemas.microsoft.com/office/word/2012/wordml" xmlns:w16cex="http://schemas.microsoft.com/office/word/2018/wordml/cex" xmlns:w16cid="http://schemas.microsoft.com/office/word/2016/wordml/cid" xmlns:w16="http://schemas.microsoft.com/office/word/2018/wordml" xmlns:w16du="http://schemas.microsoft.com/office/word/2023/wordml/word16du" xmlns:w16sdtdh="http://schemas.microsoft.com/office/word/2020/wordml/sdtdatahash" xmlns:w16se="http://schemas.microsoft.com/office/word/2015/wordml/symex" xmlns:wpg="http://schemas.microsoft.com/office/word/2010/wordprocessingGroup" xmlns:wpi="http://schemas.microsoft.com/office/word/2010/wordprocessingInk" xmlns:wne="http://schemas.microsoft.com/office/word/2006/wordml" xmlns:wps="http://schemas.microsoft.com/office/word/2010/wordprocessingShape" mc:Ignorable="w14 w15 w16se w16cid w16 w16cex w16sdtdh w16du wp14">
+<w:ftr xmlns:wpc="http://schemas.microsoft.com/office/word/2010/wordprocessingCanvas" xmlns:cx="http://schemas.microsoft.com/office/drawing/2014/chartex" xmlns:cx1="http://schemas.microsoft.com/office/drawing/2015/9/8/chartex" xmlns:cx2="http://schemas.microsoft.com/office/drawing/2015/10/21/chartex" xmlns:cx3="http://schemas.microsoft.com/office/drawing/2016/5/9/chartex" xmlns:cx4="http://schemas.microsoft.com/office/drawing/2016/5/10/chartex" xmlns:cx5="http://schemas.microsoft.com/office/drawing/2016/5/11/chartex" xmlns:cx6="http://schemas.microsoft.com/office/drawing/2016/5/12/chartex" xmlns:cx7="http://schemas.microsoft.com/office/drawing/2016/5/13/chartex" xmlns:cx8="http://schemas.microsoft.com/office/drawing/2016/5/14/chartex" xmlns:mc="http://schemas.openxmlformats.org/markup-compatibility/2006" xmlns:aink="http://schemas.microsoft.com/office/drawing/2016/ink" xmlns:am3d="http://schemas.microsoft.com/office/drawing/2017/model3d" xmlns:o="urn:schemas-microsoft-com:office:office" xmlns:oel="http://schemas.microsoft.com/office/2019/extlst" xmlns:r="http://schemas.openxmlformats.org/officeDocument/2006/relationships" xmlns:m="http://schemas.openxmlformats.org/officeDocument/2006/math" xmlns:v="urn:schemas-microsoft-com:vml" xmlns:wp14="http://schemas.microsoft.com/office/word/2010/wordprocessingDrawing" xmlns:wp="http://schemas.openxmlformats.org/drawingml/2006/wordprocessingDrawing" xmlns:w10="urn:schemas-microsoft-com:office:word" xmlns:w="http://schemas.openxmlformats.org/wordprocessingml/2006/main" xmlns:w14="http://schemas.microsoft.com/office/word/2010/wordml" xmlns:w15="http://schemas.microsoft.com/office/word/2012/wordml" xmlns:w16cex="http://schemas.microsoft.com/office/word/2018/wordml/cex" xmlns:w16cid="http://schemas.microsoft.com/office/word/2016/wordml/cid" xmlns:w16="http://schemas.microsoft.com/office/word/2018/wordml" xmlns:w16du="http://schemas.microsoft.com/office/word/2023/wordml/word16du" xmlns:w16sdtdh="http://schemas.microsoft.com/office/word/2020/wordml/sdtdatahash" xmlns:w16sdtfl="http://schemas.microsoft.com/office/word/2024/wordml/sdtformatlock" xmlns:w16se="http://schemas.microsoft.com/office/word/2015/wordml/symex" xmlns:wpg="http://schemas.microsoft.com/office/word/2010/wordprocessingGroup" xmlns:wpi="http://schemas.microsoft.com/office/word/2010/wordprocessingInk" xmlns:wne="http://schemas.microsoft.com/office/word/2006/wordml" xmlns:wps="http://schemas.microsoft.com/office/word/2010/wordprocessingShape" mc:Ignorable="w14 w15 w16se w16cid w16 w16cex w16sdtdh w16sdtfl w16du wp14">
   <w:sdt>
     <w:sdtPr>
       <w:id w:val="1865711266"/>
@@ -8956,7 +6362,7 @@
 </file>
 
 <file path=word/footnotes.xml><?xml version="1.0" encoding="utf-8"?>
-<w:footnotes xmlns:wpc="http://schemas.microsoft.com/office/word/2010/wordprocessingCanvas" xmlns:cx="http://schemas.microsoft.com/office/drawing/2014/chartex" xmlns:cx1="http://schemas.microsoft.com/office/drawing/2015/9/8/chartex" xmlns:cx2="http://schemas.microsoft.com/office/drawing/2015/10/21/chartex" xmlns:cx3="http://schemas.microsoft.com/office/drawing/2016/5/9/chartex" xmlns:cx4="http://schemas.microsoft.com/office/drawing/2016/5/10/chartex" xmlns:cx5="http://schemas.microsoft.com/office/drawing/2016/5/11/chartex" xmlns:cx6="http://schemas.microsoft.com/office/drawing/2016/5/12/chartex" xmlns:cx7="http://schemas.microsoft.com/office/drawing/2016/5/13/chartex" xmlns:cx8="http://schemas.microsoft.com/office/drawing/2016/5/14/chartex" xmlns:mc="http://schemas.openxmlformats.org/markup-compatibility/2006" xmlns:aink="http://schemas.microsoft.com/office/drawing/2016/ink" xmlns:am3d="http://schemas.microsoft.com/office/drawing/2017/model3d" xmlns:o="urn:schemas-microsoft-com:office:office" xmlns:oel="http://schemas.microsoft.com/office/2019/extlst" xmlns:r="http://schemas.openxmlformats.org/officeDocument/2006/relationships" xmlns:m="http://schemas.openxmlformats.org/officeDocument/2006/math" xmlns:v="urn:schemas-microsoft-com:vml" xmlns:wp14="http://schemas.microsoft.com/office/word/2010/wordprocessingDrawing" xmlns:wp="http://schemas.openxmlformats.org/drawingml/2006/wordprocessingDrawing" xmlns:w10="urn:schemas-microsoft-com:office:word" xmlns:w="http://schemas.openxmlformats.org/wordprocessingml/2006/main" xmlns:w14="http://schemas.microsoft.com/office/word/2010/wordml" xmlns:w15="http://schemas.microsoft.com/office/word/2012/wordml" xmlns:w16cex="http://schemas.microsoft.com/office/word/2018/wordml/cex" xmlns:w16cid="http://schemas.microsoft.com/office/word/2016/wordml/cid" xmlns:w16="http://schemas.microsoft.com/office/word/2018/wordml" xmlns:w16du="http://schemas.microsoft.com/office/word/2023/wordml/word16du" xmlns:w16sdtdh="http://schemas.microsoft.com/office/word/2020/wordml/sdtdatahash" xmlns:w16se="http://schemas.microsoft.com/office/word/2015/wordml/symex" xmlns:wpg="http://schemas.microsoft.com/office/word/2010/wordprocessingGroup" xmlns:wpi="http://schemas.microsoft.com/office/word/2010/wordprocessingInk" xmlns:wne="http://schemas.microsoft.com/office/word/2006/wordml" xmlns:wps="http://schemas.microsoft.com/office/word/2010/wordprocessingShape" mc:Ignorable="w14 w15 w16se w16cid w16 w16cex w16sdtdh w16du wp14">
+<w:footnotes xmlns:wpc="http://schemas.microsoft.com/office/word/2010/wordprocessingCanvas" xmlns:cx="http://schemas.microsoft.com/office/drawing/2014/chartex" xmlns:cx1="http://schemas.microsoft.com/office/drawing/2015/9/8/chartex" xmlns:cx2="http://schemas.microsoft.com/office/drawing/2015/10/21/chartex" xmlns:cx3="http://schemas.microsoft.com/office/drawing/2016/5/9/chartex" xmlns:cx4="http://schemas.microsoft.com/office/drawing/2016/5/10/chartex" xmlns:cx5="http://schemas.microsoft.com/office/drawing/2016/5/11/chartex" xmlns:cx6="http://schemas.microsoft.com/office/drawing/2016/5/12/chartex" xmlns:cx7="http://schemas.microsoft.com/office/drawing/2016/5/13/chartex" xmlns:cx8="http://schemas.microsoft.com/office/drawing/2016/5/14/chartex" xmlns:mc="http://schemas.openxmlformats.org/markup-compatibility/2006" xmlns:aink="http://schemas.microsoft.com/office/drawing/2016/ink" xmlns:am3d="http://schemas.microsoft.com/office/drawing/2017/model3d" xmlns:o="urn:schemas-microsoft-com:office:office" xmlns:oel="http://schemas.microsoft.com/office/2019/extlst" xmlns:r="http://schemas.openxmlformats.org/officeDocument/2006/relationships" xmlns:m="http://schemas.openxmlformats.org/officeDocument/2006/math" xmlns:v="urn:schemas-microsoft-com:vml" xmlns:wp14="http://schemas.microsoft.com/office/word/2010/wordprocessingDrawing" xmlns:wp="http://schemas.openxmlformats.org/drawingml/2006/wordprocessingDrawing" xmlns:w10="urn:schemas-microsoft-com:office:word" xmlns:w="http://schemas.openxmlformats.org/wordprocessingml/2006/main" xmlns:w14="http://schemas.microsoft.com/office/word/2010/wordml" xmlns:w15="http://schemas.microsoft.com/office/word/2012/wordml" xmlns:w16cex="http://schemas.microsoft.com/office/word/2018/wordml/cex" xmlns:w16cid="http://schemas.microsoft.com/office/word/2016/wordml/cid" xmlns:w16="http://schemas.microsoft.com/office/word/2018/wordml" xmlns:w16du="http://schemas.microsoft.com/office/word/2023/wordml/word16du" xmlns:w16sdtdh="http://schemas.microsoft.com/office/word/2020/wordml/sdtdatahash" xmlns:w16sdtfl="http://schemas.microsoft.com/office/word/2024/wordml/sdtformatlock" xmlns:w16se="http://schemas.microsoft.com/office/word/2015/wordml/symex" xmlns:wpg="http://schemas.microsoft.com/office/word/2010/wordprocessingGroup" xmlns:wpi="http://schemas.microsoft.com/office/word/2010/wordprocessingInk" xmlns:wne="http://schemas.microsoft.com/office/word/2006/wordml" xmlns:wps="http://schemas.microsoft.com/office/word/2010/wordprocessingShape" mc:Ignorable="w14 w15 w16se w16cid w16 w16cex w16sdtdh w16sdtfl w16du wp14">
   <w:footnote w:type="separator" w:id="-1">
     <w:p>
       <w:pPr>
@@ -8981,7 +6387,7 @@
 </file>
 
 <file path=word/numbering.xml><?xml version="1.0" encoding="utf-8"?>
-<w:numbering xmlns:wpc="http://schemas.microsoft.com/office/word/2010/wordprocessingCanvas" xmlns:cx="http://schemas.microsoft.com/office/drawing/2014/chartex" xmlns:cx1="http://schemas.microsoft.com/office/drawing/2015/9/8/chartex" xmlns:cx2="http://schemas.microsoft.com/office/drawing/2015/10/21/chartex" xmlns:cx3="http://schemas.microsoft.com/office/drawing/2016/5/9/chartex" xmlns:cx4="http://schemas.microsoft.com/office/drawing/2016/5/10/chartex" xmlns:cx5="http://schemas.microsoft.com/office/drawing/2016/5/11/chartex" xmlns:cx6="http://schemas.microsoft.com/office/drawing/2016/5/12/chartex" xmlns:cx7="http://schemas.microsoft.com/office/drawing/2016/5/13/chartex" xmlns:cx8="http://schemas.microsoft.com/office/drawing/2016/5/14/chartex" xmlns:mc="http://schemas.openxmlformats.org/markup-compatibility/2006" xmlns:aink="http://schemas.microsoft.com/office/drawing/2016/ink" xmlns:am3d="http://schemas.microsoft.com/office/drawing/2017/model3d" xmlns:o="urn:schemas-microsoft-com:office:office" xmlns:oel="http://schemas.microsoft.com/office/2019/extlst" xmlns:r="http://schemas.openxmlformats.org/officeDocument/2006/relationships" xmlns:m="http://schemas.openxmlformats.org/officeDocument/2006/math" xmlns:v="urn:schemas-microsoft-com:vml" xmlns:wp14="http://schemas.microsoft.com/office/word/2010/wordprocessingDrawing" xmlns:wp="http://schemas.openxmlformats.org/drawingml/2006/wordprocessingDrawing" xmlns:w10="urn:schemas-microsoft-com:office:word" xmlns:w="http://schemas.openxmlformats.org/wordprocessingml/2006/main" xmlns:w14="http://schemas.microsoft.com/office/word/2010/wordml" xmlns:w15="http://schemas.microsoft.com/office/word/2012/wordml" xmlns:w16cex="http://schemas.microsoft.com/office/word/2018/wordml/cex" xmlns:w16cid="http://schemas.microsoft.com/office/word/2016/wordml/cid" xmlns:w16="http://schemas.microsoft.com/office/word/2018/wordml" xmlns:w16du="http://schemas.microsoft.com/office/word/2023/wordml/word16du" xmlns:w16sdtdh="http://schemas.microsoft.com/office/word/2020/wordml/sdtdatahash" xmlns:w16se="http://schemas.microsoft.com/office/word/2015/wordml/symex" xmlns:wpg="http://schemas.microsoft.com/office/word/2010/wordprocessingGroup" xmlns:wpi="http://schemas.microsoft.com/office/word/2010/wordprocessingInk" xmlns:wne="http://schemas.microsoft.com/office/word/2006/wordml" xmlns:wps="http://schemas.microsoft.com/office/word/2010/wordprocessingShape" mc:Ignorable="w14 w15 w16se w16cid w16 w16cex w16sdtdh w16du wp14">
+<w:numbering xmlns:wpc="http://schemas.microsoft.com/office/word/2010/wordprocessingCanvas" xmlns:cx="http://schemas.microsoft.com/office/drawing/2014/chartex" xmlns:cx1="http://schemas.microsoft.com/office/drawing/2015/9/8/chartex" xmlns:cx2="http://schemas.microsoft.com/office/drawing/2015/10/21/chartex" xmlns:cx3="http://schemas.microsoft.com/office/drawing/2016/5/9/chartex" xmlns:cx4="http://schemas.microsoft.com/office/drawing/2016/5/10/chartex" xmlns:cx5="http://schemas.microsoft.com/office/drawing/2016/5/11/chartex" xmlns:cx6="http://schemas.microsoft.com/office/drawing/2016/5/12/chartex" xmlns:cx7="http://schemas.microsoft.com/office/drawing/2016/5/13/chartex" xmlns:cx8="http://schemas.microsoft.com/office/drawing/2016/5/14/chartex" xmlns:mc="http://schemas.openxmlformats.org/markup-compatibility/2006" xmlns:aink="http://schemas.microsoft.com/office/drawing/2016/ink" xmlns:am3d="http://schemas.microsoft.com/office/drawing/2017/model3d" xmlns:o="urn:schemas-microsoft-com:office:office" xmlns:oel="http://schemas.microsoft.com/office/2019/extlst" xmlns:r="http://schemas.openxmlformats.org/officeDocument/2006/relationships" xmlns:m="http://schemas.openxmlformats.org/officeDocument/2006/math" xmlns:v="urn:schemas-microsoft-com:vml" xmlns:wp14="http://schemas.microsoft.com/office/word/2010/wordprocessingDrawing" xmlns:wp="http://schemas.openxmlformats.org/drawingml/2006/wordprocessingDrawing" xmlns:w10="urn:schemas-microsoft-com:office:word" xmlns:w="http://schemas.openxmlformats.org/wordprocessingml/2006/main" xmlns:w14="http://schemas.microsoft.com/office/word/2010/wordml" xmlns:w15="http://schemas.microsoft.com/office/word/2012/wordml" xmlns:w16cex="http://schemas.microsoft.com/office/word/2018/wordml/cex" xmlns:w16cid="http://schemas.microsoft.com/office/word/2016/wordml/cid" xmlns:w16="http://schemas.microsoft.com/office/word/2018/wordml" xmlns:w16du="http://schemas.microsoft.com/office/word/2023/wordml/word16du" xmlns:w16sdtdh="http://schemas.microsoft.com/office/word/2020/wordml/sdtdatahash" xmlns:w16sdtfl="http://schemas.microsoft.com/office/word/2024/wordml/sdtformatlock" xmlns:w16se="http://schemas.microsoft.com/office/word/2015/wordml/symex" xmlns:wpg="http://schemas.microsoft.com/office/word/2010/wordprocessingGroup" xmlns:wpi="http://schemas.microsoft.com/office/word/2010/wordprocessingInk" xmlns:wne="http://schemas.microsoft.com/office/word/2006/wordml" xmlns:wps="http://schemas.microsoft.com/office/word/2010/wordprocessingShape" mc:Ignorable="w14 w15 w16se w16cid w16 w16cex w16sdtdh w16sdtfl w16du wp14">
   <w:abstractNum w:abstractNumId="0" w15:restartNumberingAfterBreak="0">
     <w:nsid w:val="02081313"/>
     <w:multiLevelType w:val="hybridMultilevel"/>
@@ -11530,7 +8936,7 @@
 </file>
 
 <file path=word/styles.xml><?xml version="1.0" encoding="utf-8"?>
-<w:styles xmlns:mc="http://schemas.openxmlformats.org/markup-compatibility/2006" xmlns:r="http://schemas.openxmlformats.org/officeDocument/2006/relationships" xmlns:w="http://schemas.openxmlformats.org/wordprocessingml/2006/main" xmlns:w14="http://schemas.microsoft.com/office/word/2010/wordml" xmlns:w15="http://schemas.microsoft.com/office/word/2012/wordml" xmlns:w16cex="http://schemas.microsoft.com/office/word/2018/wordml/cex" xmlns:w16cid="http://schemas.microsoft.com/office/word/2016/wordml/cid" xmlns:w16="http://schemas.microsoft.com/office/word/2018/wordml" xmlns:w16du="http://schemas.microsoft.com/office/word/2023/wordml/word16du" xmlns:w16sdtdh="http://schemas.microsoft.com/office/word/2020/wordml/sdtdatahash" xmlns:w16se="http://schemas.microsoft.com/office/word/2015/wordml/symex" mc:Ignorable="w14 w15 w16se w16cid w16 w16cex w16sdtdh w16du">
+<w:styles xmlns:mc="http://schemas.openxmlformats.org/markup-compatibility/2006" xmlns:r="http://schemas.openxmlformats.org/officeDocument/2006/relationships" xmlns:w="http://schemas.openxmlformats.org/wordprocessingml/2006/main" xmlns:w14="http://schemas.microsoft.com/office/word/2010/wordml" xmlns:w15="http://schemas.microsoft.com/office/word/2012/wordml" xmlns:w16cex="http://schemas.microsoft.com/office/word/2018/wordml/cex" xmlns:w16cid="http://schemas.microsoft.com/office/word/2016/wordml/cid" xmlns:w16="http://schemas.microsoft.com/office/word/2018/wordml" xmlns:w16du="http://schemas.microsoft.com/office/word/2023/wordml/word16du" xmlns:w16sdtdh="http://schemas.microsoft.com/office/word/2020/wordml/sdtdatahash" xmlns:w16sdtfl="http://schemas.microsoft.com/office/word/2024/wordml/sdtformatlock" xmlns:w16se="http://schemas.microsoft.com/office/word/2015/wordml/symex" mc:Ignorable="w14 w15 w16se w16cid w16 w16cex w16sdtdh w16sdtfl w16du">
   <w:docDefaults>
     <w:rPrDefault>
       <w:rPr>
@@ -12124,7 +9530,6 @@
   <w:style w:type="character" w:default="1" w:styleId="DefaultParagraphFont">
     <w:name w:val="Default Paragraph Font"/>
     <w:uiPriority w:val="1"/>
-    <w:semiHidden/>
     <w:unhideWhenUsed/>
   </w:style>
   <w:style w:type="table" w:default="1" w:styleId="TableNormal">
@@ -23802,6 +21207,18 @@
       <w:szCs w:val="20"/>
     </w:rPr>
   </w:style>
+  <w:style w:type="character" w:styleId="UnresolvedMention">
+    <w:name w:val="Unresolved Mention"/>
+    <w:basedOn w:val="DefaultParagraphFont"/>
+    <w:uiPriority w:val="99"/>
+    <w:semiHidden/>
+    <w:unhideWhenUsed/>
+    <w:rsid w:val="009B420D"/>
+    <w:rPr>
+      <w:color w:val="605E5C"/>
+      <w:shd w:val="clear" w:color="auto" w:fill="E1DFDD"/>
+    </w:rPr>
+  </w:style>
 </w:styles>
 </file>
 
@@ -24016,22 +21433,6 @@
 </file>
 
 <file path=customXml/item1.xml><?xml version="1.0" encoding="utf-8"?>
-<p:properties xmlns:p="http://schemas.microsoft.com/office/2006/metadata/properties" xmlns:xsi="http://www.w3.org/2001/XMLSchema-instance" xmlns:pc="http://schemas.microsoft.com/office/infopath/2007/PartnerControls">
-  <documentManagement>
-    <_DCDateModified xmlns="http://schemas.microsoft.com/sharepoint/v3/fields" xsi:nil="true"/>
-    <IconOverlay xmlns="http://schemas.microsoft.com/sharepoint/v4" xsi:nil="true"/>
-    <PublishingExpirationDate xmlns="http://schemas.microsoft.com/sharepoint/v3" xsi:nil="true"/>
-    <PublishingStartDate xmlns="http://schemas.microsoft.com/sharepoint/v3" xsi:nil="true"/>
-    <_dlc_DocId xmlns="afee9e21-8e0c-452e-93ec-a70efb6b23ab">DAMK26V7PEQZ-1320525258-73877</_dlc_DocId>
-    <_dlc_DocIdUrl xmlns="afee9e21-8e0c-452e-93ec-a70efb6b23ab">
-      <Url>https://portal.fwf.ac.at/workspaces/Strateg-Dok/_layouts/15/DocIdRedir.aspx?ID=DAMK26V7PEQZ-1320525258-73877</Url>
-      <Description>DAMK26V7PEQZ-1320525258-73877</Description>
-    </_dlc_DocIdUrl>
-  </documentManagement>
-</p:properties>
-</file>
-
-<file path=customXml/item2.xml><?xml version="1.0" encoding="utf-8"?>
 <ct:contentTypeSchema xmlns:ct="http://schemas.microsoft.com/office/2006/metadata/contentType" xmlns:ma="http://schemas.microsoft.com/office/2006/metadata/properties/metaAttributes" ct:_="" ma:_="" ma:contentTypeName="Dokument" ma:contentTypeID="0x010100464D6544A015444385B10BEB1E534503" ma:contentTypeVersion="3" ma:contentTypeDescription="Ein neues Dokument erstellen." ma:contentTypeScope="" ma:versionID="97182bbd3e9b32d05dd5555f7c2bd814">
   <xsd:schema xmlns:xsd="http://www.w3.org/2001/XMLSchema" xmlns:xs="http://www.w3.org/2001/XMLSchema" xmlns:p="http://schemas.microsoft.com/office/2006/metadata/properties" xmlns:ns1="http://schemas.microsoft.com/sharepoint/v3" xmlns:ns2="http://schemas.microsoft.com/sharepoint/v3/fields" xmlns:ns3="http://schemas.microsoft.com/sharepoint/v4" xmlns:ns4="afee9e21-8e0c-452e-93ec-a70efb6b23ab" targetNamespace="http://schemas.microsoft.com/office/2006/metadata/properties" ma:root="true" ma:fieldsID="7bd051767b3e235ef3b7c10b4a85711f" ns1:_="" ns2:_="" ns3:_="" ns4:_="">
     <xsd:import namespace="http://schemas.microsoft.com/sharepoint/v3"/>
@@ -24215,13 +21616,13 @@
 </ct:contentTypeSchema>
 </file>
 
-<file path=customXml/item3.xml><?xml version="1.0" encoding="utf-8"?>
+<file path=customXml/item2.xml><?xml version="1.0" encoding="utf-8"?>
 <w:settings xmlns:w="http://schemas.openxmlformats.org/wordprocessingml/2006/main">
   <w:SpecialFormsHighlight w:val="c9c8ff"/>
 </w:settings>
 </file>
 
-<file path=customXml/item4.xml><?xml version="1.0" encoding="utf-8"?>
+<file path=customXml/item3.xml><?xml version="1.0" encoding="utf-8"?>
 <?mso-contentType ?>
 <spe:Receivers xmlns:spe="http://schemas.microsoft.com/sharepoint/events">
   <Receiver>
@@ -24271,11 +21672,11 @@
 </spe:Receivers>
 </file>
 
-<file path=customXml/item5.xml><?xml version="1.0" encoding="utf-8"?>
+<file path=customXml/item4.xml><?xml version="1.0" encoding="utf-8"?>
 <b:Sources xmlns:b="http://schemas.openxmlformats.org/officeDocument/2006/bibliography" xmlns="http://schemas.openxmlformats.org/officeDocument/2006/bibliography" SelectedStyle="\APASixthEditionOfficeOnline.xsl" StyleName="APA" Version="6"/>
 </file>
 
-<file path=customXml/item6.xml><?xml version="1.0" encoding="utf-8"?>
+<file path=customXml/item5.xml><?xml version="1.0" encoding="utf-8"?>
 <?mso-contentType ?>
 <FormTemplates xmlns="http://schemas.microsoft.com/sharepoint/v3/contenttype/forms">
   <Display>DocumentLibraryForm</Display>
@@ -24284,20 +21685,23 @@
 </FormTemplates>
 </file>
 
-<file path=customXml/itemProps1.xml><?xml version="1.0" encoding="utf-8"?>
-<ds:datastoreItem xmlns:ds="http://schemas.openxmlformats.org/officeDocument/2006/customXml" ds:itemID="{80DCD561-5D0E-41FB-A5B2-A60CACB93746}">
-  <ds:schemaRefs>
-    <ds:schemaRef ds:uri="http://schemas.microsoft.com/office/2006/metadata/properties"/>
-    <ds:schemaRef ds:uri="http://schemas.microsoft.com/office/infopath/2007/PartnerControls"/>
-    <ds:schemaRef ds:uri="http://schemas.microsoft.com/sharepoint/v3/fields"/>
-    <ds:schemaRef ds:uri="http://schemas.microsoft.com/sharepoint/v4"/>
-    <ds:schemaRef ds:uri="http://schemas.microsoft.com/sharepoint/v3"/>
-    <ds:schemaRef ds:uri="afee9e21-8e0c-452e-93ec-a70efb6b23ab"/>
-  </ds:schemaRefs>
-</ds:datastoreItem>
+<file path=customXml/item6.xml><?xml version="1.0" encoding="utf-8"?>
+<p:properties xmlns:p="http://schemas.microsoft.com/office/2006/metadata/properties" xmlns:xsi="http://www.w3.org/2001/XMLSchema-instance" xmlns:pc="http://schemas.microsoft.com/office/infopath/2007/PartnerControls">
+  <documentManagement>
+    <_DCDateModified xmlns="http://schemas.microsoft.com/sharepoint/v3/fields" xsi:nil="true"/>
+    <IconOverlay xmlns="http://schemas.microsoft.com/sharepoint/v4" xsi:nil="true"/>
+    <PublishingExpirationDate xmlns="http://schemas.microsoft.com/sharepoint/v3" xsi:nil="true"/>
+    <PublishingStartDate xmlns="http://schemas.microsoft.com/sharepoint/v3" xsi:nil="true"/>
+    <_dlc_DocId xmlns="afee9e21-8e0c-452e-93ec-a70efb6b23ab">DAMK26V7PEQZ-1320525258-73877</_dlc_DocId>
+    <_dlc_DocIdUrl xmlns="afee9e21-8e0c-452e-93ec-a70efb6b23ab">
+      <Url>https://portal.fwf.ac.at/workspaces/Strateg-Dok/_layouts/15/DocIdRedir.aspx?ID=DAMK26V7PEQZ-1320525258-73877</Url>
+      <Description>DAMK26V7PEQZ-1320525258-73877</Description>
+    </_dlc_DocIdUrl>
+  </documentManagement>
+</p:properties>
 </file>
 
-<file path=customXml/itemProps2.xml><?xml version="1.0" encoding="utf-8"?>
+<file path=customXml/itemProps1.xml><?xml version="1.0" encoding="utf-8"?>
 <ds:datastoreItem xmlns:ds="http://schemas.openxmlformats.org/officeDocument/2006/customXml" ds:itemID="{AF3DCB32-2405-4B27-9ABA-B6FBCC24494E}">
   <ds:schemaRefs>
     <ds:schemaRef ds:uri="http://schemas.microsoft.com/office/2006/metadata/contentType"/>
@@ -24318,7 +21722,7 @@
 </ds:datastoreItem>
 </file>
 
-<file path=customXml/itemProps3.xml><?xml version="1.0" encoding="utf-8"?>
+<file path=customXml/itemProps2.xml><?xml version="1.0" encoding="utf-8"?>
 <ds:datastoreItem xmlns:ds="http://schemas.openxmlformats.org/officeDocument/2006/customXml" ds:itemID="{5D0AEA6B-E499-4EEF-98A3-AFBB261C493E}">
   <ds:schemaRefs>
     <ds:schemaRef ds:uri="http://schemas.openxmlformats.org/wordprocessingml/2006/main"/>
@@ -24326,7 +21730,7 @@
 </ds:datastoreItem>
 </file>
 
-<file path=customXml/itemProps4.xml><?xml version="1.0" encoding="utf-8"?>
+<file path=customXml/itemProps3.xml><?xml version="1.0" encoding="utf-8"?>
 <ds:datastoreItem xmlns:ds="http://schemas.openxmlformats.org/officeDocument/2006/customXml" ds:itemID="{924007F5-9277-4670-9FE6-06782C7296A1}">
   <ds:schemaRefs>
     <ds:schemaRef ds:uri="http://schemas.microsoft.com/sharepoint/events"/>
@@ -24334,7 +21738,7 @@
 </ds:datastoreItem>
 </file>
 
-<file path=customXml/itemProps5.xml><?xml version="1.0" encoding="utf-8"?>
+<file path=customXml/itemProps4.xml><?xml version="1.0" encoding="utf-8"?>
 <ds:datastoreItem xmlns:ds="http://schemas.openxmlformats.org/officeDocument/2006/customXml" ds:itemID="{6685E73F-2677-4B89-8508-7813A036A081}">
   <ds:schemaRefs>
     <ds:schemaRef ds:uri="http://schemas.openxmlformats.org/officeDocument/2006/bibliography"/>
@@ -24342,10 +21746,23 @@
 </ds:datastoreItem>
 </file>
 
-<file path=customXml/itemProps6.xml><?xml version="1.0" encoding="utf-8"?>
+<file path=customXml/itemProps5.xml><?xml version="1.0" encoding="utf-8"?>
 <ds:datastoreItem xmlns:ds="http://schemas.openxmlformats.org/officeDocument/2006/customXml" ds:itemID="{76E5CD1D-9176-4FA7-9A9A-698AC52D8E9F}">
   <ds:schemaRefs>
     <ds:schemaRef ds:uri="http://schemas.microsoft.com/sharepoint/v3/contenttype/forms"/>
   </ds:schemaRefs>
 </ds:datastoreItem>
+</file>
+
+<file path=customXml/itemProps6.xml><?xml version="1.0" encoding="utf-8"?>
+<ds:datastoreItem xmlns:ds="http://schemas.openxmlformats.org/officeDocument/2006/customXml" ds:itemID="{80DCD561-5D0E-41FB-A5B2-A60CACB93746}">
+  <ds:schemaRefs>
+    <ds:schemaRef ds:uri="http://schemas.microsoft.com/office/2006/metadata/properties"/>
+    <ds:schemaRef ds:uri="http://schemas.microsoft.com/office/infopath/2007/PartnerControls"/>
+    <ds:schemaRef ds:uri="http://schemas.microsoft.com/sharepoint/v3/fields"/>
+    <ds:schemaRef ds:uri="http://schemas.microsoft.com/sharepoint/v4"/>
+    <ds:schemaRef ds:uri="http://schemas.microsoft.com/sharepoint/v3"/>
+    <ds:schemaRef ds:uri="afee9e21-8e0c-452e-93ec-a70efb6b23ab"/>
+  </ds:schemaRefs>
+</ds:datastoreItem>
 </file>
</xml_diff>

<commit_message>
Templates: Add grantId, projectid and funderId
</commit_message>
<xml_diff>
--- a/src/main/resources/org/damap/base/template/FWFTemplate.docx
+++ b/src/main/resources/org/damap/base/template/FWFTemplate.docx
@@ -1,6 +1,6 @@
 
 <file path=word/document.xml><?xml version="1.0" encoding="utf-8"?>
-<w:document xmlns:wpc="http://schemas.microsoft.com/office/word/2010/wordprocessingCanvas" xmlns:cx="http://schemas.microsoft.com/office/drawing/2014/chartex" xmlns:cx1="http://schemas.microsoft.com/office/drawing/2015/9/8/chartex" xmlns:cx2="http://schemas.microsoft.com/office/drawing/2015/10/21/chartex" xmlns:cx3="http://schemas.microsoft.com/office/drawing/2016/5/9/chartex" xmlns:cx4="http://schemas.microsoft.com/office/drawing/2016/5/10/chartex" xmlns:cx5="http://schemas.microsoft.com/office/drawing/2016/5/11/chartex" xmlns:cx6="http://schemas.microsoft.com/office/drawing/2016/5/12/chartex" xmlns:cx7="http://schemas.microsoft.com/office/drawing/2016/5/13/chartex" xmlns:cx8="http://schemas.microsoft.com/office/drawing/2016/5/14/chartex" xmlns:mc="http://schemas.openxmlformats.org/markup-compatibility/2006" xmlns:aink="http://schemas.microsoft.com/office/drawing/2016/ink" xmlns:am3d="http://schemas.microsoft.com/office/drawing/2017/model3d" xmlns:o="urn:schemas-microsoft-com:office:office" xmlns:oel="http://schemas.microsoft.com/office/2019/extlst" xmlns:r="http://schemas.openxmlformats.org/officeDocument/2006/relationships" xmlns:m="http://schemas.openxmlformats.org/officeDocument/2006/math" xmlns:v="urn:schemas-microsoft-com:vml" xmlns:wp14="http://schemas.microsoft.com/office/word/2010/wordprocessingDrawing" xmlns:wp="http://schemas.openxmlformats.org/drawingml/2006/wordprocessingDrawing" xmlns:w10="urn:schemas-microsoft-com:office:word" xmlns:w="http://schemas.openxmlformats.org/wordprocessingml/2006/main" xmlns:w14="http://schemas.microsoft.com/office/word/2010/wordml" xmlns:w15="http://schemas.microsoft.com/office/word/2012/wordml" xmlns:w16cex="http://schemas.microsoft.com/office/word/2018/wordml/cex" xmlns:w16cid="http://schemas.microsoft.com/office/word/2016/wordml/cid" xmlns:w16="http://schemas.microsoft.com/office/word/2018/wordml" xmlns:w16du="http://schemas.microsoft.com/office/word/2023/wordml/word16du" xmlns:w16sdtdh="http://schemas.microsoft.com/office/word/2020/wordml/sdtdatahash" xmlns:w16sdtfl="http://schemas.microsoft.com/office/word/2024/wordml/sdtformatlock" xmlns:w16se="http://schemas.microsoft.com/office/word/2015/wordml/symex" xmlns:wpg="http://schemas.microsoft.com/office/word/2010/wordprocessingGroup" xmlns:wpi="http://schemas.microsoft.com/office/word/2010/wordprocessingInk" xmlns:wne="http://schemas.microsoft.com/office/word/2006/wordml" xmlns:wps="http://schemas.microsoft.com/office/word/2010/wordprocessingShape" mc:Ignorable="w14 w15 w16se w16cid w16 w16cex w16sdtdh w16sdtfl w16du wp14">
+<w:document xmlns:wpc="http://schemas.microsoft.com/office/word/2010/wordprocessingCanvas" xmlns:cx="http://schemas.microsoft.com/office/drawing/2014/chartex" xmlns:cx1="http://schemas.microsoft.com/office/drawing/2015/9/8/chartex" xmlns:cx2="http://schemas.microsoft.com/office/drawing/2015/10/21/chartex" xmlns:cx3="http://schemas.microsoft.com/office/drawing/2016/5/9/chartex" xmlns:cx4="http://schemas.microsoft.com/office/drawing/2016/5/10/chartex" xmlns:cx5="http://schemas.microsoft.com/office/drawing/2016/5/11/chartex" xmlns:cx6="http://schemas.microsoft.com/office/drawing/2016/5/12/chartex" xmlns:cx7="http://schemas.microsoft.com/office/drawing/2016/5/13/chartex" xmlns:cx8="http://schemas.microsoft.com/office/drawing/2016/5/14/chartex" xmlns:mc="http://schemas.openxmlformats.org/markup-compatibility/2006" xmlns:aink="http://schemas.microsoft.com/office/drawing/2016/ink" xmlns:am3d="http://schemas.microsoft.com/office/drawing/2017/model3d" xmlns:o="urn:schemas-microsoft-com:office:office" xmlns:oel="http://schemas.microsoft.com/office/2019/extlst" xmlns:r="http://schemas.openxmlformats.org/officeDocument/2006/relationships" xmlns:m="http://schemas.openxmlformats.org/officeDocument/2006/math" xmlns:v="urn:schemas-microsoft-com:vml" xmlns:wp14="http://schemas.microsoft.com/office/word/2010/wordprocessingDrawing" xmlns:wp="http://schemas.openxmlformats.org/drawingml/2006/wordprocessingDrawing" xmlns:w10="urn:schemas-microsoft-com:office:word" xmlns:w="http://schemas.openxmlformats.org/wordprocessingml/2006/main" xmlns:w14="http://schemas.microsoft.com/office/word/2010/wordml" xmlns:w15="http://schemas.microsoft.com/office/word/2012/wordml" xmlns:w16cex="http://schemas.microsoft.com/office/word/2018/wordml/cex" xmlns:w16cid="http://schemas.microsoft.com/office/word/2016/wordml/cid" xmlns:w16="http://schemas.microsoft.com/office/word/2018/wordml" xmlns:w16du="http://schemas.microsoft.com/office/word/2023/wordml/word16du" xmlns:w16sdtdh="http://schemas.microsoft.com/office/word/2020/wordml/sdtdatahash" xmlns:w16se="http://schemas.microsoft.com/office/word/2015/wordml/symex" xmlns:wpg="http://schemas.microsoft.com/office/word/2010/wordprocessingGroup" xmlns:wpi="http://schemas.microsoft.com/office/word/2010/wordprocessingInk" xmlns:wne="http://schemas.microsoft.com/office/word/2006/wordml" xmlns:wps="http://schemas.microsoft.com/office/word/2010/wordprocessingShape" mc:Ignorable="w14 w15 w16se w16cid w16 w16cex w16sdtdh w16du wp14">
   <w:body>
     <w:p>
       <w:pPr>
@@ -51,7 +51,31 @@
           <w:szCs w:val="64"/>
           <w:lang w:val="en-GB"/>
         </w:rPr>
-        <w:t>[projectname]</w:t>
+        <w:t>[</w:t>
+      </w:r>
+      <w:proofErr w:type="spellStart"/>
+      <w:r>
+        <w:rPr>
+          <w:b/>
+          <w:bCs/>
+          <w:color w:val="006699"/>
+          <w:sz w:val="64"/>
+          <w:szCs w:val="64"/>
+          <w:lang w:val="en-GB"/>
+        </w:rPr>
+        <w:t>projectname</w:t>
+      </w:r>
+      <w:proofErr w:type="spellEnd"/>
+      <w:r>
+        <w:rPr>
+          <w:b/>
+          <w:bCs/>
+          <w:color w:val="006699"/>
+          <w:sz w:val="64"/>
+          <w:szCs w:val="64"/>
+          <w:lang w:val="en-GB"/>
+        </w:rPr>
+        <w:t>]</w:t>
       </w:r>
     </w:p>
     <w:p>
@@ -233,14 +257,34 @@
                 <w:szCs w:val="20"/>
               </w:rPr>
             </w:pPr>
+            <w:proofErr w:type="spellStart"/>
             <w:r>
               <w:rPr>
                 <w:color w:val="92D050"/>
                 <w:sz w:val="20"/>
                 <w:szCs w:val="20"/>
               </w:rPr>
-              <w:t>dd/mm/yyyy</w:t>
+              <w:t>dd</w:t>
             </w:r>
+            <w:proofErr w:type="spellEnd"/>
+            <w:r>
+              <w:rPr>
+                <w:color w:val="92D050"/>
+                <w:sz w:val="20"/>
+                <w:szCs w:val="20"/>
+              </w:rPr>
+              <w:t>/mm/</w:t>
+            </w:r>
+            <w:proofErr w:type="spellStart"/>
+            <w:r>
+              <w:rPr>
+                <w:color w:val="92D050"/>
+                <w:sz w:val="20"/>
+                <w:szCs w:val="20"/>
+              </w:rPr>
+              <w:t>yyyy</w:t>
+            </w:r>
+            <w:proofErr w:type="spellEnd"/>
           </w:p>
         </w:tc>
         <w:tc>
@@ -585,7 +629,7 @@
                     </wp:anchor>
                   </w:drawing>
                 </mc:Choice>
-                <mc:Fallback xmlns:a="http://schemas.openxmlformats.org/drawingml/2006/main" xmlns:wp14="http://schemas.microsoft.com/office/word/2010/wordml" xmlns:pic="http://schemas.openxmlformats.org/drawingml/2006/picture">
+                <mc:Fallback xmlns:pic="http://schemas.openxmlformats.org/drawingml/2006/picture" xmlns:wp14="http://schemas.microsoft.com/office/word/2010/wordml" xmlns:a="http://schemas.openxmlformats.org/drawingml/2006/main" xmlns:w16sdtfl="http://schemas.microsoft.com/office/word/2024/wordml/sdtformatlock">
                   <w:pict w14:anchorId="7AAC8864">
                     <v:shapetype coordsize="21600,21600" o:spt="75" o:preferrelative="t" path="m@4@5l@4@11@9@11@9@5xe" type="#_x0000_t75">
                       <v:formulas>
@@ -990,7 +1034,7 @@
               <w:spacing w:before="120" w:after="120" w:line="276" w:lineRule="auto"/>
               <w:rPr>
                 <w:rFonts w:ascii="Arial" w:hAnsi="Arial" w:cs="Arial"/>
-                <w:color w:val="000000" w:themeColor="text1"/>
+                <w:iCs/>
                 <w:sz w:val="18"/>
                 <w:szCs w:val="18"/>
                 <w:lang w:val="en-GB"/>
@@ -1005,7 +1049,7 @@
                 <w:szCs w:val="18"/>
                 <w:lang w:val="en-GB"/>
               </w:rPr>
-              <w:t xml:space="preserve">FWF grant </w:t>
+              <w:t xml:space="preserve">FWF </w:t>
             </w:r>
             <w:r>
               <w:rPr>
@@ -1016,7 +1060,18 @@
                 <w:szCs w:val="18"/>
                 <w:lang w:val="en-GB"/>
               </w:rPr>
-              <w:t>information:</w:t>
+              <w:t>project number</w:t>
+            </w:r>
+            <w:r>
+              <w:rPr>
+                <w:rFonts w:ascii="Arial" w:hAnsi="Arial" w:cs="Arial"/>
+                <w:b/>
+                <w:bCs/>
+                <w:sz w:val="18"/>
+                <w:szCs w:val="18"/>
+                <w:lang w:val="en-GB"/>
+              </w:rPr>
+              <w:t>:</w:t>
             </w:r>
             <w:r>
               <w:rPr>
@@ -1037,6 +1092,7 @@
               </w:rPr>
               <w:t>[</w:t>
             </w:r>
+            <w:proofErr w:type="spellStart"/>
             <w:r>
               <w:rPr>
                 <w:rFonts w:ascii="Arial" w:hAnsi="Arial" w:cs="Arial"/>
@@ -1047,6 +1103,7 @@
               </w:rPr>
               <w:t>grantid</w:t>
             </w:r>
+            <w:proofErr w:type="spellEnd"/>
             <w:r>
               <w:rPr>
                 <w:rFonts w:ascii="Arial" w:hAnsi="Arial" w:cs="Arial"/>
@@ -1064,6 +1121,69 @@
               <w:spacing w:before="120" w:after="120" w:line="276" w:lineRule="auto"/>
               <w:rPr>
                 <w:rFonts w:ascii="Arial" w:hAnsi="Arial" w:cs="Arial"/>
+                <w:b/>
+                <w:bCs/>
+                <w:color w:val="000000" w:themeColor="text1"/>
+                <w:sz w:val="18"/>
+                <w:szCs w:val="18"/>
+                <w:lang w:val="en-GB"/>
+              </w:rPr>
+            </w:pPr>
+            <w:r>
+              <w:rPr>
+                <w:rFonts w:ascii="Arial" w:hAnsi="Arial" w:cs="Arial"/>
+                <w:b/>
+                <w:bCs/>
+                <w:iCs/>
+                <w:color w:val="000000" w:themeColor="text1"/>
+                <w:sz w:val="18"/>
+                <w:szCs w:val="18"/>
+                <w:lang w:val="en-GB"/>
+              </w:rPr>
+              <w:t xml:space="preserve">Internal Project ID: </w:t>
+            </w:r>
+            <w:r>
+              <w:rPr>
+                <w:rFonts w:ascii="Arial" w:hAnsi="Arial" w:cs="Arial"/>
+                <w:iCs/>
+                <w:color w:val="000000" w:themeColor="text1"/>
+                <w:sz w:val="18"/>
+                <w:szCs w:val="18"/>
+                <w:lang w:val="en-GB"/>
+              </w:rPr>
+              <w:t>[</w:t>
+            </w:r>
+            <w:proofErr w:type="spellStart"/>
+            <w:r>
+              <w:rPr>
+                <w:rFonts w:ascii="Arial" w:hAnsi="Arial" w:cs="Arial"/>
+                <w:iCs/>
+                <w:color w:val="000000" w:themeColor="text1"/>
+                <w:sz w:val="18"/>
+                <w:szCs w:val="18"/>
+                <w:lang w:val="en-GB"/>
+              </w:rPr>
+              <w:t>projectid</w:t>
+            </w:r>
+            <w:proofErr w:type="spellEnd"/>
+            <w:r>
+              <w:rPr>
+                <w:rFonts w:ascii="Arial" w:hAnsi="Arial" w:cs="Arial"/>
+                <w:iCs/>
+                <w:color w:val="000000" w:themeColor="text1"/>
+                <w:sz w:val="18"/>
+                <w:szCs w:val="18"/>
+                <w:lang w:val="en-GB"/>
+              </w:rPr>
+              <w:t>]</w:t>
+            </w:r>
+          </w:p>
+          <w:p>
+            <w:pPr>
+              <w:pStyle w:val="NoSpacing"/>
+              <w:spacing w:before="120" w:after="120" w:line="276" w:lineRule="auto"/>
+              <w:rPr>
+                <w:rFonts w:ascii="Arial" w:hAnsi="Arial" w:cs="Arial"/>
                 <w:iCs/>
                 <w:color w:val="92D050"/>
                 <w:sz w:val="18"/>
@@ -1081,34 +1201,10 @@
                 <w:szCs w:val="18"/>
                 <w:lang w:val="de-AT"/>
               </w:rPr>
-              <w:t>DMP version:</w:t>
+              <w:t xml:space="preserve">DMP </w:t>
             </w:r>
+            <w:proofErr w:type="spellStart"/>
             <w:r>
-              <w:rPr>
-                <w:rFonts w:ascii="Arial" w:hAnsi="Arial" w:cs="Arial"/>
-                <w:iCs/>
-                <w:sz w:val="18"/>
-                <w:szCs w:val="18"/>
-                <w:lang w:val="de-AT"/>
-              </w:rPr>
-              <w:t xml:space="preserve"> </w:t>
-            </w:r>
-            <w:r>
-              <w:rPr>
-                <w:rFonts w:ascii="Arial" w:hAnsi="Arial" w:cs="Arial"/>
-                <w:iCs/>
-                <w:color w:val="92D050"/>
-                <w:sz w:val="18"/>
-                <w:szCs w:val="18"/>
-                <w:lang w:val="de-AT"/>
-              </w:rPr>
-              <w:t>[Nr.], [dd.mm.yyyy]</w:t>
-            </w:r>
-          </w:p>
-          <w:p>
-            <w:pPr>
-              <w:pStyle w:val="NoSpacing"/>
-              <w:spacing w:before="120" w:after="120" w:line="276" w:lineRule="auto"/>
               <w:rPr>
                 <w:rFonts w:ascii="Arial" w:hAnsi="Arial" w:cs="Arial"/>
                 <w:b/>
@@ -1118,7 +1214,9 @@
                 <w:szCs w:val="18"/>
                 <w:lang w:val="de-AT"/>
               </w:rPr>
-            </w:pPr>
+              <w:t>version</w:t>
+            </w:r>
+            <w:proofErr w:type="spellEnd"/>
             <w:r>
               <w:rPr>
                 <w:rFonts w:ascii="Arial" w:hAnsi="Arial" w:cs="Arial"/>
@@ -1129,9 +1227,58 @@
                 <w:szCs w:val="18"/>
                 <w:lang w:val="de-AT"/>
               </w:rPr>
-              <w:t>C</w:t>
+              <w:t>:</w:t>
             </w:r>
             <w:r>
+              <w:rPr>
+                <w:rFonts w:ascii="Arial" w:hAnsi="Arial" w:cs="Arial"/>
+                <w:iCs/>
+                <w:sz w:val="18"/>
+                <w:szCs w:val="18"/>
+                <w:lang w:val="de-AT"/>
+              </w:rPr>
+              <w:t xml:space="preserve"> </w:t>
+            </w:r>
+            <w:r>
+              <w:rPr>
+                <w:rFonts w:ascii="Arial" w:hAnsi="Arial" w:cs="Arial"/>
+                <w:iCs/>
+                <w:color w:val="92D050"/>
+                <w:sz w:val="18"/>
+                <w:szCs w:val="18"/>
+                <w:lang w:val="de-AT"/>
+              </w:rPr>
+              <w:t>[Nr.], [</w:t>
+            </w:r>
+            <w:proofErr w:type="spellStart"/>
+            <w:r>
+              <w:rPr>
+                <w:rFonts w:ascii="Arial" w:hAnsi="Arial" w:cs="Arial"/>
+                <w:iCs/>
+                <w:color w:val="92D050"/>
+                <w:sz w:val="18"/>
+                <w:szCs w:val="18"/>
+                <w:lang w:val="de-AT"/>
+              </w:rPr>
+              <w:t>dd.mm.yyyy</w:t>
+            </w:r>
+            <w:proofErr w:type="spellEnd"/>
+            <w:r>
+              <w:rPr>
+                <w:rFonts w:ascii="Arial" w:hAnsi="Arial" w:cs="Arial"/>
+                <w:iCs/>
+                <w:color w:val="92D050"/>
+                <w:sz w:val="18"/>
+                <w:szCs w:val="18"/>
+                <w:lang w:val="de-AT"/>
+              </w:rPr>
+              <w:t>]</w:t>
+            </w:r>
+          </w:p>
+          <w:p>
+            <w:pPr>
+              <w:pStyle w:val="NoSpacing"/>
+              <w:spacing w:before="120" w:after="120" w:line="276" w:lineRule="auto"/>
               <w:rPr>
                 <w:rFonts w:ascii="Arial" w:hAnsi="Arial" w:cs="Arial"/>
                 <w:b/>
@@ -1141,7 +1288,44 @@
                 <w:szCs w:val="18"/>
                 <w:lang w:val="de-AT"/>
               </w:rPr>
-              <w:t>ontributors:</w:t>
+            </w:pPr>
+            <w:proofErr w:type="spellStart"/>
+            <w:r>
+              <w:rPr>
+                <w:rFonts w:ascii="Arial" w:hAnsi="Arial" w:cs="Arial"/>
+                <w:b/>
+                <w:bCs/>
+                <w:iCs/>
+                <w:sz w:val="18"/>
+                <w:szCs w:val="18"/>
+                <w:lang w:val="de-AT"/>
+              </w:rPr>
+              <w:t>C</w:t>
+            </w:r>
+            <w:r>
+              <w:rPr>
+                <w:rFonts w:ascii="Arial" w:hAnsi="Arial" w:cs="Arial"/>
+                <w:b/>
+                <w:bCs/>
+                <w:iCs/>
+                <w:sz w:val="18"/>
+                <w:szCs w:val="18"/>
+                <w:lang w:val="de-AT"/>
+              </w:rPr>
+              <w:t>ontributors</w:t>
+            </w:r>
+            <w:proofErr w:type="spellEnd"/>
+            <w:r>
+              <w:rPr>
+                <w:rFonts w:ascii="Arial" w:hAnsi="Arial" w:cs="Arial"/>
+                <w:b/>
+                <w:bCs/>
+                <w:iCs/>
+                <w:sz w:val="18"/>
+                <w:szCs w:val="18"/>
+                <w:lang w:val="de-AT"/>
+              </w:rPr>
+              <w:t>:</w:t>
             </w:r>
           </w:p>
           <w:p>
@@ -1164,7 +1348,29 @@
                 <w:szCs w:val="18"/>
                 <w:lang w:val="de-AT"/>
               </w:rPr>
-              <w:t>[contributors]</w:t>
+              <w:t>[</w:t>
+            </w:r>
+            <w:proofErr w:type="spellStart"/>
+            <w:r>
+              <w:rPr>
+                <w:rFonts w:ascii="Arial" w:hAnsi="Arial" w:cs="Arial"/>
+                <w:iCs/>
+                <w:sz w:val="18"/>
+                <w:szCs w:val="18"/>
+                <w:lang w:val="de-AT"/>
+              </w:rPr>
+              <w:t>contributors</w:t>
+            </w:r>
+            <w:proofErr w:type="spellEnd"/>
+            <w:r>
+              <w:rPr>
+                <w:rFonts w:ascii="Arial" w:hAnsi="Arial" w:cs="Arial"/>
+                <w:iCs/>
+                <w:sz w:val="18"/>
+                <w:szCs w:val="18"/>
+                <w:lang w:val="de-AT"/>
+              </w:rPr>
+              <w:t>]</w:t>
             </w:r>
           </w:p>
         </w:tc>
@@ -1624,7 +1830,25 @@
                       <w:sz w:val="18"/>
                       <w:szCs w:val="18"/>
                     </w:rPr>
-                    <w:t>[costTable]</w:t>
+                    <w:t>[</w:t>
+                  </w:r>
+                  <w:proofErr w:type="spellStart"/>
+                  <w:r>
+                    <w:rPr>
+                      <w:bCs/>
+                      <w:sz w:val="18"/>
+                      <w:szCs w:val="18"/>
+                    </w:rPr>
+                    <w:t>costTable</w:t>
+                  </w:r>
+                  <w:proofErr w:type="spellEnd"/>
+                  <w:r>
+                    <w:rPr>
+                      <w:bCs/>
+                      <w:sz w:val="18"/>
+                      <w:szCs w:val="18"/>
+                    </w:rPr>
+                    <w:t>]</w:t>
                   </w:r>
                 </w:p>
               </w:tc>
@@ -1651,7 +1875,25 @@
                       <w:sz w:val="18"/>
                       <w:szCs w:val="18"/>
                     </w:rPr>
-                    <w:t>[costTable]</w:t>
+                    <w:t>[</w:t>
+                  </w:r>
+                  <w:proofErr w:type="spellStart"/>
+                  <w:r>
+                    <w:rPr>
+                      <w:bCs/>
+                      <w:sz w:val="18"/>
+                      <w:szCs w:val="18"/>
+                    </w:rPr>
+                    <w:t>costTable</w:t>
+                  </w:r>
+                  <w:proofErr w:type="spellEnd"/>
+                  <w:r>
+                    <w:rPr>
+                      <w:bCs/>
+                      <w:sz w:val="18"/>
+                      <w:szCs w:val="18"/>
+                    </w:rPr>
+                    <w:t>]</w:t>
                   </w:r>
                 </w:p>
               </w:tc>
@@ -1930,7 +2172,25 @@
                       <w:sz w:val="18"/>
                       <w:szCs w:val="18"/>
                     </w:rPr>
-                    <w:t>[costcurrency]</w:t>
+                    <w:t>[</w:t>
+                  </w:r>
+                  <w:proofErr w:type="spellStart"/>
+                  <w:r>
+                    <w:rPr>
+                      <w:b/>
+                      <w:sz w:val="18"/>
+                      <w:szCs w:val="18"/>
+                    </w:rPr>
+                    <w:t>costcurrency</w:t>
+                  </w:r>
+                  <w:proofErr w:type="spellEnd"/>
+                  <w:r>
+                    <w:rPr>
+                      <w:b/>
+                      <w:sz w:val="18"/>
+                      <w:szCs w:val="18"/>
+                    </w:rPr>
+                    <w:t>]</w:t>
                   </w:r>
                 </w:p>
               </w:tc>
@@ -1959,7 +2219,25 @@
                       <w:sz w:val="18"/>
                       <w:szCs w:val="18"/>
                     </w:rPr>
-                    <w:t>[costtotal]</w:t>
+                    <w:t>[</w:t>
+                  </w:r>
+                  <w:proofErr w:type="spellStart"/>
+                  <w:r>
+                    <w:rPr>
+                      <w:b/>
+                      <w:sz w:val="18"/>
+                      <w:szCs w:val="18"/>
+                    </w:rPr>
+                    <w:t>costtotal</w:t>
+                  </w:r>
+                  <w:proofErr w:type="spellEnd"/>
+                  <w:r>
+                    <w:rPr>
+                      <w:b/>
+                      <w:sz w:val="18"/>
+                      <w:szCs w:val="18"/>
+                    </w:rPr>
+                    <w:t>]</w:t>
                   </w:r>
                 </w:p>
               </w:tc>
@@ -1982,8 +2260,9 @@
                 <w:szCs w:val="18"/>
                 <w:lang w:val="en-GB"/>
               </w:rPr>
-              <w:t>[costsDescription</w:t>
+              <w:t>[</w:t>
             </w:r>
+            <w:proofErr w:type="spellStart"/>
             <w:r>
               <w:rPr>
                 <w:rFonts w:ascii="Arial" w:hAnsi="Arial" w:cs="Arial"/>
@@ -1991,8 +2270,18 @@
                 <w:szCs w:val="18"/>
                 <w:lang w:val="en-GB"/>
               </w:rPr>
+              <w:t>costsDescription</w:t>
+            </w:r>
+            <w:r>
+              <w:rPr>
+                <w:rFonts w:ascii="Arial" w:hAnsi="Arial" w:cs="Arial"/>
+                <w:sz w:val="18"/>
+                <w:szCs w:val="18"/>
+                <w:lang w:val="en-GB"/>
+              </w:rPr>
               <w:t>s</w:t>
             </w:r>
+            <w:proofErr w:type="spellEnd"/>
             <w:r>
               <w:rPr>
                 <w:rFonts w:ascii="Arial" w:hAnsi="Arial" w:cs="Arial"/>
@@ -2010,7 +2299,29 @@
                 <w:szCs w:val="18"/>
                 <w:lang w:val="en-GB"/>
               </w:rPr>
-              <w:t>[costCoverage]</w:t>
+              <w:t>[</w:t>
+            </w:r>
+            <w:proofErr w:type="spellStart"/>
+            <w:r>
+              <w:rPr>
+                <w:rFonts w:ascii="Arial" w:hAnsi="Arial" w:cs="Arial"/>
+                <w:color w:val="92D050"/>
+                <w:sz w:val="18"/>
+                <w:szCs w:val="18"/>
+                <w:lang w:val="en-GB"/>
+              </w:rPr>
+              <w:t>costCoverage</w:t>
+            </w:r>
+            <w:proofErr w:type="spellEnd"/>
+            <w:r>
+              <w:rPr>
+                <w:rFonts w:ascii="Arial" w:hAnsi="Arial" w:cs="Arial"/>
+                <w:color w:val="92D050"/>
+                <w:sz w:val="18"/>
+                <w:szCs w:val="18"/>
+                <w:lang w:val="en-GB"/>
+              </w:rPr>
+              <w:t>]</w:t>
             </w:r>
           </w:p>
         </w:tc>
@@ -2423,7 +2734,23 @@
                       <w:sz w:val="18"/>
                       <w:szCs w:val="18"/>
                     </w:rPr>
-                    <w:t>[datasetTable]</w:t>
+                    <w:t>[</w:t>
+                  </w:r>
+                  <w:proofErr w:type="spellStart"/>
+                  <w:r>
+                    <w:rPr>
+                      <w:sz w:val="18"/>
+                      <w:szCs w:val="18"/>
+                    </w:rPr>
+                    <w:t>datasetTable</w:t>
+                  </w:r>
+                  <w:proofErr w:type="spellEnd"/>
+                  <w:r>
+                    <w:rPr>
+                      <w:sz w:val="18"/>
+                      <w:szCs w:val="18"/>
+                    </w:rPr>
+                    <w:t>]</w:t>
                   </w:r>
                 </w:p>
               </w:tc>
@@ -3016,7 +3343,23 @@
                       <w:sz w:val="18"/>
                       <w:szCs w:val="18"/>
                     </w:rPr>
-                    <w:t>[reusedDatasetTable]</w:t>
+                    <w:t>[</w:t>
+                  </w:r>
+                  <w:proofErr w:type="spellStart"/>
+                  <w:r>
+                    <w:rPr>
+                      <w:sz w:val="18"/>
+                      <w:szCs w:val="18"/>
+                    </w:rPr>
+                    <w:t>reusedDatasetTable</w:t>
+                  </w:r>
+                  <w:proofErr w:type="spellEnd"/>
+                  <w:r>
+                    <w:rPr>
+                      <w:sz w:val="18"/>
+                      <w:szCs w:val="18"/>
+                    </w:rPr>
+                    <w:t>]</w:t>
                   </w:r>
                 </w:p>
               </w:tc>
@@ -3175,7 +3518,23 @@
                       <w:sz w:val="18"/>
                       <w:szCs w:val="18"/>
                     </w:rPr>
-                    <w:t>[reusedDatasetTable]</w:t>
+                    <w:t>[</w:t>
+                  </w:r>
+                  <w:proofErr w:type="spellStart"/>
+                  <w:r>
+                    <w:rPr>
+                      <w:sz w:val="18"/>
+                      <w:szCs w:val="18"/>
+                    </w:rPr>
+                    <w:t>reusedDatasetTable</w:t>
+                  </w:r>
+                  <w:proofErr w:type="spellEnd"/>
+                  <w:r>
+                    <w:rPr>
+                      <w:sz w:val="18"/>
+                      <w:szCs w:val="18"/>
+                    </w:rPr>
+                    <w:t>]</w:t>
                   </w:r>
                 </w:p>
               </w:tc>
@@ -3325,7 +3684,27 @@
                 <w:szCs w:val="18"/>
                 <w:lang w:val="en-GB"/>
               </w:rPr>
-              <w:t>[datageneration]</w:t>
+              <w:t>[</w:t>
+            </w:r>
+            <w:proofErr w:type="spellStart"/>
+            <w:r>
+              <w:rPr>
+                <w:rFonts w:ascii="Arial" w:hAnsi="Arial" w:cs="Arial"/>
+                <w:sz w:val="18"/>
+                <w:szCs w:val="18"/>
+                <w:lang w:val="en-GB"/>
+              </w:rPr>
+              <w:t>datageneration</w:t>
+            </w:r>
+            <w:proofErr w:type="spellEnd"/>
+            <w:r>
+              <w:rPr>
+                <w:rFonts w:ascii="Arial" w:hAnsi="Arial" w:cs="Arial"/>
+                <w:sz w:val="18"/>
+                <w:szCs w:val="18"/>
+                <w:lang w:val="en-GB"/>
+              </w:rPr>
+              <w:t>]</w:t>
             </w:r>
           </w:p>
         </w:tc>
@@ -3363,6 +3742,7 @@
                 <w:szCs w:val="18"/>
                 <w:lang w:val="en-GB"/>
               </w:rPr>
+              <w:lastRenderedPageBreak/>
               <w:t xml:space="preserve">III Documentation and Data Quality </w:t>
             </w:r>
           </w:p>
@@ -3462,7 +3842,27 @@
                 <w:szCs w:val="18"/>
                 <w:lang w:val="en-US"/>
               </w:rPr>
-              <w:t>[dataorganisation]</w:t>
+              <w:t>[</w:t>
+            </w:r>
+            <w:proofErr w:type="spellStart"/>
+            <w:r>
+              <w:rPr>
+                <w:rFonts w:ascii="Arial" w:hAnsi="Arial" w:cs="Arial"/>
+                <w:sz w:val="18"/>
+                <w:szCs w:val="18"/>
+                <w:lang w:val="en-US"/>
+              </w:rPr>
+              <w:t>dataorganisation</w:t>
+            </w:r>
+            <w:proofErr w:type="spellEnd"/>
+            <w:r>
+              <w:rPr>
+                <w:rFonts w:ascii="Arial" w:hAnsi="Arial" w:cs="Arial"/>
+                <w:sz w:val="18"/>
+                <w:szCs w:val="18"/>
+                <w:lang w:val="en-US"/>
+              </w:rPr>
+              <w:t>]</w:t>
             </w:r>
           </w:p>
           <w:p>
@@ -3664,7 +4064,27 @@
                 <w:szCs w:val="18"/>
                 <w:lang w:val="en-US"/>
               </w:rPr>
-              <w:t>[dataqualitycontrol]</w:t>
+              <w:t>[</w:t>
+            </w:r>
+            <w:proofErr w:type="spellStart"/>
+            <w:r>
+              <w:rPr>
+                <w:rFonts w:ascii="Arial" w:eastAsia="Arial" w:hAnsi="Arial" w:cs="Arial"/>
+                <w:sz w:val="18"/>
+                <w:szCs w:val="18"/>
+                <w:lang w:val="en-US"/>
+              </w:rPr>
+              <w:t>dataqualitycontrol</w:t>
+            </w:r>
+            <w:proofErr w:type="spellEnd"/>
+            <w:r>
+              <w:rPr>
+                <w:rFonts w:ascii="Arial" w:eastAsia="Arial" w:hAnsi="Arial" w:cs="Arial"/>
+                <w:sz w:val="18"/>
+                <w:szCs w:val="18"/>
+                <w:lang w:val="en-US"/>
+              </w:rPr>
+              <w:t>]</w:t>
             </w:r>
           </w:p>
         </w:tc>
@@ -3798,7 +4218,27 @@
                 <w:szCs w:val="18"/>
                 <w:lang w:val="en-GB"/>
               </w:rPr>
-              <w:t>[storageintro]</w:t>
+              <w:t>[</w:t>
+            </w:r>
+            <w:proofErr w:type="spellStart"/>
+            <w:r>
+              <w:rPr>
+                <w:rFonts w:ascii="Arial" w:hAnsi="Arial" w:cs="Arial"/>
+                <w:sz w:val="18"/>
+                <w:szCs w:val="18"/>
+                <w:lang w:val="en-GB"/>
+              </w:rPr>
+              <w:t>storageintro</w:t>
+            </w:r>
+            <w:proofErr w:type="spellEnd"/>
+            <w:r>
+              <w:rPr>
+                <w:rFonts w:ascii="Arial" w:hAnsi="Arial" w:cs="Arial"/>
+                <w:sz w:val="18"/>
+                <w:szCs w:val="18"/>
+                <w:lang w:val="en-GB"/>
+              </w:rPr>
+              <w:t>]</w:t>
             </w:r>
             <w:r>
               <w:rPr>
@@ -3878,8 +4318,9 @@
                 <w:szCs w:val="18"/>
                 <w:lang w:val="en-GB"/>
               </w:rPr>
-              <w:t>[sensitive</w:t>
+              <w:t>[</w:t>
             </w:r>
+            <w:proofErr w:type="spellStart"/>
             <w:r>
               <w:rPr>
                 <w:rFonts w:ascii="Arial" w:hAnsi="Arial" w:cs="Arial"/>
@@ -3887,8 +4328,18 @@
                 <w:szCs w:val="18"/>
                 <w:lang w:val="en-GB"/>
               </w:rPr>
+              <w:t>sensitive</w:t>
+            </w:r>
+            <w:r>
+              <w:rPr>
+                <w:rFonts w:ascii="Arial" w:hAnsi="Arial" w:cs="Arial"/>
+                <w:sz w:val="18"/>
+                <w:szCs w:val="18"/>
+                <w:lang w:val="en-GB"/>
+              </w:rPr>
               <w:t>data</w:t>
             </w:r>
+            <w:proofErr w:type="spellEnd"/>
             <w:r>
               <w:rPr>
                 <w:rFonts w:ascii="Arial" w:hAnsi="Arial" w:cs="Arial"/>
@@ -4120,7 +4571,23 @@
                       <w:sz w:val="18"/>
                       <w:szCs w:val="18"/>
                     </w:rPr>
-                    <w:t>[datasetAccessTable]</w:t>
+                    <w:t>[</w:t>
+                  </w:r>
+                  <w:proofErr w:type="spellStart"/>
+                  <w:r>
+                    <w:rPr>
+                      <w:sz w:val="18"/>
+                      <w:szCs w:val="18"/>
+                    </w:rPr>
+                    <w:t>datasetAccessTable</w:t>
+                  </w:r>
+                  <w:proofErr w:type="spellEnd"/>
+                  <w:r>
+                    <w:rPr>
+                      <w:sz w:val="18"/>
+                      <w:szCs w:val="18"/>
+                    </w:rPr>
+                    <w:t>]</w:t>
                   </w:r>
                 </w:p>
               </w:tc>
@@ -4654,7 +5121,23 @@
                       <w:sz w:val="18"/>
                       <w:szCs w:val="18"/>
                     </w:rPr>
-                    <w:t>[datasetPublicationTable]</w:t>
+                    <w:t>[</w:t>
+                  </w:r>
+                  <w:proofErr w:type="spellStart"/>
+                  <w:r>
+                    <w:rPr>
+                      <w:sz w:val="18"/>
+                      <w:szCs w:val="18"/>
+                    </w:rPr>
+                    <w:t>datasetPublicationTable</w:t>
+                  </w:r>
+                  <w:proofErr w:type="spellEnd"/>
+                  <w:r>
+                    <w:rPr>
+                      <w:sz w:val="18"/>
+                      <w:szCs w:val="18"/>
+                    </w:rPr>
+                    <w:t>]</w:t>
                   </w:r>
                 </w:p>
               </w:tc>
@@ -4893,8 +5376,9 @@
                 <w:szCs w:val="18"/>
                 <w:lang w:val="en-GB"/>
               </w:rPr>
-              <w:t>[closed</w:t>
+              <w:t>[</w:t>
             </w:r>
+            <w:proofErr w:type="spellStart"/>
             <w:r>
               <w:rPr>
                 <w:rFonts w:ascii="Arial" w:hAnsi="Arial" w:cs="Arial"/>
@@ -4902,7 +5386,7 @@
                 <w:szCs w:val="18"/>
                 <w:lang w:val="en-GB"/>
               </w:rPr>
-              <w:t>restricted</w:t>
+              <w:t>closed</w:t>
             </w:r>
             <w:r>
               <w:rPr>
@@ -4911,7 +5395,26 @@
                 <w:szCs w:val="18"/>
                 <w:lang w:val="en-GB"/>
               </w:rPr>
-              <w:t>datasetreasons]</w:t>
+              <w:t>restricted</w:t>
+            </w:r>
+            <w:r>
+              <w:rPr>
+                <w:rFonts w:ascii="Arial" w:hAnsi="Arial" w:cs="Arial"/>
+                <w:sz w:val="18"/>
+                <w:szCs w:val="18"/>
+                <w:lang w:val="en-GB"/>
+              </w:rPr>
+              <w:t>datasetreasons</w:t>
+            </w:r>
+            <w:proofErr w:type="spellEnd"/>
+            <w:r>
+              <w:rPr>
+                <w:rFonts w:ascii="Arial" w:hAnsi="Arial" w:cs="Arial"/>
+                <w:sz w:val="18"/>
+                <w:szCs w:val="18"/>
+                <w:lang w:val="en-GB"/>
+              </w:rPr>
+              <w:t>]</w:t>
             </w:r>
           </w:p>
           <w:p>
@@ -4931,7 +5434,27 @@
                 <w:szCs w:val="18"/>
                 <w:lang w:val="en-GB"/>
               </w:rPr>
-              <w:t>[repoinformation]</w:t>
+              <w:t>[</w:t>
+            </w:r>
+            <w:proofErr w:type="spellStart"/>
+            <w:r>
+              <w:rPr>
+                <w:rFonts w:ascii="Arial" w:hAnsi="Arial" w:cs="Arial"/>
+                <w:sz w:val="18"/>
+                <w:szCs w:val="18"/>
+                <w:lang w:val="en-GB"/>
+              </w:rPr>
+              <w:t>repoinformation</w:t>
+            </w:r>
+            <w:proofErr w:type="spellEnd"/>
+            <w:r>
+              <w:rPr>
+                <w:rFonts w:ascii="Arial" w:hAnsi="Arial" w:cs="Arial"/>
+                <w:sz w:val="18"/>
+                <w:szCs w:val="18"/>
+                <w:lang w:val="en-GB"/>
+              </w:rPr>
+              <w:t>]</w:t>
             </w:r>
           </w:p>
           <w:p>
@@ -4971,7 +5494,27 @@
                 <w:szCs w:val="18"/>
                 <w:lang w:val="en-US"/>
               </w:rPr>
-              <w:t>[restrictedAccessInfo]</w:t>
+              <w:t>[</w:t>
+            </w:r>
+            <w:proofErr w:type="spellStart"/>
+            <w:r>
+              <w:rPr>
+                <w:rFonts w:ascii="Arial" w:hAnsi="Arial" w:cs="Arial"/>
+                <w:sz w:val="18"/>
+                <w:szCs w:val="18"/>
+                <w:lang w:val="en-US"/>
+              </w:rPr>
+              <w:t>restrictedAccessInfo</w:t>
+            </w:r>
+            <w:proofErr w:type="spellEnd"/>
+            <w:r>
+              <w:rPr>
+                <w:rFonts w:ascii="Arial" w:hAnsi="Arial" w:cs="Arial"/>
+                <w:sz w:val="18"/>
+                <w:szCs w:val="18"/>
+                <w:lang w:val="en-US"/>
+              </w:rPr>
+              <w:t>]</w:t>
             </w:r>
             <w:bookmarkStart w:id="3" w:name="_Toc66691678"/>
           </w:p>
@@ -5214,7 +5757,23 @@
                       <w:sz w:val="18"/>
                       <w:szCs w:val="18"/>
                     </w:rPr>
-                    <w:t>[datasetRepositoryTable]</w:t>
+                    <w:t>[</w:t>
+                  </w:r>
+                  <w:proofErr w:type="spellStart"/>
+                  <w:r>
+                    <w:rPr>
+                      <w:sz w:val="18"/>
+                      <w:szCs w:val="18"/>
+                    </w:rPr>
+                    <w:t>datasetRepositoryTable</w:t>
+                  </w:r>
+                  <w:proofErr w:type="spellEnd"/>
+                  <w:r>
+                    <w:rPr>
+                      <w:sz w:val="18"/>
+                      <w:szCs w:val="18"/>
+                    </w:rPr>
+                    <w:t>]</w:t>
                   </w:r>
                 </w:p>
               </w:tc>
@@ -5351,7 +5910,23 @@
                       <w:sz w:val="18"/>
                       <w:szCs w:val="18"/>
                     </w:rPr>
-                    <w:t>[targetaudience]</w:t>
+                    <w:t>[</w:t>
+                  </w:r>
+                  <w:proofErr w:type="spellStart"/>
+                  <w:r>
+                    <w:rPr>
+                      <w:sz w:val="18"/>
+                      <w:szCs w:val="18"/>
+                    </w:rPr>
+                    <w:t>targetaudience</w:t>
+                  </w:r>
+                  <w:proofErr w:type="spellEnd"/>
+                  <w:r>
+                    <w:rPr>
+                      <w:sz w:val="18"/>
+                      <w:szCs w:val="18"/>
+                    </w:rPr>
+                    <w:t>]</w:t>
                   </w:r>
                 </w:p>
               </w:tc>
@@ -5598,7 +6173,23 @@
                       <w:sz w:val="18"/>
                       <w:szCs w:val="18"/>
                     </w:rPr>
-                    <w:t>[datasetDeleteTable]</w:t>
+                    <w:t>[</w:t>
+                  </w:r>
+                  <w:proofErr w:type="spellStart"/>
+                  <w:r>
+                    <w:rPr>
+                      <w:sz w:val="18"/>
+                      <w:szCs w:val="18"/>
+                    </w:rPr>
+                    <w:t>datasetDeleteTable</w:t>
+                  </w:r>
+                  <w:proofErr w:type="spellEnd"/>
+                  <w:r>
+                    <w:rPr>
+                      <w:sz w:val="18"/>
+                      <w:szCs w:val="18"/>
+                    </w:rPr>
+                    <w:t>]</w:t>
                   </w:r>
                 </w:p>
               </w:tc>
@@ -5624,7 +6215,23 @@
                       <w:sz w:val="18"/>
                       <w:szCs w:val="18"/>
                     </w:rPr>
-                    <w:t>[datasetDeleteTable]</w:t>
+                    <w:t>[</w:t>
+                  </w:r>
+                  <w:proofErr w:type="spellStart"/>
+                  <w:r>
+                    <w:rPr>
+                      <w:sz w:val="18"/>
+                      <w:szCs w:val="18"/>
+                    </w:rPr>
+                    <w:t>datasetDeleteTable</w:t>
+                  </w:r>
+                  <w:proofErr w:type="spellEnd"/>
+                  <w:r>
+                    <w:rPr>
+                      <w:sz w:val="18"/>
+                      <w:szCs w:val="18"/>
+                    </w:rPr>
+                    <w:t>]</w:t>
                   </w:r>
                 </w:p>
               </w:tc>
@@ -5844,6 +6451,7 @@
                 <w:szCs w:val="18"/>
                 <w:lang w:val="en-GB"/>
               </w:rPr>
+              <w:lastRenderedPageBreak/>
               <w:t>V Legal and Ethical Aspects</w:t>
             </w:r>
           </w:p>
@@ -5945,6 +6553,7 @@
               </w:rPr>
               <w:t>[</w:t>
             </w:r>
+            <w:proofErr w:type="spellStart"/>
             <w:r>
               <w:rPr>
                 <w:rFonts w:ascii="Arial" w:hAnsi="Arial" w:cs="Arial"/>
@@ -5954,6 +6563,7 @@
               </w:rPr>
               <w:t>personaldata</w:t>
             </w:r>
+            <w:proofErr w:type="spellEnd"/>
             <w:r>
               <w:rPr>
                 <w:rFonts w:ascii="Arial" w:hAnsi="Arial" w:cs="Arial"/>
@@ -6017,6 +6627,7 @@
               </w:rPr>
               <w:t>[</w:t>
             </w:r>
+            <w:proofErr w:type="spellStart"/>
             <w:r>
               <w:rPr>
                 <w:rFonts w:ascii="Arial" w:hAnsi="Arial" w:cs="Arial"/>
@@ -6024,7 +6635,17 @@
                 <w:szCs w:val="18"/>
                 <w:lang w:val="en-GB"/>
               </w:rPr>
-              <w:t>legalrestriction]</w:t>
+              <w:t>legalrestriction</w:t>
+            </w:r>
+            <w:proofErr w:type="spellEnd"/>
+            <w:r>
+              <w:rPr>
+                <w:rFonts w:ascii="Arial" w:hAnsi="Arial" w:cs="Arial"/>
+                <w:sz w:val="18"/>
+                <w:szCs w:val="18"/>
+                <w:lang w:val="en-GB"/>
+              </w:rPr>
+              <w:t>]</w:t>
             </w:r>
           </w:p>
         </w:tc>
@@ -6124,7 +6745,27 @@
                 <w:szCs w:val="18"/>
                 <w:lang w:val="en-GB"/>
               </w:rPr>
-              <w:t>[ethicalissues]</w:t>
+              <w:t>[</w:t>
+            </w:r>
+            <w:proofErr w:type="spellStart"/>
+            <w:r>
+              <w:rPr>
+                <w:rFonts w:ascii="Arial" w:hAnsi="Arial" w:cs="Arial"/>
+                <w:sz w:val="18"/>
+                <w:szCs w:val="18"/>
+                <w:lang w:val="en-GB"/>
+              </w:rPr>
+              <w:t>ethicalissues</w:t>
+            </w:r>
+            <w:proofErr w:type="spellEnd"/>
+            <w:r>
+              <w:rPr>
+                <w:rFonts w:ascii="Arial" w:hAnsi="Arial" w:cs="Arial"/>
+                <w:sz w:val="18"/>
+                <w:szCs w:val="18"/>
+                <w:lang w:val="en-GB"/>
+              </w:rPr>
+              <w:t>]</w:t>
             </w:r>
           </w:p>
         </w:tc>
@@ -6150,7 +6791,7 @@
 </file>
 
 <file path=word/endnotes.xml><?xml version="1.0" encoding="utf-8"?>
-<w:endnotes xmlns:wpc="http://schemas.microsoft.com/office/word/2010/wordprocessingCanvas" xmlns:cx="http://schemas.microsoft.com/office/drawing/2014/chartex" xmlns:cx1="http://schemas.microsoft.com/office/drawing/2015/9/8/chartex" xmlns:cx2="http://schemas.microsoft.com/office/drawing/2015/10/21/chartex" xmlns:cx3="http://schemas.microsoft.com/office/drawing/2016/5/9/chartex" xmlns:cx4="http://schemas.microsoft.com/office/drawing/2016/5/10/chartex" xmlns:cx5="http://schemas.microsoft.com/office/drawing/2016/5/11/chartex" xmlns:cx6="http://schemas.microsoft.com/office/drawing/2016/5/12/chartex" xmlns:cx7="http://schemas.microsoft.com/office/drawing/2016/5/13/chartex" xmlns:cx8="http://schemas.microsoft.com/office/drawing/2016/5/14/chartex" xmlns:mc="http://schemas.openxmlformats.org/markup-compatibility/2006" xmlns:aink="http://schemas.microsoft.com/office/drawing/2016/ink" xmlns:am3d="http://schemas.microsoft.com/office/drawing/2017/model3d" xmlns:o="urn:schemas-microsoft-com:office:office" xmlns:oel="http://schemas.microsoft.com/office/2019/extlst" xmlns:r="http://schemas.openxmlformats.org/officeDocument/2006/relationships" xmlns:m="http://schemas.openxmlformats.org/officeDocument/2006/math" xmlns:v="urn:schemas-microsoft-com:vml" xmlns:wp14="http://schemas.microsoft.com/office/word/2010/wordprocessingDrawing" xmlns:wp="http://schemas.openxmlformats.org/drawingml/2006/wordprocessingDrawing" xmlns:w10="urn:schemas-microsoft-com:office:word" xmlns:w="http://schemas.openxmlformats.org/wordprocessingml/2006/main" xmlns:w14="http://schemas.microsoft.com/office/word/2010/wordml" xmlns:w15="http://schemas.microsoft.com/office/word/2012/wordml" xmlns:w16cex="http://schemas.microsoft.com/office/word/2018/wordml/cex" xmlns:w16cid="http://schemas.microsoft.com/office/word/2016/wordml/cid" xmlns:w16="http://schemas.microsoft.com/office/word/2018/wordml" xmlns:w16du="http://schemas.microsoft.com/office/word/2023/wordml/word16du" xmlns:w16sdtdh="http://schemas.microsoft.com/office/word/2020/wordml/sdtdatahash" xmlns:w16sdtfl="http://schemas.microsoft.com/office/word/2024/wordml/sdtformatlock" xmlns:w16se="http://schemas.microsoft.com/office/word/2015/wordml/symex" xmlns:wpg="http://schemas.microsoft.com/office/word/2010/wordprocessingGroup" xmlns:wpi="http://schemas.microsoft.com/office/word/2010/wordprocessingInk" xmlns:wne="http://schemas.microsoft.com/office/word/2006/wordml" xmlns:wps="http://schemas.microsoft.com/office/word/2010/wordprocessingShape" mc:Ignorable="w14 w15 w16se w16cid w16 w16cex w16sdtdh w16sdtfl w16du wp14">
+<w:endnotes xmlns:wpc="http://schemas.microsoft.com/office/word/2010/wordprocessingCanvas" xmlns:cx="http://schemas.microsoft.com/office/drawing/2014/chartex" xmlns:cx1="http://schemas.microsoft.com/office/drawing/2015/9/8/chartex" xmlns:cx2="http://schemas.microsoft.com/office/drawing/2015/10/21/chartex" xmlns:cx3="http://schemas.microsoft.com/office/drawing/2016/5/9/chartex" xmlns:cx4="http://schemas.microsoft.com/office/drawing/2016/5/10/chartex" xmlns:cx5="http://schemas.microsoft.com/office/drawing/2016/5/11/chartex" xmlns:cx6="http://schemas.microsoft.com/office/drawing/2016/5/12/chartex" xmlns:cx7="http://schemas.microsoft.com/office/drawing/2016/5/13/chartex" xmlns:cx8="http://schemas.microsoft.com/office/drawing/2016/5/14/chartex" xmlns:mc="http://schemas.openxmlformats.org/markup-compatibility/2006" xmlns:aink="http://schemas.microsoft.com/office/drawing/2016/ink" xmlns:am3d="http://schemas.microsoft.com/office/drawing/2017/model3d" xmlns:o="urn:schemas-microsoft-com:office:office" xmlns:oel="http://schemas.microsoft.com/office/2019/extlst" xmlns:r="http://schemas.openxmlformats.org/officeDocument/2006/relationships" xmlns:m="http://schemas.openxmlformats.org/officeDocument/2006/math" xmlns:v="urn:schemas-microsoft-com:vml" xmlns:wp14="http://schemas.microsoft.com/office/word/2010/wordprocessingDrawing" xmlns:wp="http://schemas.openxmlformats.org/drawingml/2006/wordprocessingDrawing" xmlns:w10="urn:schemas-microsoft-com:office:word" xmlns:w="http://schemas.openxmlformats.org/wordprocessingml/2006/main" xmlns:w14="http://schemas.microsoft.com/office/word/2010/wordml" xmlns:w15="http://schemas.microsoft.com/office/word/2012/wordml" xmlns:w16cex="http://schemas.microsoft.com/office/word/2018/wordml/cex" xmlns:w16cid="http://schemas.microsoft.com/office/word/2016/wordml/cid" xmlns:w16="http://schemas.microsoft.com/office/word/2018/wordml" xmlns:w16du="http://schemas.microsoft.com/office/word/2023/wordml/word16du" xmlns:w16sdtdh="http://schemas.microsoft.com/office/word/2020/wordml/sdtdatahash" xmlns:w16se="http://schemas.microsoft.com/office/word/2015/wordml/symex" xmlns:wpg="http://schemas.microsoft.com/office/word/2010/wordprocessingGroup" xmlns:wpi="http://schemas.microsoft.com/office/word/2010/wordprocessingInk" xmlns:wne="http://schemas.microsoft.com/office/word/2006/wordml" xmlns:wps="http://schemas.microsoft.com/office/word/2010/wordprocessingShape" mc:Ignorable="w14 w15 w16se w16cid w16 w16cex w16sdtdh w16du wp14">
   <w:endnote w:type="separator" w:id="-1">
     <w:p>
       <w:pPr>
@@ -6175,7 +6816,7 @@
 </file>
 
 <file path=word/footer1.xml><?xml version="1.0" encoding="utf-8"?>
-<w:ftr xmlns:wpc="http://schemas.microsoft.com/office/word/2010/wordprocessingCanvas" xmlns:cx="http://schemas.microsoft.com/office/drawing/2014/chartex" xmlns:cx1="http://schemas.microsoft.com/office/drawing/2015/9/8/chartex" xmlns:cx2="http://schemas.microsoft.com/office/drawing/2015/10/21/chartex" xmlns:cx3="http://schemas.microsoft.com/office/drawing/2016/5/9/chartex" xmlns:cx4="http://schemas.microsoft.com/office/drawing/2016/5/10/chartex" xmlns:cx5="http://schemas.microsoft.com/office/drawing/2016/5/11/chartex" xmlns:cx6="http://schemas.microsoft.com/office/drawing/2016/5/12/chartex" xmlns:cx7="http://schemas.microsoft.com/office/drawing/2016/5/13/chartex" xmlns:cx8="http://schemas.microsoft.com/office/drawing/2016/5/14/chartex" xmlns:mc="http://schemas.openxmlformats.org/markup-compatibility/2006" xmlns:aink="http://schemas.microsoft.com/office/drawing/2016/ink" xmlns:am3d="http://schemas.microsoft.com/office/drawing/2017/model3d" xmlns:o="urn:schemas-microsoft-com:office:office" xmlns:oel="http://schemas.microsoft.com/office/2019/extlst" xmlns:r="http://schemas.openxmlformats.org/officeDocument/2006/relationships" xmlns:m="http://schemas.openxmlformats.org/officeDocument/2006/math" xmlns:v="urn:schemas-microsoft-com:vml" xmlns:wp14="http://schemas.microsoft.com/office/word/2010/wordprocessingDrawing" xmlns:wp="http://schemas.openxmlformats.org/drawingml/2006/wordprocessingDrawing" xmlns:w10="urn:schemas-microsoft-com:office:word" xmlns:w="http://schemas.openxmlformats.org/wordprocessingml/2006/main" xmlns:w14="http://schemas.microsoft.com/office/word/2010/wordml" xmlns:w15="http://schemas.microsoft.com/office/word/2012/wordml" xmlns:w16cex="http://schemas.microsoft.com/office/word/2018/wordml/cex" xmlns:w16cid="http://schemas.microsoft.com/office/word/2016/wordml/cid" xmlns:w16="http://schemas.microsoft.com/office/word/2018/wordml" xmlns:w16du="http://schemas.microsoft.com/office/word/2023/wordml/word16du" xmlns:w16sdtdh="http://schemas.microsoft.com/office/word/2020/wordml/sdtdatahash" xmlns:w16sdtfl="http://schemas.microsoft.com/office/word/2024/wordml/sdtformatlock" xmlns:w16se="http://schemas.microsoft.com/office/word/2015/wordml/symex" xmlns:wpg="http://schemas.microsoft.com/office/word/2010/wordprocessingGroup" xmlns:wpi="http://schemas.microsoft.com/office/word/2010/wordprocessingInk" xmlns:wne="http://schemas.microsoft.com/office/word/2006/wordml" xmlns:wps="http://schemas.microsoft.com/office/word/2010/wordprocessingShape" mc:Ignorable="w14 w15 w16se w16cid w16 w16cex w16sdtdh w16sdtfl w16du wp14">
+<w:ftr xmlns:wpc="http://schemas.microsoft.com/office/word/2010/wordprocessingCanvas" xmlns:cx="http://schemas.microsoft.com/office/drawing/2014/chartex" xmlns:cx1="http://schemas.microsoft.com/office/drawing/2015/9/8/chartex" xmlns:cx2="http://schemas.microsoft.com/office/drawing/2015/10/21/chartex" xmlns:cx3="http://schemas.microsoft.com/office/drawing/2016/5/9/chartex" xmlns:cx4="http://schemas.microsoft.com/office/drawing/2016/5/10/chartex" xmlns:cx5="http://schemas.microsoft.com/office/drawing/2016/5/11/chartex" xmlns:cx6="http://schemas.microsoft.com/office/drawing/2016/5/12/chartex" xmlns:cx7="http://schemas.microsoft.com/office/drawing/2016/5/13/chartex" xmlns:cx8="http://schemas.microsoft.com/office/drawing/2016/5/14/chartex" xmlns:mc="http://schemas.openxmlformats.org/markup-compatibility/2006" xmlns:aink="http://schemas.microsoft.com/office/drawing/2016/ink" xmlns:am3d="http://schemas.microsoft.com/office/drawing/2017/model3d" xmlns:o="urn:schemas-microsoft-com:office:office" xmlns:oel="http://schemas.microsoft.com/office/2019/extlst" xmlns:r="http://schemas.openxmlformats.org/officeDocument/2006/relationships" xmlns:m="http://schemas.openxmlformats.org/officeDocument/2006/math" xmlns:v="urn:schemas-microsoft-com:vml" xmlns:wp14="http://schemas.microsoft.com/office/word/2010/wordprocessingDrawing" xmlns:wp="http://schemas.openxmlformats.org/drawingml/2006/wordprocessingDrawing" xmlns:w10="urn:schemas-microsoft-com:office:word" xmlns:w="http://schemas.openxmlformats.org/wordprocessingml/2006/main" xmlns:w14="http://schemas.microsoft.com/office/word/2010/wordml" xmlns:w15="http://schemas.microsoft.com/office/word/2012/wordml" xmlns:w16cex="http://schemas.microsoft.com/office/word/2018/wordml/cex" xmlns:w16cid="http://schemas.microsoft.com/office/word/2016/wordml/cid" xmlns:w16="http://schemas.microsoft.com/office/word/2018/wordml" xmlns:w16du="http://schemas.microsoft.com/office/word/2023/wordml/word16du" xmlns:w16sdtdh="http://schemas.microsoft.com/office/word/2020/wordml/sdtdatahash" xmlns:w16se="http://schemas.microsoft.com/office/word/2015/wordml/symex" xmlns:wpg="http://schemas.microsoft.com/office/word/2010/wordprocessingGroup" xmlns:wpi="http://schemas.microsoft.com/office/word/2010/wordprocessingInk" xmlns:wne="http://schemas.microsoft.com/office/word/2006/wordml" xmlns:wps="http://schemas.microsoft.com/office/word/2010/wordprocessingShape" mc:Ignorable="w14 w15 w16se w16cid w16 w16cex w16sdtdh w16du wp14">
   <w:p>
     <w:pPr>
       <w:pStyle w:val="Footer"/>
@@ -6197,7 +6838,7 @@
 </file>
 
 <file path=word/footer2.xml><?xml version="1.0" encoding="utf-8"?>
-<w:ftr xmlns:wpc="http://schemas.microsoft.com/office/word/2010/wordprocessingCanvas" xmlns:cx="http://schemas.microsoft.com/office/drawing/2014/chartex" xmlns:cx1="http://schemas.microsoft.com/office/drawing/2015/9/8/chartex" xmlns:cx2="http://schemas.microsoft.com/office/drawing/2015/10/21/chartex" xmlns:cx3="http://schemas.microsoft.com/office/drawing/2016/5/9/chartex" xmlns:cx4="http://schemas.microsoft.com/office/drawing/2016/5/10/chartex" xmlns:cx5="http://schemas.microsoft.com/office/drawing/2016/5/11/chartex" xmlns:cx6="http://schemas.microsoft.com/office/drawing/2016/5/12/chartex" xmlns:cx7="http://schemas.microsoft.com/office/drawing/2016/5/13/chartex" xmlns:cx8="http://schemas.microsoft.com/office/drawing/2016/5/14/chartex" xmlns:mc="http://schemas.openxmlformats.org/markup-compatibility/2006" xmlns:aink="http://schemas.microsoft.com/office/drawing/2016/ink" xmlns:am3d="http://schemas.microsoft.com/office/drawing/2017/model3d" xmlns:o="urn:schemas-microsoft-com:office:office" xmlns:oel="http://schemas.microsoft.com/office/2019/extlst" xmlns:r="http://schemas.openxmlformats.org/officeDocument/2006/relationships" xmlns:m="http://schemas.openxmlformats.org/officeDocument/2006/math" xmlns:v="urn:schemas-microsoft-com:vml" xmlns:wp14="http://schemas.microsoft.com/office/word/2010/wordprocessingDrawing" xmlns:wp="http://schemas.openxmlformats.org/drawingml/2006/wordprocessingDrawing" xmlns:w10="urn:schemas-microsoft-com:office:word" xmlns:w="http://schemas.openxmlformats.org/wordprocessingml/2006/main" xmlns:w14="http://schemas.microsoft.com/office/word/2010/wordml" xmlns:w15="http://schemas.microsoft.com/office/word/2012/wordml" xmlns:w16cex="http://schemas.microsoft.com/office/word/2018/wordml/cex" xmlns:w16cid="http://schemas.microsoft.com/office/word/2016/wordml/cid" xmlns:w16="http://schemas.microsoft.com/office/word/2018/wordml" xmlns:w16du="http://schemas.microsoft.com/office/word/2023/wordml/word16du" xmlns:w16sdtdh="http://schemas.microsoft.com/office/word/2020/wordml/sdtdatahash" xmlns:w16sdtfl="http://schemas.microsoft.com/office/word/2024/wordml/sdtformatlock" xmlns:w16se="http://schemas.microsoft.com/office/word/2015/wordml/symex" xmlns:wpg="http://schemas.microsoft.com/office/word/2010/wordprocessingGroup" xmlns:wpi="http://schemas.microsoft.com/office/word/2010/wordprocessingInk" xmlns:wne="http://schemas.microsoft.com/office/word/2006/wordml" xmlns:wps="http://schemas.microsoft.com/office/word/2010/wordprocessingShape" mc:Ignorable="w14 w15 w16se w16cid w16 w16cex w16sdtdh w16sdtfl w16du wp14">
+<w:ftr xmlns:wpc="http://schemas.microsoft.com/office/word/2010/wordprocessingCanvas" xmlns:cx="http://schemas.microsoft.com/office/drawing/2014/chartex" xmlns:cx1="http://schemas.microsoft.com/office/drawing/2015/9/8/chartex" xmlns:cx2="http://schemas.microsoft.com/office/drawing/2015/10/21/chartex" xmlns:cx3="http://schemas.microsoft.com/office/drawing/2016/5/9/chartex" xmlns:cx4="http://schemas.microsoft.com/office/drawing/2016/5/10/chartex" xmlns:cx5="http://schemas.microsoft.com/office/drawing/2016/5/11/chartex" xmlns:cx6="http://schemas.microsoft.com/office/drawing/2016/5/12/chartex" xmlns:cx7="http://schemas.microsoft.com/office/drawing/2016/5/13/chartex" xmlns:cx8="http://schemas.microsoft.com/office/drawing/2016/5/14/chartex" xmlns:mc="http://schemas.openxmlformats.org/markup-compatibility/2006" xmlns:aink="http://schemas.microsoft.com/office/drawing/2016/ink" xmlns:am3d="http://schemas.microsoft.com/office/drawing/2017/model3d" xmlns:o="urn:schemas-microsoft-com:office:office" xmlns:oel="http://schemas.microsoft.com/office/2019/extlst" xmlns:r="http://schemas.openxmlformats.org/officeDocument/2006/relationships" xmlns:m="http://schemas.openxmlformats.org/officeDocument/2006/math" xmlns:v="urn:schemas-microsoft-com:vml" xmlns:wp14="http://schemas.microsoft.com/office/word/2010/wordprocessingDrawing" xmlns:wp="http://schemas.openxmlformats.org/drawingml/2006/wordprocessingDrawing" xmlns:w10="urn:schemas-microsoft-com:office:word" xmlns:w="http://schemas.openxmlformats.org/wordprocessingml/2006/main" xmlns:w14="http://schemas.microsoft.com/office/word/2010/wordml" xmlns:w15="http://schemas.microsoft.com/office/word/2012/wordml" xmlns:w16cex="http://schemas.microsoft.com/office/word/2018/wordml/cex" xmlns:w16cid="http://schemas.microsoft.com/office/word/2016/wordml/cid" xmlns:w16="http://schemas.microsoft.com/office/word/2018/wordml" xmlns:w16du="http://schemas.microsoft.com/office/word/2023/wordml/word16du" xmlns:w16sdtdh="http://schemas.microsoft.com/office/word/2020/wordml/sdtdatahash" xmlns:w16se="http://schemas.microsoft.com/office/word/2015/wordml/symex" xmlns:wpg="http://schemas.microsoft.com/office/word/2010/wordprocessingGroup" xmlns:wpi="http://schemas.microsoft.com/office/word/2010/wordprocessingInk" xmlns:wne="http://schemas.microsoft.com/office/word/2006/wordml" xmlns:wps="http://schemas.microsoft.com/office/word/2010/wordprocessingShape" mc:Ignorable="w14 w15 w16se w16cid w16 w16cex w16sdtdh w16du wp14">
   <w:sdt>
     <w:sdtPr>
       <w:id w:val="1865711266"/>
@@ -6270,7 +6911,7 @@
                 </wp:inline>
               </w:drawing>
             </mc:Choice>
-            <mc:Fallback xmlns:a="http://schemas.openxmlformats.org/drawingml/2006/main" xmlns:wp14="http://schemas.microsoft.com/office/word/2010/wordml" xmlns:pic="http://schemas.openxmlformats.org/drawingml/2006/picture">
+            <mc:Fallback xmlns:pic="http://schemas.openxmlformats.org/drawingml/2006/picture" xmlns:wp14="http://schemas.microsoft.com/office/word/2010/wordml" xmlns:a="http://schemas.openxmlformats.org/drawingml/2006/main" xmlns:w16sdtfl="http://schemas.microsoft.com/office/word/2024/wordml/sdtformatlock">
               <w:pict w14:anchorId="1521B567">
                 <v:shapetype coordsize="21600,21600" o:spt="75" o:preferrelative="t" path="m@4@5l@4@11@9@11@9@5xe" type="#_x0000_t75">
                   <v:formulas>
@@ -6362,7 +7003,7 @@
 </file>
 
 <file path=word/footnotes.xml><?xml version="1.0" encoding="utf-8"?>
-<w:footnotes xmlns:wpc="http://schemas.microsoft.com/office/word/2010/wordprocessingCanvas" xmlns:cx="http://schemas.microsoft.com/office/drawing/2014/chartex" xmlns:cx1="http://schemas.microsoft.com/office/drawing/2015/9/8/chartex" xmlns:cx2="http://schemas.microsoft.com/office/drawing/2015/10/21/chartex" xmlns:cx3="http://schemas.microsoft.com/office/drawing/2016/5/9/chartex" xmlns:cx4="http://schemas.microsoft.com/office/drawing/2016/5/10/chartex" xmlns:cx5="http://schemas.microsoft.com/office/drawing/2016/5/11/chartex" xmlns:cx6="http://schemas.microsoft.com/office/drawing/2016/5/12/chartex" xmlns:cx7="http://schemas.microsoft.com/office/drawing/2016/5/13/chartex" xmlns:cx8="http://schemas.microsoft.com/office/drawing/2016/5/14/chartex" xmlns:mc="http://schemas.openxmlformats.org/markup-compatibility/2006" xmlns:aink="http://schemas.microsoft.com/office/drawing/2016/ink" xmlns:am3d="http://schemas.microsoft.com/office/drawing/2017/model3d" xmlns:o="urn:schemas-microsoft-com:office:office" xmlns:oel="http://schemas.microsoft.com/office/2019/extlst" xmlns:r="http://schemas.openxmlformats.org/officeDocument/2006/relationships" xmlns:m="http://schemas.openxmlformats.org/officeDocument/2006/math" xmlns:v="urn:schemas-microsoft-com:vml" xmlns:wp14="http://schemas.microsoft.com/office/word/2010/wordprocessingDrawing" xmlns:wp="http://schemas.openxmlformats.org/drawingml/2006/wordprocessingDrawing" xmlns:w10="urn:schemas-microsoft-com:office:word" xmlns:w="http://schemas.openxmlformats.org/wordprocessingml/2006/main" xmlns:w14="http://schemas.microsoft.com/office/word/2010/wordml" xmlns:w15="http://schemas.microsoft.com/office/word/2012/wordml" xmlns:w16cex="http://schemas.microsoft.com/office/word/2018/wordml/cex" xmlns:w16cid="http://schemas.microsoft.com/office/word/2016/wordml/cid" xmlns:w16="http://schemas.microsoft.com/office/word/2018/wordml" xmlns:w16du="http://schemas.microsoft.com/office/word/2023/wordml/word16du" xmlns:w16sdtdh="http://schemas.microsoft.com/office/word/2020/wordml/sdtdatahash" xmlns:w16sdtfl="http://schemas.microsoft.com/office/word/2024/wordml/sdtformatlock" xmlns:w16se="http://schemas.microsoft.com/office/word/2015/wordml/symex" xmlns:wpg="http://schemas.microsoft.com/office/word/2010/wordprocessingGroup" xmlns:wpi="http://schemas.microsoft.com/office/word/2010/wordprocessingInk" xmlns:wne="http://schemas.microsoft.com/office/word/2006/wordml" xmlns:wps="http://schemas.microsoft.com/office/word/2010/wordprocessingShape" mc:Ignorable="w14 w15 w16se w16cid w16 w16cex w16sdtdh w16sdtfl w16du wp14">
+<w:footnotes xmlns:wpc="http://schemas.microsoft.com/office/word/2010/wordprocessingCanvas" xmlns:cx="http://schemas.microsoft.com/office/drawing/2014/chartex" xmlns:cx1="http://schemas.microsoft.com/office/drawing/2015/9/8/chartex" xmlns:cx2="http://schemas.microsoft.com/office/drawing/2015/10/21/chartex" xmlns:cx3="http://schemas.microsoft.com/office/drawing/2016/5/9/chartex" xmlns:cx4="http://schemas.microsoft.com/office/drawing/2016/5/10/chartex" xmlns:cx5="http://schemas.microsoft.com/office/drawing/2016/5/11/chartex" xmlns:cx6="http://schemas.microsoft.com/office/drawing/2016/5/12/chartex" xmlns:cx7="http://schemas.microsoft.com/office/drawing/2016/5/13/chartex" xmlns:cx8="http://schemas.microsoft.com/office/drawing/2016/5/14/chartex" xmlns:mc="http://schemas.openxmlformats.org/markup-compatibility/2006" xmlns:aink="http://schemas.microsoft.com/office/drawing/2016/ink" xmlns:am3d="http://schemas.microsoft.com/office/drawing/2017/model3d" xmlns:o="urn:schemas-microsoft-com:office:office" xmlns:oel="http://schemas.microsoft.com/office/2019/extlst" xmlns:r="http://schemas.openxmlformats.org/officeDocument/2006/relationships" xmlns:m="http://schemas.openxmlformats.org/officeDocument/2006/math" xmlns:v="urn:schemas-microsoft-com:vml" xmlns:wp14="http://schemas.microsoft.com/office/word/2010/wordprocessingDrawing" xmlns:wp="http://schemas.openxmlformats.org/drawingml/2006/wordprocessingDrawing" xmlns:w10="urn:schemas-microsoft-com:office:word" xmlns:w="http://schemas.openxmlformats.org/wordprocessingml/2006/main" xmlns:w14="http://schemas.microsoft.com/office/word/2010/wordml" xmlns:w15="http://schemas.microsoft.com/office/word/2012/wordml" xmlns:w16cex="http://schemas.microsoft.com/office/word/2018/wordml/cex" xmlns:w16cid="http://schemas.microsoft.com/office/word/2016/wordml/cid" xmlns:w16="http://schemas.microsoft.com/office/word/2018/wordml" xmlns:w16du="http://schemas.microsoft.com/office/word/2023/wordml/word16du" xmlns:w16sdtdh="http://schemas.microsoft.com/office/word/2020/wordml/sdtdatahash" xmlns:w16se="http://schemas.microsoft.com/office/word/2015/wordml/symex" xmlns:wpg="http://schemas.microsoft.com/office/word/2010/wordprocessingGroup" xmlns:wpi="http://schemas.microsoft.com/office/word/2010/wordprocessingInk" xmlns:wne="http://schemas.microsoft.com/office/word/2006/wordml" xmlns:wps="http://schemas.microsoft.com/office/word/2010/wordprocessingShape" mc:Ignorable="w14 w15 w16se w16cid w16 w16cex w16sdtdh w16du wp14">
   <w:footnote w:type="separator" w:id="-1">
     <w:p>
       <w:pPr>
@@ -6387,7 +7028,7 @@
 </file>
 
 <file path=word/numbering.xml><?xml version="1.0" encoding="utf-8"?>
-<w:numbering xmlns:wpc="http://schemas.microsoft.com/office/word/2010/wordprocessingCanvas" xmlns:cx="http://schemas.microsoft.com/office/drawing/2014/chartex" xmlns:cx1="http://schemas.microsoft.com/office/drawing/2015/9/8/chartex" xmlns:cx2="http://schemas.microsoft.com/office/drawing/2015/10/21/chartex" xmlns:cx3="http://schemas.microsoft.com/office/drawing/2016/5/9/chartex" xmlns:cx4="http://schemas.microsoft.com/office/drawing/2016/5/10/chartex" xmlns:cx5="http://schemas.microsoft.com/office/drawing/2016/5/11/chartex" xmlns:cx6="http://schemas.microsoft.com/office/drawing/2016/5/12/chartex" xmlns:cx7="http://schemas.microsoft.com/office/drawing/2016/5/13/chartex" xmlns:cx8="http://schemas.microsoft.com/office/drawing/2016/5/14/chartex" xmlns:mc="http://schemas.openxmlformats.org/markup-compatibility/2006" xmlns:aink="http://schemas.microsoft.com/office/drawing/2016/ink" xmlns:am3d="http://schemas.microsoft.com/office/drawing/2017/model3d" xmlns:o="urn:schemas-microsoft-com:office:office" xmlns:oel="http://schemas.microsoft.com/office/2019/extlst" xmlns:r="http://schemas.openxmlformats.org/officeDocument/2006/relationships" xmlns:m="http://schemas.openxmlformats.org/officeDocument/2006/math" xmlns:v="urn:schemas-microsoft-com:vml" xmlns:wp14="http://schemas.microsoft.com/office/word/2010/wordprocessingDrawing" xmlns:wp="http://schemas.openxmlformats.org/drawingml/2006/wordprocessingDrawing" xmlns:w10="urn:schemas-microsoft-com:office:word" xmlns:w="http://schemas.openxmlformats.org/wordprocessingml/2006/main" xmlns:w14="http://schemas.microsoft.com/office/word/2010/wordml" xmlns:w15="http://schemas.microsoft.com/office/word/2012/wordml" xmlns:w16cex="http://schemas.microsoft.com/office/word/2018/wordml/cex" xmlns:w16cid="http://schemas.microsoft.com/office/word/2016/wordml/cid" xmlns:w16="http://schemas.microsoft.com/office/word/2018/wordml" xmlns:w16du="http://schemas.microsoft.com/office/word/2023/wordml/word16du" xmlns:w16sdtdh="http://schemas.microsoft.com/office/word/2020/wordml/sdtdatahash" xmlns:w16sdtfl="http://schemas.microsoft.com/office/word/2024/wordml/sdtformatlock" xmlns:w16se="http://schemas.microsoft.com/office/word/2015/wordml/symex" xmlns:wpg="http://schemas.microsoft.com/office/word/2010/wordprocessingGroup" xmlns:wpi="http://schemas.microsoft.com/office/word/2010/wordprocessingInk" xmlns:wne="http://schemas.microsoft.com/office/word/2006/wordml" xmlns:wps="http://schemas.microsoft.com/office/word/2010/wordprocessingShape" mc:Ignorable="w14 w15 w16se w16cid w16 w16cex w16sdtdh w16sdtfl w16du wp14">
+<w:numbering xmlns:wpc="http://schemas.microsoft.com/office/word/2010/wordprocessingCanvas" xmlns:cx="http://schemas.microsoft.com/office/drawing/2014/chartex" xmlns:cx1="http://schemas.microsoft.com/office/drawing/2015/9/8/chartex" xmlns:cx2="http://schemas.microsoft.com/office/drawing/2015/10/21/chartex" xmlns:cx3="http://schemas.microsoft.com/office/drawing/2016/5/9/chartex" xmlns:cx4="http://schemas.microsoft.com/office/drawing/2016/5/10/chartex" xmlns:cx5="http://schemas.microsoft.com/office/drawing/2016/5/11/chartex" xmlns:cx6="http://schemas.microsoft.com/office/drawing/2016/5/12/chartex" xmlns:cx7="http://schemas.microsoft.com/office/drawing/2016/5/13/chartex" xmlns:cx8="http://schemas.microsoft.com/office/drawing/2016/5/14/chartex" xmlns:mc="http://schemas.openxmlformats.org/markup-compatibility/2006" xmlns:aink="http://schemas.microsoft.com/office/drawing/2016/ink" xmlns:am3d="http://schemas.microsoft.com/office/drawing/2017/model3d" xmlns:o="urn:schemas-microsoft-com:office:office" xmlns:oel="http://schemas.microsoft.com/office/2019/extlst" xmlns:r="http://schemas.openxmlformats.org/officeDocument/2006/relationships" xmlns:m="http://schemas.openxmlformats.org/officeDocument/2006/math" xmlns:v="urn:schemas-microsoft-com:vml" xmlns:wp14="http://schemas.microsoft.com/office/word/2010/wordprocessingDrawing" xmlns:wp="http://schemas.openxmlformats.org/drawingml/2006/wordprocessingDrawing" xmlns:w10="urn:schemas-microsoft-com:office:word" xmlns:w="http://schemas.openxmlformats.org/wordprocessingml/2006/main" xmlns:w14="http://schemas.microsoft.com/office/word/2010/wordml" xmlns:w15="http://schemas.microsoft.com/office/word/2012/wordml" xmlns:w16cex="http://schemas.microsoft.com/office/word/2018/wordml/cex" xmlns:w16cid="http://schemas.microsoft.com/office/word/2016/wordml/cid" xmlns:w16="http://schemas.microsoft.com/office/word/2018/wordml" xmlns:w16du="http://schemas.microsoft.com/office/word/2023/wordml/word16du" xmlns:w16sdtdh="http://schemas.microsoft.com/office/word/2020/wordml/sdtdatahash" xmlns:w16se="http://schemas.microsoft.com/office/word/2015/wordml/symex" xmlns:wpg="http://schemas.microsoft.com/office/word/2010/wordprocessingGroup" xmlns:wpi="http://schemas.microsoft.com/office/word/2010/wordprocessingInk" xmlns:wne="http://schemas.microsoft.com/office/word/2006/wordml" xmlns:wps="http://schemas.microsoft.com/office/word/2010/wordprocessingShape" mc:Ignorable="w14 w15 w16se w16cid w16 w16cex w16sdtdh w16du wp14">
   <w:abstractNum w:abstractNumId="0" w15:restartNumberingAfterBreak="0">
     <w:nsid w:val="02081313"/>
     <w:multiLevelType w:val="hybridMultilevel"/>
@@ -8936,7 +9577,7 @@
 </file>
 
 <file path=word/styles.xml><?xml version="1.0" encoding="utf-8"?>
-<w:styles xmlns:mc="http://schemas.openxmlformats.org/markup-compatibility/2006" xmlns:r="http://schemas.openxmlformats.org/officeDocument/2006/relationships" xmlns:w="http://schemas.openxmlformats.org/wordprocessingml/2006/main" xmlns:w14="http://schemas.microsoft.com/office/word/2010/wordml" xmlns:w15="http://schemas.microsoft.com/office/word/2012/wordml" xmlns:w16cex="http://schemas.microsoft.com/office/word/2018/wordml/cex" xmlns:w16cid="http://schemas.microsoft.com/office/word/2016/wordml/cid" xmlns:w16="http://schemas.microsoft.com/office/word/2018/wordml" xmlns:w16du="http://schemas.microsoft.com/office/word/2023/wordml/word16du" xmlns:w16sdtdh="http://schemas.microsoft.com/office/word/2020/wordml/sdtdatahash" xmlns:w16sdtfl="http://schemas.microsoft.com/office/word/2024/wordml/sdtformatlock" xmlns:w16se="http://schemas.microsoft.com/office/word/2015/wordml/symex" mc:Ignorable="w14 w15 w16se w16cid w16 w16cex w16sdtdh w16sdtfl w16du">
+<w:styles xmlns:mc="http://schemas.openxmlformats.org/markup-compatibility/2006" xmlns:r="http://schemas.openxmlformats.org/officeDocument/2006/relationships" xmlns:w="http://schemas.openxmlformats.org/wordprocessingml/2006/main" xmlns:w14="http://schemas.microsoft.com/office/word/2010/wordml" xmlns:w15="http://schemas.microsoft.com/office/word/2012/wordml" xmlns:w16cex="http://schemas.microsoft.com/office/word/2018/wordml/cex" xmlns:w16cid="http://schemas.microsoft.com/office/word/2016/wordml/cid" xmlns:w16="http://schemas.microsoft.com/office/word/2018/wordml" xmlns:w16du="http://schemas.microsoft.com/office/word/2023/wordml/word16du" xmlns:w16sdtdh="http://schemas.microsoft.com/office/word/2020/wordml/sdtdatahash" xmlns:w16se="http://schemas.microsoft.com/office/word/2015/wordml/symex" mc:Ignorable="w14 w15 w16se w16cid w16 w16cex w16sdtdh w16du">
   <w:docDefaults>
     <w:rPrDefault>
       <w:rPr>
@@ -9530,6 +10171,7 @@
   <w:style w:type="character" w:default="1" w:styleId="DefaultParagraphFont">
     <w:name w:val="Default Paragraph Font"/>
     <w:uiPriority w:val="1"/>
+    <w:semiHidden/>
     <w:unhideWhenUsed/>
   </w:style>
   <w:style w:type="table" w:default="1" w:styleId="TableNormal">
@@ -21433,6 +22075,75 @@
 </file>
 
 <file path=customXml/item1.xml><?xml version="1.0" encoding="utf-8"?>
+<?mso-contentType ?>
+<FormTemplates xmlns="http://schemas.microsoft.com/sharepoint/v3/contenttype/forms">
+  <Display>DocumentLibraryForm</Display>
+  <Edit>DocumentLibraryForm</Edit>
+  <New>DocumentLibraryForm</New>
+</FormTemplates>
+</file>
+
+<file path=customXml/item2.xml><?xml version="1.0" encoding="utf-8"?>
+<b:Sources xmlns:b="http://schemas.openxmlformats.org/officeDocument/2006/bibliography" xmlns="http://schemas.openxmlformats.org/officeDocument/2006/bibliography" SelectedStyle="\APASixthEditionOfficeOnline.xsl" StyleName="APA" Version="6"/>
+</file>
+
+<file path=customXml/item3.xml><?xml version="1.0" encoding="utf-8"?>
+<?mso-contentType ?>
+<spe:Receivers xmlns:spe="http://schemas.microsoft.com/sharepoint/events">
+  <Receiver>
+    <Name>Document ID Generator</Name>
+    <Synchronization>Synchronous</Synchronization>
+    <Type>10001</Type>
+    <SequenceNumber>1000</SequenceNumber>
+    <Url/>
+    <Assembly>Microsoft.Office.DocumentManagement, Version=16.0.0.0, Culture=neutral, PublicKeyToken=71e9bce111e9429c</Assembly>
+    <Class>Microsoft.Office.DocumentManagement.Internal.DocIdHandler</Class>
+    <Data/>
+    <Filter/>
+  </Receiver>
+  <Receiver>
+    <Name>Document ID Generator</Name>
+    <Synchronization>Synchronous</Synchronization>
+    <Type>10002</Type>
+    <SequenceNumber>1001</SequenceNumber>
+    <Url/>
+    <Assembly>Microsoft.Office.DocumentManagement, Version=16.0.0.0, Culture=neutral, PublicKeyToken=71e9bce111e9429c</Assembly>
+    <Class>Microsoft.Office.DocumentManagement.Internal.DocIdHandler</Class>
+    <Data/>
+    <Filter/>
+  </Receiver>
+  <Receiver>
+    <Name>Document ID Generator</Name>
+    <Synchronization>Synchronous</Synchronization>
+    <Type>10004</Type>
+    <SequenceNumber>1002</SequenceNumber>
+    <Url/>
+    <Assembly>Microsoft.Office.DocumentManagement, Version=16.0.0.0, Culture=neutral, PublicKeyToken=71e9bce111e9429c</Assembly>
+    <Class>Microsoft.Office.DocumentManagement.Internal.DocIdHandler</Class>
+    <Data/>
+    <Filter/>
+  </Receiver>
+  <Receiver>
+    <Name>Document ID Generator</Name>
+    <Synchronization>Synchronous</Synchronization>
+    <Type>10006</Type>
+    <SequenceNumber>1003</SequenceNumber>
+    <Url/>
+    <Assembly>Microsoft.Office.DocumentManagement, Version=16.0.0.0, Culture=neutral, PublicKeyToken=71e9bce111e9429c</Assembly>
+    <Class>Microsoft.Office.DocumentManagement.Internal.DocIdHandler</Class>
+    <Data/>
+    <Filter/>
+  </Receiver>
+</spe:Receivers>
+</file>
+
+<file path=customXml/item4.xml><?xml version="1.0" encoding="utf-8"?>
+<w:settings xmlns:w="http://schemas.openxmlformats.org/wordprocessingml/2006/main">
+  <w:SpecialFormsHighlight w:val="c9c8ff"/>
+</w:settings>
+</file>
+
+<file path=customXml/item5.xml><?xml version="1.0" encoding="utf-8"?>
 <ct:contentTypeSchema xmlns:ct="http://schemas.microsoft.com/office/2006/metadata/contentType" xmlns:ma="http://schemas.microsoft.com/office/2006/metadata/properties/metaAttributes" ct:_="" ma:_="" ma:contentTypeName="Dokument" ma:contentTypeID="0x010100464D6544A015444385B10BEB1E534503" ma:contentTypeVersion="3" ma:contentTypeDescription="Ein neues Dokument erstellen." ma:contentTypeScope="" ma:versionID="97182bbd3e9b32d05dd5555f7c2bd814">
   <xsd:schema xmlns:xsd="http://www.w3.org/2001/XMLSchema" xmlns:xs="http://www.w3.org/2001/XMLSchema" xmlns:p="http://schemas.microsoft.com/office/2006/metadata/properties" xmlns:ns1="http://schemas.microsoft.com/sharepoint/v3" xmlns:ns2="http://schemas.microsoft.com/sharepoint/v3/fields" xmlns:ns3="http://schemas.microsoft.com/sharepoint/v4" xmlns:ns4="afee9e21-8e0c-452e-93ec-a70efb6b23ab" targetNamespace="http://schemas.microsoft.com/office/2006/metadata/properties" ma:root="true" ma:fieldsID="7bd051767b3e235ef3b7c10b4a85711f" ns1:_="" ns2:_="" ns3:_="" ns4:_="">
     <xsd:import namespace="http://schemas.microsoft.com/sharepoint/v3"/>
@@ -21616,75 +22327,6 @@
 </ct:contentTypeSchema>
 </file>
 
-<file path=customXml/item2.xml><?xml version="1.0" encoding="utf-8"?>
-<w:settings xmlns:w="http://schemas.openxmlformats.org/wordprocessingml/2006/main">
-  <w:SpecialFormsHighlight w:val="c9c8ff"/>
-</w:settings>
-</file>
-
-<file path=customXml/item3.xml><?xml version="1.0" encoding="utf-8"?>
-<?mso-contentType ?>
-<spe:Receivers xmlns:spe="http://schemas.microsoft.com/sharepoint/events">
-  <Receiver>
-    <Name>Document ID Generator</Name>
-    <Synchronization>Synchronous</Synchronization>
-    <Type>10001</Type>
-    <SequenceNumber>1000</SequenceNumber>
-    <Url/>
-    <Assembly>Microsoft.Office.DocumentManagement, Version=16.0.0.0, Culture=neutral, PublicKeyToken=71e9bce111e9429c</Assembly>
-    <Class>Microsoft.Office.DocumentManagement.Internal.DocIdHandler</Class>
-    <Data/>
-    <Filter/>
-  </Receiver>
-  <Receiver>
-    <Name>Document ID Generator</Name>
-    <Synchronization>Synchronous</Synchronization>
-    <Type>10002</Type>
-    <SequenceNumber>1001</SequenceNumber>
-    <Url/>
-    <Assembly>Microsoft.Office.DocumentManagement, Version=16.0.0.0, Culture=neutral, PublicKeyToken=71e9bce111e9429c</Assembly>
-    <Class>Microsoft.Office.DocumentManagement.Internal.DocIdHandler</Class>
-    <Data/>
-    <Filter/>
-  </Receiver>
-  <Receiver>
-    <Name>Document ID Generator</Name>
-    <Synchronization>Synchronous</Synchronization>
-    <Type>10004</Type>
-    <SequenceNumber>1002</SequenceNumber>
-    <Url/>
-    <Assembly>Microsoft.Office.DocumentManagement, Version=16.0.0.0, Culture=neutral, PublicKeyToken=71e9bce111e9429c</Assembly>
-    <Class>Microsoft.Office.DocumentManagement.Internal.DocIdHandler</Class>
-    <Data/>
-    <Filter/>
-  </Receiver>
-  <Receiver>
-    <Name>Document ID Generator</Name>
-    <Synchronization>Synchronous</Synchronization>
-    <Type>10006</Type>
-    <SequenceNumber>1003</SequenceNumber>
-    <Url/>
-    <Assembly>Microsoft.Office.DocumentManagement, Version=16.0.0.0, Culture=neutral, PublicKeyToken=71e9bce111e9429c</Assembly>
-    <Class>Microsoft.Office.DocumentManagement.Internal.DocIdHandler</Class>
-    <Data/>
-    <Filter/>
-  </Receiver>
-</spe:Receivers>
-</file>
-
-<file path=customXml/item4.xml><?xml version="1.0" encoding="utf-8"?>
-<b:Sources xmlns:b="http://schemas.openxmlformats.org/officeDocument/2006/bibliography" xmlns="http://schemas.openxmlformats.org/officeDocument/2006/bibliography" SelectedStyle="\APASixthEditionOfficeOnline.xsl" StyleName="APA" Version="6"/>
-</file>
-
-<file path=customXml/item5.xml><?xml version="1.0" encoding="utf-8"?>
-<?mso-contentType ?>
-<FormTemplates xmlns="http://schemas.microsoft.com/sharepoint/v3/contenttype/forms">
-  <Display>DocumentLibraryForm</Display>
-  <Edit>DocumentLibraryForm</Edit>
-  <New>DocumentLibraryForm</New>
-</FormTemplates>
-</file>
-
 <file path=customXml/item6.xml><?xml version="1.0" encoding="utf-8"?>
 <p:properties xmlns:p="http://schemas.microsoft.com/office/2006/metadata/properties" xmlns:xsi="http://www.w3.org/2001/XMLSchema-instance" xmlns:pc="http://schemas.microsoft.com/office/infopath/2007/PartnerControls">
   <documentManagement>
@@ -21702,6 +22344,38 @@
 </file>
 
 <file path=customXml/itemProps1.xml><?xml version="1.0" encoding="utf-8"?>
+<ds:datastoreItem xmlns:ds="http://schemas.openxmlformats.org/officeDocument/2006/customXml" ds:itemID="{76E5CD1D-9176-4FA7-9A9A-698AC52D8E9F}">
+  <ds:schemaRefs>
+    <ds:schemaRef ds:uri="http://schemas.microsoft.com/sharepoint/v3/contenttype/forms"/>
+  </ds:schemaRefs>
+</ds:datastoreItem>
+</file>
+
+<file path=customXml/itemProps2.xml><?xml version="1.0" encoding="utf-8"?>
+<ds:datastoreItem xmlns:ds="http://schemas.openxmlformats.org/officeDocument/2006/customXml" ds:itemID="{6685E73F-2677-4B89-8508-7813A036A081}">
+  <ds:schemaRefs>
+    <ds:schemaRef ds:uri="http://schemas.openxmlformats.org/officeDocument/2006/bibliography"/>
+  </ds:schemaRefs>
+</ds:datastoreItem>
+</file>
+
+<file path=customXml/itemProps3.xml><?xml version="1.0" encoding="utf-8"?>
+<ds:datastoreItem xmlns:ds="http://schemas.openxmlformats.org/officeDocument/2006/customXml" ds:itemID="{924007F5-9277-4670-9FE6-06782C7296A1}">
+  <ds:schemaRefs>
+    <ds:schemaRef ds:uri="http://schemas.microsoft.com/sharepoint/events"/>
+  </ds:schemaRefs>
+</ds:datastoreItem>
+</file>
+
+<file path=customXml/itemProps4.xml><?xml version="1.0" encoding="utf-8"?>
+<ds:datastoreItem xmlns:ds="http://schemas.openxmlformats.org/officeDocument/2006/customXml" ds:itemID="{5D0AEA6B-E499-4EEF-98A3-AFBB261C493E}">
+  <ds:schemaRefs>
+    <ds:schemaRef ds:uri="http://schemas.openxmlformats.org/wordprocessingml/2006/main"/>
+  </ds:schemaRefs>
+</ds:datastoreItem>
+</file>
+
+<file path=customXml/itemProps5.xml><?xml version="1.0" encoding="utf-8"?>
 <ds:datastoreItem xmlns:ds="http://schemas.openxmlformats.org/officeDocument/2006/customXml" ds:itemID="{AF3DCB32-2405-4B27-9ABA-B6FBCC24494E}">
   <ds:schemaRefs>
     <ds:schemaRef ds:uri="http://schemas.microsoft.com/office/2006/metadata/contentType"/>
@@ -21722,38 +22396,6 @@
 </ds:datastoreItem>
 </file>
 
-<file path=customXml/itemProps2.xml><?xml version="1.0" encoding="utf-8"?>
-<ds:datastoreItem xmlns:ds="http://schemas.openxmlformats.org/officeDocument/2006/customXml" ds:itemID="{5D0AEA6B-E499-4EEF-98A3-AFBB261C493E}">
-  <ds:schemaRefs>
-    <ds:schemaRef ds:uri="http://schemas.openxmlformats.org/wordprocessingml/2006/main"/>
-  </ds:schemaRefs>
-</ds:datastoreItem>
-</file>
-
-<file path=customXml/itemProps3.xml><?xml version="1.0" encoding="utf-8"?>
-<ds:datastoreItem xmlns:ds="http://schemas.openxmlformats.org/officeDocument/2006/customXml" ds:itemID="{924007F5-9277-4670-9FE6-06782C7296A1}">
-  <ds:schemaRefs>
-    <ds:schemaRef ds:uri="http://schemas.microsoft.com/sharepoint/events"/>
-  </ds:schemaRefs>
-</ds:datastoreItem>
-</file>
-
-<file path=customXml/itemProps4.xml><?xml version="1.0" encoding="utf-8"?>
-<ds:datastoreItem xmlns:ds="http://schemas.openxmlformats.org/officeDocument/2006/customXml" ds:itemID="{6685E73F-2677-4B89-8508-7813A036A081}">
-  <ds:schemaRefs>
-    <ds:schemaRef ds:uri="http://schemas.openxmlformats.org/officeDocument/2006/bibliography"/>
-  </ds:schemaRefs>
-</ds:datastoreItem>
-</file>
-
-<file path=customXml/itemProps5.xml><?xml version="1.0" encoding="utf-8"?>
-<ds:datastoreItem xmlns:ds="http://schemas.openxmlformats.org/officeDocument/2006/customXml" ds:itemID="{76E5CD1D-9176-4FA7-9A9A-698AC52D8E9F}">
-  <ds:schemaRefs>
-    <ds:schemaRef ds:uri="http://schemas.microsoft.com/sharepoint/v3/contenttype/forms"/>
-  </ds:schemaRefs>
-</ds:datastoreItem>
-</file>
-
 <file path=customXml/itemProps6.xml><?xml version="1.0" encoding="utf-8"?>
 <ds:datastoreItem xmlns:ds="http://schemas.openxmlformats.org/officeDocument/2006/customXml" ds:itemID="{80DCD561-5D0E-41FB-A5B2-A60CACB93746}">
   <ds:schemaRefs>

</xml_diff>

<commit_message>
Dataset: Add technical resource
</commit_message>
<xml_diff>
--- a/src/main/resources/org/damap/base/template/FWFTemplate.docx
+++ b/src/main/resources/org/damap/base/template/FWFTemplate.docx
@@ -1,6 +1,6 @@
 
 <file path=word/document.xml><?xml version="1.0" encoding="utf-8"?>
-<w:document xmlns:wpc="http://schemas.microsoft.com/office/word/2010/wordprocessingCanvas" xmlns:cx="http://schemas.microsoft.com/office/drawing/2014/chartex" xmlns:cx1="http://schemas.microsoft.com/office/drawing/2015/9/8/chartex" xmlns:cx2="http://schemas.microsoft.com/office/drawing/2015/10/21/chartex" xmlns:cx3="http://schemas.microsoft.com/office/drawing/2016/5/9/chartex" xmlns:cx4="http://schemas.microsoft.com/office/drawing/2016/5/10/chartex" xmlns:cx5="http://schemas.microsoft.com/office/drawing/2016/5/11/chartex" xmlns:cx6="http://schemas.microsoft.com/office/drawing/2016/5/12/chartex" xmlns:cx7="http://schemas.microsoft.com/office/drawing/2016/5/13/chartex" xmlns:cx8="http://schemas.microsoft.com/office/drawing/2016/5/14/chartex" xmlns:mc="http://schemas.openxmlformats.org/markup-compatibility/2006" xmlns:aink="http://schemas.microsoft.com/office/drawing/2016/ink" xmlns:am3d="http://schemas.microsoft.com/office/drawing/2017/model3d" xmlns:o="urn:schemas-microsoft-com:office:office" xmlns:oel="http://schemas.microsoft.com/office/2019/extlst" xmlns:r="http://schemas.openxmlformats.org/officeDocument/2006/relationships" xmlns:m="http://schemas.openxmlformats.org/officeDocument/2006/math" xmlns:v="urn:schemas-microsoft-com:vml" xmlns:wp14="http://schemas.microsoft.com/office/word/2010/wordprocessingDrawing" xmlns:wp="http://schemas.openxmlformats.org/drawingml/2006/wordprocessingDrawing" xmlns:w10="urn:schemas-microsoft-com:office:word" xmlns:w="http://schemas.openxmlformats.org/wordprocessingml/2006/main" xmlns:w14="http://schemas.microsoft.com/office/word/2010/wordml" xmlns:w15="http://schemas.microsoft.com/office/word/2012/wordml" xmlns:w16cex="http://schemas.microsoft.com/office/word/2018/wordml/cex" xmlns:w16cid="http://schemas.microsoft.com/office/word/2016/wordml/cid" xmlns:w16="http://schemas.microsoft.com/office/word/2018/wordml" xmlns:w16du="http://schemas.microsoft.com/office/word/2023/wordml/word16du" xmlns:w16sdtdh="http://schemas.microsoft.com/office/word/2020/wordml/sdtdatahash" xmlns:w16se="http://schemas.microsoft.com/office/word/2015/wordml/symex" xmlns:wpg="http://schemas.microsoft.com/office/word/2010/wordprocessingGroup" xmlns:wpi="http://schemas.microsoft.com/office/word/2010/wordprocessingInk" xmlns:wne="http://schemas.microsoft.com/office/word/2006/wordml" xmlns:wps="http://schemas.microsoft.com/office/word/2010/wordprocessingShape" mc:Ignorable="w14 w15 w16se w16cid w16 w16cex w16sdtdh w16du wp14">
+<w:document xmlns:wpc="http://schemas.microsoft.com/office/word/2010/wordprocessingCanvas" xmlns:cx="http://schemas.microsoft.com/office/drawing/2014/chartex" xmlns:cx1="http://schemas.microsoft.com/office/drawing/2015/9/8/chartex" xmlns:cx2="http://schemas.microsoft.com/office/drawing/2015/10/21/chartex" xmlns:cx3="http://schemas.microsoft.com/office/drawing/2016/5/9/chartex" xmlns:cx4="http://schemas.microsoft.com/office/drawing/2016/5/10/chartex" xmlns:cx5="http://schemas.microsoft.com/office/drawing/2016/5/11/chartex" xmlns:cx6="http://schemas.microsoft.com/office/drawing/2016/5/12/chartex" xmlns:cx7="http://schemas.microsoft.com/office/drawing/2016/5/13/chartex" xmlns:cx8="http://schemas.microsoft.com/office/drawing/2016/5/14/chartex" xmlns:mc="http://schemas.openxmlformats.org/markup-compatibility/2006" xmlns:aink="http://schemas.microsoft.com/office/drawing/2016/ink" xmlns:am3d="http://schemas.microsoft.com/office/drawing/2017/model3d" xmlns:o="urn:schemas-microsoft-com:office:office" xmlns:oel="http://schemas.microsoft.com/office/2019/extlst" xmlns:r="http://schemas.openxmlformats.org/officeDocument/2006/relationships" xmlns:m="http://schemas.openxmlformats.org/officeDocument/2006/math" xmlns:v="urn:schemas-microsoft-com:vml" xmlns:wp14="http://schemas.microsoft.com/office/word/2010/wordprocessingDrawing" xmlns:wp="http://schemas.openxmlformats.org/drawingml/2006/wordprocessingDrawing" xmlns:w10="urn:schemas-microsoft-com:office:word" xmlns:w="http://schemas.openxmlformats.org/wordprocessingml/2006/main" xmlns:w14="http://schemas.microsoft.com/office/word/2010/wordml" xmlns:w15="http://schemas.microsoft.com/office/word/2012/wordml" xmlns:w16cex="http://schemas.microsoft.com/office/word/2018/wordml/cex" xmlns:w16cid="http://schemas.microsoft.com/office/word/2016/wordml/cid" xmlns:w16="http://schemas.microsoft.com/office/word/2018/wordml" xmlns:w16du="http://schemas.microsoft.com/office/word/2023/wordml/word16du" xmlns:w16sdtdh="http://schemas.microsoft.com/office/word/2020/wordml/sdtdatahash" xmlns:w16sdtfl="http://schemas.microsoft.com/office/word/2024/wordml/sdtformatlock" xmlns:w16se="http://schemas.microsoft.com/office/word/2015/wordml/symex" xmlns:wpg="http://schemas.microsoft.com/office/word/2010/wordprocessingGroup" xmlns:wpi="http://schemas.microsoft.com/office/word/2010/wordprocessingInk" xmlns:wne="http://schemas.microsoft.com/office/word/2006/wordml" xmlns:wps="http://schemas.microsoft.com/office/word/2010/wordprocessingShape" mc:Ignorable="w14 w15 w16se w16cid w16 w16cex w16sdtdh w16sdtfl w16du wp14">
   <w:body>
     <w:p>
       <w:pPr>
@@ -629,7 +629,7 @@
                     </wp:anchor>
                   </w:drawing>
                 </mc:Choice>
-                <mc:Fallback xmlns:pic="http://schemas.openxmlformats.org/drawingml/2006/picture" xmlns:wp14="http://schemas.microsoft.com/office/word/2010/wordml" xmlns:a="http://schemas.openxmlformats.org/drawingml/2006/main" xmlns:w16sdtfl="http://schemas.microsoft.com/office/word/2024/wordml/sdtformatlock">
+                <mc:Fallback xmlns:pic="http://schemas.openxmlformats.org/drawingml/2006/picture" xmlns:wp14="http://schemas.microsoft.com/office/word/2010/wordml" xmlns:a="http://schemas.openxmlformats.org/drawingml/2006/main">
                   <w:pict w14:anchorId="7AAC8864">
                     <v:shapetype coordsize="21600,21600" o:spt="75" o:preferrelative="t" path="m@4@5l@4@11@9@11@9@5xe" type="#_x0000_t75">
                       <v:formulas>
@@ -1188,7 +1188,7 @@
                 <w:color w:val="92D050"/>
                 <w:sz w:val="18"/>
                 <w:szCs w:val="18"/>
-                <w:lang w:val="de-AT"/>
+                <w:lang w:val="en-US"/>
               </w:rPr>
             </w:pPr>
             <w:r>
@@ -1199,35 +1199,9 @@
                 <w:iCs/>
                 <w:sz w:val="18"/>
                 <w:szCs w:val="18"/>
-                <w:lang w:val="de-AT"/>
-              </w:rPr>
-              <w:t xml:space="preserve">DMP </w:t>
-            </w:r>
-            <w:proofErr w:type="spellStart"/>
-            <w:r>
-              <w:rPr>
-                <w:rFonts w:ascii="Arial" w:hAnsi="Arial" w:cs="Arial"/>
-                <w:b/>
-                <w:bCs/>
-                <w:iCs/>
-                <w:sz w:val="18"/>
-                <w:szCs w:val="18"/>
-                <w:lang w:val="de-AT"/>
-              </w:rPr>
-              <w:t>version</w:t>
-            </w:r>
-            <w:proofErr w:type="spellEnd"/>
-            <w:r>
-              <w:rPr>
-                <w:rFonts w:ascii="Arial" w:hAnsi="Arial" w:cs="Arial"/>
-                <w:b/>
-                <w:bCs/>
-                <w:iCs/>
-                <w:sz w:val="18"/>
-                <w:szCs w:val="18"/>
-                <w:lang w:val="de-AT"/>
-              </w:rPr>
-              <w:t>:</w:t>
+                <w:lang w:val="en-US"/>
+              </w:rPr>
+              <w:t>DMP version:</w:t>
             </w:r>
             <w:r>
               <w:rPr>
@@ -1235,7 +1209,7 @@
                 <w:iCs/>
                 <w:sz w:val="18"/>
                 <w:szCs w:val="18"/>
-                <w:lang w:val="de-AT"/>
+                <w:lang w:val="en-US"/>
               </w:rPr>
               <w:t xml:space="preserve"> </w:t>
             </w:r>
@@ -1246,11 +1220,12 @@
                 <w:color w:val="92D050"/>
                 <w:sz w:val="18"/>
                 <w:szCs w:val="18"/>
-                <w:lang w:val="de-AT"/>
+                <w:lang w:val="en-US"/>
               </w:rPr>
               <w:t>[Nr.], [</w:t>
             </w:r>
             <w:proofErr w:type="spellStart"/>
+            <w:proofErr w:type="gramStart"/>
             <w:r>
               <w:rPr>
                 <w:rFonts w:ascii="Arial" w:hAnsi="Arial" w:cs="Arial"/>
@@ -1258,11 +1233,12 @@
                 <w:color w:val="92D050"/>
                 <w:sz w:val="18"/>
                 <w:szCs w:val="18"/>
-                <w:lang w:val="de-AT"/>
+                <w:lang w:val="en-US"/>
               </w:rPr>
               <w:t>dd.mm.yyyy</w:t>
             </w:r>
             <w:proofErr w:type="spellEnd"/>
+            <w:proofErr w:type="gramEnd"/>
             <w:r>
               <w:rPr>
                 <w:rFonts w:ascii="Arial" w:hAnsi="Arial" w:cs="Arial"/>
@@ -1270,7 +1246,7 @@
                 <w:color w:val="92D050"/>
                 <w:sz w:val="18"/>
                 <w:szCs w:val="18"/>
-                <w:lang w:val="de-AT"/>
+                <w:lang w:val="en-US"/>
               </w:rPr>
               <w:t>]</w:t>
             </w:r>
@@ -3074,6 +3050,46 @@
             <w:r>
               <w:rPr>
                 <w:rFonts w:ascii="Arial" w:hAnsi="Arial" w:cs="Arial"/>
+                <w:sz w:val="18"/>
+                <w:szCs w:val="18"/>
+                <w:lang w:val="en-GB"/>
+              </w:rPr>
+              <w:t>[</w:t>
+            </w:r>
+            <w:proofErr w:type="spellStart"/>
+            <w:r>
+              <w:rPr>
+                <w:rFonts w:ascii="Arial" w:hAnsi="Arial" w:cs="Arial"/>
+                <w:sz w:val="18"/>
+                <w:szCs w:val="18"/>
+                <w:lang w:val="en-GB"/>
+              </w:rPr>
+              <w:t>datasetTechnicalResources</w:t>
+            </w:r>
+            <w:proofErr w:type="spellEnd"/>
+            <w:r>
+              <w:rPr>
+                <w:rFonts w:ascii="Arial" w:hAnsi="Arial" w:cs="Arial"/>
+                <w:sz w:val="18"/>
+                <w:szCs w:val="18"/>
+                <w:lang w:val="en-GB"/>
+              </w:rPr>
+              <w:t>]</w:t>
+            </w:r>
+          </w:p>
+          <w:p>
+            <w:pPr>
+              <w:spacing w:before="120" w:after="120"/>
+              <w:rPr>
+                <w:rFonts w:ascii="Arial" w:hAnsi="Arial" w:cs="Arial"/>
+                <w:sz w:val="18"/>
+                <w:szCs w:val="18"/>
+                <w:lang w:val="en-GB"/>
+              </w:rPr>
+            </w:pPr>
+            <w:r>
+              <w:rPr>
+                <w:rFonts w:ascii="Arial" w:hAnsi="Arial" w:cs="Arial"/>
                 <w:b/>
                 <w:bCs/>
                 <w:sz w:val="18"/>
@@ -4122,6 +4138,7 @@
                 <w:szCs w:val="18"/>
                 <w:lang w:val="en-GB"/>
               </w:rPr>
+              <w:lastRenderedPageBreak/>
               <w:t>IV Data Storage, Sharing, and Long-Term Preservation</w:t>
             </w:r>
           </w:p>
@@ -4163,7 +4180,6 @@
                 <w:szCs w:val="18"/>
                 <w:lang w:val="en-GB"/>
               </w:rPr>
-              <w:lastRenderedPageBreak/>
               <w:t>IV.1 Data storage and backup during the research process</w:t>
             </w:r>
           </w:p>
@@ -6791,7 +6807,7 @@
 </file>
 
 <file path=word/endnotes.xml><?xml version="1.0" encoding="utf-8"?>
-<w:endnotes xmlns:wpc="http://schemas.microsoft.com/office/word/2010/wordprocessingCanvas" xmlns:cx="http://schemas.microsoft.com/office/drawing/2014/chartex" xmlns:cx1="http://schemas.microsoft.com/office/drawing/2015/9/8/chartex" xmlns:cx2="http://schemas.microsoft.com/office/drawing/2015/10/21/chartex" xmlns:cx3="http://schemas.microsoft.com/office/drawing/2016/5/9/chartex" xmlns:cx4="http://schemas.microsoft.com/office/drawing/2016/5/10/chartex" xmlns:cx5="http://schemas.microsoft.com/office/drawing/2016/5/11/chartex" xmlns:cx6="http://schemas.microsoft.com/office/drawing/2016/5/12/chartex" xmlns:cx7="http://schemas.microsoft.com/office/drawing/2016/5/13/chartex" xmlns:cx8="http://schemas.microsoft.com/office/drawing/2016/5/14/chartex" xmlns:mc="http://schemas.openxmlformats.org/markup-compatibility/2006" xmlns:aink="http://schemas.microsoft.com/office/drawing/2016/ink" xmlns:am3d="http://schemas.microsoft.com/office/drawing/2017/model3d" xmlns:o="urn:schemas-microsoft-com:office:office" xmlns:oel="http://schemas.microsoft.com/office/2019/extlst" xmlns:r="http://schemas.openxmlformats.org/officeDocument/2006/relationships" xmlns:m="http://schemas.openxmlformats.org/officeDocument/2006/math" xmlns:v="urn:schemas-microsoft-com:vml" xmlns:wp14="http://schemas.microsoft.com/office/word/2010/wordprocessingDrawing" xmlns:wp="http://schemas.openxmlformats.org/drawingml/2006/wordprocessingDrawing" xmlns:w10="urn:schemas-microsoft-com:office:word" xmlns:w="http://schemas.openxmlformats.org/wordprocessingml/2006/main" xmlns:w14="http://schemas.microsoft.com/office/word/2010/wordml" xmlns:w15="http://schemas.microsoft.com/office/word/2012/wordml" xmlns:w16cex="http://schemas.microsoft.com/office/word/2018/wordml/cex" xmlns:w16cid="http://schemas.microsoft.com/office/word/2016/wordml/cid" xmlns:w16="http://schemas.microsoft.com/office/word/2018/wordml" xmlns:w16du="http://schemas.microsoft.com/office/word/2023/wordml/word16du" xmlns:w16sdtdh="http://schemas.microsoft.com/office/word/2020/wordml/sdtdatahash" xmlns:w16se="http://schemas.microsoft.com/office/word/2015/wordml/symex" xmlns:wpg="http://schemas.microsoft.com/office/word/2010/wordprocessingGroup" xmlns:wpi="http://schemas.microsoft.com/office/word/2010/wordprocessingInk" xmlns:wne="http://schemas.microsoft.com/office/word/2006/wordml" xmlns:wps="http://schemas.microsoft.com/office/word/2010/wordprocessingShape" mc:Ignorable="w14 w15 w16se w16cid w16 w16cex w16sdtdh w16du wp14">
+<w:endnotes xmlns:wpc="http://schemas.microsoft.com/office/word/2010/wordprocessingCanvas" xmlns:cx="http://schemas.microsoft.com/office/drawing/2014/chartex" xmlns:cx1="http://schemas.microsoft.com/office/drawing/2015/9/8/chartex" xmlns:cx2="http://schemas.microsoft.com/office/drawing/2015/10/21/chartex" xmlns:cx3="http://schemas.microsoft.com/office/drawing/2016/5/9/chartex" xmlns:cx4="http://schemas.microsoft.com/office/drawing/2016/5/10/chartex" xmlns:cx5="http://schemas.microsoft.com/office/drawing/2016/5/11/chartex" xmlns:cx6="http://schemas.microsoft.com/office/drawing/2016/5/12/chartex" xmlns:cx7="http://schemas.microsoft.com/office/drawing/2016/5/13/chartex" xmlns:cx8="http://schemas.microsoft.com/office/drawing/2016/5/14/chartex" xmlns:mc="http://schemas.openxmlformats.org/markup-compatibility/2006" xmlns:aink="http://schemas.microsoft.com/office/drawing/2016/ink" xmlns:am3d="http://schemas.microsoft.com/office/drawing/2017/model3d" xmlns:o="urn:schemas-microsoft-com:office:office" xmlns:oel="http://schemas.microsoft.com/office/2019/extlst" xmlns:r="http://schemas.openxmlformats.org/officeDocument/2006/relationships" xmlns:m="http://schemas.openxmlformats.org/officeDocument/2006/math" xmlns:v="urn:schemas-microsoft-com:vml" xmlns:wp14="http://schemas.microsoft.com/office/word/2010/wordprocessingDrawing" xmlns:wp="http://schemas.openxmlformats.org/drawingml/2006/wordprocessingDrawing" xmlns:w10="urn:schemas-microsoft-com:office:word" xmlns:w="http://schemas.openxmlformats.org/wordprocessingml/2006/main" xmlns:w14="http://schemas.microsoft.com/office/word/2010/wordml" xmlns:w15="http://schemas.microsoft.com/office/word/2012/wordml" xmlns:w16cex="http://schemas.microsoft.com/office/word/2018/wordml/cex" xmlns:w16cid="http://schemas.microsoft.com/office/word/2016/wordml/cid" xmlns:w16="http://schemas.microsoft.com/office/word/2018/wordml" xmlns:w16du="http://schemas.microsoft.com/office/word/2023/wordml/word16du" xmlns:w16sdtdh="http://schemas.microsoft.com/office/word/2020/wordml/sdtdatahash" xmlns:w16sdtfl="http://schemas.microsoft.com/office/word/2024/wordml/sdtformatlock" xmlns:w16se="http://schemas.microsoft.com/office/word/2015/wordml/symex" xmlns:wpg="http://schemas.microsoft.com/office/word/2010/wordprocessingGroup" xmlns:wpi="http://schemas.microsoft.com/office/word/2010/wordprocessingInk" xmlns:wne="http://schemas.microsoft.com/office/word/2006/wordml" xmlns:wps="http://schemas.microsoft.com/office/word/2010/wordprocessingShape" mc:Ignorable="w14 w15 w16se w16cid w16 w16cex w16sdtdh w16sdtfl w16du wp14">
   <w:endnote w:type="separator" w:id="-1">
     <w:p>
       <w:pPr>
@@ -6816,7 +6832,7 @@
 </file>
 
 <file path=word/footer1.xml><?xml version="1.0" encoding="utf-8"?>
-<w:ftr xmlns:wpc="http://schemas.microsoft.com/office/word/2010/wordprocessingCanvas" xmlns:cx="http://schemas.microsoft.com/office/drawing/2014/chartex" xmlns:cx1="http://schemas.microsoft.com/office/drawing/2015/9/8/chartex" xmlns:cx2="http://schemas.microsoft.com/office/drawing/2015/10/21/chartex" xmlns:cx3="http://schemas.microsoft.com/office/drawing/2016/5/9/chartex" xmlns:cx4="http://schemas.microsoft.com/office/drawing/2016/5/10/chartex" xmlns:cx5="http://schemas.microsoft.com/office/drawing/2016/5/11/chartex" xmlns:cx6="http://schemas.microsoft.com/office/drawing/2016/5/12/chartex" xmlns:cx7="http://schemas.microsoft.com/office/drawing/2016/5/13/chartex" xmlns:cx8="http://schemas.microsoft.com/office/drawing/2016/5/14/chartex" xmlns:mc="http://schemas.openxmlformats.org/markup-compatibility/2006" xmlns:aink="http://schemas.microsoft.com/office/drawing/2016/ink" xmlns:am3d="http://schemas.microsoft.com/office/drawing/2017/model3d" xmlns:o="urn:schemas-microsoft-com:office:office" xmlns:oel="http://schemas.microsoft.com/office/2019/extlst" xmlns:r="http://schemas.openxmlformats.org/officeDocument/2006/relationships" xmlns:m="http://schemas.openxmlformats.org/officeDocument/2006/math" xmlns:v="urn:schemas-microsoft-com:vml" xmlns:wp14="http://schemas.microsoft.com/office/word/2010/wordprocessingDrawing" xmlns:wp="http://schemas.openxmlformats.org/drawingml/2006/wordprocessingDrawing" xmlns:w10="urn:schemas-microsoft-com:office:word" xmlns:w="http://schemas.openxmlformats.org/wordprocessingml/2006/main" xmlns:w14="http://schemas.microsoft.com/office/word/2010/wordml" xmlns:w15="http://schemas.microsoft.com/office/word/2012/wordml" xmlns:w16cex="http://schemas.microsoft.com/office/word/2018/wordml/cex" xmlns:w16cid="http://schemas.microsoft.com/office/word/2016/wordml/cid" xmlns:w16="http://schemas.microsoft.com/office/word/2018/wordml" xmlns:w16du="http://schemas.microsoft.com/office/word/2023/wordml/word16du" xmlns:w16sdtdh="http://schemas.microsoft.com/office/word/2020/wordml/sdtdatahash" xmlns:w16se="http://schemas.microsoft.com/office/word/2015/wordml/symex" xmlns:wpg="http://schemas.microsoft.com/office/word/2010/wordprocessingGroup" xmlns:wpi="http://schemas.microsoft.com/office/word/2010/wordprocessingInk" xmlns:wne="http://schemas.microsoft.com/office/word/2006/wordml" xmlns:wps="http://schemas.microsoft.com/office/word/2010/wordprocessingShape" mc:Ignorable="w14 w15 w16se w16cid w16 w16cex w16sdtdh w16du wp14">
+<w:ftr xmlns:wpc="http://schemas.microsoft.com/office/word/2010/wordprocessingCanvas" xmlns:cx="http://schemas.microsoft.com/office/drawing/2014/chartex" xmlns:cx1="http://schemas.microsoft.com/office/drawing/2015/9/8/chartex" xmlns:cx2="http://schemas.microsoft.com/office/drawing/2015/10/21/chartex" xmlns:cx3="http://schemas.microsoft.com/office/drawing/2016/5/9/chartex" xmlns:cx4="http://schemas.microsoft.com/office/drawing/2016/5/10/chartex" xmlns:cx5="http://schemas.microsoft.com/office/drawing/2016/5/11/chartex" xmlns:cx6="http://schemas.microsoft.com/office/drawing/2016/5/12/chartex" xmlns:cx7="http://schemas.microsoft.com/office/drawing/2016/5/13/chartex" xmlns:cx8="http://schemas.microsoft.com/office/drawing/2016/5/14/chartex" xmlns:mc="http://schemas.openxmlformats.org/markup-compatibility/2006" xmlns:aink="http://schemas.microsoft.com/office/drawing/2016/ink" xmlns:am3d="http://schemas.microsoft.com/office/drawing/2017/model3d" xmlns:o="urn:schemas-microsoft-com:office:office" xmlns:oel="http://schemas.microsoft.com/office/2019/extlst" xmlns:r="http://schemas.openxmlformats.org/officeDocument/2006/relationships" xmlns:m="http://schemas.openxmlformats.org/officeDocument/2006/math" xmlns:v="urn:schemas-microsoft-com:vml" xmlns:wp14="http://schemas.microsoft.com/office/word/2010/wordprocessingDrawing" xmlns:wp="http://schemas.openxmlformats.org/drawingml/2006/wordprocessingDrawing" xmlns:w10="urn:schemas-microsoft-com:office:word" xmlns:w="http://schemas.openxmlformats.org/wordprocessingml/2006/main" xmlns:w14="http://schemas.microsoft.com/office/word/2010/wordml" xmlns:w15="http://schemas.microsoft.com/office/word/2012/wordml" xmlns:w16cex="http://schemas.microsoft.com/office/word/2018/wordml/cex" xmlns:w16cid="http://schemas.microsoft.com/office/word/2016/wordml/cid" xmlns:w16="http://schemas.microsoft.com/office/word/2018/wordml" xmlns:w16du="http://schemas.microsoft.com/office/word/2023/wordml/word16du" xmlns:w16sdtdh="http://schemas.microsoft.com/office/word/2020/wordml/sdtdatahash" xmlns:w16sdtfl="http://schemas.microsoft.com/office/word/2024/wordml/sdtformatlock" xmlns:w16se="http://schemas.microsoft.com/office/word/2015/wordml/symex" xmlns:wpg="http://schemas.microsoft.com/office/word/2010/wordprocessingGroup" xmlns:wpi="http://schemas.microsoft.com/office/word/2010/wordprocessingInk" xmlns:wne="http://schemas.microsoft.com/office/word/2006/wordml" xmlns:wps="http://schemas.microsoft.com/office/word/2010/wordprocessingShape" mc:Ignorable="w14 w15 w16se w16cid w16 w16cex w16sdtdh w16sdtfl w16du wp14">
   <w:p>
     <w:pPr>
       <w:pStyle w:val="Footer"/>
@@ -6838,7 +6854,7 @@
 </file>
 
 <file path=word/footer2.xml><?xml version="1.0" encoding="utf-8"?>
-<w:ftr xmlns:wpc="http://schemas.microsoft.com/office/word/2010/wordprocessingCanvas" xmlns:cx="http://schemas.microsoft.com/office/drawing/2014/chartex" xmlns:cx1="http://schemas.microsoft.com/office/drawing/2015/9/8/chartex" xmlns:cx2="http://schemas.microsoft.com/office/drawing/2015/10/21/chartex" xmlns:cx3="http://schemas.microsoft.com/office/drawing/2016/5/9/chartex" xmlns:cx4="http://schemas.microsoft.com/office/drawing/2016/5/10/chartex" xmlns:cx5="http://schemas.microsoft.com/office/drawing/2016/5/11/chartex" xmlns:cx6="http://schemas.microsoft.com/office/drawing/2016/5/12/chartex" xmlns:cx7="http://schemas.microsoft.com/office/drawing/2016/5/13/chartex" xmlns:cx8="http://schemas.microsoft.com/office/drawing/2016/5/14/chartex" xmlns:mc="http://schemas.openxmlformats.org/markup-compatibility/2006" xmlns:aink="http://schemas.microsoft.com/office/drawing/2016/ink" xmlns:am3d="http://schemas.microsoft.com/office/drawing/2017/model3d" xmlns:o="urn:schemas-microsoft-com:office:office" xmlns:oel="http://schemas.microsoft.com/office/2019/extlst" xmlns:r="http://schemas.openxmlformats.org/officeDocument/2006/relationships" xmlns:m="http://schemas.openxmlformats.org/officeDocument/2006/math" xmlns:v="urn:schemas-microsoft-com:vml" xmlns:wp14="http://schemas.microsoft.com/office/word/2010/wordprocessingDrawing" xmlns:wp="http://schemas.openxmlformats.org/drawingml/2006/wordprocessingDrawing" xmlns:w10="urn:schemas-microsoft-com:office:word" xmlns:w="http://schemas.openxmlformats.org/wordprocessingml/2006/main" xmlns:w14="http://schemas.microsoft.com/office/word/2010/wordml" xmlns:w15="http://schemas.microsoft.com/office/word/2012/wordml" xmlns:w16cex="http://schemas.microsoft.com/office/word/2018/wordml/cex" xmlns:w16cid="http://schemas.microsoft.com/office/word/2016/wordml/cid" xmlns:w16="http://schemas.microsoft.com/office/word/2018/wordml" xmlns:w16du="http://schemas.microsoft.com/office/word/2023/wordml/word16du" xmlns:w16sdtdh="http://schemas.microsoft.com/office/word/2020/wordml/sdtdatahash" xmlns:w16se="http://schemas.microsoft.com/office/word/2015/wordml/symex" xmlns:wpg="http://schemas.microsoft.com/office/word/2010/wordprocessingGroup" xmlns:wpi="http://schemas.microsoft.com/office/word/2010/wordprocessingInk" xmlns:wne="http://schemas.microsoft.com/office/word/2006/wordml" xmlns:wps="http://schemas.microsoft.com/office/word/2010/wordprocessingShape" mc:Ignorable="w14 w15 w16se w16cid w16 w16cex w16sdtdh w16du wp14">
+<w:ftr xmlns:wpc="http://schemas.microsoft.com/office/word/2010/wordprocessingCanvas" xmlns:cx="http://schemas.microsoft.com/office/drawing/2014/chartex" xmlns:cx1="http://schemas.microsoft.com/office/drawing/2015/9/8/chartex" xmlns:cx2="http://schemas.microsoft.com/office/drawing/2015/10/21/chartex" xmlns:cx3="http://schemas.microsoft.com/office/drawing/2016/5/9/chartex" xmlns:cx4="http://schemas.microsoft.com/office/drawing/2016/5/10/chartex" xmlns:cx5="http://schemas.microsoft.com/office/drawing/2016/5/11/chartex" xmlns:cx6="http://schemas.microsoft.com/office/drawing/2016/5/12/chartex" xmlns:cx7="http://schemas.microsoft.com/office/drawing/2016/5/13/chartex" xmlns:cx8="http://schemas.microsoft.com/office/drawing/2016/5/14/chartex" xmlns:mc="http://schemas.openxmlformats.org/markup-compatibility/2006" xmlns:aink="http://schemas.microsoft.com/office/drawing/2016/ink" xmlns:am3d="http://schemas.microsoft.com/office/drawing/2017/model3d" xmlns:o="urn:schemas-microsoft-com:office:office" xmlns:oel="http://schemas.microsoft.com/office/2019/extlst" xmlns:r="http://schemas.openxmlformats.org/officeDocument/2006/relationships" xmlns:m="http://schemas.openxmlformats.org/officeDocument/2006/math" xmlns:v="urn:schemas-microsoft-com:vml" xmlns:wp14="http://schemas.microsoft.com/office/word/2010/wordprocessingDrawing" xmlns:wp="http://schemas.openxmlformats.org/drawingml/2006/wordprocessingDrawing" xmlns:w10="urn:schemas-microsoft-com:office:word" xmlns:w="http://schemas.openxmlformats.org/wordprocessingml/2006/main" xmlns:w14="http://schemas.microsoft.com/office/word/2010/wordml" xmlns:w15="http://schemas.microsoft.com/office/word/2012/wordml" xmlns:w16cex="http://schemas.microsoft.com/office/word/2018/wordml/cex" xmlns:w16cid="http://schemas.microsoft.com/office/word/2016/wordml/cid" xmlns:w16="http://schemas.microsoft.com/office/word/2018/wordml" xmlns:w16du="http://schemas.microsoft.com/office/word/2023/wordml/word16du" xmlns:w16sdtdh="http://schemas.microsoft.com/office/word/2020/wordml/sdtdatahash" xmlns:w16sdtfl="http://schemas.microsoft.com/office/word/2024/wordml/sdtformatlock" xmlns:w16se="http://schemas.microsoft.com/office/word/2015/wordml/symex" xmlns:wpg="http://schemas.microsoft.com/office/word/2010/wordprocessingGroup" xmlns:wpi="http://schemas.microsoft.com/office/word/2010/wordprocessingInk" xmlns:wne="http://schemas.microsoft.com/office/word/2006/wordml" xmlns:wps="http://schemas.microsoft.com/office/word/2010/wordprocessingShape" mc:Ignorable="w14 w15 w16se w16cid w16 w16cex w16sdtdh w16sdtfl w16du wp14">
   <w:sdt>
     <w:sdtPr>
       <w:id w:val="1865711266"/>
@@ -6911,7 +6927,7 @@
                 </wp:inline>
               </w:drawing>
             </mc:Choice>
-            <mc:Fallback xmlns:pic="http://schemas.openxmlformats.org/drawingml/2006/picture" xmlns:wp14="http://schemas.microsoft.com/office/word/2010/wordml" xmlns:a="http://schemas.openxmlformats.org/drawingml/2006/main" xmlns:w16sdtfl="http://schemas.microsoft.com/office/word/2024/wordml/sdtformatlock">
+            <mc:Fallback xmlns:pic="http://schemas.openxmlformats.org/drawingml/2006/picture" xmlns:wp14="http://schemas.microsoft.com/office/word/2010/wordml" xmlns:a="http://schemas.openxmlformats.org/drawingml/2006/main">
               <w:pict w14:anchorId="1521B567">
                 <v:shapetype coordsize="21600,21600" o:spt="75" o:preferrelative="t" path="m@4@5l@4@11@9@11@9@5xe" type="#_x0000_t75">
                   <v:formulas>
@@ -6943,6 +6959,7 @@
           </w:rPr>
           <w:t xml:space="preserve"> </w:t>
         </w:r>
+        <w:proofErr w:type="gramStart"/>
         <w:r>
           <w:rPr>
             <w:rFonts w:ascii="Arial" w:hAnsi="Arial" w:cs="Arial"/>
@@ -6950,7 +6967,17 @@
             <w:szCs w:val="16"/>
             <w:lang w:val="de-AT"/>
           </w:rPr>
-          <w:t>DMP Template (01/2022)</w:t>
+          <w:t>DMP Template</w:t>
+        </w:r>
+        <w:proofErr w:type="gramEnd"/>
+        <w:r>
+          <w:rPr>
+            <w:rFonts w:ascii="Arial" w:hAnsi="Arial" w:cs="Arial"/>
+            <w:sz w:val="16"/>
+            <w:szCs w:val="16"/>
+            <w:lang w:val="de-AT"/>
+          </w:rPr>
+          <w:t xml:space="preserve"> (01/2022)</w:t>
         </w:r>
         <w:r>
           <w:tab/>
@@ -7003,7 +7030,7 @@
 </file>
 
 <file path=word/footnotes.xml><?xml version="1.0" encoding="utf-8"?>
-<w:footnotes xmlns:wpc="http://schemas.microsoft.com/office/word/2010/wordprocessingCanvas" xmlns:cx="http://schemas.microsoft.com/office/drawing/2014/chartex" xmlns:cx1="http://schemas.microsoft.com/office/drawing/2015/9/8/chartex" xmlns:cx2="http://schemas.microsoft.com/office/drawing/2015/10/21/chartex" xmlns:cx3="http://schemas.microsoft.com/office/drawing/2016/5/9/chartex" xmlns:cx4="http://schemas.microsoft.com/office/drawing/2016/5/10/chartex" xmlns:cx5="http://schemas.microsoft.com/office/drawing/2016/5/11/chartex" xmlns:cx6="http://schemas.microsoft.com/office/drawing/2016/5/12/chartex" xmlns:cx7="http://schemas.microsoft.com/office/drawing/2016/5/13/chartex" xmlns:cx8="http://schemas.microsoft.com/office/drawing/2016/5/14/chartex" xmlns:mc="http://schemas.openxmlformats.org/markup-compatibility/2006" xmlns:aink="http://schemas.microsoft.com/office/drawing/2016/ink" xmlns:am3d="http://schemas.microsoft.com/office/drawing/2017/model3d" xmlns:o="urn:schemas-microsoft-com:office:office" xmlns:oel="http://schemas.microsoft.com/office/2019/extlst" xmlns:r="http://schemas.openxmlformats.org/officeDocument/2006/relationships" xmlns:m="http://schemas.openxmlformats.org/officeDocument/2006/math" xmlns:v="urn:schemas-microsoft-com:vml" xmlns:wp14="http://schemas.microsoft.com/office/word/2010/wordprocessingDrawing" xmlns:wp="http://schemas.openxmlformats.org/drawingml/2006/wordprocessingDrawing" xmlns:w10="urn:schemas-microsoft-com:office:word" xmlns:w="http://schemas.openxmlformats.org/wordprocessingml/2006/main" xmlns:w14="http://schemas.microsoft.com/office/word/2010/wordml" xmlns:w15="http://schemas.microsoft.com/office/word/2012/wordml" xmlns:w16cex="http://schemas.microsoft.com/office/word/2018/wordml/cex" xmlns:w16cid="http://schemas.microsoft.com/office/word/2016/wordml/cid" xmlns:w16="http://schemas.microsoft.com/office/word/2018/wordml" xmlns:w16du="http://schemas.microsoft.com/office/word/2023/wordml/word16du" xmlns:w16sdtdh="http://schemas.microsoft.com/office/word/2020/wordml/sdtdatahash" xmlns:w16se="http://schemas.microsoft.com/office/word/2015/wordml/symex" xmlns:wpg="http://schemas.microsoft.com/office/word/2010/wordprocessingGroup" xmlns:wpi="http://schemas.microsoft.com/office/word/2010/wordprocessingInk" xmlns:wne="http://schemas.microsoft.com/office/word/2006/wordml" xmlns:wps="http://schemas.microsoft.com/office/word/2010/wordprocessingShape" mc:Ignorable="w14 w15 w16se w16cid w16 w16cex w16sdtdh w16du wp14">
+<w:footnotes xmlns:wpc="http://schemas.microsoft.com/office/word/2010/wordprocessingCanvas" xmlns:cx="http://schemas.microsoft.com/office/drawing/2014/chartex" xmlns:cx1="http://schemas.microsoft.com/office/drawing/2015/9/8/chartex" xmlns:cx2="http://schemas.microsoft.com/office/drawing/2015/10/21/chartex" xmlns:cx3="http://schemas.microsoft.com/office/drawing/2016/5/9/chartex" xmlns:cx4="http://schemas.microsoft.com/office/drawing/2016/5/10/chartex" xmlns:cx5="http://schemas.microsoft.com/office/drawing/2016/5/11/chartex" xmlns:cx6="http://schemas.microsoft.com/office/drawing/2016/5/12/chartex" xmlns:cx7="http://schemas.microsoft.com/office/drawing/2016/5/13/chartex" xmlns:cx8="http://schemas.microsoft.com/office/drawing/2016/5/14/chartex" xmlns:mc="http://schemas.openxmlformats.org/markup-compatibility/2006" xmlns:aink="http://schemas.microsoft.com/office/drawing/2016/ink" xmlns:am3d="http://schemas.microsoft.com/office/drawing/2017/model3d" xmlns:o="urn:schemas-microsoft-com:office:office" xmlns:oel="http://schemas.microsoft.com/office/2019/extlst" xmlns:r="http://schemas.openxmlformats.org/officeDocument/2006/relationships" xmlns:m="http://schemas.openxmlformats.org/officeDocument/2006/math" xmlns:v="urn:schemas-microsoft-com:vml" xmlns:wp14="http://schemas.microsoft.com/office/word/2010/wordprocessingDrawing" xmlns:wp="http://schemas.openxmlformats.org/drawingml/2006/wordprocessingDrawing" xmlns:w10="urn:schemas-microsoft-com:office:word" xmlns:w="http://schemas.openxmlformats.org/wordprocessingml/2006/main" xmlns:w14="http://schemas.microsoft.com/office/word/2010/wordml" xmlns:w15="http://schemas.microsoft.com/office/word/2012/wordml" xmlns:w16cex="http://schemas.microsoft.com/office/word/2018/wordml/cex" xmlns:w16cid="http://schemas.microsoft.com/office/word/2016/wordml/cid" xmlns:w16="http://schemas.microsoft.com/office/word/2018/wordml" xmlns:w16du="http://schemas.microsoft.com/office/word/2023/wordml/word16du" xmlns:w16sdtdh="http://schemas.microsoft.com/office/word/2020/wordml/sdtdatahash" xmlns:w16sdtfl="http://schemas.microsoft.com/office/word/2024/wordml/sdtformatlock" xmlns:w16se="http://schemas.microsoft.com/office/word/2015/wordml/symex" xmlns:wpg="http://schemas.microsoft.com/office/word/2010/wordprocessingGroup" xmlns:wpi="http://schemas.microsoft.com/office/word/2010/wordprocessingInk" xmlns:wne="http://schemas.microsoft.com/office/word/2006/wordml" xmlns:wps="http://schemas.microsoft.com/office/word/2010/wordprocessingShape" mc:Ignorable="w14 w15 w16se w16cid w16 w16cex w16sdtdh w16sdtfl w16du wp14">
   <w:footnote w:type="separator" w:id="-1">
     <w:p>
       <w:pPr>
@@ -7028,7 +7055,7 @@
 </file>
 
 <file path=word/numbering.xml><?xml version="1.0" encoding="utf-8"?>
-<w:numbering xmlns:wpc="http://schemas.microsoft.com/office/word/2010/wordprocessingCanvas" xmlns:cx="http://schemas.microsoft.com/office/drawing/2014/chartex" xmlns:cx1="http://schemas.microsoft.com/office/drawing/2015/9/8/chartex" xmlns:cx2="http://schemas.microsoft.com/office/drawing/2015/10/21/chartex" xmlns:cx3="http://schemas.microsoft.com/office/drawing/2016/5/9/chartex" xmlns:cx4="http://schemas.microsoft.com/office/drawing/2016/5/10/chartex" xmlns:cx5="http://schemas.microsoft.com/office/drawing/2016/5/11/chartex" xmlns:cx6="http://schemas.microsoft.com/office/drawing/2016/5/12/chartex" xmlns:cx7="http://schemas.microsoft.com/office/drawing/2016/5/13/chartex" xmlns:cx8="http://schemas.microsoft.com/office/drawing/2016/5/14/chartex" xmlns:mc="http://schemas.openxmlformats.org/markup-compatibility/2006" xmlns:aink="http://schemas.microsoft.com/office/drawing/2016/ink" xmlns:am3d="http://schemas.microsoft.com/office/drawing/2017/model3d" xmlns:o="urn:schemas-microsoft-com:office:office" xmlns:oel="http://schemas.microsoft.com/office/2019/extlst" xmlns:r="http://schemas.openxmlformats.org/officeDocument/2006/relationships" xmlns:m="http://schemas.openxmlformats.org/officeDocument/2006/math" xmlns:v="urn:schemas-microsoft-com:vml" xmlns:wp14="http://schemas.microsoft.com/office/word/2010/wordprocessingDrawing" xmlns:wp="http://schemas.openxmlformats.org/drawingml/2006/wordprocessingDrawing" xmlns:w10="urn:schemas-microsoft-com:office:word" xmlns:w="http://schemas.openxmlformats.org/wordprocessingml/2006/main" xmlns:w14="http://schemas.microsoft.com/office/word/2010/wordml" xmlns:w15="http://schemas.microsoft.com/office/word/2012/wordml" xmlns:w16cex="http://schemas.microsoft.com/office/word/2018/wordml/cex" xmlns:w16cid="http://schemas.microsoft.com/office/word/2016/wordml/cid" xmlns:w16="http://schemas.microsoft.com/office/word/2018/wordml" xmlns:w16du="http://schemas.microsoft.com/office/word/2023/wordml/word16du" xmlns:w16sdtdh="http://schemas.microsoft.com/office/word/2020/wordml/sdtdatahash" xmlns:w16se="http://schemas.microsoft.com/office/word/2015/wordml/symex" xmlns:wpg="http://schemas.microsoft.com/office/word/2010/wordprocessingGroup" xmlns:wpi="http://schemas.microsoft.com/office/word/2010/wordprocessingInk" xmlns:wne="http://schemas.microsoft.com/office/word/2006/wordml" xmlns:wps="http://schemas.microsoft.com/office/word/2010/wordprocessingShape" mc:Ignorable="w14 w15 w16se w16cid w16 w16cex w16sdtdh w16du wp14">
+<w:numbering xmlns:wpc="http://schemas.microsoft.com/office/word/2010/wordprocessingCanvas" xmlns:cx="http://schemas.microsoft.com/office/drawing/2014/chartex" xmlns:cx1="http://schemas.microsoft.com/office/drawing/2015/9/8/chartex" xmlns:cx2="http://schemas.microsoft.com/office/drawing/2015/10/21/chartex" xmlns:cx3="http://schemas.microsoft.com/office/drawing/2016/5/9/chartex" xmlns:cx4="http://schemas.microsoft.com/office/drawing/2016/5/10/chartex" xmlns:cx5="http://schemas.microsoft.com/office/drawing/2016/5/11/chartex" xmlns:cx6="http://schemas.microsoft.com/office/drawing/2016/5/12/chartex" xmlns:cx7="http://schemas.microsoft.com/office/drawing/2016/5/13/chartex" xmlns:cx8="http://schemas.microsoft.com/office/drawing/2016/5/14/chartex" xmlns:mc="http://schemas.openxmlformats.org/markup-compatibility/2006" xmlns:aink="http://schemas.microsoft.com/office/drawing/2016/ink" xmlns:am3d="http://schemas.microsoft.com/office/drawing/2017/model3d" xmlns:o="urn:schemas-microsoft-com:office:office" xmlns:oel="http://schemas.microsoft.com/office/2019/extlst" xmlns:r="http://schemas.openxmlformats.org/officeDocument/2006/relationships" xmlns:m="http://schemas.openxmlformats.org/officeDocument/2006/math" xmlns:v="urn:schemas-microsoft-com:vml" xmlns:wp14="http://schemas.microsoft.com/office/word/2010/wordprocessingDrawing" xmlns:wp="http://schemas.openxmlformats.org/drawingml/2006/wordprocessingDrawing" xmlns:w10="urn:schemas-microsoft-com:office:word" xmlns:w="http://schemas.openxmlformats.org/wordprocessingml/2006/main" xmlns:w14="http://schemas.microsoft.com/office/word/2010/wordml" xmlns:w15="http://schemas.microsoft.com/office/word/2012/wordml" xmlns:w16cex="http://schemas.microsoft.com/office/word/2018/wordml/cex" xmlns:w16cid="http://schemas.microsoft.com/office/word/2016/wordml/cid" xmlns:w16="http://schemas.microsoft.com/office/word/2018/wordml" xmlns:w16du="http://schemas.microsoft.com/office/word/2023/wordml/word16du" xmlns:w16sdtdh="http://schemas.microsoft.com/office/word/2020/wordml/sdtdatahash" xmlns:w16sdtfl="http://schemas.microsoft.com/office/word/2024/wordml/sdtformatlock" xmlns:w16se="http://schemas.microsoft.com/office/word/2015/wordml/symex" xmlns:wpg="http://schemas.microsoft.com/office/word/2010/wordprocessingGroup" xmlns:wpi="http://schemas.microsoft.com/office/word/2010/wordprocessingInk" xmlns:wne="http://schemas.microsoft.com/office/word/2006/wordml" xmlns:wps="http://schemas.microsoft.com/office/word/2010/wordprocessingShape" mc:Ignorable="w14 w15 w16se w16cid w16 w16cex w16sdtdh w16sdtfl w16du wp14">
   <w:abstractNum w:abstractNumId="0" w15:restartNumberingAfterBreak="0">
     <w:nsid w:val="02081313"/>
     <w:multiLevelType w:val="hybridMultilevel"/>
@@ -9577,7 +9604,7 @@
 </file>
 
 <file path=word/styles.xml><?xml version="1.0" encoding="utf-8"?>
-<w:styles xmlns:mc="http://schemas.openxmlformats.org/markup-compatibility/2006" xmlns:r="http://schemas.openxmlformats.org/officeDocument/2006/relationships" xmlns:w="http://schemas.openxmlformats.org/wordprocessingml/2006/main" xmlns:w14="http://schemas.microsoft.com/office/word/2010/wordml" xmlns:w15="http://schemas.microsoft.com/office/word/2012/wordml" xmlns:w16cex="http://schemas.microsoft.com/office/word/2018/wordml/cex" xmlns:w16cid="http://schemas.microsoft.com/office/word/2016/wordml/cid" xmlns:w16="http://schemas.microsoft.com/office/word/2018/wordml" xmlns:w16du="http://schemas.microsoft.com/office/word/2023/wordml/word16du" xmlns:w16sdtdh="http://schemas.microsoft.com/office/word/2020/wordml/sdtdatahash" xmlns:w16se="http://schemas.microsoft.com/office/word/2015/wordml/symex" mc:Ignorable="w14 w15 w16se w16cid w16 w16cex w16sdtdh w16du">
+<w:styles xmlns:mc="http://schemas.openxmlformats.org/markup-compatibility/2006" xmlns:r="http://schemas.openxmlformats.org/officeDocument/2006/relationships" xmlns:w="http://schemas.openxmlformats.org/wordprocessingml/2006/main" xmlns:w14="http://schemas.microsoft.com/office/word/2010/wordml" xmlns:w15="http://schemas.microsoft.com/office/word/2012/wordml" xmlns:w16cex="http://schemas.microsoft.com/office/word/2018/wordml/cex" xmlns:w16cid="http://schemas.microsoft.com/office/word/2016/wordml/cid" xmlns:w16="http://schemas.microsoft.com/office/word/2018/wordml" xmlns:w16du="http://schemas.microsoft.com/office/word/2023/wordml/word16du" xmlns:w16sdtdh="http://schemas.microsoft.com/office/word/2020/wordml/sdtdatahash" xmlns:w16sdtfl="http://schemas.microsoft.com/office/word/2024/wordml/sdtformatlock" xmlns:w16se="http://schemas.microsoft.com/office/word/2015/wordml/symex" mc:Ignorable="w14 w15 w16se w16cid w16 w16cex w16sdtdh w16sdtfl w16du">
   <w:docDefaults>
     <w:rPrDefault>
       <w:rPr>

</xml_diff>

<commit_message>
Template: Fix dataset tables in templates
</commit_message>
<xml_diff>
--- a/src/main/resources/org/damap/base/template/FWFTemplate.docx
+++ b/src/main/resources/org/damap/base/template/FWFTemplate.docx
@@ -1188,7 +1188,7 @@
                 <w:color w:val="92D050"/>
                 <w:sz w:val="18"/>
                 <w:szCs w:val="18"/>
-                <w:lang w:val="en-US"/>
+                <w:lang w:val="de-AT"/>
               </w:rPr>
             </w:pPr>
             <w:r>
@@ -1199,9 +1199,35 @@
                 <w:iCs/>
                 <w:sz w:val="18"/>
                 <w:szCs w:val="18"/>
-                <w:lang w:val="en-US"/>
-              </w:rPr>
-              <w:t>DMP version:</w:t>
+                <w:lang w:val="de-AT"/>
+              </w:rPr>
+              <w:t xml:space="preserve">DMP </w:t>
+            </w:r>
+            <w:proofErr w:type="spellStart"/>
+            <w:r>
+              <w:rPr>
+                <w:rFonts w:ascii="Arial" w:hAnsi="Arial" w:cs="Arial"/>
+                <w:b/>
+                <w:bCs/>
+                <w:iCs/>
+                <w:sz w:val="18"/>
+                <w:szCs w:val="18"/>
+                <w:lang w:val="de-AT"/>
+              </w:rPr>
+              <w:t>version</w:t>
+            </w:r>
+            <w:proofErr w:type="spellEnd"/>
+            <w:r>
+              <w:rPr>
+                <w:rFonts w:ascii="Arial" w:hAnsi="Arial" w:cs="Arial"/>
+                <w:b/>
+                <w:bCs/>
+                <w:iCs/>
+                <w:sz w:val="18"/>
+                <w:szCs w:val="18"/>
+                <w:lang w:val="de-AT"/>
+              </w:rPr>
+              <w:t>:</w:t>
             </w:r>
             <w:r>
               <w:rPr>
@@ -1209,7 +1235,7 @@
                 <w:iCs/>
                 <w:sz w:val="18"/>
                 <w:szCs w:val="18"/>
-                <w:lang w:val="en-US"/>
+                <w:lang w:val="de-AT"/>
               </w:rPr>
               <w:t xml:space="preserve"> </w:t>
             </w:r>
@@ -1220,7 +1246,7 @@
                 <w:color w:val="92D050"/>
                 <w:sz w:val="18"/>
                 <w:szCs w:val="18"/>
-                <w:lang w:val="en-US"/>
+                <w:lang w:val="de-AT"/>
               </w:rPr>
               <w:t>[Nr.], [</w:t>
             </w:r>
@@ -1233,7 +1259,7 @@
                 <w:color w:val="92D050"/>
                 <w:sz w:val="18"/>
                 <w:szCs w:val="18"/>
-                <w:lang w:val="en-US"/>
+                <w:lang w:val="de-AT"/>
               </w:rPr>
               <w:t>dd.mm.yyyy</w:t>
             </w:r>
@@ -1246,7 +1272,7 @@
                 <w:color w:val="92D050"/>
                 <w:sz w:val="18"/>
                 <w:szCs w:val="18"/>
-                <w:lang w:val="en-US"/>
+                <w:lang w:val="de-AT"/>
               </w:rPr>
               <w:t>]</w:t>
             </w:r>
@@ -2428,13 +2454,13 @@
               <w:tblLook w:val="04A0" w:firstRow="1" w:lastRow="0" w:firstColumn="1" w:lastColumn="0" w:noHBand="0" w:noVBand="1"/>
             </w:tblPr>
             <w:tblGrid>
-              <w:gridCol w:w="808"/>
-              <w:gridCol w:w="2401"/>
+              <w:gridCol w:w="944"/>
+              <w:gridCol w:w="2283"/>
               <w:gridCol w:w="1347"/>
               <w:gridCol w:w="1517"/>
-              <w:gridCol w:w="1576"/>
+              <w:gridCol w:w="1572"/>
               <w:gridCol w:w="1707"/>
-              <w:gridCol w:w="3070"/>
+              <w:gridCol w:w="3056"/>
             </w:tblGrid>
             <w:tr>
               <w:trPr>
@@ -2443,7 +2469,7 @@
               </w:trPr>
               <w:tc>
                 <w:tcPr>
-                  <w:tcW w:w="808" w:type="dxa"/>
+                  <w:tcW w:w="944" w:type="dxa"/>
                   <w:tcBorders>
                     <w:bottom w:val="single" w:sz="12" w:space="0" w:color="006AAB"/>
                   </w:tcBorders>
@@ -2451,7 +2477,7 @@
                 </w:tcPr>
                 <w:p>
                   <w:pPr>
-                    <w:jc w:val="left"/>
+                    <w:jc w:val="center"/>
                     <w:rPr>
                       <w:rFonts w:cs="Arial"/>
                       <w:b/>
@@ -2471,13 +2497,22 @@
                       <w:szCs w:val="18"/>
                     </w:rPr>
                     <w:lastRenderedPageBreak/>
-                    <w:t>D</w:t>
+                    <w:t>d</w:t>
+                  </w:r>
+                  <w:r>
+                    <w:rPr>
+                      <w:rFonts w:cs="Arial"/>
+                      <w:color w:val="006AAB"/>
+                      <w:sz w:val="18"/>
+                      <w:szCs w:val="18"/>
+                    </w:rPr>
+                    <w:t>ataset ID</w:t>
                   </w:r>
                 </w:p>
               </w:tc>
               <w:tc>
                 <w:tcPr>
-                  <w:tcW w:w="2401" w:type="dxa"/>
+                  <w:tcW w:w="2283" w:type="dxa"/>
                   <w:tcBorders>
                     <w:bottom w:val="single" w:sz="12" w:space="0" w:color="006AAB"/>
                   </w:tcBorders>
@@ -2570,7 +2605,7 @@
               </w:tc>
               <w:tc>
                 <w:tcPr>
-                  <w:tcW w:w="1576" w:type="dxa"/>
+                  <w:tcW w:w="1572" w:type="dxa"/>
                   <w:tcBorders>
                     <w:bottom w:val="single" w:sz="12" w:space="0" w:color="006AAB"/>
                   </w:tcBorders>
@@ -2632,7 +2667,7 @@
               </w:tc>
               <w:tc>
                 <w:tcPr>
-                  <w:tcW w:w="3070" w:type="dxa"/>
+                  <w:tcW w:w="3056" w:type="dxa"/>
                   <w:tcBorders>
                     <w:bottom w:val="single" w:sz="12" w:space="0" w:color="006AAB"/>
                   </w:tcBorders>
@@ -2663,7 +2698,7 @@
             <w:tr>
               <w:tc>
                 <w:tcPr>
-                  <w:tcW w:w="808" w:type="dxa"/>
+                  <w:tcW w:w="944" w:type="dxa"/>
                   <w:tcBorders>
                     <w:top w:val="single" w:sz="12" w:space="0" w:color="006AAB"/>
                   </w:tcBorders>
@@ -2690,7 +2725,7 @@
               </w:tc>
               <w:tc>
                 <w:tcPr>
-                  <w:tcW w:w="2401" w:type="dxa"/>
+                  <w:tcW w:w="2283" w:type="dxa"/>
                   <w:tcBorders>
                     <w:top w:val="single" w:sz="12" w:space="0" w:color="006AAB"/>
                   </w:tcBorders>
@@ -2784,7 +2819,7 @@
               </w:tc>
               <w:tc>
                 <w:tcPr>
-                  <w:tcW w:w="1576" w:type="dxa"/>
+                  <w:tcW w:w="1572" w:type="dxa"/>
                   <w:tcBorders>
                     <w:top w:val="single" w:sz="12" w:space="0" w:color="006AAB"/>
                   </w:tcBorders>
@@ -2836,7 +2871,7 @@
               </w:tc>
               <w:tc>
                 <w:tcPr>
-                  <w:tcW w:w="3070" w:type="dxa"/>
+                  <w:tcW w:w="3056" w:type="dxa"/>
                   <w:tcBorders>
                     <w:top w:val="single" w:sz="12" w:space="0" w:color="006AAB"/>
                   </w:tcBorders>
@@ -2862,7 +2897,7 @@
             <w:tr>
               <w:tc>
                 <w:tcPr>
-                  <w:tcW w:w="808" w:type="dxa"/>
+                  <w:tcW w:w="944" w:type="dxa"/>
                 </w:tcPr>
                 <w:p>
                   <w:pPr>
@@ -2886,7 +2921,7 @@
               </w:tc>
               <w:tc>
                 <w:tcPr>
-                  <w:tcW w:w="2401" w:type="dxa"/>
+                  <w:tcW w:w="2283" w:type="dxa"/>
                 </w:tcPr>
                 <w:p>
                   <w:pPr>
@@ -2955,7 +2990,7 @@
               </w:tc>
               <w:tc>
                 <w:tcPr>
-                  <w:tcW w:w="1576" w:type="dxa"/>
+                  <w:tcW w:w="1572" w:type="dxa"/>
                 </w:tcPr>
                 <w:p>
                   <w:pPr>
@@ -3002,7 +3037,7 @@
               </w:tc>
               <w:tc>
                 <w:tcPr>
-                  <w:tcW w:w="3070" w:type="dxa"/>
+                  <w:tcW w:w="3056" w:type="dxa"/>
                 </w:tcPr>
                 <w:p>
                   <w:pPr>
@@ -3114,8 +3149,8 @@
               <w:tblLook w:val="04A0" w:firstRow="1" w:lastRow="0" w:firstColumn="1" w:lastColumn="0" w:noHBand="0" w:noVBand="1"/>
             </w:tblPr>
             <w:tblGrid>
-              <w:gridCol w:w="807"/>
-              <w:gridCol w:w="2405"/>
+              <w:gridCol w:w="944"/>
+              <w:gridCol w:w="2268"/>
               <w:gridCol w:w="2835"/>
               <w:gridCol w:w="1559"/>
               <w:gridCol w:w="1843"/>
@@ -3127,7 +3162,7 @@
               </w:trPr>
               <w:tc>
                 <w:tcPr>
-                  <w:tcW w:w="807" w:type="dxa"/>
+                  <w:tcW w:w="944" w:type="dxa"/>
                   <w:tcBorders>
                     <w:bottom w:val="single" w:sz="12" w:space="0" w:color="006AAB"/>
                   </w:tcBorders>
@@ -3158,7 +3193,7 @@
               </w:tc>
               <w:tc>
                 <w:tcPr>
-                  <w:tcW w:w="2405" w:type="dxa"/>
+                  <w:tcW w:w="2268" w:type="dxa"/>
                   <w:tcBorders>
                     <w:bottom w:val="single" w:sz="12" w:space="0" w:color="006AAB"/>
                   </w:tcBorders>
@@ -3311,7 +3346,7 @@
               </w:trPr>
               <w:tc>
                 <w:tcPr>
-                  <w:tcW w:w="807" w:type="dxa"/>
+                  <w:tcW w:w="944" w:type="dxa"/>
                   <w:tcBorders>
                     <w:top w:val="single" w:sz="12" w:space="0" w:color="006AAB"/>
                     <w:bottom w:val="single" w:sz="12" w:space="0" w:color="BFBFBF" w:themeColor="background1" w:themeShade="BF"/>
@@ -3339,7 +3374,7 @@
               </w:tc>
               <w:tc>
                 <w:tcPr>
-                  <w:tcW w:w="2405" w:type="dxa"/>
+                  <w:tcW w:w="2268" w:type="dxa"/>
                   <w:tcBorders>
                     <w:top w:val="single" w:sz="12" w:space="0" w:color="006AAB"/>
                     <w:bottom w:val="single" w:sz="12" w:space="0" w:color="BFBFBF" w:themeColor="background1" w:themeShade="BF"/>
@@ -3490,7 +3525,7 @@
               </w:trPr>
               <w:tc>
                 <w:tcPr>
-                  <w:tcW w:w="807" w:type="dxa"/>
+                  <w:tcW w:w="944" w:type="dxa"/>
                   <w:tcBorders>
                     <w:top w:val="single" w:sz="12" w:space="0" w:color="BFBFBF" w:themeColor="background1" w:themeShade="BF"/>
                     <w:bottom w:val="single" w:sz="12" w:space="0" w:color="BFBFBF" w:themeColor="background1" w:themeShade="BF"/>
@@ -3515,7 +3550,7 @@
               </w:tc>
               <w:tc>
                 <w:tcPr>
-                  <w:tcW w:w="2405" w:type="dxa"/>
+                  <w:tcW w:w="2268" w:type="dxa"/>
                   <w:tcBorders>
                     <w:top w:val="single" w:sz="12" w:space="0" w:color="BFBFBF" w:themeColor="background1" w:themeShade="BF"/>
                     <w:bottom w:val="single" w:sz="12" w:space="0" w:color="BFBFBF" w:themeColor="background1" w:themeShade="BF"/>

</xml_diff>

<commit_message>
Template: Add cover pages to templates
</commit_message>
<xml_diff>
--- a/src/main/resources/org/damap/base/template/FWFTemplate.docx
+++ b/src/main/resources/org/damap/base/template/FWFTemplate.docx
@@ -2,6 +2,405 @@
 <file path=word/document.xml><?xml version="1.0" encoding="utf-8"?>
 <w:document xmlns:wpc="http://schemas.microsoft.com/office/word/2010/wordprocessingCanvas" xmlns:cx="http://schemas.microsoft.com/office/drawing/2014/chartex" xmlns:cx1="http://schemas.microsoft.com/office/drawing/2015/9/8/chartex" xmlns:cx2="http://schemas.microsoft.com/office/drawing/2015/10/21/chartex" xmlns:cx3="http://schemas.microsoft.com/office/drawing/2016/5/9/chartex" xmlns:cx4="http://schemas.microsoft.com/office/drawing/2016/5/10/chartex" xmlns:cx5="http://schemas.microsoft.com/office/drawing/2016/5/11/chartex" xmlns:cx6="http://schemas.microsoft.com/office/drawing/2016/5/12/chartex" xmlns:cx7="http://schemas.microsoft.com/office/drawing/2016/5/13/chartex" xmlns:cx8="http://schemas.microsoft.com/office/drawing/2016/5/14/chartex" xmlns:mc="http://schemas.openxmlformats.org/markup-compatibility/2006" xmlns:aink="http://schemas.microsoft.com/office/drawing/2016/ink" xmlns:am3d="http://schemas.microsoft.com/office/drawing/2017/model3d" xmlns:o="urn:schemas-microsoft-com:office:office" xmlns:oel="http://schemas.microsoft.com/office/2019/extlst" xmlns:r="http://schemas.openxmlformats.org/officeDocument/2006/relationships" xmlns:m="http://schemas.openxmlformats.org/officeDocument/2006/math" xmlns:v="urn:schemas-microsoft-com:vml" xmlns:wp14="http://schemas.microsoft.com/office/word/2010/wordprocessingDrawing" xmlns:wp="http://schemas.openxmlformats.org/drawingml/2006/wordprocessingDrawing" xmlns:w10="urn:schemas-microsoft-com:office:word" xmlns:w="http://schemas.openxmlformats.org/wordprocessingml/2006/main" xmlns:w14="http://schemas.microsoft.com/office/word/2010/wordml" xmlns:w15="http://schemas.microsoft.com/office/word/2012/wordml" xmlns:w16cex="http://schemas.microsoft.com/office/word/2018/wordml/cex" xmlns:w16cid="http://schemas.microsoft.com/office/word/2016/wordml/cid" xmlns:w16="http://schemas.microsoft.com/office/word/2018/wordml" xmlns:w16du="http://schemas.microsoft.com/office/word/2023/wordml/word16du" xmlns:w16sdtdh="http://schemas.microsoft.com/office/word/2020/wordml/sdtdatahash" xmlns:w16sdtfl="http://schemas.microsoft.com/office/word/2024/wordml/sdtformatlock" xmlns:w16se="http://schemas.microsoft.com/office/word/2015/wordml/symex" xmlns:wpg="http://schemas.microsoft.com/office/word/2010/wordprocessingGroup" xmlns:wpi="http://schemas.microsoft.com/office/word/2010/wordprocessingInk" xmlns:wne="http://schemas.microsoft.com/office/word/2006/wordml" xmlns:wps="http://schemas.microsoft.com/office/word/2010/wordprocessingShape" mc:Ignorable="w14 w15 w16se w16cid w16 w16cex w16sdtdh w16sdtfl w16du wp14">
   <w:body>
+    <w:p>
+      <w:pPr>
+        <w:pStyle w:val="Heading2"/>
+        <w:rPr>
+          <w:lang w:val="en-US"/>
+        </w:rPr>
+      </w:pPr>
+    </w:p>
+    <w:p>
+      <w:pPr>
+        <w:pStyle w:val="Heading1"/>
+        <w:rPr>
+          <w:lang w:val="en-US"/>
+        </w:rPr>
+      </w:pPr>
+    </w:p>
+    <w:p>
+      <w:pPr>
+        <w:pStyle w:val="Heading1"/>
+        <w:rPr>
+          <w:lang w:val="en-US"/>
+        </w:rPr>
+      </w:pPr>
+      <w:r>
+        <w:rPr>
+          <w:lang w:val="en-US"/>
+        </w:rPr>
+        <w:t>You are almost there!</w:t>
+      </w:r>
+    </w:p>
+    <w:p>
+      <w:pPr>
+        <w:pBdr>
+          <w:top w:val="single" w:sz="4" w:space="1" w:color="auto"/>
+          <w:left w:val="single" w:sz="4" w:space="4" w:color="auto"/>
+          <w:bottom w:val="single" w:sz="4" w:space="1" w:color="auto"/>
+          <w:right w:val="single" w:sz="4" w:space="4" w:color="auto"/>
+        </w:pBdr>
+        <w:rPr>
+          <w:lang w:val="en-GB"/>
+        </w:rPr>
+      </w:pPr>
+      <w:r>
+        <w:rPr>
+          <w:lang w:val="en-GB"/>
+        </w:rPr>
+        <w:t>Here are some suggestions for you to finalise the DMP.</w:t>
+      </w:r>
+    </w:p>
+    <w:p>
+      <w:pPr>
+        <w:pBdr>
+          <w:top w:val="single" w:sz="4" w:space="1" w:color="auto"/>
+          <w:left w:val="single" w:sz="4" w:space="4" w:color="auto"/>
+          <w:bottom w:val="single" w:sz="4" w:space="1" w:color="auto"/>
+          <w:right w:val="single" w:sz="4" w:space="4" w:color="auto"/>
+        </w:pBdr>
+        <w:tabs>
+          <w:tab w:val="left" w:pos="1418"/>
+        </w:tabs>
+        <w:ind w:left="1418" w:hanging="1418"/>
+        <w:rPr>
+          <w:rFonts w:cstheme="minorHAnsi"/>
+          <w:lang w:val="en-GB"/>
+        </w:rPr>
+      </w:pPr>
+      <w:r>
+        <w:rPr>
+          <w:rFonts w:cstheme="minorHAnsi"/>
+          <w:b/>
+          <w:bCs/>
+          <w:lang w:val="en-GB"/>
+        </w:rPr>
+        <w:t>Check</w:t>
+      </w:r>
+      <w:r>
+        <w:rPr>
+          <w:rFonts w:cstheme="minorHAnsi"/>
+          <w:lang w:val="en-GB"/>
+        </w:rPr>
+        <w:t>:</w:t>
+      </w:r>
+      <w:r>
+        <w:rPr>
+          <w:rFonts w:cstheme="minorHAnsi"/>
+          <w:lang w:val="en-GB"/>
+        </w:rPr>
+        <w:tab/>
+        <w:t xml:space="preserve">Read everything carefully and adjust automatically generated text if necessary. </w:t>
+      </w:r>
+    </w:p>
+    <w:p>
+      <w:pPr>
+        <w:pBdr>
+          <w:top w:val="single" w:sz="4" w:space="1" w:color="auto"/>
+          <w:left w:val="single" w:sz="4" w:space="4" w:color="auto"/>
+          <w:bottom w:val="single" w:sz="4" w:space="1" w:color="auto"/>
+          <w:right w:val="single" w:sz="4" w:space="4" w:color="auto"/>
+        </w:pBdr>
+        <w:tabs>
+          <w:tab w:val="left" w:pos="1418"/>
+        </w:tabs>
+        <w:ind w:left="1418" w:hanging="1418"/>
+        <w:rPr>
+          <w:rFonts w:cstheme="minorHAnsi"/>
+          <w:lang w:val="en-GB"/>
+        </w:rPr>
+      </w:pPr>
+      <w:r>
+        <w:rPr>
+          <w:rFonts w:cstheme="minorHAnsi"/>
+          <w:b/>
+          <w:bCs/>
+          <w:lang w:val="en-GB"/>
+        </w:rPr>
+        <w:t>Replace</w:t>
+      </w:r>
+      <w:r>
+        <w:rPr>
+          <w:rFonts w:cstheme="minorHAnsi"/>
+          <w:lang w:val="en-GB"/>
+        </w:rPr>
+        <w:t>:</w:t>
+      </w:r>
+      <w:r>
+        <w:rPr>
+          <w:rFonts w:cstheme="minorHAnsi"/>
+          <w:lang w:val="en-GB"/>
+        </w:rPr>
+        <w:tab/>
+        <w:t xml:space="preserve">Content </w:t>
+      </w:r>
+      <w:r>
+        <w:rPr>
+          <w:rFonts w:cstheme="minorHAnsi"/>
+          <w:color w:val="00B050"/>
+          <w:lang w:val="en-GB"/>
+        </w:rPr>
+        <w:t xml:space="preserve">in green font </w:t>
+      </w:r>
+      <w:r>
+        <w:rPr>
+          <w:rFonts w:cstheme="minorHAnsi"/>
+          <w:lang w:val="en-GB"/>
+        </w:rPr>
+        <w:t>and in […] needs extra attention. Check and add missing information. Delete the square brackets and change the font colour to black. E</w:t>
+      </w:r>
+      <w:r>
+        <w:rPr>
+          <w:rFonts w:cstheme="minorHAnsi"/>
+          <w:lang w:val="en-GB"/>
+        </w:rPr>
+        <w:t>XAMPLE 1</w:t>
+      </w:r>
+      <w:r>
+        <w:rPr>
+          <w:rFonts w:cstheme="minorHAnsi"/>
+          <w:lang w:val="en-GB"/>
+        </w:rPr>
+        <w:t>: DMP version number and date on the cover page and in section I.1.</w:t>
+      </w:r>
+      <w:r>
+        <w:rPr>
+          <w:rFonts w:cstheme="minorHAnsi"/>
+          <w:lang w:val="en-GB"/>
+        </w:rPr>
+        <w:t xml:space="preserve"> EXAMPLE 2: README file level in </w:t>
+      </w:r>
+      <w:r>
+        <w:rPr>
+          <w:rFonts w:cstheme="minorHAnsi"/>
+          <w:lang w:val="en-GB"/>
+        </w:rPr>
+        <w:t>section III.</w:t>
+      </w:r>
+      <w:r>
+        <w:rPr>
+          <w:rFonts w:cstheme="minorHAnsi"/>
+          <w:lang w:val="en-GB"/>
+        </w:rPr>
+        <w:t>1 - choose one and delete the other options.</w:t>
+      </w:r>
+    </w:p>
+    <w:p>
+      <w:pPr>
+        <w:pBdr>
+          <w:top w:val="single" w:sz="4" w:space="1" w:color="auto"/>
+          <w:left w:val="single" w:sz="4" w:space="4" w:color="auto"/>
+          <w:bottom w:val="single" w:sz="4" w:space="1" w:color="auto"/>
+          <w:right w:val="single" w:sz="4" w:space="4" w:color="auto"/>
+        </w:pBdr>
+        <w:tabs>
+          <w:tab w:val="left" w:pos="1418"/>
+        </w:tabs>
+        <w:ind w:left="1418" w:hanging="1418"/>
+        <w:rPr>
+          <w:rFonts w:cstheme="minorHAnsi"/>
+          <w:lang w:val="en-GB"/>
+        </w:rPr>
+      </w:pPr>
+      <w:r>
+        <w:rPr>
+          <w:rFonts w:cstheme="minorHAnsi"/>
+          <w:b/>
+          <w:bCs/>
+          <w:lang w:val="en-GB"/>
+        </w:rPr>
+        <w:t>Fill gaps</w:t>
+      </w:r>
+      <w:r>
+        <w:rPr>
+          <w:rFonts w:cstheme="minorHAnsi"/>
+          <w:lang w:val="en-GB"/>
+        </w:rPr>
+        <w:t>:</w:t>
+      </w:r>
+      <w:r>
+        <w:rPr>
+          <w:rFonts w:cstheme="minorHAnsi"/>
+          <w:lang w:val="en-GB"/>
+        </w:rPr>
+        <w:tab/>
+        <w:t xml:space="preserve">Fill in missing information. </w:t>
+      </w:r>
+      <w:r>
+        <w:rPr>
+          <w:rFonts w:cstheme="minorHAnsi"/>
+          <w:lang w:val="en-GB"/>
+        </w:rPr>
+        <w:t xml:space="preserve">EXAMPLE: </w:t>
+      </w:r>
+      <w:r>
+        <w:rPr>
+          <w:rFonts w:cstheme="minorHAnsi"/>
+          <w:lang w:val="en-GB"/>
+        </w:rPr>
+        <w:t>Fill in gaps in tables</w:t>
+      </w:r>
+      <w:r>
+        <w:rPr>
+          <w:rFonts w:cstheme="minorHAnsi"/>
+          <w:lang w:val="en-GB"/>
+        </w:rPr>
+        <w:t>.</w:t>
+      </w:r>
+    </w:p>
+    <w:p>
+      <w:pPr>
+        <w:pBdr>
+          <w:top w:val="single" w:sz="4" w:space="1" w:color="auto"/>
+          <w:left w:val="single" w:sz="4" w:space="4" w:color="auto"/>
+          <w:bottom w:val="single" w:sz="4" w:space="1" w:color="auto"/>
+          <w:right w:val="single" w:sz="4" w:space="4" w:color="auto"/>
+        </w:pBdr>
+        <w:spacing w:before="120" w:after="120"/>
+        <w:ind w:left="1418" w:hanging="1418"/>
+        <w:rPr>
+          <w:rFonts w:cstheme="minorHAnsi"/>
+          <w:lang w:val="en-GB"/>
+        </w:rPr>
+      </w:pPr>
+      <w:r>
+        <w:rPr>
+          <w:rFonts w:cstheme="minorHAnsi"/>
+          <w:b/>
+          <w:bCs/>
+          <w:lang w:val="en-GB"/>
+        </w:rPr>
+        <w:t xml:space="preserve">Delete </w:t>
+      </w:r>
+      <w:r>
+        <w:rPr>
+          <w:rFonts w:cstheme="minorHAnsi"/>
+          <w:b/>
+          <w:bCs/>
+          <w:lang w:val="en-GB"/>
+        </w:rPr>
+        <w:t>(1)</w:t>
+      </w:r>
+      <w:r>
+        <w:rPr>
+          <w:rFonts w:cstheme="minorHAnsi"/>
+          <w:b/>
+          <w:bCs/>
+          <w:lang w:val="en-GB"/>
+        </w:rPr>
+        <w:t>:</w:t>
+      </w:r>
+      <w:r>
+        <w:rPr>
+          <w:rFonts w:cstheme="minorHAnsi"/>
+          <w:b/>
+          <w:bCs/>
+          <w:lang w:val="en-GB"/>
+        </w:rPr>
+        <w:tab/>
+      </w:r>
+      <w:r>
+        <w:rPr>
+          <w:rFonts w:cstheme="minorHAnsi"/>
+          <w:lang w:val="en-GB"/>
+        </w:rPr>
+        <w:t>If you do not want to publish the DMP, delete the CC BY logo on the cover page and replace the text next to it with a statement like “For internal use only”.</w:t>
+      </w:r>
+    </w:p>
+    <w:p>
+      <w:pPr>
+        <w:pBdr>
+          <w:top w:val="single" w:sz="4" w:space="1" w:color="auto"/>
+          <w:left w:val="single" w:sz="4" w:space="4" w:color="auto"/>
+          <w:bottom w:val="single" w:sz="4" w:space="1" w:color="auto"/>
+          <w:right w:val="single" w:sz="4" w:space="4" w:color="auto"/>
+        </w:pBdr>
+        <w:tabs>
+          <w:tab w:val="left" w:pos="1418"/>
+        </w:tabs>
+        <w:ind w:left="1418" w:hanging="1418"/>
+        <w:rPr>
+          <w:rFonts w:cstheme="minorHAnsi"/>
+          <w:lang w:val="en-GB"/>
+        </w:rPr>
+      </w:pPr>
+      <w:r>
+        <w:rPr>
+          <w:rFonts w:cstheme="minorHAnsi"/>
+          <w:b/>
+          <w:bCs/>
+          <w:lang w:val="en-GB"/>
+        </w:rPr>
+        <w:t xml:space="preserve">Delete </w:t>
+      </w:r>
+      <w:r>
+        <w:rPr>
+          <w:rFonts w:cstheme="minorHAnsi"/>
+          <w:b/>
+          <w:bCs/>
+          <w:lang w:val="en-GB"/>
+        </w:rPr>
+        <w:t>(2)</w:t>
+      </w:r>
+      <w:r>
+        <w:rPr>
+          <w:rFonts w:cstheme="minorHAnsi"/>
+          <w:b/>
+          <w:bCs/>
+          <w:lang w:val="en-GB"/>
+        </w:rPr>
+        <w:t>:</w:t>
+      </w:r>
+      <w:r>
+        <w:rPr>
+          <w:rFonts w:cstheme="minorHAnsi"/>
+          <w:b/>
+          <w:bCs/>
+          <w:lang w:val="en-GB"/>
+        </w:rPr>
+        <w:tab/>
+      </w:r>
+      <w:r>
+        <w:rPr>
+          <w:rFonts w:cstheme="minorHAnsi"/>
+          <w:lang w:val="en-GB"/>
+        </w:rPr>
+        <w:t>D</w:t>
+      </w:r>
+      <w:r>
+        <w:rPr>
+          <w:rFonts w:cstheme="minorHAnsi"/>
+          <w:lang w:val="en-GB"/>
+        </w:rPr>
+        <w:t xml:space="preserve">elete this </w:t>
+      </w:r>
+      <w:r>
+        <w:rPr>
+          <w:rFonts w:cstheme="minorHAnsi"/>
+          <w:lang w:val="en-GB"/>
+        </w:rPr>
+        <w:t xml:space="preserve">instruction </w:t>
+      </w:r>
+      <w:r>
+        <w:rPr>
+          <w:rFonts w:cstheme="minorHAnsi"/>
+          <w:lang w:val="en-GB"/>
+        </w:rPr>
+        <w:t xml:space="preserve">page. </w:t>
+      </w:r>
+    </w:p>
+    <w:p>
+      <w:pPr>
+        <w:rPr>
+          <w:rFonts w:ascii="Arial" w:eastAsia="Times New Roman" w:hAnsi="Arial" w:cs="Arial"/>
+          <w:bCs/>
+          <w:color w:val="999999"/>
+          <w:sz w:val="64"/>
+          <w:szCs w:val="64"/>
+          <w:lang w:val="en-GB"/>
+        </w:rPr>
+      </w:pPr>
+    </w:p>
     <w:p>
       <w:pPr>
         <w:pStyle w:val="Title"/>
@@ -13,12 +412,25 @@
           <w:lang w:val="en-GB"/>
         </w:rPr>
       </w:pPr>
+    </w:p>
+    <w:p>
+      <w:pPr>
+        <w:pStyle w:val="Title"/>
+        <w:spacing w:after="840"/>
+        <w:jc w:val="center"/>
+        <w:rPr>
+          <w:sz w:val="64"/>
+          <w:szCs w:val="64"/>
+          <w:lang w:val="en-GB"/>
+        </w:rPr>
+      </w:pPr>
       <w:r>
         <w:rPr>
           <w:sz w:val="64"/>
           <w:szCs w:val="64"/>
           <w:lang w:val="en-GB"/>
         </w:rPr>
+        <w:lastRenderedPageBreak/>
         <w:t>Data management plan (DMP)</w:t>
       </w:r>
       <w:r>
@@ -51,31 +463,7 @@
           <w:szCs w:val="64"/>
           <w:lang w:val="en-GB"/>
         </w:rPr>
-        <w:t>[</w:t>
-      </w:r>
-      <w:proofErr w:type="spellStart"/>
-      <w:r>
-        <w:rPr>
-          <w:b/>
-          <w:bCs/>
-          <w:color w:val="006699"/>
-          <w:sz w:val="64"/>
-          <w:szCs w:val="64"/>
-          <w:lang w:val="en-GB"/>
-        </w:rPr>
-        <w:t>projectname</w:t>
-      </w:r>
-      <w:proofErr w:type="spellEnd"/>
-      <w:r>
-        <w:rPr>
-          <w:b/>
-          <w:bCs/>
-          <w:color w:val="006699"/>
-          <w:sz w:val="64"/>
-          <w:szCs w:val="64"/>
-          <w:lang w:val="en-GB"/>
-        </w:rPr>
-        <w:t>]</w:t>
+        <w:t>[projectname]</w:t>
       </w:r>
     </w:p>
     <w:p>
@@ -257,34 +645,14 @@
                 <w:szCs w:val="20"/>
               </w:rPr>
             </w:pPr>
-            <w:proofErr w:type="spellStart"/>
             <w:r>
               <w:rPr>
                 <w:color w:val="92D050"/>
                 <w:sz w:val="20"/>
                 <w:szCs w:val="20"/>
               </w:rPr>
-              <w:t>dd</w:t>
+              <w:t>dd/mm/yyyy</w:t>
             </w:r>
-            <w:proofErr w:type="spellEnd"/>
-            <w:r>
-              <w:rPr>
-                <w:color w:val="92D050"/>
-                <w:sz w:val="20"/>
-                <w:szCs w:val="20"/>
-              </w:rPr>
-              <w:t>/mm/</w:t>
-            </w:r>
-            <w:proofErr w:type="spellStart"/>
-            <w:r>
-              <w:rPr>
-                <w:color w:val="92D050"/>
-                <w:sz w:val="20"/>
-                <w:szCs w:val="20"/>
-              </w:rPr>
-              <w:t>yyyy</w:t>
-            </w:r>
-            <w:proofErr w:type="spellEnd"/>
           </w:p>
         </w:tc>
         <w:tc>
@@ -629,7 +997,7 @@
                     </wp:anchor>
                   </w:drawing>
                 </mc:Choice>
-                <mc:Fallback xmlns:pic="http://schemas.openxmlformats.org/drawingml/2006/picture" xmlns:wp14="http://schemas.microsoft.com/office/word/2010/wordml" xmlns:a="http://schemas.openxmlformats.org/drawingml/2006/main">
+                <mc:Fallback xmlns:a="http://schemas.openxmlformats.org/drawingml/2006/main" xmlns:wp14="http://schemas.microsoft.com/office/word/2010/wordml" xmlns:pic="http://schemas.openxmlformats.org/drawingml/2006/picture">
                   <w:pict w14:anchorId="7AAC8864">
                     <v:shapetype coordsize="21600,21600" o:spt="75" o:preferrelative="t" path="m@4@5l@4@11@9@11@9@5xe" type="#_x0000_t75">
                       <v:formulas>
@@ -1092,7 +1460,6 @@
               </w:rPr>
               <w:t>[</w:t>
             </w:r>
-            <w:proofErr w:type="spellStart"/>
             <w:r>
               <w:rPr>
                 <w:rFonts w:ascii="Arial" w:hAnsi="Arial" w:cs="Arial"/>
@@ -1103,7 +1470,6 @@
               </w:rPr>
               <w:t>grantid</w:t>
             </w:r>
-            <w:proofErr w:type="spellEnd"/>
             <w:r>
               <w:rPr>
                 <w:rFonts w:ascii="Arial" w:hAnsi="Arial" w:cs="Arial"/>
@@ -1151,31 +1517,7 @@
                 <w:szCs w:val="18"/>
                 <w:lang w:val="en-GB"/>
               </w:rPr>
-              <w:t>[</w:t>
-            </w:r>
-            <w:proofErr w:type="spellStart"/>
-            <w:r>
-              <w:rPr>
-                <w:rFonts w:ascii="Arial" w:hAnsi="Arial" w:cs="Arial"/>
-                <w:iCs/>
-                <w:color w:val="000000" w:themeColor="text1"/>
-                <w:sz w:val="18"/>
-                <w:szCs w:val="18"/>
-                <w:lang w:val="en-GB"/>
-              </w:rPr>
-              <w:t>projectid</w:t>
-            </w:r>
-            <w:proofErr w:type="spellEnd"/>
-            <w:r>
-              <w:rPr>
-                <w:rFonts w:ascii="Arial" w:hAnsi="Arial" w:cs="Arial"/>
-                <w:iCs/>
-                <w:color w:val="000000" w:themeColor="text1"/>
-                <w:sz w:val="18"/>
-                <w:szCs w:val="18"/>
-                <w:lang w:val="en-GB"/>
-              </w:rPr>
-              <w:t>]</w:t>
+              <w:t>[projectid]</w:t>
             </w:r>
           </w:p>
           <w:p>
@@ -1201,33 +1543,7 @@
                 <w:szCs w:val="18"/>
                 <w:lang w:val="de-AT"/>
               </w:rPr>
-              <w:t xml:space="preserve">DMP </w:t>
-            </w:r>
-            <w:proofErr w:type="spellStart"/>
-            <w:r>
-              <w:rPr>
-                <w:rFonts w:ascii="Arial" w:hAnsi="Arial" w:cs="Arial"/>
-                <w:b/>
-                <w:bCs/>
-                <w:iCs/>
-                <w:sz w:val="18"/>
-                <w:szCs w:val="18"/>
-                <w:lang w:val="de-AT"/>
-              </w:rPr>
-              <w:t>version</w:t>
-            </w:r>
-            <w:proofErr w:type="spellEnd"/>
-            <w:r>
-              <w:rPr>
-                <w:rFonts w:ascii="Arial" w:hAnsi="Arial" w:cs="Arial"/>
-                <w:b/>
-                <w:bCs/>
-                <w:iCs/>
-                <w:sz w:val="18"/>
-                <w:szCs w:val="18"/>
-                <w:lang w:val="de-AT"/>
-              </w:rPr>
-              <w:t>:</w:t>
+              <w:t>DMP version:</w:t>
             </w:r>
             <w:r>
               <w:rPr>
@@ -1248,33 +1564,7 @@
                 <w:szCs w:val="18"/>
                 <w:lang w:val="de-AT"/>
               </w:rPr>
-              <w:t>[Nr.], [</w:t>
-            </w:r>
-            <w:proofErr w:type="spellStart"/>
-            <w:proofErr w:type="gramStart"/>
-            <w:r>
-              <w:rPr>
-                <w:rFonts w:ascii="Arial" w:hAnsi="Arial" w:cs="Arial"/>
-                <w:iCs/>
-                <w:color w:val="92D050"/>
-                <w:sz w:val="18"/>
-                <w:szCs w:val="18"/>
-                <w:lang w:val="de-AT"/>
-              </w:rPr>
-              <w:t>dd.mm.yyyy</w:t>
-            </w:r>
-            <w:proofErr w:type="spellEnd"/>
-            <w:proofErr w:type="gramEnd"/>
-            <w:r>
-              <w:rPr>
-                <w:rFonts w:ascii="Arial" w:hAnsi="Arial" w:cs="Arial"/>
-                <w:iCs/>
-                <w:color w:val="92D050"/>
-                <w:sz w:val="18"/>
-                <w:szCs w:val="18"/>
-                <w:lang w:val="de-AT"/>
-              </w:rPr>
-              <w:t>]</w:t>
+              <w:t>[Nr.], [dd.mm.yyyy]</w:t>
             </w:r>
           </w:p>
           <w:p>
@@ -1291,7 +1581,6 @@
                 <w:lang w:val="de-AT"/>
               </w:rPr>
             </w:pPr>
-            <w:proofErr w:type="spellStart"/>
             <w:r>
               <w:rPr>
                 <w:rFonts w:ascii="Arial" w:hAnsi="Arial" w:cs="Arial"/>
@@ -1314,20 +1603,7 @@
                 <w:szCs w:val="18"/>
                 <w:lang w:val="de-AT"/>
               </w:rPr>
-              <w:t>ontributors</w:t>
-            </w:r>
-            <w:proofErr w:type="spellEnd"/>
-            <w:r>
-              <w:rPr>
-                <w:rFonts w:ascii="Arial" w:hAnsi="Arial" w:cs="Arial"/>
-                <w:b/>
-                <w:bCs/>
-                <w:iCs/>
-                <w:sz w:val="18"/>
-                <w:szCs w:val="18"/>
-                <w:lang w:val="de-AT"/>
-              </w:rPr>
-              <w:t>:</w:t>
+              <w:t>ontributors:</w:t>
             </w:r>
           </w:p>
           <w:p>
@@ -1350,29 +1626,7 @@
                 <w:szCs w:val="18"/>
                 <w:lang w:val="de-AT"/>
               </w:rPr>
-              <w:t>[</w:t>
-            </w:r>
-            <w:proofErr w:type="spellStart"/>
-            <w:r>
-              <w:rPr>
-                <w:rFonts w:ascii="Arial" w:hAnsi="Arial" w:cs="Arial"/>
-                <w:iCs/>
-                <w:sz w:val="18"/>
-                <w:szCs w:val="18"/>
-                <w:lang w:val="de-AT"/>
-              </w:rPr>
-              <w:t>contributors</w:t>
-            </w:r>
-            <w:proofErr w:type="spellEnd"/>
-            <w:r>
-              <w:rPr>
-                <w:rFonts w:ascii="Arial" w:hAnsi="Arial" w:cs="Arial"/>
-                <w:iCs/>
-                <w:sz w:val="18"/>
-                <w:szCs w:val="18"/>
-                <w:lang w:val="de-AT"/>
-              </w:rPr>
-              <w:t>]</w:t>
+              <w:t>[contributors]</w:t>
             </w:r>
           </w:p>
         </w:tc>
@@ -1832,25 +2086,7 @@
                       <w:sz w:val="18"/>
                       <w:szCs w:val="18"/>
                     </w:rPr>
-                    <w:t>[</w:t>
-                  </w:r>
-                  <w:proofErr w:type="spellStart"/>
-                  <w:r>
-                    <w:rPr>
-                      <w:bCs/>
-                      <w:sz w:val="18"/>
-                      <w:szCs w:val="18"/>
-                    </w:rPr>
-                    <w:t>costTable</w:t>
-                  </w:r>
-                  <w:proofErr w:type="spellEnd"/>
-                  <w:r>
-                    <w:rPr>
-                      <w:bCs/>
-                      <w:sz w:val="18"/>
-                      <w:szCs w:val="18"/>
-                    </w:rPr>
-                    <w:t>]</w:t>
+                    <w:t>[costTable]</w:t>
                   </w:r>
                 </w:p>
               </w:tc>
@@ -1877,25 +2113,7 @@
                       <w:sz w:val="18"/>
                       <w:szCs w:val="18"/>
                     </w:rPr>
-                    <w:t>[</w:t>
-                  </w:r>
-                  <w:proofErr w:type="spellStart"/>
-                  <w:r>
-                    <w:rPr>
-                      <w:bCs/>
-                      <w:sz w:val="18"/>
-                      <w:szCs w:val="18"/>
-                    </w:rPr>
-                    <w:t>costTable</w:t>
-                  </w:r>
-                  <w:proofErr w:type="spellEnd"/>
-                  <w:r>
-                    <w:rPr>
-                      <w:bCs/>
-                      <w:sz w:val="18"/>
-                      <w:szCs w:val="18"/>
-                    </w:rPr>
-                    <w:t>]</w:t>
+                    <w:t>[costTable]</w:t>
                   </w:r>
                 </w:p>
               </w:tc>
@@ -2174,25 +2392,7 @@
                       <w:sz w:val="18"/>
                       <w:szCs w:val="18"/>
                     </w:rPr>
-                    <w:t>[</w:t>
-                  </w:r>
-                  <w:proofErr w:type="spellStart"/>
-                  <w:r>
-                    <w:rPr>
-                      <w:b/>
-                      <w:sz w:val="18"/>
-                      <w:szCs w:val="18"/>
-                    </w:rPr>
-                    <w:t>costcurrency</w:t>
-                  </w:r>
-                  <w:proofErr w:type="spellEnd"/>
-                  <w:r>
-                    <w:rPr>
-                      <w:b/>
-                      <w:sz w:val="18"/>
-                      <w:szCs w:val="18"/>
-                    </w:rPr>
-                    <w:t>]</w:t>
+                    <w:t>[costcurrency]</w:t>
                   </w:r>
                 </w:p>
               </w:tc>
@@ -2221,25 +2421,7 @@
                       <w:sz w:val="18"/>
                       <w:szCs w:val="18"/>
                     </w:rPr>
-                    <w:t>[</w:t>
-                  </w:r>
-                  <w:proofErr w:type="spellStart"/>
-                  <w:r>
-                    <w:rPr>
-                      <w:b/>
-                      <w:sz w:val="18"/>
-                      <w:szCs w:val="18"/>
-                    </w:rPr>
-                    <w:t>costtotal</w:t>
-                  </w:r>
-                  <w:proofErr w:type="spellEnd"/>
-                  <w:r>
-                    <w:rPr>
-                      <w:b/>
-                      <w:sz w:val="18"/>
-                      <w:szCs w:val="18"/>
-                    </w:rPr>
-                    <w:t>]</w:t>
+                    <w:t>[costtotal]</w:t>
                   </w:r>
                 </w:p>
               </w:tc>
@@ -2262,17 +2444,7 @@
                 <w:szCs w:val="18"/>
                 <w:lang w:val="en-GB"/>
               </w:rPr>
-              <w:t>[</w:t>
-            </w:r>
-            <w:proofErr w:type="spellStart"/>
-            <w:r>
-              <w:rPr>
-                <w:rFonts w:ascii="Arial" w:hAnsi="Arial" w:cs="Arial"/>
-                <w:sz w:val="18"/>
-                <w:szCs w:val="18"/>
-                <w:lang w:val="en-GB"/>
-              </w:rPr>
-              <w:t>costsDescription</w:t>
+              <w:t>[costsDescription</w:t>
             </w:r>
             <w:r>
               <w:rPr>
@@ -2283,7 +2455,6 @@
               </w:rPr>
               <w:t>s</w:t>
             </w:r>
-            <w:proofErr w:type="spellEnd"/>
             <w:r>
               <w:rPr>
                 <w:rFonts w:ascii="Arial" w:hAnsi="Arial" w:cs="Arial"/>
@@ -2301,29 +2472,7 @@
                 <w:szCs w:val="18"/>
                 <w:lang w:val="en-GB"/>
               </w:rPr>
-              <w:t>[</w:t>
-            </w:r>
-            <w:proofErr w:type="spellStart"/>
-            <w:r>
-              <w:rPr>
-                <w:rFonts w:ascii="Arial" w:hAnsi="Arial" w:cs="Arial"/>
-                <w:color w:val="92D050"/>
-                <w:sz w:val="18"/>
-                <w:szCs w:val="18"/>
-                <w:lang w:val="en-GB"/>
-              </w:rPr>
-              <w:t>costCoverage</w:t>
-            </w:r>
-            <w:proofErr w:type="spellEnd"/>
-            <w:r>
-              <w:rPr>
-                <w:rFonts w:ascii="Arial" w:hAnsi="Arial" w:cs="Arial"/>
-                <w:color w:val="92D050"/>
-                <w:sz w:val="18"/>
-                <w:szCs w:val="18"/>
-                <w:lang w:val="en-GB"/>
-              </w:rPr>
-              <w:t>]</w:t>
+              <w:t>[costCoverage]</w:t>
             </w:r>
           </w:p>
         </w:tc>
@@ -2745,23 +2894,7 @@
                       <w:sz w:val="18"/>
                       <w:szCs w:val="18"/>
                     </w:rPr>
-                    <w:t>[</w:t>
-                  </w:r>
-                  <w:proofErr w:type="spellStart"/>
-                  <w:r>
-                    <w:rPr>
-                      <w:sz w:val="18"/>
-                      <w:szCs w:val="18"/>
-                    </w:rPr>
-                    <w:t>datasetTable</w:t>
-                  </w:r>
-                  <w:proofErr w:type="spellEnd"/>
-                  <w:r>
-                    <w:rPr>
-                      <w:sz w:val="18"/>
-                      <w:szCs w:val="18"/>
-                    </w:rPr>
-                    <w:t>]</w:t>
+                    <w:t>[datasetTable]</w:t>
                   </w:r>
                 </w:p>
               </w:tc>
@@ -3089,27 +3222,7 @@
                 <w:szCs w:val="18"/>
                 <w:lang w:val="en-GB"/>
               </w:rPr>
-              <w:t>[</w:t>
-            </w:r>
-            <w:proofErr w:type="spellStart"/>
-            <w:r>
-              <w:rPr>
-                <w:rFonts w:ascii="Arial" w:hAnsi="Arial" w:cs="Arial"/>
-                <w:sz w:val="18"/>
-                <w:szCs w:val="18"/>
-                <w:lang w:val="en-GB"/>
-              </w:rPr>
-              <w:t>datasetTechnicalResources</w:t>
-            </w:r>
-            <w:proofErr w:type="spellEnd"/>
-            <w:r>
-              <w:rPr>
-                <w:rFonts w:ascii="Arial" w:hAnsi="Arial" w:cs="Arial"/>
-                <w:sz w:val="18"/>
-                <w:szCs w:val="18"/>
-                <w:lang w:val="en-GB"/>
-              </w:rPr>
-              <w:t>]</w:t>
+              <w:t>[datasetTechnicalResources]</w:t>
             </w:r>
           </w:p>
           <w:p>
@@ -3394,23 +3507,7 @@
                       <w:sz w:val="18"/>
                       <w:szCs w:val="18"/>
                     </w:rPr>
-                    <w:t>[</w:t>
-                  </w:r>
-                  <w:proofErr w:type="spellStart"/>
-                  <w:r>
-                    <w:rPr>
-                      <w:sz w:val="18"/>
-                      <w:szCs w:val="18"/>
-                    </w:rPr>
-                    <w:t>reusedDatasetTable</w:t>
-                  </w:r>
-                  <w:proofErr w:type="spellEnd"/>
-                  <w:r>
-                    <w:rPr>
-                      <w:sz w:val="18"/>
-                      <w:szCs w:val="18"/>
-                    </w:rPr>
-                    <w:t>]</w:t>
+                    <w:t>[reusedDatasetTable]</w:t>
                   </w:r>
                 </w:p>
               </w:tc>
@@ -3569,23 +3666,7 @@
                       <w:sz w:val="18"/>
                       <w:szCs w:val="18"/>
                     </w:rPr>
-                    <w:t>[</w:t>
-                  </w:r>
-                  <w:proofErr w:type="spellStart"/>
-                  <w:r>
-                    <w:rPr>
-                      <w:sz w:val="18"/>
-                      <w:szCs w:val="18"/>
-                    </w:rPr>
-                    <w:t>reusedDatasetTable</w:t>
-                  </w:r>
-                  <w:proofErr w:type="spellEnd"/>
-                  <w:r>
-                    <w:rPr>
-                      <w:sz w:val="18"/>
-                      <w:szCs w:val="18"/>
-                    </w:rPr>
-                    <w:t>]</w:t>
+                    <w:t>[reusedDatasetTable]</w:t>
                   </w:r>
                 </w:p>
               </w:tc>
@@ -3735,27 +3816,7 @@
                 <w:szCs w:val="18"/>
                 <w:lang w:val="en-GB"/>
               </w:rPr>
-              <w:t>[</w:t>
-            </w:r>
-            <w:proofErr w:type="spellStart"/>
-            <w:r>
-              <w:rPr>
-                <w:rFonts w:ascii="Arial" w:hAnsi="Arial" w:cs="Arial"/>
-                <w:sz w:val="18"/>
-                <w:szCs w:val="18"/>
-                <w:lang w:val="en-GB"/>
-              </w:rPr>
-              <w:t>datageneration</w:t>
-            </w:r>
-            <w:proofErr w:type="spellEnd"/>
-            <w:r>
-              <w:rPr>
-                <w:rFonts w:ascii="Arial" w:hAnsi="Arial" w:cs="Arial"/>
-                <w:sz w:val="18"/>
-                <w:szCs w:val="18"/>
-                <w:lang w:val="en-GB"/>
-              </w:rPr>
-              <w:t>]</w:t>
+              <w:t>[datageneration]</w:t>
             </w:r>
           </w:p>
         </w:tc>
@@ -3793,7 +3854,6 @@
                 <w:szCs w:val="18"/>
                 <w:lang w:val="en-GB"/>
               </w:rPr>
-              <w:lastRenderedPageBreak/>
               <w:t xml:space="preserve">III Documentation and Data Quality </w:t>
             </w:r>
           </w:p>
@@ -3893,27 +3953,7 @@
                 <w:szCs w:val="18"/>
                 <w:lang w:val="en-US"/>
               </w:rPr>
-              <w:t>[</w:t>
-            </w:r>
-            <w:proofErr w:type="spellStart"/>
-            <w:r>
-              <w:rPr>
-                <w:rFonts w:ascii="Arial" w:hAnsi="Arial" w:cs="Arial"/>
-                <w:sz w:val="18"/>
-                <w:szCs w:val="18"/>
-                <w:lang w:val="en-US"/>
-              </w:rPr>
-              <w:t>dataorganisation</w:t>
-            </w:r>
-            <w:proofErr w:type="spellEnd"/>
-            <w:r>
-              <w:rPr>
-                <w:rFonts w:ascii="Arial" w:hAnsi="Arial" w:cs="Arial"/>
-                <w:sz w:val="18"/>
-                <w:szCs w:val="18"/>
-                <w:lang w:val="en-US"/>
-              </w:rPr>
-              <w:t>]</w:t>
+              <w:t>[dataorganisation]</w:t>
             </w:r>
           </w:p>
           <w:p>
@@ -4115,27 +4155,7 @@
                 <w:szCs w:val="18"/>
                 <w:lang w:val="en-US"/>
               </w:rPr>
-              <w:t>[</w:t>
-            </w:r>
-            <w:proofErr w:type="spellStart"/>
-            <w:r>
-              <w:rPr>
-                <w:rFonts w:ascii="Arial" w:eastAsia="Arial" w:hAnsi="Arial" w:cs="Arial"/>
-                <w:sz w:val="18"/>
-                <w:szCs w:val="18"/>
-                <w:lang w:val="en-US"/>
-              </w:rPr>
-              <w:t>dataqualitycontrol</w:t>
-            </w:r>
-            <w:proofErr w:type="spellEnd"/>
-            <w:r>
-              <w:rPr>
-                <w:rFonts w:ascii="Arial" w:eastAsia="Arial" w:hAnsi="Arial" w:cs="Arial"/>
-                <w:sz w:val="18"/>
-                <w:szCs w:val="18"/>
-                <w:lang w:val="en-US"/>
-              </w:rPr>
-              <w:t>]</w:t>
+              <w:t>[dataqualitycontrol]</w:t>
             </w:r>
           </w:p>
         </w:tc>
@@ -4269,27 +4289,7 @@
                 <w:szCs w:val="18"/>
                 <w:lang w:val="en-GB"/>
               </w:rPr>
-              <w:t>[</w:t>
-            </w:r>
-            <w:proofErr w:type="spellStart"/>
-            <w:r>
-              <w:rPr>
-                <w:rFonts w:ascii="Arial" w:hAnsi="Arial" w:cs="Arial"/>
-                <w:sz w:val="18"/>
-                <w:szCs w:val="18"/>
-                <w:lang w:val="en-GB"/>
-              </w:rPr>
-              <w:t>storageintro</w:t>
-            </w:r>
-            <w:proofErr w:type="spellEnd"/>
-            <w:r>
-              <w:rPr>
-                <w:rFonts w:ascii="Arial" w:hAnsi="Arial" w:cs="Arial"/>
-                <w:sz w:val="18"/>
-                <w:szCs w:val="18"/>
-                <w:lang w:val="en-GB"/>
-              </w:rPr>
-              <w:t>]</w:t>
+              <w:t>[storageintro]</w:t>
             </w:r>
             <w:r>
               <w:rPr>
@@ -4369,17 +4369,7 @@
                 <w:szCs w:val="18"/>
                 <w:lang w:val="en-GB"/>
               </w:rPr>
-              <w:t>[</w:t>
-            </w:r>
-            <w:proofErr w:type="spellStart"/>
-            <w:r>
-              <w:rPr>
-                <w:rFonts w:ascii="Arial" w:hAnsi="Arial" w:cs="Arial"/>
-                <w:sz w:val="18"/>
-                <w:szCs w:val="18"/>
-                <w:lang w:val="en-GB"/>
-              </w:rPr>
-              <w:t>sensitive</w:t>
+              <w:t>[sensitive</w:t>
             </w:r>
             <w:r>
               <w:rPr>
@@ -4390,7 +4380,6 @@
               </w:rPr>
               <w:t>data</w:t>
             </w:r>
-            <w:proofErr w:type="spellEnd"/>
             <w:r>
               <w:rPr>
                 <w:rFonts w:ascii="Arial" w:hAnsi="Arial" w:cs="Arial"/>
@@ -4622,23 +4611,7 @@
                       <w:sz w:val="18"/>
                       <w:szCs w:val="18"/>
                     </w:rPr>
-                    <w:t>[</w:t>
-                  </w:r>
-                  <w:proofErr w:type="spellStart"/>
-                  <w:r>
-                    <w:rPr>
-                      <w:sz w:val="18"/>
-                      <w:szCs w:val="18"/>
-                    </w:rPr>
-                    <w:t>datasetAccessTable</w:t>
-                  </w:r>
-                  <w:proofErr w:type="spellEnd"/>
-                  <w:r>
-                    <w:rPr>
-                      <w:sz w:val="18"/>
-                      <w:szCs w:val="18"/>
-                    </w:rPr>
-                    <w:t>]</w:t>
+                    <w:t>[datasetAccessTable]</w:t>
                   </w:r>
                 </w:p>
               </w:tc>
@@ -5172,23 +5145,7 @@
                       <w:sz w:val="18"/>
                       <w:szCs w:val="18"/>
                     </w:rPr>
-                    <w:t>[</w:t>
-                  </w:r>
-                  <w:proofErr w:type="spellStart"/>
-                  <w:r>
-                    <w:rPr>
-                      <w:sz w:val="18"/>
-                      <w:szCs w:val="18"/>
-                    </w:rPr>
-                    <w:t>datasetPublicationTable</w:t>
-                  </w:r>
-                  <w:proofErr w:type="spellEnd"/>
-                  <w:r>
-                    <w:rPr>
-                      <w:sz w:val="18"/>
-                      <w:szCs w:val="18"/>
-                    </w:rPr>
-                    <w:t>]</w:t>
+                    <w:t>[datasetPublicationTable]</w:t>
                   </w:r>
                 </w:p>
               </w:tc>
@@ -5427,17 +5384,7 @@
                 <w:szCs w:val="18"/>
                 <w:lang w:val="en-GB"/>
               </w:rPr>
-              <w:t>[</w:t>
-            </w:r>
-            <w:proofErr w:type="spellStart"/>
-            <w:r>
-              <w:rPr>
-                <w:rFonts w:ascii="Arial" w:hAnsi="Arial" w:cs="Arial"/>
-                <w:sz w:val="18"/>
-                <w:szCs w:val="18"/>
-                <w:lang w:val="en-GB"/>
-              </w:rPr>
-              <w:t>closed</w:t>
+              <w:t>[closed</w:t>
             </w:r>
             <w:r>
               <w:rPr>
@@ -5455,17 +5402,7 @@
                 <w:szCs w:val="18"/>
                 <w:lang w:val="en-GB"/>
               </w:rPr>
-              <w:t>datasetreasons</w:t>
-            </w:r>
-            <w:proofErr w:type="spellEnd"/>
-            <w:r>
-              <w:rPr>
-                <w:rFonts w:ascii="Arial" w:hAnsi="Arial" w:cs="Arial"/>
-                <w:sz w:val="18"/>
-                <w:szCs w:val="18"/>
-                <w:lang w:val="en-GB"/>
-              </w:rPr>
-              <w:t>]</w:t>
+              <w:t>datasetreasons]</w:t>
             </w:r>
           </w:p>
           <w:p>
@@ -5485,27 +5422,7 @@
                 <w:szCs w:val="18"/>
                 <w:lang w:val="en-GB"/>
               </w:rPr>
-              <w:t>[</w:t>
-            </w:r>
-            <w:proofErr w:type="spellStart"/>
-            <w:r>
-              <w:rPr>
-                <w:rFonts w:ascii="Arial" w:hAnsi="Arial" w:cs="Arial"/>
-                <w:sz w:val="18"/>
-                <w:szCs w:val="18"/>
-                <w:lang w:val="en-GB"/>
-              </w:rPr>
-              <w:t>repoinformation</w:t>
-            </w:r>
-            <w:proofErr w:type="spellEnd"/>
-            <w:r>
-              <w:rPr>
-                <w:rFonts w:ascii="Arial" w:hAnsi="Arial" w:cs="Arial"/>
-                <w:sz w:val="18"/>
-                <w:szCs w:val="18"/>
-                <w:lang w:val="en-GB"/>
-              </w:rPr>
-              <w:t>]</w:t>
+              <w:t>[repoinformation]</w:t>
             </w:r>
           </w:p>
           <w:p>
@@ -5545,27 +5462,7 @@
                 <w:szCs w:val="18"/>
                 <w:lang w:val="en-US"/>
               </w:rPr>
-              <w:t>[</w:t>
-            </w:r>
-            <w:proofErr w:type="spellStart"/>
-            <w:r>
-              <w:rPr>
-                <w:rFonts w:ascii="Arial" w:hAnsi="Arial" w:cs="Arial"/>
-                <w:sz w:val="18"/>
-                <w:szCs w:val="18"/>
-                <w:lang w:val="en-US"/>
-              </w:rPr>
-              <w:t>restrictedAccessInfo</w:t>
-            </w:r>
-            <w:proofErr w:type="spellEnd"/>
-            <w:r>
-              <w:rPr>
-                <w:rFonts w:ascii="Arial" w:hAnsi="Arial" w:cs="Arial"/>
-                <w:sz w:val="18"/>
-                <w:szCs w:val="18"/>
-                <w:lang w:val="en-US"/>
-              </w:rPr>
-              <w:t>]</w:t>
+              <w:t>[restrictedAccessInfo]</w:t>
             </w:r>
             <w:bookmarkStart w:id="3" w:name="_Toc66691678"/>
           </w:p>
@@ -5808,23 +5705,7 @@
                       <w:sz w:val="18"/>
                       <w:szCs w:val="18"/>
                     </w:rPr>
-                    <w:t>[</w:t>
-                  </w:r>
-                  <w:proofErr w:type="spellStart"/>
-                  <w:r>
-                    <w:rPr>
-                      <w:sz w:val="18"/>
-                      <w:szCs w:val="18"/>
-                    </w:rPr>
-                    <w:t>datasetRepositoryTable</w:t>
-                  </w:r>
-                  <w:proofErr w:type="spellEnd"/>
-                  <w:r>
-                    <w:rPr>
-                      <w:sz w:val="18"/>
-                      <w:szCs w:val="18"/>
-                    </w:rPr>
-                    <w:t>]</w:t>
+                    <w:t>[datasetRepositoryTable]</w:t>
                   </w:r>
                 </w:p>
               </w:tc>
@@ -5961,23 +5842,7 @@
                       <w:sz w:val="18"/>
                       <w:szCs w:val="18"/>
                     </w:rPr>
-                    <w:t>[</w:t>
-                  </w:r>
-                  <w:proofErr w:type="spellStart"/>
-                  <w:r>
-                    <w:rPr>
-                      <w:sz w:val="18"/>
-                      <w:szCs w:val="18"/>
-                    </w:rPr>
-                    <w:t>targetaudience</w:t>
-                  </w:r>
-                  <w:proofErr w:type="spellEnd"/>
-                  <w:r>
-                    <w:rPr>
-                      <w:sz w:val="18"/>
-                      <w:szCs w:val="18"/>
-                    </w:rPr>
-                    <w:t>]</w:t>
+                    <w:t>[targetaudience]</w:t>
                   </w:r>
                 </w:p>
               </w:tc>
@@ -6224,23 +6089,7 @@
                       <w:sz w:val="18"/>
                       <w:szCs w:val="18"/>
                     </w:rPr>
-                    <w:t>[</w:t>
-                  </w:r>
-                  <w:proofErr w:type="spellStart"/>
-                  <w:r>
-                    <w:rPr>
-                      <w:sz w:val="18"/>
-                      <w:szCs w:val="18"/>
-                    </w:rPr>
-                    <w:t>datasetDeleteTable</w:t>
-                  </w:r>
-                  <w:proofErr w:type="spellEnd"/>
-                  <w:r>
-                    <w:rPr>
-                      <w:sz w:val="18"/>
-                      <w:szCs w:val="18"/>
-                    </w:rPr>
-                    <w:t>]</w:t>
+                    <w:t>[datasetDeleteTable]</w:t>
                   </w:r>
                 </w:p>
               </w:tc>
@@ -6266,23 +6115,7 @@
                       <w:sz w:val="18"/>
                       <w:szCs w:val="18"/>
                     </w:rPr>
-                    <w:t>[</w:t>
-                  </w:r>
-                  <w:proofErr w:type="spellStart"/>
-                  <w:r>
-                    <w:rPr>
-                      <w:sz w:val="18"/>
-                      <w:szCs w:val="18"/>
-                    </w:rPr>
-                    <w:t>datasetDeleteTable</w:t>
-                  </w:r>
-                  <w:proofErr w:type="spellEnd"/>
-                  <w:r>
-                    <w:rPr>
-                      <w:sz w:val="18"/>
-                      <w:szCs w:val="18"/>
-                    </w:rPr>
-                    <w:t>]</w:t>
+                    <w:t>[datasetDeleteTable]</w:t>
                   </w:r>
                 </w:p>
               </w:tc>
@@ -6502,7 +6335,6 @@
                 <w:szCs w:val="18"/>
                 <w:lang w:val="en-GB"/>
               </w:rPr>
-              <w:lastRenderedPageBreak/>
               <w:t>V Legal and Ethical Aspects</w:t>
             </w:r>
           </w:p>
@@ -6604,7 +6436,6 @@
               </w:rPr>
               <w:t>[</w:t>
             </w:r>
-            <w:proofErr w:type="spellStart"/>
             <w:r>
               <w:rPr>
                 <w:rFonts w:ascii="Arial" w:hAnsi="Arial" w:cs="Arial"/>
@@ -6614,7 +6445,6 @@
               </w:rPr>
               <w:t>personaldata</w:t>
             </w:r>
-            <w:proofErr w:type="spellEnd"/>
             <w:r>
               <w:rPr>
                 <w:rFonts w:ascii="Arial" w:hAnsi="Arial" w:cs="Arial"/>
@@ -6678,7 +6508,6 @@
               </w:rPr>
               <w:t>[</w:t>
             </w:r>
-            <w:proofErr w:type="spellStart"/>
             <w:r>
               <w:rPr>
                 <w:rFonts w:ascii="Arial" w:hAnsi="Arial" w:cs="Arial"/>
@@ -6686,17 +6515,7 @@
                 <w:szCs w:val="18"/>
                 <w:lang w:val="en-GB"/>
               </w:rPr>
-              <w:t>legalrestriction</w:t>
-            </w:r>
-            <w:proofErr w:type="spellEnd"/>
-            <w:r>
-              <w:rPr>
-                <w:rFonts w:ascii="Arial" w:hAnsi="Arial" w:cs="Arial"/>
-                <w:sz w:val="18"/>
-                <w:szCs w:val="18"/>
-                <w:lang w:val="en-GB"/>
-              </w:rPr>
-              <w:t>]</w:t>
+              <w:t>legalrestriction]</w:t>
             </w:r>
           </w:p>
         </w:tc>
@@ -6796,27 +6615,7 @@
                 <w:szCs w:val="18"/>
                 <w:lang w:val="en-GB"/>
               </w:rPr>
-              <w:t>[</w:t>
-            </w:r>
-            <w:proofErr w:type="spellStart"/>
-            <w:r>
-              <w:rPr>
-                <w:rFonts w:ascii="Arial" w:hAnsi="Arial" w:cs="Arial"/>
-                <w:sz w:val="18"/>
-                <w:szCs w:val="18"/>
-                <w:lang w:val="en-GB"/>
-              </w:rPr>
-              <w:t>ethicalissues</w:t>
-            </w:r>
-            <w:proofErr w:type="spellEnd"/>
-            <w:r>
-              <w:rPr>
-                <w:rFonts w:ascii="Arial" w:hAnsi="Arial" w:cs="Arial"/>
-                <w:sz w:val="18"/>
-                <w:szCs w:val="18"/>
-                <w:lang w:val="en-GB"/>
-              </w:rPr>
-              <w:t>]</w:t>
+              <w:t>[ethicalissues]</w:t>
             </w:r>
           </w:p>
         </w:tc>
@@ -6962,7 +6761,7 @@
                 </wp:inline>
               </w:drawing>
             </mc:Choice>
-            <mc:Fallback xmlns:pic="http://schemas.openxmlformats.org/drawingml/2006/picture" xmlns:wp14="http://schemas.microsoft.com/office/word/2010/wordml" xmlns:a="http://schemas.openxmlformats.org/drawingml/2006/main">
+            <mc:Fallback xmlns:a="http://schemas.openxmlformats.org/drawingml/2006/main" xmlns:wp14="http://schemas.microsoft.com/office/word/2010/wordml" xmlns:pic="http://schemas.openxmlformats.org/drawingml/2006/picture">
               <w:pict w14:anchorId="1521B567">
                 <v:shapetype coordsize="21600,21600" o:spt="75" o:preferrelative="t" path="m@4@5l@4@11@9@11@9@5xe" type="#_x0000_t75">
                   <v:formulas>
@@ -6994,7 +6793,6 @@
           </w:rPr>
           <w:t xml:space="preserve"> </w:t>
         </w:r>
-        <w:proofErr w:type="gramStart"/>
         <w:r>
           <w:rPr>
             <w:rFonts w:ascii="Arial" w:hAnsi="Arial" w:cs="Arial"/>
@@ -7002,17 +6800,7 @@
             <w:szCs w:val="16"/>
             <w:lang w:val="de-AT"/>
           </w:rPr>
-          <w:t>DMP Template</w:t>
-        </w:r>
-        <w:proofErr w:type="gramEnd"/>
-        <w:r>
-          <w:rPr>
-            <w:rFonts w:ascii="Arial" w:hAnsi="Arial" w:cs="Arial"/>
-            <w:sz w:val="16"/>
-            <w:szCs w:val="16"/>
-            <w:lang w:val="de-AT"/>
-          </w:rPr>
-          <w:t xml:space="preserve"> (01/2022)</w:t>
+          <w:t>DMP Template (01/2022)</w:t>
         </w:r>
         <w:r>
           <w:tab/>
@@ -9249,6 +9037,119 @@
     </w:lvl>
   </w:abstractNum>
   <w:abstractNum w:abstractNumId="19" w15:restartNumberingAfterBreak="0">
+    <w:nsid w:val="55A15A60"/>
+    <w:multiLevelType w:val="hybridMultilevel"/>
+    <w:tmpl w:val="9B7EBE5A"/>
+    <w:lvl w:ilvl="0" w:tplc="0C070001">
+      <w:start w:val="1"/>
+      <w:numFmt w:val="bullet"/>
+      <w:lvlText w:val=""/>
+      <w:lvlJc w:val="left"/>
+      <w:pPr>
+        <w:ind w:left="360" w:hanging="360"/>
+      </w:pPr>
+      <w:rPr>
+        <w:rFonts w:ascii="Symbol" w:hAnsi="Symbol" w:hint="default"/>
+      </w:rPr>
+    </w:lvl>
+    <w:lvl w:ilvl="1" w:tplc="0C070003" w:tentative="1">
+      <w:start w:val="1"/>
+      <w:numFmt w:val="bullet"/>
+      <w:lvlText w:val="o"/>
+      <w:lvlJc w:val="left"/>
+      <w:pPr>
+        <w:ind w:left="1080" w:hanging="360"/>
+      </w:pPr>
+      <w:rPr>
+        <w:rFonts w:ascii="Courier New" w:hAnsi="Courier New" w:cs="Courier New" w:hint="default"/>
+      </w:rPr>
+    </w:lvl>
+    <w:lvl w:ilvl="2" w:tplc="0C070005" w:tentative="1">
+      <w:start w:val="1"/>
+      <w:numFmt w:val="bullet"/>
+      <w:lvlText w:val=""/>
+      <w:lvlJc w:val="left"/>
+      <w:pPr>
+        <w:ind w:left="1800" w:hanging="360"/>
+      </w:pPr>
+      <w:rPr>
+        <w:rFonts w:ascii="Wingdings" w:hAnsi="Wingdings" w:hint="default"/>
+      </w:rPr>
+    </w:lvl>
+    <w:lvl w:ilvl="3" w:tplc="0C070001" w:tentative="1">
+      <w:start w:val="1"/>
+      <w:numFmt w:val="bullet"/>
+      <w:lvlText w:val=""/>
+      <w:lvlJc w:val="left"/>
+      <w:pPr>
+        <w:ind w:left="2520" w:hanging="360"/>
+      </w:pPr>
+      <w:rPr>
+        <w:rFonts w:ascii="Symbol" w:hAnsi="Symbol" w:hint="default"/>
+      </w:rPr>
+    </w:lvl>
+    <w:lvl w:ilvl="4" w:tplc="0C070003" w:tentative="1">
+      <w:start w:val="1"/>
+      <w:numFmt w:val="bullet"/>
+      <w:lvlText w:val="o"/>
+      <w:lvlJc w:val="left"/>
+      <w:pPr>
+        <w:ind w:left="3240" w:hanging="360"/>
+      </w:pPr>
+      <w:rPr>
+        <w:rFonts w:ascii="Courier New" w:hAnsi="Courier New" w:cs="Courier New" w:hint="default"/>
+      </w:rPr>
+    </w:lvl>
+    <w:lvl w:ilvl="5" w:tplc="0C070005" w:tentative="1">
+      <w:start w:val="1"/>
+      <w:numFmt w:val="bullet"/>
+      <w:lvlText w:val=""/>
+      <w:lvlJc w:val="left"/>
+      <w:pPr>
+        <w:ind w:left="3960" w:hanging="360"/>
+      </w:pPr>
+      <w:rPr>
+        <w:rFonts w:ascii="Wingdings" w:hAnsi="Wingdings" w:hint="default"/>
+      </w:rPr>
+    </w:lvl>
+    <w:lvl w:ilvl="6" w:tplc="0C070001" w:tentative="1">
+      <w:start w:val="1"/>
+      <w:numFmt w:val="bullet"/>
+      <w:lvlText w:val=""/>
+      <w:lvlJc w:val="left"/>
+      <w:pPr>
+        <w:ind w:left="4680" w:hanging="360"/>
+      </w:pPr>
+      <w:rPr>
+        <w:rFonts w:ascii="Symbol" w:hAnsi="Symbol" w:hint="default"/>
+      </w:rPr>
+    </w:lvl>
+    <w:lvl w:ilvl="7" w:tplc="0C070003" w:tentative="1">
+      <w:start w:val="1"/>
+      <w:numFmt w:val="bullet"/>
+      <w:lvlText w:val="o"/>
+      <w:lvlJc w:val="left"/>
+      <w:pPr>
+        <w:ind w:left="5400" w:hanging="360"/>
+      </w:pPr>
+      <w:rPr>
+        <w:rFonts w:ascii="Courier New" w:hAnsi="Courier New" w:cs="Courier New" w:hint="default"/>
+      </w:rPr>
+    </w:lvl>
+    <w:lvl w:ilvl="8" w:tplc="0C070005" w:tentative="1">
+      <w:start w:val="1"/>
+      <w:numFmt w:val="bullet"/>
+      <w:lvlText w:val=""/>
+      <w:lvlJc w:val="left"/>
+      <w:pPr>
+        <w:ind w:left="6120" w:hanging="360"/>
+      </w:pPr>
+      <w:rPr>
+        <w:rFonts w:ascii="Wingdings" w:hAnsi="Wingdings" w:hint="default"/>
+      </w:rPr>
+    </w:lvl>
+  </w:abstractNum>
+  <w:abstractNum w:abstractNumId="20" w15:restartNumberingAfterBreak="0">
     <w:nsid w:val="65E561E2"/>
     <w:multiLevelType w:val="hybridMultilevel"/>
     <w:tmpl w:val="E1702832"/>
@@ -9337,7 +9238,7 @@
       </w:pPr>
     </w:lvl>
   </w:abstractNum>
-  <w:abstractNum w:abstractNumId="20" w15:restartNumberingAfterBreak="0">
+  <w:abstractNum w:abstractNumId="21" w15:restartNumberingAfterBreak="0">
     <w:nsid w:val="7341665F"/>
     <w:multiLevelType w:val="hybridMultilevel"/>
     <w:tmpl w:val="2DDCAF56"/>
@@ -9450,7 +9351,7 @@
       </w:rPr>
     </w:lvl>
   </w:abstractNum>
-  <w:abstractNum w:abstractNumId="21" w15:restartNumberingAfterBreak="0">
+  <w:abstractNum w:abstractNumId="22" w15:restartNumberingAfterBreak="0">
     <w:nsid w:val="7BE317D5"/>
     <w:multiLevelType w:val="hybridMultilevel"/>
     <w:tmpl w:val="E522FCF4"/>
@@ -9594,7 +9495,7 @@
     <w:abstractNumId w:val="10"/>
   </w:num>
   <w:num w:numId="11" w16cid:durableId="495615980">
-    <w:abstractNumId w:val="20"/>
+    <w:abstractNumId w:val="21"/>
   </w:num>
   <w:num w:numId="12" w16cid:durableId="352193452">
     <w:abstractNumId w:val="10"/>
@@ -9606,7 +9507,7 @@
     <w:abstractNumId w:val="13"/>
   </w:num>
   <w:num w:numId="15" w16cid:durableId="1367827781">
-    <w:abstractNumId w:val="19"/>
+    <w:abstractNumId w:val="20"/>
   </w:num>
   <w:num w:numId="16" w16cid:durableId="1259557001">
     <w:abstractNumId w:val="7"/>
@@ -9630,10 +9531,13 @@
     <w:abstractNumId w:val="12"/>
   </w:num>
   <w:num w:numId="23" w16cid:durableId="934898026">
-    <w:abstractNumId w:val="21"/>
+    <w:abstractNumId w:val="22"/>
   </w:num>
   <w:num w:numId="24" w16cid:durableId="932397819">
     <w:abstractNumId w:val="15"/>
+  </w:num>
+  <w:num w:numId="25" w16cid:durableId="1445151520">
+    <w:abstractNumId w:val="19"/>
   </w:num>
 </w:numbering>
 </file>
@@ -22137,75 +22041,6 @@
 </file>
 
 <file path=customXml/item1.xml><?xml version="1.0" encoding="utf-8"?>
-<?mso-contentType ?>
-<FormTemplates xmlns="http://schemas.microsoft.com/sharepoint/v3/contenttype/forms">
-  <Display>DocumentLibraryForm</Display>
-  <Edit>DocumentLibraryForm</Edit>
-  <New>DocumentLibraryForm</New>
-</FormTemplates>
-</file>
-
-<file path=customXml/item2.xml><?xml version="1.0" encoding="utf-8"?>
-<b:Sources xmlns:b="http://schemas.openxmlformats.org/officeDocument/2006/bibliography" xmlns="http://schemas.openxmlformats.org/officeDocument/2006/bibliography" SelectedStyle="\APASixthEditionOfficeOnline.xsl" StyleName="APA" Version="6"/>
-</file>
-
-<file path=customXml/item3.xml><?xml version="1.0" encoding="utf-8"?>
-<?mso-contentType ?>
-<spe:Receivers xmlns:spe="http://schemas.microsoft.com/sharepoint/events">
-  <Receiver>
-    <Name>Document ID Generator</Name>
-    <Synchronization>Synchronous</Synchronization>
-    <Type>10001</Type>
-    <SequenceNumber>1000</SequenceNumber>
-    <Url/>
-    <Assembly>Microsoft.Office.DocumentManagement, Version=16.0.0.0, Culture=neutral, PublicKeyToken=71e9bce111e9429c</Assembly>
-    <Class>Microsoft.Office.DocumentManagement.Internal.DocIdHandler</Class>
-    <Data/>
-    <Filter/>
-  </Receiver>
-  <Receiver>
-    <Name>Document ID Generator</Name>
-    <Synchronization>Synchronous</Synchronization>
-    <Type>10002</Type>
-    <SequenceNumber>1001</SequenceNumber>
-    <Url/>
-    <Assembly>Microsoft.Office.DocumentManagement, Version=16.0.0.0, Culture=neutral, PublicKeyToken=71e9bce111e9429c</Assembly>
-    <Class>Microsoft.Office.DocumentManagement.Internal.DocIdHandler</Class>
-    <Data/>
-    <Filter/>
-  </Receiver>
-  <Receiver>
-    <Name>Document ID Generator</Name>
-    <Synchronization>Synchronous</Synchronization>
-    <Type>10004</Type>
-    <SequenceNumber>1002</SequenceNumber>
-    <Url/>
-    <Assembly>Microsoft.Office.DocumentManagement, Version=16.0.0.0, Culture=neutral, PublicKeyToken=71e9bce111e9429c</Assembly>
-    <Class>Microsoft.Office.DocumentManagement.Internal.DocIdHandler</Class>
-    <Data/>
-    <Filter/>
-  </Receiver>
-  <Receiver>
-    <Name>Document ID Generator</Name>
-    <Synchronization>Synchronous</Synchronization>
-    <Type>10006</Type>
-    <SequenceNumber>1003</SequenceNumber>
-    <Url/>
-    <Assembly>Microsoft.Office.DocumentManagement, Version=16.0.0.0, Culture=neutral, PublicKeyToken=71e9bce111e9429c</Assembly>
-    <Class>Microsoft.Office.DocumentManagement.Internal.DocIdHandler</Class>
-    <Data/>
-    <Filter/>
-  </Receiver>
-</spe:Receivers>
-</file>
-
-<file path=customXml/item4.xml><?xml version="1.0" encoding="utf-8"?>
-<w:settings xmlns:w="http://schemas.openxmlformats.org/wordprocessingml/2006/main">
-  <w:SpecialFormsHighlight w:val="c9c8ff"/>
-</w:settings>
-</file>
-
-<file path=customXml/item5.xml><?xml version="1.0" encoding="utf-8"?>
 <ct:contentTypeSchema xmlns:ct="http://schemas.microsoft.com/office/2006/metadata/contentType" xmlns:ma="http://schemas.microsoft.com/office/2006/metadata/properties/metaAttributes" ct:_="" ma:_="" ma:contentTypeName="Dokument" ma:contentTypeID="0x010100464D6544A015444385B10BEB1E534503" ma:contentTypeVersion="3" ma:contentTypeDescription="Ein neues Dokument erstellen." ma:contentTypeScope="" ma:versionID="97182bbd3e9b32d05dd5555f7c2bd814">
   <xsd:schema xmlns:xsd="http://www.w3.org/2001/XMLSchema" xmlns:xs="http://www.w3.org/2001/XMLSchema" xmlns:p="http://schemas.microsoft.com/office/2006/metadata/properties" xmlns:ns1="http://schemas.microsoft.com/sharepoint/v3" xmlns:ns2="http://schemas.microsoft.com/sharepoint/v3/fields" xmlns:ns3="http://schemas.microsoft.com/sharepoint/v4" xmlns:ns4="afee9e21-8e0c-452e-93ec-a70efb6b23ab" targetNamespace="http://schemas.microsoft.com/office/2006/metadata/properties" ma:root="true" ma:fieldsID="7bd051767b3e235ef3b7c10b4a85711f" ns1:_="" ns2:_="" ns3:_="" ns4:_="">
     <xsd:import namespace="http://schemas.microsoft.com/sharepoint/v3"/>
@@ -22389,6 +22224,75 @@
 </ct:contentTypeSchema>
 </file>
 
+<file path=customXml/item2.xml><?xml version="1.0" encoding="utf-8"?>
+<w:settings xmlns:w="http://schemas.openxmlformats.org/wordprocessingml/2006/main">
+  <w:SpecialFormsHighlight w:val="c9c8ff"/>
+</w:settings>
+</file>
+
+<file path=customXml/item3.xml><?xml version="1.0" encoding="utf-8"?>
+<?mso-contentType ?>
+<spe:Receivers xmlns:spe="http://schemas.microsoft.com/sharepoint/events">
+  <Receiver>
+    <Name>Document ID Generator</Name>
+    <Synchronization>Synchronous</Synchronization>
+    <Type>10001</Type>
+    <SequenceNumber>1000</SequenceNumber>
+    <Url/>
+    <Assembly>Microsoft.Office.DocumentManagement, Version=16.0.0.0, Culture=neutral, PublicKeyToken=71e9bce111e9429c</Assembly>
+    <Class>Microsoft.Office.DocumentManagement.Internal.DocIdHandler</Class>
+    <Data/>
+    <Filter/>
+  </Receiver>
+  <Receiver>
+    <Name>Document ID Generator</Name>
+    <Synchronization>Synchronous</Synchronization>
+    <Type>10002</Type>
+    <SequenceNumber>1001</SequenceNumber>
+    <Url/>
+    <Assembly>Microsoft.Office.DocumentManagement, Version=16.0.0.0, Culture=neutral, PublicKeyToken=71e9bce111e9429c</Assembly>
+    <Class>Microsoft.Office.DocumentManagement.Internal.DocIdHandler</Class>
+    <Data/>
+    <Filter/>
+  </Receiver>
+  <Receiver>
+    <Name>Document ID Generator</Name>
+    <Synchronization>Synchronous</Synchronization>
+    <Type>10004</Type>
+    <SequenceNumber>1002</SequenceNumber>
+    <Url/>
+    <Assembly>Microsoft.Office.DocumentManagement, Version=16.0.0.0, Culture=neutral, PublicKeyToken=71e9bce111e9429c</Assembly>
+    <Class>Microsoft.Office.DocumentManagement.Internal.DocIdHandler</Class>
+    <Data/>
+    <Filter/>
+  </Receiver>
+  <Receiver>
+    <Name>Document ID Generator</Name>
+    <Synchronization>Synchronous</Synchronization>
+    <Type>10006</Type>
+    <SequenceNumber>1003</SequenceNumber>
+    <Url/>
+    <Assembly>Microsoft.Office.DocumentManagement, Version=16.0.0.0, Culture=neutral, PublicKeyToken=71e9bce111e9429c</Assembly>
+    <Class>Microsoft.Office.DocumentManagement.Internal.DocIdHandler</Class>
+    <Data/>
+    <Filter/>
+  </Receiver>
+</spe:Receivers>
+</file>
+
+<file path=customXml/item4.xml><?xml version="1.0" encoding="utf-8"?>
+<b:Sources xmlns:b="http://schemas.openxmlformats.org/officeDocument/2006/bibliography" xmlns="http://schemas.openxmlformats.org/officeDocument/2006/bibliography" SelectedStyle="\APASixthEditionOfficeOnline.xsl" StyleName="APA" Version="6"/>
+</file>
+
+<file path=customXml/item5.xml><?xml version="1.0" encoding="utf-8"?>
+<?mso-contentType ?>
+<FormTemplates xmlns="http://schemas.microsoft.com/sharepoint/v3/contenttype/forms">
+  <Display>DocumentLibraryForm</Display>
+  <Edit>DocumentLibraryForm</Edit>
+  <New>DocumentLibraryForm</New>
+</FormTemplates>
+</file>
+
 <file path=customXml/item6.xml><?xml version="1.0" encoding="utf-8"?>
 <p:properties xmlns:p="http://schemas.microsoft.com/office/2006/metadata/properties" xmlns:xsi="http://www.w3.org/2001/XMLSchema-instance" xmlns:pc="http://schemas.microsoft.com/office/infopath/2007/PartnerControls">
   <documentManagement>
@@ -22406,38 +22310,6 @@
 </file>
 
 <file path=customXml/itemProps1.xml><?xml version="1.0" encoding="utf-8"?>
-<ds:datastoreItem xmlns:ds="http://schemas.openxmlformats.org/officeDocument/2006/customXml" ds:itemID="{76E5CD1D-9176-4FA7-9A9A-698AC52D8E9F}">
-  <ds:schemaRefs>
-    <ds:schemaRef ds:uri="http://schemas.microsoft.com/sharepoint/v3/contenttype/forms"/>
-  </ds:schemaRefs>
-</ds:datastoreItem>
-</file>
-
-<file path=customXml/itemProps2.xml><?xml version="1.0" encoding="utf-8"?>
-<ds:datastoreItem xmlns:ds="http://schemas.openxmlformats.org/officeDocument/2006/customXml" ds:itemID="{6685E73F-2677-4B89-8508-7813A036A081}">
-  <ds:schemaRefs>
-    <ds:schemaRef ds:uri="http://schemas.openxmlformats.org/officeDocument/2006/bibliography"/>
-  </ds:schemaRefs>
-</ds:datastoreItem>
-</file>
-
-<file path=customXml/itemProps3.xml><?xml version="1.0" encoding="utf-8"?>
-<ds:datastoreItem xmlns:ds="http://schemas.openxmlformats.org/officeDocument/2006/customXml" ds:itemID="{924007F5-9277-4670-9FE6-06782C7296A1}">
-  <ds:schemaRefs>
-    <ds:schemaRef ds:uri="http://schemas.microsoft.com/sharepoint/events"/>
-  </ds:schemaRefs>
-</ds:datastoreItem>
-</file>
-
-<file path=customXml/itemProps4.xml><?xml version="1.0" encoding="utf-8"?>
-<ds:datastoreItem xmlns:ds="http://schemas.openxmlformats.org/officeDocument/2006/customXml" ds:itemID="{5D0AEA6B-E499-4EEF-98A3-AFBB261C493E}">
-  <ds:schemaRefs>
-    <ds:schemaRef ds:uri="http://schemas.openxmlformats.org/wordprocessingml/2006/main"/>
-  </ds:schemaRefs>
-</ds:datastoreItem>
-</file>
-
-<file path=customXml/itemProps5.xml><?xml version="1.0" encoding="utf-8"?>
 <ds:datastoreItem xmlns:ds="http://schemas.openxmlformats.org/officeDocument/2006/customXml" ds:itemID="{AF3DCB32-2405-4B27-9ABA-B6FBCC24494E}">
   <ds:schemaRefs>
     <ds:schemaRef ds:uri="http://schemas.microsoft.com/office/2006/metadata/contentType"/>
@@ -22458,6 +22330,38 @@
 </ds:datastoreItem>
 </file>
 
+<file path=customXml/itemProps2.xml><?xml version="1.0" encoding="utf-8"?>
+<ds:datastoreItem xmlns:ds="http://schemas.openxmlformats.org/officeDocument/2006/customXml" ds:itemID="{5D0AEA6B-E499-4EEF-98A3-AFBB261C493E}">
+  <ds:schemaRefs>
+    <ds:schemaRef ds:uri="http://schemas.openxmlformats.org/wordprocessingml/2006/main"/>
+  </ds:schemaRefs>
+</ds:datastoreItem>
+</file>
+
+<file path=customXml/itemProps3.xml><?xml version="1.0" encoding="utf-8"?>
+<ds:datastoreItem xmlns:ds="http://schemas.openxmlformats.org/officeDocument/2006/customXml" ds:itemID="{924007F5-9277-4670-9FE6-06782C7296A1}">
+  <ds:schemaRefs>
+    <ds:schemaRef ds:uri="http://schemas.microsoft.com/sharepoint/events"/>
+  </ds:schemaRefs>
+</ds:datastoreItem>
+</file>
+
+<file path=customXml/itemProps4.xml><?xml version="1.0" encoding="utf-8"?>
+<ds:datastoreItem xmlns:ds="http://schemas.openxmlformats.org/officeDocument/2006/customXml" ds:itemID="{6685E73F-2677-4B89-8508-7813A036A081}">
+  <ds:schemaRefs>
+    <ds:schemaRef ds:uri="http://schemas.openxmlformats.org/officeDocument/2006/bibliography"/>
+  </ds:schemaRefs>
+</ds:datastoreItem>
+</file>
+
+<file path=customXml/itemProps5.xml><?xml version="1.0" encoding="utf-8"?>
+<ds:datastoreItem xmlns:ds="http://schemas.openxmlformats.org/officeDocument/2006/customXml" ds:itemID="{76E5CD1D-9176-4FA7-9A9A-698AC52D8E9F}">
+  <ds:schemaRefs>
+    <ds:schemaRef ds:uri="http://schemas.microsoft.com/sharepoint/v3/contenttype/forms"/>
+  </ds:schemaRefs>
+</ds:datastoreItem>
+</file>
+
 <file path=customXml/itemProps6.xml><?xml version="1.0" encoding="utf-8"?>
 <ds:datastoreItem xmlns:ds="http://schemas.openxmlformats.org/officeDocument/2006/customXml" ds:itemID="{80DCD561-5D0E-41FB-A5B2-A60CACB93746}">
   <ds:schemaRefs>

</xml_diff>

<commit_message>
FWF I: Add [contact] placeholder to fill out Co-ordination
</commit_message>
<xml_diff>
--- a/src/main/resources/org/damap/base/template/FWFTemplate.docx
+++ b/src/main/resources/org/damap/base/template/FWFTemplate.docx
@@ -4,7 +4,7 @@
   <w:body>
     <w:p>
       <w:pPr>
-        <w:pStyle w:val="Heading2"/>
+        <w:pStyle w:val="berschrift2"/>
         <w:rPr>
           <w:lang w:val="en-US"/>
         </w:rPr>
@@ -12,7 +12,7 @@
     </w:p>
     <w:p>
       <w:pPr>
-        <w:pStyle w:val="Heading1"/>
+        <w:pStyle w:val="berschrift1"/>
         <w:rPr>
           <w:lang w:val="en-US"/>
         </w:rPr>
@@ -20,7 +20,7 @@
     </w:p>
     <w:p>
       <w:pPr>
-        <w:pStyle w:val="Heading1"/>
+        <w:pStyle w:val="berschrift1"/>
         <w:rPr>
           <w:lang w:val="en-US"/>
         </w:rPr>
@@ -403,7 +403,7 @@
     </w:p>
     <w:p>
       <w:pPr>
-        <w:pStyle w:val="Title"/>
+        <w:pStyle w:val="Titel"/>
         <w:spacing w:after="840"/>
         <w:jc w:val="center"/>
         <w:rPr>
@@ -415,7 +415,7 @@
     </w:p>
     <w:p>
       <w:pPr>
-        <w:pStyle w:val="Title"/>
+        <w:pStyle w:val="Titel"/>
         <w:spacing w:after="840"/>
         <w:jc w:val="center"/>
         <w:rPr>
@@ -463,7 +463,31 @@
           <w:szCs w:val="64"/>
           <w:lang w:val="en-GB"/>
         </w:rPr>
-        <w:t>[projectname]</w:t>
+        <w:t>[</w:t>
+      </w:r>
+      <w:proofErr w:type="spellStart"/>
+      <w:r>
+        <w:rPr>
+          <w:b/>
+          <w:bCs/>
+          <w:color w:val="006699"/>
+          <w:sz w:val="64"/>
+          <w:szCs w:val="64"/>
+          <w:lang w:val="en-GB"/>
+        </w:rPr>
+        <w:t>projectname</w:t>
+      </w:r>
+      <w:proofErr w:type="spellEnd"/>
+      <w:r>
+        <w:rPr>
+          <w:b/>
+          <w:bCs/>
+          <w:color w:val="006699"/>
+          <w:sz w:val="64"/>
+          <w:szCs w:val="64"/>
+          <w:lang w:val="en-GB"/>
+        </w:rPr>
+        <w:t>]</w:t>
       </w:r>
     </w:p>
     <w:p>
@@ -645,14 +669,34 @@
                 <w:szCs w:val="20"/>
               </w:rPr>
             </w:pPr>
+            <w:proofErr w:type="spellStart"/>
             <w:r>
               <w:rPr>
                 <w:color w:val="92D050"/>
                 <w:sz w:val="20"/>
                 <w:szCs w:val="20"/>
               </w:rPr>
-              <w:t>dd/mm/yyyy</w:t>
+              <w:t>dd</w:t>
             </w:r>
+            <w:proofErr w:type="spellEnd"/>
+            <w:r>
+              <w:rPr>
+                <w:color w:val="92D050"/>
+                <w:sz w:val="20"/>
+                <w:szCs w:val="20"/>
+              </w:rPr>
+              <w:t>/mm/</w:t>
+            </w:r>
+            <w:proofErr w:type="spellStart"/>
+            <w:r>
+              <w:rPr>
+                <w:color w:val="92D050"/>
+                <w:sz w:val="20"/>
+                <w:szCs w:val="20"/>
+              </w:rPr>
+              <w:t>yyyy</w:t>
+            </w:r>
+            <w:proofErr w:type="spellEnd"/>
           </w:p>
         </w:tc>
         <w:tc>
@@ -997,7 +1041,7 @@
                     </wp:anchor>
                   </w:drawing>
                 </mc:Choice>
-                <mc:Fallback xmlns:a="http://schemas.openxmlformats.org/drawingml/2006/main" xmlns:wp14="http://schemas.microsoft.com/office/word/2010/wordml" xmlns:pic="http://schemas.openxmlformats.org/drawingml/2006/picture">
+                <mc:Fallback xmlns:pic="http://schemas.openxmlformats.org/drawingml/2006/picture" xmlns:wp14="http://schemas.microsoft.com/office/word/2010/wordml" xmlns:a="http://schemas.openxmlformats.org/drawingml/2006/main">
                   <w:pict w14:anchorId="7AAC8864">
                     <v:shapetype coordsize="21600,21600" o:spt="75" o:preferrelative="t" path="m@4@5l@4@11@9@11@9@5xe" type="#_x0000_t75">
                       <v:formulas>
@@ -1251,7 +1295,7 @@
           </w:tcPr>
           <w:p>
             <w:pPr>
-              <w:pStyle w:val="NoSpacing"/>
+              <w:pStyle w:val="KeinLeerraum"/>
               <w:spacing w:before="120" w:after="120"/>
               <w:ind w:left="-27"/>
               <w:rPr>
@@ -1295,7 +1339,7 @@
           </w:tcPr>
           <w:p>
             <w:pPr>
-              <w:pStyle w:val="NoSpacing"/>
+              <w:pStyle w:val="KeinLeerraum"/>
               <w:spacing w:before="120" w:after="120"/>
               <w:rPr>
                 <w:rFonts w:ascii="Arial" w:hAnsi="Arial" w:cs="Arial"/>
@@ -1331,7 +1375,7 @@
           </w:tcPr>
           <w:p>
             <w:pPr>
-              <w:pStyle w:val="NoSpacing"/>
+              <w:pStyle w:val="KeinLeerraum"/>
               <w:spacing w:before="120" w:after="120" w:line="276" w:lineRule="auto"/>
               <w:rPr>
                 <w:rFonts w:ascii="Arial" w:hAnsi="Arial" w:cs="Arial"/>
@@ -1398,7 +1442,7 @@
           </w:p>
           <w:p>
             <w:pPr>
-              <w:pStyle w:val="NoSpacing"/>
+              <w:pStyle w:val="KeinLeerraum"/>
               <w:spacing w:before="120" w:after="120" w:line="276" w:lineRule="auto"/>
               <w:rPr>
                 <w:rFonts w:ascii="Arial" w:hAnsi="Arial" w:cs="Arial"/>
@@ -1460,6 +1504,7 @@
               </w:rPr>
               <w:t>[</w:t>
             </w:r>
+            <w:proofErr w:type="spellStart"/>
             <w:r>
               <w:rPr>
                 <w:rFonts w:ascii="Arial" w:hAnsi="Arial" w:cs="Arial"/>
@@ -1470,6 +1515,7 @@
               </w:rPr>
               <w:t>grantid</w:t>
             </w:r>
+            <w:proofErr w:type="spellEnd"/>
             <w:r>
               <w:rPr>
                 <w:rFonts w:ascii="Arial" w:hAnsi="Arial" w:cs="Arial"/>
@@ -1483,7 +1529,7 @@
           </w:p>
           <w:p>
             <w:pPr>
-              <w:pStyle w:val="NoSpacing"/>
+              <w:pStyle w:val="KeinLeerraum"/>
               <w:spacing w:before="120" w:after="120" w:line="276" w:lineRule="auto"/>
               <w:rPr>
                 <w:rFonts w:ascii="Arial" w:hAnsi="Arial" w:cs="Arial"/>
@@ -1517,12 +1563,36 @@
                 <w:szCs w:val="18"/>
                 <w:lang w:val="en-GB"/>
               </w:rPr>
-              <w:t>[projectid]</w:t>
+              <w:t>[</w:t>
+            </w:r>
+            <w:proofErr w:type="spellStart"/>
+            <w:r>
+              <w:rPr>
+                <w:rFonts w:ascii="Arial" w:hAnsi="Arial" w:cs="Arial"/>
+                <w:iCs/>
+                <w:color w:val="000000" w:themeColor="text1"/>
+                <w:sz w:val="18"/>
+                <w:szCs w:val="18"/>
+                <w:lang w:val="en-GB"/>
+              </w:rPr>
+              <w:t>projectid</w:t>
+            </w:r>
+            <w:proofErr w:type="spellEnd"/>
+            <w:r>
+              <w:rPr>
+                <w:rFonts w:ascii="Arial" w:hAnsi="Arial" w:cs="Arial"/>
+                <w:iCs/>
+                <w:color w:val="000000" w:themeColor="text1"/>
+                <w:sz w:val="18"/>
+                <w:szCs w:val="18"/>
+                <w:lang w:val="en-GB"/>
+              </w:rPr>
+              <w:t>]</w:t>
             </w:r>
           </w:p>
           <w:p>
             <w:pPr>
-              <w:pStyle w:val="NoSpacing"/>
+              <w:pStyle w:val="KeinLeerraum"/>
               <w:spacing w:before="120" w:after="120" w:line="276" w:lineRule="auto"/>
               <w:rPr>
                 <w:rFonts w:ascii="Arial" w:hAnsi="Arial" w:cs="Arial"/>
@@ -1543,34 +1613,10 @@
                 <w:szCs w:val="18"/>
                 <w:lang w:val="de-AT"/>
               </w:rPr>
-              <w:t>DMP version:</w:t>
+              <w:t xml:space="preserve">DMP </w:t>
             </w:r>
+            <w:proofErr w:type="spellStart"/>
             <w:r>
-              <w:rPr>
-                <w:rFonts w:ascii="Arial" w:hAnsi="Arial" w:cs="Arial"/>
-                <w:iCs/>
-                <w:sz w:val="18"/>
-                <w:szCs w:val="18"/>
-                <w:lang w:val="de-AT"/>
-              </w:rPr>
-              <w:t xml:space="preserve"> </w:t>
-            </w:r>
-            <w:r>
-              <w:rPr>
-                <w:rFonts w:ascii="Arial" w:hAnsi="Arial" w:cs="Arial"/>
-                <w:iCs/>
-                <w:color w:val="92D050"/>
-                <w:sz w:val="18"/>
-                <w:szCs w:val="18"/>
-                <w:lang w:val="de-AT"/>
-              </w:rPr>
-              <w:t>[Nr.], [dd.mm.yyyy]</w:t>
-            </w:r>
-          </w:p>
-          <w:p>
-            <w:pPr>
-              <w:pStyle w:val="NoSpacing"/>
-              <w:spacing w:before="120" w:after="120" w:line="276" w:lineRule="auto"/>
               <w:rPr>
                 <w:rFonts w:ascii="Arial" w:hAnsi="Arial" w:cs="Arial"/>
                 <w:b/>
@@ -1580,7 +1626,9 @@
                 <w:szCs w:val="18"/>
                 <w:lang w:val="de-AT"/>
               </w:rPr>
-            </w:pPr>
+              <w:t>version</w:t>
+            </w:r>
+            <w:proofErr w:type="spellEnd"/>
             <w:r>
               <w:rPr>
                 <w:rFonts w:ascii="Arial" w:hAnsi="Arial" w:cs="Arial"/>
@@ -1591,9 +1639,60 @@
                 <w:szCs w:val="18"/>
                 <w:lang w:val="de-AT"/>
               </w:rPr>
-              <w:t>C</w:t>
+              <w:t>:</w:t>
             </w:r>
             <w:r>
+              <w:rPr>
+                <w:rFonts w:ascii="Arial" w:hAnsi="Arial" w:cs="Arial"/>
+                <w:iCs/>
+                <w:sz w:val="18"/>
+                <w:szCs w:val="18"/>
+                <w:lang w:val="de-AT"/>
+              </w:rPr>
+              <w:t xml:space="preserve"> </w:t>
+            </w:r>
+            <w:r>
+              <w:rPr>
+                <w:rFonts w:ascii="Arial" w:hAnsi="Arial" w:cs="Arial"/>
+                <w:iCs/>
+                <w:color w:val="92D050"/>
+                <w:sz w:val="18"/>
+                <w:szCs w:val="18"/>
+                <w:lang w:val="de-AT"/>
+              </w:rPr>
+              <w:t>[Nr.], [</w:t>
+            </w:r>
+            <w:proofErr w:type="spellStart"/>
+            <w:proofErr w:type="gramStart"/>
+            <w:r>
+              <w:rPr>
+                <w:rFonts w:ascii="Arial" w:hAnsi="Arial" w:cs="Arial"/>
+                <w:iCs/>
+                <w:color w:val="92D050"/>
+                <w:sz w:val="18"/>
+                <w:szCs w:val="18"/>
+                <w:lang w:val="de-AT"/>
+              </w:rPr>
+              <w:t>dd.mm.yyyy</w:t>
+            </w:r>
+            <w:proofErr w:type="spellEnd"/>
+            <w:proofErr w:type="gramEnd"/>
+            <w:r>
+              <w:rPr>
+                <w:rFonts w:ascii="Arial" w:hAnsi="Arial" w:cs="Arial"/>
+                <w:iCs/>
+                <w:color w:val="92D050"/>
+                <w:sz w:val="18"/>
+                <w:szCs w:val="18"/>
+                <w:lang w:val="de-AT"/>
+              </w:rPr>
+              <w:t>]</w:t>
+            </w:r>
+          </w:p>
+          <w:p>
+            <w:pPr>
+              <w:pStyle w:val="KeinLeerraum"/>
+              <w:spacing w:before="120" w:after="120" w:line="276" w:lineRule="auto"/>
               <w:rPr>
                 <w:rFonts w:ascii="Arial" w:hAnsi="Arial" w:cs="Arial"/>
                 <w:b/>
@@ -1603,12 +1702,49 @@
                 <w:szCs w:val="18"/>
                 <w:lang w:val="de-AT"/>
               </w:rPr>
-              <w:t>ontributors:</w:t>
+            </w:pPr>
+            <w:proofErr w:type="spellStart"/>
+            <w:r>
+              <w:rPr>
+                <w:rFonts w:ascii="Arial" w:hAnsi="Arial" w:cs="Arial"/>
+                <w:b/>
+                <w:bCs/>
+                <w:iCs/>
+                <w:sz w:val="18"/>
+                <w:szCs w:val="18"/>
+                <w:lang w:val="de-AT"/>
+              </w:rPr>
+              <w:t>C</w:t>
+            </w:r>
+            <w:r>
+              <w:rPr>
+                <w:rFonts w:ascii="Arial" w:hAnsi="Arial" w:cs="Arial"/>
+                <w:b/>
+                <w:bCs/>
+                <w:iCs/>
+                <w:sz w:val="18"/>
+                <w:szCs w:val="18"/>
+                <w:lang w:val="de-AT"/>
+              </w:rPr>
+              <w:t>ontributors</w:t>
+            </w:r>
+            <w:proofErr w:type="spellEnd"/>
+            <w:r>
+              <w:rPr>
+                <w:rFonts w:ascii="Arial" w:hAnsi="Arial" w:cs="Arial"/>
+                <w:b/>
+                <w:bCs/>
+                <w:iCs/>
+                <w:sz w:val="18"/>
+                <w:szCs w:val="18"/>
+                <w:lang w:val="de-AT"/>
+              </w:rPr>
+              <w:t>:</w:t>
             </w:r>
           </w:p>
           <w:p>
             <w:pPr>
-              <w:pStyle w:val="NoSpacing"/>
+              <w:pStyle w:val="KeinLeerraum"/>
               <w:spacing w:before="120" w:after="120"/>
               <w:rPr>
                 <w:rFonts w:ascii="Arial" w:hAnsi="Arial" w:cs="Arial"/>
@@ -1626,7 +1762,29 @@
                 <w:szCs w:val="18"/>
                 <w:lang w:val="de-AT"/>
               </w:rPr>
-              <w:t>[contributors]</w:t>
+              <w:t>[</w:t>
+            </w:r>
+            <w:proofErr w:type="spellStart"/>
+            <w:r>
+              <w:rPr>
+                <w:rFonts w:ascii="Arial" w:hAnsi="Arial" w:cs="Arial"/>
+                <w:iCs/>
+                <w:sz w:val="18"/>
+                <w:szCs w:val="18"/>
+                <w:lang w:val="de-AT"/>
+              </w:rPr>
+              <w:t>contributors</w:t>
+            </w:r>
+            <w:proofErr w:type="spellEnd"/>
+            <w:r>
+              <w:rPr>
+                <w:rFonts w:ascii="Arial" w:hAnsi="Arial" w:cs="Arial"/>
+                <w:iCs/>
+                <w:sz w:val="18"/>
+                <w:szCs w:val="18"/>
+                <w:lang w:val="de-AT"/>
+              </w:rPr>
+              <w:t>]</w:t>
             </w:r>
           </w:p>
         </w:tc>
@@ -1649,7 +1807,7 @@
           </w:tcPr>
           <w:p>
             <w:pPr>
-              <w:pStyle w:val="NoSpacing"/>
+              <w:pStyle w:val="KeinLeerraum"/>
               <w:spacing w:before="120" w:after="120"/>
               <w:rPr>
                 <w:rFonts w:ascii="Arial" w:hAnsi="Arial" w:cs="Arial"/>
@@ -1685,7 +1843,7 @@
           </w:tcPr>
           <w:p>
             <w:pPr>
-              <w:pStyle w:val="NoSpacing"/>
+              <w:pStyle w:val="KeinLeerraum"/>
               <w:spacing w:before="120" w:after="120" w:line="276" w:lineRule="auto"/>
               <w:rPr>
                 <w:rFonts w:ascii="Arial" w:hAnsi="Arial" w:cs="Arial"/>
@@ -1751,7 +1909,7 @@
           </w:p>
           <w:p>
             <w:pPr>
-              <w:pStyle w:val="NoSpacing"/>
+              <w:pStyle w:val="KeinLeerraum"/>
               <w:spacing w:before="120" w:after="120" w:line="276" w:lineRule="auto"/>
               <w:rPr>
                 <w:rFonts w:ascii="Arial" w:hAnsi="Arial" w:cs="Arial"/>
@@ -1769,7 +1927,29 @@
                 <w:szCs w:val="18"/>
                 <w:lang w:val="en-GB"/>
               </w:rPr>
-              <w:t>Co-ordination of data management responsibilities across partners:</w:t>
+              <w:t>Co-ordination of data management responsibilities across partners</w:t>
+            </w:r>
+            <w:r>
+              <w:rPr>
+                <w:rFonts w:ascii="Arial" w:hAnsi="Arial" w:cs="Arial"/>
+                <w:b/>
+                <w:bCs/>
+                <w:iCs/>
+                <w:sz w:val="18"/>
+                <w:szCs w:val="18"/>
+                <w:lang w:val="en-GB"/>
+              </w:rPr>
+              <w:t>:</w:t>
+            </w:r>
+            <w:r>
+              <w:rPr>
+                <w:rFonts w:ascii="Arial" w:hAnsi="Arial" w:cs="Arial"/>
+                <w:iCs/>
+                <w:sz w:val="18"/>
+                <w:szCs w:val="18"/>
+                <w:lang w:val="en-GB"/>
+              </w:rPr>
+              <w:t xml:space="preserve"> [contact]</w:t>
             </w:r>
             <w:r>
               <w:rPr>
@@ -2086,7 +2266,25 @@
                       <w:sz w:val="18"/>
                       <w:szCs w:val="18"/>
                     </w:rPr>
-                    <w:t>[costTable]</w:t>
+                    <w:t>[</w:t>
+                  </w:r>
+                  <w:proofErr w:type="spellStart"/>
+                  <w:r>
+                    <w:rPr>
+                      <w:bCs/>
+                      <w:sz w:val="18"/>
+                      <w:szCs w:val="18"/>
+                    </w:rPr>
+                    <w:t>costTable</w:t>
+                  </w:r>
+                  <w:proofErr w:type="spellEnd"/>
+                  <w:r>
+                    <w:rPr>
+                      <w:bCs/>
+                      <w:sz w:val="18"/>
+                      <w:szCs w:val="18"/>
+                    </w:rPr>
+                    <w:t>]</w:t>
                   </w:r>
                 </w:p>
               </w:tc>
@@ -2113,7 +2311,25 @@
                       <w:sz w:val="18"/>
                       <w:szCs w:val="18"/>
                     </w:rPr>
-                    <w:t>[costTable]</w:t>
+                    <w:t>[</w:t>
+                  </w:r>
+                  <w:proofErr w:type="spellStart"/>
+                  <w:r>
+                    <w:rPr>
+                      <w:bCs/>
+                      <w:sz w:val="18"/>
+                      <w:szCs w:val="18"/>
+                    </w:rPr>
+                    <w:t>costTable</w:t>
+                  </w:r>
+                  <w:proofErr w:type="spellEnd"/>
+                  <w:r>
+                    <w:rPr>
+                      <w:bCs/>
+                      <w:sz w:val="18"/>
+                      <w:szCs w:val="18"/>
+                    </w:rPr>
+                    <w:t>]</w:t>
                   </w:r>
                 </w:p>
               </w:tc>
@@ -2392,7 +2608,25 @@
                       <w:sz w:val="18"/>
                       <w:szCs w:val="18"/>
                     </w:rPr>
-                    <w:t>[costcurrency]</w:t>
+                    <w:t>[</w:t>
+                  </w:r>
+                  <w:proofErr w:type="spellStart"/>
+                  <w:r>
+                    <w:rPr>
+                      <w:b/>
+                      <w:sz w:val="18"/>
+                      <w:szCs w:val="18"/>
+                    </w:rPr>
+                    <w:t>costcurrency</w:t>
+                  </w:r>
+                  <w:proofErr w:type="spellEnd"/>
+                  <w:r>
+                    <w:rPr>
+                      <w:b/>
+                      <w:sz w:val="18"/>
+                      <w:szCs w:val="18"/>
+                    </w:rPr>
+                    <w:t>]</w:t>
                   </w:r>
                 </w:p>
               </w:tc>
@@ -2421,7 +2655,25 @@
                       <w:sz w:val="18"/>
                       <w:szCs w:val="18"/>
                     </w:rPr>
-                    <w:t>[costtotal]</w:t>
+                    <w:t>[</w:t>
+                  </w:r>
+                  <w:proofErr w:type="spellStart"/>
+                  <w:r>
+                    <w:rPr>
+                      <w:b/>
+                      <w:sz w:val="18"/>
+                      <w:szCs w:val="18"/>
+                    </w:rPr>
+                    <w:t>costtotal</w:t>
+                  </w:r>
+                  <w:proofErr w:type="spellEnd"/>
+                  <w:r>
+                    <w:rPr>
+                      <w:b/>
+                      <w:sz w:val="18"/>
+                      <w:szCs w:val="18"/>
+                    </w:rPr>
+                    <w:t>]</w:t>
                   </w:r>
                 </w:p>
               </w:tc>
@@ -2444,8 +2696,9 @@
                 <w:szCs w:val="18"/>
                 <w:lang w:val="en-GB"/>
               </w:rPr>
-              <w:t>[costsDescription</w:t>
+              <w:t>[</w:t>
             </w:r>
+            <w:proofErr w:type="spellStart"/>
             <w:r>
               <w:rPr>
                 <w:rFonts w:ascii="Arial" w:hAnsi="Arial" w:cs="Arial"/>
@@ -2453,8 +2706,18 @@
                 <w:szCs w:val="18"/>
                 <w:lang w:val="en-GB"/>
               </w:rPr>
+              <w:t>costsDescription</w:t>
+            </w:r>
+            <w:r>
+              <w:rPr>
+                <w:rFonts w:ascii="Arial" w:hAnsi="Arial" w:cs="Arial"/>
+                <w:sz w:val="18"/>
+                <w:szCs w:val="18"/>
+                <w:lang w:val="en-GB"/>
+              </w:rPr>
               <w:t>s</w:t>
             </w:r>
+            <w:proofErr w:type="spellEnd"/>
             <w:r>
               <w:rPr>
                 <w:rFonts w:ascii="Arial" w:hAnsi="Arial" w:cs="Arial"/>
@@ -2472,7 +2735,29 @@
                 <w:szCs w:val="18"/>
                 <w:lang w:val="en-GB"/>
               </w:rPr>
-              <w:t>[costCoverage]</w:t>
+              <w:t>[</w:t>
+            </w:r>
+            <w:proofErr w:type="spellStart"/>
+            <w:r>
+              <w:rPr>
+                <w:rFonts w:ascii="Arial" w:hAnsi="Arial" w:cs="Arial"/>
+                <w:color w:val="92D050"/>
+                <w:sz w:val="18"/>
+                <w:szCs w:val="18"/>
+                <w:lang w:val="en-GB"/>
+              </w:rPr>
+              <w:t>costCoverage</w:t>
+            </w:r>
+            <w:proofErr w:type="spellEnd"/>
+            <w:r>
+              <w:rPr>
+                <w:rFonts w:ascii="Arial" w:hAnsi="Arial" w:cs="Arial"/>
+                <w:color w:val="92D050"/>
+                <w:sz w:val="18"/>
+                <w:szCs w:val="18"/>
+                <w:lang w:val="en-GB"/>
+              </w:rPr>
+              <w:t>]</w:t>
             </w:r>
           </w:p>
         </w:tc>
@@ -2490,7 +2775,7 @@
           </w:tcPr>
           <w:p>
             <w:pPr>
-              <w:pStyle w:val="NoSpacing"/>
+              <w:pStyle w:val="KeinLeerraum"/>
               <w:spacing w:before="120" w:after="120"/>
               <w:rPr>
                 <w:rFonts w:ascii="Arial" w:hAnsi="Arial" w:cs="Arial"/>
@@ -2527,7 +2812,7 @@
           </w:tcPr>
           <w:p>
             <w:pPr>
-              <w:pStyle w:val="NoSpacing"/>
+              <w:pStyle w:val="KeinLeerraum"/>
               <w:spacing w:before="120" w:after="120"/>
               <w:rPr>
                 <w:rFonts w:ascii="Arial" w:hAnsi="Arial" w:cs="Arial"/>
@@ -2894,7 +3179,23 @@
                       <w:sz w:val="18"/>
                       <w:szCs w:val="18"/>
                     </w:rPr>
-                    <w:t>[datasetTable]</w:t>
+                    <w:t>[</w:t>
+                  </w:r>
+                  <w:proofErr w:type="spellStart"/>
+                  <w:r>
+                    <w:rPr>
+                      <w:sz w:val="18"/>
+                      <w:szCs w:val="18"/>
+                    </w:rPr>
+                    <w:t>datasetTable</w:t>
+                  </w:r>
+                  <w:proofErr w:type="spellEnd"/>
+                  <w:r>
+                    <w:rPr>
+                      <w:sz w:val="18"/>
+                      <w:szCs w:val="18"/>
+                    </w:rPr>
+                    <w:t>]</w:t>
                   </w:r>
                 </w:p>
               </w:tc>
@@ -3222,7 +3523,27 @@
                 <w:szCs w:val="18"/>
                 <w:lang w:val="en-GB"/>
               </w:rPr>
-              <w:t>[datasetTechnicalResources]</w:t>
+              <w:t>[</w:t>
+            </w:r>
+            <w:proofErr w:type="spellStart"/>
+            <w:r>
+              <w:rPr>
+                <w:rFonts w:ascii="Arial" w:hAnsi="Arial" w:cs="Arial"/>
+                <w:sz w:val="18"/>
+                <w:szCs w:val="18"/>
+                <w:lang w:val="en-GB"/>
+              </w:rPr>
+              <w:t>datasetTechnicalResources</w:t>
+            </w:r>
+            <w:proofErr w:type="spellEnd"/>
+            <w:r>
+              <w:rPr>
+                <w:rFonts w:ascii="Arial" w:hAnsi="Arial" w:cs="Arial"/>
+                <w:sz w:val="18"/>
+                <w:szCs w:val="18"/>
+                <w:lang w:val="en-GB"/>
+              </w:rPr>
+              <w:t>]</w:t>
             </w:r>
           </w:p>
           <w:p>
@@ -3507,7 +3828,23 @@
                       <w:sz w:val="18"/>
                       <w:szCs w:val="18"/>
                     </w:rPr>
-                    <w:t>[reusedDatasetTable]</w:t>
+                    <w:t>[</w:t>
+                  </w:r>
+                  <w:proofErr w:type="spellStart"/>
+                  <w:r>
+                    <w:rPr>
+                      <w:sz w:val="18"/>
+                      <w:szCs w:val="18"/>
+                    </w:rPr>
+                    <w:t>reusedDatasetTable</w:t>
+                  </w:r>
+                  <w:proofErr w:type="spellEnd"/>
+                  <w:r>
+                    <w:rPr>
+                      <w:sz w:val="18"/>
+                      <w:szCs w:val="18"/>
+                    </w:rPr>
+                    <w:t>]</w:t>
                   </w:r>
                 </w:p>
               </w:tc>
@@ -3666,7 +4003,23 @@
                       <w:sz w:val="18"/>
                       <w:szCs w:val="18"/>
                     </w:rPr>
-                    <w:t>[reusedDatasetTable]</w:t>
+                    <w:t>[</w:t>
+                  </w:r>
+                  <w:proofErr w:type="spellStart"/>
+                  <w:r>
+                    <w:rPr>
+                      <w:sz w:val="18"/>
+                      <w:szCs w:val="18"/>
+                    </w:rPr>
+                    <w:t>reusedDatasetTable</w:t>
+                  </w:r>
+                  <w:proofErr w:type="spellEnd"/>
+                  <w:r>
+                    <w:rPr>
+                      <w:sz w:val="18"/>
+                      <w:szCs w:val="18"/>
+                    </w:rPr>
+                    <w:t>]</w:t>
                   </w:r>
                 </w:p>
               </w:tc>
@@ -3816,7 +4169,27 @@
                 <w:szCs w:val="18"/>
                 <w:lang w:val="en-GB"/>
               </w:rPr>
-              <w:t>[datageneration]</w:t>
+              <w:t>[</w:t>
+            </w:r>
+            <w:proofErr w:type="spellStart"/>
+            <w:r>
+              <w:rPr>
+                <w:rFonts w:ascii="Arial" w:hAnsi="Arial" w:cs="Arial"/>
+                <w:sz w:val="18"/>
+                <w:szCs w:val="18"/>
+                <w:lang w:val="en-GB"/>
+              </w:rPr>
+              <w:t>datageneration</w:t>
+            </w:r>
+            <w:proofErr w:type="spellEnd"/>
+            <w:r>
+              <w:rPr>
+                <w:rFonts w:ascii="Arial" w:hAnsi="Arial" w:cs="Arial"/>
+                <w:sz w:val="18"/>
+                <w:szCs w:val="18"/>
+                <w:lang w:val="en-GB"/>
+              </w:rPr>
+              <w:t>]</w:t>
             </w:r>
           </w:p>
         </w:tc>
@@ -3834,7 +4207,7 @@
           </w:tcPr>
           <w:p>
             <w:pPr>
-              <w:pStyle w:val="NoSpacing"/>
+              <w:pStyle w:val="KeinLeerraum"/>
               <w:spacing w:before="120" w:after="120"/>
               <w:rPr>
                 <w:rFonts w:ascii="Arial" w:hAnsi="Arial" w:cs="Arial"/>
@@ -3854,6 +4227,7 @@
                 <w:szCs w:val="18"/>
                 <w:lang w:val="en-GB"/>
               </w:rPr>
+              <w:lastRenderedPageBreak/>
               <w:t xml:space="preserve">III Documentation and Data Quality </w:t>
             </w:r>
           </w:p>
@@ -3871,7 +4245,7 @@
           </w:tcPr>
           <w:p>
             <w:pPr>
-              <w:pStyle w:val="NoSpacing"/>
+              <w:pStyle w:val="KeinLeerraum"/>
               <w:spacing w:before="120" w:after="120"/>
               <w:rPr>
                 <w:rFonts w:ascii="Arial" w:hAnsi="Arial" w:cs="Arial"/>
@@ -3953,7 +4327,27 @@
                 <w:szCs w:val="18"/>
                 <w:lang w:val="en-US"/>
               </w:rPr>
-              <w:t>[dataorganisation]</w:t>
+              <w:t>[</w:t>
+            </w:r>
+            <w:proofErr w:type="spellStart"/>
+            <w:r>
+              <w:rPr>
+                <w:rFonts w:ascii="Arial" w:hAnsi="Arial" w:cs="Arial"/>
+                <w:sz w:val="18"/>
+                <w:szCs w:val="18"/>
+                <w:lang w:val="en-US"/>
+              </w:rPr>
+              <w:t>dataorganisation</w:t>
+            </w:r>
+            <w:proofErr w:type="spellEnd"/>
+            <w:r>
+              <w:rPr>
+                <w:rFonts w:ascii="Arial" w:hAnsi="Arial" w:cs="Arial"/>
+                <w:sz w:val="18"/>
+                <w:szCs w:val="18"/>
+                <w:lang w:val="en-US"/>
+              </w:rPr>
+              <w:t>]</w:t>
             </w:r>
           </w:p>
           <w:p>
@@ -4068,7 +4462,7 @@
           </w:tcPr>
           <w:p>
             <w:pPr>
-              <w:pStyle w:val="NoSpacing"/>
+              <w:pStyle w:val="KeinLeerraum"/>
               <w:spacing w:before="120" w:after="120"/>
               <w:rPr>
                 <w:rFonts w:ascii="Arial" w:hAnsi="Arial" w:cs="Arial"/>
@@ -4155,7 +4549,27 @@
                 <w:szCs w:val="18"/>
                 <w:lang w:val="en-US"/>
               </w:rPr>
-              <w:t>[dataqualitycontrol]</w:t>
+              <w:t>[</w:t>
+            </w:r>
+            <w:proofErr w:type="spellStart"/>
+            <w:r>
+              <w:rPr>
+                <w:rFonts w:ascii="Arial" w:eastAsia="Arial" w:hAnsi="Arial" w:cs="Arial"/>
+                <w:sz w:val="18"/>
+                <w:szCs w:val="18"/>
+                <w:lang w:val="en-US"/>
+              </w:rPr>
+              <w:t>dataqualitycontrol</w:t>
+            </w:r>
+            <w:proofErr w:type="spellEnd"/>
+            <w:r>
+              <w:rPr>
+                <w:rFonts w:ascii="Arial" w:eastAsia="Arial" w:hAnsi="Arial" w:cs="Arial"/>
+                <w:sz w:val="18"/>
+                <w:szCs w:val="18"/>
+                <w:lang w:val="en-US"/>
+              </w:rPr>
+              <w:t>]</w:t>
             </w:r>
           </w:p>
         </w:tc>
@@ -4173,7 +4587,7 @@
           </w:tcPr>
           <w:p>
             <w:pPr>
-              <w:pStyle w:val="NoSpacing"/>
+              <w:pStyle w:val="KeinLeerraum"/>
               <w:spacing w:before="120" w:after="120"/>
               <w:rPr>
                 <w:rFonts w:ascii="Arial" w:hAnsi="Arial" w:cs="Arial"/>
@@ -4217,7 +4631,7 @@
           </w:tcPr>
           <w:p>
             <w:pPr>
-              <w:pStyle w:val="NoSpacing"/>
+              <w:pStyle w:val="KeinLeerraum"/>
               <w:spacing w:before="120" w:after="120"/>
               <w:rPr>
                 <w:rFonts w:ascii="Arial" w:hAnsi="Arial" w:cs="Arial"/>
@@ -4253,7 +4667,7 @@
           </w:tcPr>
           <w:p>
             <w:pPr>
-              <w:pStyle w:val="Heading3"/>
+              <w:pStyle w:val="berschrift3"/>
               <w:spacing w:before="120" w:line="276" w:lineRule="auto"/>
               <w:rPr>
                 <w:color w:val="auto"/>
@@ -4289,7 +4703,27 @@
                 <w:szCs w:val="18"/>
                 <w:lang w:val="en-GB"/>
               </w:rPr>
-              <w:t>[storageintro]</w:t>
+              <w:t>[</w:t>
+            </w:r>
+            <w:proofErr w:type="spellStart"/>
+            <w:r>
+              <w:rPr>
+                <w:rFonts w:ascii="Arial" w:hAnsi="Arial" w:cs="Arial"/>
+                <w:sz w:val="18"/>
+                <w:szCs w:val="18"/>
+                <w:lang w:val="en-GB"/>
+              </w:rPr>
+              <w:t>storageintro</w:t>
+            </w:r>
+            <w:proofErr w:type="spellEnd"/>
+            <w:r>
+              <w:rPr>
+                <w:rFonts w:ascii="Arial" w:hAnsi="Arial" w:cs="Arial"/>
+                <w:sz w:val="18"/>
+                <w:szCs w:val="18"/>
+                <w:lang w:val="en-GB"/>
+              </w:rPr>
+              <w:t>]</w:t>
             </w:r>
             <w:r>
               <w:rPr>
@@ -4369,8 +4803,9 @@
                 <w:szCs w:val="18"/>
                 <w:lang w:val="en-GB"/>
               </w:rPr>
-              <w:t>[sensitive</w:t>
+              <w:t>[</w:t>
             </w:r>
+            <w:proofErr w:type="spellStart"/>
             <w:r>
               <w:rPr>
                 <w:rFonts w:ascii="Arial" w:hAnsi="Arial" w:cs="Arial"/>
@@ -4378,8 +4813,18 @@
                 <w:szCs w:val="18"/>
                 <w:lang w:val="en-GB"/>
               </w:rPr>
+              <w:t>sensitive</w:t>
+            </w:r>
+            <w:r>
+              <w:rPr>
+                <w:rFonts w:ascii="Arial" w:hAnsi="Arial" w:cs="Arial"/>
+                <w:sz w:val="18"/>
+                <w:szCs w:val="18"/>
+                <w:lang w:val="en-GB"/>
+              </w:rPr>
               <w:t>data</w:t>
             </w:r>
+            <w:proofErr w:type="spellEnd"/>
             <w:r>
               <w:rPr>
                 <w:rFonts w:ascii="Arial" w:hAnsi="Arial" w:cs="Arial"/>
@@ -4611,7 +5056,23 @@
                       <w:sz w:val="18"/>
                       <w:szCs w:val="18"/>
                     </w:rPr>
-                    <w:t>[datasetAccessTable]</w:t>
+                    <w:t>[</w:t>
+                  </w:r>
+                  <w:proofErr w:type="spellStart"/>
+                  <w:r>
+                    <w:rPr>
+                      <w:sz w:val="18"/>
+                      <w:szCs w:val="18"/>
+                    </w:rPr>
+                    <w:t>datasetAccessTable</w:t>
+                  </w:r>
+                  <w:proofErr w:type="spellEnd"/>
+                  <w:r>
+                    <w:rPr>
+                      <w:sz w:val="18"/>
+                      <w:szCs w:val="18"/>
+                    </w:rPr>
+                    <w:t>]</w:t>
                   </w:r>
                 </w:p>
               </w:tc>
@@ -4800,7 +5261,7 @@
           </w:tcPr>
           <w:p>
             <w:pPr>
-              <w:pStyle w:val="NoSpacing"/>
+              <w:pStyle w:val="KeinLeerraum"/>
               <w:spacing w:before="120" w:after="120"/>
               <w:rPr>
                 <w:rFonts w:ascii="Arial" w:hAnsi="Arial" w:cs="Arial"/>
@@ -4837,7 +5298,7 @@
           </w:tcPr>
           <w:p>
             <w:pPr>
-              <w:pStyle w:val="Heading3"/>
+              <w:pStyle w:val="berschrift3"/>
               <w:spacing w:before="120" w:line="276" w:lineRule="auto"/>
               <w:rPr>
                 <w:b/>
@@ -5145,7 +5606,23 @@
                       <w:sz w:val="18"/>
                       <w:szCs w:val="18"/>
                     </w:rPr>
-                    <w:t>[datasetPublicationTable]</w:t>
+                    <w:t>[</w:t>
+                  </w:r>
+                  <w:proofErr w:type="spellStart"/>
+                  <w:r>
+                    <w:rPr>
+                      <w:sz w:val="18"/>
+                      <w:szCs w:val="18"/>
+                    </w:rPr>
+                    <w:t>datasetPublicationTable</w:t>
+                  </w:r>
+                  <w:proofErr w:type="spellEnd"/>
+                  <w:r>
+                    <w:rPr>
+                      <w:sz w:val="18"/>
+                      <w:szCs w:val="18"/>
+                    </w:rPr>
+                    <w:t>]</w:t>
                   </w:r>
                 </w:p>
               </w:tc>
@@ -5384,8 +5861,9 @@
                 <w:szCs w:val="18"/>
                 <w:lang w:val="en-GB"/>
               </w:rPr>
-              <w:t>[closed</w:t>
+              <w:t>[</w:t>
             </w:r>
+            <w:proofErr w:type="spellStart"/>
             <w:r>
               <w:rPr>
                 <w:rFonts w:ascii="Arial" w:hAnsi="Arial" w:cs="Arial"/>
@@ -5393,7 +5871,7 @@
                 <w:szCs w:val="18"/>
                 <w:lang w:val="en-GB"/>
               </w:rPr>
-              <w:t>restricted</w:t>
+              <w:t>closed</w:t>
             </w:r>
             <w:r>
               <w:rPr>
@@ -5402,7 +5880,26 @@
                 <w:szCs w:val="18"/>
                 <w:lang w:val="en-GB"/>
               </w:rPr>
-              <w:t>datasetreasons]</w:t>
+              <w:t>restricted</w:t>
+            </w:r>
+            <w:r>
+              <w:rPr>
+                <w:rFonts w:ascii="Arial" w:hAnsi="Arial" w:cs="Arial"/>
+                <w:sz w:val="18"/>
+                <w:szCs w:val="18"/>
+                <w:lang w:val="en-GB"/>
+              </w:rPr>
+              <w:t>datasetreasons</w:t>
+            </w:r>
+            <w:proofErr w:type="spellEnd"/>
+            <w:r>
+              <w:rPr>
+                <w:rFonts w:ascii="Arial" w:hAnsi="Arial" w:cs="Arial"/>
+                <w:sz w:val="18"/>
+                <w:szCs w:val="18"/>
+                <w:lang w:val="en-GB"/>
+              </w:rPr>
+              <w:t>]</w:t>
             </w:r>
           </w:p>
           <w:p>
@@ -5422,7 +5919,27 @@
                 <w:szCs w:val="18"/>
                 <w:lang w:val="en-GB"/>
               </w:rPr>
-              <w:t>[repoinformation]</w:t>
+              <w:t>[</w:t>
+            </w:r>
+            <w:proofErr w:type="spellStart"/>
+            <w:r>
+              <w:rPr>
+                <w:rFonts w:ascii="Arial" w:hAnsi="Arial" w:cs="Arial"/>
+                <w:sz w:val="18"/>
+                <w:szCs w:val="18"/>
+                <w:lang w:val="en-GB"/>
+              </w:rPr>
+              <w:t>repoinformation</w:t>
+            </w:r>
+            <w:proofErr w:type="spellEnd"/>
+            <w:r>
+              <w:rPr>
+                <w:rFonts w:ascii="Arial" w:hAnsi="Arial" w:cs="Arial"/>
+                <w:sz w:val="18"/>
+                <w:szCs w:val="18"/>
+                <w:lang w:val="en-GB"/>
+              </w:rPr>
+              <w:t>]</w:t>
             </w:r>
           </w:p>
           <w:p>
@@ -5462,13 +5979,33 @@
                 <w:szCs w:val="18"/>
                 <w:lang w:val="en-US"/>
               </w:rPr>
-              <w:t>[restrictedAccessInfo]</w:t>
+              <w:t>[</w:t>
+            </w:r>
+            <w:proofErr w:type="spellStart"/>
+            <w:r>
+              <w:rPr>
+                <w:rFonts w:ascii="Arial" w:hAnsi="Arial" w:cs="Arial"/>
+                <w:sz w:val="18"/>
+                <w:szCs w:val="18"/>
+                <w:lang w:val="en-US"/>
+              </w:rPr>
+              <w:t>restrictedAccessInfo</w:t>
+            </w:r>
+            <w:proofErr w:type="spellEnd"/>
+            <w:r>
+              <w:rPr>
+                <w:rFonts w:ascii="Arial" w:hAnsi="Arial" w:cs="Arial"/>
+                <w:sz w:val="18"/>
+                <w:szCs w:val="18"/>
+                <w:lang w:val="en-US"/>
+              </w:rPr>
+              <w:t>]</w:t>
             </w:r>
             <w:bookmarkStart w:id="3" w:name="_Toc66691678"/>
           </w:p>
           <w:p>
             <w:pPr>
-              <w:pStyle w:val="Heading3"/>
+              <w:pStyle w:val="berschrift3"/>
               <w:spacing w:before="120" w:line="276" w:lineRule="auto"/>
               <w:rPr>
                 <w:b/>
@@ -5705,7 +6242,23 @@
                       <w:sz w:val="18"/>
                       <w:szCs w:val="18"/>
                     </w:rPr>
-                    <w:t>[datasetRepositoryTable]</w:t>
+                    <w:t>[</w:t>
+                  </w:r>
+                  <w:proofErr w:type="spellStart"/>
+                  <w:r>
+                    <w:rPr>
+                      <w:sz w:val="18"/>
+                      <w:szCs w:val="18"/>
+                    </w:rPr>
+                    <w:t>datasetRepositoryTable</w:t>
+                  </w:r>
+                  <w:proofErr w:type="spellEnd"/>
+                  <w:r>
+                    <w:rPr>
+                      <w:sz w:val="18"/>
+                      <w:szCs w:val="18"/>
+                    </w:rPr>
+                    <w:t>]</w:t>
                   </w:r>
                 </w:p>
               </w:tc>
@@ -5842,7 +6395,23 @@
                       <w:sz w:val="18"/>
                       <w:szCs w:val="18"/>
                     </w:rPr>
-                    <w:t>[targetaudience]</w:t>
+                    <w:t>[</w:t>
+                  </w:r>
+                  <w:proofErr w:type="spellStart"/>
+                  <w:r>
+                    <w:rPr>
+                      <w:sz w:val="18"/>
+                      <w:szCs w:val="18"/>
+                    </w:rPr>
+                    <w:t>targetaudience</w:t>
+                  </w:r>
+                  <w:proofErr w:type="spellEnd"/>
+                  <w:r>
+                    <w:rPr>
+                      <w:sz w:val="18"/>
+                      <w:szCs w:val="18"/>
+                    </w:rPr>
+                    <w:t>]</w:t>
                   </w:r>
                 </w:p>
               </w:tc>
@@ -6089,7 +6658,23 @@
                       <w:sz w:val="18"/>
                       <w:szCs w:val="18"/>
                     </w:rPr>
-                    <w:t>[datasetDeleteTable]</w:t>
+                    <w:t>[</w:t>
+                  </w:r>
+                  <w:proofErr w:type="spellStart"/>
+                  <w:r>
+                    <w:rPr>
+                      <w:sz w:val="18"/>
+                      <w:szCs w:val="18"/>
+                    </w:rPr>
+                    <w:t>datasetDeleteTable</w:t>
+                  </w:r>
+                  <w:proofErr w:type="spellEnd"/>
+                  <w:r>
+                    <w:rPr>
+                      <w:sz w:val="18"/>
+                      <w:szCs w:val="18"/>
+                    </w:rPr>
+                    <w:t>]</w:t>
                   </w:r>
                 </w:p>
               </w:tc>
@@ -6115,7 +6700,23 @@
                       <w:sz w:val="18"/>
                       <w:szCs w:val="18"/>
                     </w:rPr>
-                    <w:t>[datasetDeleteTable]</w:t>
+                    <w:t>[</w:t>
+                  </w:r>
+                  <w:proofErr w:type="spellStart"/>
+                  <w:r>
+                    <w:rPr>
+                      <w:sz w:val="18"/>
+                      <w:szCs w:val="18"/>
+                    </w:rPr>
+                    <w:t>datasetDeleteTable</w:t>
+                  </w:r>
+                  <w:proofErr w:type="spellEnd"/>
+                  <w:r>
+                    <w:rPr>
+                      <w:sz w:val="18"/>
+                      <w:szCs w:val="18"/>
+                    </w:rPr>
+                    <w:t>]</w:t>
                   </w:r>
                 </w:p>
               </w:tc>
@@ -6315,7 +6916,7 @@
           </w:tcPr>
           <w:p>
             <w:pPr>
-              <w:pStyle w:val="NoSpacing"/>
+              <w:pStyle w:val="KeinLeerraum"/>
               <w:spacing w:before="120" w:after="120"/>
               <w:rPr>
                 <w:rFonts w:ascii="Arial" w:hAnsi="Arial" w:cs="Arial"/>
@@ -6335,6 +6936,7 @@
                 <w:szCs w:val="18"/>
                 <w:lang w:val="en-GB"/>
               </w:rPr>
+              <w:lastRenderedPageBreak/>
               <w:t>V Legal and Ethical Aspects</w:t>
             </w:r>
           </w:p>
@@ -6352,7 +6954,7 @@
           </w:tcPr>
           <w:p>
             <w:pPr>
-              <w:pStyle w:val="NoSpacing"/>
+              <w:pStyle w:val="KeinLeerraum"/>
               <w:spacing w:before="120" w:after="120"/>
               <w:rPr>
                 <w:rFonts w:ascii="Arial" w:hAnsi="Arial" w:cs="Arial"/>
@@ -6382,7 +6984,7 @@
           </w:tcPr>
           <w:p>
             <w:pPr>
-              <w:pStyle w:val="Heading3"/>
+              <w:pStyle w:val="berschrift3"/>
               <w:spacing w:before="120" w:line="276" w:lineRule="auto"/>
               <w:rPr>
                 <w:b/>
@@ -6436,6 +7038,7 @@
               </w:rPr>
               <w:t>[</w:t>
             </w:r>
+            <w:proofErr w:type="spellStart"/>
             <w:r>
               <w:rPr>
                 <w:rFonts w:ascii="Arial" w:hAnsi="Arial" w:cs="Arial"/>
@@ -6445,6 +7048,7 @@
               </w:rPr>
               <w:t>personaldata</w:t>
             </w:r>
+            <w:proofErr w:type="spellEnd"/>
             <w:r>
               <w:rPr>
                 <w:rFonts w:ascii="Arial" w:hAnsi="Arial" w:cs="Arial"/>
@@ -6457,7 +7061,7 @@
           </w:p>
           <w:p>
             <w:pPr>
-              <w:pStyle w:val="Heading3"/>
+              <w:pStyle w:val="berschrift3"/>
               <w:spacing w:before="120" w:line="276" w:lineRule="auto"/>
               <w:rPr>
                 <w:b/>
@@ -6508,6 +7112,7 @@
               </w:rPr>
               <w:t>[</w:t>
             </w:r>
+            <w:proofErr w:type="spellStart"/>
             <w:r>
               <w:rPr>
                 <w:rFonts w:ascii="Arial" w:hAnsi="Arial" w:cs="Arial"/>
@@ -6515,7 +7120,17 @@
                 <w:szCs w:val="18"/>
                 <w:lang w:val="en-GB"/>
               </w:rPr>
-              <w:t>legalrestriction]</w:t>
+              <w:t>legalrestriction</w:t>
+            </w:r>
+            <w:proofErr w:type="spellEnd"/>
+            <w:r>
+              <w:rPr>
+                <w:rFonts w:ascii="Arial" w:hAnsi="Arial" w:cs="Arial"/>
+                <w:sz w:val="18"/>
+                <w:szCs w:val="18"/>
+                <w:lang w:val="en-GB"/>
+              </w:rPr>
+              <w:t>]</w:t>
             </w:r>
           </w:p>
         </w:tc>
@@ -6538,7 +7153,7 @@
           </w:tcPr>
           <w:p>
             <w:pPr>
-              <w:pStyle w:val="NoSpacing"/>
+              <w:pStyle w:val="KeinLeerraum"/>
               <w:spacing w:before="120" w:after="120"/>
               <w:rPr>
                 <w:rFonts w:ascii="Arial" w:hAnsi="Arial" w:cs="Arial"/>
@@ -6615,7 +7230,27 @@
                 <w:szCs w:val="18"/>
                 <w:lang w:val="en-GB"/>
               </w:rPr>
-              <w:t>[ethicalissues]</w:t>
+              <w:t>[</w:t>
+            </w:r>
+            <w:proofErr w:type="spellStart"/>
+            <w:r>
+              <w:rPr>
+                <w:rFonts w:ascii="Arial" w:hAnsi="Arial" w:cs="Arial"/>
+                <w:sz w:val="18"/>
+                <w:szCs w:val="18"/>
+                <w:lang w:val="en-GB"/>
+              </w:rPr>
+              <w:t>ethicalissues</w:t>
+            </w:r>
+            <w:proofErr w:type="spellEnd"/>
+            <w:r>
+              <w:rPr>
+                <w:rFonts w:ascii="Arial" w:hAnsi="Arial" w:cs="Arial"/>
+                <w:sz w:val="18"/>
+                <w:szCs w:val="18"/>
+                <w:lang w:val="en-GB"/>
+              </w:rPr>
+              <w:t>]</w:t>
             </w:r>
           </w:p>
         </w:tc>
@@ -6669,7 +7304,7 @@
 <w:ftr xmlns:wpc="http://schemas.microsoft.com/office/word/2010/wordprocessingCanvas" xmlns:cx="http://schemas.microsoft.com/office/drawing/2014/chartex" xmlns:cx1="http://schemas.microsoft.com/office/drawing/2015/9/8/chartex" xmlns:cx2="http://schemas.microsoft.com/office/drawing/2015/10/21/chartex" xmlns:cx3="http://schemas.microsoft.com/office/drawing/2016/5/9/chartex" xmlns:cx4="http://schemas.microsoft.com/office/drawing/2016/5/10/chartex" xmlns:cx5="http://schemas.microsoft.com/office/drawing/2016/5/11/chartex" xmlns:cx6="http://schemas.microsoft.com/office/drawing/2016/5/12/chartex" xmlns:cx7="http://schemas.microsoft.com/office/drawing/2016/5/13/chartex" xmlns:cx8="http://schemas.microsoft.com/office/drawing/2016/5/14/chartex" xmlns:mc="http://schemas.openxmlformats.org/markup-compatibility/2006" xmlns:aink="http://schemas.microsoft.com/office/drawing/2016/ink" xmlns:am3d="http://schemas.microsoft.com/office/drawing/2017/model3d" xmlns:o="urn:schemas-microsoft-com:office:office" xmlns:oel="http://schemas.microsoft.com/office/2019/extlst" xmlns:r="http://schemas.openxmlformats.org/officeDocument/2006/relationships" xmlns:m="http://schemas.openxmlformats.org/officeDocument/2006/math" xmlns:v="urn:schemas-microsoft-com:vml" xmlns:wp14="http://schemas.microsoft.com/office/word/2010/wordprocessingDrawing" xmlns:wp="http://schemas.openxmlformats.org/drawingml/2006/wordprocessingDrawing" xmlns:w10="urn:schemas-microsoft-com:office:word" xmlns:w="http://schemas.openxmlformats.org/wordprocessingml/2006/main" xmlns:w14="http://schemas.microsoft.com/office/word/2010/wordml" xmlns:w15="http://schemas.microsoft.com/office/word/2012/wordml" xmlns:w16cex="http://schemas.microsoft.com/office/word/2018/wordml/cex" xmlns:w16cid="http://schemas.microsoft.com/office/word/2016/wordml/cid" xmlns:w16="http://schemas.microsoft.com/office/word/2018/wordml" xmlns:w16du="http://schemas.microsoft.com/office/word/2023/wordml/word16du" xmlns:w16sdtdh="http://schemas.microsoft.com/office/word/2020/wordml/sdtdatahash" xmlns:w16sdtfl="http://schemas.microsoft.com/office/word/2024/wordml/sdtformatlock" xmlns:w16se="http://schemas.microsoft.com/office/word/2015/wordml/symex" xmlns:wpg="http://schemas.microsoft.com/office/word/2010/wordprocessingGroup" xmlns:wpi="http://schemas.microsoft.com/office/word/2010/wordprocessingInk" xmlns:wne="http://schemas.microsoft.com/office/word/2006/wordml" xmlns:wps="http://schemas.microsoft.com/office/word/2010/wordprocessingShape" mc:Ignorable="w14 w15 w16se w16cid w16 w16cex w16sdtdh w16sdtfl w16du wp14">
   <w:p>
     <w:pPr>
-      <w:pStyle w:val="Footer"/>
+      <w:pStyle w:val="Fuzeile"/>
       <w:tabs>
         <w:tab w:val="clear" w:pos="4536"/>
         <w:tab w:val="clear" w:pos="9072"/>
@@ -6700,7 +7335,7 @@
     <w:sdtContent>
       <w:p>
         <w:pPr>
-          <w:pStyle w:val="Footer"/>
+          <w:pStyle w:val="Fuzeile"/>
           <w:tabs>
             <w:tab w:val="clear" w:pos="4536"/>
             <w:tab w:val="clear" w:pos="9072"/>
@@ -6761,7 +7396,7 @@
                 </wp:inline>
               </w:drawing>
             </mc:Choice>
-            <mc:Fallback xmlns:a="http://schemas.openxmlformats.org/drawingml/2006/main" xmlns:wp14="http://schemas.microsoft.com/office/word/2010/wordml" xmlns:pic="http://schemas.openxmlformats.org/drawingml/2006/picture">
+            <mc:Fallback xmlns:pic="http://schemas.openxmlformats.org/drawingml/2006/picture" xmlns:wp14="http://schemas.microsoft.com/office/word/2010/wordml" xmlns:a="http://schemas.openxmlformats.org/drawingml/2006/main">
               <w:pict w14:anchorId="1521B567">
                 <v:shapetype coordsize="21600,21600" o:spt="75" o:preferrelative="t" path="m@4@5l@4@11@9@11@9@5xe" type="#_x0000_t75">
                   <v:formulas>
@@ -6793,6 +7428,7 @@
           </w:rPr>
           <w:t xml:space="preserve"> </w:t>
         </w:r>
+        <w:proofErr w:type="gramStart"/>
         <w:r>
           <w:rPr>
             <w:rFonts w:ascii="Arial" w:hAnsi="Arial" w:cs="Arial"/>
@@ -6800,7 +7436,17 @@
             <w:szCs w:val="16"/>
             <w:lang w:val="de-AT"/>
           </w:rPr>
-          <w:t>DMP Template (01/2022)</w:t>
+          <w:t>DMP Template</w:t>
+        </w:r>
+        <w:proofErr w:type="gramEnd"/>
+        <w:r>
+          <w:rPr>
+            <w:rFonts w:ascii="Arial" w:hAnsi="Arial" w:cs="Arial"/>
+            <w:sz w:val="16"/>
+            <w:szCs w:val="16"/>
+            <w:lang w:val="de-AT"/>
+          </w:rPr>
+          <w:t xml:space="preserve"> (01/2022)</w:t>
         </w:r>
         <w:r>
           <w:tab/>
@@ -9937,15 +10583,15 @@
     <w:lsdException w:name="Unresolved Mention" w:semiHidden="1" w:unhideWhenUsed="1"/>
     <w:lsdException w:name="Smart Link" w:semiHidden="1" w:unhideWhenUsed="1"/>
   </w:latentStyles>
-  <w:style w:type="paragraph" w:default="1" w:styleId="Normal">
+  <w:style w:type="paragraph" w:default="1" w:styleId="Standard">
     <w:name w:val="Normal"/>
     <w:qFormat/>
   </w:style>
-  <w:style w:type="paragraph" w:styleId="Heading1">
+  <w:style w:type="paragraph" w:styleId="berschrift1">
     <w:name w:val="heading 1"/>
-    <w:basedOn w:val="Normal"/>
-    <w:next w:val="Normal"/>
-    <w:link w:val="Heading1Char"/>
+    <w:basedOn w:val="Standard"/>
+    <w:next w:val="Standard"/>
+    <w:link w:val="berschrift1Zchn"/>
     <w:uiPriority w:val="9"/>
     <w:qFormat/>
     <w:pPr>
@@ -9960,11 +10606,11 @@
       <w:szCs w:val="40"/>
     </w:rPr>
   </w:style>
-  <w:style w:type="paragraph" w:styleId="Heading2">
+  <w:style w:type="paragraph" w:styleId="berschrift2">
     <w:name w:val="heading 2"/>
-    <w:basedOn w:val="Normal"/>
-    <w:next w:val="Normal"/>
-    <w:link w:val="Heading2Char"/>
+    <w:basedOn w:val="Standard"/>
+    <w:next w:val="Standard"/>
+    <w:link w:val="berschrift2Zchn"/>
     <w:uiPriority w:val="9"/>
     <w:unhideWhenUsed/>
     <w:qFormat/>
@@ -9979,10 +10625,10 @@
       <w:sz w:val="34"/>
     </w:rPr>
   </w:style>
-  <w:style w:type="paragraph" w:styleId="Heading3">
+  <w:style w:type="paragraph" w:styleId="berschrift3">
     <w:name w:val="heading 3"/>
-    <w:next w:val="Normal"/>
-    <w:link w:val="Heading3Char1"/>
+    <w:next w:val="Standard"/>
+    <w:link w:val="berschrift3Zchn"/>
     <w:uiPriority w:val="9"/>
     <w:unhideWhenUsed/>
     <w:qFormat/>
@@ -9999,11 +10645,11 @@
       <w:lang w:val="en-GB"/>
     </w:rPr>
   </w:style>
-  <w:style w:type="paragraph" w:styleId="Heading4">
+  <w:style w:type="paragraph" w:styleId="berschrift4">
     <w:name w:val="heading 4"/>
-    <w:basedOn w:val="Normal"/>
-    <w:next w:val="Normal"/>
-    <w:link w:val="Heading4Char1"/>
+    <w:basedOn w:val="Standard"/>
+    <w:next w:val="Standard"/>
+    <w:link w:val="berschrift4Zchn"/>
     <w:uiPriority w:val="9"/>
     <w:unhideWhenUsed/>
     <w:qFormat/>
@@ -10028,11 +10674,11 @@
       <w:lang w:val="en-GB"/>
     </w:rPr>
   </w:style>
-  <w:style w:type="paragraph" w:styleId="Heading5">
+  <w:style w:type="paragraph" w:styleId="berschrift5">
     <w:name w:val="heading 5"/>
-    <w:basedOn w:val="Normal"/>
-    <w:next w:val="Normal"/>
-    <w:link w:val="Heading5Char"/>
+    <w:basedOn w:val="Standard"/>
+    <w:next w:val="Standard"/>
+    <w:link w:val="berschrift5Zchn"/>
     <w:uiPriority w:val="9"/>
     <w:unhideWhenUsed/>
     <w:qFormat/>
@@ -10050,11 +10696,11 @@
       <w:szCs w:val="24"/>
     </w:rPr>
   </w:style>
-  <w:style w:type="paragraph" w:styleId="Heading6">
+  <w:style w:type="paragraph" w:styleId="berschrift6">
     <w:name w:val="heading 6"/>
-    <w:basedOn w:val="Normal"/>
-    <w:next w:val="Normal"/>
-    <w:link w:val="Heading6Char"/>
+    <w:basedOn w:val="Standard"/>
+    <w:next w:val="Standard"/>
+    <w:link w:val="berschrift6Zchn"/>
     <w:uiPriority w:val="9"/>
     <w:unhideWhenUsed/>
     <w:qFormat/>
@@ -10070,11 +10716,11 @@
       <w:bCs/>
     </w:rPr>
   </w:style>
-  <w:style w:type="paragraph" w:styleId="Heading7">
+  <w:style w:type="paragraph" w:styleId="berschrift7">
     <w:name w:val="heading 7"/>
-    <w:basedOn w:val="Normal"/>
-    <w:next w:val="Normal"/>
-    <w:link w:val="Heading7Char"/>
+    <w:basedOn w:val="Standard"/>
+    <w:next w:val="Standard"/>
+    <w:link w:val="berschrift7Zchn"/>
     <w:uiPriority w:val="9"/>
     <w:unhideWhenUsed/>
     <w:qFormat/>
@@ -10092,11 +10738,11 @@
       <w:iCs/>
     </w:rPr>
   </w:style>
-  <w:style w:type="paragraph" w:styleId="Heading8">
+  <w:style w:type="paragraph" w:styleId="berschrift8">
     <w:name w:val="heading 8"/>
-    <w:basedOn w:val="Normal"/>
-    <w:next w:val="Normal"/>
-    <w:link w:val="Heading8Char"/>
+    <w:basedOn w:val="Standard"/>
+    <w:next w:val="Standard"/>
+    <w:link w:val="berschrift8Zchn"/>
     <w:uiPriority w:val="9"/>
     <w:unhideWhenUsed/>
     <w:qFormat/>
@@ -10112,11 +10758,11 @@
       <w:iCs/>
     </w:rPr>
   </w:style>
-  <w:style w:type="paragraph" w:styleId="Heading9">
+  <w:style w:type="paragraph" w:styleId="berschrift9">
     <w:name w:val="heading 9"/>
-    <w:basedOn w:val="Normal"/>
-    <w:next w:val="Normal"/>
-    <w:link w:val="Heading9Char"/>
+    <w:basedOn w:val="Standard"/>
+    <w:next w:val="Standard"/>
+    <w:link w:val="berschrift9Zchn"/>
     <w:uiPriority w:val="9"/>
     <w:unhideWhenUsed/>
     <w:qFormat/>
@@ -10134,13 +10780,13 @@
       <w:szCs w:val="21"/>
     </w:rPr>
   </w:style>
-  <w:style w:type="character" w:default="1" w:styleId="DefaultParagraphFont">
+  <w:style w:type="character" w:default="1" w:styleId="Absatz-Standardschriftart">
     <w:name w:val="Default Paragraph Font"/>
     <w:uiPriority w:val="1"/>
     <w:semiHidden/>
     <w:unhideWhenUsed/>
   </w:style>
-  <w:style w:type="table" w:default="1" w:styleId="TableNormal">
+  <w:style w:type="table" w:default="1" w:styleId="NormaleTabelle">
     <w:name w:val="Normal Table"/>
     <w:uiPriority w:val="99"/>
     <w:semiHidden/>
@@ -10155,16 +10801,16 @@
       </w:tblCellMar>
     </w:tblPr>
   </w:style>
-  <w:style w:type="numbering" w:default="1" w:styleId="NoList">
+  <w:style w:type="numbering" w:default="1" w:styleId="KeineListe">
     <w:name w:val="No List"/>
     <w:uiPriority w:val="99"/>
     <w:semiHidden/>
     <w:unhideWhenUsed/>
   </w:style>
-  <w:style w:type="character" w:customStyle="1" w:styleId="Heading1Char">
-    <w:name w:val="Heading 1 Char"/>
-    <w:basedOn w:val="DefaultParagraphFont"/>
-    <w:link w:val="Heading1"/>
+  <w:style w:type="character" w:customStyle="1" w:styleId="berschrift1Zchn">
+    <w:name w:val="Überschrift 1 Zchn"/>
+    <w:basedOn w:val="Absatz-Standardschriftart"/>
+    <w:link w:val="berschrift1"/>
     <w:uiPriority w:val="9"/>
     <w:rPr>
       <w:rFonts w:ascii="Arial" w:eastAsia="Arial" w:hAnsi="Arial" w:cs="Arial"/>
@@ -10172,10 +10818,10 @@
       <w:szCs w:val="40"/>
     </w:rPr>
   </w:style>
-  <w:style w:type="character" w:customStyle="1" w:styleId="Heading2Char">
-    <w:name w:val="Heading 2 Char"/>
-    <w:basedOn w:val="DefaultParagraphFont"/>
-    <w:link w:val="Heading2"/>
+  <w:style w:type="character" w:customStyle="1" w:styleId="berschrift2Zchn">
+    <w:name w:val="Überschrift 2 Zchn"/>
+    <w:basedOn w:val="Absatz-Standardschriftart"/>
+    <w:link w:val="berschrift2"/>
     <w:uiPriority w:val="9"/>
     <w:rPr>
       <w:rFonts w:ascii="Arial" w:eastAsia="Arial" w:hAnsi="Arial" w:cs="Arial"/>
@@ -10184,7 +10830,7 @@
   </w:style>
   <w:style w:type="character" w:customStyle="1" w:styleId="Heading3Char">
     <w:name w:val="Heading 3 Char"/>
-    <w:basedOn w:val="DefaultParagraphFont"/>
+    <w:basedOn w:val="Absatz-Standardschriftart"/>
     <w:uiPriority w:val="9"/>
     <w:rPr>
       <w:rFonts w:ascii="Arial" w:eastAsia="Arial" w:hAnsi="Arial" w:cs="Arial"/>
@@ -10194,7 +10840,7 @@
   </w:style>
   <w:style w:type="character" w:customStyle="1" w:styleId="Heading4Char">
     <w:name w:val="Heading 4 Char"/>
-    <w:basedOn w:val="DefaultParagraphFont"/>
+    <w:basedOn w:val="Absatz-Standardschriftart"/>
     <w:uiPriority w:val="9"/>
     <w:rPr>
       <w:rFonts w:ascii="Arial" w:eastAsia="Arial" w:hAnsi="Arial" w:cs="Arial"/>
@@ -10204,10 +10850,10 @@
       <w:szCs w:val="26"/>
     </w:rPr>
   </w:style>
-  <w:style w:type="character" w:customStyle="1" w:styleId="Heading5Char">
-    <w:name w:val="Heading 5 Char"/>
-    <w:basedOn w:val="DefaultParagraphFont"/>
-    <w:link w:val="Heading5"/>
+  <w:style w:type="character" w:customStyle="1" w:styleId="berschrift5Zchn">
+    <w:name w:val="Überschrift 5 Zchn"/>
+    <w:basedOn w:val="Absatz-Standardschriftart"/>
+    <w:link w:val="berschrift5"/>
     <w:uiPriority w:val="9"/>
     <w:rPr>
       <w:rFonts w:ascii="Arial" w:eastAsia="Arial" w:hAnsi="Arial" w:cs="Arial"/>
@@ -10217,10 +10863,10 @@
       <w:szCs w:val="24"/>
     </w:rPr>
   </w:style>
-  <w:style w:type="character" w:customStyle="1" w:styleId="Heading6Char">
-    <w:name w:val="Heading 6 Char"/>
-    <w:basedOn w:val="DefaultParagraphFont"/>
-    <w:link w:val="Heading6"/>
+  <w:style w:type="character" w:customStyle="1" w:styleId="berschrift6Zchn">
+    <w:name w:val="Überschrift 6 Zchn"/>
+    <w:basedOn w:val="Absatz-Standardschriftart"/>
+    <w:link w:val="berschrift6"/>
     <w:uiPriority w:val="9"/>
     <w:rPr>
       <w:rFonts w:ascii="Arial" w:eastAsia="Arial" w:hAnsi="Arial" w:cs="Arial"/>
@@ -10230,10 +10876,10 @@
       <w:szCs w:val="22"/>
     </w:rPr>
   </w:style>
-  <w:style w:type="character" w:customStyle="1" w:styleId="Heading7Char">
-    <w:name w:val="Heading 7 Char"/>
-    <w:basedOn w:val="DefaultParagraphFont"/>
-    <w:link w:val="Heading7"/>
+  <w:style w:type="character" w:customStyle="1" w:styleId="berschrift7Zchn">
+    <w:name w:val="Überschrift 7 Zchn"/>
+    <w:basedOn w:val="Absatz-Standardschriftart"/>
+    <w:link w:val="berschrift7"/>
     <w:uiPriority w:val="9"/>
     <w:rPr>
       <w:rFonts w:ascii="Arial" w:eastAsia="Arial" w:hAnsi="Arial" w:cs="Arial"/>
@@ -10245,10 +10891,10 @@
       <w:szCs w:val="22"/>
     </w:rPr>
   </w:style>
-  <w:style w:type="character" w:customStyle="1" w:styleId="Heading8Char">
-    <w:name w:val="Heading 8 Char"/>
-    <w:basedOn w:val="DefaultParagraphFont"/>
-    <w:link w:val="Heading8"/>
+  <w:style w:type="character" w:customStyle="1" w:styleId="berschrift8Zchn">
+    <w:name w:val="Überschrift 8 Zchn"/>
+    <w:basedOn w:val="Absatz-Standardschriftart"/>
+    <w:link w:val="berschrift8"/>
     <w:uiPriority w:val="9"/>
     <w:rPr>
       <w:rFonts w:ascii="Arial" w:eastAsia="Arial" w:hAnsi="Arial" w:cs="Arial"/>
@@ -10258,10 +10904,10 @@
       <w:szCs w:val="22"/>
     </w:rPr>
   </w:style>
-  <w:style w:type="character" w:customStyle="1" w:styleId="Heading9Char">
-    <w:name w:val="Heading 9 Char"/>
-    <w:basedOn w:val="DefaultParagraphFont"/>
-    <w:link w:val="Heading9"/>
+  <w:style w:type="character" w:customStyle="1" w:styleId="berschrift9Zchn">
+    <w:name w:val="Überschrift 9 Zchn"/>
+    <w:basedOn w:val="Absatz-Standardschriftart"/>
+    <w:link w:val="berschrift9"/>
     <w:uiPriority w:val="9"/>
     <w:rPr>
       <w:rFonts w:ascii="Arial" w:eastAsia="Arial" w:hAnsi="Arial" w:cs="Arial"/>
@@ -10273,18 +10919,18 @@
   </w:style>
   <w:style w:type="character" w:customStyle="1" w:styleId="TitleChar">
     <w:name w:val="Title Char"/>
-    <w:basedOn w:val="DefaultParagraphFont"/>
+    <w:basedOn w:val="Absatz-Standardschriftart"/>
     <w:uiPriority w:val="10"/>
     <w:rPr>
       <w:sz w:val="48"/>
       <w:szCs w:val="48"/>
     </w:rPr>
   </w:style>
-  <w:style w:type="paragraph" w:styleId="Subtitle">
+  <w:style w:type="paragraph" w:styleId="Untertitel">
     <w:name w:val="Subtitle"/>
-    <w:basedOn w:val="Normal"/>
-    <w:next w:val="Normal"/>
-    <w:link w:val="SubtitleChar"/>
+    <w:basedOn w:val="Standard"/>
+    <w:next w:val="Standard"/>
+    <w:link w:val="UntertitelZchn"/>
     <w:uiPriority w:val="11"/>
     <w:qFormat/>
     <w:pPr>
@@ -10295,21 +10941,21 @@
       <w:szCs w:val="24"/>
     </w:rPr>
   </w:style>
-  <w:style w:type="character" w:customStyle="1" w:styleId="SubtitleChar">
-    <w:name w:val="Subtitle Char"/>
-    <w:basedOn w:val="DefaultParagraphFont"/>
-    <w:link w:val="Subtitle"/>
+  <w:style w:type="character" w:customStyle="1" w:styleId="UntertitelZchn">
+    <w:name w:val="Untertitel Zchn"/>
+    <w:basedOn w:val="Absatz-Standardschriftart"/>
+    <w:link w:val="Untertitel"/>
     <w:uiPriority w:val="11"/>
     <w:rPr>
       <w:sz w:val="24"/>
       <w:szCs w:val="24"/>
     </w:rPr>
   </w:style>
-  <w:style w:type="paragraph" w:styleId="Quote">
+  <w:style w:type="paragraph" w:styleId="Zitat">
     <w:name w:val="Quote"/>
-    <w:basedOn w:val="Normal"/>
-    <w:next w:val="Normal"/>
-    <w:link w:val="QuoteChar"/>
+    <w:basedOn w:val="Standard"/>
+    <w:next w:val="Standard"/>
+    <w:link w:val="ZitatZchn"/>
     <w:uiPriority w:val="29"/>
     <w:qFormat/>
     <w:pPr>
@@ -10319,19 +10965,19 @@
       <w:i/>
     </w:rPr>
   </w:style>
-  <w:style w:type="character" w:customStyle="1" w:styleId="QuoteChar">
-    <w:name w:val="Quote Char"/>
-    <w:link w:val="Quote"/>
+  <w:style w:type="character" w:customStyle="1" w:styleId="ZitatZchn">
+    <w:name w:val="Zitat Zchn"/>
+    <w:link w:val="Zitat"/>
     <w:uiPriority w:val="29"/>
     <w:rPr>
       <w:i/>
     </w:rPr>
   </w:style>
-  <w:style w:type="paragraph" w:styleId="IntenseQuote">
+  <w:style w:type="paragraph" w:styleId="IntensivesZitat">
     <w:name w:val="Intense Quote"/>
-    <w:basedOn w:val="Normal"/>
-    <w:next w:val="Normal"/>
-    <w:link w:val="IntenseQuoteChar"/>
+    <w:basedOn w:val="Standard"/>
+    <w:next w:val="Standard"/>
+    <w:link w:val="IntensivesZitatZchn"/>
     <w:uiPriority w:val="30"/>
     <w:qFormat/>
     <w:pPr>
@@ -10348,9 +10994,9 @@
       <w:i/>
     </w:rPr>
   </w:style>
-  <w:style w:type="character" w:customStyle="1" w:styleId="IntenseQuoteChar">
-    <w:name w:val="Intense Quote Char"/>
-    <w:link w:val="IntenseQuote"/>
+  <w:style w:type="character" w:customStyle="1" w:styleId="IntensivesZitatZchn">
+    <w:name w:val="Intensives Zitat Zchn"/>
+    <w:link w:val="IntensivesZitat"/>
     <w:uiPriority w:val="30"/>
     <w:rPr>
       <w:i/>
@@ -10358,18 +11004,18 @@
   </w:style>
   <w:style w:type="character" w:customStyle="1" w:styleId="HeaderChar">
     <w:name w:val="Header Char"/>
-    <w:basedOn w:val="DefaultParagraphFont"/>
+    <w:basedOn w:val="Absatz-Standardschriftart"/>
     <w:uiPriority w:val="99"/>
   </w:style>
   <w:style w:type="character" w:customStyle="1" w:styleId="FooterChar">
     <w:name w:val="Footer Char"/>
-    <w:basedOn w:val="DefaultParagraphFont"/>
+    <w:basedOn w:val="Absatz-Standardschriftart"/>
     <w:uiPriority w:val="99"/>
   </w:style>
-  <w:style w:type="paragraph" w:styleId="Caption">
+  <w:style w:type="paragraph" w:styleId="Beschriftung">
     <w:name w:val="caption"/>
-    <w:basedOn w:val="Normal"/>
-    <w:next w:val="Normal"/>
+    <w:basedOn w:val="Standard"/>
+    <w:next w:val="Standard"/>
     <w:uiPriority w:val="35"/>
     <w:semiHidden/>
     <w:unhideWhenUsed/>
@@ -10388,7 +11034,7 @@
   </w:style>
   <w:style w:type="table" w:customStyle="1" w:styleId="TableGridLight1">
     <w:name w:val="Table Grid Light1"/>
-    <w:basedOn w:val="TableNormal"/>
+    <w:basedOn w:val="NormaleTabelle"/>
     <w:uiPriority w:val="59"/>
     <w:pPr>
       <w:spacing w:after="0" w:line="240" w:lineRule="auto"/>
@@ -10404,9 +11050,9 @@
       </w:tblBorders>
     </w:tblPr>
   </w:style>
-  <w:style w:type="table" w:styleId="PlainTable1">
+  <w:style w:type="table" w:styleId="EinfacheTabelle1">
     <w:name w:val="Plain Table 1"/>
-    <w:basedOn w:val="TableNormal"/>
+    <w:basedOn w:val="NormaleTabelle"/>
     <w:uiPriority w:val="59"/>
     <w:pPr>
       <w:spacing w:after="0" w:line="240" w:lineRule="auto"/>
@@ -10466,9 +11112,9 @@
       </w:tcPr>
     </w:tblStylePr>
   </w:style>
-  <w:style w:type="table" w:styleId="PlainTable2">
+  <w:style w:type="table" w:styleId="EinfacheTabelle2">
     <w:name w:val="Plain Table 2"/>
-    <w:basedOn w:val="TableNormal"/>
+    <w:basedOn w:val="NormaleTabelle"/>
     <w:uiPriority w:val="59"/>
     <w:pPr>
       <w:spacing w:after="0" w:line="240" w:lineRule="auto"/>
@@ -10548,9 +11194,9 @@
       </w:tcPr>
     </w:tblStylePr>
   </w:style>
-  <w:style w:type="table" w:styleId="PlainTable3">
+  <w:style w:type="table" w:styleId="EinfacheTabelle3">
     <w:name w:val="Plain Table 3"/>
-    <w:basedOn w:val="TableNormal"/>
+    <w:basedOn w:val="NormaleTabelle"/>
     <w:uiPriority w:val="99"/>
     <w:pPr>
       <w:spacing w:after="0" w:line="240" w:lineRule="auto"/>
@@ -10628,9 +11274,9 @@
       </w:tcPr>
     </w:tblStylePr>
   </w:style>
-  <w:style w:type="table" w:styleId="PlainTable4">
+  <w:style w:type="table" w:styleId="EinfacheTabelle4">
     <w:name w:val="Plain Table 4"/>
-    <w:basedOn w:val="TableNormal"/>
+    <w:basedOn w:val="NormaleTabelle"/>
     <w:uiPriority w:val="99"/>
     <w:pPr>
       <w:spacing w:after="0" w:line="240" w:lineRule="auto"/>
@@ -10686,9 +11332,9 @@
       </w:tcPr>
     </w:tblStylePr>
   </w:style>
-  <w:style w:type="table" w:styleId="PlainTable5">
+  <w:style w:type="table" w:styleId="EinfacheTabelle5">
     <w:name w:val="Plain Table 5"/>
-    <w:basedOn w:val="TableNormal"/>
+    <w:basedOn w:val="NormaleTabelle"/>
     <w:uiPriority w:val="99"/>
     <w:pPr>
       <w:spacing w:after="0" w:line="240" w:lineRule="auto"/>
@@ -10779,9 +11425,9 @@
       </w:tcPr>
     </w:tblStylePr>
   </w:style>
-  <w:style w:type="table" w:styleId="GridTable1Light">
+  <w:style w:type="table" w:styleId="Gitternetztabelle1hell">
     <w:name w:val="Grid Table 1 Light"/>
-    <w:basedOn w:val="TableNormal"/>
+    <w:basedOn w:val="NormaleTabelle"/>
     <w:uiPriority w:val="99"/>
     <w:pPr>
       <w:spacing w:after="0" w:line="240" w:lineRule="auto"/>
@@ -10847,7 +11493,7 @@
   </w:style>
   <w:style w:type="table" w:customStyle="1" w:styleId="GridTable1Light-Accent11">
     <w:name w:val="Grid Table 1 Light - Accent 11"/>
-    <w:basedOn w:val="TableNormal"/>
+    <w:basedOn w:val="NormaleTabelle"/>
     <w:uiPriority w:val="99"/>
     <w:pPr>
       <w:spacing w:after="0" w:line="240" w:lineRule="auto"/>
@@ -10913,7 +11559,7 @@
   </w:style>
   <w:style w:type="table" w:customStyle="1" w:styleId="GridTable1Light-Accent21">
     <w:name w:val="Grid Table 1 Light - Accent 21"/>
-    <w:basedOn w:val="TableNormal"/>
+    <w:basedOn w:val="NormaleTabelle"/>
     <w:uiPriority w:val="99"/>
     <w:pPr>
       <w:spacing w:after="0" w:line="240" w:lineRule="auto"/>
@@ -10979,7 +11625,7 @@
   </w:style>
   <w:style w:type="table" w:customStyle="1" w:styleId="GridTable1Light-Accent31">
     <w:name w:val="Grid Table 1 Light - Accent 31"/>
-    <w:basedOn w:val="TableNormal"/>
+    <w:basedOn w:val="NormaleTabelle"/>
     <w:uiPriority w:val="99"/>
     <w:pPr>
       <w:spacing w:after="0" w:line="240" w:lineRule="auto"/>
@@ -11045,7 +11691,7 @@
   </w:style>
   <w:style w:type="table" w:customStyle="1" w:styleId="GridTable1Light-Accent41">
     <w:name w:val="Grid Table 1 Light - Accent 41"/>
-    <w:basedOn w:val="TableNormal"/>
+    <w:basedOn w:val="NormaleTabelle"/>
     <w:uiPriority w:val="99"/>
     <w:pPr>
       <w:spacing w:after="0" w:line="240" w:lineRule="auto"/>
@@ -11111,7 +11757,7 @@
   </w:style>
   <w:style w:type="table" w:customStyle="1" w:styleId="GridTable1Light-Accent51">
     <w:name w:val="Grid Table 1 Light - Accent 51"/>
-    <w:basedOn w:val="TableNormal"/>
+    <w:basedOn w:val="NormaleTabelle"/>
     <w:uiPriority w:val="99"/>
     <w:pPr>
       <w:spacing w:after="0" w:line="240" w:lineRule="auto"/>
@@ -11177,7 +11823,7 @@
   </w:style>
   <w:style w:type="table" w:customStyle="1" w:styleId="GridTable1Light-Accent61">
     <w:name w:val="Grid Table 1 Light - Accent 61"/>
-    <w:basedOn w:val="TableNormal"/>
+    <w:basedOn w:val="NormaleTabelle"/>
     <w:uiPriority w:val="99"/>
     <w:pPr>
       <w:spacing w:after="0" w:line="240" w:lineRule="auto"/>
@@ -11241,9 +11887,9 @@
       </w:tcPr>
     </w:tblStylePr>
   </w:style>
-  <w:style w:type="table" w:styleId="GridTable2">
+  <w:style w:type="table" w:styleId="Gitternetztabelle2">
     <w:name w:val="Grid Table 2"/>
-    <w:basedOn w:val="TableNormal"/>
+    <w:basedOn w:val="NormaleTabelle"/>
     <w:uiPriority w:val="99"/>
     <w:pPr>
       <w:spacing w:after="0" w:line="240" w:lineRule="auto"/>
@@ -11326,7 +11972,7 @@
   </w:style>
   <w:style w:type="table" w:customStyle="1" w:styleId="GridTable2-Accent11">
     <w:name w:val="Grid Table 2 - Accent 11"/>
-    <w:basedOn w:val="TableNormal"/>
+    <w:basedOn w:val="NormaleTabelle"/>
     <w:uiPriority w:val="99"/>
     <w:pPr>
       <w:spacing w:after="0" w:line="240" w:lineRule="auto"/>
@@ -11409,7 +12055,7 @@
   </w:style>
   <w:style w:type="table" w:customStyle="1" w:styleId="GridTable2-Accent21">
     <w:name w:val="Grid Table 2 - Accent 21"/>
-    <w:basedOn w:val="TableNormal"/>
+    <w:basedOn w:val="NormaleTabelle"/>
     <w:uiPriority w:val="99"/>
     <w:pPr>
       <w:spacing w:after="0" w:line="240" w:lineRule="auto"/>
@@ -11492,7 +12138,7 @@
   </w:style>
   <w:style w:type="table" w:customStyle="1" w:styleId="GridTable2-Accent31">
     <w:name w:val="Grid Table 2 - Accent 31"/>
-    <w:basedOn w:val="TableNormal"/>
+    <w:basedOn w:val="NormaleTabelle"/>
     <w:uiPriority w:val="99"/>
     <w:pPr>
       <w:spacing w:after="0" w:line="240" w:lineRule="auto"/>
@@ -11575,7 +12221,7 @@
   </w:style>
   <w:style w:type="table" w:customStyle="1" w:styleId="GridTable2-Accent41">
     <w:name w:val="Grid Table 2 - Accent 41"/>
-    <w:basedOn w:val="TableNormal"/>
+    <w:basedOn w:val="NormaleTabelle"/>
     <w:uiPriority w:val="99"/>
     <w:pPr>
       <w:spacing w:after="0" w:line="240" w:lineRule="auto"/>
@@ -11658,7 +12304,7 @@
   </w:style>
   <w:style w:type="table" w:customStyle="1" w:styleId="GridTable2-Accent51">
     <w:name w:val="Grid Table 2 - Accent 51"/>
-    <w:basedOn w:val="TableNormal"/>
+    <w:basedOn w:val="NormaleTabelle"/>
     <w:uiPriority w:val="99"/>
     <w:pPr>
       <w:spacing w:after="0" w:line="240" w:lineRule="auto"/>
@@ -11741,7 +12387,7 @@
   </w:style>
   <w:style w:type="table" w:customStyle="1" w:styleId="GridTable2-Accent61">
     <w:name w:val="Grid Table 2 - Accent 61"/>
-    <w:basedOn w:val="TableNormal"/>
+    <w:basedOn w:val="NormaleTabelle"/>
     <w:uiPriority w:val="99"/>
     <w:pPr>
       <w:spacing w:after="0" w:line="240" w:lineRule="auto"/>
@@ -11822,9 +12468,9 @@
       </w:tcPr>
     </w:tblStylePr>
   </w:style>
-  <w:style w:type="table" w:styleId="GridTable3">
+  <w:style w:type="table" w:styleId="Gitternetztabelle3">
     <w:name w:val="Grid Table 3"/>
-    <w:basedOn w:val="TableNormal"/>
+    <w:basedOn w:val="NormaleTabelle"/>
     <w:uiPriority w:val="99"/>
     <w:pPr>
       <w:spacing w:after="0" w:line="240" w:lineRule="auto"/>
@@ -11930,7 +12576,7 @@
   </w:style>
   <w:style w:type="table" w:customStyle="1" w:styleId="GridTable3-Accent11">
     <w:name w:val="Grid Table 3 - Accent 11"/>
-    <w:basedOn w:val="TableNormal"/>
+    <w:basedOn w:val="NormaleTabelle"/>
     <w:uiPriority w:val="99"/>
     <w:pPr>
       <w:spacing w:after="0" w:line="240" w:lineRule="auto"/>
@@ -12036,7 +12682,7 @@
   </w:style>
   <w:style w:type="table" w:customStyle="1" w:styleId="GridTable3-Accent21">
     <w:name w:val="Grid Table 3 - Accent 21"/>
-    <w:basedOn w:val="TableNormal"/>
+    <w:basedOn w:val="NormaleTabelle"/>
     <w:uiPriority w:val="99"/>
     <w:pPr>
       <w:spacing w:after="0" w:line="240" w:lineRule="auto"/>
@@ -12142,7 +12788,7 @@
   </w:style>
   <w:style w:type="table" w:customStyle="1" w:styleId="GridTable3-Accent31">
     <w:name w:val="Grid Table 3 - Accent 31"/>
-    <w:basedOn w:val="TableNormal"/>
+    <w:basedOn w:val="NormaleTabelle"/>
     <w:uiPriority w:val="99"/>
     <w:pPr>
       <w:spacing w:after="0" w:line="240" w:lineRule="auto"/>
@@ -12248,7 +12894,7 @@
   </w:style>
   <w:style w:type="table" w:customStyle="1" w:styleId="GridTable3-Accent41">
     <w:name w:val="Grid Table 3 - Accent 41"/>
-    <w:basedOn w:val="TableNormal"/>
+    <w:basedOn w:val="NormaleTabelle"/>
     <w:uiPriority w:val="99"/>
     <w:pPr>
       <w:spacing w:after="0" w:line="240" w:lineRule="auto"/>
@@ -12354,7 +13000,7 @@
   </w:style>
   <w:style w:type="table" w:customStyle="1" w:styleId="GridTable3-Accent51">
     <w:name w:val="Grid Table 3 - Accent 51"/>
-    <w:basedOn w:val="TableNormal"/>
+    <w:basedOn w:val="NormaleTabelle"/>
     <w:uiPriority w:val="99"/>
     <w:pPr>
       <w:spacing w:after="0" w:line="240" w:lineRule="auto"/>
@@ -12460,7 +13106,7 @@
   </w:style>
   <w:style w:type="table" w:customStyle="1" w:styleId="GridTable3-Accent61">
     <w:name w:val="Grid Table 3 - Accent 61"/>
-    <w:basedOn w:val="TableNormal"/>
+    <w:basedOn w:val="NormaleTabelle"/>
     <w:uiPriority w:val="99"/>
     <w:pPr>
       <w:spacing w:after="0" w:line="240" w:lineRule="auto"/>
@@ -12564,9 +13210,9 @@
       </w:tcPr>
     </w:tblStylePr>
   </w:style>
-  <w:style w:type="table" w:styleId="GridTable4">
+  <w:style w:type="table" w:styleId="Gitternetztabelle4">
     <w:name w:val="Grid Table 4"/>
-    <w:basedOn w:val="TableNormal"/>
+    <w:basedOn w:val="NormaleTabelle"/>
     <w:uiPriority w:val="59"/>
     <w:pPr>
       <w:spacing w:after="0" w:line="240" w:lineRule="auto"/>
@@ -12650,7 +13296,7 @@
   </w:style>
   <w:style w:type="table" w:customStyle="1" w:styleId="GridTable4-Accent11">
     <w:name w:val="Grid Table 4 - Accent 11"/>
-    <w:basedOn w:val="TableNormal"/>
+    <w:basedOn w:val="NormaleTabelle"/>
     <w:uiPriority w:val="59"/>
     <w:pPr>
       <w:spacing w:after="0" w:line="240" w:lineRule="auto"/>
@@ -12734,7 +13380,7 @@
   </w:style>
   <w:style w:type="table" w:customStyle="1" w:styleId="GridTable4-Accent21">
     <w:name w:val="Grid Table 4 - Accent 21"/>
-    <w:basedOn w:val="TableNormal"/>
+    <w:basedOn w:val="NormaleTabelle"/>
     <w:uiPriority w:val="59"/>
     <w:pPr>
       <w:spacing w:after="0" w:line="240" w:lineRule="auto"/>
@@ -12818,7 +13464,7 @@
   </w:style>
   <w:style w:type="table" w:customStyle="1" w:styleId="GridTable4-Accent31">
     <w:name w:val="Grid Table 4 - Accent 31"/>
-    <w:basedOn w:val="TableNormal"/>
+    <w:basedOn w:val="NormaleTabelle"/>
     <w:uiPriority w:val="59"/>
     <w:pPr>
       <w:spacing w:after="0" w:line="240" w:lineRule="auto"/>
@@ -12902,7 +13548,7 @@
   </w:style>
   <w:style w:type="table" w:customStyle="1" w:styleId="GridTable4-Accent41">
     <w:name w:val="Grid Table 4 - Accent 41"/>
-    <w:basedOn w:val="TableNormal"/>
+    <w:basedOn w:val="NormaleTabelle"/>
     <w:uiPriority w:val="59"/>
     <w:pPr>
       <w:spacing w:after="0" w:line="240" w:lineRule="auto"/>
@@ -12986,7 +13632,7 @@
   </w:style>
   <w:style w:type="table" w:customStyle="1" w:styleId="GridTable4-Accent51">
     <w:name w:val="Grid Table 4 - Accent 51"/>
-    <w:basedOn w:val="TableNormal"/>
+    <w:basedOn w:val="NormaleTabelle"/>
     <w:uiPriority w:val="59"/>
     <w:pPr>
       <w:spacing w:after="0" w:line="240" w:lineRule="auto"/>
@@ -13070,7 +13716,7 @@
   </w:style>
   <w:style w:type="table" w:customStyle="1" w:styleId="GridTable4-Accent61">
     <w:name w:val="Grid Table 4 - Accent 61"/>
-    <w:basedOn w:val="TableNormal"/>
+    <w:basedOn w:val="NormaleTabelle"/>
     <w:uiPriority w:val="59"/>
     <w:pPr>
       <w:spacing w:after="0" w:line="240" w:lineRule="auto"/>
@@ -13152,9 +13798,9 @@
       </w:tcPr>
     </w:tblStylePr>
   </w:style>
-  <w:style w:type="table" w:styleId="GridTable5Dark">
+  <w:style w:type="table" w:styleId="Gitternetztabelle5dunkel">
     <w:name w:val="Grid Table 5 Dark"/>
-    <w:basedOn w:val="TableNormal"/>
+    <w:basedOn w:val="NormaleTabelle"/>
     <w:uiPriority w:val="99"/>
     <w:pPr>
       <w:spacing w:after="0" w:line="240" w:lineRule="auto"/>
@@ -13238,7 +13884,7 @@
   </w:style>
   <w:style w:type="table" w:customStyle="1" w:styleId="GridTable5Dark-Accent11">
     <w:name w:val="Grid Table 5 Dark - Accent 11"/>
-    <w:basedOn w:val="TableNormal"/>
+    <w:basedOn w:val="NormaleTabelle"/>
     <w:uiPriority w:val="99"/>
     <w:pPr>
       <w:spacing w:after="0" w:line="240" w:lineRule="auto"/>
@@ -13322,7 +13968,7 @@
   </w:style>
   <w:style w:type="table" w:customStyle="1" w:styleId="GridTable5Dark-Accent21">
     <w:name w:val="Grid Table 5 Dark - Accent 21"/>
-    <w:basedOn w:val="TableNormal"/>
+    <w:basedOn w:val="NormaleTabelle"/>
     <w:uiPriority w:val="99"/>
     <w:pPr>
       <w:spacing w:after="0" w:line="240" w:lineRule="auto"/>
@@ -13406,7 +14052,7 @@
   </w:style>
   <w:style w:type="table" w:customStyle="1" w:styleId="GridTable5Dark-Accent31">
     <w:name w:val="Grid Table 5 Dark - Accent 31"/>
-    <w:basedOn w:val="TableNormal"/>
+    <w:basedOn w:val="NormaleTabelle"/>
     <w:uiPriority w:val="99"/>
     <w:pPr>
       <w:spacing w:after="0" w:line="240" w:lineRule="auto"/>
@@ -13490,7 +14136,7 @@
   </w:style>
   <w:style w:type="table" w:customStyle="1" w:styleId="GridTable5Dark-Accent41">
     <w:name w:val="Grid Table 5 Dark - Accent 41"/>
-    <w:basedOn w:val="TableNormal"/>
+    <w:basedOn w:val="NormaleTabelle"/>
     <w:uiPriority w:val="99"/>
     <w:pPr>
       <w:spacing w:after="0" w:line="240" w:lineRule="auto"/>
@@ -13574,7 +14220,7 @@
   </w:style>
   <w:style w:type="table" w:customStyle="1" w:styleId="GridTable5Dark-Accent51">
     <w:name w:val="Grid Table 5 Dark - Accent 51"/>
-    <w:basedOn w:val="TableNormal"/>
+    <w:basedOn w:val="NormaleTabelle"/>
     <w:uiPriority w:val="99"/>
     <w:pPr>
       <w:spacing w:after="0" w:line="240" w:lineRule="auto"/>
@@ -13658,7 +14304,7 @@
   </w:style>
   <w:style w:type="table" w:customStyle="1" w:styleId="GridTable5Dark-Accent61">
     <w:name w:val="Grid Table 5 Dark - Accent 61"/>
-    <w:basedOn w:val="TableNormal"/>
+    <w:basedOn w:val="NormaleTabelle"/>
     <w:uiPriority w:val="99"/>
     <w:pPr>
       <w:spacing w:after="0" w:line="240" w:lineRule="auto"/>
@@ -13740,9 +14386,9 @@
       </w:tcPr>
     </w:tblStylePr>
   </w:style>
-  <w:style w:type="table" w:styleId="GridTable6Colorful">
+  <w:style w:type="table" w:styleId="Gitternetztabelle6farbig">
     <w:name w:val="Grid Table 6 Colorful"/>
-    <w:basedOn w:val="TableNormal"/>
+    <w:basedOn w:val="NormaleTabelle"/>
     <w:uiPriority w:val="99"/>
     <w:pPr>
       <w:spacing w:after="0" w:line="240" w:lineRule="auto"/>
@@ -13816,7 +14462,7 @@
   </w:style>
   <w:style w:type="table" w:customStyle="1" w:styleId="GridTable6Colorful-Accent11">
     <w:name w:val="Grid Table 6 Colorful - Accent 11"/>
-    <w:basedOn w:val="TableNormal"/>
+    <w:basedOn w:val="NormaleTabelle"/>
     <w:uiPriority w:val="99"/>
     <w:pPr>
       <w:spacing w:after="0" w:line="240" w:lineRule="auto"/>
@@ -13890,7 +14536,7 @@
   </w:style>
   <w:style w:type="table" w:customStyle="1" w:styleId="GridTable6Colorful-Accent21">
     <w:name w:val="Grid Table 6 Colorful - Accent 21"/>
-    <w:basedOn w:val="TableNormal"/>
+    <w:basedOn w:val="NormaleTabelle"/>
     <w:uiPriority w:val="99"/>
     <w:pPr>
       <w:spacing w:after="0" w:line="240" w:lineRule="auto"/>
@@ -13964,7 +14610,7 @@
   </w:style>
   <w:style w:type="table" w:customStyle="1" w:styleId="GridTable6Colorful-Accent31">
     <w:name w:val="Grid Table 6 Colorful - Accent 31"/>
-    <w:basedOn w:val="TableNormal"/>
+    <w:basedOn w:val="NormaleTabelle"/>
     <w:uiPriority w:val="99"/>
     <w:pPr>
       <w:spacing w:after="0" w:line="240" w:lineRule="auto"/>
@@ -14038,7 +14684,7 @@
   </w:style>
   <w:style w:type="table" w:customStyle="1" w:styleId="GridTable6Colorful-Accent41">
     <w:name w:val="Grid Table 6 Colorful - Accent 41"/>
-    <w:basedOn w:val="TableNormal"/>
+    <w:basedOn w:val="NormaleTabelle"/>
     <w:uiPriority w:val="99"/>
     <w:pPr>
       <w:spacing w:after="0" w:line="240" w:lineRule="auto"/>
@@ -14112,7 +14758,7 @@
   </w:style>
   <w:style w:type="table" w:customStyle="1" w:styleId="GridTable6Colorful-Accent51">
     <w:name w:val="Grid Table 6 Colorful - Accent 51"/>
-    <w:basedOn w:val="TableNormal"/>
+    <w:basedOn w:val="NormaleTabelle"/>
     <w:uiPriority w:val="99"/>
     <w:pPr>
       <w:spacing w:after="0" w:line="240" w:lineRule="auto"/>
@@ -14186,7 +14832,7 @@
   </w:style>
   <w:style w:type="table" w:customStyle="1" w:styleId="GridTable6Colorful-Accent61">
     <w:name w:val="Grid Table 6 Colorful - Accent 61"/>
-    <w:basedOn w:val="TableNormal"/>
+    <w:basedOn w:val="NormaleTabelle"/>
     <w:uiPriority w:val="99"/>
     <w:pPr>
       <w:spacing w:after="0" w:line="240" w:lineRule="auto"/>
@@ -14258,9 +14904,9 @@
       </w:rPr>
     </w:tblStylePr>
   </w:style>
-  <w:style w:type="table" w:styleId="GridTable7Colorful">
+  <w:style w:type="table" w:styleId="Gitternetztabelle7farbig">
     <w:name w:val="Grid Table 7 Colorful"/>
-    <w:basedOn w:val="TableNormal"/>
+    <w:basedOn w:val="NormaleTabelle"/>
     <w:uiPriority w:val="99"/>
     <w:pPr>
       <w:spacing w:after="0" w:line="240" w:lineRule="auto"/>
@@ -14377,7 +15023,7 @@
   </w:style>
   <w:style w:type="table" w:customStyle="1" w:styleId="GridTable7Colorful-Accent11">
     <w:name w:val="Grid Table 7 Colorful - Accent 11"/>
-    <w:basedOn w:val="TableNormal"/>
+    <w:basedOn w:val="NormaleTabelle"/>
     <w:uiPriority w:val="99"/>
     <w:pPr>
       <w:spacing w:after="0" w:line="240" w:lineRule="auto"/>
@@ -14494,7 +15140,7 @@
   </w:style>
   <w:style w:type="table" w:customStyle="1" w:styleId="GridTable7Colorful-Accent21">
     <w:name w:val="Grid Table 7 Colorful - Accent 21"/>
-    <w:basedOn w:val="TableNormal"/>
+    <w:basedOn w:val="NormaleTabelle"/>
     <w:uiPriority w:val="99"/>
     <w:pPr>
       <w:spacing w:after="0" w:line="240" w:lineRule="auto"/>
@@ -14611,7 +15257,7 @@
   </w:style>
   <w:style w:type="table" w:customStyle="1" w:styleId="GridTable7Colorful-Accent31">
     <w:name w:val="Grid Table 7 Colorful - Accent 31"/>
-    <w:basedOn w:val="TableNormal"/>
+    <w:basedOn w:val="NormaleTabelle"/>
     <w:uiPriority w:val="99"/>
     <w:pPr>
       <w:spacing w:after="0" w:line="240" w:lineRule="auto"/>
@@ -14728,7 +15374,7 @@
   </w:style>
   <w:style w:type="table" w:customStyle="1" w:styleId="GridTable7Colorful-Accent41">
     <w:name w:val="Grid Table 7 Colorful - Accent 41"/>
-    <w:basedOn w:val="TableNormal"/>
+    <w:basedOn w:val="NormaleTabelle"/>
     <w:uiPriority w:val="99"/>
     <w:pPr>
       <w:spacing w:after="0" w:line="240" w:lineRule="auto"/>
@@ -14845,7 +15491,7 @@
   </w:style>
   <w:style w:type="table" w:customStyle="1" w:styleId="GridTable7Colorful-Accent51">
     <w:name w:val="Grid Table 7 Colorful - Accent 51"/>
-    <w:basedOn w:val="TableNormal"/>
+    <w:basedOn w:val="NormaleTabelle"/>
     <w:uiPriority w:val="99"/>
     <w:pPr>
       <w:spacing w:after="0" w:line="240" w:lineRule="auto"/>
@@ -14962,7 +15608,7 @@
   </w:style>
   <w:style w:type="table" w:customStyle="1" w:styleId="GridTable7Colorful-Accent61">
     <w:name w:val="Grid Table 7 Colorful - Accent 61"/>
-    <w:basedOn w:val="TableNormal"/>
+    <w:basedOn w:val="NormaleTabelle"/>
     <w:uiPriority w:val="99"/>
     <w:pPr>
       <w:spacing w:after="0" w:line="240" w:lineRule="auto"/>
@@ -15077,9 +15723,9 @@
       </w:rPr>
     </w:tblStylePr>
   </w:style>
-  <w:style w:type="table" w:styleId="ListTable1Light">
+  <w:style w:type="table" w:styleId="Listentabelle1hell">
     <w:name w:val="List Table 1 Light"/>
-    <w:basedOn w:val="TableNormal"/>
+    <w:basedOn w:val="NormaleTabelle"/>
     <w:uiPriority w:val="99"/>
     <w:pPr>
       <w:spacing w:after="0" w:line="240" w:lineRule="auto"/>
@@ -15145,7 +15791,7 @@
   </w:style>
   <w:style w:type="table" w:customStyle="1" w:styleId="ListTable1Light-Accent11">
     <w:name w:val="List Table 1 Light - Accent 11"/>
-    <w:basedOn w:val="TableNormal"/>
+    <w:basedOn w:val="NormaleTabelle"/>
     <w:uiPriority w:val="99"/>
     <w:pPr>
       <w:spacing w:after="0" w:line="240" w:lineRule="auto"/>
@@ -15211,7 +15857,7 @@
   </w:style>
   <w:style w:type="table" w:customStyle="1" w:styleId="ListTable1Light-Accent21">
     <w:name w:val="List Table 1 Light - Accent 21"/>
-    <w:basedOn w:val="TableNormal"/>
+    <w:basedOn w:val="NormaleTabelle"/>
     <w:uiPriority w:val="99"/>
     <w:pPr>
       <w:spacing w:after="0" w:line="240" w:lineRule="auto"/>
@@ -15277,7 +15923,7 @@
   </w:style>
   <w:style w:type="table" w:customStyle="1" w:styleId="ListTable1Light-Accent31">
     <w:name w:val="List Table 1 Light - Accent 31"/>
-    <w:basedOn w:val="TableNormal"/>
+    <w:basedOn w:val="NormaleTabelle"/>
     <w:uiPriority w:val="99"/>
     <w:pPr>
       <w:spacing w:after="0" w:line="240" w:lineRule="auto"/>
@@ -15343,7 +15989,7 @@
   </w:style>
   <w:style w:type="table" w:customStyle="1" w:styleId="ListTable1Light-Accent41">
     <w:name w:val="List Table 1 Light - Accent 41"/>
-    <w:basedOn w:val="TableNormal"/>
+    <w:basedOn w:val="NormaleTabelle"/>
     <w:uiPriority w:val="99"/>
     <w:pPr>
       <w:spacing w:after="0" w:line="240" w:lineRule="auto"/>
@@ -15409,7 +16055,7 @@
   </w:style>
   <w:style w:type="table" w:customStyle="1" w:styleId="ListTable1Light-Accent51">
     <w:name w:val="List Table 1 Light - Accent 51"/>
-    <w:basedOn w:val="TableNormal"/>
+    <w:basedOn w:val="NormaleTabelle"/>
     <w:uiPriority w:val="99"/>
     <w:pPr>
       <w:spacing w:after="0" w:line="240" w:lineRule="auto"/>
@@ -15475,7 +16121,7 @@
   </w:style>
   <w:style w:type="table" w:customStyle="1" w:styleId="ListTable1Light-Accent61">
     <w:name w:val="List Table 1 Light - Accent 61"/>
-    <w:basedOn w:val="TableNormal"/>
+    <w:basedOn w:val="NormaleTabelle"/>
     <w:uiPriority w:val="99"/>
     <w:pPr>
       <w:spacing w:after="0" w:line="240" w:lineRule="auto"/>
@@ -15539,9 +16185,9 @@
       </w:tcPr>
     </w:tblStylePr>
   </w:style>
-  <w:style w:type="table" w:styleId="ListTable2">
+  <w:style w:type="table" w:styleId="Listentabelle2">
     <w:name w:val="List Table 2"/>
-    <w:basedOn w:val="TableNormal"/>
+    <w:basedOn w:val="NormaleTabelle"/>
     <w:uiPriority w:val="99"/>
     <w:pPr>
       <w:spacing w:after="0" w:line="240" w:lineRule="auto"/>
@@ -15630,7 +16276,7 @@
   </w:style>
   <w:style w:type="table" w:customStyle="1" w:styleId="ListTable2-Accent11">
     <w:name w:val="List Table 2 - Accent 11"/>
-    <w:basedOn w:val="TableNormal"/>
+    <w:basedOn w:val="NormaleTabelle"/>
     <w:uiPriority w:val="99"/>
     <w:pPr>
       <w:spacing w:after="0" w:line="240" w:lineRule="auto"/>
@@ -15719,7 +16365,7 @@
   </w:style>
   <w:style w:type="table" w:customStyle="1" w:styleId="ListTable2-Accent21">
     <w:name w:val="List Table 2 - Accent 21"/>
-    <w:basedOn w:val="TableNormal"/>
+    <w:basedOn w:val="NormaleTabelle"/>
     <w:uiPriority w:val="99"/>
     <w:pPr>
       <w:spacing w:after="0" w:line="240" w:lineRule="auto"/>
@@ -15808,7 +16454,7 @@
   </w:style>
   <w:style w:type="table" w:customStyle="1" w:styleId="ListTable2-Accent31">
     <w:name w:val="List Table 2 - Accent 31"/>
-    <w:basedOn w:val="TableNormal"/>
+    <w:basedOn w:val="NormaleTabelle"/>
     <w:uiPriority w:val="99"/>
     <w:pPr>
       <w:spacing w:after="0" w:line="240" w:lineRule="auto"/>
@@ -15897,7 +16543,7 @@
   </w:style>
   <w:style w:type="table" w:customStyle="1" w:styleId="ListTable2-Accent41">
     <w:name w:val="List Table 2 - Accent 41"/>
-    <w:basedOn w:val="TableNormal"/>
+    <w:basedOn w:val="NormaleTabelle"/>
     <w:uiPriority w:val="99"/>
     <w:pPr>
       <w:spacing w:after="0" w:line="240" w:lineRule="auto"/>
@@ -15986,7 +16632,7 @@
   </w:style>
   <w:style w:type="table" w:customStyle="1" w:styleId="ListTable2-Accent51">
     <w:name w:val="List Table 2 - Accent 51"/>
-    <w:basedOn w:val="TableNormal"/>
+    <w:basedOn w:val="NormaleTabelle"/>
     <w:uiPriority w:val="99"/>
     <w:pPr>
       <w:spacing w:after="0" w:line="240" w:lineRule="auto"/>
@@ -16075,7 +16721,7 @@
   </w:style>
   <w:style w:type="table" w:customStyle="1" w:styleId="ListTable2-Accent61">
     <w:name w:val="List Table 2 - Accent 61"/>
-    <w:basedOn w:val="TableNormal"/>
+    <w:basedOn w:val="NormaleTabelle"/>
     <w:uiPriority w:val="99"/>
     <w:pPr>
       <w:spacing w:after="0" w:line="240" w:lineRule="auto"/>
@@ -16162,9 +16808,9 @@
       </w:tcPr>
     </w:tblStylePr>
   </w:style>
-  <w:style w:type="table" w:styleId="ListTable3">
+  <w:style w:type="table" w:styleId="Listentabelle3">
     <w:name w:val="List Table 3"/>
-    <w:basedOn w:val="TableNormal"/>
+    <w:basedOn w:val="NormaleTabelle"/>
     <w:uiPriority w:val="99"/>
     <w:pPr>
       <w:spacing w:after="0" w:line="240" w:lineRule="auto"/>
@@ -16240,7 +16886,7 @@
   </w:style>
   <w:style w:type="table" w:customStyle="1" w:styleId="ListTable3-Accent11">
     <w:name w:val="List Table 3 - Accent 11"/>
-    <w:basedOn w:val="TableNormal"/>
+    <w:basedOn w:val="NormaleTabelle"/>
     <w:uiPriority w:val="99"/>
     <w:pPr>
       <w:spacing w:after="0" w:line="240" w:lineRule="auto"/>
@@ -16316,7 +16962,7 @@
   </w:style>
   <w:style w:type="table" w:customStyle="1" w:styleId="ListTable3-Accent21">
     <w:name w:val="List Table 3 - Accent 21"/>
-    <w:basedOn w:val="TableNormal"/>
+    <w:basedOn w:val="NormaleTabelle"/>
     <w:uiPriority w:val="99"/>
     <w:pPr>
       <w:spacing w:after="0" w:line="240" w:lineRule="auto"/>
@@ -16392,7 +17038,7 @@
   </w:style>
   <w:style w:type="table" w:customStyle="1" w:styleId="ListTable3-Accent31">
     <w:name w:val="List Table 3 - Accent 31"/>
-    <w:basedOn w:val="TableNormal"/>
+    <w:basedOn w:val="NormaleTabelle"/>
     <w:uiPriority w:val="99"/>
     <w:pPr>
       <w:spacing w:after="0" w:line="240" w:lineRule="auto"/>
@@ -16468,7 +17114,7 @@
   </w:style>
   <w:style w:type="table" w:customStyle="1" w:styleId="ListTable3-Accent41">
     <w:name w:val="List Table 3 - Accent 41"/>
-    <w:basedOn w:val="TableNormal"/>
+    <w:basedOn w:val="NormaleTabelle"/>
     <w:uiPriority w:val="99"/>
     <w:pPr>
       <w:spacing w:after="0" w:line="240" w:lineRule="auto"/>
@@ -16544,7 +17190,7 @@
   </w:style>
   <w:style w:type="table" w:customStyle="1" w:styleId="ListTable3-Accent51">
     <w:name w:val="List Table 3 - Accent 51"/>
-    <w:basedOn w:val="TableNormal"/>
+    <w:basedOn w:val="NormaleTabelle"/>
     <w:uiPriority w:val="99"/>
     <w:pPr>
       <w:spacing w:after="0" w:line="240" w:lineRule="auto"/>
@@ -16620,7 +17266,7 @@
   </w:style>
   <w:style w:type="table" w:customStyle="1" w:styleId="ListTable3-Accent61">
     <w:name w:val="List Table 3 - Accent 61"/>
-    <w:basedOn w:val="TableNormal"/>
+    <w:basedOn w:val="NormaleTabelle"/>
     <w:uiPriority w:val="99"/>
     <w:pPr>
       <w:spacing w:after="0" w:line="240" w:lineRule="auto"/>
@@ -16694,9 +17340,9 @@
       </w:tcPr>
     </w:tblStylePr>
   </w:style>
-  <w:style w:type="table" w:styleId="ListTable4">
+  <w:style w:type="table" w:styleId="Listentabelle4">
     <w:name w:val="List Table 4"/>
-    <w:basedOn w:val="TableNormal"/>
+    <w:basedOn w:val="NormaleTabelle"/>
     <w:uiPriority w:val="99"/>
     <w:pPr>
       <w:spacing w:after="0" w:line="240" w:lineRule="auto"/>
@@ -16767,7 +17413,7 @@
   </w:style>
   <w:style w:type="table" w:customStyle="1" w:styleId="ListTable4-Accent11">
     <w:name w:val="List Table 4 - Accent 11"/>
-    <w:basedOn w:val="TableNormal"/>
+    <w:basedOn w:val="NormaleTabelle"/>
     <w:uiPriority w:val="99"/>
     <w:pPr>
       <w:spacing w:after="0" w:line="240" w:lineRule="auto"/>
@@ -16838,7 +17484,7 @@
   </w:style>
   <w:style w:type="table" w:customStyle="1" w:styleId="ListTable4-Accent21">
     <w:name w:val="List Table 4 - Accent 21"/>
-    <w:basedOn w:val="TableNormal"/>
+    <w:basedOn w:val="NormaleTabelle"/>
     <w:uiPriority w:val="99"/>
     <w:pPr>
       <w:spacing w:after="0" w:line="240" w:lineRule="auto"/>
@@ -16909,7 +17555,7 @@
   </w:style>
   <w:style w:type="table" w:customStyle="1" w:styleId="ListTable4-Accent31">
     <w:name w:val="List Table 4 - Accent 31"/>
-    <w:basedOn w:val="TableNormal"/>
+    <w:basedOn w:val="NormaleTabelle"/>
     <w:uiPriority w:val="99"/>
     <w:pPr>
       <w:spacing w:after="0" w:line="240" w:lineRule="auto"/>
@@ -16980,7 +17626,7 @@
   </w:style>
   <w:style w:type="table" w:customStyle="1" w:styleId="ListTable4-Accent41">
     <w:name w:val="List Table 4 - Accent 41"/>
-    <w:basedOn w:val="TableNormal"/>
+    <w:basedOn w:val="NormaleTabelle"/>
     <w:uiPriority w:val="99"/>
     <w:pPr>
       <w:spacing w:after="0" w:line="240" w:lineRule="auto"/>
@@ -17051,7 +17697,7 @@
   </w:style>
   <w:style w:type="table" w:customStyle="1" w:styleId="ListTable4-Accent51">
     <w:name w:val="List Table 4 - Accent 51"/>
-    <w:basedOn w:val="TableNormal"/>
+    <w:basedOn w:val="NormaleTabelle"/>
     <w:uiPriority w:val="99"/>
     <w:pPr>
       <w:spacing w:after="0" w:line="240" w:lineRule="auto"/>
@@ -17122,7 +17768,7 @@
   </w:style>
   <w:style w:type="table" w:customStyle="1" w:styleId="ListTable4-Accent61">
     <w:name w:val="List Table 4 - Accent 61"/>
-    <w:basedOn w:val="TableNormal"/>
+    <w:basedOn w:val="NormaleTabelle"/>
     <w:uiPriority w:val="99"/>
     <w:pPr>
       <w:spacing w:after="0" w:line="240" w:lineRule="auto"/>
@@ -17191,9 +17837,9 @@
       </w:tcPr>
     </w:tblStylePr>
   </w:style>
-  <w:style w:type="table" w:styleId="ListTable5Dark">
+  <w:style w:type="table" w:styleId="Listentabelle5dunkel">
     <w:name w:val="List Table 5 Dark"/>
-    <w:basedOn w:val="TableNormal"/>
+    <w:basedOn w:val="NormaleTabelle"/>
     <w:uiPriority w:val="99"/>
     <w:pPr>
       <w:spacing w:after="0" w:line="240" w:lineRule="auto"/>
@@ -17299,7 +17945,7 @@
   </w:style>
   <w:style w:type="table" w:customStyle="1" w:styleId="ListTable5Dark-Accent11">
     <w:name w:val="List Table 5 Dark - Accent 11"/>
-    <w:basedOn w:val="TableNormal"/>
+    <w:basedOn w:val="NormaleTabelle"/>
     <w:uiPriority w:val="99"/>
     <w:pPr>
       <w:spacing w:after="0" w:line="240" w:lineRule="auto"/>
@@ -17405,7 +18051,7 @@
   </w:style>
   <w:style w:type="table" w:customStyle="1" w:styleId="ListTable5Dark-Accent21">
     <w:name w:val="List Table 5 Dark - Accent 21"/>
-    <w:basedOn w:val="TableNormal"/>
+    <w:basedOn w:val="NormaleTabelle"/>
     <w:uiPriority w:val="99"/>
     <w:pPr>
       <w:spacing w:after="0" w:line="240" w:lineRule="auto"/>
@@ -17511,7 +18157,7 @@
   </w:style>
   <w:style w:type="table" w:customStyle="1" w:styleId="ListTable5Dark-Accent31">
     <w:name w:val="List Table 5 Dark - Accent 31"/>
-    <w:basedOn w:val="TableNormal"/>
+    <w:basedOn w:val="NormaleTabelle"/>
     <w:uiPriority w:val="99"/>
     <w:pPr>
       <w:spacing w:after="0" w:line="240" w:lineRule="auto"/>
@@ -17617,7 +18263,7 @@
   </w:style>
   <w:style w:type="table" w:customStyle="1" w:styleId="ListTable5Dark-Accent41">
     <w:name w:val="List Table 5 Dark - Accent 41"/>
-    <w:basedOn w:val="TableNormal"/>
+    <w:basedOn w:val="NormaleTabelle"/>
     <w:uiPriority w:val="99"/>
     <w:pPr>
       <w:spacing w:after="0" w:line="240" w:lineRule="auto"/>
@@ -17723,7 +18369,7 @@
   </w:style>
   <w:style w:type="table" w:customStyle="1" w:styleId="ListTable5Dark-Accent51">
     <w:name w:val="List Table 5 Dark - Accent 51"/>
-    <w:basedOn w:val="TableNormal"/>
+    <w:basedOn w:val="NormaleTabelle"/>
     <w:uiPriority w:val="99"/>
     <w:pPr>
       <w:spacing w:after="0" w:line="240" w:lineRule="auto"/>
@@ -17829,7 +18475,7 @@
   </w:style>
   <w:style w:type="table" w:customStyle="1" w:styleId="ListTable5Dark-Accent61">
     <w:name w:val="List Table 5 Dark - Accent 61"/>
-    <w:basedOn w:val="TableNormal"/>
+    <w:basedOn w:val="NormaleTabelle"/>
     <w:uiPriority w:val="99"/>
     <w:pPr>
       <w:spacing w:after="0" w:line="240" w:lineRule="auto"/>
@@ -17933,9 +18579,9 @@
       </w:tcPr>
     </w:tblStylePr>
   </w:style>
-  <w:style w:type="table" w:styleId="ListTable6Colorful">
+  <w:style w:type="table" w:styleId="Listentabelle6farbig">
     <w:name w:val="List Table 6 Colorful"/>
-    <w:basedOn w:val="TableNormal"/>
+    <w:basedOn w:val="NormaleTabelle"/>
     <w:uiPriority w:val="99"/>
     <w:pPr>
       <w:spacing w:after="0" w:line="240" w:lineRule="auto"/>
@@ -18011,7 +18657,7 @@
   </w:style>
   <w:style w:type="table" w:customStyle="1" w:styleId="ListTable6Colorful-Accent11">
     <w:name w:val="List Table 6 Colorful - Accent 11"/>
-    <w:basedOn w:val="TableNormal"/>
+    <w:basedOn w:val="NormaleTabelle"/>
     <w:uiPriority w:val="99"/>
     <w:pPr>
       <w:spacing w:after="0" w:line="240" w:lineRule="auto"/>
@@ -18087,7 +18733,7 @@
   </w:style>
   <w:style w:type="table" w:customStyle="1" w:styleId="ListTable6Colorful-Accent21">
     <w:name w:val="List Table 6 Colorful - Accent 21"/>
-    <w:basedOn w:val="TableNormal"/>
+    <w:basedOn w:val="NormaleTabelle"/>
     <w:uiPriority w:val="99"/>
     <w:pPr>
       <w:spacing w:after="0" w:line="240" w:lineRule="auto"/>
@@ -18163,7 +18809,7 @@
   </w:style>
   <w:style w:type="table" w:customStyle="1" w:styleId="ListTable6Colorful-Accent31">
     <w:name w:val="List Table 6 Colorful - Accent 31"/>
-    <w:basedOn w:val="TableNormal"/>
+    <w:basedOn w:val="NormaleTabelle"/>
     <w:uiPriority w:val="99"/>
     <w:pPr>
       <w:spacing w:after="0" w:line="240" w:lineRule="auto"/>
@@ -18239,7 +18885,7 @@
   </w:style>
   <w:style w:type="table" w:customStyle="1" w:styleId="ListTable6Colorful-Accent41">
     <w:name w:val="List Table 6 Colorful - Accent 41"/>
-    <w:basedOn w:val="TableNormal"/>
+    <w:basedOn w:val="NormaleTabelle"/>
     <w:uiPriority w:val="99"/>
     <w:pPr>
       <w:spacing w:after="0" w:line="240" w:lineRule="auto"/>
@@ -18315,7 +18961,7 @@
   </w:style>
   <w:style w:type="table" w:customStyle="1" w:styleId="ListTable6Colorful-Accent51">
     <w:name w:val="List Table 6 Colorful - Accent 51"/>
-    <w:basedOn w:val="TableNormal"/>
+    <w:basedOn w:val="NormaleTabelle"/>
     <w:uiPriority w:val="99"/>
     <w:pPr>
       <w:spacing w:after="0" w:line="240" w:lineRule="auto"/>
@@ -18391,7 +19037,7 @@
   </w:style>
   <w:style w:type="table" w:customStyle="1" w:styleId="ListTable6Colorful-Accent61">
     <w:name w:val="List Table 6 Colorful - Accent 61"/>
-    <w:basedOn w:val="TableNormal"/>
+    <w:basedOn w:val="NormaleTabelle"/>
     <w:uiPriority w:val="99"/>
     <w:pPr>
       <w:spacing w:after="0" w:line="240" w:lineRule="auto"/>
@@ -18465,9 +19111,9 @@
       </w:rPr>
     </w:tblStylePr>
   </w:style>
-  <w:style w:type="table" w:styleId="ListTable7Colorful">
+  <w:style w:type="table" w:styleId="Listentabelle7farbig">
     <w:name w:val="List Table 7 Colorful"/>
-    <w:basedOn w:val="TableNormal"/>
+    <w:basedOn w:val="NormaleTabelle"/>
     <w:uiPriority w:val="99"/>
     <w:pPr>
       <w:spacing w:after="0" w:line="240" w:lineRule="auto"/>
@@ -18581,7 +19227,7 @@
   </w:style>
   <w:style w:type="table" w:customStyle="1" w:styleId="ListTable7Colorful-Accent11">
     <w:name w:val="List Table 7 Colorful - Accent 11"/>
-    <w:basedOn w:val="TableNormal"/>
+    <w:basedOn w:val="NormaleTabelle"/>
     <w:uiPriority w:val="99"/>
     <w:pPr>
       <w:spacing w:after="0" w:line="240" w:lineRule="auto"/>
@@ -18695,7 +19341,7 @@
   </w:style>
   <w:style w:type="table" w:customStyle="1" w:styleId="ListTable7Colorful-Accent21">
     <w:name w:val="List Table 7 Colorful - Accent 21"/>
-    <w:basedOn w:val="TableNormal"/>
+    <w:basedOn w:val="NormaleTabelle"/>
     <w:uiPriority w:val="99"/>
     <w:pPr>
       <w:spacing w:after="0" w:line="240" w:lineRule="auto"/>
@@ -18809,7 +19455,7 @@
   </w:style>
   <w:style w:type="table" w:customStyle="1" w:styleId="ListTable7Colorful-Accent31">
     <w:name w:val="List Table 7 Colorful - Accent 31"/>
-    <w:basedOn w:val="TableNormal"/>
+    <w:basedOn w:val="NormaleTabelle"/>
     <w:uiPriority w:val="99"/>
     <w:pPr>
       <w:spacing w:after="0" w:line="240" w:lineRule="auto"/>
@@ -18923,7 +19569,7 @@
   </w:style>
   <w:style w:type="table" w:customStyle="1" w:styleId="ListTable7Colorful-Accent41">
     <w:name w:val="List Table 7 Colorful - Accent 41"/>
-    <w:basedOn w:val="TableNormal"/>
+    <w:basedOn w:val="NormaleTabelle"/>
     <w:uiPriority w:val="99"/>
     <w:pPr>
       <w:spacing w:after="0" w:line="240" w:lineRule="auto"/>
@@ -19037,7 +19683,7 @@
   </w:style>
   <w:style w:type="table" w:customStyle="1" w:styleId="ListTable7Colorful-Accent51">
     <w:name w:val="List Table 7 Colorful - Accent 51"/>
-    <w:basedOn w:val="TableNormal"/>
+    <w:basedOn w:val="NormaleTabelle"/>
     <w:uiPriority w:val="99"/>
     <w:pPr>
       <w:spacing w:after="0" w:line="240" w:lineRule="auto"/>
@@ -19151,7 +19797,7 @@
   </w:style>
   <w:style w:type="table" w:customStyle="1" w:styleId="ListTable7Colorful-Accent61">
     <w:name w:val="List Table 7 Colorful - Accent 61"/>
-    <w:basedOn w:val="TableNormal"/>
+    <w:basedOn w:val="NormaleTabelle"/>
     <w:uiPriority w:val="99"/>
     <w:pPr>
       <w:spacing w:after="0" w:line="240" w:lineRule="auto"/>
@@ -19265,7 +19911,7 @@
   </w:style>
   <w:style w:type="table" w:customStyle="1" w:styleId="Lined-Accent">
     <w:name w:val="Lined - Accent"/>
-    <w:basedOn w:val="TableNormal"/>
+    <w:basedOn w:val="NormaleTabelle"/>
     <w:uiPriority w:val="99"/>
     <w:pPr>
       <w:spacing w:after="0" w:line="240" w:lineRule="auto"/>
@@ -19363,7 +20009,7 @@
   </w:style>
   <w:style w:type="table" w:customStyle="1" w:styleId="Lined-Accent1">
     <w:name w:val="Lined - Accent 1"/>
-    <w:basedOn w:val="TableNormal"/>
+    <w:basedOn w:val="NormaleTabelle"/>
     <w:uiPriority w:val="99"/>
     <w:pPr>
       <w:spacing w:after="0" w:line="240" w:lineRule="auto"/>
@@ -19461,7 +20107,7 @@
   </w:style>
   <w:style w:type="table" w:customStyle="1" w:styleId="Lined-Accent2">
     <w:name w:val="Lined - Accent 2"/>
-    <w:basedOn w:val="TableNormal"/>
+    <w:basedOn w:val="NormaleTabelle"/>
     <w:uiPriority w:val="99"/>
     <w:pPr>
       <w:spacing w:after="0" w:line="240" w:lineRule="auto"/>
@@ -19559,7 +20205,7 @@
   </w:style>
   <w:style w:type="table" w:customStyle="1" w:styleId="Lined-Accent3">
     <w:name w:val="Lined - Accent 3"/>
-    <w:basedOn w:val="TableNormal"/>
+    <w:basedOn w:val="NormaleTabelle"/>
     <w:uiPriority w:val="99"/>
     <w:pPr>
       <w:spacing w:after="0" w:line="240" w:lineRule="auto"/>
@@ -19657,7 +20303,7 @@
   </w:style>
   <w:style w:type="table" w:customStyle="1" w:styleId="Lined-Accent4">
     <w:name w:val="Lined - Accent 4"/>
-    <w:basedOn w:val="TableNormal"/>
+    <w:basedOn w:val="NormaleTabelle"/>
     <w:uiPriority w:val="99"/>
     <w:pPr>
       <w:spacing w:after="0" w:line="240" w:lineRule="auto"/>
@@ -19755,7 +20401,7 @@
   </w:style>
   <w:style w:type="table" w:customStyle="1" w:styleId="Lined-Accent5">
     <w:name w:val="Lined - Accent 5"/>
-    <w:basedOn w:val="TableNormal"/>
+    <w:basedOn w:val="NormaleTabelle"/>
     <w:uiPriority w:val="99"/>
     <w:pPr>
       <w:spacing w:after="0" w:line="240" w:lineRule="auto"/>
@@ -19853,7 +20499,7 @@
   </w:style>
   <w:style w:type="table" w:customStyle="1" w:styleId="Lined-Accent6">
     <w:name w:val="Lined - Accent 6"/>
-    <w:basedOn w:val="TableNormal"/>
+    <w:basedOn w:val="NormaleTabelle"/>
     <w:uiPriority w:val="99"/>
     <w:pPr>
       <w:spacing w:after="0" w:line="240" w:lineRule="auto"/>
@@ -19951,7 +20597,7 @@
   </w:style>
   <w:style w:type="table" w:customStyle="1" w:styleId="BorderedLined-Accent">
     <w:name w:val="Bordered &amp; Lined - Accent"/>
-    <w:basedOn w:val="TableNormal"/>
+    <w:basedOn w:val="NormaleTabelle"/>
     <w:uiPriority w:val="99"/>
     <w:pPr>
       <w:spacing w:after="0" w:line="240" w:lineRule="auto"/>
@@ -20057,7 +20703,7 @@
   </w:style>
   <w:style w:type="table" w:customStyle="1" w:styleId="BorderedLined-Accent1">
     <w:name w:val="Bordered &amp; Lined - Accent 1"/>
-    <w:basedOn w:val="TableNormal"/>
+    <w:basedOn w:val="NormaleTabelle"/>
     <w:uiPriority w:val="99"/>
     <w:pPr>
       <w:spacing w:after="0" w:line="240" w:lineRule="auto"/>
@@ -20163,7 +20809,7 @@
   </w:style>
   <w:style w:type="table" w:customStyle="1" w:styleId="BorderedLined-Accent2">
     <w:name w:val="Bordered &amp; Lined - Accent 2"/>
-    <w:basedOn w:val="TableNormal"/>
+    <w:basedOn w:val="NormaleTabelle"/>
     <w:uiPriority w:val="99"/>
     <w:pPr>
       <w:spacing w:after="0" w:line="240" w:lineRule="auto"/>
@@ -20269,7 +20915,7 @@
   </w:style>
   <w:style w:type="table" w:customStyle="1" w:styleId="BorderedLined-Accent3">
     <w:name w:val="Bordered &amp; Lined - Accent 3"/>
-    <w:basedOn w:val="TableNormal"/>
+    <w:basedOn w:val="NormaleTabelle"/>
     <w:uiPriority w:val="99"/>
     <w:pPr>
       <w:spacing w:after="0" w:line="240" w:lineRule="auto"/>
@@ -20375,7 +21021,7 @@
   </w:style>
   <w:style w:type="table" w:customStyle="1" w:styleId="BorderedLined-Accent4">
     <w:name w:val="Bordered &amp; Lined - Accent 4"/>
-    <w:basedOn w:val="TableNormal"/>
+    <w:basedOn w:val="NormaleTabelle"/>
     <w:uiPriority w:val="99"/>
     <w:pPr>
       <w:spacing w:after="0" w:line="240" w:lineRule="auto"/>
@@ -20481,7 +21127,7 @@
   </w:style>
   <w:style w:type="table" w:customStyle="1" w:styleId="BorderedLined-Accent5">
     <w:name w:val="Bordered &amp; Lined - Accent 5"/>
-    <w:basedOn w:val="TableNormal"/>
+    <w:basedOn w:val="NormaleTabelle"/>
     <w:uiPriority w:val="99"/>
     <w:pPr>
       <w:spacing w:after="0" w:line="240" w:lineRule="auto"/>
@@ -20587,7 +21233,7 @@
   </w:style>
   <w:style w:type="table" w:customStyle="1" w:styleId="BorderedLined-Accent6">
     <w:name w:val="Bordered &amp; Lined - Accent 6"/>
-    <w:basedOn w:val="TableNormal"/>
+    <w:basedOn w:val="NormaleTabelle"/>
     <w:uiPriority w:val="99"/>
     <w:pPr>
       <w:spacing w:after="0" w:line="240" w:lineRule="auto"/>
@@ -20693,7 +21339,7 @@
   </w:style>
   <w:style w:type="table" w:customStyle="1" w:styleId="Bordered">
     <w:name w:val="Bordered"/>
-    <w:basedOn w:val="TableNormal"/>
+    <w:basedOn w:val="NormaleTabelle"/>
     <w:uiPriority w:val="99"/>
     <w:pPr>
       <w:spacing w:after="0" w:line="240" w:lineRule="auto"/>
@@ -20775,7 +21421,7 @@
   </w:style>
   <w:style w:type="table" w:customStyle="1" w:styleId="Bordered-Accent1">
     <w:name w:val="Bordered - Accent 1"/>
-    <w:basedOn w:val="TableNormal"/>
+    <w:basedOn w:val="NormaleTabelle"/>
     <w:uiPriority w:val="99"/>
     <w:pPr>
       <w:spacing w:after="0" w:line="240" w:lineRule="auto"/>
@@ -20857,7 +21503,7 @@
   </w:style>
   <w:style w:type="table" w:customStyle="1" w:styleId="Bordered-Accent2">
     <w:name w:val="Bordered - Accent 2"/>
-    <w:basedOn w:val="TableNormal"/>
+    <w:basedOn w:val="NormaleTabelle"/>
     <w:uiPriority w:val="99"/>
     <w:pPr>
       <w:spacing w:after="0" w:line="240" w:lineRule="auto"/>
@@ -20939,7 +21585,7 @@
   </w:style>
   <w:style w:type="table" w:customStyle="1" w:styleId="Bordered-Accent3">
     <w:name w:val="Bordered - Accent 3"/>
-    <w:basedOn w:val="TableNormal"/>
+    <w:basedOn w:val="NormaleTabelle"/>
     <w:uiPriority w:val="99"/>
     <w:pPr>
       <w:spacing w:after="0" w:line="240" w:lineRule="auto"/>
@@ -21021,7 +21667,7 @@
   </w:style>
   <w:style w:type="table" w:customStyle="1" w:styleId="Bordered-Accent4">
     <w:name w:val="Bordered - Accent 4"/>
-    <w:basedOn w:val="TableNormal"/>
+    <w:basedOn w:val="NormaleTabelle"/>
     <w:uiPriority w:val="99"/>
     <w:pPr>
       <w:spacing w:after="0" w:line="240" w:lineRule="auto"/>
@@ -21103,7 +21749,7 @@
   </w:style>
   <w:style w:type="table" w:customStyle="1" w:styleId="Bordered-Accent5">
     <w:name w:val="Bordered - Accent 5"/>
-    <w:basedOn w:val="TableNormal"/>
+    <w:basedOn w:val="NormaleTabelle"/>
     <w:uiPriority w:val="99"/>
     <w:pPr>
       <w:spacing w:after="0" w:line="240" w:lineRule="auto"/>
@@ -21185,7 +21831,7 @@
   </w:style>
   <w:style w:type="table" w:customStyle="1" w:styleId="Bordered-Accent6">
     <w:name w:val="Bordered - Accent 6"/>
-    <w:basedOn w:val="TableNormal"/>
+    <w:basedOn w:val="NormaleTabelle"/>
     <w:uiPriority w:val="99"/>
     <w:pPr>
       <w:spacing w:after="0" w:line="240" w:lineRule="auto"/>
@@ -21272,10 +21918,10 @@
       <w:sz w:val="18"/>
     </w:rPr>
   </w:style>
-  <w:style w:type="paragraph" w:styleId="EndnoteText">
+  <w:style w:type="paragraph" w:styleId="Endnotentext">
     <w:name w:val="endnote text"/>
-    <w:basedOn w:val="Normal"/>
-    <w:link w:val="EndnoteTextChar"/>
+    <w:basedOn w:val="Standard"/>
+    <w:link w:val="EndnotentextZchn"/>
     <w:uiPriority w:val="99"/>
     <w:semiHidden/>
     <w:unhideWhenUsed/>
@@ -21286,17 +21932,17 @@
       <w:sz w:val="20"/>
     </w:rPr>
   </w:style>
-  <w:style w:type="character" w:customStyle="1" w:styleId="EndnoteTextChar">
-    <w:name w:val="Endnote Text Char"/>
-    <w:link w:val="EndnoteText"/>
+  <w:style w:type="character" w:customStyle="1" w:styleId="EndnotentextZchn">
+    <w:name w:val="Endnotentext Zchn"/>
+    <w:link w:val="Endnotentext"/>
     <w:uiPriority w:val="99"/>
     <w:rPr>
       <w:sz w:val="20"/>
     </w:rPr>
   </w:style>
-  <w:style w:type="character" w:styleId="EndnoteReference">
+  <w:style w:type="character" w:styleId="Endnotenzeichen">
     <w:name w:val="endnote reference"/>
-    <w:basedOn w:val="DefaultParagraphFont"/>
+    <w:basedOn w:val="Absatz-Standardschriftart"/>
     <w:uiPriority w:val="99"/>
     <w:semiHidden/>
     <w:unhideWhenUsed/>
@@ -21304,20 +21950,20 @@
       <w:vertAlign w:val="superscript"/>
     </w:rPr>
   </w:style>
-  <w:style w:type="paragraph" w:styleId="TOC1">
+  <w:style w:type="paragraph" w:styleId="Verzeichnis1">
     <w:name w:val="toc 1"/>
-    <w:basedOn w:val="Normal"/>
-    <w:next w:val="Normal"/>
+    <w:basedOn w:val="Standard"/>
+    <w:next w:val="Standard"/>
     <w:uiPriority w:val="39"/>
     <w:unhideWhenUsed/>
     <w:pPr>
       <w:spacing w:after="57"/>
     </w:pPr>
   </w:style>
-  <w:style w:type="paragraph" w:styleId="TOC2">
+  <w:style w:type="paragraph" w:styleId="Verzeichnis2">
     <w:name w:val="toc 2"/>
-    <w:basedOn w:val="Normal"/>
-    <w:next w:val="Normal"/>
+    <w:basedOn w:val="Standard"/>
+    <w:next w:val="Standard"/>
     <w:uiPriority w:val="39"/>
     <w:unhideWhenUsed/>
     <w:pPr>
@@ -21325,10 +21971,10 @@
       <w:ind w:left="283"/>
     </w:pPr>
   </w:style>
-  <w:style w:type="paragraph" w:styleId="TOC3">
+  <w:style w:type="paragraph" w:styleId="Verzeichnis3">
     <w:name w:val="toc 3"/>
-    <w:basedOn w:val="Normal"/>
-    <w:next w:val="Normal"/>
+    <w:basedOn w:val="Standard"/>
+    <w:next w:val="Standard"/>
     <w:uiPriority w:val="39"/>
     <w:unhideWhenUsed/>
     <w:pPr>
@@ -21336,10 +21982,10 @@
       <w:ind w:left="567"/>
     </w:pPr>
   </w:style>
-  <w:style w:type="paragraph" w:styleId="TOC4">
+  <w:style w:type="paragraph" w:styleId="Verzeichnis4">
     <w:name w:val="toc 4"/>
-    <w:basedOn w:val="Normal"/>
-    <w:next w:val="Normal"/>
+    <w:basedOn w:val="Standard"/>
+    <w:next w:val="Standard"/>
     <w:uiPriority w:val="39"/>
     <w:unhideWhenUsed/>
     <w:pPr>
@@ -21347,10 +21993,10 @@
       <w:ind w:left="850"/>
     </w:pPr>
   </w:style>
-  <w:style w:type="paragraph" w:styleId="TOC5">
+  <w:style w:type="paragraph" w:styleId="Verzeichnis5">
     <w:name w:val="toc 5"/>
-    <w:basedOn w:val="Normal"/>
-    <w:next w:val="Normal"/>
+    <w:basedOn w:val="Standard"/>
+    <w:next w:val="Standard"/>
     <w:uiPriority w:val="39"/>
     <w:unhideWhenUsed/>
     <w:pPr>
@@ -21358,10 +22004,10 @@
       <w:ind w:left="1134"/>
     </w:pPr>
   </w:style>
-  <w:style w:type="paragraph" w:styleId="TOC6">
+  <w:style w:type="paragraph" w:styleId="Verzeichnis6">
     <w:name w:val="toc 6"/>
-    <w:basedOn w:val="Normal"/>
-    <w:next w:val="Normal"/>
+    <w:basedOn w:val="Standard"/>
+    <w:next w:val="Standard"/>
     <w:uiPriority w:val="39"/>
     <w:unhideWhenUsed/>
     <w:pPr>
@@ -21369,10 +22015,10 @@
       <w:ind w:left="1417"/>
     </w:pPr>
   </w:style>
-  <w:style w:type="paragraph" w:styleId="TOC7">
+  <w:style w:type="paragraph" w:styleId="Verzeichnis7">
     <w:name w:val="toc 7"/>
-    <w:basedOn w:val="Normal"/>
-    <w:next w:val="Normal"/>
+    <w:basedOn w:val="Standard"/>
+    <w:next w:val="Standard"/>
     <w:uiPriority w:val="39"/>
     <w:unhideWhenUsed/>
     <w:pPr>
@@ -21380,10 +22026,10 @@
       <w:ind w:left="1701"/>
     </w:pPr>
   </w:style>
-  <w:style w:type="paragraph" w:styleId="TOC8">
+  <w:style w:type="paragraph" w:styleId="Verzeichnis8">
     <w:name w:val="toc 8"/>
-    <w:basedOn w:val="Normal"/>
-    <w:next w:val="Normal"/>
+    <w:basedOn w:val="Standard"/>
+    <w:next w:val="Standard"/>
     <w:uiPriority w:val="39"/>
     <w:unhideWhenUsed/>
     <w:pPr>
@@ -21391,10 +22037,10 @@
       <w:ind w:left="1984"/>
     </w:pPr>
   </w:style>
-  <w:style w:type="paragraph" w:styleId="TOC9">
+  <w:style w:type="paragraph" w:styleId="Verzeichnis9">
     <w:name w:val="toc 9"/>
-    <w:basedOn w:val="Normal"/>
-    <w:next w:val="Normal"/>
+    <w:basedOn w:val="Standard"/>
+    <w:next w:val="Standard"/>
     <w:uiPriority w:val="39"/>
     <w:unhideWhenUsed/>
     <w:pPr>
@@ -21402,15 +22048,15 @@
       <w:ind w:left="2268"/>
     </w:pPr>
   </w:style>
-  <w:style w:type="paragraph" w:styleId="TOCHeading">
+  <w:style w:type="paragraph" w:styleId="Inhaltsverzeichnisberschrift">
     <w:name w:val="TOC Heading"/>
     <w:uiPriority w:val="39"/>
     <w:unhideWhenUsed/>
   </w:style>
-  <w:style w:type="paragraph" w:styleId="TableofFigures">
+  <w:style w:type="paragraph" w:styleId="Abbildungsverzeichnis">
     <w:name w:val="table of figures"/>
-    <w:basedOn w:val="Normal"/>
-    <w:next w:val="Normal"/>
+    <w:basedOn w:val="Standard"/>
+    <w:next w:val="Standard"/>
     <w:uiPriority w:val="99"/>
     <w:unhideWhenUsed/>
     <w:pPr>
@@ -21419,7 +22065,7 @@
   </w:style>
   <w:style w:type="character" w:styleId="Hyperlink">
     <w:name w:val="Hyperlink"/>
-    <w:basedOn w:val="DefaultParagraphFont"/>
+    <w:basedOn w:val="Absatz-Standardschriftart"/>
     <w:uiPriority w:val="99"/>
     <w:unhideWhenUsed/>
     <w:rPr>
@@ -21427,9 +22073,9 @@
       <w:u w:val="single"/>
     </w:rPr>
   </w:style>
-  <w:style w:type="paragraph" w:styleId="ListParagraph">
+  <w:style w:type="paragraph" w:styleId="Listenabsatz">
     <w:name w:val="List Paragraph"/>
-    <w:basedOn w:val="Normal"/>
+    <w:basedOn w:val="Standard"/>
     <w:uiPriority w:val="34"/>
     <w:qFormat/>
     <w:pPr>
@@ -21437,9 +22083,9 @@
       <w:contextualSpacing/>
     </w:pPr>
   </w:style>
-  <w:style w:type="table" w:styleId="TableGrid">
+  <w:style w:type="table" w:styleId="Tabellenraster">
     <w:name w:val="Table Grid"/>
-    <w:basedOn w:val="TableNormal"/>
+    <w:basedOn w:val="NormaleTabelle"/>
     <w:uiPriority w:val="59"/>
     <w:pPr>
       <w:spacing w:after="0" w:line="240" w:lineRule="auto"/>
@@ -21455,9 +22101,9 @@
       </w:tblBorders>
     </w:tblPr>
   </w:style>
-  <w:style w:type="character" w:styleId="CommentReference">
+  <w:style w:type="character" w:styleId="Kommentarzeichen">
     <w:name w:val="annotation reference"/>
-    <w:basedOn w:val="DefaultParagraphFont"/>
+    <w:basedOn w:val="Absatz-Standardschriftart"/>
     <w:uiPriority w:val="99"/>
     <w:semiHidden/>
     <w:unhideWhenUsed/>
@@ -21466,10 +22112,10 @@
       <w:szCs w:val="16"/>
     </w:rPr>
   </w:style>
-  <w:style w:type="paragraph" w:styleId="CommentText">
+  <w:style w:type="paragraph" w:styleId="Kommentartext">
     <w:name w:val="annotation text"/>
-    <w:basedOn w:val="Normal"/>
-    <w:link w:val="CommentTextChar"/>
+    <w:basedOn w:val="Standard"/>
+    <w:link w:val="KommentartextZchn"/>
     <w:uiPriority w:val="99"/>
     <w:unhideWhenUsed/>
     <w:pPr>
@@ -21480,21 +22126,21 @@
       <w:szCs w:val="20"/>
     </w:rPr>
   </w:style>
-  <w:style w:type="character" w:customStyle="1" w:styleId="CommentTextChar">
-    <w:name w:val="Comment Text Char"/>
-    <w:basedOn w:val="DefaultParagraphFont"/>
-    <w:link w:val="CommentText"/>
+  <w:style w:type="character" w:customStyle="1" w:styleId="KommentartextZchn">
+    <w:name w:val="Kommentartext Zchn"/>
+    <w:basedOn w:val="Absatz-Standardschriftart"/>
+    <w:link w:val="Kommentartext"/>
     <w:uiPriority w:val="99"/>
     <w:rPr>
       <w:sz w:val="20"/>
       <w:szCs w:val="20"/>
     </w:rPr>
   </w:style>
-  <w:style w:type="paragraph" w:styleId="CommentSubject">
+  <w:style w:type="paragraph" w:styleId="Kommentarthema">
     <w:name w:val="annotation subject"/>
-    <w:basedOn w:val="CommentText"/>
-    <w:next w:val="CommentText"/>
-    <w:link w:val="CommentSubjectChar"/>
+    <w:basedOn w:val="Kommentartext"/>
+    <w:next w:val="Kommentartext"/>
+    <w:link w:val="KommentarthemaZchn"/>
     <w:uiPriority w:val="99"/>
     <w:semiHidden/>
     <w:unhideWhenUsed/>
@@ -21503,10 +22149,10 @@
       <w:bCs/>
     </w:rPr>
   </w:style>
-  <w:style w:type="character" w:customStyle="1" w:styleId="CommentSubjectChar">
-    <w:name w:val="Comment Subject Char"/>
-    <w:basedOn w:val="CommentTextChar"/>
-    <w:link w:val="CommentSubject"/>
+  <w:style w:type="character" w:customStyle="1" w:styleId="KommentarthemaZchn">
+    <w:name w:val="Kommentarthema Zchn"/>
+    <w:basedOn w:val="KommentartextZchn"/>
+    <w:link w:val="Kommentarthema"/>
     <w:uiPriority w:val="99"/>
     <w:semiHidden/>
     <w:rPr>
@@ -21516,10 +22162,10 @@
       <w:szCs w:val="20"/>
     </w:rPr>
   </w:style>
-  <w:style w:type="paragraph" w:styleId="BalloonText">
+  <w:style w:type="paragraph" w:styleId="Sprechblasentext">
     <w:name w:val="Balloon Text"/>
-    <w:basedOn w:val="Normal"/>
-    <w:link w:val="BalloonTextChar"/>
+    <w:basedOn w:val="Standard"/>
+    <w:link w:val="SprechblasentextZchn"/>
     <w:uiPriority w:val="99"/>
     <w:semiHidden/>
     <w:unhideWhenUsed/>
@@ -21532,10 +22178,10 @@
       <w:szCs w:val="16"/>
     </w:rPr>
   </w:style>
-  <w:style w:type="character" w:customStyle="1" w:styleId="BalloonTextChar">
-    <w:name w:val="Balloon Text Char"/>
-    <w:basedOn w:val="DefaultParagraphFont"/>
-    <w:link w:val="BalloonText"/>
+  <w:style w:type="character" w:customStyle="1" w:styleId="SprechblasentextZchn">
+    <w:name w:val="Sprechblasentext Zchn"/>
+    <w:basedOn w:val="Absatz-Standardschriftart"/>
+    <w:link w:val="Sprechblasentext"/>
     <w:uiPriority w:val="99"/>
     <w:semiHidden/>
     <w:rPr>
@@ -21544,7 +22190,7 @@
       <w:szCs w:val="16"/>
     </w:rPr>
   </w:style>
-  <w:style w:type="paragraph" w:styleId="NoSpacing">
+  <w:style w:type="paragraph" w:styleId="KeinLeerraum">
     <w:name w:val="No Spacing"/>
     <w:uiPriority w:val="1"/>
     <w:qFormat/>
@@ -21552,10 +22198,10 @@
       <w:spacing w:after="0" w:line="240" w:lineRule="auto"/>
     </w:pPr>
   </w:style>
-  <w:style w:type="paragraph" w:styleId="Header">
+  <w:style w:type="paragraph" w:styleId="Kopfzeile">
     <w:name w:val="header"/>
-    <w:basedOn w:val="Normal"/>
-    <w:link w:val="HeaderChar1"/>
+    <w:basedOn w:val="Standard"/>
+    <w:link w:val="KopfzeileZchn"/>
     <w:uiPriority w:val="99"/>
     <w:unhideWhenUsed/>
     <w:pPr>
@@ -21566,16 +22212,16 @@
       <w:spacing w:after="0" w:line="240" w:lineRule="auto"/>
     </w:pPr>
   </w:style>
-  <w:style w:type="character" w:customStyle="1" w:styleId="HeaderChar1">
-    <w:name w:val="Header Char1"/>
-    <w:basedOn w:val="DefaultParagraphFont"/>
-    <w:link w:val="Header"/>
+  <w:style w:type="character" w:customStyle="1" w:styleId="KopfzeileZchn">
+    <w:name w:val="Kopfzeile Zchn"/>
+    <w:basedOn w:val="Absatz-Standardschriftart"/>
+    <w:link w:val="Kopfzeile"/>
     <w:uiPriority w:val="99"/>
   </w:style>
-  <w:style w:type="paragraph" w:styleId="Footer">
+  <w:style w:type="paragraph" w:styleId="Fuzeile">
     <w:name w:val="footer"/>
-    <w:basedOn w:val="Normal"/>
-    <w:link w:val="FooterChar1"/>
+    <w:basedOn w:val="Standard"/>
+    <w:link w:val="FuzeileZchn"/>
     <w:uiPriority w:val="99"/>
     <w:unhideWhenUsed/>
     <w:pPr>
@@ -21586,13 +22232,13 @@
       <w:spacing w:after="0" w:line="240" w:lineRule="auto"/>
     </w:pPr>
   </w:style>
-  <w:style w:type="character" w:customStyle="1" w:styleId="FooterChar1">
-    <w:name w:val="Footer Char1"/>
-    <w:basedOn w:val="DefaultParagraphFont"/>
-    <w:link w:val="Footer"/>
+  <w:style w:type="character" w:customStyle="1" w:styleId="FuzeileZchn">
+    <w:name w:val="Fußzeile Zchn"/>
+    <w:basedOn w:val="Absatz-Standardschriftart"/>
+    <w:link w:val="Fuzeile"/>
     <w:uiPriority w:val="99"/>
   </w:style>
-  <w:style w:type="paragraph" w:styleId="Revision">
+  <w:style w:type="paragraph" w:styleId="berarbeitung">
     <w:name w:val="Revision"/>
     <w:hidden/>
     <w:uiPriority w:val="99"/>
@@ -21603,7 +22249,7 @@
   </w:style>
   <w:style w:type="paragraph" w:customStyle="1" w:styleId="ListItem-Bullet">
     <w:name w:val="List Item - Bullet"/>
-    <w:basedOn w:val="ListParagraph"/>
+    <w:basedOn w:val="Listenabsatz"/>
     <w:uiPriority w:val="2"/>
     <w:qFormat/>
     <w:pPr>
@@ -21637,7 +22283,7 @@
   </w:style>
   <w:style w:type="character" w:customStyle="1" w:styleId="UnresolvedMention1">
     <w:name w:val="Unresolved Mention1"/>
-    <w:basedOn w:val="DefaultParagraphFont"/>
+    <w:basedOn w:val="Absatz-Standardschriftart"/>
     <w:uiPriority w:val="99"/>
     <w:semiHidden/>
     <w:unhideWhenUsed/>
@@ -21646,9 +22292,9 @@
       <w:shd w:val="clear" w:color="auto" w:fill="E1DFDD"/>
     </w:rPr>
   </w:style>
-  <w:style w:type="character" w:styleId="FollowedHyperlink">
+  <w:style w:type="character" w:styleId="BesuchterLink">
     <w:name w:val="FollowedHyperlink"/>
-    <w:basedOn w:val="DefaultParagraphFont"/>
+    <w:basedOn w:val="Absatz-Standardschriftart"/>
     <w:uiPriority w:val="99"/>
     <w:semiHidden/>
     <w:unhideWhenUsed/>
@@ -21657,10 +22303,10 @@
       <w:u w:val="single"/>
     </w:rPr>
   </w:style>
-  <w:style w:type="paragraph" w:styleId="FootnoteText">
+  <w:style w:type="paragraph" w:styleId="Funotentext">
     <w:name w:val="footnote text"/>
-    <w:basedOn w:val="Normal"/>
-    <w:link w:val="FootnoteTextChar1"/>
+    <w:basedOn w:val="Standard"/>
+    <w:link w:val="FunotentextZchn"/>
     <w:uiPriority w:val="99"/>
     <w:semiHidden/>
     <w:unhideWhenUsed/>
@@ -21672,10 +22318,10 @@
       <w:szCs w:val="20"/>
     </w:rPr>
   </w:style>
-  <w:style w:type="character" w:customStyle="1" w:styleId="FootnoteTextChar1">
-    <w:name w:val="Footnote Text Char1"/>
-    <w:basedOn w:val="DefaultParagraphFont"/>
-    <w:link w:val="FootnoteText"/>
+  <w:style w:type="character" w:customStyle="1" w:styleId="FunotentextZchn">
+    <w:name w:val="Fußnotentext Zchn"/>
+    <w:basedOn w:val="Absatz-Standardschriftart"/>
+    <w:link w:val="Funotentext"/>
     <w:uiPriority w:val="99"/>
     <w:semiHidden/>
     <w:rPr>
@@ -21683,9 +22329,9 @@
       <w:szCs w:val="20"/>
     </w:rPr>
   </w:style>
-  <w:style w:type="character" w:styleId="FootnoteReference">
+  <w:style w:type="character" w:styleId="Funotenzeichen">
     <w:name w:val="footnote reference"/>
-    <w:basedOn w:val="DefaultParagraphFont"/>
+    <w:basedOn w:val="Absatz-Standardschriftart"/>
     <w:uiPriority w:val="99"/>
     <w:semiHidden/>
     <w:unhideWhenUsed/>
@@ -21695,7 +22341,7 @@
   </w:style>
   <w:style w:type="table" w:customStyle="1" w:styleId="GridTableLight0">
     <w:name w:val="Grid Table Light0"/>
-    <w:basedOn w:val="TableNormal"/>
+    <w:basedOn w:val="NormaleTabelle"/>
     <w:uiPriority w:val="40"/>
     <w:pPr>
       <w:pBdr>
@@ -21723,10 +22369,10 @@
       </w:tblBorders>
     </w:tblPr>
   </w:style>
-  <w:style w:type="character" w:customStyle="1" w:styleId="Heading3Char1">
-    <w:name w:val="Heading 3 Char1"/>
-    <w:basedOn w:val="DefaultParagraphFont"/>
-    <w:link w:val="Heading3"/>
+  <w:style w:type="character" w:customStyle="1" w:styleId="berschrift3Zchn">
+    <w:name w:val="Überschrift 3 Zchn"/>
+    <w:basedOn w:val="Absatz-Standardschriftart"/>
+    <w:link w:val="berschrift3"/>
     <w:uiPriority w:val="9"/>
     <w:rPr>
       <w:rFonts w:ascii="Arial" w:eastAsia="Times New Roman" w:hAnsi="Arial" w:cs="Arial"/>
@@ -21736,10 +22382,10 @@
       <w:lang w:val="en-GB"/>
     </w:rPr>
   </w:style>
-  <w:style w:type="character" w:customStyle="1" w:styleId="Heading4Char1">
-    <w:name w:val="Heading 4 Char1"/>
-    <w:basedOn w:val="DefaultParagraphFont"/>
-    <w:link w:val="Heading4"/>
+  <w:style w:type="character" w:customStyle="1" w:styleId="berschrift4Zchn">
+    <w:name w:val="Überschrift 4 Zchn"/>
+    <w:basedOn w:val="Absatz-Standardschriftart"/>
+    <w:link w:val="berschrift4"/>
     <w:uiPriority w:val="9"/>
     <w:rPr>
       <w:rFonts w:ascii="Arial" w:eastAsia="Times New Roman" w:hAnsi="Arial" w:cs="Arial"/>
@@ -21753,11 +22399,11 @@
       <w:lang w:val="en-GB"/>
     </w:rPr>
   </w:style>
-  <w:style w:type="paragraph" w:styleId="Title">
+  <w:style w:type="paragraph" w:styleId="Titel">
     <w:name w:val="Title"/>
-    <w:basedOn w:val="Normal"/>
-    <w:next w:val="Normal"/>
-    <w:link w:val="TitleChar1"/>
+    <w:basedOn w:val="Standard"/>
+    <w:next w:val="Standard"/>
+    <w:link w:val="TitelZchn"/>
     <w:uiPriority w:val="10"/>
     <w:qFormat/>
     <w:pPr>
@@ -21772,10 +22418,10 @@
       <w:szCs w:val="32"/>
     </w:rPr>
   </w:style>
-  <w:style w:type="character" w:customStyle="1" w:styleId="TitleChar1">
-    <w:name w:val="Title Char1"/>
-    <w:basedOn w:val="DefaultParagraphFont"/>
-    <w:link w:val="Title"/>
+  <w:style w:type="character" w:customStyle="1" w:styleId="TitelZchn">
+    <w:name w:val="Titel Zchn"/>
+    <w:basedOn w:val="Absatz-Standardschriftart"/>
+    <w:link w:val="Titel"/>
     <w:uiPriority w:val="10"/>
     <w:rPr>
       <w:rFonts w:ascii="Arial" w:eastAsia="Times New Roman" w:hAnsi="Arial" w:cs="Arial"/>
@@ -21785,10 +22431,10 @@
       <w:szCs w:val="32"/>
     </w:rPr>
   </w:style>
-  <w:style w:type="paragraph" w:styleId="HTMLPreformatted">
+  <w:style w:type="paragraph" w:styleId="HTMLVorformatiert">
     <w:name w:val="HTML Preformatted"/>
-    <w:basedOn w:val="Normal"/>
-    <w:link w:val="HTMLPreformattedChar"/>
+    <w:basedOn w:val="Standard"/>
+    <w:link w:val="HTMLVorformatiertZchn"/>
     <w:uiPriority w:val="99"/>
     <w:semiHidden/>
     <w:unhideWhenUsed/>
@@ -21802,10 +22448,10 @@
       <w:szCs w:val="20"/>
     </w:rPr>
   </w:style>
-  <w:style w:type="character" w:customStyle="1" w:styleId="HTMLPreformattedChar">
-    <w:name w:val="HTML Preformatted Char"/>
-    <w:basedOn w:val="DefaultParagraphFont"/>
-    <w:link w:val="HTMLPreformatted"/>
+  <w:style w:type="character" w:customStyle="1" w:styleId="HTMLVorformatiertZchn">
+    <w:name w:val="HTML Vorformatiert Zchn"/>
+    <w:basedOn w:val="Absatz-Standardschriftart"/>
+    <w:link w:val="HTMLVorformatiert"/>
     <w:uiPriority w:val="99"/>
     <w:semiHidden/>
     <w:rsid w:val="00DC03C7"/>
@@ -21815,9 +22461,9 @@
       <w:szCs w:val="20"/>
     </w:rPr>
   </w:style>
-  <w:style w:type="character" w:styleId="UnresolvedMention">
+  <w:style w:type="character" w:styleId="NichtaufgelsteErwhnung">
     <w:name w:val="Unresolved Mention"/>
-    <w:basedOn w:val="DefaultParagraphFont"/>
+    <w:basedOn w:val="Absatz-Standardschriftart"/>
     <w:uiPriority w:val="99"/>
     <w:semiHidden/>
     <w:unhideWhenUsed/>
@@ -22225,12 +22871,35 @@
 </file>
 
 <file path=customXml/item2.xml><?xml version="1.0" encoding="utf-8"?>
-<w:settings xmlns:w="http://schemas.openxmlformats.org/wordprocessingml/2006/main">
-  <w:SpecialFormsHighlight w:val="c9c8ff"/>
-</w:settings>
+<p:properties xmlns:p="http://schemas.microsoft.com/office/2006/metadata/properties" xmlns:xsi="http://www.w3.org/2001/XMLSchema-instance" xmlns:pc="http://schemas.microsoft.com/office/infopath/2007/PartnerControls">
+  <documentManagement>
+    <_DCDateModified xmlns="http://schemas.microsoft.com/sharepoint/v3/fields" xsi:nil="true"/>
+    <IconOverlay xmlns="http://schemas.microsoft.com/sharepoint/v4" xsi:nil="true"/>
+    <PublishingExpirationDate xmlns="http://schemas.microsoft.com/sharepoint/v3" xsi:nil="true"/>
+    <PublishingStartDate xmlns="http://schemas.microsoft.com/sharepoint/v3" xsi:nil="true"/>
+    <_dlc_DocId xmlns="afee9e21-8e0c-452e-93ec-a70efb6b23ab">DAMK26V7PEQZ-1320525258-73877</_dlc_DocId>
+    <_dlc_DocIdUrl xmlns="afee9e21-8e0c-452e-93ec-a70efb6b23ab">
+      <Url>https://portal.fwf.ac.at/workspaces/Strateg-Dok/_layouts/15/DocIdRedir.aspx?ID=DAMK26V7PEQZ-1320525258-73877</Url>
+      <Description>DAMK26V7PEQZ-1320525258-73877</Description>
+    </_dlc_DocIdUrl>
+  </documentManagement>
+</p:properties>
 </file>
 
 <file path=customXml/item3.xml><?xml version="1.0" encoding="utf-8"?>
+<?mso-contentType ?>
+<FormTemplates xmlns="http://schemas.microsoft.com/sharepoint/v3/contenttype/forms">
+  <Display>DocumentLibraryForm</Display>
+  <Edit>DocumentLibraryForm</Edit>
+  <New>DocumentLibraryForm</New>
+</FormTemplates>
+</file>
+
+<file path=customXml/item4.xml><?xml version="1.0" encoding="utf-8"?>
+<b:Sources xmlns:b="http://schemas.openxmlformats.org/officeDocument/2006/bibliography" xmlns="http://schemas.openxmlformats.org/officeDocument/2006/bibliography" SelectedStyle="\APASixthEditionOfficeOnline.xsl" StyleName="APA" Version="6"/>
+</file>
+
+<file path=customXml/item5.xml><?xml version="1.0" encoding="utf-8"?>
 <?mso-contentType ?>
 <spe:Receivers xmlns:spe="http://schemas.microsoft.com/sharepoint/events">
   <Receiver>
@@ -22280,33 +22949,10 @@
 </spe:Receivers>
 </file>
 
-<file path=customXml/item4.xml><?xml version="1.0" encoding="utf-8"?>
-<b:Sources xmlns:b="http://schemas.openxmlformats.org/officeDocument/2006/bibliography" xmlns="http://schemas.openxmlformats.org/officeDocument/2006/bibliography" SelectedStyle="\APASixthEditionOfficeOnline.xsl" StyleName="APA" Version="6"/>
-</file>
-
-<file path=customXml/item5.xml><?xml version="1.0" encoding="utf-8"?>
-<?mso-contentType ?>
-<FormTemplates xmlns="http://schemas.microsoft.com/sharepoint/v3/contenttype/forms">
-  <Display>DocumentLibraryForm</Display>
-  <Edit>DocumentLibraryForm</Edit>
-  <New>DocumentLibraryForm</New>
-</FormTemplates>
-</file>
-
 <file path=customXml/item6.xml><?xml version="1.0" encoding="utf-8"?>
-<p:properties xmlns:p="http://schemas.microsoft.com/office/2006/metadata/properties" xmlns:xsi="http://www.w3.org/2001/XMLSchema-instance" xmlns:pc="http://schemas.microsoft.com/office/infopath/2007/PartnerControls">
-  <documentManagement>
-    <_DCDateModified xmlns="http://schemas.microsoft.com/sharepoint/v3/fields" xsi:nil="true"/>
-    <IconOverlay xmlns="http://schemas.microsoft.com/sharepoint/v4" xsi:nil="true"/>
-    <PublishingExpirationDate xmlns="http://schemas.microsoft.com/sharepoint/v3" xsi:nil="true"/>
-    <PublishingStartDate xmlns="http://schemas.microsoft.com/sharepoint/v3" xsi:nil="true"/>
-    <_dlc_DocId xmlns="afee9e21-8e0c-452e-93ec-a70efb6b23ab">DAMK26V7PEQZ-1320525258-73877</_dlc_DocId>
-    <_dlc_DocIdUrl xmlns="afee9e21-8e0c-452e-93ec-a70efb6b23ab">
-      <Url>https://portal.fwf.ac.at/workspaces/Strateg-Dok/_layouts/15/DocIdRedir.aspx?ID=DAMK26V7PEQZ-1320525258-73877</Url>
-      <Description>DAMK26V7PEQZ-1320525258-73877</Description>
-    </_dlc_DocIdUrl>
-  </documentManagement>
-</p:properties>
+<w:settings xmlns:w="http://schemas.openxmlformats.org/wordprocessingml/2006/main">
+  <w:SpecialFormsHighlight w:val="c9c8ff"/>
+</w:settings>
 </file>
 
 <file path=customXml/itemProps1.xml><?xml version="1.0" encoding="utf-8"?>
@@ -22331,17 +22977,22 @@
 </file>
 
 <file path=customXml/itemProps2.xml><?xml version="1.0" encoding="utf-8"?>
-<ds:datastoreItem xmlns:ds="http://schemas.openxmlformats.org/officeDocument/2006/customXml" ds:itemID="{5D0AEA6B-E499-4EEF-98A3-AFBB261C493E}">
+<ds:datastoreItem xmlns:ds="http://schemas.openxmlformats.org/officeDocument/2006/customXml" ds:itemID="{80DCD561-5D0E-41FB-A5B2-A60CACB93746}">
   <ds:schemaRefs>
-    <ds:schemaRef ds:uri="http://schemas.openxmlformats.org/wordprocessingml/2006/main"/>
+    <ds:schemaRef ds:uri="http://schemas.microsoft.com/office/2006/metadata/properties"/>
+    <ds:schemaRef ds:uri="http://schemas.microsoft.com/office/infopath/2007/PartnerControls"/>
+    <ds:schemaRef ds:uri="http://schemas.microsoft.com/sharepoint/v3/fields"/>
+    <ds:schemaRef ds:uri="http://schemas.microsoft.com/sharepoint/v4"/>
+    <ds:schemaRef ds:uri="http://schemas.microsoft.com/sharepoint/v3"/>
+    <ds:schemaRef ds:uri="afee9e21-8e0c-452e-93ec-a70efb6b23ab"/>
   </ds:schemaRefs>
 </ds:datastoreItem>
 </file>
 
 <file path=customXml/itemProps3.xml><?xml version="1.0" encoding="utf-8"?>
-<ds:datastoreItem xmlns:ds="http://schemas.openxmlformats.org/officeDocument/2006/customXml" ds:itemID="{924007F5-9277-4670-9FE6-06782C7296A1}">
+<ds:datastoreItem xmlns:ds="http://schemas.openxmlformats.org/officeDocument/2006/customXml" ds:itemID="{76E5CD1D-9176-4FA7-9A9A-698AC52D8E9F}">
   <ds:schemaRefs>
-    <ds:schemaRef ds:uri="http://schemas.microsoft.com/sharepoint/events"/>
+    <ds:schemaRef ds:uri="http://schemas.microsoft.com/sharepoint/v3/contenttype/forms"/>
   </ds:schemaRefs>
 </ds:datastoreItem>
 </file>
@@ -22355,22 +23006,17 @@
 </file>
 
 <file path=customXml/itemProps5.xml><?xml version="1.0" encoding="utf-8"?>
-<ds:datastoreItem xmlns:ds="http://schemas.openxmlformats.org/officeDocument/2006/customXml" ds:itemID="{76E5CD1D-9176-4FA7-9A9A-698AC52D8E9F}">
+<ds:datastoreItem xmlns:ds="http://schemas.openxmlformats.org/officeDocument/2006/customXml" ds:itemID="{924007F5-9277-4670-9FE6-06782C7296A1}">
   <ds:schemaRefs>
-    <ds:schemaRef ds:uri="http://schemas.microsoft.com/sharepoint/v3/contenttype/forms"/>
+    <ds:schemaRef ds:uri="http://schemas.microsoft.com/sharepoint/events"/>
   </ds:schemaRefs>
 </ds:datastoreItem>
 </file>
 
 <file path=customXml/itemProps6.xml><?xml version="1.0" encoding="utf-8"?>
-<ds:datastoreItem xmlns:ds="http://schemas.openxmlformats.org/officeDocument/2006/customXml" ds:itemID="{80DCD561-5D0E-41FB-A5B2-A60CACB93746}">
+<ds:datastoreItem xmlns:ds="http://schemas.openxmlformats.org/officeDocument/2006/customXml" ds:itemID="{5D0AEA6B-E499-4EEF-98A3-AFBB261C493E}">
   <ds:schemaRefs>
-    <ds:schemaRef ds:uri="http://schemas.microsoft.com/office/2006/metadata/properties"/>
-    <ds:schemaRef ds:uri="http://schemas.microsoft.com/office/infopath/2007/PartnerControls"/>
-    <ds:schemaRef ds:uri="http://schemas.microsoft.com/sharepoint/v3/fields"/>
-    <ds:schemaRef ds:uri="http://schemas.microsoft.com/sharepoint/v4"/>
-    <ds:schemaRef ds:uri="http://schemas.microsoft.com/sharepoint/v3"/>
-    <ds:schemaRef ds:uri="afee9e21-8e0c-452e-93ec-a70efb6b23ab"/>
+    <ds:schemaRef ds:uri="http://schemas.openxmlformats.org/wordprocessingml/2006/main"/>
   </ds:schemaRefs>
 </ds:datastoreItem>
 </file>
</xml_diff>

<commit_message>
Templates: Prevent tables from splitting across pages
</commit_message>
<xml_diff>
--- a/src/main/resources/org/damap/base/template/FWFTemplate.docx
+++ b/src/main/resources/org/damap/base/template/FWFTemplate.docx
@@ -4,7 +4,7 @@
   <w:body>
     <w:p>
       <w:pPr>
-        <w:pStyle w:val="berschrift2"/>
+        <w:pStyle w:val="Heading2"/>
         <w:rPr>
           <w:lang w:val="en-US"/>
         </w:rPr>
@@ -12,7 +12,7 @@
     </w:p>
     <w:p>
       <w:pPr>
-        <w:pStyle w:val="berschrift1"/>
+        <w:pStyle w:val="Heading1"/>
         <w:rPr>
           <w:lang w:val="en-US"/>
         </w:rPr>
@@ -20,7 +20,7 @@
     </w:p>
     <w:p>
       <w:pPr>
-        <w:pStyle w:val="berschrift1"/>
+        <w:pStyle w:val="Heading1"/>
         <w:rPr>
           <w:lang w:val="en-US"/>
         </w:rPr>
@@ -403,7 +403,7 @@
     </w:p>
     <w:p>
       <w:pPr>
-        <w:pStyle w:val="Titel"/>
+        <w:pStyle w:val="Title"/>
         <w:spacing w:after="840"/>
         <w:jc w:val="center"/>
         <w:rPr>
@@ -415,7 +415,7 @@
     </w:p>
     <w:p>
       <w:pPr>
-        <w:pStyle w:val="Titel"/>
+        <w:pStyle w:val="Title"/>
         <w:spacing w:after="840"/>
         <w:jc w:val="center"/>
         <w:rPr>
@@ -1041,7 +1041,7 @@
                     </wp:anchor>
                   </w:drawing>
                 </mc:Choice>
-                <mc:Fallback xmlns:pic="http://schemas.openxmlformats.org/drawingml/2006/picture" xmlns:wp14="http://schemas.microsoft.com/office/word/2010/wordml" xmlns:a="http://schemas.openxmlformats.org/drawingml/2006/main">
+                <mc:Fallback xmlns:a="http://schemas.openxmlformats.org/drawingml/2006/main" xmlns:wp14="http://schemas.microsoft.com/office/word/2010/wordml" xmlns:pic="http://schemas.openxmlformats.org/drawingml/2006/picture">
                   <w:pict w14:anchorId="7AAC8864">
                     <v:shapetype coordsize="21600,21600" o:spt="75" o:preferrelative="t" path="m@4@5l@4@11@9@11@9@5xe" type="#_x0000_t75">
                       <v:formulas>
@@ -1092,17 +1092,30 @@
               </w:rPr>
               <w:t xml:space="preserve">This DMP is licensed under a </w:t>
             </w:r>
-            <w:hyperlink r:id="rId18" w:tooltip="https://creativecommons.org/licenses/by/4.0/legalcode" w:history="1">
-              <w:r>
-                <w:rPr>
-                  <w:sz w:val="20"/>
-                  <w:szCs w:val="20"/>
-                  <w:u w:val="single"/>
-                  <w:lang w:val="en-GB"/>
-                </w:rPr>
-                <w:t>Creative Commons Attribution 4.0 International License</w:t>
-              </w:r>
-            </w:hyperlink>
+            <w:r>
+              <w:fldChar w:fldCharType="begin"/>
+            </w:r>
+            <w:r>
+              <w:rPr>
+                <w:lang w:val="en-US"/>
+              </w:rPr>
+              <w:instrText>HYPERLINK "https://creativecommons.org/licenses/by/4.0/legalcode" \o "https://creativecommons.org/licenses/by/4.0/legalcode"</w:instrText>
+            </w:r>
+            <w:r>
+              <w:fldChar w:fldCharType="separate"/>
+            </w:r>
+            <w:r>
+              <w:rPr>
+                <w:sz w:val="20"/>
+                <w:szCs w:val="20"/>
+                <w:u w:val="single"/>
+                <w:lang w:val="en-GB"/>
+              </w:rPr>
+              <w:t>Creative Commons Attribution 4.0 International License</w:t>
+            </w:r>
+            <w:r>
+              <w:fldChar w:fldCharType="end"/>
+            </w:r>
             <w:r>
               <w:rPr>
                 <w:sz w:val="20"/>
@@ -1183,7 +1196,7 @@
           <w:lang w:val="en-GB"/>
         </w:rPr>
         <w:sectPr>
-          <w:footerReference w:type="default" r:id="rId19"/>
+          <w:footerReference w:type="default" r:id="rId18"/>
           <w:pgSz w:w="16838" w:h="11906" w:orient="landscape"/>
           <w:pgMar w:top="851" w:right="820" w:bottom="1417" w:left="1134" w:header="708" w:footer="708" w:gutter="0"/>
           <w:cols w:space="708"/>
@@ -1235,18 +1248,31 @@
         </w:rPr>
         <w:t>This DMP follows the official FWF template. When revising this DMP, please check the guidance from FWF for more details: </w:t>
       </w:r>
-      <w:hyperlink r:id="rId20" w:history="1">
-        <w:r>
-          <w:rPr>
-            <w:rStyle w:val="Hyperlink"/>
-            <w:rFonts w:ascii="Arial" w:hAnsi="Arial" w:cs="Arial"/>
-            <w:bCs/>
-            <w:color w:val="92D050"/>
-            <w:lang w:val="en-US"/>
-          </w:rPr>
-          <w:t>FWF DMP - Guidance and Template</w:t>
-        </w:r>
-      </w:hyperlink>
+      <w:r>
+        <w:fldChar w:fldCharType="begin"/>
+      </w:r>
+      <w:r>
+        <w:rPr>
+          <w:lang w:val="en-US"/>
+        </w:rPr>
+        <w:instrText>HYPERLINK "https://www.fwf.ac.at/fileadmin/Website/Dokumente/Ueber_uns/Aufgaben_und_Aktivitaeten/Open_Science/fwf_dmp_guidelines_template.docx"</w:instrText>
+      </w:r>
+      <w:r>
+        <w:fldChar w:fldCharType="separate"/>
+      </w:r>
+      <w:r>
+        <w:rPr>
+          <w:rStyle w:val="Hyperlink"/>
+          <w:rFonts w:ascii="Arial" w:hAnsi="Arial" w:cs="Arial"/>
+          <w:bCs/>
+          <w:color w:val="92D050"/>
+          <w:lang w:val="en-US"/>
+        </w:rPr>
+        <w:t>FWF DMP - Guidance and Template</w:t>
+      </w:r>
+      <w:r>
+        <w:fldChar w:fldCharType="end"/>
+      </w:r>
     </w:p>
     <w:p>
       <w:pPr>
@@ -1295,7 +1321,7 @@
           </w:tcPr>
           <w:p>
             <w:pPr>
-              <w:pStyle w:val="KeinLeerraum"/>
+              <w:pStyle w:val="NoSpacing"/>
               <w:spacing w:before="120" w:after="120"/>
               <w:ind w:left="-27"/>
               <w:rPr>
@@ -1339,7 +1365,7 @@
           </w:tcPr>
           <w:p>
             <w:pPr>
-              <w:pStyle w:val="KeinLeerraum"/>
+              <w:pStyle w:val="NoSpacing"/>
               <w:spacing w:before="120" w:after="120"/>
               <w:rPr>
                 <w:rFonts w:ascii="Arial" w:hAnsi="Arial" w:cs="Arial"/>
@@ -1375,7 +1401,7 @@
           </w:tcPr>
           <w:p>
             <w:pPr>
-              <w:pStyle w:val="KeinLeerraum"/>
+              <w:pStyle w:val="NoSpacing"/>
               <w:spacing w:before="120" w:after="120" w:line="276" w:lineRule="auto"/>
               <w:rPr>
                 <w:rFonts w:ascii="Arial" w:hAnsi="Arial" w:cs="Arial"/>
@@ -1442,7 +1468,7 @@
           </w:p>
           <w:p>
             <w:pPr>
-              <w:pStyle w:val="KeinLeerraum"/>
+              <w:pStyle w:val="NoSpacing"/>
               <w:spacing w:before="120" w:after="120" w:line="276" w:lineRule="auto"/>
               <w:rPr>
                 <w:rFonts w:ascii="Arial" w:hAnsi="Arial" w:cs="Arial"/>
@@ -1529,7 +1555,7 @@
           </w:p>
           <w:p>
             <w:pPr>
-              <w:pStyle w:val="KeinLeerraum"/>
+              <w:pStyle w:val="NoSpacing"/>
               <w:spacing w:before="120" w:after="120" w:line="276" w:lineRule="auto"/>
               <w:rPr>
                 <w:rFonts w:ascii="Arial" w:hAnsi="Arial" w:cs="Arial"/>
@@ -1592,7 +1618,7 @@
           </w:p>
           <w:p>
             <w:pPr>
-              <w:pStyle w:val="KeinLeerraum"/>
+              <w:pStyle w:val="NoSpacing"/>
               <w:spacing w:before="120" w:after="120" w:line="276" w:lineRule="auto"/>
               <w:rPr>
                 <w:rFonts w:ascii="Arial" w:hAnsi="Arial" w:cs="Arial"/>
@@ -1691,7 +1717,7 @@
           </w:p>
           <w:p>
             <w:pPr>
-              <w:pStyle w:val="KeinLeerraum"/>
+              <w:pStyle w:val="NoSpacing"/>
               <w:spacing w:before="120" w:after="120" w:line="276" w:lineRule="auto"/>
               <w:rPr>
                 <w:rFonts w:ascii="Arial" w:hAnsi="Arial" w:cs="Arial"/>
@@ -1744,7 +1770,7 @@
           </w:p>
           <w:p>
             <w:pPr>
-              <w:pStyle w:val="KeinLeerraum"/>
+              <w:pStyle w:val="NoSpacing"/>
               <w:spacing w:before="120" w:after="120"/>
               <w:rPr>
                 <w:rFonts w:ascii="Arial" w:hAnsi="Arial" w:cs="Arial"/>
@@ -1807,7 +1833,7 @@
           </w:tcPr>
           <w:p>
             <w:pPr>
-              <w:pStyle w:val="KeinLeerraum"/>
+              <w:pStyle w:val="NoSpacing"/>
               <w:spacing w:before="120" w:after="120"/>
               <w:rPr>
                 <w:rFonts w:ascii="Arial" w:hAnsi="Arial" w:cs="Arial"/>
@@ -1843,7 +1869,7 @@
           </w:tcPr>
           <w:p>
             <w:pPr>
-              <w:pStyle w:val="KeinLeerraum"/>
+              <w:pStyle w:val="NoSpacing"/>
               <w:spacing w:before="120" w:after="120" w:line="276" w:lineRule="auto"/>
               <w:rPr>
                 <w:rFonts w:ascii="Arial" w:hAnsi="Arial" w:cs="Arial"/>
@@ -1909,7 +1935,7 @@
           </w:p>
           <w:p>
             <w:pPr>
-              <w:pStyle w:val="KeinLeerraum"/>
+              <w:pStyle w:val="NoSpacing"/>
               <w:spacing w:before="120" w:after="120" w:line="276" w:lineRule="auto"/>
               <w:rPr>
                 <w:rFonts w:ascii="Arial" w:hAnsi="Arial" w:cs="Arial"/>
@@ -2775,7 +2801,7 @@
           </w:tcPr>
           <w:p>
             <w:pPr>
-              <w:pStyle w:val="KeinLeerraum"/>
+              <w:pStyle w:val="NoSpacing"/>
               <w:spacing w:before="120" w:after="120"/>
               <w:rPr>
                 <w:rFonts w:ascii="Arial" w:hAnsi="Arial" w:cs="Arial"/>
@@ -2812,7 +2838,7 @@
           </w:tcPr>
           <w:p>
             <w:pPr>
-              <w:pStyle w:val="KeinLeerraum"/>
+              <w:pStyle w:val="NoSpacing"/>
               <w:spacing w:before="120" w:after="120"/>
               <w:rPr>
                 <w:rFonts w:ascii="Arial" w:hAnsi="Arial" w:cs="Arial"/>
@@ -4207,7 +4233,7 @@
           </w:tcPr>
           <w:p>
             <w:pPr>
-              <w:pStyle w:val="KeinLeerraum"/>
+              <w:pStyle w:val="NoSpacing"/>
               <w:spacing w:before="120" w:after="120"/>
               <w:rPr>
                 <w:rFonts w:ascii="Arial" w:hAnsi="Arial" w:cs="Arial"/>
@@ -4245,7 +4271,7 @@
           </w:tcPr>
           <w:p>
             <w:pPr>
-              <w:pStyle w:val="KeinLeerraum"/>
+              <w:pStyle w:val="NoSpacing"/>
               <w:spacing w:before="120" w:after="120"/>
               <w:rPr>
                 <w:rFonts w:ascii="Arial" w:hAnsi="Arial" w:cs="Arial"/>
@@ -4462,7 +4488,7 @@
           </w:tcPr>
           <w:p>
             <w:pPr>
-              <w:pStyle w:val="KeinLeerraum"/>
+              <w:pStyle w:val="NoSpacing"/>
               <w:spacing w:before="120" w:after="120"/>
               <w:rPr>
                 <w:rFonts w:ascii="Arial" w:hAnsi="Arial" w:cs="Arial"/>
@@ -4587,7 +4613,7 @@
           </w:tcPr>
           <w:p>
             <w:pPr>
-              <w:pStyle w:val="KeinLeerraum"/>
+              <w:pStyle w:val="NoSpacing"/>
               <w:spacing w:before="120" w:after="120"/>
               <w:rPr>
                 <w:rFonts w:ascii="Arial" w:hAnsi="Arial" w:cs="Arial"/>
@@ -4631,7 +4657,7 @@
           </w:tcPr>
           <w:p>
             <w:pPr>
-              <w:pStyle w:val="KeinLeerraum"/>
+              <w:pStyle w:val="NoSpacing"/>
               <w:spacing w:before="120" w:after="120"/>
               <w:rPr>
                 <w:rFonts w:ascii="Arial" w:hAnsi="Arial" w:cs="Arial"/>
@@ -4667,7 +4693,7 @@
           </w:tcPr>
           <w:p>
             <w:pPr>
-              <w:pStyle w:val="berschrift3"/>
+              <w:pStyle w:val="Heading3"/>
               <w:spacing w:before="120" w:line="276" w:lineRule="auto"/>
               <w:rPr>
                 <w:color w:val="auto"/>
@@ -5261,7 +5287,7 @@
           </w:tcPr>
           <w:p>
             <w:pPr>
-              <w:pStyle w:val="KeinLeerraum"/>
+              <w:pStyle w:val="NoSpacing"/>
               <w:spacing w:before="120" w:after="120"/>
               <w:rPr>
                 <w:rFonts w:ascii="Arial" w:hAnsi="Arial" w:cs="Arial"/>
@@ -5298,7 +5324,7 @@
           </w:tcPr>
           <w:p>
             <w:pPr>
-              <w:pStyle w:val="berschrift3"/>
+              <w:pStyle w:val="Heading3"/>
               <w:spacing w:before="120" w:line="276" w:lineRule="auto"/>
               <w:rPr>
                 <w:b/>
@@ -6005,7 +6031,7 @@
           </w:p>
           <w:p>
             <w:pPr>
-              <w:pStyle w:val="berschrift3"/>
+              <w:pStyle w:val="Heading3"/>
               <w:spacing w:before="120" w:line="276" w:lineRule="auto"/>
               <w:rPr>
                 <w:b/>
@@ -6916,7 +6942,7 @@
           </w:tcPr>
           <w:p>
             <w:pPr>
-              <w:pStyle w:val="KeinLeerraum"/>
+              <w:pStyle w:val="NoSpacing"/>
               <w:spacing w:before="120" w:after="120"/>
               <w:rPr>
                 <w:rFonts w:ascii="Arial" w:hAnsi="Arial" w:cs="Arial"/>
@@ -6954,7 +6980,7 @@
           </w:tcPr>
           <w:p>
             <w:pPr>
-              <w:pStyle w:val="KeinLeerraum"/>
+              <w:pStyle w:val="NoSpacing"/>
               <w:spacing w:before="120" w:after="120"/>
               <w:rPr>
                 <w:rFonts w:ascii="Arial" w:hAnsi="Arial" w:cs="Arial"/>
@@ -6984,7 +7010,7 @@
           </w:tcPr>
           <w:p>
             <w:pPr>
-              <w:pStyle w:val="berschrift3"/>
+              <w:pStyle w:val="Heading3"/>
               <w:spacing w:before="120" w:line="276" w:lineRule="auto"/>
               <w:rPr>
                 <w:b/>
@@ -7061,7 +7087,7 @@
           </w:p>
           <w:p>
             <w:pPr>
-              <w:pStyle w:val="berschrift3"/>
+              <w:pStyle w:val="Heading3"/>
               <w:spacing w:before="120" w:line="276" w:lineRule="auto"/>
               <w:rPr>
                 <w:b/>
@@ -7153,7 +7179,7 @@
           </w:tcPr>
           <w:p>
             <w:pPr>
-              <w:pStyle w:val="KeinLeerraum"/>
+              <w:pStyle w:val="NoSpacing"/>
               <w:spacing w:before="120" w:after="120"/>
               <w:rPr>
                 <w:rFonts w:ascii="Arial" w:hAnsi="Arial" w:cs="Arial"/>
@@ -7265,7 +7291,7 @@
       </w:pPr>
     </w:p>
     <w:sectPr>
-      <w:footerReference w:type="default" r:id="rId21"/>
+      <w:footerReference w:type="default" r:id="rId19"/>
       <w:pgSz w:w="16838" w:h="11906" w:orient="landscape"/>
       <w:pgMar w:top="1134" w:right="1417" w:bottom="1417" w:left="1134" w:header="708" w:footer="708" w:gutter="0"/>
       <w:cols w:space="708"/>
@@ -7304,7 +7330,7 @@
 <w:ftr xmlns:wpc="http://schemas.microsoft.com/office/word/2010/wordprocessingCanvas" xmlns:cx="http://schemas.microsoft.com/office/drawing/2014/chartex" xmlns:cx1="http://schemas.microsoft.com/office/drawing/2015/9/8/chartex" xmlns:cx2="http://schemas.microsoft.com/office/drawing/2015/10/21/chartex" xmlns:cx3="http://schemas.microsoft.com/office/drawing/2016/5/9/chartex" xmlns:cx4="http://schemas.microsoft.com/office/drawing/2016/5/10/chartex" xmlns:cx5="http://schemas.microsoft.com/office/drawing/2016/5/11/chartex" xmlns:cx6="http://schemas.microsoft.com/office/drawing/2016/5/12/chartex" xmlns:cx7="http://schemas.microsoft.com/office/drawing/2016/5/13/chartex" xmlns:cx8="http://schemas.microsoft.com/office/drawing/2016/5/14/chartex" xmlns:mc="http://schemas.openxmlformats.org/markup-compatibility/2006" xmlns:aink="http://schemas.microsoft.com/office/drawing/2016/ink" xmlns:am3d="http://schemas.microsoft.com/office/drawing/2017/model3d" xmlns:o="urn:schemas-microsoft-com:office:office" xmlns:oel="http://schemas.microsoft.com/office/2019/extlst" xmlns:r="http://schemas.openxmlformats.org/officeDocument/2006/relationships" xmlns:m="http://schemas.openxmlformats.org/officeDocument/2006/math" xmlns:v="urn:schemas-microsoft-com:vml" xmlns:wp14="http://schemas.microsoft.com/office/word/2010/wordprocessingDrawing" xmlns:wp="http://schemas.openxmlformats.org/drawingml/2006/wordprocessingDrawing" xmlns:w10="urn:schemas-microsoft-com:office:word" xmlns:w="http://schemas.openxmlformats.org/wordprocessingml/2006/main" xmlns:w14="http://schemas.microsoft.com/office/word/2010/wordml" xmlns:w15="http://schemas.microsoft.com/office/word/2012/wordml" xmlns:w16cex="http://schemas.microsoft.com/office/word/2018/wordml/cex" xmlns:w16cid="http://schemas.microsoft.com/office/word/2016/wordml/cid" xmlns:w16="http://schemas.microsoft.com/office/word/2018/wordml" xmlns:w16du="http://schemas.microsoft.com/office/word/2023/wordml/word16du" xmlns:w16sdtdh="http://schemas.microsoft.com/office/word/2020/wordml/sdtdatahash" xmlns:w16sdtfl="http://schemas.microsoft.com/office/word/2024/wordml/sdtformatlock" xmlns:w16se="http://schemas.microsoft.com/office/word/2015/wordml/symex" xmlns:wpg="http://schemas.microsoft.com/office/word/2010/wordprocessingGroup" xmlns:wpi="http://schemas.microsoft.com/office/word/2010/wordprocessingInk" xmlns:wne="http://schemas.microsoft.com/office/word/2006/wordml" xmlns:wps="http://schemas.microsoft.com/office/word/2010/wordprocessingShape" mc:Ignorable="w14 w15 w16se w16cid w16 w16cex w16sdtdh w16sdtfl w16du wp14">
   <w:p>
     <w:pPr>
-      <w:pStyle w:val="Fuzeile"/>
+      <w:pStyle w:val="Footer"/>
       <w:tabs>
         <w:tab w:val="clear" w:pos="4536"/>
         <w:tab w:val="clear" w:pos="9072"/>
@@ -7335,7 +7361,7 @@
     <w:sdtContent>
       <w:p>
         <w:pPr>
-          <w:pStyle w:val="Fuzeile"/>
+          <w:pStyle w:val="Footer"/>
           <w:tabs>
             <w:tab w:val="clear" w:pos="4536"/>
             <w:tab w:val="clear" w:pos="9072"/>
@@ -7396,7 +7422,7 @@
                 </wp:inline>
               </w:drawing>
             </mc:Choice>
-            <mc:Fallback xmlns:pic="http://schemas.openxmlformats.org/drawingml/2006/picture" xmlns:wp14="http://schemas.microsoft.com/office/word/2010/wordml" xmlns:a="http://schemas.openxmlformats.org/drawingml/2006/main">
+            <mc:Fallback xmlns:a="http://schemas.openxmlformats.org/drawingml/2006/main" xmlns:wp14="http://schemas.microsoft.com/office/word/2010/wordml" xmlns:pic="http://schemas.openxmlformats.org/drawingml/2006/picture">
               <w:pict w14:anchorId="1521B567">
                 <v:shapetype coordsize="21600,21600" o:spt="75" o:preferrelative="t" path="m@4@5l@4@11@9@11@9@5xe" type="#_x0000_t75">
                   <v:formulas>
@@ -10583,15 +10609,15 @@
     <w:lsdException w:name="Unresolved Mention" w:semiHidden="1" w:unhideWhenUsed="1"/>
     <w:lsdException w:name="Smart Link" w:semiHidden="1" w:unhideWhenUsed="1"/>
   </w:latentStyles>
-  <w:style w:type="paragraph" w:default="1" w:styleId="Standard">
+  <w:style w:type="paragraph" w:default="1" w:styleId="Normal">
     <w:name w:val="Normal"/>
     <w:qFormat/>
   </w:style>
-  <w:style w:type="paragraph" w:styleId="berschrift1">
+  <w:style w:type="paragraph" w:styleId="Heading1">
     <w:name w:val="heading 1"/>
-    <w:basedOn w:val="Standard"/>
-    <w:next w:val="Standard"/>
-    <w:link w:val="berschrift1Zchn"/>
+    <w:basedOn w:val="Normal"/>
+    <w:next w:val="Normal"/>
+    <w:link w:val="Heading1Char"/>
     <w:uiPriority w:val="9"/>
     <w:qFormat/>
     <w:pPr>
@@ -10606,11 +10632,11 @@
       <w:szCs w:val="40"/>
     </w:rPr>
   </w:style>
-  <w:style w:type="paragraph" w:styleId="berschrift2">
+  <w:style w:type="paragraph" w:styleId="Heading2">
     <w:name w:val="heading 2"/>
-    <w:basedOn w:val="Standard"/>
-    <w:next w:val="Standard"/>
-    <w:link w:val="berschrift2Zchn"/>
+    <w:basedOn w:val="Normal"/>
+    <w:next w:val="Normal"/>
+    <w:link w:val="Heading2Char"/>
     <w:uiPriority w:val="9"/>
     <w:unhideWhenUsed/>
     <w:qFormat/>
@@ -10625,10 +10651,10 @@
       <w:sz w:val="34"/>
     </w:rPr>
   </w:style>
-  <w:style w:type="paragraph" w:styleId="berschrift3">
+  <w:style w:type="paragraph" w:styleId="Heading3">
     <w:name w:val="heading 3"/>
-    <w:next w:val="Standard"/>
-    <w:link w:val="berschrift3Zchn"/>
+    <w:next w:val="Normal"/>
+    <w:link w:val="Heading3Char1"/>
     <w:uiPriority w:val="9"/>
     <w:unhideWhenUsed/>
     <w:qFormat/>
@@ -10645,11 +10671,11 @@
       <w:lang w:val="en-GB"/>
     </w:rPr>
   </w:style>
-  <w:style w:type="paragraph" w:styleId="berschrift4">
+  <w:style w:type="paragraph" w:styleId="Heading4">
     <w:name w:val="heading 4"/>
-    <w:basedOn w:val="Standard"/>
-    <w:next w:val="Standard"/>
-    <w:link w:val="berschrift4Zchn"/>
+    <w:basedOn w:val="Normal"/>
+    <w:next w:val="Normal"/>
+    <w:link w:val="Heading4Char1"/>
     <w:uiPriority w:val="9"/>
     <w:unhideWhenUsed/>
     <w:qFormat/>
@@ -10674,11 +10700,11 @@
       <w:lang w:val="en-GB"/>
     </w:rPr>
   </w:style>
-  <w:style w:type="paragraph" w:styleId="berschrift5">
+  <w:style w:type="paragraph" w:styleId="Heading5">
     <w:name w:val="heading 5"/>
-    <w:basedOn w:val="Standard"/>
-    <w:next w:val="Standard"/>
-    <w:link w:val="berschrift5Zchn"/>
+    <w:basedOn w:val="Normal"/>
+    <w:next w:val="Normal"/>
+    <w:link w:val="Heading5Char"/>
     <w:uiPriority w:val="9"/>
     <w:unhideWhenUsed/>
     <w:qFormat/>
@@ -10696,11 +10722,11 @@
       <w:szCs w:val="24"/>
     </w:rPr>
   </w:style>
-  <w:style w:type="paragraph" w:styleId="berschrift6">
+  <w:style w:type="paragraph" w:styleId="Heading6">
     <w:name w:val="heading 6"/>
-    <w:basedOn w:val="Standard"/>
-    <w:next w:val="Standard"/>
-    <w:link w:val="berschrift6Zchn"/>
+    <w:basedOn w:val="Normal"/>
+    <w:next w:val="Normal"/>
+    <w:link w:val="Heading6Char"/>
     <w:uiPriority w:val="9"/>
     <w:unhideWhenUsed/>
     <w:qFormat/>
@@ -10716,11 +10742,11 @@
       <w:bCs/>
     </w:rPr>
   </w:style>
-  <w:style w:type="paragraph" w:styleId="berschrift7">
+  <w:style w:type="paragraph" w:styleId="Heading7">
     <w:name w:val="heading 7"/>
-    <w:basedOn w:val="Standard"/>
-    <w:next w:val="Standard"/>
-    <w:link w:val="berschrift7Zchn"/>
+    <w:basedOn w:val="Normal"/>
+    <w:next w:val="Normal"/>
+    <w:link w:val="Heading7Char"/>
     <w:uiPriority w:val="9"/>
     <w:unhideWhenUsed/>
     <w:qFormat/>
@@ -10738,11 +10764,11 @@
       <w:iCs/>
     </w:rPr>
   </w:style>
-  <w:style w:type="paragraph" w:styleId="berschrift8">
+  <w:style w:type="paragraph" w:styleId="Heading8">
     <w:name w:val="heading 8"/>
-    <w:basedOn w:val="Standard"/>
-    <w:next w:val="Standard"/>
-    <w:link w:val="berschrift8Zchn"/>
+    <w:basedOn w:val="Normal"/>
+    <w:next w:val="Normal"/>
+    <w:link w:val="Heading8Char"/>
     <w:uiPriority w:val="9"/>
     <w:unhideWhenUsed/>
     <w:qFormat/>
@@ -10758,11 +10784,11 @@
       <w:iCs/>
     </w:rPr>
   </w:style>
-  <w:style w:type="paragraph" w:styleId="berschrift9">
+  <w:style w:type="paragraph" w:styleId="Heading9">
     <w:name w:val="heading 9"/>
-    <w:basedOn w:val="Standard"/>
-    <w:next w:val="Standard"/>
-    <w:link w:val="berschrift9Zchn"/>
+    <w:basedOn w:val="Normal"/>
+    <w:next w:val="Normal"/>
+    <w:link w:val="Heading9Char"/>
     <w:uiPriority w:val="9"/>
     <w:unhideWhenUsed/>
     <w:qFormat/>
@@ -10780,13 +10806,13 @@
       <w:szCs w:val="21"/>
     </w:rPr>
   </w:style>
-  <w:style w:type="character" w:default="1" w:styleId="Absatz-Standardschriftart">
+  <w:style w:type="character" w:default="1" w:styleId="DefaultParagraphFont">
     <w:name w:val="Default Paragraph Font"/>
     <w:uiPriority w:val="1"/>
     <w:semiHidden/>
     <w:unhideWhenUsed/>
   </w:style>
-  <w:style w:type="table" w:default="1" w:styleId="NormaleTabelle">
+  <w:style w:type="table" w:default="1" w:styleId="TableNormal">
     <w:name w:val="Normal Table"/>
     <w:uiPriority w:val="99"/>
     <w:semiHidden/>
@@ -10801,16 +10827,16 @@
       </w:tblCellMar>
     </w:tblPr>
   </w:style>
-  <w:style w:type="numbering" w:default="1" w:styleId="KeineListe">
+  <w:style w:type="numbering" w:default="1" w:styleId="NoList">
     <w:name w:val="No List"/>
     <w:uiPriority w:val="99"/>
     <w:semiHidden/>
     <w:unhideWhenUsed/>
   </w:style>
-  <w:style w:type="character" w:customStyle="1" w:styleId="berschrift1Zchn">
-    <w:name w:val="Überschrift 1 Zchn"/>
-    <w:basedOn w:val="Absatz-Standardschriftart"/>
-    <w:link w:val="berschrift1"/>
+  <w:style w:type="character" w:customStyle="1" w:styleId="Heading1Char">
+    <w:name w:val="Heading 1 Char"/>
+    <w:basedOn w:val="DefaultParagraphFont"/>
+    <w:link w:val="Heading1"/>
     <w:uiPriority w:val="9"/>
     <w:rPr>
       <w:rFonts w:ascii="Arial" w:eastAsia="Arial" w:hAnsi="Arial" w:cs="Arial"/>
@@ -10818,10 +10844,10 @@
       <w:szCs w:val="40"/>
     </w:rPr>
   </w:style>
-  <w:style w:type="character" w:customStyle="1" w:styleId="berschrift2Zchn">
-    <w:name w:val="Überschrift 2 Zchn"/>
-    <w:basedOn w:val="Absatz-Standardschriftart"/>
-    <w:link w:val="berschrift2"/>
+  <w:style w:type="character" w:customStyle="1" w:styleId="Heading2Char">
+    <w:name w:val="Heading 2 Char"/>
+    <w:basedOn w:val="DefaultParagraphFont"/>
+    <w:link w:val="Heading2"/>
     <w:uiPriority w:val="9"/>
     <w:rPr>
       <w:rFonts w:ascii="Arial" w:eastAsia="Arial" w:hAnsi="Arial" w:cs="Arial"/>
@@ -10830,7 +10856,7 @@
   </w:style>
   <w:style w:type="character" w:customStyle="1" w:styleId="Heading3Char">
     <w:name w:val="Heading 3 Char"/>
-    <w:basedOn w:val="Absatz-Standardschriftart"/>
+    <w:basedOn w:val="DefaultParagraphFont"/>
     <w:uiPriority w:val="9"/>
     <w:rPr>
       <w:rFonts w:ascii="Arial" w:eastAsia="Arial" w:hAnsi="Arial" w:cs="Arial"/>
@@ -10840,7 +10866,7 @@
   </w:style>
   <w:style w:type="character" w:customStyle="1" w:styleId="Heading4Char">
     <w:name w:val="Heading 4 Char"/>
-    <w:basedOn w:val="Absatz-Standardschriftart"/>
+    <w:basedOn w:val="DefaultParagraphFont"/>
     <w:uiPriority w:val="9"/>
     <w:rPr>
       <w:rFonts w:ascii="Arial" w:eastAsia="Arial" w:hAnsi="Arial" w:cs="Arial"/>
@@ -10850,10 +10876,10 @@
       <w:szCs w:val="26"/>
     </w:rPr>
   </w:style>
-  <w:style w:type="character" w:customStyle="1" w:styleId="berschrift5Zchn">
-    <w:name w:val="Überschrift 5 Zchn"/>
-    <w:basedOn w:val="Absatz-Standardschriftart"/>
-    <w:link w:val="berschrift5"/>
+  <w:style w:type="character" w:customStyle="1" w:styleId="Heading5Char">
+    <w:name w:val="Heading 5 Char"/>
+    <w:basedOn w:val="DefaultParagraphFont"/>
+    <w:link w:val="Heading5"/>
     <w:uiPriority w:val="9"/>
     <w:rPr>
       <w:rFonts w:ascii="Arial" w:eastAsia="Arial" w:hAnsi="Arial" w:cs="Arial"/>
@@ -10863,10 +10889,10 @@
       <w:szCs w:val="24"/>
     </w:rPr>
   </w:style>
-  <w:style w:type="character" w:customStyle="1" w:styleId="berschrift6Zchn">
-    <w:name w:val="Überschrift 6 Zchn"/>
-    <w:basedOn w:val="Absatz-Standardschriftart"/>
-    <w:link w:val="berschrift6"/>
+  <w:style w:type="character" w:customStyle="1" w:styleId="Heading6Char">
+    <w:name w:val="Heading 6 Char"/>
+    <w:basedOn w:val="DefaultParagraphFont"/>
+    <w:link w:val="Heading6"/>
     <w:uiPriority w:val="9"/>
     <w:rPr>
       <w:rFonts w:ascii="Arial" w:eastAsia="Arial" w:hAnsi="Arial" w:cs="Arial"/>
@@ -10876,10 +10902,10 @@
       <w:szCs w:val="22"/>
     </w:rPr>
   </w:style>
-  <w:style w:type="character" w:customStyle="1" w:styleId="berschrift7Zchn">
-    <w:name w:val="Überschrift 7 Zchn"/>
-    <w:basedOn w:val="Absatz-Standardschriftart"/>
-    <w:link w:val="berschrift7"/>
+  <w:style w:type="character" w:customStyle="1" w:styleId="Heading7Char">
+    <w:name w:val="Heading 7 Char"/>
+    <w:basedOn w:val="DefaultParagraphFont"/>
+    <w:link w:val="Heading7"/>
     <w:uiPriority w:val="9"/>
     <w:rPr>
       <w:rFonts w:ascii="Arial" w:eastAsia="Arial" w:hAnsi="Arial" w:cs="Arial"/>
@@ -10891,10 +10917,10 @@
       <w:szCs w:val="22"/>
     </w:rPr>
   </w:style>
-  <w:style w:type="character" w:customStyle="1" w:styleId="berschrift8Zchn">
-    <w:name w:val="Überschrift 8 Zchn"/>
-    <w:basedOn w:val="Absatz-Standardschriftart"/>
-    <w:link w:val="berschrift8"/>
+  <w:style w:type="character" w:customStyle="1" w:styleId="Heading8Char">
+    <w:name w:val="Heading 8 Char"/>
+    <w:basedOn w:val="DefaultParagraphFont"/>
+    <w:link w:val="Heading8"/>
     <w:uiPriority w:val="9"/>
     <w:rPr>
       <w:rFonts w:ascii="Arial" w:eastAsia="Arial" w:hAnsi="Arial" w:cs="Arial"/>
@@ -10904,10 +10930,10 @@
       <w:szCs w:val="22"/>
     </w:rPr>
   </w:style>
-  <w:style w:type="character" w:customStyle="1" w:styleId="berschrift9Zchn">
-    <w:name w:val="Überschrift 9 Zchn"/>
-    <w:basedOn w:val="Absatz-Standardschriftart"/>
-    <w:link w:val="berschrift9"/>
+  <w:style w:type="character" w:customStyle="1" w:styleId="Heading9Char">
+    <w:name w:val="Heading 9 Char"/>
+    <w:basedOn w:val="DefaultParagraphFont"/>
+    <w:link w:val="Heading9"/>
     <w:uiPriority w:val="9"/>
     <w:rPr>
       <w:rFonts w:ascii="Arial" w:eastAsia="Arial" w:hAnsi="Arial" w:cs="Arial"/>
@@ -10919,18 +10945,18 @@
   </w:style>
   <w:style w:type="character" w:customStyle="1" w:styleId="TitleChar">
     <w:name w:val="Title Char"/>
-    <w:basedOn w:val="Absatz-Standardschriftart"/>
+    <w:basedOn w:val="DefaultParagraphFont"/>
     <w:uiPriority w:val="10"/>
     <w:rPr>
       <w:sz w:val="48"/>
       <w:szCs w:val="48"/>
     </w:rPr>
   </w:style>
-  <w:style w:type="paragraph" w:styleId="Untertitel">
+  <w:style w:type="paragraph" w:styleId="Subtitle">
     <w:name w:val="Subtitle"/>
-    <w:basedOn w:val="Standard"/>
-    <w:next w:val="Standard"/>
-    <w:link w:val="UntertitelZchn"/>
+    <w:basedOn w:val="Normal"/>
+    <w:next w:val="Normal"/>
+    <w:link w:val="SubtitleChar"/>
     <w:uiPriority w:val="11"/>
     <w:qFormat/>
     <w:pPr>
@@ -10941,21 +10967,21 @@
       <w:szCs w:val="24"/>
     </w:rPr>
   </w:style>
-  <w:style w:type="character" w:customStyle="1" w:styleId="UntertitelZchn">
-    <w:name w:val="Untertitel Zchn"/>
-    <w:basedOn w:val="Absatz-Standardschriftart"/>
-    <w:link w:val="Untertitel"/>
+  <w:style w:type="character" w:customStyle="1" w:styleId="SubtitleChar">
+    <w:name w:val="Subtitle Char"/>
+    <w:basedOn w:val="DefaultParagraphFont"/>
+    <w:link w:val="Subtitle"/>
     <w:uiPriority w:val="11"/>
     <w:rPr>
       <w:sz w:val="24"/>
       <w:szCs w:val="24"/>
     </w:rPr>
   </w:style>
-  <w:style w:type="paragraph" w:styleId="Zitat">
+  <w:style w:type="paragraph" w:styleId="Quote">
     <w:name w:val="Quote"/>
-    <w:basedOn w:val="Standard"/>
-    <w:next w:val="Standard"/>
-    <w:link w:val="ZitatZchn"/>
+    <w:basedOn w:val="Normal"/>
+    <w:next w:val="Normal"/>
+    <w:link w:val="QuoteChar"/>
     <w:uiPriority w:val="29"/>
     <w:qFormat/>
     <w:pPr>
@@ -10965,19 +10991,19 @@
       <w:i/>
     </w:rPr>
   </w:style>
-  <w:style w:type="character" w:customStyle="1" w:styleId="ZitatZchn">
-    <w:name w:val="Zitat Zchn"/>
-    <w:link w:val="Zitat"/>
+  <w:style w:type="character" w:customStyle="1" w:styleId="QuoteChar">
+    <w:name w:val="Quote Char"/>
+    <w:link w:val="Quote"/>
     <w:uiPriority w:val="29"/>
     <w:rPr>
       <w:i/>
     </w:rPr>
   </w:style>
-  <w:style w:type="paragraph" w:styleId="IntensivesZitat">
+  <w:style w:type="paragraph" w:styleId="IntenseQuote">
     <w:name w:val="Intense Quote"/>
-    <w:basedOn w:val="Standard"/>
-    <w:next w:val="Standard"/>
-    <w:link w:val="IntensivesZitatZchn"/>
+    <w:basedOn w:val="Normal"/>
+    <w:next w:val="Normal"/>
+    <w:link w:val="IntenseQuoteChar"/>
     <w:uiPriority w:val="30"/>
     <w:qFormat/>
     <w:pPr>
@@ -10994,9 +11020,9 @@
       <w:i/>
     </w:rPr>
   </w:style>
-  <w:style w:type="character" w:customStyle="1" w:styleId="IntensivesZitatZchn">
-    <w:name w:val="Intensives Zitat Zchn"/>
-    <w:link w:val="IntensivesZitat"/>
+  <w:style w:type="character" w:customStyle="1" w:styleId="IntenseQuoteChar">
+    <w:name w:val="Intense Quote Char"/>
+    <w:link w:val="IntenseQuote"/>
     <w:uiPriority w:val="30"/>
     <w:rPr>
       <w:i/>
@@ -11004,18 +11030,18 @@
   </w:style>
   <w:style w:type="character" w:customStyle="1" w:styleId="HeaderChar">
     <w:name w:val="Header Char"/>
-    <w:basedOn w:val="Absatz-Standardschriftart"/>
+    <w:basedOn w:val="DefaultParagraphFont"/>
     <w:uiPriority w:val="99"/>
   </w:style>
   <w:style w:type="character" w:customStyle="1" w:styleId="FooterChar">
     <w:name w:val="Footer Char"/>
-    <w:basedOn w:val="Absatz-Standardschriftart"/>
+    <w:basedOn w:val="DefaultParagraphFont"/>
     <w:uiPriority w:val="99"/>
   </w:style>
-  <w:style w:type="paragraph" w:styleId="Beschriftung">
+  <w:style w:type="paragraph" w:styleId="Caption">
     <w:name w:val="caption"/>
-    <w:basedOn w:val="Standard"/>
-    <w:next w:val="Standard"/>
+    <w:basedOn w:val="Normal"/>
+    <w:next w:val="Normal"/>
     <w:uiPriority w:val="35"/>
     <w:semiHidden/>
     <w:unhideWhenUsed/>
@@ -11034,7 +11060,7 @@
   </w:style>
   <w:style w:type="table" w:customStyle="1" w:styleId="TableGridLight1">
     <w:name w:val="Table Grid Light1"/>
-    <w:basedOn w:val="NormaleTabelle"/>
+    <w:basedOn w:val="TableNormal"/>
     <w:uiPriority w:val="59"/>
     <w:pPr>
       <w:spacing w:after="0" w:line="240" w:lineRule="auto"/>
@@ -11050,9 +11076,9 @@
       </w:tblBorders>
     </w:tblPr>
   </w:style>
-  <w:style w:type="table" w:styleId="EinfacheTabelle1">
+  <w:style w:type="table" w:styleId="PlainTable1">
     <w:name w:val="Plain Table 1"/>
-    <w:basedOn w:val="NormaleTabelle"/>
+    <w:basedOn w:val="TableNormal"/>
     <w:uiPriority w:val="59"/>
     <w:pPr>
       <w:spacing w:after="0" w:line="240" w:lineRule="auto"/>
@@ -11112,9 +11138,9 @@
       </w:tcPr>
     </w:tblStylePr>
   </w:style>
-  <w:style w:type="table" w:styleId="EinfacheTabelle2">
+  <w:style w:type="table" w:styleId="PlainTable2">
     <w:name w:val="Plain Table 2"/>
-    <w:basedOn w:val="NormaleTabelle"/>
+    <w:basedOn w:val="TableNormal"/>
     <w:uiPriority w:val="59"/>
     <w:pPr>
       <w:spacing w:after="0" w:line="240" w:lineRule="auto"/>
@@ -11194,9 +11220,9 @@
       </w:tcPr>
     </w:tblStylePr>
   </w:style>
-  <w:style w:type="table" w:styleId="EinfacheTabelle3">
+  <w:style w:type="table" w:styleId="PlainTable3">
     <w:name w:val="Plain Table 3"/>
-    <w:basedOn w:val="NormaleTabelle"/>
+    <w:basedOn w:val="TableNormal"/>
     <w:uiPriority w:val="99"/>
     <w:pPr>
       <w:spacing w:after="0" w:line="240" w:lineRule="auto"/>
@@ -11274,9 +11300,9 @@
       </w:tcPr>
     </w:tblStylePr>
   </w:style>
-  <w:style w:type="table" w:styleId="EinfacheTabelle4">
+  <w:style w:type="table" w:styleId="PlainTable4">
     <w:name w:val="Plain Table 4"/>
-    <w:basedOn w:val="NormaleTabelle"/>
+    <w:basedOn w:val="TableNormal"/>
     <w:uiPriority w:val="99"/>
     <w:pPr>
       <w:spacing w:after="0" w:line="240" w:lineRule="auto"/>
@@ -11332,9 +11358,9 @@
       </w:tcPr>
     </w:tblStylePr>
   </w:style>
-  <w:style w:type="table" w:styleId="EinfacheTabelle5">
+  <w:style w:type="table" w:styleId="PlainTable5">
     <w:name w:val="Plain Table 5"/>
-    <w:basedOn w:val="NormaleTabelle"/>
+    <w:basedOn w:val="TableNormal"/>
     <w:uiPriority w:val="99"/>
     <w:pPr>
       <w:spacing w:after="0" w:line="240" w:lineRule="auto"/>
@@ -11425,9 +11451,9 @@
       </w:tcPr>
     </w:tblStylePr>
   </w:style>
-  <w:style w:type="table" w:styleId="Gitternetztabelle1hell">
+  <w:style w:type="table" w:styleId="GridTable1Light">
     <w:name w:val="Grid Table 1 Light"/>
-    <w:basedOn w:val="NormaleTabelle"/>
+    <w:basedOn w:val="TableNormal"/>
     <w:uiPriority w:val="99"/>
     <w:pPr>
       <w:spacing w:after="0" w:line="240" w:lineRule="auto"/>
@@ -11493,7 +11519,7 @@
   </w:style>
   <w:style w:type="table" w:customStyle="1" w:styleId="GridTable1Light-Accent11">
     <w:name w:val="Grid Table 1 Light - Accent 11"/>
-    <w:basedOn w:val="NormaleTabelle"/>
+    <w:basedOn w:val="TableNormal"/>
     <w:uiPriority w:val="99"/>
     <w:pPr>
       <w:spacing w:after="0" w:line="240" w:lineRule="auto"/>
@@ -11559,7 +11585,7 @@
   </w:style>
   <w:style w:type="table" w:customStyle="1" w:styleId="GridTable1Light-Accent21">
     <w:name w:val="Grid Table 1 Light - Accent 21"/>
-    <w:basedOn w:val="NormaleTabelle"/>
+    <w:basedOn w:val="TableNormal"/>
     <w:uiPriority w:val="99"/>
     <w:pPr>
       <w:spacing w:after="0" w:line="240" w:lineRule="auto"/>
@@ -11625,7 +11651,7 @@
   </w:style>
   <w:style w:type="table" w:customStyle="1" w:styleId="GridTable1Light-Accent31">
     <w:name w:val="Grid Table 1 Light - Accent 31"/>
-    <w:basedOn w:val="NormaleTabelle"/>
+    <w:basedOn w:val="TableNormal"/>
     <w:uiPriority w:val="99"/>
     <w:pPr>
       <w:spacing w:after="0" w:line="240" w:lineRule="auto"/>
@@ -11691,7 +11717,7 @@
   </w:style>
   <w:style w:type="table" w:customStyle="1" w:styleId="GridTable1Light-Accent41">
     <w:name w:val="Grid Table 1 Light - Accent 41"/>
-    <w:basedOn w:val="NormaleTabelle"/>
+    <w:basedOn w:val="TableNormal"/>
     <w:uiPriority w:val="99"/>
     <w:pPr>
       <w:spacing w:after="0" w:line="240" w:lineRule="auto"/>
@@ -11757,7 +11783,7 @@
   </w:style>
   <w:style w:type="table" w:customStyle="1" w:styleId="GridTable1Light-Accent51">
     <w:name w:val="Grid Table 1 Light - Accent 51"/>
-    <w:basedOn w:val="NormaleTabelle"/>
+    <w:basedOn w:val="TableNormal"/>
     <w:uiPriority w:val="99"/>
     <w:pPr>
       <w:spacing w:after="0" w:line="240" w:lineRule="auto"/>
@@ -11823,7 +11849,7 @@
   </w:style>
   <w:style w:type="table" w:customStyle="1" w:styleId="GridTable1Light-Accent61">
     <w:name w:val="Grid Table 1 Light - Accent 61"/>
-    <w:basedOn w:val="NormaleTabelle"/>
+    <w:basedOn w:val="TableNormal"/>
     <w:uiPriority w:val="99"/>
     <w:pPr>
       <w:spacing w:after="0" w:line="240" w:lineRule="auto"/>
@@ -11887,9 +11913,9 @@
       </w:tcPr>
     </w:tblStylePr>
   </w:style>
-  <w:style w:type="table" w:styleId="Gitternetztabelle2">
+  <w:style w:type="table" w:styleId="GridTable2">
     <w:name w:val="Grid Table 2"/>
-    <w:basedOn w:val="NormaleTabelle"/>
+    <w:basedOn w:val="TableNormal"/>
     <w:uiPriority w:val="99"/>
     <w:pPr>
       <w:spacing w:after="0" w:line="240" w:lineRule="auto"/>
@@ -11972,7 +11998,7 @@
   </w:style>
   <w:style w:type="table" w:customStyle="1" w:styleId="GridTable2-Accent11">
     <w:name w:val="Grid Table 2 - Accent 11"/>
-    <w:basedOn w:val="NormaleTabelle"/>
+    <w:basedOn w:val="TableNormal"/>
     <w:uiPriority w:val="99"/>
     <w:pPr>
       <w:spacing w:after="0" w:line="240" w:lineRule="auto"/>
@@ -12055,7 +12081,7 @@
   </w:style>
   <w:style w:type="table" w:customStyle="1" w:styleId="GridTable2-Accent21">
     <w:name w:val="Grid Table 2 - Accent 21"/>
-    <w:basedOn w:val="NormaleTabelle"/>
+    <w:basedOn w:val="TableNormal"/>
     <w:uiPriority w:val="99"/>
     <w:pPr>
       <w:spacing w:after="0" w:line="240" w:lineRule="auto"/>
@@ -12138,7 +12164,7 @@
   </w:style>
   <w:style w:type="table" w:customStyle="1" w:styleId="GridTable2-Accent31">
     <w:name w:val="Grid Table 2 - Accent 31"/>
-    <w:basedOn w:val="NormaleTabelle"/>
+    <w:basedOn w:val="TableNormal"/>
     <w:uiPriority w:val="99"/>
     <w:pPr>
       <w:spacing w:after="0" w:line="240" w:lineRule="auto"/>
@@ -12221,7 +12247,7 @@
   </w:style>
   <w:style w:type="table" w:customStyle="1" w:styleId="GridTable2-Accent41">
     <w:name w:val="Grid Table 2 - Accent 41"/>
-    <w:basedOn w:val="NormaleTabelle"/>
+    <w:basedOn w:val="TableNormal"/>
     <w:uiPriority w:val="99"/>
     <w:pPr>
       <w:spacing w:after="0" w:line="240" w:lineRule="auto"/>
@@ -12304,7 +12330,7 @@
   </w:style>
   <w:style w:type="table" w:customStyle="1" w:styleId="GridTable2-Accent51">
     <w:name w:val="Grid Table 2 - Accent 51"/>
-    <w:basedOn w:val="NormaleTabelle"/>
+    <w:basedOn w:val="TableNormal"/>
     <w:uiPriority w:val="99"/>
     <w:pPr>
       <w:spacing w:after="0" w:line="240" w:lineRule="auto"/>
@@ -12387,7 +12413,7 @@
   </w:style>
   <w:style w:type="table" w:customStyle="1" w:styleId="GridTable2-Accent61">
     <w:name w:val="Grid Table 2 - Accent 61"/>
-    <w:basedOn w:val="NormaleTabelle"/>
+    <w:basedOn w:val="TableNormal"/>
     <w:uiPriority w:val="99"/>
     <w:pPr>
       <w:spacing w:after="0" w:line="240" w:lineRule="auto"/>
@@ -12468,9 +12494,9 @@
       </w:tcPr>
     </w:tblStylePr>
   </w:style>
-  <w:style w:type="table" w:styleId="Gitternetztabelle3">
+  <w:style w:type="table" w:styleId="GridTable3">
     <w:name w:val="Grid Table 3"/>
-    <w:basedOn w:val="NormaleTabelle"/>
+    <w:basedOn w:val="TableNormal"/>
     <w:uiPriority w:val="99"/>
     <w:pPr>
       <w:spacing w:after="0" w:line="240" w:lineRule="auto"/>
@@ -12576,7 +12602,7 @@
   </w:style>
   <w:style w:type="table" w:customStyle="1" w:styleId="GridTable3-Accent11">
     <w:name w:val="Grid Table 3 - Accent 11"/>
-    <w:basedOn w:val="NormaleTabelle"/>
+    <w:basedOn w:val="TableNormal"/>
     <w:uiPriority w:val="99"/>
     <w:pPr>
       <w:spacing w:after="0" w:line="240" w:lineRule="auto"/>
@@ -12682,7 +12708,7 @@
   </w:style>
   <w:style w:type="table" w:customStyle="1" w:styleId="GridTable3-Accent21">
     <w:name w:val="Grid Table 3 - Accent 21"/>
-    <w:basedOn w:val="NormaleTabelle"/>
+    <w:basedOn w:val="TableNormal"/>
     <w:uiPriority w:val="99"/>
     <w:pPr>
       <w:spacing w:after="0" w:line="240" w:lineRule="auto"/>
@@ -12788,7 +12814,7 @@
   </w:style>
   <w:style w:type="table" w:customStyle="1" w:styleId="GridTable3-Accent31">
     <w:name w:val="Grid Table 3 - Accent 31"/>
-    <w:basedOn w:val="NormaleTabelle"/>
+    <w:basedOn w:val="TableNormal"/>
     <w:uiPriority w:val="99"/>
     <w:pPr>
       <w:spacing w:after="0" w:line="240" w:lineRule="auto"/>
@@ -12894,7 +12920,7 @@
   </w:style>
   <w:style w:type="table" w:customStyle="1" w:styleId="GridTable3-Accent41">
     <w:name w:val="Grid Table 3 - Accent 41"/>
-    <w:basedOn w:val="NormaleTabelle"/>
+    <w:basedOn w:val="TableNormal"/>
     <w:uiPriority w:val="99"/>
     <w:pPr>
       <w:spacing w:after="0" w:line="240" w:lineRule="auto"/>
@@ -13000,7 +13026,7 @@
   </w:style>
   <w:style w:type="table" w:customStyle="1" w:styleId="GridTable3-Accent51">
     <w:name w:val="Grid Table 3 - Accent 51"/>
-    <w:basedOn w:val="NormaleTabelle"/>
+    <w:basedOn w:val="TableNormal"/>
     <w:uiPriority w:val="99"/>
     <w:pPr>
       <w:spacing w:after="0" w:line="240" w:lineRule="auto"/>
@@ -13106,7 +13132,7 @@
   </w:style>
   <w:style w:type="table" w:customStyle="1" w:styleId="GridTable3-Accent61">
     <w:name w:val="Grid Table 3 - Accent 61"/>
-    <w:basedOn w:val="NormaleTabelle"/>
+    <w:basedOn w:val="TableNormal"/>
     <w:uiPriority w:val="99"/>
     <w:pPr>
       <w:spacing w:after="0" w:line="240" w:lineRule="auto"/>
@@ -13210,9 +13236,9 @@
       </w:tcPr>
     </w:tblStylePr>
   </w:style>
-  <w:style w:type="table" w:styleId="Gitternetztabelle4">
+  <w:style w:type="table" w:styleId="GridTable4">
     <w:name w:val="Grid Table 4"/>
-    <w:basedOn w:val="NormaleTabelle"/>
+    <w:basedOn w:val="TableNormal"/>
     <w:uiPriority w:val="59"/>
     <w:pPr>
       <w:spacing w:after="0" w:line="240" w:lineRule="auto"/>
@@ -13296,7 +13322,7 @@
   </w:style>
   <w:style w:type="table" w:customStyle="1" w:styleId="GridTable4-Accent11">
     <w:name w:val="Grid Table 4 - Accent 11"/>
-    <w:basedOn w:val="NormaleTabelle"/>
+    <w:basedOn w:val="TableNormal"/>
     <w:uiPriority w:val="59"/>
     <w:pPr>
       <w:spacing w:after="0" w:line="240" w:lineRule="auto"/>
@@ -13380,7 +13406,7 @@
   </w:style>
   <w:style w:type="table" w:customStyle="1" w:styleId="GridTable4-Accent21">
     <w:name w:val="Grid Table 4 - Accent 21"/>
-    <w:basedOn w:val="NormaleTabelle"/>
+    <w:basedOn w:val="TableNormal"/>
     <w:uiPriority w:val="59"/>
     <w:pPr>
       <w:spacing w:after="0" w:line="240" w:lineRule="auto"/>
@@ -13464,7 +13490,7 @@
   </w:style>
   <w:style w:type="table" w:customStyle="1" w:styleId="GridTable4-Accent31">
     <w:name w:val="Grid Table 4 - Accent 31"/>
-    <w:basedOn w:val="NormaleTabelle"/>
+    <w:basedOn w:val="TableNormal"/>
     <w:uiPriority w:val="59"/>
     <w:pPr>
       <w:spacing w:after="0" w:line="240" w:lineRule="auto"/>
@@ -13548,7 +13574,7 @@
   </w:style>
   <w:style w:type="table" w:customStyle="1" w:styleId="GridTable4-Accent41">
     <w:name w:val="Grid Table 4 - Accent 41"/>
-    <w:basedOn w:val="NormaleTabelle"/>
+    <w:basedOn w:val="TableNormal"/>
     <w:uiPriority w:val="59"/>
     <w:pPr>
       <w:spacing w:after="0" w:line="240" w:lineRule="auto"/>
@@ -13632,7 +13658,7 @@
   </w:style>
   <w:style w:type="table" w:customStyle="1" w:styleId="GridTable4-Accent51">
     <w:name w:val="Grid Table 4 - Accent 51"/>
-    <w:basedOn w:val="NormaleTabelle"/>
+    <w:basedOn w:val="TableNormal"/>
     <w:uiPriority w:val="59"/>
     <w:pPr>
       <w:spacing w:after="0" w:line="240" w:lineRule="auto"/>
@@ -13716,7 +13742,7 @@
   </w:style>
   <w:style w:type="table" w:customStyle="1" w:styleId="GridTable4-Accent61">
     <w:name w:val="Grid Table 4 - Accent 61"/>
-    <w:basedOn w:val="NormaleTabelle"/>
+    <w:basedOn w:val="TableNormal"/>
     <w:uiPriority w:val="59"/>
     <w:pPr>
       <w:spacing w:after="0" w:line="240" w:lineRule="auto"/>
@@ -13798,9 +13824,9 @@
       </w:tcPr>
     </w:tblStylePr>
   </w:style>
-  <w:style w:type="table" w:styleId="Gitternetztabelle5dunkel">
+  <w:style w:type="table" w:styleId="GridTable5Dark">
     <w:name w:val="Grid Table 5 Dark"/>
-    <w:basedOn w:val="NormaleTabelle"/>
+    <w:basedOn w:val="TableNormal"/>
     <w:uiPriority w:val="99"/>
     <w:pPr>
       <w:spacing w:after="0" w:line="240" w:lineRule="auto"/>
@@ -13884,7 +13910,7 @@
   </w:style>
   <w:style w:type="table" w:customStyle="1" w:styleId="GridTable5Dark-Accent11">
     <w:name w:val="Grid Table 5 Dark - Accent 11"/>
-    <w:basedOn w:val="NormaleTabelle"/>
+    <w:basedOn w:val="TableNormal"/>
     <w:uiPriority w:val="99"/>
     <w:pPr>
       <w:spacing w:after="0" w:line="240" w:lineRule="auto"/>
@@ -13968,7 +13994,7 @@
   </w:style>
   <w:style w:type="table" w:customStyle="1" w:styleId="GridTable5Dark-Accent21">
     <w:name w:val="Grid Table 5 Dark - Accent 21"/>
-    <w:basedOn w:val="NormaleTabelle"/>
+    <w:basedOn w:val="TableNormal"/>
     <w:uiPriority w:val="99"/>
     <w:pPr>
       <w:spacing w:after="0" w:line="240" w:lineRule="auto"/>
@@ -14052,7 +14078,7 @@
   </w:style>
   <w:style w:type="table" w:customStyle="1" w:styleId="GridTable5Dark-Accent31">
     <w:name w:val="Grid Table 5 Dark - Accent 31"/>
-    <w:basedOn w:val="NormaleTabelle"/>
+    <w:basedOn w:val="TableNormal"/>
     <w:uiPriority w:val="99"/>
     <w:pPr>
       <w:spacing w:after="0" w:line="240" w:lineRule="auto"/>
@@ -14136,7 +14162,7 @@
   </w:style>
   <w:style w:type="table" w:customStyle="1" w:styleId="GridTable5Dark-Accent41">
     <w:name w:val="Grid Table 5 Dark - Accent 41"/>
-    <w:basedOn w:val="NormaleTabelle"/>
+    <w:basedOn w:val="TableNormal"/>
     <w:uiPriority w:val="99"/>
     <w:pPr>
       <w:spacing w:after="0" w:line="240" w:lineRule="auto"/>
@@ -14220,7 +14246,7 @@
   </w:style>
   <w:style w:type="table" w:customStyle="1" w:styleId="GridTable5Dark-Accent51">
     <w:name w:val="Grid Table 5 Dark - Accent 51"/>
-    <w:basedOn w:val="NormaleTabelle"/>
+    <w:basedOn w:val="TableNormal"/>
     <w:uiPriority w:val="99"/>
     <w:pPr>
       <w:spacing w:after="0" w:line="240" w:lineRule="auto"/>
@@ -14304,7 +14330,7 @@
   </w:style>
   <w:style w:type="table" w:customStyle="1" w:styleId="GridTable5Dark-Accent61">
     <w:name w:val="Grid Table 5 Dark - Accent 61"/>
-    <w:basedOn w:val="NormaleTabelle"/>
+    <w:basedOn w:val="TableNormal"/>
     <w:uiPriority w:val="99"/>
     <w:pPr>
       <w:spacing w:after="0" w:line="240" w:lineRule="auto"/>
@@ -14386,9 +14412,9 @@
       </w:tcPr>
     </w:tblStylePr>
   </w:style>
-  <w:style w:type="table" w:styleId="Gitternetztabelle6farbig">
+  <w:style w:type="table" w:styleId="GridTable6Colorful">
     <w:name w:val="Grid Table 6 Colorful"/>
-    <w:basedOn w:val="NormaleTabelle"/>
+    <w:basedOn w:val="TableNormal"/>
     <w:uiPriority w:val="99"/>
     <w:pPr>
       <w:spacing w:after="0" w:line="240" w:lineRule="auto"/>
@@ -14462,7 +14488,7 @@
   </w:style>
   <w:style w:type="table" w:customStyle="1" w:styleId="GridTable6Colorful-Accent11">
     <w:name w:val="Grid Table 6 Colorful - Accent 11"/>
-    <w:basedOn w:val="NormaleTabelle"/>
+    <w:basedOn w:val="TableNormal"/>
     <w:uiPriority w:val="99"/>
     <w:pPr>
       <w:spacing w:after="0" w:line="240" w:lineRule="auto"/>
@@ -14536,7 +14562,7 @@
   </w:style>
   <w:style w:type="table" w:customStyle="1" w:styleId="GridTable6Colorful-Accent21">
     <w:name w:val="Grid Table 6 Colorful - Accent 21"/>
-    <w:basedOn w:val="NormaleTabelle"/>
+    <w:basedOn w:val="TableNormal"/>
     <w:uiPriority w:val="99"/>
     <w:pPr>
       <w:spacing w:after="0" w:line="240" w:lineRule="auto"/>
@@ -14610,7 +14636,7 @@
   </w:style>
   <w:style w:type="table" w:customStyle="1" w:styleId="GridTable6Colorful-Accent31">
     <w:name w:val="Grid Table 6 Colorful - Accent 31"/>
-    <w:basedOn w:val="NormaleTabelle"/>
+    <w:basedOn w:val="TableNormal"/>
     <w:uiPriority w:val="99"/>
     <w:pPr>
       <w:spacing w:after="0" w:line="240" w:lineRule="auto"/>
@@ -14684,7 +14710,7 @@
   </w:style>
   <w:style w:type="table" w:customStyle="1" w:styleId="GridTable6Colorful-Accent41">
     <w:name w:val="Grid Table 6 Colorful - Accent 41"/>
-    <w:basedOn w:val="NormaleTabelle"/>
+    <w:basedOn w:val="TableNormal"/>
     <w:uiPriority w:val="99"/>
     <w:pPr>
       <w:spacing w:after="0" w:line="240" w:lineRule="auto"/>
@@ -14758,7 +14784,7 @@
   </w:style>
   <w:style w:type="table" w:customStyle="1" w:styleId="GridTable6Colorful-Accent51">
     <w:name w:val="Grid Table 6 Colorful - Accent 51"/>
-    <w:basedOn w:val="NormaleTabelle"/>
+    <w:basedOn w:val="TableNormal"/>
     <w:uiPriority w:val="99"/>
     <w:pPr>
       <w:spacing w:after="0" w:line="240" w:lineRule="auto"/>
@@ -14832,7 +14858,7 @@
   </w:style>
   <w:style w:type="table" w:customStyle="1" w:styleId="GridTable6Colorful-Accent61">
     <w:name w:val="Grid Table 6 Colorful - Accent 61"/>
-    <w:basedOn w:val="NormaleTabelle"/>
+    <w:basedOn w:val="TableNormal"/>
     <w:uiPriority w:val="99"/>
     <w:pPr>
       <w:spacing w:after="0" w:line="240" w:lineRule="auto"/>
@@ -14904,9 +14930,9 @@
       </w:rPr>
     </w:tblStylePr>
   </w:style>
-  <w:style w:type="table" w:styleId="Gitternetztabelle7farbig">
+  <w:style w:type="table" w:styleId="GridTable7Colorful">
     <w:name w:val="Grid Table 7 Colorful"/>
-    <w:basedOn w:val="NormaleTabelle"/>
+    <w:basedOn w:val="TableNormal"/>
     <w:uiPriority w:val="99"/>
     <w:pPr>
       <w:spacing w:after="0" w:line="240" w:lineRule="auto"/>
@@ -15023,7 +15049,7 @@
   </w:style>
   <w:style w:type="table" w:customStyle="1" w:styleId="GridTable7Colorful-Accent11">
     <w:name w:val="Grid Table 7 Colorful - Accent 11"/>
-    <w:basedOn w:val="NormaleTabelle"/>
+    <w:basedOn w:val="TableNormal"/>
     <w:uiPriority w:val="99"/>
     <w:pPr>
       <w:spacing w:after="0" w:line="240" w:lineRule="auto"/>
@@ -15140,7 +15166,7 @@
   </w:style>
   <w:style w:type="table" w:customStyle="1" w:styleId="GridTable7Colorful-Accent21">
     <w:name w:val="Grid Table 7 Colorful - Accent 21"/>
-    <w:basedOn w:val="NormaleTabelle"/>
+    <w:basedOn w:val="TableNormal"/>
     <w:uiPriority w:val="99"/>
     <w:pPr>
       <w:spacing w:after="0" w:line="240" w:lineRule="auto"/>
@@ -15257,7 +15283,7 @@
   </w:style>
   <w:style w:type="table" w:customStyle="1" w:styleId="GridTable7Colorful-Accent31">
     <w:name w:val="Grid Table 7 Colorful - Accent 31"/>
-    <w:basedOn w:val="NormaleTabelle"/>
+    <w:basedOn w:val="TableNormal"/>
     <w:uiPriority w:val="99"/>
     <w:pPr>
       <w:spacing w:after="0" w:line="240" w:lineRule="auto"/>
@@ -15374,7 +15400,7 @@
   </w:style>
   <w:style w:type="table" w:customStyle="1" w:styleId="GridTable7Colorful-Accent41">
     <w:name w:val="Grid Table 7 Colorful - Accent 41"/>
-    <w:basedOn w:val="NormaleTabelle"/>
+    <w:basedOn w:val="TableNormal"/>
     <w:uiPriority w:val="99"/>
     <w:pPr>
       <w:spacing w:after="0" w:line="240" w:lineRule="auto"/>
@@ -15491,7 +15517,7 @@
   </w:style>
   <w:style w:type="table" w:customStyle="1" w:styleId="GridTable7Colorful-Accent51">
     <w:name w:val="Grid Table 7 Colorful - Accent 51"/>
-    <w:basedOn w:val="NormaleTabelle"/>
+    <w:basedOn w:val="TableNormal"/>
     <w:uiPriority w:val="99"/>
     <w:pPr>
       <w:spacing w:after="0" w:line="240" w:lineRule="auto"/>
@@ -15608,7 +15634,7 @@
   </w:style>
   <w:style w:type="table" w:customStyle="1" w:styleId="GridTable7Colorful-Accent61">
     <w:name w:val="Grid Table 7 Colorful - Accent 61"/>
-    <w:basedOn w:val="NormaleTabelle"/>
+    <w:basedOn w:val="TableNormal"/>
     <w:uiPriority w:val="99"/>
     <w:pPr>
       <w:spacing w:after="0" w:line="240" w:lineRule="auto"/>
@@ -15723,9 +15749,9 @@
       </w:rPr>
     </w:tblStylePr>
   </w:style>
-  <w:style w:type="table" w:styleId="Listentabelle1hell">
+  <w:style w:type="table" w:styleId="ListTable1Light">
     <w:name w:val="List Table 1 Light"/>
-    <w:basedOn w:val="NormaleTabelle"/>
+    <w:basedOn w:val="TableNormal"/>
     <w:uiPriority w:val="99"/>
     <w:pPr>
       <w:spacing w:after="0" w:line="240" w:lineRule="auto"/>
@@ -15791,7 +15817,7 @@
   </w:style>
   <w:style w:type="table" w:customStyle="1" w:styleId="ListTable1Light-Accent11">
     <w:name w:val="List Table 1 Light - Accent 11"/>
-    <w:basedOn w:val="NormaleTabelle"/>
+    <w:basedOn w:val="TableNormal"/>
     <w:uiPriority w:val="99"/>
     <w:pPr>
       <w:spacing w:after="0" w:line="240" w:lineRule="auto"/>
@@ -15857,7 +15883,7 @@
   </w:style>
   <w:style w:type="table" w:customStyle="1" w:styleId="ListTable1Light-Accent21">
     <w:name w:val="List Table 1 Light - Accent 21"/>
-    <w:basedOn w:val="NormaleTabelle"/>
+    <w:basedOn w:val="TableNormal"/>
     <w:uiPriority w:val="99"/>
     <w:pPr>
       <w:spacing w:after="0" w:line="240" w:lineRule="auto"/>
@@ -15923,7 +15949,7 @@
   </w:style>
   <w:style w:type="table" w:customStyle="1" w:styleId="ListTable1Light-Accent31">
     <w:name w:val="List Table 1 Light - Accent 31"/>
-    <w:basedOn w:val="NormaleTabelle"/>
+    <w:basedOn w:val="TableNormal"/>
     <w:uiPriority w:val="99"/>
     <w:pPr>
       <w:spacing w:after="0" w:line="240" w:lineRule="auto"/>
@@ -15989,7 +16015,7 @@
   </w:style>
   <w:style w:type="table" w:customStyle="1" w:styleId="ListTable1Light-Accent41">
     <w:name w:val="List Table 1 Light - Accent 41"/>
-    <w:basedOn w:val="NormaleTabelle"/>
+    <w:basedOn w:val="TableNormal"/>
     <w:uiPriority w:val="99"/>
     <w:pPr>
       <w:spacing w:after="0" w:line="240" w:lineRule="auto"/>
@@ -16055,7 +16081,7 @@
   </w:style>
   <w:style w:type="table" w:customStyle="1" w:styleId="ListTable1Light-Accent51">
     <w:name w:val="List Table 1 Light - Accent 51"/>
-    <w:basedOn w:val="NormaleTabelle"/>
+    <w:basedOn w:val="TableNormal"/>
     <w:uiPriority w:val="99"/>
     <w:pPr>
       <w:spacing w:after="0" w:line="240" w:lineRule="auto"/>
@@ -16121,7 +16147,7 @@
   </w:style>
   <w:style w:type="table" w:customStyle="1" w:styleId="ListTable1Light-Accent61">
     <w:name w:val="List Table 1 Light - Accent 61"/>
-    <w:basedOn w:val="NormaleTabelle"/>
+    <w:basedOn w:val="TableNormal"/>
     <w:uiPriority w:val="99"/>
     <w:pPr>
       <w:spacing w:after="0" w:line="240" w:lineRule="auto"/>
@@ -16185,9 +16211,9 @@
       </w:tcPr>
     </w:tblStylePr>
   </w:style>
-  <w:style w:type="table" w:styleId="Listentabelle2">
+  <w:style w:type="table" w:styleId="ListTable2">
     <w:name w:val="List Table 2"/>
-    <w:basedOn w:val="NormaleTabelle"/>
+    <w:basedOn w:val="TableNormal"/>
     <w:uiPriority w:val="99"/>
     <w:pPr>
       <w:spacing w:after="0" w:line="240" w:lineRule="auto"/>
@@ -16276,7 +16302,7 @@
   </w:style>
   <w:style w:type="table" w:customStyle="1" w:styleId="ListTable2-Accent11">
     <w:name w:val="List Table 2 - Accent 11"/>
-    <w:basedOn w:val="NormaleTabelle"/>
+    <w:basedOn w:val="TableNormal"/>
     <w:uiPriority w:val="99"/>
     <w:pPr>
       <w:spacing w:after="0" w:line="240" w:lineRule="auto"/>
@@ -16365,7 +16391,7 @@
   </w:style>
   <w:style w:type="table" w:customStyle="1" w:styleId="ListTable2-Accent21">
     <w:name w:val="List Table 2 - Accent 21"/>
-    <w:basedOn w:val="NormaleTabelle"/>
+    <w:basedOn w:val="TableNormal"/>
     <w:uiPriority w:val="99"/>
     <w:pPr>
       <w:spacing w:after="0" w:line="240" w:lineRule="auto"/>
@@ -16454,7 +16480,7 @@
   </w:style>
   <w:style w:type="table" w:customStyle="1" w:styleId="ListTable2-Accent31">
     <w:name w:val="List Table 2 - Accent 31"/>
-    <w:basedOn w:val="NormaleTabelle"/>
+    <w:basedOn w:val="TableNormal"/>
     <w:uiPriority w:val="99"/>
     <w:pPr>
       <w:spacing w:after="0" w:line="240" w:lineRule="auto"/>
@@ -16543,7 +16569,7 @@
   </w:style>
   <w:style w:type="table" w:customStyle="1" w:styleId="ListTable2-Accent41">
     <w:name w:val="List Table 2 - Accent 41"/>
-    <w:basedOn w:val="NormaleTabelle"/>
+    <w:basedOn w:val="TableNormal"/>
     <w:uiPriority w:val="99"/>
     <w:pPr>
       <w:spacing w:after="0" w:line="240" w:lineRule="auto"/>
@@ -16632,7 +16658,7 @@
   </w:style>
   <w:style w:type="table" w:customStyle="1" w:styleId="ListTable2-Accent51">
     <w:name w:val="List Table 2 - Accent 51"/>
-    <w:basedOn w:val="NormaleTabelle"/>
+    <w:basedOn w:val="TableNormal"/>
     <w:uiPriority w:val="99"/>
     <w:pPr>
       <w:spacing w:after="0" w:line="240" w:lineRule="auto"/>
@@ -16721,7 +16747,7 @@
   </w:style>
   <w:style w:type="table" w:customStyle="1" w:styleId="ListTable2-Accent61">
     <w:name w:val="List Table 2 - Accent 61"/>
-    <w:basedOn w:val="NormaleTabelle"/>
+    <w:basedOn w:val="TableNormal"/>
     <w:uiPriority w:val="99"/>
     <w:pPr>
       <w:spacing w:after="0" w:line="240" w:lineRule="auto"/>
@@ -16808,9 +16834,9 @@
       </w:tcPr>
     </w:tblStylePr>
   </w:style>
-  <w:style w:type="table" w:styleId="Listentabelle3">
+  <w:style w:type="table" w:styleId="ListTable3">
     <w:name w:val="List Table 3"/>
-    <w:basedOn w:val="NormaleTabelle"/>
+    <w:basedOn w:val="TableNormal"/>
     <w:uiPriority w:val="99"/>
     <w:pPr>
       <w:spacing w:after="0" w:line="240" w:lineRule="auto"/>
@@ -16886,7 +16912,7 @@
   </w:style>
   <w:style w:type="table" w:customStyle="1" w:styleId="ListTable3-Accent11">
     <w:name w:val="List Table 3 - Accent 11"/>
-    <w:basedOn w:val="NormaleTabelle"/>
+    <w:basedOn w:val="TableNormal"/>
     <w:uiPriority w:val="99"/>
     <w:pPr>
       <w:spacing w:after="0" w:line="240" w:lineRule="auto"/>
@@ -16962,7 +16988,7 @@
   </w:style>
   <w:style w:type="table" w:customStyle="1" w:styleId="ListTable3-Accent21">
     <w:name w:val="List Table 3 - Accent 21"/>
-    <w:basedOn w:val="NormaleTabelle"/>
+    <w:basedOn w:val="TableNormal"/>
     <w:uiPriority w:val="99"/>
     <w:pPr>
       <w:spacing w:after="0" w:line="240" w:lineRule="auto"/>
@@ -17038,7 +17064,7 @@
   </w:style>
   <w:style w:type="table" w:customStyle="1" w:styleId="ListTable3-Accent31">
     <w:name w:val="List Table 3 - Accent 31"/>
-    <w:basedOn w:val="NormaleTabelle"/>
+    <w:basedOn w:val="TableNormal"/>
     <w:uiPriority w:val="99"/>
     <w:pPr>
       <w:spacing w:after="0" w:line="240" w:lineRule="auto"/>
@@ -17114,7 +17140,7 @@
   </w:style>
   <w:style w:type="table" w:customStyle="1" w:styleId="ListTable3-Accent41">
     <w:name w:val="List Table 3 - Accent 41"/>
-    <w:basedOn w:val="NormaleTabelle"/>
+    <w:basedOn w:val="TableNormal"/>
     <w:uiPriority w:val="99"/>
     <w:pPr>
       <w:spacing w:after="0" w:line="240" w:lineRule="auto"/>
@@ -17190,7 +17216,7 @@
   </w:style>
   <w:style w:type="table" w:customStyle="1" w:styleId="ListTable3-Accent51">
     <w:name w:val="List Table 3 - Accent 51"/>
-    <w:basedOn w:val="NormaleTabelle"/>
+    <w:basedOn w:val="TableNormal"/>
     <w:uiPriority w:val="99"/>
     <w:pPr>
       <w:spacing w:after="0" w:line="240" w:lineRule="auto"/>
@@ -17266,7 +17292,7 @@
   </w:style>
   <w:style w:type="table" w:customStyle="1" w:styleId="ListTable3-Accent61">
     <w:name w:val="List Table 3 - Accent 61"/>
-    <w:basedOn w:val="NormaleTabelle"/>
+    <w:basedOn w:val="TableNormal"/>
     <w:uiPriority w:val="99"/>
     <w:pPr>
       <w:spacing w:after="0" w:line="240" w:lineRule="auto"/>
@@ -17340,9 +17366,9 @@
       </w:tcPr>
     </w:tblStylePr>
   </w:style>
-  <w:style w:type="table" w:styleId="Listentabelle4">
+  <w:style w:type="table" w:styleId="ListTable4">
     <w:name w:val="List Table 4"/>
-    <w:basedOn w:val="NormaleTabelle"/>
+    <w:basedOn w:val="TableNormal"/>
     <w:uiPriority w:val="99"/>
     <w:pPr>
       <w:spacing w:after="0" w:line="240" w:lineRule="auto"/>
@@ -17413,7 +17439,7 @@
   </w:style>
   <w:style w:type="table" w:customStyle="1" w:styleId="ListTable4-Accent11">
     <w:name w:val="List Table 4 - Accent 11"/>
-    <w:basedOn w:val="NormaleTabelle"/>
+    <w:basedOn w:val="TableNormal"/>
     <w:uiPriority w:val="99"/>
     <w:pPr>
       <w:spacing w:after="0" w:line="240" w:lineRule="auto"/>
@@ -17484,7 +17510,7 @@
   </w:style>
   <w:style w:type="table" w:customStyle="1" w:styleId="ListTable4-Accent21">
     <w:name w:val="List Table 4 - Accent 21"/>
-    <w:basedOn w:val="NormaleTabelle"/>
+    <w:basedOn w:val="TableNormal"/>
     <w:uiPriority w:val="99"/>
     <w:pPr>
       <w:spacing w:after="0" w:line="240" w:lineRule="auto"/>
@@ -17555,7 +17581,7 @@
   </w:style>
   <w:style w:type="table" w:customStyle="1" w:styleId="ListTable4-Accent31">
     <w:name w:val="List Table 4 - Accent 31"/>
-    <w:basedOn w:val="NormaleTabelle"/>
+    <w:basedOn w:val="TableNormal"/>
     <w:uiPriority w:val="99"/>
     <w:pPr>
       <w:spacing w:after="0" w:line="240" w:lineRule="auto"/>
@@ -17626,7 +17652,7 @@
   </w:style>
   <w:style w:type="table" w:customStyle="1" w:styleId="ListTable4-Accent41">
     <w:name w:val="List Table 4 - Accent 41"/>
-    <w:basedOn w:val="NormaleTabelle"/>
+    <w:basedOn w:val="TableNormal"/>
     <w:uiPriority w:val="99"/>
     <w:pPr>
       <w:spacing w:after="0" w:line="240" w:lineRule="auto"/>
@@ -17697,7 +17723,7 @@
   </w:style>
   <w:style w:type="table" w:customStyle="1" w:styleId="ListTable4-Accent51">
     <w:name w:val="List Table 4 - Accent 51"/>
-    <w:basedOn w:val="NormaleTabelle"/>
+    <w:basedOn w:val="TableNormal"/>
     <w:uiPriority w:val="99"/>
     <w:pPr>
       <w:spacing w:after="0" w:line="240" w:lineRule="auto"/>
@@ -17768,7 +17794,7 @@
   </w:style>
   <w:style w:type="table" w:customStyle="1" w:styleId="ListTable4-Accent61">
     <w:name w:val="List Table 4 - Accent 61"/>
-    <w:basedOn w:val="NormaleTabelle"/>
+    <w:basedOn w:val="TableNormal"/>
     <w:uiPriority w:val="99"/>
     <w:pPr>
       <w:spacing w:after="0" w:line="240" w:lineRule="auto"/>
@@ -17837,9 +17863,9 @@
       </w:tcPr>
     </w:tblStylePr>
   </w:style>
-  <w:style w:type="table" w:styleId="Listentabelle5dunkel">
+  <w:style w:type="table" w:styleId="ListTable5Dark">
     <w:name w:val="List Table 5 Dark"/>
-    <w:basedOn w:val="NormaleTabelle"/>
+    <w:basedOn w:val="TableNormal"/>
     <w:uiPriority w:val="99"/>
     <w:pPr>
       <w:spacing w:after="0" w:line="240" w:lineRule="auto"/>
@@ -17945,7 +17971,7 @@
   </w:style>
   <w:style w:type="table" w:customStyle="1" w:styleId="ListTable5Dark-Accent11">
     <w:name w:val="List Table 5 Dark - Accent 11"/>
-    <w:basedOn w:val="NormaleTabelle"/>
+    <w:basedOn w:val="TableNormal"/>
     <w:uiPriority w:val="99"/>
     <w:pPr>
       <w:spacing w:after="0" w:line="240" w:lineRule="auto"/>
@@ -18051,7 +18077,7 @@
   </w:style>
   <w:style w:type="table" w:customStyle="1" w:styleId="ListTable5Dark-Accent21">
     <w:name w:val="List Table 5 Dark - Accent 21"/>
-    <w:basedOn w:val="NormaleTabelle"/>
+    <w:basedOn w:val="TableNormal"/>
     <w:uiPriority w:val="99"/>
     <w:pPr>
       <w:spacing w:after="0" w:line="240" w:lineRule="auto"/>
@@ -18157,7 +18183,7 @@
   </w:style>
   <w:style w:type="table" w:customStyle="1" w:styleId="ListTable5Dark-Accent31">
     <w:name w:val="List Table 5 Dark - Accent 31"/>
-    <w:basedOn w:val="NormaleTabelle"/>
+    <w:basedOn w:val="TableNormal"/>
     <w:uiPriority w:val="99"/>
     <w:pPr>
       <w:spacing w:after="0" w:line="240" w:lineRule="auto"/>
@@ -18263,7 +18289,7 @@
   </w:style>
   <w:style w:type="table" w:customStyle="1" w:styleId="ListTable5Dark-Accent41">
     <w:name w:val="List Table 5 Dark - Accent 41"/>
-    <w:basedOn w:val="NormaleTabelle"/>
+    <w:basedOn w:val="TableNormal"/>
     <w:uiPriority w:val="99"/>
     <w:pPr>
       <w:spacing w:after="0" w:line="240" w:lineRule="auto"/>
@@ -18369,7 +18395,7 @@
   </w:style>
   <w:style w:type="table" w:customStyle="1" w:styleId="ListTable5Dark-Accent51">
     <w:name w:val="List Table 5 Dark - Accent 51"/>
-    <w:basedOn w:val="NormaleTabelle"/>
+    <w:basedOn w:val="TableNormal"/>
     <w:uiPriority w:val="99"/>
     <w:pPr>
       <w:spacing w:after="0" w:line="240" w:lineRule="auto"/>
@@ -18475,7 +18501,7 @@
   </w:style>
   <w:style w:type="table" w:customStyle="1" w:styleId="ListTable5Dark-Accent61">
     <w:name w:val="List Table 5 Dark - Accent 61"/>
-    <w:basedOn w:val="NormaleTabelle"/>
+    <w:basedOn w:val="TableNormal"/>
     <w:uiPriority w:val="99"/>
     <w:pPr>
       <w:spacing w:after="0" w:line="240" w:lineRule="auto"/>
@@ -18579,9 +18605,9 @@
       </w:tcPr>
     </w:tblStylePr>
   </w:style>
-  <w:style w:type="table" w:styleId="Listentabelle6farbig">
+  <w:style w:type="table" w:styleId="ListTable6Colorful">
     <w:name w:val="List Table 6 Colorful"/>
-    <w:basedOn w:val="NormaleTabelle"/>
+    <w:basedOn w:val="TableNormal"/>
     <w:uiPriority w:val="99"/>
     <w:pPr>
       <w:spacing w:after="0" w:line="240" w:lineRule="auto"/>
@@ -18657,7 +18683,7 @@
   </w:style>
   <w:style w:type="table" w:customStyle="1" w:styleId="ListTable6Colorful-Accent11">
     <w:name w:val="List Table 6 Colorful - Accent 11"/>
-    <w:basedOn w:val="NormaleTabelle"/>
+    <w:basedOn w:val="TableNormal"/>
     <w:uiPriority w:val="99"/>
     <w:pPr>
       <w:spacing w:after="0" w:line="240" w:lineRule="auto"/>
@@ -18733,7 +18759,7 @@
   </w:style>
   <w:style w:type="table" w:customStyle="1" w:styleId="ListTable6Colorful-Accent21">
     <w:name w:val="List Table 6 Colorful - Accent 21"/>
-    <w:basedOn w:val="NormaleTabelle"/>
+    <w:basedOn w:val="TableNormal"/>
     <w:uiPriority w:val="99"/>
     <w:pPr>
       <w:spacing w:after="0" w:line="240" w:lineRule="auto"/>
@@ -18809,7 +18835,7 @@
   </w:style>
   <w:style w:type="table" w:customStyle="1" w:styleId="ListTable6Colorful-Accent31">
     <w:name w:val="List Table 6 Colorful - Accent 31"/>
-    <w:basedOn w:val="NormaleTabelle"/>
+    <w:basedOn w:val="TableNormal"/>
     <w:uiPriority w:val="99"/>
     <w:pPr>
       <w:spacing w:after="0" w:line="240" w:lineRule="auto"/>
@@ -18885,7 +18911,7 @@
   </w:style>
   <w:style w:type="table" w:customStyle="1" w:styleId="ListTable6Colorful-Accent41">
     <w:name w:val="List Table 6 Colorful - Accent 41"/>
-    <w:basedOn w:val="NormaleTabelle"/>
+    <w:basedOn w:val="TableNormal"/>
     <w:uiPriority w:val="99"/>
     <w:pPr>
       <w:spacing w:after="0" w:line="240" w:lineRule="auto"/>
@@ -18961,7 +18987,7 @@
   </w:style>
   <w:style w:type="table" w:customStyle="1" w:styleId="ListTable6Colorful-Accent51">
     <w:name w:val="List Table 6 Colorful - Accent 51"/>
-    <w:basedOn w:val="NormaleTabelle"/>
+    <w:basedOn w:val="TableNormal"/>
     <w:uiPriority w:val="99"/>
     <w:pPr>
       <w:spacing w:after="0" w:line="240" w:lineRule="auto"/>
@@ -19037,7 +19063,7 @@
   </w:style>
   <w:style w:type="table" w:customStyle="1" w:styleId="ListTable6Colorful-Accent61">
     <w:name w:val="List Table 6 Colorful - Accent 61"/>
-    <w:basedOn w:val="NormaleTabelle"/>
+    <w:basedOn w:val="TableNormal"/>
     <w:uiPriority w:val="99"/>
     <w:pPr>
       <w:spacing w:after="0" w:line="240" w:lineRule="auto"/>
@@ -19111,9 +19137,9 @@
       </w:rPr>
     </w:tblStylePr>
   </w:style>
-  <w:style w:type="table" w:styleId="Listentabelle7farbig">
+  <w:style w:type="table" w:styleId="ListTable7Colorful">
     <w:name w:val="List Table 7 Colorful"/>
-    <w:basedOn w:val="NormaleTabelle"/>
+    <w:basedOn w:val="TableNormal"/>
     <w:uiPriority w:val="99"/>
     <w:pPr>
       <w:spacing w:after="0" w:line="240" w:lineRule="auto"/>
@@ -19227,7 +19253,7 @@
   </w:style>
   <w:style w:type="table" w:customStyle="1" w:styleId="ListTable7Colorful-Accent11">
     <w:name w:val="List Table 7 Colorful - Accent 11"/>
-    <w:basedOn w:val="NormaleTabelle"/>
+    <w:basedOn w:val="TableNormal"/>
     <w:uiPriority w:val="99"/>
     <w:pPr>
       <w:spacing w:after="0" w:line="240" w:lineRule="auto"/>
@@ -19341,7 +19367,7 @@
   </w:style>
   <w:style w:type="table" w:customStyle="1" w:styleId="ListTable7Colorful-Accent21">
     <w:name w:val="List Table 7 Colorful - Accent 21"/>
-    <w:basedOn w:val="NormaleTabelle"/>
+    <w:basedOn w:val="TableNormal"/>
     <w:uiPriority w:val="99"/>
     <w:pPr>
       <w:spacing w:after="0" w:line="240" w:lineRule="auto"/>
@@ -19455,7 +19481,7 @@
   </w:style>
   <w:style w:type="table" w:customStyle="1" w:styleId="ListTable7Colorful-Accent31">
     <w:name w:val="List Table 7 Colorful - Accent 31"/>
-    <w:basedOn w:val="NormaleTabelle"/>
+    <w:basedOn w:val="TableNormal"/>
     <w:uiPriority w:val="99"/>
     <w:pPr>
       <w:spacing w:after="0" w:line="240" w:lineRule="auto"/>
@@ -19569,7 +19595,7 @@
   </w:style>
   <w:style w:type="table" w:customStyle="1" w:styleId="ListTable7Colorful-Accent41">
     <w:name w:val="List Table 7 Colorful - Accent 41"/>
-    <w:basedOn w:val="NormaleTabelle"/>
+    <w:basedOn w:val="TableNormal"/>
     <w:uiPriority w:val="99"/>
     <w:pPr>
       <w:spacing w:after="0" w:line="240" w:lineRule="auto"/>
@@ -19683,7 +19709,7 @@
   </w:style>
   <w:style w:type="table" w:customStyle="1" w:styleId="ListTable7Colorful-Accent51">
     <w:name w:val="List Table 7 Colorful - Accent 51"/>
-    <w:basedOn w:val="NormaleTabelle"/>
+    <w:basedOn w:val="TableNormal"/>
     <w:uiPriority w:val="99"/>
     <w:pPr>
       <w:spacing w:after="0" w:line="240" w:lineRule="auto"/>
@@ -19797,7 +19823,7 @@
   </w:style>
   <w:style w:type="table" w:customStyle="1" w:styleId="ListTable7Colorful-Accent61">
     <w:name w:val="List Table 7 Colorful - Accent 61"/>
-    <w:basedOn w:val="NormaleTabelle"/>
+    <w:basedOn w:val="TableNormal"/>
     <w:uiPriority w:val="99"/>
     <w:pPr>
       <w:spacing w:after="0" w:line="240" w:lineRule="auto"/>
@@ -19911,7 +19937,7 @@
   </w:style>
   <w:style w:type="table" w:customStyle="1" w:styleId="Lined-Accent">
     <w:name w:val="Lined - Accent"/>
-    <w:basedOn w:val="NormaleTabelle"/>
+    <w:basedOn w:val="TableNormal"/>
     <w:uiPriority w:val="99"/>
     <w:pPr>
       <w:spacing w:after="0" w:line="240" w:lineRule="auto"/>
@@ -20009,7 +20035,7 @@
   </w:style>
   <w:style w:type="table" w:customStyle="1" w:styleId="Lined-Accent1">
     <w:name w:val="Lined - Accent 1"/>
-    <w:basedOn w:val="NormaleTabelle"/>
+    <w:basedOn w:val="TableNormal"/>
     <w:uiPriority w:val="99"/>
     <w:pPr>
       <w:spacing w:after="0" w:line="240" w:lineRule="auto"/>
@@ -20107,7 +20133,7 @@
   </w:style>
   <w:style w:type="table" w:customStyle="1" w:styleId="Lined-Accent2">
     <w:name w:val="Lined - Accent 2"/>
-    <w:basedOn w:val="NormaleTabelle"/>
+    <w:basedOn w:val="TableNormal"/>
     <w:uiPriority w:val="99"/>
     <w:pPr>
       <w:spacing w:after="0" w:line="240" w:lineRule="auto"/>
@@ -20205,7 +20231,7 @@
   </w:style>
   <w:style w:type="table" w:customStyle="1" w:styleId="Lined-Accent3">
     <w:name w:val="Lined - Accent 3"/>
-    <w:basedOn w:val="NormaleTabelle"/>
+    <w:basedOn w:val="TableNormal"/>
     <w:uiPriority w:val="99"/>
     <w:pPr>
       <w:spacing w:after="0" w:line="240" w:lineRule="auto"/>
@@ -20303,7 +20329,7 @@
   </w:style>
   <w:style w:type="table" w:customStyle="1" w:styleId="Lined-Accent4">
     <w:name w:val="Lined - Accent 4"/>
-    <w:basedOn w:val="NormaleTabelle"/>
+    <w:basedOn w:val="TableNormal"/>
     <w:uiPriority w:val="99"/>
     <w:pPr>
       <w:spacing w:after="0" w:line="240" w:lineRule="auto"/>
@@ -20401,7 +20427,7 @@
   </w:style>
   <w:style w:type="table" w:customStyle="1" w:styleId="Lined-Accent5">
     <w:name w:val="Lined - Accent 5"/>
-    <w:basedOn w:val="NormaleTabelle"/>
+    <w:basedOn w:val="TableNormal"/>
     <w:uiPriority w:val="99"/>
     <w:pPr>
       <w:spacing w:after="0" w:line="240" w:lineRule="auto"/>
@@ -20499,7 +20525,7 @@
   </w:style>
   <w:style w:type="table" w:customStyle="1" w:styleId="Lined-Accent6">
     <w:name w:val="Lined - Accent 6"/>
-    <w:basedOn w:val="NormaleTabelle"/>
+    <w:basedOn w:val="TableNormal"/>
     <w:uiPriority w:val="99"/>
     <w:pPr>
       <w:spacing w:after="0" w:line="240" w:lineRule="auto"/>
@@ -20597,7 +20623,7 @@
   </w:style>
   <w:style w:type="table" w:customStyle="1" w:styleId="BorderedLined-Accent">
     <w:name w:val="Bordered &amp; Lined - Accent"/>
-    <w:basedOn w:val="NormaleTabelle"/>
+    <w:basedOn w:val="TableNormal"/>
     <w:uiPriority w:val="99"/>
     <w:pPr>
       <w:spacing w:after="0" w:line="240" w:lineRule="auto"/>
@@ -20703,7 +20729,7 @@
   </w:style>
   <w:style w:type="table" w:customStyle="1" w:styleId="BorderedLined-Accent1">
     <w:name w:val="Bordered &amp; Lined - Accent 1"/>
-    <w:basedOn w:val="NormaleTabelle"/>
+    <w:basedOn w:val="TableNormal"/>
     <w:uiPriority w:val="99"/>
     <w:pPr>
       <w:spacing w:after="0" w:line="240" w:lineRule="auto"/>
@@ -20809,7 +20835,7 @@
   </w:style>
   <w:style w:type="table" w:customStyle="1" w:styleId="BorderedLined-Accent2">
     <w:name w:val="Bordered &amp; Lined - Accent 2"/>
-    <w:basedOn w:val="NormaleTabelle"/>
+    <w:basedOn w:val="TableNormal"/>
     <w:uiPriority w:val="99"/>
     <w:pPr>
       <w:spacing w:after="0" w:line="240" w:lineRule="auto"/>
@@ -20915,7 +20941,7 @@
   </w:style>
   <w:style w:type="table" w:customStyle="1" w:styleId="BorderedLined-Accent3">
     <w:name w:val="Bordered &amp; Lined - Accent 3"/>
-    <w:basedOn w:val="NormaleTabelle"/>
+    <w:basedOn w:val="TableNormal"/>
     <w:uiPriority w:val="99"/>
     <w:pPr>
       <w:spacing w:after="0" w:line="240" w:lineRule="auto"/>
@@ -21021,7 +21047,7 @@
   </w:style>
   <w:style w:type="table" w:customStyle="1" w:styleId="BorderedLined-Accent4">
     <w:name w:val="Bordered &amp; Lined - Accent 4"/>
-    <w:basedOn w:val="NormaleTabelle"/>
+    <w:basedOn w:val="TableNormal"/>
     <w:uiPriority w:val="99"/>
     <w:pPr>
       <w:spacing w:after="0" w:line="240" w:lineRule="auto"/>
@@ -21127,7 +21153,7 @@
   </w:style>
   <w:style w:type="table" w:customStyle="1" w:styleId="BorderedLined-Accent5">
     <w:name w:val="Bordered &amp; Lined - Accent 5"/>
-    <w:basedOn w:val="NormaleTabelle"/>
+    <w:basedOn w:val="TableNormal"/>
     <w:uiPriority w:val="99"/>
     <w:pPr>
       <w:spacing w:after="0" w:line="240" w:lineRule="auto"/>
@@ -21233,7 +21259,7 @@
   </w:style>
   <w:style w:type="table" w:customStyle="1" w:styleId="BorderedLined-Accent6">
     <w:name w:val="Bordered &amp; Lined - Accent 6"/>
-    <w:basedOn w:val="NormaleTabelle"/>
+    <w:basedOn w:val="TableNormal"/>
     <w:uiPriority w:val="99"/>
     <w:pPr>
       <w:spacing w:after="0" w:line="240" w:lineRule="auto"/>
@@ -21339,7 +21365,7 @@
   </w:style>
   <w:style w:type="table" w:customStyle="1" w:styleId="Bordered">
     <w:name w:val="Bordered"/>
-    <w:basedOn w:val="NormaleTabelle"/>
+    <w:basedOn w:val="TableNormal"/>
     <w:uiPriority w:val="99"/>
     <w:pPr>
       <w:spacing w:after="0" w:line="240" w:lineRule="auto"/>
@@ -21421,7 +21447,7 @@
   </w:style>
   <w:style w:type="table" w:customStyle="1" w:styleId="Bordered-Accent1">
     <w:name w:val="Bordered - Accent 1"/>
-    <w:basedOn w:val="NormaleTabelle"/>
+    <w:basedOn w:val="TableNormal"/>
     <w:uiPriority w:val="99"/>
     <w:pPr>
       <w:spacing w:after="0" w:line="240" w:lineRule="auto"/>
@@ -21503,7 +21529,7 @@
   </w:style>
   <w:style w:type="table" w:customStyle="1" w:styleId="Bordered-Accent2">
     <w:name w:val="Bordered - Accent 2"/>
-    <w:basedOn w:val="NormaleTabelle"/>
+    <w:basedOn w:val="TableNormal"/>
     <w:uiPriority w:val="99"/>
     <w:pPr>
       <w:spacing w:after="0" w:line="240" w:lineRule="auto"/>
@@ -21585,7 +21611,7 @@
   </w:style>
   <w:style w:type="table" w:customStyle="1" w:styleId="Bordered-Accent3">
     <w:name w:val="Bordered - Accent 3"/>
-    <w:basedOn w:val="NormaleTabelle"/>
+    <w:basedOn w:val="TableNormal"/>
     <w:uiPriority w:val="99"/>
     <w:pPr>
       <w:spacing w:after="0" w:line="240" w:lineRule="auto"/>
@@ -21667,7 +21693,7 @@
   </w:style>
   <w:style w:type="table" w:customStyle="1" w:styleId="Bordered-Accent4">
     <w:name w:val="Bordered - Accent 4"/>
-    <w:basedOn w:val="NormaleTabelle"/>
+    <w:basedOn w:val="TableNormal"/>
     <w:uiPriority w:val="99"/>
     <w:pPr>
       <w:spacing w:after="0" w:line="240" w:lineRule="auto"/>
@@ -21749,7 +21775,7 @@
   </w:style>
   <w:style w:type="table" w:customStyle="1" w:styleId="Bordered-Accent5">
     <w:name w:val="Bordered - Accent 5"/>
-    <w:basedOn w:val="NormaleTabelle"/>
+    <w:basedOn w:val="TableNormal"/>
     <w:uiPriority w:val="99"/>
     <w:pPr>
       <w:spacing w:after="0" w:line="240" w:lineRule="auto"/>
@@ -21831,7 +21857,7 @@
   </w:style>
   <w:style w:type="table" w:customStyle="1" w:styleId="Bordered-Accent6">
     <w:name w:val="Bordered - Accent 6"/>
-    <w:basedOn w:val="NormaleTabelle"/>
+    <w:basedOn w:val="TableNormal"/>
     <w:uiPriority w:val="99"/>
     <w:pPr>
       <w:spacing w:after="0" w:line="240" w:lineRule="auto"/>
@@ -21918,10 +21944,10 @@
       <w:sz w:val="18"/>
     </w:rPr>
   </w:style>
-  <w:style w:type="paragraph" w:styleId="Endnotentext">
+  <w:style w:type="paragraph" w:styleId="EndnoteText">
     <w:name w:val="endnote text"/>
-    <w:basedOn w:val="Standard"/>
-    <w:link w:val="EndnotentextZchn"/>
+    <w:basedOn w:val="Normal"/>
+    <w:link w:val="EndnoteTextChar"/>
     <w:uiPriority w:val="99"/>
     <w:semiHidden/>
     <w:unhideWhenUsed/>
@@ -21932,17 +21958,17 @@
       <w:sz w:val="20"/>
     </w:rPr>
   </w:style>
-  <w:style w:type="character" w:customStyle="1" w:styleId="EndnotentextZchn">
-    <w:name w:val="Endnotentext Zchn"/>
-    <w:link w:val="Endnotentext"/>
+  <w:style w:type="character" w:customStyle="1" w:styleId="EndnoteTextChar">
+    <w:name w:val="Endnote Text Char"/>
+    <w:link w:val="EndnoteText"/>
     <w:uiPriority w:val="99"/>
     <w:rPr>
       <w:sz w:val="20"/>
     </w:rPr>
   </w:style>
-  <w:style w:type="character" w:styleId="Endnotenzeichen">
+  <w:style w:type="character" w:styleId="EndnoteReference">
     <w:name w:val="endnote reference"/>
-    <w:basedOn w:val="Absatz-Standardschriftart"/>
+    <w:basedOn w:val="DefaultParagraphFont"/>
     <w:uiPriority w:val="99"/>
     <w:semiHidden/>
     <w:unhideWhenUsed/>
@@ -21950,20 +21976,20 @@
       <w:vertAlign w:val="superscript"/>
     </w:rPr>
   </w:style>
-  <w:style w:type="paragraph" w:styleId="Verzeichnis1">
+  <w:style w:type="paragraph" w:styleId="TOC1">
     <w:name w:val="toc 1"/>
-    <w:basedOn w:val="Standard"/>
-    <w:next w:val="Standard"/>
+    <w:basedOn w:val="Normal"/>
+    <w:next w:val="Normal"/>
     <w:uiPriority w:val="39"/>
     <w:unhideWhenUsed/>
     <w:pPr>
       <w:spacing w:after="57"/>
     </w:pPr>
   </w:style>
-  <w:style w:type="paragraph" w:styleId="Verzeichnis2">
+  <w:style w:type="paragraph" w:styleId="TOC2">
     <w:name w:val="toc 2"/>
-    <w:basedOn w:val="Standard"/>
-    <w:next w:val="Standard"/>
+    <w:basedOn w:val="Normal"/>
+    <w:next w:val="Normal"/>
     <w:uiPriority w:val="39"/>
     <w:unhideWhenUsed/>
     <w:pPr>
@@ -21971,10 +21997,10 @@
       <w:ind w:left="283"/>
     </w:pPr>
   </w:style>
-  <w:style w:type="paragraph" w:styleId="Verzeichnis3">
+  <w:style w:type="paragraph" w:styleId="TOC3">
     <w:name w:val="toc 3"/>
-    <w:basedOn w:val="Standard"/>
-    <w:next w:val="Standard"/>
+    <w:basedOn w:val="Normal"/>
+    <w:next w:val="Normal"/>
     <w:uiPriority w:val="39"/>
     <w:unhideWhenUsed/>
     <w:pPr>
@@ -21982,10 +22008,10 @@
       <w:ind w:left="567"/>
     </w:pPr>
   </w:style>
-  <w:style w:type="paragraph" w:styleId="Verzeichnis4">
+  <w:style w:type="paragraph" w:styleId="TOC4">
     <w:name w:val="toc 4"/>
-    <w:basedOn w:val="Standard"/>
-    <w:next w:val="Standard"/>
+    <w:basedOn w:val="Normal"/>
+    <w:next w:val="Normal"/>
     <w:uiPriority w:val="39"/>
     <w:unhideWhenUsed/>
     <w:pPr>
@@ -21993,10 +22019,10 @@
       <w:ind w:left="850"/>
     </w:pPr>
   </w:style>
-  <w:style w:type="paragraph" w:styleId="Verzeichnis5">
+  <w:style w:type="paragraph" w:styleId="TOC5">
     <w:name w:val="toc 5"/>
-    <w:basedOn w:val="Standard"/>
-    <w:next w:val="Standard"/>
+    <w:basedOn w:val="Normal"/>
+    <w:next w:val="Normal"/>
     <w:uiPriority w:val="39"/>
     <w:unhideWhenUsed/>
     <w:pPr>
@@ -22004,10 +22030,10 @@
       <w:ind w:left="1134"/>
     </w:pPr>
   </w:style>
-  <w:style w:type="paragraph" w:styleId="Verzeichnis6">
+  <w:style w:type="paragraph" w:styleId="TOC6">
     <w:name w:val="toc 6"/>
-    <w:basedOn w:val="Standard"/>
-    <w:next w:val="Standard"/>
+    <w:basedOn w:val="Normal"/>
+    <w:next w:val="Normal"/>
     <w:uiPriority w:val="39"/>
     <w:unhideWhenUsed/>
     <w:pPr>
@@ -22015,10 +22041,10 @@
       <w:ind w:left="1417"/>
     </w:pPr>
   </w:style>
-  <w:style w:type="paragraph" w:styleId="Verzeichnis7">
+  <w:style w:type="paragraph" w:styleId="TOC7">
     <w:name w:val="toc 7"/>
-    <w:basedOn w:val="Standard"/>
-    <w:next w:val="Standard"/>
+    <w:basedOn w:val="Normal"/>
+    <w:next w:val="Normal"/>
     <w:uiPriority w:val="39"/>
     <w:unhideWhenUsed/>
     <w:pPr>
@@ -22026,10 +22052,10 @@
       <w:ind w:left="1701"/>
     </w:pPr>
   </w:style>
-  <w:style w:type="paragraph" w:styleId="Verzeichnis8">
+  <w:style w:type="paragraph" w:styleId="TOC8">
     <w:name w:val="toc 8"/>
-    <w:basedOn w:val="Standard"/>
-    <w:next w:val="Standard"/>
+    <w:basedOn w:val="Normal"/>
+    <w:next w:val="Normal"/>
     <w:uiPriority w:val="39"/>
     <w:unhideWhenUsed/>
     <w:pPr>
@@ -22037,10 +22063,10 @@
       <w:ind w:left="1984"/>
     </w:pPr>
   </w:style>
-  <w:style w:type="paragraph" w:styleId="Verzeichnis9">
+  <w:style w:type="paragraph" w:styleId="TOC9">
     <w:name w:val="toc 9"/>
-    <w:basedOn w:val="Standard"/>
-    <w:next w:val="Standard"/>
+    <w:basedOn w:val="Normal"/>
+    <w:next w:val="Normal"/>
     <w:uiPriority w:val="39"/>
     <w:unhideWhenUsed/>
     <w:pPr>
@@ -22048,15 +22074,15 @@
       <w:ind w:left="2268"/>
     </w:pPr>
   </w:style>
-  <w:style w:type="paragraph" w:styleId="Inhaltsverzeichnisberschrift">
+  <w:style w:type="paragraph" w:styleId="TOCHeading">
     <w:name w:val="TOC Heading"/>
     <w:uiPriority w:val="39"/>
     <w:unhideWhenUsed/>
   </w:style>
-  <w:style w:type="paragraph" w:styleId="Abbildungsverzeichnis">
+  <w:style w:type="paragraph" w:styleId="TableofFigures">
     <w:name w:val="table of figures"/>
-    <w:basedOn w:val="Standard"/>
-    <w:next w:val="Standard"/>
+    <w:basedOn w:val="Normal"/>
+    <w:next w:val="Normal"/>
     <w:uiPriority w:val="99"/>
     <w:unhideWhenUsed/>
     <w:pPr>
@@ -22065,7 +22091,7 @@
   </w:style>
   <w:style w:type="character" w:styleId="Hyperlink">
     <w:name w:val="Hyperlink"/>
-    <w:basedOn w:val="Absatz-Standardschriftart"/>
+    <w:basedOn w:val="DefaultParagraphFont"/>
     <w:uiPriority w:val="99"/>
     <w:unhideWhenUsed/>
     <w:rPr>
@@ -22073,9 +22099,9 @@
       <w:u w:val="single"/>
     </w:rPr>
   </w:style>
-  <w:style w:type="paragraph" w:styleId="Listenabsatz">
+  <w:style w:type="paragraph" w:styleId="ListParagraph">
     <w:name w:val="List Paragraph"/>
-    <w:basedOn w:val="Standard"/>
+    <w:basedOn w:val="Normal"/>
     <w:uiPriority w:val="34"/>
     <w:qFormat/>
     <w:pPr>
@@ -22083,9 +22109,9 @@
       <w:contextualSpacing/>
     </w:pPr>
   </w:style>
-  <w:style w:type="table" w:styleId="Tabellenraster">
+  <w:style w:type="table" w:styleId="TableGrid">
     <w:name w:val="Table Grid"/>
-    <w:basedOn w:val="NormaleTabelle"/>
+    <w:basedOn w:val="TableNormal"/>
     <w:uiPriority w:val="59"/>
     <w:pPr>
       <w:spacing w:after="0" w:line="240" w:lineRule="auto"/>
@@ -22101,9 +22127,9 @@
       </w:tblBorders>
     </w:tblPr>
   </w:style>
-  <w:style w:type="character" w:styleId="Kommentarzeichen">
+  <w:style w:type="character" w:styleId="CommentReference">
     <w:name w:val="annotation reference"/>
-    <w:basedOn w:val="Absatz-Standardschriftart"/>
+    <w:basedOn w:val="DefaultParagraphFont"/>
     <w:uiPriority w:val="99"/>
     <w:semiHidden/>
     <w:unhideWhenUsed/>
@@ -22112,10 +22138,10 @@
       <w:szCs w:val="16"/>
     </w:rPr>
   </w:style>
-  <w:style w:type="paragraph" w:styleId="Kommentartext">
+  <w:style w:type="paragraph" w:styleId="CommentText">
     <w:name w:val="annotation text"/>
-    <w:basedOn w:val="Standard"/>
-    <w:link w:val="KommentartextZchn"/>
+    <w:basedOn w:val="Normal"/>
+    <w:link w:val="CommentTextChar"/>
     <w:uiPriority w:val="99"/>
     <w:unhideWhenUsed/>
     <w:pPr>
@@ -22126,21 +22152,21 @@
       <w:szCs w:val="20"/>
     </w:rPr>
   </w:style>
-  <w:style w:type="character" w:customStyle="1" w:styleId="KommentartextZchn">
-    <w:name w:val="Kommentartext Zchn"/>
-    <w:basedOn w:val="Absatz-Standardschriftart"/>
-    <w:link w:val="Kommentartext"/>
+  <w:style w:type="character" w:customStyle="1" w:styleId="CommentTextChar">
+    <w:name w:val="Comment Text Char"/>
+    <w:basedOn w:val="DefaultParagraphFont"/>
+    <w:link w:val="CommentText"/>
     <w:uiPriority w:val="99"/>
     <w:rPr>
       <w:sz w:val="20"/>
       <w:szCs w:val="20"/>
     </w:rPr>
   </w:style>
-  <w:style w:type="paragraph" w:styleId="Kommentarthema">
+  <w:style w:type="paragraph" w:styleId="CommentSubject">
     <w:name w:val="annotation subject"/>
-    <w:basedOn w:val="Kommentartext"/>
-    <w:next w:val="Kommentartext"/>
-    <w:link w:val="KommentarthemaZchn"/>
+    <w:basedOn w:val="CommentText"/>
+    <w:next w:val="CommentText"/>
+    <w:link w:val="CommentSubjectChar"/>
     <w:uiPriority w:val="99"/>
     <w:semiHidden/>
     <w:unhideWhenUsed/>
@@ -22149,10 +22175,10 @@
       <w:bCs/>
     </w:rPr>
   </w:style>
-  <w:style w:type="character" w:customStyle="1" w:styleId="KommentarthemaZchn">
-    <w:name w:val="Kommentarthema Zchn"/>
-    <w:basedOn w:val="KommentartextZchn"/>
-    <w:link w:val="Kommentarthema"/>
+  <w:style w:type="character" w:customStyle="1" w:styleId="CommentSubjectChar">
+    <w:name w:val="Comment Subject Char"/>
+    <w:basedOn w:val="CommentTextChar"/>
+    <w:link w:val="CommentSubject"/>
     <w:uiPriority w:val="99"/>
     <w:semiHidden/>
     <w:rPr>
@@ -22162,10 +22188,10 @@
       <w:szCs w:val="20"/>
     </w:rPr>
   </w:style>
-  <w:style w:type="paragraph" w:styleId="Sprechblasentext">
+  <w:style w:type="paragraph" w:styleId="BalloonText">
     <w:name w:val="Balloon Text"/>
-    <w:basedOn w:val="Standard"/>
-    <w:link w:val="SprechblasentextZchn"/>
+    <w:basedOn w:val="Normal"/>
+    <w:link w:val="BalloonTextChar"/>
     <w:uiPriority w:val="99"/>
     <w:semiHidden/>
     <w:unhideWhenUsed/>
@@ -22178,10 +22204,10 @@
       <w:szCs w:val="16"/>
     </w:rPr>
   </w:style>
-  <w:style w:type="character" w:customStyle="1" w:styleId="SprechblasentextZchn">
-    <w:name w:val="Sprechblasentext Zchn"/>
-    <w:basedOn w:val="Absatz-Standardschriftart"/>
-    <w:link w:val="Sprechblasentext"/>
+  <w:style w:type="character" w:customStyle="1" w:styleId="BalloonTextChar">
+    <w:name w:val="Balloon Text Char"/>
+    <w:basedOn w:val="DefaultParagraphFont"/>
+    <w:link w:val="BalloonText"/>
     <w:uiPriority w:val="99"/>
     <w:semiHidden/>
     <w:rPr>
@@ -22190,7 +22216,7 @@
       <w:szCs w:val="16"/>
     </w:rPr>
   </w:style>
-  <w:style w:type="paragraph" w:styleId="KeinLeerraum">
+  <w:style w:type="paragraph" w:styleId="NoSpacing">
     <w:name w:val="No Spacing"/>
     <w:uiPriority w:val="1"/>
     <w:qFormat/>
@@ -22198,10 +22224,10 @@
       <w:spacing w:after="0" w:line="240" w:lineRule="auto"/>
     </w:pPr>
   </w:style>
-  <w:style w:type="paragraph" w:styleId="Kopfzeile">
+  <w:style w:type="paragraph" w:styleId="Header">
     <w:name w:val="header"/>
-    <w:basedOn w:val="Standard"/>
-    <w:link w:val="KopfzeileZchn"/>
+    <w:basedOn w:val="Normal"/>
+    <w:link w:val="HeaderChar1"/>
     <w:uiPriority w:val="99"/>
     <w:unhideWhenUsed/>
     <w:pPr>
@@ -22212,16 +22238,16 @@
       <w:spacing w:after="0" w:line="240" w:lineRule="auto"/>
     </w:pPr>
   </w:style>
-  <w:style w:type="character" w:customStyle="1" w:styleId="KopfzeileZchn">
-    <w:name w:val="Kopfzeile Zchn"/>
-    <w:basedOn w:val="Absatz-Standardschriftart"/>
-    <w:link w:val="Kopfzeile"/>
+  <w:style w:type="character" w:customStyle="1" w:styleId="HeaderChar1">
+    <w:name w:val="Header Char1"/>
+    <w:basedOn w:val="DefaultParagraphFont"/>
+    <w:link w:val="Header"/>
     <w:uiPriority w:val="99"/>
   </w:style>
-  <w:style w:type="paragraph" w:styleId="Fuzeile">
+  <w:style w:type="paragraph" w:styleId="Footer">
     <w:name w:val="footer"/>
-    <w:basedOn w:val="Standard"/>
-    <w:link w:val="FuzeileZchn"/>
+    <w:basedOn w:val="Normal"/>
+    <w:link w:val="FooterChar1"/>
     <w:uiPriority w:val="99"/>
     <w:unhideWhenUsed/>
     <w:pPr>
@@ -22232,13 +22258,13 @@
       <w:spacing w:after="0" w:line="240" w:lineRule="auto"/>
     </w:pPr>
   </w:style>
-  <w:style w:type="character" w:customStyle="1" w:styleId="FuzeileZchn">
-    <w:name w:val="Fußzeile Zchn"/>
-    <w:basedOn w:val="Absatz-Standardschriftart"/>
-    <w:link w:val="Fuzeile"/>
+  <w:style w:type="character" w:customStyle="1" w:styleId="FooterChar1">
+    <w:name w:val="Footer Char1"/>
+    <w:basedOn w:val="DefaultParagraphFont"/>
+    <w:link w:val="Footer"/>
     <w:uiPriority w:val="99"/>
   </w:style>
-  <w:style w:type="paragraph" w:styleId="berarbeitung">
+  <w:style w:type="paragraph" w:styleId="Revision">
     <w:name w:val="Revision"/>
     <w:hidden/>
     <w:uiPriority w:val="99"/>
@@ -22249,7 +22275,7 @@
   </w:style>
   <w:style w:type="paragraph" w:customStyle="1" w:styleId="ListItem-Bullet">
     <w:name w:val="List Item - Bullet"/>
-    <w:basedOn w:val="Listenabsatz"/>
+    <w:basedOn w:val="ListParagraph"/>
     <w:uiPriority w:val="2"/>
     <w:qFormat/>
     <w:pPr>
@@ -22283,7 +22309,7 @@
   </w:style>
   <w:style w:type="character" w:customStyle="1" w:styleId="UnresolvedMention1">
     <w:name w:val="Unresolved Mention1"/>
-    <w:basedOn w:val="Absatz-Standardschriftart"/>
+    <w:basedOn w:val="DefaultParagraphFont"/>
     <w:uiPriority w:val="99"/>
     <w:semiHidden/>
     <w:unhideWhenUsed/>
@@ -22292,9 +22318,9 @@
       <w:shd w:val="clear" w:color="auto" w:fill="E1DFDD"/>
     </w:rPr>
   </w:style>
-  <w:style w:type="character" w:styleId="BesuchterLink">
+  <w:style w:type="character" w:styleId="FollowedHyperlink">
     <w:name w:val="FollowedHyperlink"/>
-    <w:basedOn w:val="Absatz-Standardschriftart"/>
+    <w:basedOn w:val="DefaultParagraphFont"/>
     <w:uiPriority w:val="99"/>
     <w:semiHidden/>
     <w:unhideWhenUsed/>
@@ -22303,10 +22329,10 @@
       <w:u w:val="single"/>
     </w:rPr>
   </w:style>
-  <w:style w:type="paragraph" w:styleId="Funotentext">
+  <w:style w:type="paragraph" w:styleId="FootnoteText">
     <w:name w:val="footnote text"/>
-    <w:basedOn w:val="Standard"/>
-    <w:link w:val="FunotentextZchn"/>
+    <w:basedOn w:val="Normal"/>
+    <w:link w:val="FootnoteTextChar1"/>
     <w:uiPriority w:val="99"/>
     <w:semiHidden/>
     <w:unhideWhenUsed/>
@@ -22318,10 +22344,10 @@
       <w:szCs w:val="20"/>
     </w:rPr>
   </w:style>
-  <w:style w:type="character" w:customStyle="1" w:styleId="FunotentextZchn">
-    <w:name w:val="Fußnotentext Zchn"/>
-    <w:basedOn w:val="Absatz-Standardschriftart"/>
-    <w:link w:val="Funotentext"/>
+  <w:style w:type="character" w:customStyle="1" w:styleId="FootnoteTextChar1">
+    <w:name w:val="Footnote Text Char1"/>
+    <w:basedOn w:val="DefaultParagraphFont"/>
+    <w:link w:val="FootnoteText"/>
     <w:uiPriority w:val="99"/>
     <w:semiHidden/>
     <w:rPr>
@@ -22329,9 +22355,9 @@
       <w:szCs w:val="20"/>
     </w:rPr>
   </w:style>
-  <w:style w:type="character" w:styleId="Funotenzeichen">
+  <w:style w:type="character" w:styleId="FootnoteReference">
     <w:name w:val="footnote reference"/>
-    <w:basedOn w:val="Absatz-Standardschriftart"/>
+    <w:basedOn w:val="DefaultParagraphFont"/>
     <w:uiPriority w:val="99"/>
     <w:semiHidden/>
     <w:unhideWhenUsed/>
@@ -22341,9 +22367,12 @@
   </w:style>
   <w:style w:type="table" w:customStyle="1" w:styleId="GridTableLight0">
     <w:name w:val="Grid Table Light0"/>
-    <w:basedOn w:val="NormaleTabelle"/>
+    <w:basedOn w:val="TableNormal"/>
     <w:uiPriority w:val="40"/>
+    <w:rsid w:val="00AA0056"/>
     <w:pPr>
+      <w:keepLines/>
+      <w:pageBreakBefore/>
       <w:pBdr>
         <w:top w:val="none" w:sz="4" w:space="0" w:color="000000"/>
         <w:left w:val="none" w:sz="4" w:space="0" w:color="000000"/>
@@ -22369,10 +22398,10 @@
       </w:tblBorders>
     </w:tblPr>
   </w:style>
-  <w:style w:type="character" w:customStyle="1" w:styleId="berschrift3Zchn">
-    <w:name w:val="Überschrift 3 Zchn"/>
-    <w:basedOn w:val="Absatz-Standardschriftart"/>
-    <w:link w:val="berschrift3"/>
+  <w:style w:type="character" w:customStyle="1" w:styleId="Heading3Char1">
+    <w:name w:val="Heading 3 Char1"/>
+    <w:basedOn w:val="DefaultParagraphFont"/>
+    <w:link w:val="Heading3"/>
     <w:uiPriority w:val="9"/>
     <w:rPr>
       <w:rFonts w:ascii="Arial" w:eastAsia="Times New Roman" w:hAnsi="Arial" w:cs="Arial"/>
@@ -22382,10 +22411,10 @@
       <w:lang w:val="en-GB"/>
     </w:rPr>
   </w:style>
-  <w:style w:type="character" w:customStyle="1" w:styleId="berschrift4Zchn">
-    <w:name w:val="Überschrift 4 Zchn"/>
-    <w:basedOn w:val="Absatz-Standardschriftart"/>
-    <w:link w:val="berschrift4"/>
+  <w:style w:type="character" w:customStyle="1" w:styleId="Heading4Char1">
+    <w:name w:val="Heading 4 Char1"/>
+    <w:basedOn w:val="DefaultParagraphFont"/>
+    <w:link w:val="Heading4"/>
     <w:uiPriority w:val="9"/>
     <w:rPr>
       <w:rFonts w:ascii="Arial" w:eastAsia="Times New Roman" w:hAnsi="Arial" w:cs="Arial"/>
@@ -22399,11 +22428,11 @@
       <w:lang w:val="en-GB"/>
     </w:rPr>
   </w:style>
-  <w:style w:type="paragraph" w:styleId="Titel">
+  <w:style w:type="paragraph" w:styleId="Title">
     <w:name w:val="Title"/>
-    <w:basedOn w:val="Standard"/>
-    <w:next w:val="Standard"/>
-    <w:link w:val="TitelZchn"/>
+    <w:basedOn w:val="Normal"/>
+    <w:next w:val="Normal"/>
+    <w:link w:val="TitleChar1"/>
     <w:uiPriority w:val="10"/>
     <w:qFormat/>
     <w:pPr>
@@ -22418,10 +22447,10 @@
       <w:szCs w:val="32"/>
     </w:rPr>
   </w:style>
-  <w:style w:type="character" w:customStyle="1" w:styleId="TitelZchn">
-    <w:name w:val="Titel Zchn"/>
-    <w:basedOn w:val="Absatz-Standardschriftart"/>
-    <w:link w:val="Titel"/>
+  <w:style w:type="character" w:customStyle="1" w:styleId="TitleChar1">
+    <w:name w:val="Title Char1"/>
+    <w:basedOn w:val="DefaultParagraphFont"/>
+    <w:link w:val="Title"/>
     <w:uiPriority w:val="10"/>
     <w:rPr>
       <w:rFonts w:ascii="Arial" w:eastAsia="Times New Roman" w:hAnsi="Arial" w:cs="Arial"/>
@@ -22431,10 +22460,10 @@
       <w:szCs w:val="32"/>
     </w:rPr>
   </w:style>
-  <w:style w:type="paragraph" w:styleId="HTMLVorformatiert">
+  <w:style w:type="paragraph" w:styleId="HTMLPreformatted">
     <w:name w:val="HTML Preformatted"/>
-    <w:basedOn w:val="Standard"/>
-    <w:link w:val="HTMLVorformatiertZchn"/>
+    <w:basedOn w:val="Normal"/>
+    <w:link w:val="HTMLPreformattedChar"/>
     <w:uiPriority w:val="99"/>
     <w:semiHidden/>
     <w:unhideWhenUsed/>
@@ -22448,10 +22477,10 @@
       <w:szCs w:val="20"/>
     </w:rPr>
   </w:style>
-  <w:style w:type="character" w:customStyle="1" w:styleId="HTMLVorformatiertZchn">
-    <w:name w:val="HTML Vorformatiert Zchn"/>
-    <w:basedOn w:val="Absatz-Standardschriftart"/>
-    <w:link w:val="HTMLVorformatiert"/>
+  <w:style w:type="character" w:customStyle="1" w:styleId="HTMLPreformattedChar">
+    <w:name w:val="HTML Preformatted Char"/>
+    <w:basedOn w:val="DefaultParagraphFont"/>
+    <w:link w:val="HTMLPreformatted"/>
     <w:uiPriority w:val="99"/>
     <w:semiHidden/>
     <w:rsid w:val="00DC03C7"/>
@@ -22461,9 +22490,9 @@
       <w:szCs w:val="20"/>
     </w:rPr>
   </w:style>
-  <w:style w:type="character" w:styleId="NichtaufgelsteErwhnung">
+  <w:style w:type="character" w:styleId="UnresolvedMention">
     <w:name w:val="Unresolved Mention"/>
-    <w:basedOn w:val="Absatz-Standardschriftart"/>
+    <w:basedOn w:val="DefaultParagraphFont"/>
     <w:uiPriority w:val="99"/>
     <w:semiHidden/>
     <w:unhideWhenUsed/>
@@ -22687,6 +22716,22 @@
 </file>
 
 <file path=customXml/item1.xml><?xml version="1.0" encoding="utf-8"?>
+<p:properties xmlns:p="http://schemas.microsoft.com/office/2006/metadata/properties" xmlns:xsi="http://www.w3.org/2001/XMLSchema-instance" xmlns:pc="http://schemas.microsoft.com/office/infopath/2007/PartnerControls">
+  <documentManagement>
+    <_DCDateModified xmlns="http://schemas.microsoft.com/sharepoint/v3/fields" xsi:nil="true"/>
+    <IconOverlay xmlns="http://schemas.microsoft.com/sharepoint/v4" xsi:nil="true"/>
+    <PublishingExpirationDate xmlns="http://schemas.microsoft.com/sharepoint/v3" xsi:nil="true"/>
+    <PublishingStartDate xmlns="http://schemas.microsoft.com/sharepoint/v3" xsi:nil="true"/>
+    <_dlc_DocId xmlns="afee9e21-8e0c-452e-93ec-a70efb6b23ab">DAMK26V7PEQZ-1320525258-73877</_dlc_DocId>
+    <_dlc_DocIdUrl xmlns="afee9e21-8e0c-452e-93ec-a70efb6b23ab">
+      <Url>https://portal.fwf.ac.at/workspaces/Strateg-Dok/_layouts/15/DocIdRedir.aspx?ID=DAMK26V7PEQZ-1320525258-73877</Url>
+      <Description>DAMK26V7PEQZ-1320525258-73877</Description>
+    </_dlc_DocIdUrl>
+  </documentManagement>
+</p:properties>
+</file>
+
+<file path=customXml/item2.xml><?xml version="1.0" encoding="utf-8"?>
 <ct:contentTypeSchema xmlns:ct="http://schemas.microsoft.com/office/2006/metadata/contentType" xmlns:ma="http://schemas.microsoft.com/office/2006/metadata/properties/metaAttributes" ct:_="" ma:_="" ma:contentTypeName="Dokument" ma:contentTypeID="0x010100464D6544A015444385B10BEB1E534503" ma:contentTypeVersion="3" ma:contentTypeDescription="Ein neues Dokument erstellen." ma:contentTypeScope="" ma:versionID="97182bbd3e9b32d05dd5555f7c2bd814">
   <xsd:schema xmlns:xsd="http://www.w3.org/2001/XMLSchema" xmlns:xs="http://www.w3.org/2001/XMLSchema" xmlns:p="http://schemas.microsoft.com/office/2006/metadata/properties" xmlns:ns1="http://schemas.microsoft.com/sharepoint/v3" xmlns:ns2="http://schemas.microsoft.com/sharepoint/v3/fields" xmlns:ns3="http://schemas.microsoft.com/sharepoint/v4" xmlns:ns4="afee9e21-8e0c-452e-93ec-a70efb6b23ab" targetNamespace="http://schemas.microsoft.com/office/2006/metadata/properties" ma:root="true" ma:fieldsID="7bd051767b3e235ef3b7c10b4a85711f" ns1:_="" ns2:_="" ns3:_="" ns4:_="">
     <xsd:import namespace="http://schemas.microsoft.com/sharepoint/v3"/>
@@ -22870,36 +22915,13 @@
 </ct:contentTypeSchema>
 </file>
 
-<file path=customXml/item2.xml><?xml version="1.0" encoding="utf-8"?>
-<p:properties xmlns:p="http://schemas.microsoft.com/office/2006/metadata/properties" xmlns:xsi="http://www.w3.org/2001/XMLSchema-instance" xmlns:pc="http://schemas.microsoft.com/office/infopath/2007/PartnerControls">
-  <documentManagement>
-    <_DCDateModified xmlns="http://schemas.microsoft.com/sharepoint/v3/fields" xsi:nil="true"/>
-    <IconOverlay xmlns="http://schemas.microsoft.com/sharepoint/v4" xsi:nil="true"/>
-    <PublishingExpirationDate xmlns="http://schemas.microsoft.com/sharepoint/v3" xsi:nil="true"/>
-    <PublishingStartDate xmlns="http://schemas.microsoft.com/sharepoint/v3" xsi:nil="true"/>
-    <_dlc_DocId xmlns="afee9e21-8e0c-452e-93ec-a70efb6b23ab">DAMK26V7PEQZ-1320525258-73877</_dlc_DocId>
-    <_dlc_DocIdUrl xmlns="afee9e21-8e0c-452e-93ec-a70efb6b23ab">
-      <Url>https://portal.fwf.ac.at/workspaces/Strateg-Dok/_layouts/15/DocIdRedir.aspx?ID=DAMK26V7PEQZ-1320525258-73877</Url>
-      <Description>DAMK26V7PEQZ-1320525258-73877</Description>
-    </_dlc_DocIdUrl>
-  </documentManagement>
-</p:properties>
-</file>
-
 <file path=customXml/item3.xml><?xml version="1.0" encoding="utf-8"?>
-<?mso-contentType ?>
-<FormTemplates xmlns="http://schemas.microsoft.com/sharepoint/v3/contenttype/forms">
-  <Display>DocumentLibraryForm</Display>
-  <Edit>DocumentLibraryForm</Edit>
-  <New>DocumentLibraryForm</New>
-</FormTemplates>
+<w:settings xmlns:w="http://schemas.openxmlformats.org/wordprocessingml/2006/main">
+  <w:SpecialFormsHighlight w:val="c9c8ff"/>
+</w:settings>
 </file>
 
 <file path=customXml/item4.xml><?xml version="1.0" encoding="utf-8"?>
-<b:Sources xmlns:b="http://schemas.openxmlformats.org/officeDocument/2006/bibliography" xmlns="http://schemas.openxmlformats.org/officeDocument/2006/bibliography" SelectedStyle="\APASixthEditionOfficeOnline.xsl" StyleName="APA" Version="6"/>
-</file>
-
-<file path=customXml/item5.xml><?xml version="1.0" encoding="utf-8"?>
 <?mso-contentType ?>
 <spe:Receivers xmlns:spe="http://schemas.microsoft.com/sharepoint/events">
   <Receiver>
@@ -22949,13 +22971,33 @@
 </spe:Receivers>
 </file>
 
+<file path=customXml/item5.xml><?xml version="1.0" encoding="utf-8"?>
+<b:Sources xmlns:b="http://schemas.openxmlformats.org/officeDocument/2006/bibliography" xmlns="http://schemas.openxmlformats.org/officeDocument/2006/bibliography" SelectedStyle="\APASixthEditionOfficeOnline.xsl" StyleName="APA" Version="6"/>
+</file>
+
 <file path=customXml/item6.xml><?xml version="1.0" encoding="utf-8"?>
-<w:settings xmlns:w="http://schemas.openxmlformats.org/wordprocessingml/2006/main">
-  <w:SpecialFormsHighlight w:val="c9c8ff"/>
-</w:settings>
+<?mso-contentType ?>
+<FormTemplates xmlns="http://schemas.microsoft.com/sharepoint/v3/contenttype/forms">
+  <Display>DocumentLibraryForm</Display>
+  <Edit>DocumentLibraryForm</Edit>
+  <New>DocumentLibraryForm</New>
+</FormTemplates>
 </file>
 
 <file path=customXml/itemProps1.xml><?xml version="1.0" encoding="utf-8"?>
+<ds:datastoreItem xmlns:ds="http://schemas.openxmlformats.org/officeDocument/2006/customXml" ds:itemID="{80DCD561-5D0E-41FB-A5B2-A60CACB93746}">
+  <ds:schemaRefs>
+    <ds:schemaRef ds:uri="http://schemas.microsoft.com/office/2006/metadata/properties"/>
+    <ds:schemaRef ds:uri="http://schemas.microsoft.com/office/infopath/2007/PartnerControls"/>
+    <ds:schemaRef ds:uri="http://schemas.microsoft.com/sharepoint/v3/fields"/>
+    <ds:schemaRef ds:uri="http://schemas.microsoft.com/sharepoint/v4"/>
+    <ds:schemaRef ds:uri="http://schemas.microsoft.com/sharepoint/v3"/>
+    <ds:schemaRef ds:uri="afee9e21-8e0c-452e-93ec-a70efb6b23ab"/>
+  </ds:schemaRefs>
+</ds:datastoreItem>
+</file>
+
+<file path=customXml/itemProps2.xml><?xml version="1.0" encoding="utf-8"?>
 <ds:datastoreItem xmlns:ds="http://schemas.openxmlformats.org/officeDocument/2006/customXml" ds:itemID="{AF3DCB32-2405-4B27-9ABA-B6FBCC24494E}">
   <ds:schemaRefs>
     <ds:schemaRef ds:uri="http://schemas.microsoft.com/office/2006/metadata/contentType"/>
@@ -22976,28 +23018,23 @@
 </ds:datastoreItem>
 </file>
 
-<file path=customXml/itemProps2.xml><?xml version="1.0" encoding="utf-8"?>
-<ds:datastoreItem xmlns:ds="http://schemas.openxmlformats.org/officeDocument/2006/customXml" ds:itemID="{80DCD561-5D0E-41FB-A5B2-A60CACB93746}">
+<file path=customXml/itemProps3.xml><?xml version="1.0" encoding="utf-8"?>
+<ds:datastoreItem xmlns:ds="http://schemas.openxmlformats.org/officeDocument/2006/customXml" ds:itemID="{5D0AEA6B-E499-4EEF-98A3-AFBB261C493E}">
   <ds:schemaRefs>
-    <ds:schemaRef ds:uri="http://schemas.microsoft.com/office/2006/metadata/properties"/>
-    <ds:schemaRef ds:uri="http://schemas.microsoft.com/office/infopath/2007/PartnerControls"/>
-    <ds:schemaRef ds:uri="http://schemas.microsoft.com/sharepoint/v3/fields"/>
-    <ds:schemaRef ds:uri="http://schemas.microsoft.com/sharepoint/v4"/>
-    <ds:schemaRef ds:uri="http://schemas.microsoft.com/sharepoint/v3"/>
-    <ds:schemaRef ds:uri="afee9e21-8e0c-452e-93ec-a70efb6b23ab"/>
-  </ds:schemaRefs>
-</ds:datastoreItem>
-</file>
-
-<file path=customXml/itemProps3.xml><?xml version="1.0" encoding="utf-8"?>
-<ds:datastoreItem xmlns:ds="http://schemas.openxmlformats.org/officeDocument/2006/customXml" ds:itemID="{76E5CD1D-9176-4FA7-9A9A-698AC52D8E9F}">
-  <ds:schemaRefs>
-    <ds:schemaRef ds:uri="http://schemas.microsoft.com/sharepoint/v3/contenttype/forms"/>
+    <ds:schemaRef ds:uri="http://schemas.openxmlformats.org/wordprocessingml/2006/main"/>
   </ds:schemaRefs>
 </ds:datastoreItem>
 </file>
 
 <file path=customXml/itemProps4.xml><?xml version="1.0" encoding="utf-8"?>
+<ds:datastoreItem xmlns:ds="http://schemas.openxmlformats.org/officeDocument/2006/customXml" ds:itemID="{924007F5-9277-4670-9FE6-06782C7296A1}">
+  <ds:schemaRefs>
+    <ds:schemaRef ds:uri="http://schemas.microsoft.com/sharepoint/events"/>
+  </ds:schemaRefs>
+</ds:datastoreItem>
+</file>
+
+<file path=customXml/itemProps5.xml><?xml version="1.0" encoding="utf-8"?>
 <ds:datastoreItem xmlns:ds="http://schemas.openxmlformats.org/officeDocument/2006/customXml" ds:itemID="{6685E73F-2677-4B89-8508-7813A036A081}">
   <ds:schemaRefs>
     <ds:schemaRef ds:uri="http://schemas.openxmlformats.org/officeDocument/2006/bibliography"/>
@@ -23005,18 +23042,10 @@
 </ds:datastoreItem>
 </file>
 
-<file path=customXml/itemProps5.xml><?xml version="1.0" encoding="utf-8"?>
-<ds:datastoreItem xmlns:ds="http://schemas.openxmlformats.org/officeDocument/2006/customXml" ds:itemID="{924007F5-9277-4670-9FE6-06782C7296A1}">
+<file path=customXml/itemProps6.xml><?xml version="1.0" encoding="utf-8"?>
+<ds:datastoreItem xmlns:ds="http://schemas.openxmlformats.org/officeDocument/2006/customXml" ds:itemID="{76E5CD1D-9176-4FA7-9A9A-698AC52D8E9F}">
   <ds:schemaRefs>
-    <ds:schemaRef ds:uri="http://schemas.microsoft.com/sharepoint/events"/>
-  </ds:schemaRefs>
-</ds:datastoreItem>
-</file>
-
-<file path=customXml/itemProps6.xml><?xml version="1.0" encoding="utf-8"?>
-<ds:datastoreItem xmlns:ds="http://schemas.openxmlformats.org/officeDocument/2006/customXml" ds:itemID="{5D0AEA6B-E499-4EEF-98A3-AFBB261C493E}">
-  <ds:schemaRefs>
-    <ds:schemaRef ds:uri="http://schemas.openxmlformats.org/wordprocessingml/2006/main"/>
+    <ds:schemaRef ds:uri="http://schemas.microsoft.com/sharepoint/v3/contenttype/forms"/>
   </ds:schemaRefs>
 </ds:datastoreItem>
 </file>
</xml_diff>

<commit_message>
Templates: Clarify wording produced & reused datasets
</commit_message>
<xml_diff>
--- a/src/main/resources/org/damap/base/template/FWFTemplate.docx
+++ b/src/main/resources/org/damap/base/template/FWFTemplate.docx
@@ -544,7 +544,6 @@
             <w:tcBorders>
               <w:bottom w:val="single" w:sz="12" w:space="0" w:color="006AAB"/>
             </w:tcBorders>
-            <w:shd w:val="clear" w:color="auto" w:fill="auto"/>
           </w:tcPr>
           <w:p>
             <w:pPr>
@@ -573,7 +572,6 @@
             <w:tcBorders>
               <w:bottom w:val="single" w:sz="12" w:space="0" w:color="006AAB"/>
             </w:tcBorders>
-            <w:shd w:val="clear" w:color="auto" w:fill="auto"/>
           </w:tcPr>
           <w:p>
             <w:pPr>
@@ -602,7 +600,6 @@
             <w:tcBorders>
               <w:bottom w:val="single" w:sz="12" w:space="0" w:color="006AAB"/>
             </w:tcBorders>
-            <w:shd w:val="clear" w:color="auto" w:fill="auto"/>
           </w:tcPr>
           <w:p>
             <w:pPr>
@@ -634,7 +631,6 @@
             <w:tcBorders>
               <w:top w:val="single" w:sz="12" w:space="0" w:color="006AAB"/>
             </w:tcBorders>
-            <w:shd w:val="clear" w:color="auto" w:fill="auto"/>
           </w:tcPr>
           <w:p>
             <w:pPr>
@@ -660,7 +656,6 @@
             <w:tcBorders>
               <w:top w:val="single" w:sz="12" w:space="0" w:color="006AAB"/>
             </w:tcBorders>
-            <w:shd w:val="clear" w:color="auto" w:fill="auto"/>
           </w:tcPr>
           <w:p>
             <w:pPr>
@@ -705,7 +700,6 @@
             <w:tcBorders>
               <w:top w:val="single" w:sz="12" w:space="0" w:color="006AAB"/>
             </w:tcBorders>
-            <w:shd w:val="clear" w:color="auto" w:fill="auto"/>
           </w:tcPr>
           <w:p>
             <w:pPr>
@@ -779,7 +773,6 @@
         <w:tc>
           <w:tcPr>
             <w:tcW w:w="1261" w:type="dxa"/>
-            <w:shd w:val="clear" w:color="auto" w:fill="auto"/>
           </w:tcPr>
           <w:p>
             <w:pPr>
@@ -795,7 +788,6 @@
         <w:tc>
           <w:tcPr>
             <w:tcW w:w="1843" w:type="dxa"/>
-            <w:shd w:val="clear" w:color="auto" w:fill="auto"/>
           </w:tcPr>
           <w:p>
             <w:pPr>
@@ -810,7 +802,6 @@
         <w:tc>
           <w:tcPr>
             <w:tcW w:w="11198" w:type="dxa"/>
-            <w:shd w:val="clear" w:color="auto" w:fill="auto"/>
           </w:tcPr>
           <w:p>
             <w:pPr>
@@ -827,7 +818,6 @@
         <w:tc>
           <w:tcPr>
             <w:tcW w:w="1261" w:type="dxa"/>
-            <w:shd w:val="clear" w:color="auto" w:fill="auto"/>
           </w:tcPr>
           <w:p>
             <w:pPr>
@@ -843,7 +833,6 @@
         <w:tc>
           <w:tcPr>
             <w:tcW w:w="1843" w:type="dxa"/>
-            <w:shd w:val="clear" w:color="auto" w:fill="auto"/>
           </w:tcPr>
           <w:p>
             <w:pPr>
@@ -859,7 +848,6 @@
         <w:tc>
           <w:tcPr>
             <w:tcW w:w="11198" w:type="dxa"/>
-            <w:shd w:val="clear" w:color="auto" w:fill="auto"/>
           </w:tcPr>
           <w:p>
             <w:pPr>
@@ -877,7 +865,6 @@
         <w:tc>
           <w:tcPr>
             <w:tcW w:w="1261" w:type="dxa"/>
-            <w:shd w:val="clear" w:color="auto" w:fill="auto"/>
           </w:tcPr>
           <w:p>
             <w:pPr>
@@ -893,7 +880,6 @@
         <w:tc>
           <w:tcPr>
             <w:tcW w:w="1843" w:type="dxa"/>
-            <w:shd w:val="clear" w:color="auto" w:fill="auto"/>
           </w:tcPr>
           <w:p>
             <w:pPr>
@@ -909,7 +895,6 @@
         <w:tc>
           <w:tcPr>
             <w:tcW w:w="11198" w:type="dxa"/>
-            <w:shd w:val="clear" w:color="auto" w:fill="auto"/>
           </w:tcPr>
           <w:p>
             <w:pPr>
@@ -954,7 +939,6 @@
         <w:tc>
           <w:tcPr>
             <w:tcW w:w="1261" w:type="dxa"/>
-            <w:shd w:val="clear" w:color="auto" w:fill="auto"/>
             <w:vAlign w:val="center"/>
           </w:tcPr>
           <w:p>
@@ -981,7 +965,6 @@
         <w:tc>
           <w:tcPr>
             <w:tcW w:w="1843" w:type="dxa"/>
-            <w:shd w:val="clear" w:color="auto" w:fill="auto"/>
           </w:tcPr>
           <w:p>
             <w:pPr>
@@ -1072,7 +1055,6 @@
         <w:tc>
           <w:tcPr>
             <w:tcW w:w="11198" w:type="dxa"/>
-            <w:shd w:val="clear" w:color="auto" w:fill="auto"/>
           </w:tcPr>
           <w:p>
             <w:pPr>
@@ -1092,30 +1074,17 @@
               </w:rPr>
               <w:t xml:space="preserve">This DMP is licensed under a </w:t>
             </w:r>
-            <w:r>
-              <w:fldChar w:fldCharType="begin"/>
-            </w:r>
-            <w:r>
-              <w:rPr>
-                <w:lang w:val="en-US"/>
-              </w:rPr>
-              <w:instrText>HYPERLINK "https://creativecommons.org/licenses/by/4.0/legalcode" \o "https://creativecommons.org/licenses/by/4.0/legalcode"</w:instrText>
-            </w:r>
-            <w:r>
-              <w:fldChar w:fldCharType="separate"/>
-            </w:r>
-            <w:r>
-              <w:rPr>
-                <w:sz w:val="20"/>
-                <w:szCs w:val="20"/>
-                <w:u w:val="single"/>
-                <w:lang w:val="en-GB"/>
-              </w:rPr>
-              <w:t>Creative Commons Attribution 4.0 International License</w:t>
-            </w:r>
-            <w:r>
-              <w:fldChar w:fldCharType="end"/>
-            </w:r>
+            <w:hyperlink r:id="rId18" w:tooltip="https://creativecommons.org/licenses/by/4.0/legalcode" w:history="1">
+              <w:r>
+                <w:rPr>
+                  <w:sz w:val="20"/>
+                  <w:szCs w:val="20"/>
+                  <w:u w:val="single"/>
+                  <w:lang w:val="en-GB"/>
+                </w:rPr>
+                <w:t>Creative Commons Attribution 4.0 International License</w:t>
+              </w:r>
+            </w:hyperlink>
             <w:r>
               <w:rPr>
                 <w:sz w:val="20"/>
@@ -1196,7 +1165,7 @@
           <w:lang w:val="en-GB"/>
         </w:rPr>
         <w:sectPr>
-          <w:footerReference w:type="default" r:id="rId18"/>
+          <w:footerReference w:type="default" r:id="rId19"/>
           <w:pgSz w:w="16838" w:h="11906" w:orient="landscape"/>
           <w:pgMar w:top="851" w:right="820" w:bottom="1417" w:left="1134" w:header="708" w:footer="708" w:gutter="0"/>
           <w:cols w:space="708"/>
@@ -1248,31 +1217,18 @@
         </w:rPr>
         <w:t>This DMP follows the official FWF template. When revising this DMP, please check the guidance from FWF for more details: </w:t>
       </w:r>
-      <w:r>
-        <w:fldChar w:fldCharType="begin"/>
-      </w:r>
-      <w:r>
-        <w:rPr>
-          <w:lang w:val="en-US"/>
-        </w:rPr>
-        <w:instrText>HYPERLINK "https://www.fwf.ac.at/fileadmin/Website/Dokumente/Ueber_uns/Aufgaben_und_Aktivitaeten/Open_Science/fwf_dmp_guidelines_template.docx"</w:instrText>
-      </w:r>
-      <w:r>
-        <w:fldChar w:fldCharType="separate"/>
-      </w:r>
-      <w:r>
-        <w:rPr>
-          <w:rStyle w:val="Hyperlink"/>
-          <w:rFonts w:ascii="Arial" w:hAnsi="Arial" w:cs="Arial"/>
-          <w:bCs/>
-          <w:color w:val="92D050"/>
-          <w:lang w:val="en-US"/>
-        </w:rPr>
-        <w:t>FWF DMP - Guidance and Template</w:t>
-      </w:r>
-      <w:r>
-        <w:fldChar w:fldCharType="end"/>
-      </w:r>
+      <w:hyperlink r:id="rId20" w:history="1">
+        <w:r>
+          <w:rPr>
+            <w:rStyle w:val="Hyperlink"/>
+            <w:rFonts w:ascii="Arial" w:hAnsi="Arial" w:cs="Arial"/>
+            <w:bCs/>
+            <w:color w:val="92D050"/>
+            <w:lang w:val="en-US"/>
+          </w:rPr>
+          <w:t>FWF DMP - Guidance and Template</w:t>
+        </w:r>
+      </w:hyperlink>
     </w:p>
     <w:p>
       <w:pPr>
@@ -1360,7 +1316,6 @@
               <w:bottom w:val="single" w:sz="4" w:space="0" w:color="auto"/>
               <w:right w:val="single" w:sz="4" w:space="0" w:color="auto"/>
             </w:tcBorders>
-            <w:shd w:val="clear" w:color="auto" w:fill="auto"/>
             <w:vAlign w:val="center"/>
           </w:tcPr>
           <w:p>
@@ -1396,7 +1351,6 @@
               <w:bottom w:val="single" w:sz="4" w:space="0" w:color="auto"/>
               <w:right w:val="single" w:sz="4" w:space="0" w:color="auto"/>
             </w:tcBorders>
-            <w:shd w:val="clear" w:color="auto" w:fill="auto"/>
             <w:vAlign w:val="center"/>
           </w:tcPr>
           <w:p>
@@ -1828,7 +1782,6 @@
               <w:bottom w:val="single" w:sz="4" w:space="0" w:color="auto"/>
               <w:right w:val="single" w:sz="4" w:space="0" w:color="auto"/>
             </w:tcBorders>
-            <w:shd w:val="clear" w:color="auto" w:fill="auto"/>
             <w:vAlign w:val="center"/>
           </w:tcPr>
           <w:p>
@@ -1864,7 +1817,6 @@
               <w:bottom w:val="single" w:sz="4" w:space="0" w:color="auto"/>
               <w:right w:val="single" w:sz="4" w:space="0" w:color="auto"/>
             </w:tcBorders>
-            <w:shd w:val="clear" w:color="auto" w:fill="auto"/>
             <w:vAlign w:val="center"/>
           </w:tcPr>
           <w:p>
@@ -2544,7 +2496,6 @@
                     <w:top w:val="single" w:sz="12" w:space="0" w:color="006AAB"/>
                     <w:right w:val="none" w:sz="4" w:space="0" w:color="000000" w:themeColor="text1"/>
                   </w:tcBorders>
-                  <w:shd w:val="clear" w:color="auto" w:fill="auto"/>
                 </w:tcPr>
                 <w:p>
                   <w:pPr>
@@ -2574,7 +2525,6 @@
                     <w:left w:val="none" w:sz="4" w:space="0" w:color="000000" w:themeColor="text1"/>
                     <w:right w:val="none" w:sz="4" w:space="0" w:color="000000" w:themeColor="text1"/>
                   </w:tcBorders>
-                  <w:shd w:val="clear" w:color="auto" w:fill="auto"/>
                 </w:tcPr>
                 <w:p>
                   <w:pPr>
@@ -2595,7 +2545,6 @@
                     <w:top w:val="single" w:sz="12" w:space="0" w:color="006AAB"/>
                     <w:left w:val="none" w:sz="4" w:space="0" w:color="000000" w:themeColor="text1"/>
                   </w:tcBorders>
-                  <w:shd w:val="clear" w:color="auto" w:fill="auto"/>
                 </w:tcPr>
                 <w:p>
                   <w:pPr>
@@ -2615,7 +2564,6 @@
                   <w:tcBorders>
                     <w:top w:val="single" w:sz="12" w:space="0" w:color="006AAB"/>
                   </w:tcBorders>
-                  <w:shd w:val="clear" w:color="auto" w:fill="auto"/>
                 </w:tcPr>
                 <w:p>
                   <w:pPr>
@@ -2662,7 +2610,6 @@
                   <w:tcBorders>
                     <w:top w:val="single" w:sz="12" w:space="0" w:color="006AAB"/>
                   </w:tcBorders>
-                  <w:shd w:val="clear" w:color="auto" w:fill="auto"/>
                 </w:tcPr>
                 <w:p>
                   <w:pPr>
@@ -2833,7 +2780,6 @@
         <w:tc>
           <w:tcPr>
             <w:tcW w:w="2052" w:type="dxa"/>
-            <w:shd w:val="clear" w:color="auto" w:fill="auto"/>
             <w:vAlign w:val="center"/>
           </w:tcPr>
           <w:p>
@@ -2863,7 +2809,6 @@
         <w:tc>
           <w:tcPr>
             <w:tcW w:w="12783" w:type="dxa"/>
-            <w:shd w:val="clear" w:color="auto" w:fill="auto"/>
             <w:vAlign w:val="center"/>
           </w:tcPr>
           <w:p>
@@ -2886,7 +2831,18 @@
                 <w:szCs w:val="18"/>
                 <w:lang w:val="en-GB"/>
               </w:rPr>
-              <w:t>Produced datasets:</w:t>
+              <w:t>The following datasets will be p</w:t>
+            </w:r>
+            <w:r>
+              <w:rPr>
+                <w:rFonts w:ascii="Arial" w:hAnsi="Arial" w:cs="Arial"/>
+                <w:b/>
+                <w:bCs/>
+                <w:sz w:val="18"/>
+                <w:szCs w:val="18"/>
+                <w:lang w:val="en-GB"/>
+              </w:rPr>
+              <w:t>roduced:</w:t>
             </w:r>
             <w:r>
               <w:rPr>
@@ -3591,7 +3547,18 @@
                 <w:szCs w:val="18"/>
                 <w:lang w:val="en-GB"/>
               </w:rPr>
-              <w:t>Reused datasets:</w:t>
+              <w:t>The following datasets will be reused</w:t>
+            </w:r>
+            <w:r>
+              <w:rPr>
+                <w:rFonts w:ascii="Arial" w:hAnsi="Arial" w:cs="Arial"/>
+                <w:b/>
+                <w:bCs/>
+                <w:sz w:val="18"/>
+                <w:szCs w:val="18"/>
+                <w:lang w:val="en-GB"/>
+              </w:rPr>
+              <w:t>:</w:t>
             </w:r>
           </w:p>
           <w:tbl>
@@ -4266,7 +4233,6 @@
         <w:tc>
           <w:tcPr>
             <w:tcW w:w="2052" w:type="dxa"/>
-            <w:shd w:val="clear" w:color="auto" w:fill="auto"/>
             <w:vAlign w:val="center"/>
           </w:tcPr>
           <w:p>
@@ -4296,7 +4262,6 @@
         <w:tc>
           <w:tcPr>
             <w:tcW w:w="12783" w:type="dxa"/>
-            <w:shd w:val="clear" w:color="auto" w:fill="auto"/>
             <w:vAlign w:val="center"/>
           </w:tcPr>
           <w:p>
@@ -4483,7 +4448,6 @@
         <w:tc>
           <w:tcPr>
             <w:tcW w:w="2052" w:type="dxa"/>
-            <w:shd w:val="clear" w:color="auto" w:fill="auto"/>
             <w:vAlign w:val="center"/>
           </w:tcPr>
           <w:p>
@@ -4513,7 +4477,6 @@
         <w:tc>
           <w:tcPr>
             <w:tcW w:w="12783" w:type="dxa"/>
-            <w:shd w:val="clear" w:color="auto" w:fill="auto"/>
             <w:vAlign w:val="center"/>
           </w:tcPr>
           <w:p>
@@ -4652,7 +4615,6 @@
               <w:bottom w:val="single" w:sz="4" w:space="0" w:color="auto"/>
               <w:right w:val="single" w:sz="4" w:space="0" w:color="auto"/>
             </w:tcBorders>
-            <w:shd w:val="clear" w:color="auto" w:fill="auto"/>
             <w:vAlign w:val="center"/>
           </w:tcPr>
           <w:p>
@@ -4688,7 +4650,6 @@
               <w:bottom w:val="single" w:sz="4" w:space="0" w:color="auto"/>
               <w:right w:val="single" w:sz="4" w:space="0" w:color="auto"/>
             </w:tcBorders>
-            <w:shd w:val="clear" w:color="auto" w:fill="auto"/>
             <w:vAlign w:val="center"/>
           </w:tcPr>
           <w:p>
@@ -5282,7 +5243,6 @@
               <w:bottom w:val="single" w:sz="4" w:space="0" w:color="auto"/>
               <w:right w:val="single" w:sz="4" w:space="0" w:color="auto"/>
             </w:tcBorders>
-            <w:shd w:val="clear" w:color="auto" w:fill="auto"/>
             <w:vAlign w:val="center"/>
           </w:tcPr>
           <w:p>
@@ -5319,7 +5279,6 @@
               <w:bottom w:val="single" w:sz="4" w:space="0" w:color="auto"/>
               <w:right w:val="single" w:sz="4" w:space="0" w:color="auto"/>
             </w:tcBorders>
-            <w:shd w:val="clear" w:color="auto" w:fill="auto"/>
             <w:vAlign w:val="center"/>
           </w:tcPr>
           <w:p>
@@ -6975,7 +6934,6 @@
         <w:tc>
           <w:tcPr>
             <w:tcW w:w="2052" w:type="dxa"/>
-            <w:shd w:val="clear" w:color="auto" w:fill="auto"/>
             <w:vAlign w:val="center"/>
           </w:tcPr>
           <w:p>
@@ -7005,7 +6963,6 @@
         <w:tc>
           <w:tcPr>
             <w:tcW w:w="12783" w:type="dxa"/>
-            <w:shd w:val="clear" w:color="auto" w:fill="auto"/>
             <w:vAlign w:val="center"/>
           </w:tcPr>
           <w:p>
@@ -7174,7 +7131,6 @@
               <w:bottom w:val="single" w:sz="4" w:space="0" w:color="auto"/>
               <w:right w:val="single" w:sz="4" w:space="0" w:color="auto"/>
             </w:tcBorders>
-            <w:shd w:val="clear" w:color="auto" w:fill="auto"/>
             <w:vAlign w:val="center"/>
           </w:tcPr>
           <w:p>
@@ -7210,7 +7166,6 @@
               <w:bottom w:val="single" w:sz="4" w:space="0" w:color="auto"/>
               <w:right w:val="single" w:sz="4" w:space="0" w:color="auto"/>
             </w:tcBorders>
-            <w:shd w:val="clear" w:color="auto" w:fill="auto"/>
             <w:vAlign w:val="center"/>
           </w:tcPr>
           <w:p>
@@ -7291,7 +7246,7 @@
       </w:pPr>
     </w:p>
     <w:sectPr>
-      <w:footerReference w:type="default" r:id="rId19"/>
+      <w:footerReference w:type="default" r:id="rId21"/>
       <w:pgSz w:w="16838" w:h="11906" w:orient="landscape"/>
       <w:pgMar w:top="1134" w:right="1417" w:bottom="1417" w:left="1134" w:header="708" w:footer="708" w:gutter="0"/>
       <w:cols w:space="708"/>
@@ -22716,6 +22671,15 @@
 </file>
 
 <file path=customXml/item1.xml><?xml version="1.0" encoding="utf-8"?>
+<?mso-contentType ?>
+<FormTemplates xmlns="http://schemas.microsoft.com/sharepoint/v3/contenttype/forms">
+  <Display>DocumentLibraryForm</Display>
+  <Edit>DocumentLibraryForm</Edit>
+  <New>DocumentLibraryForm</New>
+</FormTemplates>
+</file>
+
+<file path=customXml/item2.xml><?xml version="1.0" encoding="utf-8"?>
 <p:properties xmlns:p="http://schemas.microsoft.com/office/2006/metadata/properties" xmlns:xsi="http://www.w3.org/2001/XMLSchema-instance" xmlns:pc="http://schemas.microsoft.com/office/infopath/2007/PartnerControls">
   <documentManagement>
     <_DCDateModified xmlns="http://schemas.microsoft.com/sharepoint/v3/fields" xsi:nil="true"/>
@@ -22731,7 +22695,7 @@
 </p:properties>
 </file>
 
-<file path=customXml/item2.xml><?xml version="1.0" encoding="utf-8"?>
+<file path=customXml/item3.xml><?xml version="1.0" encoding="utf-8"?>
 <ct:contentTypeSchema xmlns:ct="http://schemas.microsoft.com/office/2006/metadata/contentType" xmlns:ma="http://schemas.microsoft.com/office/2006/metadata/properties/metaAttributes" ct:_="" ma:_="" ma:contentTypeName="Dokument" ma:contentTypeID="0x010100464D6544A015444385B10BEB1E534503" ma:contentTypeVersion="3" ma:contentTypeDescription="Ein neues Dokument erstellen." ma:contentTypeScope="" ma:versionID="97182bbd3e9b32d05dd5555f7c2bd814">
   <xsd:schema xmlns:xsd="http://www.w3.org/2001/XMLSchema" xmlns:xs="http://www.w3.org/2001/XMLSchema" xmlns:p="http://schemas.microsoft.com/office/2006/metadata/properties" xmlns:ns1="http://schemas.microsoft.com/sharepoint/v3" xmlns:ns2="http://schemas.microsoft.com/sharepoint/v3/fields" xmlns:ns3="http://schemas.microsoft.com/sharepoint/v4" xmlns:ns4="afee9e21-8e0c-452e-93ec-a70efb6b23ab" targetNamespace="http://schemas.microsoft.com/office/2006/metadata/properties" ma:root="true" ma:fieldsID="7bd051767b3e235ef3b7c10b4a85711f" ns1:_="" ns2:_="" ns3:_="" ns4:_="">
     <xsd:import namespace="http://schemas.microsoft.com/sharepoint/v3"/>
@@ -22915,13 +22879,13 @@
 </ct:contentTypeSchema>
 </file>
 
-<file path=customXml/item3.xml><?xml version="1.0" encoding="utf-8"?>
+<file path=customXml/item4.xml><?xml version="1.0" encoding="utf-8"?>
 <w:settings xmlns:w="http://schemas.openxmlformats.org/wordprocessingml/2006/main">
   <w:SpecialFormsHighlight w:val="c9c8ff"/>
 </w:settings>
 </file>
 
-<file path=customXml/item4.xml><?xml version="1.0" encoding="utf-8"?>
+<file path=customXml/item5.xml><?xml version="1.0" encoding="utf-8"?>
 <?mso-contentType ?>
 <spe:Receivers xmlns:spe="http://schemas.microsoft.com/sharepoint/events">
   <Receiver>
@@ -22971,20 +22935,19 @@
 </spe:Receivers>
 </file>
 
-<file path=customXml/item5.xml><?xml version="1.0" encoding="utf-8"?>
+<file path=customXml/item6.xml><?xml version="1.0" encoding="utf-8"?>
 <b:Sources xmlns:b="http://schemas.openxmlformats.org/officeDocument/2006/bibliography" xmlns="http://schemas.openxmlformats.org/officeDocument/2006/bibliography" SelectedStyle="\APASixthEditionOfficeOnline.xsl" StyleName="APA" Version="6"/>
 </file>
 
-<file path=customXml/item6.xml><?xml version="1.0" encoding="utf-8"?>
-<?mso-contentType ?>
-<FormTemplates xmlns="http://schemas.microsoft.com/sharepoint/v3/contenttype/forms">
-  <Display>DocumentLibraryForm</Display>
-  <Edit>DocumentLibraryForm</Edit>
-  <New>DocumentLibraryForm</New>
-</FormTemplates>
+<file path=customXml/itemProps1.xml><?xml version="1.0" encoding="utf-8"?>
+<ds:datastoreItem xmlns:ds="http://schemas.openxmlformats.org/officeDocument/2006/customXml" ds:itemID="{76E5CD1D-9176-4FA7-9A9A-698AC52D8E9F}">
+  <ds:schemaRefs>
+    <ds:schemaRef ds:uri="http://schemas.microsoft.com/sharepoint/v3/contenttype/forms"/>
+  </ds:schemaRefs>
+</ds:datastoreItem>
 </file>
 
-<file path=customXml/itemProps1.xml><?xml version="1.0" encoding="utf-8"?>
+<file path=customXml/itemProps2.xml><?xml version="1.0" encoding="utf-8"?>
 <ds:datastoreItem xmlns:ds="http://schemas.openxmlformats.org/officeDocument/2006/customXml" ds:itemID="{80DCD561-5D0E-41FB-A5B2-A60CACB93746}">
   <ds:schemaRefs>
     <ds:schemaRef ds:uri="http://schemas.microsoft.com/office/2006/metadata/properties"/>
@@ -22997,7 +22960,7 @@
 </ds:datastoreItem>
 </file>
 
-<file path=customXml/itemProps2.xml><?xml version="1.0" encoding="utf-8"?>
+<file path=customXml/itemProps3.xml><?xml version="1.0" encoding="utf-8"?>
 <ds:datastoreItem xmlns:ds="http://schemas.openxmlformats.org/officeDocument/2006/customXml" ds:itemID="{AF3DCB32-2405-4B27-9ABA-B6FBCC24494E}">
   <ds:schemaRefs>
     <ds:schemaRef ds:uri="http://schemas.microsoft.com/office/2006/metadata/contentType"/>
@@ -23018,7 +22981,7 @@
 </ds:datastoreItem>
 </file>
 
-<file path=customXml/itemProps3.xml><?xml version="1.0" encoding="utf-8"?>
+<file path=customXml/itemProps4.xml><?xml version="1.0" encoding="utf-8"?>
 <ds:datastoreItem xmlns:ds="http://schemas.openxmlformats.org/officeDocument/2006/customXml" ds:itemID="{5D0AEA6B-E499-4EEF-98A3-AFBB261C493E}">
   <ds:schemaRefs>
     <ds:schemaRef ds:uri="http://schemas.openxmlformats.org/wordprocessingml/2006/main"/>
@@ -23026,7 +22989,7 @@
 </ds:datastoreItem>
 </file>
 
-<file path=customXml/itemProps4.xml><?xml version="1.0" encoding="utf-8"?>
+<file path=customXml/itemProps5.xml><?xml version="1.0" encoding="utf-8"?>
 <ds:datastoreItem xmlns:ds="http://schemas.openxmlformats.org/officeDocument/2006/customXml" ds:itemID="{924007F5-9277-4670-9FE6-06782C7296A1}">
   <ds:schemaRefs>
     <ds:schemaRef ds:uri="http://schemas.microsoft.com/sharepoint/events"/>
@@ -23034,18 +22997,10 @@
 </ds:datastoreItem>
 </file>
 
-<file path=customXml/itemProps5.xml><?xml version="1.0" encoding="utf-8"?>
+<file path=customXml/itemProps6.xml><?xml version="1.0" encoding="utf-8"?>
 <ds:datastoreItem xmlns:ds="http://schemas.openxmlformats.org/officeDocument/2006/customXml" ds:itemID="{6685E73F-2677-4B89-8508-7813A036A081}">
   <ds:schemaRefs>
     <ds:schemaRef ds:uri="http://schemas.openxmlformats.org/officeDocument/2006/bibliography"/>
   </ds:schemaRefs>
 </ds:datastoreItem>
-</file>
-
-<file path=customXml/itemProps6.xml><?xml version="1.0" encoding="utf-8"?>
-<ds:datastoreItem xmlns:ds="http://schemas.openxmlformats.org/officeDocument/2006/customXml" ds:itemID="{76E5CD1D-9176-4FA7-9A9A-698AC52D8E9F}">
-  <ds:schemaRefs>
-    <ds:schemaRef ds:uri="http://schemas.microsoft.com/sharepoint/v3/contenttype/forms"/>
-  </ds:schemaRefs>
-</ds:datastoreItem>
 </file>
</xml_diff>